<commit_message>
Completed Cover Page and included online Github repsoitory link
</commit_message>
<xml_diff>
--- a/HDSDAB - Strategic Thinking - Capstone Project.docx
+++ b/HDSDAB - Strategic Thinking - Capstone Project.docx
@@ -290,14 +290,54 @@
           <w:szCs w:val="32"/>
         </w:rPr>
       </w:pPr>
-      <w:r>
+      <w:ins w:id="0" w:author="kyle O'Reilly" w:date="2026-10-20T21:23:00Z" w16du:dateUtc="2026-10-20T20:23:00Z">
+        <w:r>
+          <w:rPr>
+            <w:i/>
+            <w:color w:val="EE0000"/>
+            <w:sz w:val="32"/>
+            <w:szCs w:val="32"/>
+          </w:rPr>
+          <w:t xml:space="preserve">Kyle </w:t>
+        </w:r>
+        <w:r>
+          <w:rPr>
+            <w:i/>
+            <w:color w:val="EE0000"/>
+            <w:sz w:val="32"/>
+            <w:szCs w:val="32"/>
+          </w:rPr>
+          <w:t>O’Reilly</w:t>
+        </w:r>
+      </w:ins>
+    </w:p>
+    <w:p>
+      <w:pPr>
         <w:rPr>
           <w:i/>
           <w:color w:val="EE0000"/>
           <w:sz w:val="32"/>
           <w:szCs w:val="32"/>
         </w:rPr>
-        <w:t>?</w:t>
+      </w:pPr>
+    </w:p>
+    <w:p>
+      <w:pPr>
+        <w:rPr>
+          <w:i/>
+          <w:color w:val="156082"/>
+          <w:sz w:val="32"/>
+          <w:szCs w:val="32"/>
+        </w:rPr>
+      </w:pPr>
+      <w:r>
+        <w:rPr>
+          <w:i/>
+          <w:color w:val="156082"/>
+          <w:sz w:val="32"/>
+          <w:szCs w:val="32"/>
+        </w:rPr>
+        <w:t>Student Number</w:t>
       </w:r>
     </w:p>
     <w:p>
@@ -309,6 +349,27 @@
           <w:szCs w:val="32"/>
         </w:rPr>
       </w:pPr>
+      <w:ins w:id="1" w:author="kyle O'Reilly" w:date="2026-10-20T21:23:00Z" w16du:dateUtc="2026-10-20T20:23:00Z">
+        <w:r>
+          <w:rPr>
+            <w:i/>
+            <w:color w:val="EE0000"/>
+            <w:sz w:val="32"/>
+            <w:szCs w:val="32"/>
+          </w:rPr>
+          <w:t>Sba26104</w:t>
+        </w:r>
+      </w:ins>
+    </w:p>
+    <w:p>
+      <w:pPr>
+        <w:rPr>
+          <w:i/>
+          <w:color w:val="EE0000"/>
+          <w:sz w:val="32"/>
+          <w:szCs w:val="32"/>
+        </w:rPr>
+      </w:pPr>
     </w:p>
     <w:p>
       <w:pPr>
@@ -326,7 +387,7 @@
           <w:sz w:val="32"/>
           <w:szCs w:val="32"/>
         </w:rPr>
-        <w:t>Student Number</w:t>
+        <w:t>Module Title</w:t>
       </w:r>
     </w:p>
     <w:p>
@@ -338,15 +399,67 @@
           <w:szCs w:val="32"/>
         </w:rPr>
       </w:pPr>
+      <w:ins w:id="2" w:author="kyle O'Reilly" w:date="2026-10-20T21:24:00Z" w16du:dateUtc="2026-10-20T20:24:00Z">
+        <w:r>
+          <w:rPr>
+            <w:i/>
+            <w:color w:val="EE0000"/>
+            <w:sz w:val="32"/>
+            <w:szCs w:val="32"/>
+          </w:rPr>
+          <w:t>Strategic Thinking</w:t>
+        </w:r>
+      </w:ins>
+    </w:p>
+    <w:p>
+      <w:pPr>
+        <w:rPr>
+          <w:i/>
+          <w:color w:val="156082"/>
+          <w:sz w:val="32"/>
+          <w:szCs w:val="32"/>
+        </w:rPr>
+      </w:pPr>
+    </w:p>
+    <w:p>
+      <w:pPr>
+        <w:rPr>
+          <w:i/>
+          <w:color w:val="156082"/>
+          <w:sz w:val="32"/>
+          <w:szCs w:val="32"/>
+        </w:rPr>
+      </w:pPr>
       <w:r>
+        <w:rPr>
+          <w:i/>
+          <w:color w:val="156082"/>
+          <w:sz w:val="32"/>
+          <w:szCs w:val="32"/>
+        </w:rPr>
+        <w:t>Assessment Title</w:t>
+      </w:r>
+    </w:p>
+    <w:p>
+      <w:pPr>
         <w:rPr>
           <w:i/>
           <w:color w:val="EE0000"/>
           <w:sz w:val="32"/>
           <w:szCs w:val="32"/>
         </w:rPr>
-        <w:t>?</w:t>
-      </w:r>
+      </w:pPr>
+      <w:ins w:id="3" w:author="kyle O'Reilly" w:date="2026-10-20T21:24:00Z" w16du:dateUtc="2026-10-20T20:24:00Z">
+        <w:r>
+          <w:rPr>
+            <w:i/>
+            <w:color w:val="EE0000"/>
+            <w:sz w:val="32"/>
+            <w:szCs w:val="32"/>
+          </w:rPr>
+          <w:t>CA-1 Capstone Project Proposal</w:t>
+        </w:r>
+      </w:ins>
     </w:p>
     <w:p>
       <w:pPr>
@@ -374,7 +487,7 @@
           <w:sz w:val="32"/>
           <w:szCs w:val="32"/>
         </w:rPr>
-        <w:t>Module Title</w:t>
+        <w:t>Lecturer/Supervisor</w:t>
       </w:r>
     </w:p>
     <w:p>
@@ -386,15 +499,38 @@
           <w:szCs w:val="32"/>
         </w:rPr>
       </w:pPr>
-      <w:r>
+      <w:proofErr w:type="spellStart"/>
+      <w:ins w:id="4" w:author="kyle O'Reilly" w:date="2026-10-20T21:24:00Z" w16du:dateUtc="2026-10-20T20:24:00Z">
+        <w:r>
+          <w:rPr>
+            <w:i/>
+            <w:color w:val="EE0000"/>
+            <w:sz w:val="32"/>
+            <w:szCs w:val="32"/>
+          </w:rPr>
+          <w:t>Taufique</w:t>
+        </w:r>
+        <w:proofErr w:type="spellEnd"/>
+        <w:r>
+          <w:rPr>
+            <w:i/>
+            <w:color w:val="EE0000"/>
+            <w:sz w:val="32"/>
+            <w:szCs w:val="32"/>
+          </w:rPr>
+          <w:t xml:space="preserve"> Ahmed</w:t>
+        </w:r>
+      </w:ins>
+    </w:p>
+    <w:p>
+      <w:pPr>
         <w:rPr>
           <w:i/>
           <w:color w:val="EE0000"/>
           <w:sz w:val="32"/>
           <w:szCs w:val="32"/>
         </w:rPr>
-        <w:t>?</w:t>
-      </w:r>
+      </w:pPr>
     </w:p>
     <w:p>
       <w:pPr>
@@ -405,24 +541,64 @@
           <w:szCs w:val="32"/>
         </w:rPr>
       </w:pPr>
-    </w:p>
-    <w:p>
-      <w:pPr>
+      <w:r>
         <w:rPr>
           <w:i/>
           <w:color w:val="156082"/>
           <w:sz w:val="32"/>
           <w:szCs w:val="32"/>
         </w:rPr>
-      </w:pPr>
-      <w:r>
+        <w:t xml:space="preserve">Assessment Date </w:t>
+      </w:r>
+    </w:p>
+    <w:p>
+      <w:pPr>
+        <w:rPr>
+          <w:i/>
+          <w:color w:val="EE0000"/>
+          <w:sz w:val="32"/>
+          <w:szCs w:val="32"/>
+        </w:rPr>
+      </w:pPr>
+      <w:ins w:id="5" w:author="kyle O'Reilly" w:date="2026-10-20T21:25:00Z" w16du:dateUtc="2026-10-20T20:25:00Z">
+        <w:r>
+          <w:rPr>
+            <w:i/>
+            <w:color w:val="EE0000"/>
+            <w:sz w:val="32"/>
+            <w:szCs w:val="32"/>
+          </w:rPr>
+          <w:t>25/10/2026</w:t>
+        </w:r>
+      </w:ins>
+    </w:p>
+    <w:p>
+      <w:pPr>
         <w:rPr>
           <w:i/>
           <w:color w:val="156082"/>
           <w:sz w:val="32"/>
           <w:szCs w:val="32"/>
         </w:rPr>
-        <w:t>Assessment Title</w:t>
+      </w:pPr>
+    </w:p>
+    <w:p>
+      <w:pPr>
+        <w:rPr>
+          <w:i/>
+          <w:color w:val="156082"/>
+          <w:sz w:val="32"/>
+          <w:szCs w:val="32"/>
+        </w:rPr>
+      </w:pPr>
+      <w:r>
+        <w:rPr>
+          <w:i/>
+          <w:color w:val="156082"/>
+          <w:sz w:val="32"/>
+          <w:szCs w:val="32"/>
+        </w:rPr>
+        <w:t>Date of Submission</w:t>
       </w:r>
     </w:p>
     <w:p>
@@ -434,159 +610,17 @@
           <w:szCs w:val="32"/>
         </w:rPr>
       </w:pPr>
-      <w:r>
-        <w:rPr>
-          <w:i/>
-          <w:color w:val="EE0000"/>
-          <w:sz w:val="32"/>
-          <w:szCs w:val="32"/>
-        </w:rPr>
-        <w:t>?</w:t>
-      </w:r>
-    </w:p>
-    <w:p>
-      <w:pPr>
-        <w:rPr>
-          <w:i/>
-          <w:color w:val="EE0000"/>
-          <w:sz w:val="32"/>
-          <w:szCs w:val="32"/>
-        </w:rPr>
-      </w:pPr>
-    </w:p>
-    <w:p>
-      <w:pPr>
-        <w:rPr>
-          <w:i/>
-          <w:color w:val="156082"/>
-          <w:sz w:val="32"/>
-          <w:szCs w:val="32"/>
-        </w:rPr>
-      </w:pPr>
-      <w:r>
-        <w:rPr>
-          <w:i/>
-          <w:color w:val="156082"/>
-          <w:sz w:val="32"/>
-          <w:szCs w:val="32"/>
-        </w:rPr>
-        <w:t>Lecturer/Supervisor</w:t>
-      </w:r>
-    </w:p>
-    <w:p>
-      <w:pPr>
-        <w:rPr>
-          <w:i/>
-          <w:color w:val="EE0000"/>
-          <w:sz w:val="32"/>
-          <w:szCs w:val="32"/>
-        </w:rPr>
-      </w:pPr>
-      <w:r>
-        <w:rPr>
-          <w:i/>
-          <w:color w:val="EE0000"/>
-          <w:sz w:val="32"/>
-          <w:szCs w:val="32"/>
-        </w:rPr>
-        <w:t>?</w:t>
-      </w:r>
-    </w:p>
-    <w:p>
-      <w:pPr>
-        <w:rPr>
-          <w:i/>
-          <w:color w:val="EE0000"/>
-          <w:sz w:val="32"/>
-          <w:szCs w:val="32"/>
-        </w:rPr>
-      </w:pPr>
-    </w:p>
-    <w:p>
-      <w:pPr>
-        <w:rPr>
-          <w:i/>
-          <w:color w:val="156082"/>
-          <w:sz w:val="32"/>
-          <w:szCs w:val="32"/>
-        </w:rPr>
-      </w:pPr>
-      <w:r>
-        <w:rPr>
-          <w:i/>
-          <w:color w:val="156082"/>
-          <w:sz w:val="32"/>
-          <w:szCs w:val="32"/>
-        </w:rPr>
-        <w:t xml:space="preserve">Assessment Date </w:t>
-      </w:r>
-    </w:p>
-    <w:p>
-      <w:pPr>
-        <w:rPr>
-          <w:i/>
-          <w:color w:val="EE0000"/>
-          <w:sz w:val="32"/>
-          <w:szCs w:val="32"/>
-        </w:rPr>
-      </w:pPr>
-      <w:r>
-        <w:rPr>
-          <w:i/>
-          <w:color w:val="EE0000"/>
-          <w:sz w:val="32"/>
-          <w:szCs w:val="32"/>
-        </w:rPr>
-        <w:t>?</w:t>
-      </w:r>
-    </w:p>
-    <w:p>
-      <w:pPr>
-        <w:rPr>
-          <w:i/>
-          <w:color w:val="156082"/>
-          <w:sz w:val="32"/>
-          <w:szCs w:val="32"/>
-        </w:rPr>
-      </w:pPr>
-    </w:p>
-    <w:p>
-      <w:pPr>
-        <w:rPr>
-          <w:i/>
-          <w:color w:val="156082"/>
-          <w:sz w:val="32"/>
-          <w:szCs w:val="32"/>
-        </w:rPr>
-      </w:pPr>
-      <w:r>
-        <w:rPr>
-          <w:i/>
-          <w:color w:val="156082"/>
-          <w:sz w:val="32"/>
-          <w:szCs w:val="32"/>
-        </w:rPr>
-        <w:t>Date of Submission</w:t>
-      </w:r>
-    </w:p>
-    <w:p>
-      <w:pPr>
-        <w:rPr>
-          <w:i/>
-          <w:color w:val="EE0000"/>
-          <w:sz w:val="32"/>
-          <w:szCs w:val="32"/>
-        </w:rPr>
-      </w:pPr>
-      <w:r>
-        <w:rPr>
-          <w:i/>
-          <w:color w:val="EE0000"/>
-          <w:sz w:val="32"/>
-          <w:szCs w:val="32"/>
-        </w:rPr>
-        <w:t>?</w:t>
-      </w:r>
+      <w:ins w:id="6" w:author="kyle O'Reilly" w:date="2026-10-20T21:25:00Z" w16du:dateUtc="2026-10-20T20:25:00Z">
+        <w:r>
+          <w:rPr>
+            <w:i/>
+            <w:color w:val="EE0000"/>
+            <w:sz w:val="32"/>
+            <w:szCs w:val="32"/>
+          </w:rPr>
+          <w:t>25/10/2026</w:t>
+        </w:r>
+      </w:ins>
     </w:p>
     <w:p>
       <w:pPr>
@@ -650,17 +684,32 @@
           <w:szCs w:val="32"/>
         </w:rPr>
       </w:pPr>
-      <w:r>
-        <w:rPr>
-          <w:bCs/>
-          <w:i/>
-          <w:iCs/>
-          <w:color w:val="EE0000"/>
-          <w:sz w:val="32"/>
-          <w:szCs w:val="32"/>
-        </w:rPr>
-        <w:t>?</w:t>
-      </w:r>
+      <w:ins w:id="7" w:author="kyle O'Reilly" w:date="2026-10-20T21:25:00Z" w16du:dateUtc="2026-10-20T20:25:00Z">
+        <w:r>
+          <w:rPr>
+            <w:bCs/>
+            <w:i/>
+            <w:iCs/>
+            <w:color w:val="EE0000"/>
+            <w:sz w:val="32"/>
+            <w:szCs w:val="32"/>
+          </w:rPr>
+          <w:t>https://github.com/sba26104-KOR/HDSDAB---Strategic-Thinking---Capstone-</w:t>
+        </w:r>
+        <w:proofErr w:type="spellStart"/>
+        <w:r>
+          <w:rPr>
+            <w:bCs/>
+            <w:i/>
+            <w:iCs/>
+            <w:color w:val="EE0000"/>
+            <w:sz w:val="32"/>
+            <w:szCs w:val="32"/>
+          </w:rPr>
+          <w:t>Project.git</w:t>
+        </w:r>
+      </w:ins>
+      <w:proofErr w:type="spellEnd"/>
     </w:p>
     <w:p>
       <w:pPr>
@@ -1111,6 +1160,14 @@
     </w:p>
     <w:sdt>
       <w:sdtPr>
+        <w:rPr>
+          <w:rFonts w:ascii="Calibri" w:eastAsia="Calibri" w:hAnsi="Calibri" w:cs="Calibri"/>
+          <w:color w:val="auto"/>
+          <w:spacing w:val="0"/>
+          <w:sz w:val="22"/>
+          <w:szCs w:val="22"/>
+          <w:lang w:val="en-IE"/>
+        </w:rPr>
         <w:id w:val="-1686670332"/>
         <w:docPartObj>
           <w:docPartGallery w:val="Table of Contents"/>
@@ -1119,15 +1176,9 @@
       </w:sdtPr>
       <w:sdtEndPr>
         <w:rPr>
-          <w:rFonts w:ascii="Calibri" w:eastAsia="Calibri" w:hAnsi="Calibri" w:cs="Calibri"/>
           <w:b/>
           <w:bCs/>
           <w:noProof/>
-          <w:color w:val="auto"/>
-          <w:spacing w:val="0"/>
-          <w:sz w:val="22"/>
-          <w:szCs w:val="22"/>
-          <w:lang w:val="en-IE"/>
         </w:rPr>
       </w:sdtEndPr>
       <w:sdtContent>
@@ -1141,7 +1192,137 @@
           </w:r>
         </w:p>
         <w:p>
-          <w:fldSimple w:instr=" TOC \o &quot;1-3&quot; \h \z \u ">
+          <w:pPr>
+            <w:pStyle w:val="TOC1"/>
+            <w:tabs>
+              <w:tab w:val="right" w:leader="dot" w:pos="9016"/>
+            </w:tabs>
+            <w:rPr>
+              <w:ins w:id="8" w:author="kyle O'Reilly" w:date="2026-10-20T21:26:00Z" w16du:dateUtc="2026-10-20T20:26:00Z"/>
+              <w:rFonts w:asciiTheme="minorHAnsi" w:eastAsiaTheme="minorEastAsia" w:hAnsiTheme="minorHAnsi" w:cstheme="minorBidi"/>
+              <w:noProof/>
+              <w:kern w:val="2"/>
+              <w:sz w:val="24"/>
+              <w:szCs w:val="24"/>
+              <w14:ligatures w14:val="standardContextual"/>
+            </w:rPr>
+          </w:pPr>
+          <w:r>
+            <w:fldChar w:fldCharType="begin"/>
+          </w:r>
+          <w:r>
+            <w:instrText xml:space="preserve"> TOC \o "1-3" \h \z \u </w:instrText>
+          </w:r>
+          <w:r>
+            <w:fldChar w:fldCharType="separate"/>
+          </w:r>
+          <w:ins w:id="9" w:author="kyle O'Reilly" w:date="2026-10-20T21:26:00Z" w16du:dateUtc="2026-10-20T20:26:00Z">
+            <w:r>
+              <w:rPr>
+                <w:rStyle w:val="Hyperlink"/>
+                <w:noProof/>
+              </w:rPr>
+              <w:fldChar w:fldCharType="begin"/>
+            </w:r>
+            <w:r>
+              <w:rPr>
+                <w:rStyle w:val="Hyperlink"/>
+                <w:noProof/>
+              </w:rPr>
+              <w:instrText xml:space="preserve"> </w:instrText>
+            </w:r>
+            <w:r>
+              <w:rPr>
+                <w:noProof/>
+              </w:rPr>
+              <w:instrText>HYPERLINK \l "_Toc243423982"</w:instrText>
+            </w:r>
+            <w:r>
+              <w:rPr>
+                <w:rStyle w:val="Hyperlink"/>
+                <w:noProof/>
+              </w:rPr>
+              <w:instrText xml:space="preserve"> </w:instrText>
+            </w:r>
+            <w:r>
+              <w:rPr>
+                <w:rStyle w:val="Hyperlink"/>
+                <w:noProof/>
+              </w:rPr>
+            </w:r>
+            <w:r>
+              <w:rPr>
+                <w:rStyle w:val="Hyperlink"/>
+                <w:noProof/>
+              </w:rPr>
+              <w:fldChar w:fldCharType="separate"/>
+            </w:r>
+            <w:r>
+              <w:rPr>
+                <w:rStyle w:val="Hyperlink"/>
+                <w:noProof/>
+              </w:rPr>
+              <w:t>1. Introduction</w:t>
+            </w:r>
+            <w:r>
+              <w:rPr>
+                <w:noProof/>
+                <w:webHidden/>
+              </w:rPr>
+              <w:tab/>
+            </w:r>
+            <w:r>
+              <w:rPr>
+                <w:noProof/>
+                <w:webHidden/>
+              </w:rPr>
+              <w:fldChar w:fldCharType="begin"/>
+            </w:r>
+            <w:r>
+              <w:rPr>
+                <w:noProof/>
+                <w:webHidden/>
+              </w:rPr>
+              <w:instrText xml:space="preserve"> PAGEREF _Toc243423982 \h </w:instrText>
+            </w:r>
+            <w:r>
+              <w:rPr>
+                <w:noProof/>
+                <w:webHidden/>
+              </w:rPr>
+            </w:r>
+            <w:r>
+              <w:rPr>
+                <w:noProof/>
+                <w:webHidden/>
+              </w:rPr>
+              <w:fldChar w:fldCharType="separate"/>
+            </w:r>
+            <w:r>
+              <w:rPr>
+                <w:noProof/>
+                <w:webHidden/>
+              </w:rPr>
+              <w:t>1</w:t>
+            </w:r>
+            <w:r>
+              <w:rPr>
+                <w:noProof/>
+                <w:webHidden/>
+              </w:rPr>
+              <w:fldChar w:fldCharType="end"/>
+            </w:r>
+            <w:r>
+              <w:rPr>
+                <w:rStyle w:val="Hyperlink"/>
+                <w:noProof/>
+              </w:rPr>
+              <w:fldChar w:fldCharType="end"/>
+            </w:r>
+          </w:ins>
+        </w:p>
+        <w:p>
+          <w:del w:id="10" w:author="kyle O'Reilly" w:date="2026-10-20T21:26:00Z" w16du:dateUtc="2026-10-20T20:26:00Z">
             <w:r>
               <w:rPr>
                 <w:b/>
@@ -1149,9 +1330,18 @@
                 <w:noProof/>
                 <w:lang w:val="en-US"/>
               </w:rPr>
-              <w:t>No table of contents entries found.</w:t>
+              <w:delText>No table of contents entries found.</w:delText>
             </w:r>
-          </w:fldSimple>
+          </w:del>
+          <w:r>
+            <w:rPr>
+              <w:b/>
+              <w:bCs/>
+              <w:noProof/>
+              <w:lang w:val="en-US"/>
+            </w:rPr>
+            <w:fldChar w:fldCharType="end"/>
+          </w:r>
         </w:p>
       </w:sdtContent>
     </w:sdt>
@@ -1183,7 +1373,13 @@
     <w:p/>
     <w:p/>
     <w:p/>
-    <w:p/>
+    <w:p>
+      <w:pPr>
+        <w:rPr>
+          <w:del w:id="11" w:author="kyle O'Reilly" w:date="2026-10-20T21:26:00Z" w16du:dateUtc="2026-10-20T20:26:00Z"/>
+        </w:rPr>
+      </w:pPr>
+    </w:p>
     <w:p>
       <w:pPr>
         <w:sectPr>
@@ -1195,6 +1391,27 @@
           <w:docGrid w:linePitch="299"/>
         </w:sectPr>
       </w:pPr>
+    </w:p>
+    <w:p>
+      <w:pPr>
+        <w:pStyle w:val="Heading1"/>
+        <w:rPr>
+          <w:ins w:id="12" w:author="kyle O'Reilly" w:date="2026-10-20T21:26:00Z" w16du:dateUtc="2026-10-20T20:26:00Z"/>
+        </w:rPr>
+      </w:pPr>
+      <w:bookmarkStart w:id="13" w:name="_Toc243423982"/>
+      <w:ins w:id="14" w:author="kyle O'Reilly" w:date="2026-10-20T21:25:00Z" w16du:dateUtc="2026-10-20T20:25:00Z">
+        <w:r>
+          <w:lastRenderedPageBreak/>
+          <w:t>1.</w:t>
+        </w:r>
+      </w:ins>
+      <w:ins w:id="15" w:author="kyle O'Reilly" w:date="2026-10-20T21:26:00Z" w16du:dateUtc="2026-10-20T20:26:00Z">
+        <w:r>
+          <w:t xml:space="preserve"> Introduction</w:t>
+        </w:r>
+        <w:bookmarkEnd w:id="13"/>
+      </w:ins>
     </w:p>
     <w:p/>
     <w:p/>
@@ -2192,6 +2409,14 @@
     <w:abstractNumId w:val="3"/>
   </w:num>
 </w:numbering>
+</file>
+
+<file path=word/people.xml><?xml version="1.0" encoding="utf-8"?>
+<w15:people xmlns:wpc="http://schemas.microsoft.com/office/word/2010/wordprocessingCanvas" xmlns:cx="http://schemas.microsoft.com/office/drawing/2014/chartex" xmlns:cx1="http://schemas.microsoft.com/office/drawing/2015/9/8/chartex" xmlns:cx2="http://schemas.microsoft.com/office/drawing/2015/10/21/chartex" xmlns:cx3="http://schemas.microsoft.com/office/drawing/2016/5/9/chartex" xmlns:cx4="http://schemas.microsoft.com/office/drawing/2016/5/10/chartex" xmlns:cx5="http://schemas.microsoft.com/office/drawing/2016/5/11/chartex" xmlns:cx6="http://schemas.microsoft.com/office/drawing/2016/5/12/chartex" xmlns:cx7="http://schemas.microsoft.com/office/drawing/2016/5/13/chartex" xmlns:cx8="http://schemas.microsoft.com/office/drawing/2016/5/14/chartex" xmlns:mc="http://schemas.openxmlformats.org/markup-compatibility/2006" xmlns:aink="http://schemas.microsoft.com/office/drawing/2016/ink" xmlns:am3d="http://schemas.microsoft.com/office/drawing/2017/model3d" xmlns:o="urn:schemas-microsoft-com:office:office" xmlns:oel="http://schemas.microsoft.com/office/2019/extlst" xmlns:r="http://schemas.openxmlformats.org/officeDocument/2006/relationships" xmlns:m="http://schemas.openxmlformats.org/officeDocument/2006/math" xmlns:v="urn:schemas-microsoft-com:vml" xmlns:wp14="http://schemas.microsoft.com/office/word/2010/wordprocessingDrawing" xmlns:wp="http://schemas.openxmlformats.org/drawingml/2006/wordprocessingDrawing" xmlns:w10="urn:schemas-microsoft-com:office:word" xmlns:w="http://schemas.openxmlformats.org/wordprocessingml/2006/main" xmlns:w14="http://schemas.microsoft.com/office/word/2010/wordml" xmlns:w15="http://schemas.microsoft.com/office/word/2012/wordml" xmlns:w16cex="http://schemas.microsoft.com/office/word/2018/wordml/cex" xmlns:w16cid="http://schemas.microsoft.com/office/word/2016/wordml/cid" xmlns:w16="http://schemas.microsoft.com/office/word/2018/wordml" xmlns:w16du="http://schemas.microsoft.com/office/word/2023/wordml/word16du" xmlns:w16sdtdh="http://schemas.microsoft.com/office/word/2020/wordml/sdtdatahash" xmlns:w16sdtfl="http://schemas.microsoft.com/office/word/2024/wordml/sdtformatlock" xmlns:w16se="http://schemas.microsoft.com/office/word/2015/wordml/symex" xmlns:wpg="http://schemas.microsoft.com/office/word/2010/wordprocessingGroup" xmlns:wpi="http://schemas.microsoft.com/office/word/2010/wordprocessingInk" xmlns:wne="http://schemas.microsoft.com/office/word/2006/wordml" xmlns:wps="http://schemas.microsoft.com/office/word/2010/wordprocessingShape" mc:Ignorable="w14 w15 w16se w16cid w16 w16cex w16sdtdh w16sdtfl w16du wp14">
+  <w15:person w15:author="kyle O'Reilly">
+    <w15:presenceInfo w15:providerId="Windows Live" w15:userId="38bd3c45077cf21c"/>
+  </w15:person>
+</w15:people>
 </file>
 
 <file path=word/styles.xml><?xml version="1.0" encoding="utf-8"?>
@@ -3603,6 +3828,10 @@
 </file>
 
 <file path=customXml/item1.xml><?xml version="1.0" encoding="utf-8"?>
+<b:Sources xmlns:b="http://schemas.openxmlformats.org/officeDocument/2006/bibliography" xmlns="http://schemas.openxmlformats.org/officeDocument/2006/bibliography" SelectedStyle="\APASixthEditionOfficeOnline.xsl" StyleName="APA" Version="6"/>
+</file>
+
+<file path=customXml/item2.xml><?xml version="1.0" encoding="utf-8"?>
 <ct:contentTypeSchema xmlns:ct="http://schemas.microsoft.com/office/2006/metadata/contentType" xmlns:ma="http://schemas.microsoft.com/office/2006/metadata/properties/metaAttributes" ct:_="" ma:_="" ma:contentTypeName="Document" ma:contentTypeID="0x01010091CA7052A48FB44E8BAE44044031FC77" ma:contentTypeVersion="5" ma:contentTypeDescription="Create a new document." ma:contentTypeScope="" ma:versionID="72110da391d7bf7bbbd9879cda66318c">
   <xsd:schema xmlns:xsd="http://www.w3.org/2001/XMLSchema" xmlns:xs="http://www.w3.org/2001/XMLSchema" xmlns:p="http://schemas.microsoft.com/office/2006/metadata/properties" xmlns:ns3="b16a9495-4dfd-42d3-807b-98cb11f03b43" targetNamespace="http://schemas.microsoft.com/office/2006/metadata/properties" ma:root="true" ma:fieldsID="65d4c4ab10123b5e2192ffab3149626d" ns3:_="">
     <xsd:import namespace="b16a9495-4dfd-42d3-807b-98cb11f03b43"/>
@@ -3752,17 +3981,10 @@
 </ct:contentTypeSchema>
 </file>
 
-<file path=customXml/item2.xml><?xml version="1.0" encoding="utf-8"?>
-<b:Sources xmlns:b="http://schemas.openxmlformats.org/officeDocument/2006/bibliography" xmlns="http://schemas.openxmlformats.org/officeDocument/2006/bibliography" SelectedStyle="\APASixthEditionOfficeOnline.xsl" StyleName="APA" Version="6"/>
-</file>
-
 <file path=customXml/item3.xml><?xml version="1.0" encoding="utf-8"?>
-<?mso-contentType ?>
-<FormTemplates xmlns="http://schemas.microsoft.com/sharepoint/v3/contenttype/forms">
-  <Display>DocumentLibraryForm</Display>
-  <Edit>DocumentLibraryForm</Edit>
-  <New>DocumentLibraryForm</New>
-</FormTemplates>
+<go:gDocsCustomXmlDataStorage xmlns:go="http://customooxmlschemas.google.com/" xmlns:r="http://schemas.openxmlformats.org/officeDocument/2006/relationships" uri="GoogleDocsCustomDataVersion2">
+  <go:docsCustomData xmlns:go="http://customooxmlschemas.google.com/" roundtripDataSignature="AMtx7miehlgh2pzFvkmpnhkVaeODs3Wnuw==">CgMxLjAyCGguZ2pkZ3hzMgloLjMwajB6bGwyCWguMWZvYjl0ZTIJaC4zem55c2g3MgloLjJldDkycDAyDmgua2ZranMzcndsMmMxOAByITF6bEVRVXYyWkdtTjZWemdfYk5uaGpmb0x1c2hhYUo3dw==</go:docsCustomData>
+</go:gDocsCustomXmlDataStorage>
 </file>
 
 <file path=customXml/item4.xml><?xml version="1.0" encoding="utf-8"?>
@@ -3774,12 +3996,23 @@
 </file>
 
 <file path=customXml/item5.xml><?xml version="1.0" encoding="utf-8"?>
-<go:gDocsCustomXmlDataStorage xmlns:go="http://customooxmlschemas.google.com/" xmlns:r="http://schemas.openxmlformats.org/officeDocument/2006/relationships" uri="GoogleDocsCustomDataVersion2">
-  <go:docsCustomData xmlns:go="http://customooxmlschemas.google.com/" roundtripDataSignature="AMtx7miehlgh2pzFvkmpnhkVaeODs3Wnuw==">CgMxLjAyCGguZ2pkZ3hzMgloLjMwajB6bGwyCWguMWZvYjl0ZTIJaC4zem55c2g3MgloLjJldDkycDAyDmgua2ZranMzcndsMmMxOAByITF6bEVRVXYyWkdtTjZWemdfYk5uaGpmb0x1c2hhYUo3dw==</go:docsCustomData>
-</go:gDocsCustomXmlDataStorage>
+<?mso-contentType ?>
+<FormTemplates xmlns="http://schemas.microsoft.com/sharepoint/v3/contenttype/forms">
+  <Display>DocumentLibraryForm</Display>
+  <Edit>DocumentLibraryForm</Edit>
+  <New>DocumentLibraryForm</New>
+</FormTemplates>
 </file>
 
 <file path=customXml/itemProps1.xml><?xml version="1.0" encoding="utf-8"?>
+<ds:datastoreItem xmlns:ds="http://schemas.openxmlformats.org/officeDocument/2006/customXml" ds:itemID="{A5C61161-19E4-4D42-A5DA-EC591AFE0A7D}">
+  <ds:schemaRefs>
+    <ds:schemaRef ds:uri="http://schemas.openxmlformats.org/officeDocument/2006/bibliography"/>
+  </ds:schemaRefs>
+</ds:datastoreItem>
+</file>
+
+<file path=customXml/itemProps2.xml><?xml version="1.0" encoding="utf-8"?>
 <ds:datastoreItem xmlns:ds="http://schemas.openxmlformats.org/officeDocument/2006/customXml" ds:itemID="{1CD39011-2B34-4226-8638-59B13D86301D}">
   <ds:schemaRefs>
     <ds:schemaRef ds:uri="http://schemas.microsoft.com/office/2006/metadata/contentType"/>
@@ -3797,18 +4030,11 @@
 </ds:datastoreItem>
 </file>
 
-<file path=customXml/itemProps2.xml><?xml version="1.0" encoding="utf-8"?>
-<ds:datastoreItem xmlns:ds="http://schemas.openxmlformats.org/officeDocument/2006/customXml" ds:itemID="{A5C61161-19E4-4D42-A5DA-EC591AFE0A7D}">
+<file path=customXml/itemProps3.xml><?xml version="1.0" encoding="utf-8"?>
+<ds:datastoreItem xmlns:ds="http://schemas.openxmlformats.org/officeDocument/2006/customXml" ds:itemID="{11111111-1234-1234-1234-123412341234}">
   <ds:schemaRefs>
-    <ds:schemaRef ds:uri="http://schemas.openxmlformats.org/officeDocument/2006/bibliography"/>
-  </ds:schemaRefs>
-</ds:datastoreItem>
-</file>
-
-<file path=customXml/itemProps3.xml><?xml version="1.0" encoding="utf-8"?>
-<ds:datastoreItem xmlns:ds="http://schemas.openxmlformats.org/officeDocument/2006/customXml" ds:itemID="{AD64260C-1345-4C21-A804-B9FBE7B91489}">
-  <ds:schemaRefs>
-    <ds:schemaRef ds:uri="http://schemas.microsoft.com/sharepoint/v3/contenttype/forms"/>
+    <ds:schemaRef ds:uri="http://customooxmlschemas.google.com/"/>
+    <ds:schemaRef ds:uri="http://schemas.openxmlformats.org/officeDocument/2006/relationships"/>
   </ds:schemaRefs>
 </ds:datastoreItem>
 </file>
@@ -3824,10 +4050,9 @@
 </file>
 
 <file path=customXml/itemProps5.xml><?xml version="1.0" encoding="utf-8"?>
-<ds:datastoreItem xmlns:ds="http://schemas.openxmlformats.org/officeDocument/2006/customXml" ds:itemID="{11111111-1234-1234-1234-123412341234}">
+<ds:datastoreItem xmlns:ds="http://schemas.openxmlformats.org/officeDocument/2006/customXml" ds:itemID="{AD64260C-1345-4C21-A804-B9FBE7B91489}">
   <ds:schemaRefs>
-    <ds:schemaRef ds:uri="http://customooxmlschemas.google.com/"/>
-    <ds:schemaRef ds:uri="http://schemas.openxmlformats.org/officeDocument/2006/relationships"/>
+    <ds:schemaRef ds:uri="http://schemas.microsoft.com/sharepoint/v3/contenttype/forms"/>
   </ds:schemaRefs>
 </ds:datastoreItem>
 </file>
</xml_diff>

<commit_message>
Completed Project Title information
</commit_message>
<xml_diff>
--- a/HDSDAB - Strategic Thinking - Capstone Project.docx
+++ b/HDSDAB - Strategic Thinking - Capstone Project.docx
@@ -1198,7 +1198,7 @@
               <w:tab w:val="right" w:leader="dot" w:pos="9016"/>
             </w:tabs>
             <w:rPr>
-              <w:ins w:id="8" w:author="kyle O'Reilly" w:date="2026-10-20T21:26:00Z" w16du:dateUtc="2026-10-20T20:26:00Z"/>
+              <w:ins w:id="8" w:author="kyle O'Reilly" w:date="2026-10-21T20:28:00Z" w16du:dateUtc="2026-10-21T19:28:00Z"/>
               <w:rFonts w:asciiTheme="minorHAnsi" w:eastAsiaTheme="minorEastAsia" w:hAnsiTheme="minorHAnsi" w:cstheme="minorBidi"/>
               <w:noProof/>
               <w:kern w:val="2"/>
@@ -1216,7 +1216,7 @@
           <w:r>
             <w:fldChar w:fldCharType="separate"/>
           </w:r>
-          <w:ins w:id="9" w:author="kyle O'Reilly" w:date="2026-10-20T21:26:00Z" w16du:dateUtc="2026-10-20T20:26:00Z">
+          <w:ins w:id="9" w:author="kyle O'Reilly" w:date="2026-10-21T20:28:00Z" w16du:dateUtc="2026-10-21T19:28:00Z">
             <w:r>
               <w:rPr>
                 <w:rStyle w:val="Hyperlink"/>
@@ -1235,7 +1235,7 @@
               <w:rPr>
                 <w:noProof/>
               </w:rPr>
-              <w:instrText>HYPERLINK \l "_Toc243423982"</w:instrText>
+              <w:instrText>HYPERLINK \l "_Toc243506922"</w:instrText>
             </w:r>
             <w:r>
               <w:rPr>
@@ -1262,7 +1262,7 @@
                 <w:rStyle w:val="Hyperlink"/>
                 <w:noProof/>
               </w:rPr>
-              <w:t>1. Introduction</w:t>
+              <w:t>1. Project Title</w:t>
             </w:r>
             <w:r>
               <w:rPr>
@@ -1283,7 +1283,7 @@
                 <w:noProof/>
                 <w:webHidden/>
               </w:rPr>
-              <w:instrText xml:space="preserve"> PAGEREF _Toc243423982 \h </w:instrText>
+              <w:instrText xml:space="preserve"> PAGEREF _Toc243506922 \h </w:instrText>
             </w:r>
             <w:r>
               <w:rPr>
@@ -1322,7 +1322,128 @@
           </w:ins>
         </w:p>
         <w:p>
-          <w:del w:id="10" w:author="kyle O'Reilly" w:date="2026-10-20T21:26:00Z" w16du:dateUtc="2026-10-20T20:26:00Z">
+          <w:pPr>
+            <w:pStyle w:val="TOC1"/>
+            <w:tabs>
+              <w:tab w:val="right" w:leader="dot" w:pos="9016"/>
+            </w:tabs>
+            <w:rPr>
+              <w:ins w:id="10" w:author="kyle O'Reilly" w:date="2026-10-21T20:28:00Z" w16du:dateUtc="2026-10-21T19:28:00Z"/>
+              <w:rFonts w:asciiTheme="minorHAnsi" w:eastAsiaTheme="minorEastAsia" w:hAnsiTheme="minorHAnsi" w:cstheme="minorBidi"/>
+              <w:noProof/>
+              <w:kern w:val="2"/>
+              <w:sz w:val="24"/>
+              <w:szCs w:val="24"/>
+              <w14:ligatures w14:val="standardContextual"/>
+            </w:rPr>
+          </w:pPr>
+          <w:ins w:id="11" w:author="kyle O'Reilly" w:date="2026-10-21T20:28:00Z" w16du:dateUtc="2026-10-21T19:28:00Z">
+            <w:r>
+              <w:rPr>
+                <w:rStyle w:val="Hyperlink"/>
+                <w:noProof/>
+              </w:rPr>
+              <w:fldChar w:fldCharType="begin"/>
+            </w:r>
+            <w:r>
+              <w:rPr>
+                <w:rStyle w:val="Hyperlink"/>
+                <w:noProof/>
+              </w:rPr>
+              <w:instrText xml:space="preserve"> </w:instrText>
+            </w:r>
+            <w:r>
+              <w:rPr>
+                <w:noProof/>
+              </w:rPr>
+              <w:instrText>HYPERLINK \l "_Toc243506923"</w:instrText>
+            </w:r>
+            <w:r>
+              <w:rPr>
+                <w:rStyle w:val="Hyperlink"/>
+                <w:noProof/>
+              </w:rPr>
+              <w:instrText xml:space="preserve"> </w:instrText>
+            </w:r>
+            <w:r>
+              <w:rPr>
+                <w:rStyle w:val="Hyperlink"/>
+                <w:noProof/>
+              </w:rPr>
+            </w:r>
+            <w:r>
+              <w:rPr>
+                <w:rStyle w:val="Hyperlink"/>
+                <w:noProof/>
+              </w:rPr>
+              <w:fldChar w:fldCharType="separate"/>
+            </w:r>
+            <w:r>
+              <w:rPr>
+                <w:rStyle w:val="Hyperlink"/>
+                <w:noProof/>
+              </w:rPr>
+              <w:t>2. Introduction</w:t>
+            </w:r>
+            <w:r>
+              <w:rPr>
+                <w:noProof/>
+                <w:webHidden/>
+              </w:rPr>
+              <w:tab/>
+            </w:r>
+            <w:r>
+              <w:rPr>
+                <w:noProof/>
+                <w:webHidden/>
+              </w:rPr>
+              <w:fldChar w:fldCharType="begin"/>
+            </w:r>
+            <w:r>
+              <w:rPr>
+                <w:noProof/>
+                <w:webHidden/>
+              </w:rPr>
+              <w:instrText xml:space="preserve"> PAGEREF _Toc243506923 \h </w:instrText>
+            </w:r>
+            <w:r>
+              <w:rPr>
+                <w:noProof/>
+                <w:webHidden/>
+              </w:rPr>
+            </w:r>
+            <w:r>
+              <w:rPr>
+                <w:noProof/>
+                <w:webHidden/>
+              </w:rPr>
+              <w:fldChar w:fldCharType="separate"/>
+            </w:r>
+            <w:r>
+              <w:rPr>
+                <w:noProof/>
+                <w:webHidden/>
+              </w:rPr>
+              <w:t>1</w:t>
+            </w:r>
+            <w:r>
+              <w:rPr>
+                <w:noProof/>
+                <w:webHidden/>
+              </w:rPr>
+              <w:fldChar w:fldCharType="end"/>
+            </w:r>
+            <w:r>
+              <w:rPr>
+                <w:rStyle w:val="Hyperlink"/>
+                <w:noProof/>
+              </w:rPr>
+              <w:fldChar w:fldCharType="end"/>
+            </w:r>
+          </w:ins>
+        </w:p>
+        <w:p>
+          <w:del w:id="12" w:author="kyle O'Reilly" w:date="2026-10-20T21:26:00Z" w16du:dateUtc="2026-10-20T20:26:00Z">
             <w:r>
               <w:rPr>
                 <w:b/>
@@ -1372,11 +1493,17 @@
     <w:p/>
     <w:p/>
     <w:p/>
-    <w:p/>
     <w:p>
       <w:pPr>
         <w:rPr>
-          <w:del w:id="11" w:author="kyle O'Reilly" w:date="2026-10-20T21:26:00Z" w16du:dateUtc="2026-10-20T20:26:00Z"/>
+          <w:del w:id="13" w:author="kyle O'Reilly" w:date="2026-10-21T20:28:00Z" w16du:dateUtc="2026-10-21T19:28:00Z"/>
+        </w:rPr>
+      </w:pPr>
+    </w:p>
+    <w:p>
+      <w:pPr>
+        <w:rPr>
+          <w:del w:id="14" w:author="kyle O'Reilly" w:date="2026-10-20T21:26:00Z" w16du:dateUtc="2026-10-20T20:26:00Z"/>
         </w:rPr>
       </w:pPr>
     </w:p>
@@ -1395,23 +1522,105 @@
     <w:p>
       <w:pPr>
         <w:pStyle w:val="Heading1"/>
-        <w:rPr>
-          <w:ins w:id="12" w:author="kyle O'Reilly" w:date="2026-10-20T21:26:00Z" w16du:dateUtc="2026-10-20T20:26:00Z"/>
-        </w:rPr>
-      </w:pPr>
-      <w:bookmarkStart w:id="13" w:name="_Toc243423982"/>
-      <w:ins w:id="14" w:author="kyle O'Reilly" w:date="2026-10-20T21:25:00Z" w16du:dateUtc="2026-10-20T20:25:00Z">
+        <w:spacing w:line="360" w:lineRule="auto"/>
+        <w:jc w:val="both"/>
+        <w:rPr>
+          <w:ins w:id="15" w:author="kyle O'Reilly" w:date="2026-10-21T20:28:00Z" w16du:dateUtc="2026-10-21T19:28:00Z"/>
+        </w:rPr>
+        <w:pPrChange w:id="16" w:author="kyle O'Reilly" w:date="2026-10-21T20:33:00Z" w16du:dateUtc="2026-10-21T19:33:00Z">
+          <w:pPr>
+            <w:pStyle w:val="Heading1"/>
+          </w:pPr>
+        </w:pPrChange>
+      </w:pPr>
+      <w:bookmarkStart w:id="17" w:name="_Toc243506922"/>
+      <w:ins w:id="18" w:author="kyle O'Reilly" w:date="2026-10-20T21:25:00Z" w16du:dateUtc="2026-10-20T20:25:00Z">
         <w:r>
           <w:lastRenderedPageBreak/>
           <w:t>1.</w:t>
         </w:r>
       </w:ins>
-      <w:ins w:id="15" w:author="kyle O'Reilly" w:date="2026-10-20T21:26:00Z" w16du:dateUtc="2026-10-20T20:26:00Z">
+      <w:ins w:id="19" w:author="kyle O'Reilly" w:date="2026-10-20T21:26:00Z" w16du:dateUtc="2026-10-20T20:26:00Z">
         <w:r>
-          <w:t xml:space="preserve"> Introduction</w:t>
+          <w:t xml:space="preserve"> </w:t>
         </w:r>
-        <w:bookmarkEnd w:id="13"/>
       </w:ins>
+      <w:ins w:id="20" w:author="kyle O'Reilly" w:date="2026-10-21T20:28:00Z" w16du:dateUtc="2026-10-21T19:28:00Z">
+        <w:r>
+          <w:t>Project Title</w:t>
+        </w:r>
+        <w:bookmarkEnd w:id="17"/>
+      </w:ins>
+    </w:p>
+    <w:p>
+      <w:pPr>
+        <w:spacing w:line="360" w:lineRule="auto"/>
+        <w:jc w:val="both"/>
+        <w:rPr>
+          <w:ins w:id="21" w:author="kyle O'Reilly" w:date="2026-10-21T20:32:00Z" w16du:dateUtc="2026-10-21T19:32:00Z"/>
+        </w:rPr>
+        <w:pPrChange w:id="22" w:author="kyle O'Reilly" w:date="2026-10-21T20:33:00Z" w16du:dateUtc="2026-10-21T19:33:00Z">
+          <w:pPr/>
+        </w:pPrChange>
+      </w:pPr>
+      <w:ins w:id="23" w:author="kyle O'Reilly" w:date="2026-10-21T20:28:00Z" w16du:dateUtc="2026-10-21T19:28:00Z">
+        <w:r>
+          <w:t xml:space="preserve">Assessing the Accuracy of Machine </w:t>
+        </w:r>
+      </w:ins>
+      <w:ins w:id="24" w:author="kyle O'Reilly" w:date="2026-10-21T20:29:00Z" w16du:dateUtc="2026-10-21T19:29:00Z">
+        <w:r>
+          <w:t>Learning Models in Predicting F</w:t>
+        </w:r>
+        <w:r>
+          <w:t>u</w:t>
+        </w:r>
+        <w:r>
+          <w:t xml:space="preserve">ture Stock </w:t>
+        </w:r>
+        <w:r>
+          <w:t xml:space="preserve">Closing </w:t>
+        </w:r>
+        <w:r>
+          <w:t xml:space="preserve">Prices: </w:t>
+        </w:r>
+        <w:r>
+          <w:t xml:space="preserve">A Comparative Case Study of Three Companies </w:t>
+        </w:r>
+        <w:r>
+          <w:t>wi</w:t>
+        </w:r>
+      </w:ins>
+      <w:ins w:id="25" w:author="kyle O'Reilly" w:date="2026-10-21T20:30:00Z" w16du:dateUtc="2026-10-21T19:30:00Z">
+        <w:r>
+          <w:t xml:space="preserve">th Different </w:t>
+        </w:r>
+        <w:r>
+          <w:t>Volatility Levels.</w:t>
+        </w:r>
+      </w:ins>
+    </w:p>
+    <w:p>
+      <w:pPr>
+        <w:rPr>
+          <w:ins w:id="26" w:author="kyle O'Reilly" w:date="2026-10-21T20:28:00Z" w16du:dateUtc="2026-10-21T19:28:00Z"/>
+        </w:rPr>
+      </w:pPr>
+    </w:p>
+    <w:p>
+      <w:pPr>
+        <w:pStyle w:val="Heading1"/>
+        <w:rPr>
+          <w:ins w:id="27" w:author="kyle O'Reilly" w:date="2026-10-20T21:26:00Z" w16du:dateUtc="2026-10-20T20:26:00Z"/>
+        </w:rPr>
+      </w:pPr>
+      <w:bookmarkStart w:id="28" w:name="_Toc243506923"/>
+      <w:ins w:id="29" w:author="kyle O'Reilly" w:date="2026-10-21T20:28:00Z" w16du:dateUtc="2026-10-21T19:28:00Z">
+        <w:r>
+          <w:t>2. Introduction</w:t>
+        </w:r>
+      </w:ins>
+      <w:bookmarkEnd w:id="28"/>
     </w:p>
     <w:p/>
     <w:p/>
@@ -3828,10 +4037,20 @@
 </file>
 
 <file path=customXml/item1.xml><?xml version="1.0" encoding="utf-8"?>
-<b:Sources xmlns:b="http://schemas.openxmlformats.org/officeDocument/2006/bibliography" xmlns="http://schemas.openxmlformats.org/officeDocument/2006/bibliography" SelectedStyle="\APASixthEditionOfficeOnline.xsl" StyleName="APA" Version="6"/>
+<p:properties xmlns:p="http://schemas.microsoft.com/office/2006/metadata/properties" xmlns:xsi="http://www.w3.org/2001/XMLSchema-instance" xmlns:pc="http://schemas.microsoft.com/office/infopath/2007/PartnerControls">
+  <documentManagement>
+    <_activity xmlns="b16a9495-4dfd-42d3-807b-98cb11f03b43" xsi:nil="true"/>
+  </documentManagement>
+</p:properties>
 </file>
 
 <file path=customXml/item2.xml><?xml version="1.0" encoding="utf-8"?>
+<go:gDocsCustomXmlDataStorage xmlns:go="http://customooxmlschemas.google.com/" xmlns:r="http://schemas.openxmlformats.org/officeDocument/2006/relationships" uri="GoogleDocsCustomDataVersion2">
+  <go:docsCustomData xmlns:go="http://customooxmlschemas.google.com/" roundtripDataSignature="AMtx7miehlgh2pzFvkmpnhkVaeODs3Wnuw==">CgMxLjAyCGguZ2pkZ3hzMgloLjMwajB6bGwyCWguMWZvYjl0ZTIJaC4zem55c2g3MgloLjJldDkycDAyDmgua2ZranMzcndsMmMxOAByITF6bEVRVXYyWkdtTjZWemdfYk5uaGpmb0x1c2hhYUo3dw==</go:docsCustomData>
+</go:gDocsCustomXmlDataStorage>
+</file>
+
+<file path=customXml/item3.xml><?xml version="1.0" encoding="utf-8"?>
 <ct:contentTypeSchema xmlns:ct="http://schemas.microsoft.com/office/2006/metadata/contentType" xmlns:ma="http://schemas.microsoft.com/office/2006/metadata/properties/metaAttributes" ct:_="" ma:_="" ma:contentTypeName="Document" ma:contentTypeID="0x01010091CA7052A48FB44E8BAE44044031FC77" ma:contentTypeVersion="5" ma:contentTypeDescription="Create a new document." ma:contentTypeScope="" ma:versionID="72110da391d7bf7bbbd9879cda66318c">
   <xsd:schema xmlns:xsd="http://www.w3.org/2001/XMLSchema" xmlns:xs="http://www.w3.org/2001/XMLSchema" xmlns:p="http://schemas.microsoft.com/office/2006/metadata/properties" xmlns:ns3="b16a9495-4dfd-42d3-807b-98cb11f03b43" targetNamespace="http://schemas.microsoft.com/office/2006/metadata/properties" ma:root="true" ma:fieldsID="65d4c4ab10123b5e2192ffab3149626d" ns3:_="">
     <xsd:import namespace="b16a9495-4dfd-42d3-807b-98cb11f03b43"/>
@@ -3981,18 +4200,8 @@
 </ct:contentTypeSchema>
 </file>
 
-<file path=customXml/item3.xml><?xml version="1.0" encoding="utf-8"?>
-<go:gDocsCustomXmlDataStorage xmlns:go="http://customooxmlschemas.google.com/" xmlns:r="http://schemas.openxmlformats.org/officeDocument/2006/relationships" uri="GoogleDocsCustomDataVersion2">
-  <go:docsCustomData xmlns:go="http://customooxmlschemas.google.com/" roundtripDataSignature="AMtx7miehlgh2pzFvkmpnhkVaeODs3Wnuw==">CgMxLjAyCGguZ2pkZ3hzMgloLjMwajB6bGwyCWguMWZvYjl0ZTIJaC4zem55c2g3MgloLjJldDkycDAyDmgua2ZranMzcndsMmMxOAByITF6bEVRVXYyWkdtTjZWemdfYk5uaGpmb0x1c2hhYUo3dw==</go:docsCustomData>
-</go:gDocsCustomXmlDataStorage>
-</file>
-
 <file path=customXml/item4.xml><?xml version="1.0" encoding="utf-8"?>
-<p:properties xmlns:p="http://schemas.microsoft.com/office/2006/metadata/properties" xmlns:xsi="http://www.w3.org/2001/XMLSchema-instance" xmlns:pc="http://schemas.microsoft.com/office/infopath/2007/PartnerControls">
-  <documentManagement>
-    <_activity xmlns="b16a9495-4dfd-42d3-807b-98cb11f03b43" xsi:nil="true"/>
-  </documentManagement>
-</p:properties>
+<b:Sources xmlns:b="http://schemas.openxmlformats.org/officeDocument/2006/bibliography" xmlns="http://schemas.openxmlformats.org/officeDocument/2006/bibliography" SelectedStyle="\APASixthEditionOfficeOnline.xsl" StyleName="APA" Version="6"/>
 </file>
 
 <file path=customXml/item5.xml><?xml version="1.0" encoding="utf-8"?>
@@ -4005,14 +4214,25 @@
 </file>
 
 <file path=customXml/itemProps1.xml><?xml version="1.0" encoding="utf-8"?>
-<ds:datastoreItem xmlns:ds="http://schemas.openxmlformats.org/officeDocument/2006/customXml" ds:itemID="{A5C61161-19E4-4D42-A5DA-EC591AFE0A7D}">
+<ds:datastoreItem xmlns:ds="http://schemas.openxmlformats.org/officeDocument/2006/customXml" ds:itemID="{D51EB97A-8C7A-4EE1-A3AD-E57FDBFA6BEE}">
   <ds:schemaRefs>
-    <ds:schemaRef ds:uri="http://schemas.openxmlformats.org/officeDocument/2006/bibliography"/>
+    <ds:schemaRef ds:uri="http://schemas.microsoft.com/office/2006/metadata/properties"/>
+    <ds:schemaRef ds:uri="http://schemas.microsoft.com/office/infopath/2007/PartnerControls"/>
+    <ds:schemaRef ds:uri="b16a9495-4dfd-42d3-807b-98cb11f03b43"/>
   </ds:schemaRefs>
 </ds:datastoreItem>
 </file>
 
 <file path=customXml/itemProps2.xml><?xml version="1.0" encoding="utf-8"?>
+<ds:datastoreItem xmlns:ds="http://schemas.openxmlformats.org/officeDocument/2006/customXml" ds:itemID="{11111111-1234-1234-1234-123412341234}">
+  <ds:schemaRefs>
+    <ds:schemaRef ds:uri="http://customooxmlschemas.google.com/"/>
+    <ds:schemaRef ds:uri="http://schemas.openxmlformats.org/officeDocument/2006/relationships"/>
+  </ds:schemaRefs>
+</ds:datastoreItem>
+</file>
+
+<file path=customXml/itemProps3.xml><?xml version="1.0" encoding="utf-8"?>
 <ds:datastoreItem xmlns:ds="http://schemas.openxmlformats.org/officeDocument/2006/customXml" ds:itemID="{1CD39011-2B34-4226-8638-59B13D86301D}">
   <ds:schemaRefs>
     <ds:schemaRef ds:uri="http://schemas.microsoft.com/office/2006/metadata/contentType"/>
@@ -4030,21 +4250,10 @@
 </ds:datastoreItem>
 </file>
 
-<file path=customXml/itemProps3.xml><?xml version="1.0" encoding="utf-8"?>
-<ds:datastoreItem xmlns:ds="http://schemas.openxmlformats.org/officeDocument/2006/customXml" ds:itemID="{11111111-1234-1234-1234-123412341234}">
+<file path=customXml/itemProps4.xml><?xml version="1.0" encoding="utf-8"?>
+<ds:datastoreItem xmlns:ds="http://schemas.openxmlformats.org/officeDocument/2006/customXml" ds:itemID="{A5C61161-19E4-4D42-A5DA-EC591AFE0A7D}">
   <ds:schemaRefs>
-    <ds:schemaRef ds:uri="http://customooxmlschemas.google.com/"/>
-    <ds:schemaRef ds:uri="http://schemas.openxmlformats.org/officeDocument/2006/relationships"/>
-  </ds:schemaRefs>
-</ds:datastoreItem>
-</file>
-
-<file path=customXml/itemProps4.xml><?xml version="1.0" encoding="utf-8"?>
-<ds:datastoreItem xmlns:ds="http://schemas.openxmlformats.org/officeDocument/2006/customXml" ds:itemID="{D51EB97A-8C7A-4EE1-A3AD-E57FDBFA6BEE}">
-  <ds:schemaRefs>
-    <ds:schemaRef ds:uri="http://schemas.microsoft.com/office/2006/metadata/properties"/>
-    <ds:schemaRef ds:uri="http://schemas.microsoft.com/office/infopath/2007/PartnerControls"/>
-    <ds:schemaRef ds:uri="b16a9495-4dfd-42d3-807b-98cb11f03b43"/>
+    <ds:schemaRef ds:uri="http://schemas.openxmlformats.org/officeDocument/2006/bibliography"/>
   </ds:schemaRefs>
 </ds:datastoreItem>
 </file>

</xml_diff>

<commit_message>
Completed Ethics and Legal Considerations section
</commit_message>
<xml_diff>
--- a/HDSDAB - Strategic Thinking - Capstone Project.docx
+++ b/HDSDAB - Strategic Thinking - Capstone Project.docx
@@ -499,7 +499,6 @@
           <w:szCs w:val="32"/>
         </w:rPr>
       </w:pPr>
-      <w:proofErr w:type="spellStart"/>
       <w:ins w:id="4" w:author="kyle O'Reilly" w:date="2026-10-20T21:24:00Z" w16du:dateUtc="2026-10-20T20:24:00Z">
         <w:r>
           <w:rPr>
@@ -508,17 +507,7 @@
             <w:sz w:val="32"/>
             <w:szCs w:val="32"/>
           </w:rPr>
-          <w:t>Taufique</w:t>
-        </w:r>
-        <w:proofErr w:type="spellEnd"/>
-        <w:r>
-          <w:rPr>
-            <w:i/>
-            <w:color w:val="EE0000"/>
-            <w:sz w:val="32"/>
-            <w:szCs w:val="32"/>
-          </w:rPr>
-          <w:t xml:space="preserve"> Ahmed</w:t>
+          <w:t>Taufique Ahmed</w:t>
         </w:r>
       </w:ins>
     </w:p>
@@ -651,7 +640,6 @@
           <w:szCs w:val="32"/>
         </w:rPr>
       </w:pPr>
-      <w:proofErr w:type="spellStart"/>
       <w:r>
         <w:rPr>
           <w:i/>
@@ -660,17 +648,7 @@
           <w:szCs w:val="32"/>
         </w:rPr>
         <w:lastRenderedPageBreak/>
-        <w:t>Github</w:t>
-      </w:r>
-      <w:proofErr w:type="spellEnd"/>
-      <w:r>
-        <w:rPr>
-          <w:i/>
-          <w:color w:val="156082"/>
-          <w:sz w:val="32"/>
-          <w:szCs w:val="32"/>
-        </w:rPr>
-        <w:t xml:space="preserve"> Repository </w:t>
+        <w:t xml:space="preserve">Github Repository </w:t>
       </w:r>
     </w:p>
     <w:p>
@@ -694,22 +672,9 @@
             <w:sz w:val="32"/>
             <w:szCs w:val="32"/>
           </w:rPr>
-          <w:t>https://github.com/sba26104-KOR/HDSDAB---Strategic-Thinking---Capstone-</w:t>
-        </w:r>
-        <w:proofErr w:type="spellStart"/>
-        <w:r>
-          <w:rPr>
-            <w:bCs/>
-            <w:i/>
-            <w:iCs/>
-            <w:color w:val="EE0000"/>
-            <w:sz w:val="32"/>
-            <w:szCs w:val="32"/>
-          </w:rPr>
-          <w:t>Project.git</w:t>
-        </w:r>
-      </w:ins>
-      <w:proofErr w:type="spellEnd"/>
+          <w:t>https://github.com/sba26104-KOR/HDSDAB---Strategic-Thinking---Capstone-Project.git</w:t>
+        </w:r>
+      </w:ins>
     </w:p>
     <w:p>
       <w:pPr>
@@ -825,23 +790,7 @@
                                 <w:color w:val="000000"/>
                                 <w:sz w:val="28"/>
                               </w:rPr>
-                              <w:t xml:space="preserve">By submitting this assessment, I confirm that I have read the CCT policy on academic misconduct and understand the implications of submitting work that is not my own or does not appropriately reference material </w:t>
-                            </w:r>
-                            <w:proofErr w:type="gramStart"/>
-                            <w:r>
-                              <w:rPr>
-                                <w:color w:val="000000"/>
-                                <w:sz w:val="28"/>
-                              </w:rPr>
-                              <w:t>taken</w:t>
-                            </w:r>
-                            <w:proofErr w:type="gramEnd"/>
-                            <w:r>
-                              <w:rPr>
-                                <w:color w:val="000000"/>
-                                <w:sz w:val="28"/>
-                              </w:rPr>
-                              <w:t xml:space="preserve"> from a third party or other source. </w:t>
+                              <w:t xml:space="preserve">By submitting this assessment, I confirm that I have read the CCT policy on academic misconduct and understand the implications of submitting work that is not my own or does not appropriately reference material taken from a third party or other source. </w:t>
                             </w:r>
                           </w:p>
                           <w:p>
@@ -1198,7 +1147,7 @@
               <w:tab w:val="right" w:leader="dot" w:pos="9016"/>
             </w:tabs>
             <w:rPr>
-              <w:ins w:id="8" w:author="kyle O'Reilly" w:date="2026-10-21T20:28:00Z" w16du:dateUtc="2026-10-21T19:28:00Z"/>
+              <w:ins w:id="8" w:author="kyle O'Reilly" w:date="2026-10-21T20:42:00Z" w16du:dateUtc="2026-10-21T19:42:00Z"/>
               <w:rFonts w:asciiTheme="minorHAnsi" w:eastAsiaTheme="minorEastAsia" w:hAnsiTheme="minorHAnsi" w:cstheme="minorBidi"/>
               <w:noProof/>
               <w:kern w:val="2"/>
@@ -1216,7 +1165,7 @@
           <w:r>
             <w:fldChar w:fldCharType="separate"/>
           </w:r>
-          <w:ins w:id="9" w:author="kyle O'Reilly" w:date="2026-10-21T20:28:00Z" w16du:dateUtc="2026-10-21T19:28:00Z">
+          <w:ins w:id="9" w:author="kyle O'Reilly" w:date="2026-10-21T20:42:00Z" w16du:dateUtc="2026-10-21T19:42:00Z">
             <w:r>
               <w:rPr>
                 <w:rStyle w:val="Hyperlink"/>
@@ -1235,7 +1184,7 @@
               <w:rPr>
                 <w:noProof/>
               </w:rPr>
-              <w:instrText>HYPERLINK \l "_Toc243506922"</w:instrText>
+              <w:instrText>HYPERLINK \l "_Toc243507765"</w:instrText>
             </w:r>
             <w:r>
               <w:rPr>
@@ -1283,7 +1232,7 @@
                 <w:noProof/>
                 <w:webHidden/>
               </w:rPr>
-              <w:instrText xml:space="preserve"> PAGEREF _Toc243506922 \h </w:instrText>
+              <w:instrText xml:space="preserve"> PAGEREF _Toc243507765 \h </w:instrText>
             </w:r>
             <w:r>
               <w:rPr>
@@ -1328,7 +1277,7 @@
               <w:tab w:val="right" w:leader="dot" w:pos="9016"/>
             </w:tabs>
             <w:rPr>
-              <w:ins w:id="10" w:author="kyle O'Reilly" w:date="2026-10-21T20:28:00Z" w16du:dateUtc="2026-10-21T19:28:00Z"/>
+              <w:ins w:id="10" w:author="kyle O'Reilly" w:date="2026-10-21T20:42:00Z" w16du:dateUtc="2026-10-21T19:42:00Z"/>
               <w:rFonts w:asciiTheme="minorHAnsi" w:eastAsiaTheme="minorEastAsia" w:hAnsiTheme="minorHAnsi" w:cstheme="minorBidi"/>
               <w:noProof/>
               <w:kern w:val="2"/>
@@ -1337,7 +1286,7 @@
               <w14:ligatures w14:val="standardContextual"/>
             </w:rPr>
           </w:pPr>
-          <w:ins w:id="11" w:author="kyle O'Reilly" w:date="2026-10-21T20:28:00Z" w16du:dateUtc="2026-10-21T19:28:00Z">
+          <w:ins w:id="11" w:author="kyle O'Reilly" w:date="2026-10-21T20:42:00Z" w16du:dateUtc="2026-10-21T19:42:00Z">
             <w:r>
               <w:rPr>
                 <w:rStyle w:val="Hyperlink"/>
@@ -1356,7 +1305,7 @@
               <w:rPr>
                 <w:noProof/>
               </w:rPr>
-              <w:instrText>HYPERLINK \l "_Toc243506923"</w:instrText>
+              <w:instrText>HYPERLINK \l "_Toc243507766"</w:instrText>
             </w:r>
             <w:r>
               <w:rPr>
@@ -1404,7 +1353,7 @@
                 <w:noProof/>
                 <w:webHidden/>
               </w:rPr>
-              <w:instrText xml:space="preserve"> PAGEREF _Toc243506923 \h </w:instrText>
+              <w:instrText xml:space="preserve"> PAGEREF _Toc243507766 \h </w:instrText>
             </w:r>
             <w:r>
               <w:rPr>
@@ -1443,7 +1392,1096 @@
           </w:ins>
         </w:p>
         <w:p>
-          <w:del w:id="12" w:author="kyle O'Reilly" w:date="2026-10-20T21:26:00Z" w16du:dateUtc="2026-10-20T20:26:00Z">
+          <w:pPr>
+            <w:pStyle w:val="TOC1"/>
+            <w:tabs>
+              <w:tab w:val="right" w:leader="dot" w:pos="9016"/>
+            </w:tabs>
+            <w:rPr>
+              <w:ins w:id="12" w:author="kyle O'Reilly" w:date="2026-10-21T20:42:00Z" w16du:dateUtc="2026-10-21T19:42:00Z"/>
+              <w:rFonts w:asciiTheme="minorHAnsi" w:eastAsiaTheme="minorEastAsia" w:hAnsiTheme="minorHAnsi" w:cstheme="minorBidi"/>
+              <w:noProof/>
+              <w:kern w:val="2"/>
+              <w:sz w:val="24"/>
+              <w:szCs w:val="24"/>
+              <w14:ligatures w14:val="standardContextual"/>
+            </w:rPr>
+          </w:pPr>
+          <w:ins w:id="13" w:author="kyle O'Reilly" w:date="2026-10-21T20:42:00Z" w16du:dateUtc="2026-10-21T19:42:00Z">
+            <w:r>
+              <w:rPr>
+                <w:rStyle w:val="Hyperlink"/>
+                <w:noProof/>
+              </w:rPr>
+              <w:fldChar w:fldCharType="begin"/>
+            </w:r>
+            <w:r>
+              <w:rPr>
+                <w:rStyle w:val="Hyperlink"/>
+                <w:noProof/>
+              </w:rPr>
+              <w:instrText xml:space="preserve"> </w:instrText>
+            </w:r>
+            <w:r>
+              <w:rPr>
+                <w:noProof/>
+              </w:rPr>
+              <w:instrText>HYPERLINK \l "_Toc243507767"</w:instrText>
+            </w:r>
+            <w:r>
+              <w:rPr>
+                <w:rStyle w:val="Hyperlink"/>
+                <w:noProof/>
+              </w:rPr>
+              <w:instrText xml:space="preserve"> </w:instrText>
+            </w:r>
+            <w:r>
+              <w:rPr>
+                <w:rStyle w:val="Hyperlink"/>
+                <w:noProof/>
+              </w:rPr>
+            </w:r>
+            <w:r>
+              <w:rPr>
+                <w:rStyle w:val="Hyperlink"/>
+                <w:noProof/>
+              </w:rPr>
+              <w:fldChar w:fldCharType="separate"/>
+            </w:r>
+            <w:r>
+              <w:rPr>
+                <w:rStyle w:val="Hyperlink"/>
+                <w:noProof/>
+              </w:rPr>
+              <w:t>3. Problem Definition</w:t>
+            </w:r>
+            <w:r>
+              <w:rPr>
+                <w:noProof/>
+                <w:webHidden/>
+              </w:rPr>
+              <w:tab/>
+            </w:r>
+            <w:r>
+              <w:rPr>
+                <w:noProof/>
+                <w:webHidden/>
+              </w:rPr>
+              <w:fldChar w:fldCharType="begin"/>
+            </w:r>
+            <w:r>
+              <w:rPr>
+                <w:noProof/>
+                <w:webHidden/>
+              </w:rPr>
+              <w:instrText xml:space="preserve"> PAGEREF _Toc243507767 \h </w:instrText>
+            </w:r>
+            <w:r>
+              <w:rPr>
+                <w:noProof/>
+                <w:webHidden/>
+              </w:rPr>
+            </w:r>
+            <w:r>
+              <w:rPr>
+                <w:noProof/>
+                <w:webHidden/>
+              </w:rPr>
+              <w:fldChar w:fldCharType="separate"/>
+            </w:r>
+            <w:r>
+              <w:rPr>
+                <w:noProof/>
+                <w:webHidden/>
+              </w:rPr>
+              <w:t>1</w:t>
+            </w:r>
+            <w:r>
+              <w:rPr>
+                <w:noProof/>
+                <w:webHidden/>
+              </w:rPr>
+              <w:fldChar w:fldCharType="end"/>
+            </w:r>
+            <w:r>
+              <w:rPr>
+                <w:rStyle w:val="Hyperlink"/>
+                <w:noProof/>
+              </w:rPr>
+              <w:fldChar w:fldCharType="end"/>
+            </w:r>
+          </w:ins>
+        </w:p>
+        <w:p>
+          <w:pPr>
+            <w:pStyle w:val="TOC1"/>
+            <w:tabs>
+              <w:tab w:val="right" w:leader="dot" w:pos="9016"/>
+            </w:tabs>
+            <w:rPr>
+              <w:ins w:id="14" w:author="kyle O'Reilly" w:date="2026-10-21T20:42:00Z" w16du:dateUtc="2026-10-21T19:42:00Z"/>
+              <w:rFonts w:asciiTheme="minorHAnsi" w:eastAsiaTheme="minorEastAsia" w:hAnsiTheme="minorHAnsi" w:cstheme="minorBidi"/>
+              <w:noProof/>
+              <w:kern w:val="2"/>
+              <w:sz w:val="24"/>
+              <w:szCs w:val="24"/>
+              <w14:ligatures w14:val="standardContextual"/>
+            </w:rPr>
+          </w:pPr>
+          <w:ins w:id="15" w:author="kyle O'Reilly" w:date="2026-10-21T20:42:00Z" w16du:dateUtc="2026-10-21T19:42:00Z">
+            <w:r>
+              <w:rPr>
+                <w:rStyle w:val="Hyperlink"/>
+                <w:noProof/>
+              </w:rPr>
+              <w:fldChar w:fldCharType="begin"/>
+            </w:r>
+            <w:r>
+              <w:rPr>
+                <w:rStyle w:val="Hyperlink"/>
+                <w:noProof/>
+              </w:rPr>
+              <w:instrText xml:space="preserve"> </w:instrText>
+            </w:r>
+            <w:r>
+              <w:rPr>
+                <w:noProof/>
+              </w:rPr>
+              <w:instrText>HYPERLINK \l "_Toc243507768"</w:instrText>
+            </w:r>
+            <w:r>
+              <w:rPr>
+                <w:rStyle w:val="Hyperlink"/>
+                <w:noProof/>
+              </w:rPr>
+              <w:instrText xml:space="preserve"> </w:instrText>
+            </w:r>
+            <w:r>
+              <w:rPr>
+                <w:rStyle w:val="Hyperlink"/>
+                <w:noProof/>
+              </w:rPr>
+            </w:r>
+            <w:r>
+              <w:rPr>
+                <w:rStyle w:val="Hyperlink"/>
+                <w:noProof/>
+              </w:rPr>
+              <w:fldChar w:fldCharType="separate"/>
+            </w:r>
+            <w:r>
+              <w:rPr>
+                <w:rStyle w:val="Hyperlink"/>
+                <w:noProof/>
+              </w:rPr>
+              <w:t>4. Aim, Objectives and Hypothesis</w:t>
+            </w:r>
+            <w:r>
+              <w:rPr>
+                <w:noProof/>
+                <w:webHidden/>
+              </w:rPr>
+              <w:tab/>
+            </w:r>
+            <w:r>
+              <w:rPr>
+                <w:noProof/>
+                <w:webHidden/>
+              </w:rPr>
+              <w:fldChar w:fldCharType="begin"/>
+            </w:r>
+            <w:r>
+              <w:rPr>
+                <w:noProof/>
+                <w:webHidden/>
+              </w:rPr>
+              <w:instrText xml:space="preserve"> PAGEREF _Toc243507768 \h </w:instrText>
+            </w:r>
+            <w:r>
+              <w:rPr>
+                <w:noProof/>
+                <w:webHidden/>
+              </w:rPr>
+            </w:r>
+            <w:r>
+              <w:rPr>
+                <w:noProof/>
+                <w:webHidden/>
+              </w:rPr>
+              <w:fldChar w:fldCharType="separate"/>
+            </w:r>
+            <w:r>
+              <w:rPr>
+                <w:noProof/>
+                <w:webHidden/>
+              </w:rPr>
+              <w:t>1</w:t>
+            </w:r>
+            <w:r>
+              <w:rPr>
+                <w:noProof/>
+                <w:webHidden/>
+              </w:rPr>
+              <w:fldChar w:fldCharType="end"/>
+            </w:r>
+            <w:r>
+              <w:rPr>
+                <w:rStyle w:val="Hyperlink"/>
+                <w:noProof/>
+              </w:rPr>
+              <w:fldChar w:fldCharType="end"/>
+            </w:r>
+          </w:ins>
+        </w:p>
+        <w:p>
+          <w:pPr>
+            <w:pStyle w:val="TOC1"/>
+            <w:tabs>
+              <w:tab w:val="right" w:leader="dot" w:pos="9016"/>
+            </w:tabs>
+            <w:rPr>
+              <w:ins w:id="16" w:author="kyle O'Reilly" w:date="2026-10-21T20:42:00Z" w16du:dateUtc="2026-10-21T19:42:00Z"/>
+              <w:rFonts w:asciiTheme="minorHAnsi" w:eastAsiaTheme="minorEastAsia" w:hAnsiTheme="minorHAnsi" w:cstheme="minorBidi"/>
+              <w:noProof/>
+              <w:kern w:val="2"/>
+              <w:sz w:val="24"/>
+              <w:szCs w:val="24"/>
+              <w14:ligatures w14:val="standardContextual"/>
+            </w:rPr>
+          </w:pPr>
+          <w:ins w:id="17" w:author="kyle O'Reilly" w:date="2026-10-21T20:42:00Z" w16du:dateUtc="2026-10-21T19:42:00Z">
+            <w:r>
+              <w:rPr>
+                <w:rStyle w:val="Hyperlink"/>
+                <w:noProof/>
+              </w:rPr>
+              <w:fldChar w:fldCharType="begin"/>
+            </w:r>
+            <w:r>
+              <w:rPr>
+                <w:rStyle w:val="Hyperlink"/>
+                <w:noProof/>
+              </w:rPr>
+              <w:instrText xml:space="preserve"> </w:instrText>
+            </w:r>
+            <w:r>
+              <w:rPr>
+                <w:noProof/>
+              </w:rPr>
+              <w:instrText>HYPERLINK \l "_Toc243507769"</w:instrText>
+            </w:r>
+            <w:r>
+              <w:rPr>
+                <w:rStyle w:val="Hyperlink"/>
+                <w:noProof/>
+              </w:rPr>
+              <w:instrText xml:space="preserve"> </w:instrText>
+            </w:r>
+            <w:r>
+              <w:rPr>
+                <w:rStyle w:val="Hyperlink"/>
+                <w:noProof/>
+              </w:rPr>
+            </w:r>
+            <w:r>
+              <w:rPr>
+                <w:rStyle w:val="Hyperlink"/>
+                <w:noProof/>
+              </w:rPr>
+              <w:fldChar w:fldCharType="separate"/>
+            </w:r>
+            <w:r>
+              <w:rPr>
+                <w:rStyle w:val="Hyperlink"/>
+                <w:noProof/>
+              </w:rPr>
+              <w:t>5. Project Scope</w:t>
+            </w:r>
+            <w:r>
+              <w:rPr>
+                <w:noProof/>
+                <w:webHidden/>
+              </w:rPr>
+              <w:tab/>
+            </w:r>
+            <w:r>
+              <w:rPr>
+                <w:noProof/>
+                <w:webHidden/>
+              </w:rPr>
+              <w:fldChar w:fldCharType="begin"/>
+            </w:r>
+            <w:r>
+              <w:rPr>
+                <w:noProof/>
+                <w:webHidden/>
+              </w:rPr>
+              <w:instrText xml:space="preserve"> PAGEREF _Toc243507769 \h </w:instrText>
+            </w:r>
+            <w:r>
+              <w:rPr>
+                <w:noProof/>
+                <w:webHidden/>
+              </w:rPr>
+            </w:r>
+            <w:r>
+              <w:rPr>
+                <w:noProof/>
+                <w:webHidden/>
+              </w:rPr>
+              <w:fldChar w:fldCharType="separate"/>
+            </w:r>
+            <w:r>
+              <w:rPr>
+                <w:noProof/>
+                <w:webHidden/>
+              </w:rPr>
+              <w:t>1</w:t>
+            </w:r>
+            <w:r>
+              <w:rPr>
+                <w:noProof/>
+                <w:webHidden/>
+              </w:rPr>
+              <w:fldChar w:fldCharType="end"/>
+            </w:r>
+            <w:r>
+              <w:rPr>
+                <w:rStyle w:val="Hyperlink"/>
+                <w:noProof/>
+              </w:rPr>
+              <w:fldChar w:fldCharType="end"/>
+            </w:r>
+          </w:ins>
+        </w:p>
+        <w:p>
+          <w:pPr>
+            <w:pStyle w:val="TOC1"/>
+            <w:tabs>
+              <w:tab w:val="right" w:leader="dot" w:pos="9016"/>
+            </w:tabs>
+            <w:rPr>
+              <w:ins w:id="18" w:author="kyle O'Reilly" w:date="2026-10-21T20:42:00Z" w16du:dateUtc="2026-10-21T19:42:00Z"/>
+              <w:rFonts w:asciiTheme="minorHAnsi" w:eastAsiaTheme="minorEastAsia" w:hAnsiTheme="minorHAnsi" w:cstheme="minorBidi"/>
+              <w:noProof/>
+              <w:kern w:val="2"/>
+              <w:sz w:val="24"/>
+              <w:szCs w:val="24"/>
+              <w14:ligatures w14:val="standardContextual"/>
+            </w:rPr>
+          </w:pPr>
+          <w:ins w:id="19" w:author="kyle O'Reilly" w:date="2026-10-21T20:42:00Z" w16du:dateUtc="2026-10-21T19:42:00Z">
+            <w:r>
+              <w:rPr>
+                <w:rStyle w:val="Hyperlink"/>
+                <w:noProof/>
+              </w:rPr>
+              <w:fldChar w:fldCharType="begin"/>
+            </w:r>
+            <w:r>
+              <w:rPr>
+                <w:rStyle w:val="Hyperlink"/>
+                <w:noProof/>
+              </w:rPr>
+              <w:instrText xml:space="preserve"> </w:instrText>
+            </w:r>
+            <w:r>
+              <w:rPr>
+                <w:noProof/>
+              </w:rPr>
+              <w:instrText>HYPERLINK \l "_Toc243507770"</w:instrText>
+            </w:r>
+            <w:r>
+              <w:rPr>
+                <w:rStyle w:val="Hyperlink"/>
+                <w:noProof/>
+              </w:rPr>
+              <w:instrText xml:space="preserve"> </w:instrText>
+            </w:r>
+            <w:r>
+              <w:rPr>
+                <w:rStyle w:val="Hyperlink"/>
+                <w:noProof/>
+              </w:rPr>
+            </w:r>
+            <w:r>
+              <w:rPr>
+                <w:rStyle w:val="Hyperlink"/>
+                <w:noProof/>
+              </w:rPr>
+              <w:fldChar w:fldCharType="separate"/>
+            </w:r>
+            <w:r>
+              <w:rPr>
+                <w:rStyle w:val="Hyperlink"/>
+                <w:noProof/>
+              </w:rPr>
+              <w:t>6. Methodology</w:t>
+            </w:r>
+            <w:r>
+              <w:rPr>
+                <w:noProof/>
+                <w:webHidden/>
+              </w:rPr>
+              <w:tab/>
+            </w:r>
+            <w:r>
+              <w:rPr>
+                <w:noProof/>
+                <w:webHidden/>
+              </w:rPr>
+              <w:fldChar w:fldCharType="begin"/>
+            </w:r>
+            <w:r>
+              <w:rPr>
+                <w:noProof/>
+                <w:webHidden/>
+              </w:rPr>
+              <w:instrText xml:space="preserve"> PAGEREF _Toc243507770 \h </w:instrText>
+            </w:r>
+            <w:r>
+              <w:rPr>
+                <w:noProof/>
+                <w:webHidden/>
+              </w:rPr>
+            </w:r>
+            <w:r>
+              <w:rPr>
+                <w:noProof/>
+                <w:webHidden/>
+              </w:rPr>
+              <w:fldChar w:fldCharType="separate"/>
+            </w:r>
+            <w:r>
+              <w:rPr>
+                <w:noProof/>
+                <w:webHidden/>
+              </w:rPr>
+              <w:t>1</w:t>
+            </w:r>
+            <w:r>
+              <w:rPr>
+                <w:noProof/>
+                <w:webHidden/>
+              </w:rPr>
+              <w:fldChar w:fldCharType="end"/>
+            </w:r>
+            <w:r>
+              <w:rPr>
+                <w:rStyle w:val="Hyperlink"/>
+                <w:noProof/>
+              </w:rPr>
+              <w:fldChar w:fldCharType="end"/>
+            </w:r>
+          </w:ins>
+        </w:p>
+        <w:p>
+          <w:pPr>
+            <w:pStyle w:val="TOC1"/>
+            <w:tabs>
+              <w:tab w:val="right" w:leader="dot" w:pos="9016"/>
+            </w:tabs>
+            <w:rPr>
+              <w:ins w:id="20" w:author="kyle O'Reilly" w:date="2026-10-21T20:42:00Z" w16du:dateUtc="2026-10-21T19:42:00Z"/>
+              <w:rFonts w:asciiTheme="minorHAnsi" w:eastAsiaTheme="minorEastAsia" w:hAnsiTheme="minorHAnsi" w:cstheme="minorBidi"/>
+              <w:noProof/>
+              <w:kern w:val="2"/>
+              <w:sz w:val="24"/>
+              <w:szCs w:val="24"/>
+              <w14:ligatures w14:val="standardContextual"/>
+            </w:rPr>
+          </w:pPr>
+          <w:ins w:id="21" w:author="kyle O'Reilly" w:date="2026-10-21T20:42:00Z" w16du:dateUtc="2026-10-21T19:42:00Z">
+            <w:r>
+              <w:rPr>
+                <w:rStyle w:val="Hyperlink"/>
+                <w:noProof/>
+              </w:rPr>
+              <w:fldChar w:fldCharType="begin"/>
+            </w:r>
+            <w:r>
+              <w:rPr>
+                <w:rStyle w:val="Hyperlink"/>
+                <w:noProof/>
+              </w:rPr>
+              <w:instrText xml:space="preserve"> </w:instrText>
+            </w:r>
+            <w:r>
+              <w:rPr>
+                <w:noProof/>
+              </w:rPr>
+              <w:instrText>HYPERLINK \l "_Toc243507771"</w:instrText>
+            </w:r>
+            <w:r>
+              <w:rPr>
+                <w:rStyle w:val="Hyperlink"/>
+                <w:noProof/>
+              </w:rPr>
+              <w:instrText xml:space="preserve"> </w:instrText>
+            </w:r>
+            <w:r>
+              <w:rPr>
+                <w:rStyle w:val="Hyperlink"/>
+                <w:noProof/>
+              </w:rPr>
+            </w:r>
+            <w:r>
+              <w:rPr>
+                <w:rStyle w:val="Hyperlink"/>
+                <w:noProof/>
+              </w:rPr>
+              <w:fldChar w:fldCharType="separate"/>
+            </w:r>
+            <w:r>
+              <w:rPr>
+                <w:rStyle w:val="Hyperlink"/>
+                <w:noProof/>
+              </w:rPr>
+              <w:t>7. Data Sources</w:t>
+            </w:r>
+            <w:r>
+              <w:rPr>
+                <w:noProof/>
+                <w:webHidden/>
+              </w:rPr>
+              <w:tab/>
+            </w:r>
+            <w:r>
+              <w:rPr>
+                <w:noProof/>
+                <w:webHidden/>
+              </w:rPr>
+              <w:fldChar w:fldCharType="begin"/>
+            </w:r>
+            <w:r>
+              <w:rPr>
+                <w:noProof/>
+                <w:webHidden/>
+              </w:rPr>
+              <w:instrText xml:space="preserve"> PAGEREF _Toc243507771 \h </w:instrText>
+            </w:r>
+            <w:r>
+              <w:rPr>
+                <w:noProof/>
+                <w:webHidden/>
+              </w:rPr>
+            </w:r>
+            <w:r>
+              <w:rPr>
+                <w:noProof/>
+                <w:webHidden/>
+              </w:rPr>
+              <w:fldChar w:fldCharType="separate"/>
+            </w:r>
+            <w:r>
+              <w:rPr>
+                <w:noProof/>
+                <w:webHidden/>
+              </w:rPr>
+              <w:t>1</w:t>
+            </w:r>
+            <w:r>
+              <w:rPr>
+                <w:noProof/>
+                <w:webHidden/>
+              </w:rPr>
+              <w:fldChar w:fldCharType="end"/>
+            </w:r>
+            <w:r>
+              <w:rPr>
+                <w:rStyle w:val="Hyperlink"/>
+                <w:noProof/>
+              </w:rPr>
+              <w:fldChar w:fldCharType="end"/>
+            </w:r>
+          </w:ins>
+        </w:p>
+        <w:p>
+          <w:pPr>
+            <w:pStyle w:val="TOC1"/>
+            <w:tabs>
+              <w:tab w:val="right" w:leader="dot" w:pos="9016"/>
+            </w:tabs>
+            <w:rPr>
+              <w:ins w:id="22" w:author="kyle O'Reilly" w:date="2026-10-21T20:42:00Z" w16du:dateUtc="2026-10-21T19:42:00Z"/>
+              <w:rFonts w:asciiTheme="minorHAnsi" w:eastAsiaTheme="minorEastAsia" w:hAnsiTheme="minorHAnsi" w:cstheme="minorBidi"/>
+              <w:noProof/>
+              <w:kern w:val="2"/>
+              <w:sz w:val="24"/>
+              <w:szCs w:val="24"/>
+              <w14:ligatures w14:val="standardContextual"/>
+            </w:rPr>
+          </w:pPr>
+          <w:ins w:id="23" w:author="kyle O'Reilly" w:date="2026-10-21T20:42:00Z" w16du:dateUtc="2026-10-21T19:42:00Z">
+            <w:r>
+              <w:rPr>
+                <w:rStyle w:val="Hyperlink"/>
+                <w:noProof/>
+              </w:rPr>
+              <w:fldChar w:fldCharType="begin"/>
+            </w:r>
+            <w:r>
+              <w:rPr>
+                <w:rStyle w:val="Hyperlink"/>
+                <w:noProof/>
+              </w:rPr>
+              <w:instrText xml:space="preserve"> </w:instrText>
+            </w:r>
+            <w:r>
+              <w:rPr>
+                <w:noProof/>
+              </w:rPr>
+              <w:instrText>HYPERLINK \l "_Toc243507772"</w:instrText>
+            </w:r>
+            <w:r>
+              <w:rPr>
+                <w:rStyle w:val="Hyperlink"/>
+                <w:noProof/>
+              </w:rPr>
+              <w:instrText xml:space="preserve"> </w:instrText>
+            </w:r>
+            <w:r>
+              <w:rPr>
+                <w:rStyle w:val="Hyperlink"/>
+                <w:noProof/>
+              </w:rPr>
+            </w:r>
+            <w:r>
+              <w:rPr>
+                <w:rStyle w:val="Hyperlink"/>
+                <w:noProof/>
+              </w:rPr>
+              <w:fldChar w:fldCharType="separate"/>
+            </w:r>
+            <w:r>
+              <w:rPr>
+                <w:rStyle w:val="Hyperlink"/>
+                <w:noProof/>
+              </w:rPr>
+              <w:t>8. Expected Deliverables</w:t>
+            </w:r>
+            <w:r>
+              <w:rPr>
+                <w:noProof/>
+                <w:webHidden/>
+              </w:rPr>
+              <w:tab/>
+            </w:r>
+            <w:r>
+              <w:rPr>
+                <w:noProof/>
+                <w:webHidden/>
+              </w:rPr>
+              <w:fldChar w:fldCharType="begin"/>
+            </w:r>
+            <w:r>
+              <w:rPr>
+                <w:noProof/>
+                <w:webHidden/>
+              </w:rPr>
+              <w:instrText xml:space="preserve"> PAGEREF _Toc243507772 \h </w:instrText>
+            </w:r>
+            <w:r>
+              <w:rPr>
+                <w:noProof/>
+                <w:webHidden/>
+              </w:rPr>
+            </w:r>
+            <w:r>
+              <w:rPr>
+                <w:noProof/>
+                <w:webHidden/>
+              </w:rPr>
+              <w:fldChar w:fldCharType="separate"/>
+            </w:r>
+            <w:r>
+              <w:rPr>
+                <w:noProof/>
+                <w:webHidden/>
+              </w:rPr>
+              <w:t>1</w:t>
+            </w:r>
+            <w:r>
+              <w:rPr>
+                <w:noProof/>
+                <w:webHidden/>
+              </w:rPr>
+              <w:fldChar w:fldCharType="end"/>
+            </w:r>
+            <w:r>
+              <w:rPr>
+                <w:rStyle w:val="Hyperlink"/>
+                <w:noProof/>
+              </w:rPr>
+              <w:fldChar w:fldCharType="end"/>
+            </w:r>
+          </w:ins>
+        </w:p>
+        <w:p>
+          <w:pPr>
+            <w:pStyle w:val="TOC1"/>
+            <w:tabs>
+              <w:tab w:val="right" w:leader="dot" w:pos="9016"/>
+            </w:tabs>
+            <w:rPr>
+              <w:ins w:id="24" w:author="kyle O'Reilly" w:date="2026-10-21T20:42:00Z" w16du:dateUtc="2026-10-21T19:42:00Z"/>
+              <w:rFonts w:asciiTheme="minorHAnsi" w:eastAsiaTheme="minorEastAsia" w:hAnsiTheme="minorHAnsi" w:cstheme="minorBidi"/>
+              <w:noProof/>
+              <w:kern w:val="2"/>
+              <w:sz w:val="24"/>
+              <w:szCs w:val="24"/>
+              <w14:ligatures w14:val="standardContextual"/>
+            </w:rPr>
+          </w:pPr>
+          <w:ins w:id="25" w:author="kyle O'Reilly" w:date="2026-10-21T20:42:00Z" w16du:dateUtc="2026-10-21T19:42:00Z">
+            <w:r>
+              <w:rPr>
+                <w:rStyle w:val="Hyperlink"/>
+                <w:noProof/>
+              </w:rPr>
+              <w:fldChar w:fldCharType="begin"/>
+            </w:r>
+            <w:r>
+              <w:rPr>
+                <w:rStyle w:val="Hyperlink"/>
+                <w:noProof/>
+              </w:rPr>
+              <w:instrText xml:space="preserve"> </w:instrText>
+            </w:r>
+            <w:r>
+              <w:rPr>
+                <w:noProof/>
+              </w:rPr>
+              <w:instrText>HYPERLINK \l "_Toc243507773"</w:instrText>
+            </w:r>
+            <w:r>
+              <w:rPr>
+                <w:rStyle w:val="Hyperlink"/>
+                <w:noProof/>
+              </w:rPr>
+              <w:instrText xml:space="preserve"> </w:instrText>
+            </w:r>
+            <w:r>
+              <w:rPr>
+                <w:rStyle w:val="Hyperlink"/>
+                <w:noProof/>
+              </w:rPr>
+            </w:r>
+            <w:r>
+              <w:rPr>
+                <w:rStyle w:val="Hyperlink"/>
+                <w:noProof/>
+              </w:rPr>
+              <w:fldChar w:fldCharType="separate"/>
+            </w:r>
+            <w:r>
+              <w:rPr>
+                <w:rStyle w:val="Hyperlink"/>
+                <w:noProof/>
+              </w:rPr>
+              <w:t>9. Project Timeline</w:t>
+            </w:r>
+            <w:r>
+              <w:rPr>
+                <w:noProof/>
+                <w:webHidden/>
+              </w:rPr>
+              <w:tab/>
+            </w:r>
+            <w:r>
+              <w:rPr>
+                <w:noProof/>
+                <w:webHidden/>
+              </w:rPr>
+              <w:fldChar w:fldCharType="begin"/>
+            </w:r>
+            <w:r>
+              <w:rPr>
+                <w:noProof/>
+                <w:webHidden/>
+              </w:rPr>
+              <w:instrText xml:space="preserve"> PAGEREF _Toc243507773 \h </w:instrText>
+            </w:r>
+            <w:r>
+              <w:rPr>
+                <w:noProof/>
+                <w:webHidden/>
+              </w:rPr>
+            </w:r>
+            <w:r>
+              <w:rPr>
+                <w:noProof/>
+                <w:webHidden/>
+              </w:rPr>
+              <w:fldChar w:fldCharType="separate"/>
+            </w:r>
+            <w:r>
+              <w:rPr>
+                <w:noProof/>
+                <w:webHidden/>
+              </w:rPr>
+              <w:t>2</w:t>
+            </w:r>
+            <w:r>
+              <w:rPr>
+                <w:noProof/>
+                <w:webHidden/>
+              </w:rPr>
+              <w:fldChar w:fldCharType="end"/>
+            </w:r>
+            <w:r>
+              <w:rPr>
+                <w:rStyle w:val="Hyperlink"/>
+                <w:noProof/>
+              </w:rPr>
+              <w:fldChar w:fldCharType="end"/>
+            </w:r>
+          </w:ins>
+        </w:p>
+        <w:p>
+          <w:pPr>
+            <w:pStyle w:val="TOC1"/>
+            <w:tabs>
+              <w:tab w:val="right" w:leader="dot" w:pos="9016"/>
+            </w:tabs>
+            <w:rPr>
+              <w:ins w:id="26" w:author="kyle O'Reilly" w:date="2026-10-21T20:42:00Z" w16du:dateUtc="2026-10-21T19:42:00Z"/>
+              <w:rFonts w:asciiTheme="minorHAnsi" w:eastAsiaTheme="minorEastAsia" w:hAnsiTheme="minorHAnsi" w:cstheme="minorBidi"/>
+              <w:noProof/>
+              <w:kern w:val="2"/>
+              <w:sz w:val="24"/>
+              <w:szCs w:val="24"/>
+              <w14:ligatures w14:val="standardContextual"/>
+            </w:rPr>
+          </w:pPr>
+          <w:ins w:id="27" w:author="kyle O'Reilly" w:date="2026-10-21T20:42:00Z" w16du:dateUtc="2026-10-21T19:42:00Z">
+            <w:r>
+              <w:rPr>
+                <w:rStyle w:val="Hyperlink"/>
+                <w:noProof/>
+              </w:rPr>
+              <w:fldChar w:fldCharType="begin"/>
+            </w:r>
+            <w:r>
+              <w:rPr>
+                <w:rStyle w:val="Hyperlink"/>
+                <w:noProof/>
+              </w:rPr>
+              <w:instrText xml:space="preserve"> </w:instrText>
+            </w:r>
+            <w:r>
+              <w:rPr>
+                <w:noProof/>
+              </w:rPr>
+              <w:instrText>HYPERLINK \l "_Toc243507774"</w:instrText>
+            </w:r>
+            <w:r>
+              <w:rPr>
+                <w:rStyle w:val="Hyperlink"/>
+                <w:noProof/>
+              </w:rPr>
+              <w:instrText xml:space="preserve"> </w:instrText>
+            </w:r>
+            <w:r>
+              <w:rPr>
+                <w:rStyle w:val="Hyperlink"/>
+                <w:noProof/>
+              </w:rPr>
+            </w:r>
+            <w:r>
+              <w:rPr>
+                <w:rStyle w:val="Hyperlink"/>
+                <w:noProof/>
+              </w:rPr>
+              <w:fldChar w:fldCharType="separate"/>
+            </w:r>
+            <w:r>
+              <w:rPr>
+                <w:rStyle w:val="Hyperlink"/>
+                <w:noProof/>
+              </w:rPr>
+              <w:t>10. Ethical and Legal Considerations</w:t>
+            </w:r>
+            <w:r>
+              <w:rPr>
+                <w:noProof/>
+                <w:webHidden/>
+              </w:rPr>
+              <w:tab/>
+            </w:r>
+            <w:r>
+              <w:rPr>
+                <w:noProof/>
+                <w:webHidden/>
+              </w:rPr>
+              <w:fldChar w:fldCharType="begin"/>
+            </w:r>
+            <w:r>
+              <w:rPr>
+                <w:noProof/>
+                <w:webHidden/>
+              </w:rPr>
+              <w:instrText xml:space="preserve"> PAGEREF _Toc243507774 \h </w:instrText>
+            </w:r>
+            <w:r>
+              <w:rPr>
+                <w:noProof/>
+                <w:webHidden/>
+              </w:rPr>
+            </w:r>
+            <w:r>
+              <w:rPr>
+                <w:noProof/>
+                <w:webHidden/>
+              </w:rPr>
+              <w:fldChar w:fldCharType="separate"/>
+            </w:r>
+            <w:r>
+              <w:rPr>
+                <w:noProof/>
+                <w:webHidden/>
+              </w:rPr>
+              <w:t>2</w:t>
+            </w:r>
+            <w:r>
+              <w:rPr>
+                <w:noProof/>
+                <w:webHidden/>
+              </w:rPr>
+              <w:fldChar w:fldCharType="end"/>
+            </w:r>
+            <w:r>
+              <w:rPr>
+                <w:rStyle w:val="Hyperlink"/>
+                <w:noProof/>
+              </w:rPr>
+              <w:fldChar w:fldCharType="end"/>
+            </w:r>
+          </w:ins>
+        </w:p>
+        <w:p>
+          <w:pPr>
+            <w:pStyle w:val="TOC1"/>
+            <w:tabs>
+              <w:tab w:val="right" w:leader="dot" w:pos="9016"/>
+            </w:tabs>
+            <w:rPr>
+              <w:ins w:id="28" w:author="kyle O'Reilly" w:date="2026-10-21T20:42:00Z" w16du:dateUtc="2026-10-21T19:42:00Z"/>
+              <w:rFonts w:asciiTheme="minorHAnsi" w:eastAsiaTheme="minorEastAsia" w:hAnsiTheme="minorHAnsi" w:cstheme="minorBidi"/>
+              <w:noProof/>
+              <w:kern w:val="2"/>
+              <w:sz w:val="24"/>
+              <w:szCs w:val="24"/>
+              <w14:ligatures w14:val="standardContextual"/>
+            </w:rPr>
+          </w:pPr>
+          <w:ins w:id="29" w:author="kyle O'Reilly" w:date="2026-10-21T20:42:00Z" w16du:dateUtc="2026-10-21T19:42:00Z">
+            <w:r>
+              <w:rPr>
+                <w:rStyle w:val="Hyperlink"/>
+                <w:noProof/>
+              </w:rPr>
+              <w:fldChar w:fldCharType="begin"/>
+            </w:r>
+            <w:r>
+              <w:rPr>
+                <w:rStyle w:val="Hyperlink"/>
+                <w:noProof/>
+              </w:rPr>
+              <w:instrText xml:space="preserve"> </w:instrText>
+            </w:r>
+            <w:r>
+              <w:rPr>
+                <w:noProof/>
+              </w:rPr>
+              <w:instrText>HYPERLINK \l "_Toc243507775"</w:instrText>
+            </w:r>
+            <w:r>
+              <w:rPr>
+                <w:rStyle w:val="Hyperlink"/>
+                <w:noProof/>
+              </w:rPr>
+              <w:instrText xml:space="preserve"> </w:instrText>
+            </w:r>
+            <w:r>
+              <w:rPr>
+                <w:rStyle w:val="Hyperlink"/>
+                <w:noProof/>
+              </w:rPr>
+            </w:r>
+            <w:r>
+              <w:rPr>
+                <w:rStyle w:val="Hyperlink"/>
+                <w:noProof/>
+              </w:rPr>
+              <w:fldChar w:fldCharType="separate"/>
+            </w:r>
+            <w:r>
+              <w:rPr>
+                <w:rStyle w:val="Hyperlink"/>
+                <w:noProof/>
+              </w:rPr>
+              <w:t>References</w:t>
+            </w:r>
+            <w:r>
+              <w:rPr>
+                <w:noProof/>
+                <w:webHidden/>
+              </w:rPr>
+              <w:tab/>
+            </w:r>
+            <w:r>
+              <w:rPr>
+                <w:noProof/>
+                <w:webHidden/>
+              </w:rPr>
+              <w:fldChar w:fldCharType="begin"/>
+            </w:r>
+            <w:r>
+              <w:rPr>
+                <w:noProof/>
+                <w:webHidden/>
+              </w:rPr>
+              <w:instrText xml:space="preserve"> PAGEREF _Toc243507775 \h </w:instrText>
+            </w:r>
+            <w:r>
+              <w:rPr>
+                <w:noProof/>
+                <w:webHidden/>
+              </w:rPr>
+            </w:r>
+            <w:r>
+              <w:rPr>
+                <w:noProof/>
+                <w:webHidden/>
+              </w:rPr>
+              <w:fldChar w:fldCharType="separate"/>
+            </w:r>
+            <w:r>
+              <w:rPr>
+                <w:noProof/>
+                <w:webHidden/>
+              </w:rPr>
+              <w:t>2</w:t>
+            </w:r>
+            <w:r>
+              <w:rPr>
+                <w:noProof/>
+                <w:webHidden/>
+              </w:rPr>
+              <w:fldChar w:fldCharType="end"/>
+            </w:r>
+            <w:r>
+              <w:rPr>
+                <w:rStyle w:val="Hyperlink"/>
+                <w:noProof/>
+              </w:rPr>
+              <w:fldChar w:fldCharType="end"/>
+            </w:r>
+          </w:ins>
+        </w:p>
+        <w:p>
+          <w:del w:id="30" w:author="kyle O'Reilly" w:date="2026-10-20T21:26:00Z" w16du:dateUtc="2026-10-20T20:26:00Z">
             <w:r>
               <w:rPr>
                 <w:b/>
@@ -1483,27 +2521,75 @@
     <w:p/>
     <w:p/>
     <w:p/>
+    <w:p>
+      <w:pPr>
+        <w:rPr>
+          <w:del w:id="31" w:author="kyle O'Reilly" w:date="2026-10-21T20:42:00Z" w16du:dateUtc="2026-10-21T19:42:00Z"/>
+        </w:rPr>
+      </w:pPr>
+    </w:p>
+    <w:p>
+      <w:pPr>
+        <w:rPr>
+          <w:del w:id="32" w:author="kyle O'Reilly" w:date="2026-10-21T20:42:00Z" w16du:dateUtc="2026-10-21T19:42:00Z"/>
+        </w:rPr>
+      </w:pPr>
+    </w:p>
+    <w:p>
+      <w:pPr>
+        <w:rPr>
+          <w:del w:id="33" w:author="kyle O'Reilly" w:date="2026-10-21T20:42:00Z" w16du:dateUtc="2026-10-21T19:42:00Z"/>
+        </w:rPr>
+      </w:pPr>
+    </w:p>
+    <w:p>
+      <w:pPr>
+        <w:rPr>
+          <w:del w:id="34" w:author="kyle O'Reilly" w:date="2026-10-21T20:42:00Z" w16du:dateUtc="2026-10-21T19:42:00Z"/>
+        </w:rPr>
+      </w:pPr>
+    </w:p>
+    <w:p>
+      <w:pPr>
+        <w:rPr>
+          <w:del w:id="35" w:author="kyle O'Reilly" w:date="2026-10-21T20:42:00Z" w16du:dateUtc="2026-10-21T19:42:00Z"/>
+        </w:rPr>
+      </w:pPr>
+    </w:p>
+    <w:p>
+      <w:pPr>
+        <w:rPr>
+          <w:del w:id="36" w:author="kyle O'Reilly" w:date="2026-10-21T20:42:00Z" w16du:dateUtc="2026-10-21T19:42:00Z"/>
+        </w:rPr>
+      </w:pPr>
+    </w:p>
     <w:p/>
+    <w:p>
+      <w:pPr>
+        <w:rPr>
+          <w:del w:id="37" w:author="kyle O'Reilly" w:date="2026-10-21T20:42:00Z" w16du:dateUtc="2026-10-21T19:42:00Z"/>
+        </w:rPr>
+      </w:pPr>
+    </w:p>
+    <w:p>
+      <w:pPr>
+        <w:rPr>
+          <w:del w:id="38" w:author="kyle O'Reilly" w:date="2026-10-21T20:42:00Z" w16du:dateUtc="2026-10-21T19:42:00Z"/>
+        </w:rPr>
+      </w:pPr>
+    </w:p>
     <w:p/>
-    <w:p/>
-    <w:p/>
-    <w:p/>
-    <w:p/>
-    <w:p/>
-    <w:p/>
-    <w:p/>
-    <w:p/>
-    <w:p>
-      <w:pPr>
-        <w:rPr>
-          <w:del w:id="13" w:author="kyle O'Reilly" w:date="2026-10-21T20:28:00Z" w16du:dateUtc="2026-10-21T19:28:00Z"/>
-        </w:rPr>
-      </w:pPr>
-    </w:p>
-    <w:p>
-      <w:pPr>
-        <w:rPr>
-          <w:del w:id="14" w:author="kyle O'Reilly" w:date="2026-10-20T21:26:00Z" w16du:dateUtc="2026-10-20T20:26:00Z"/>
+    <w:p>
+      <w:pPr>
+        <w:rPr>
+          <w:del w:id="39" w:author="kyle O'Reilly" w:date="2026-10-21T20:28:00Z" w16du:dateUtc="2026-10-21T19:28:00Z"/>
+        </w:rPr>
+      </w:pPr>
+    </w:p>
+    <w:p>
+      <w:pPr>
+        <w:rPr>
+          <w:del w:id="40" w:author="kyle O'Reilly" w:date="2026-10-20T21:26:00Z" w16du:dateUtc="2026-10-20T20:26:00Z"/>
         </w:rPr>
       </w:pPr>
     </w:p>
@@ -1525,31 +2611,31 @@
         <w:spacing w:line="360" w:lineRule="auto"/>
         <w:jc w:val="both"/>
         <w:rPr>
-          <w:ins w:id="15" w:author="kyle O'Reilly" w:date="2026-10-21T20:28:00Z" w16du:dateUtc="2026-10-21T19:28:00Z"/>
-        </w:rPr>
-        <w:pPrChange w:id="16" w:author="kyle O'Reilly" w:date="2026-10-21T20:33:00Z" w16du:dateUtc="2026-10-21T19:33:00Z">
+          <w:ins w:id="41" w:author="kyle O'Reilly" w:date="2026-10-21T20:28:00Z" w16du:dateUtc="2026-10-21T19:28:00Z"/>
+        </w:rPr>
+        <w:pPrChange w:id="42" w:author="kyle O'Reilly" w:date="2026-10-21T20:33:00Z" w16du:dateUtc="2026-10-21T19:33:00Z">
           <w:pPr>
             <w:pStyle w:val="Heading1"/>
           </w:pPr>
         </w:pPrChange>
       </w:pPr>
-      <w:bookmarkStart w:id="17" w:name="_Toc243506922"/>
-      <w:ins w:id="18" w:author="kyle O'Reilly" w:date="2026-10-20T21:25:00Z" w16du:dateUtc="2026-10-20T20:25:00Z">
+      <w:bookmarkStart w:id="43" w:name="_Toc243507765"/>
+      <w:ins w:id="44" w:author="kyle O'Reilly" w:date="2026-10-20T21:25:00Z" w16du:dateUtc="2026-10-20T20:25:00Z">
         <w:r>
           <w:lastRenderedPageBreak/>
           <w:t>1.</w:t>
         </w:r>
       </w:ins>
-      <w:ins w:id="19" w:author="kyle O'Reilly" w:date="2026-10-20T21:26:00Z" w16du:dateUtc="2026-10-20T20:26:00Z">
+      <w:ins w:id="45" w:author="kyle O'Reilly" w:date="2026-10-20T21:26:00Z" w16du:dateUtc="2026-10-20T20:26:00Z">
         <w:r>
           <w:t xml:space="preserve"> </w:t>
         </w:r>
       </w:ins>
-      <w:ins w:id="20" w:author="kyle O'Reilly" w:date="2026-10-21T20:28:00Z" w16du:dateUtc="2026-10-21T19:28:00Z">
+      <w:ins w:id="46" w:author="kyle O'Reilly" w:date="2026-10-21T20:28:00Z" w16du:dateUtc="2026-10-21T19:28:00Z">
         <w:r>
           <w:t>Project Title</w:t>
         </w:r>
-        <w:bookmarkEnd w:id="17"/>
+        <w:bookmarkEnd w:id="43"/>
       </w:ins>
     </w:p>
     <w:p>
@@ -1557,18 +2643,18 @@
         <w:spacing w:line="360" w:lineRule="auto"/>
         <w:jc w:val="both"/>
         <w:rPr>
-          <w:ins w:id="21" w:author="kyle O'Reilly" w:date="2026-10-21T20:32:00Z" w16du:dateUtc="2026-10-21T19:32:00Z"/>
-        </w:rPr>
-        <w:pPrChange w:id="22" w:author="kyle O'Reilly" w:date="2026-10-21T20:33:00Z" w16du:dateUtc="2026-10-21T19:33:00Z">
+          <w:ins w:id="47" w:author="kyle O'Reilly" w:date="2026-10-21T20:32:00Z" w16du:dateUtc="2026-10-21T19:32:00Z"/>
+        </w:rPr>
+        <w:pPrChange w:id="48" w:author="kyle O'Reilly" w:date="2026-10-21T20:33:00Z" w16du:dateUtc="2026-10-21T19:33:00Z">
           <w:pPr/>
         </w:pPrChange>
       </w:pPr>
-      <w:ins w:id="23" w:author="kyle O'Reilly" w:date="2026-10-21T20:28:00Z" w16du:dateUtc="2026-10-21T19:28:00Z">
+      <w:ins w:id="49" w:author="kyle O'Reilly" w:date="2026-10-21T20:28:00Z" w16du:dateUtc="2026-10-21T19:28:00Z">
         <w:r>
           <w:t xml:space="preserve">Assessing the Accuracy of Machine </w:t>
         </w:r>
       </w:ins>
-      <w:ins w:id="24" w:author="kyle O'Reilly" w:date="2026-10-21T20:29:00Z" w16du:dateUtc="2026-10-21T19:29:00Z">
+      <w:ins w:id="50" w:author="kyle O'Reilly" w:date="2026-10-21T20:29:00Z" w16du:dateUtc="2026-10-21T19:29:00Z">
         <w:r>
           <w:t>Learning Models in Predicting F</w:t>
         </w:r>
@@ -1591,7 +2677,7 @@
           <w:t>wi</w:t>
         </w:r>
       </w:ins>
-      <w:ins w:id="25" w:author="kyle O'Reilly" w:date="2026-10-21T20:30:00Z" w16du:dateUtc="2026-10-21T19:30:00Z">
+      <w:ins w:id="51" w:author="kyle O'Reilly" w:date="2026-10-21T20:30:00Z" w16du:dateUtc="2026-10-21T19:30:00Z">
         <w:r>
           <w:t xml:space="preserve">th Different </w:t>
         </w:r>
@@ -1603,7 +2689,7 @@
     <w:p>
       <w:pPr>
         <w:rPr>
-          <w:ins w:id="26" w:author="kyle O'Reilly" w:date="2026-10-21T20:28:00Z" w16du:dateUtc="2026-10-21T19:28:00Z"/>
+          <w:ins w:id="52" w:author="kyle O'Reilly" w:date="2026-10-21T20:28:00Z" w16du:dateUtc="2026-10-21T19:28:00Z"/>
         </w:rPr>
       </w:pPr>
     </w:p>
@@ -1611,19 +2697,596 @@
       <w:pPr>
         <w:pStyle w:val="Heading1"/>
         <w:rPr>
-          <w:ins w:id="27" w:author="kyle O'Reilly" w:date="2026-10-20T21:26:00Z" w16du:dateUtc="2026-10-20T20:26:00Z"/>
-        </w:rPr>
-      </w:pPr>
-      <w:bookmarkStart w:id="28" w:name="_Toc243506923"/>
-      <w:ins w:id="29" w:author="kyle O'Reilly" w:date="2026-10-21T20:28:00Z" w16du:dateUtc="2026-10-21T19:28:00Z">
+          <w:ins w:id="53" w:author="kyle O'Reilly" w:date="2026-10-21T20:39:00Z" w16du:dateUtc="2026-10-21T19:39:00Z"/>
+        </w:rPr>
+      </w:pPr>
+      <w:bookmarkStart w:id="54" w:name="_Toc243507766"/>
+      <w:ins w:id="55" w:author="kyle O'Reilly" w:date="2026-10-21T20:28:00Z" w16du:dateUtc="2026-10-21T19:28:00Z">
         <w:r>
           <w:t>2. Introduction</w:t>
         </w:r>
       </w:ins>
-      <w:bookmarkEnd w:id="28"/>
-    </w:p>
-    <w:p/>
-    <w:p/>
+      <w:bookmarkEnd w:id="54"/>
+    </w:p>
+    <w:p>
+      <w:pPr>
+        <w:rPr>
+          <w:ins w:id="56" w:author="kyle O'Reilly" w:date="2026-10-20T21:26:00Z" w16du:dateUtc="2026-10-20T20:26:00Z"/>
+        </w:rPr>
+        <w:pPrChange w:id="57" w:author="kyle O'Reilly" w:date="2026-10-21T20:39:00Z" w16du:dateUtc="2026-10-21T19:39:00Z">
+          <w:pPr>
+            <w:pStyle w:val="Heading1"/>
+          </w:pPr>
+        </w:pPrChange>
+      </w:pPr>
+      <w:ins w:id="58" w:author="kyle O'Reilly" w:date="2026-10-21T20:39:00Z" w16du:dateUtc="2026-10-21T19:39:00Z">
+        <w:r>
+          <w:t>?</w:t>
+        </w:r>
+      </w:ins>
+    </w:p>
+    <w:p>
+      <w:pPr>
+        <w:rPr>
+          <w:ins w:id="59" w:author="kyle O'Reilly" w:date="2026-10-21T20:39:00Z" w16du:dateUtc="2026-10-21T19:39:00Z"/>
+        </w:rPr>
+      </w:pPr>
+    </w:p>
+    <w:p>
+      <w:pPr>
+        <w:pStyle w:val="Heading1"/>
+        <w:rPr>
+          <w:ins w:id="60" w:author="kyle O'Reilly" w:date="2026-10-21T20:39:00Z" w16du:dateUtc="2026-10-21T19:39:00Z"/>
+        </w:rPr>
+        <w:pPrChange w:id="61" w:author="kyle O'Reilly" w:date="2026-10-21T20:40:00Z" w16du:dateUtc="2026-10-21T19:40:00Z">
+          <w:pPr/>
+        </w:pPrChange>
+      </w:pPr>
+      <w:bookmarkStart w:id="62" w:name="_Toc243507767"/>
+      <w:ins w:id="63" w:author="kyle O'Reilly" w:date="2026-10-21T20:39:00Z" w16du:dateUtc="2026-10-21T19:39:00Z">
+        <w:r>
+          <w:t>3. Problem Definition</w:t>
+        </w:r>
+        <w:bookmarkEnd w:id="62"/>
+        <w:r>
+          <w:t xml:space="preserve"> </w:t>
+        </w:r>
+      </w:ins>
+    </w:p>
+    <w:p>
+      <w:pPr>
+        <w:rPr>
+          <w:ins w:id="64" w:author="kyle O'Reilly" w:date="2026-10-21T20:39:00Z" w16du:dateUtc="2026-10-21T19:39:00Z"/>
+        </w:rPr>
+      </w:pPr>
+      <w:ins w:id="65" w:author="kyle O'Reilly" w:date="2026-10-21T20:39:00Z" w16du:dateUtc="2026-10-21T19:39:00Z">
+        <w:r>
+          <w:t>?</w:t>
+        </w:r>
+      </w:ins>
+    </w:p>
+    <w:p>
+      <w:pPr>
+        <w:pStyle w:val="Heading1"/>
+        <w:rPr>
+          <w:ins w:id="66" w:author="kyle O'Reilly" w:date="2026-10-21T20:39:00Z" w16du:dateUtc="2026-10-21T19:39:00Z"/>
+        </w:rPr>
+        <w:pPrChange w:id="67" w:author="kyle O'Reilly" w:date="2026-10-21T20:40:00Z" w16du:dateUtc="2026-10-21T19:40:00Z">
+          <w:pPr/>
+        </w:pPrChange>
+      </w:pPr>
+    </w:p>
+    <w:p>
+      <w:pPr>
+        <w:pStyle w:val="Heading1"/>
+        <w:rPr>
+          <w:ins w:id="68" w:author="kyle O'Reilly" w:date="2026-10-21T20:40:00Z" w16du:dateUtc="2026-10-21T19:40:00Z"/>
+        </w:rPr>
+        <w:pPrChange w:id="69" w:author="kyle O'Reilly" w:date="2026-10-21T20:40:00Z" w16du:dateUtc="2026-10-21T19:40:00Z">
+          <w:pPr/>
+        </w:pPrChange>
+      </w:pPr>
+      <w:bookmarkStart w:id="70" w:name="_Toc243507768"/>
+      <w:ins w:id="71" w:author="kyle O'Reilly" w:date="2026-10-21T20:39:00Z" w16du:dateUtc="2026-10-21T19:39:00Z">
+        <w:r>
+          <w:t>4. Aim</w:t>
+        </w:r>
+      </w:ins>
+      <w:ins w:id="72" w:author="kyle O'Reilly" w:date="2026-10-21T20:40:00Z" w16du:dateUtc="2026-10-21T19:40:00Z">
+        <w:r>
+          <w:t>, Objectives and Hypothesis</w:t>
+        </w:r>
+        <w:bookmarkEnd w:id="70"/>
+        <w:r>
+          <w:t xml:space="preserve"> </w:t>
+        </w:r>
+      </w:ins>
+    </w:p>
+    <w:p>
+      <w:pPr>
+        <w:rPr>
+          <w:ins w:id="73" w:author="kyle O'Reilly" w:date="2026-10-21T20:39:00Z" w16du:dateUtc="2026-10-21T19:39:00Z"/>
+        </w:rPr>
+      </w:pPr>
+      <w:ins w:id="74" w:author="kyle O'Reilly" w:date="2026-10-21T20:40:00Z" w16du:dateUtc="2026-10-21T19:40:00Z">
+        <w:r>
+          <w:t>?</w:t>
+        </w:r>
+      </w:ins>
+    </w:p>
+    <w:p>
+      <w:pPr>
+        <w:rPr>
+          <w:ins w:id="75" w:author="kyle O'Reilly" w:date="2026-10-21T20:40:00Z" w16du:dateUtc="2026-10-21T19:40:00Z"/>
+        </w:rPr>
+      </w:pPr>
+    </w:p>
+    <w:p>
+      <w:pPr>
+        <w:pStyle w:val="Heading1"/>
+        <w:rPr>
+          <w:ins w:id="76" w:author="kyle O'Reilly" w:date="2026-10-21T20:40:00Z" w16du:dateUtc="2026-10-21T19:40:00Z"/>
+        </w:rPr>
+        <w:pPrChange w:id="77" w:author="kyle O'Reilly" w:date="2026-10-21T20:41:00Z" w16du:dateUtc="2026-10-21T19:41:00Z">
+          <w:pPr/>
+        </w:pPrChange>
+      </w:pPr>
+      <w:bookmarkStart w:id="78" w:name="_Toc243507769"/>
+      <w:ins w:id="79" w:author="kyle O'Reilly" w:date="2026-10-21T20:40:00Z" w16du:dateUtc="2026-10-21T19:40:00Z">
+        <w:r>
+          <w:t>5. Project Scope</w:t>
+        </w:r>
+        <w:bookmarkEnd w:id="78"/>
+      </w:ins>
+    </w:p>
+    <w:p>
+      <w:pPr>
+        <w:rPr>
+          <w:ins w:id="80" w:author="kyle O'Reilly" w:date="2026-10-21T20:40:00Z" w16du:dateUtc="2026-10-21T19:40:00Z"/>
+        </w:rPr>
+      </w:pPr>
+      <w:ins w:id="81" w:author="kyle O'Reilly" w:date="2026-10-21T20:40:00Z" w16du:dateUtc="2026-10-21T19:40:00Z">
+        <w:r>
+          <w:t>?</w:t>
+        </w:r>
+      </w:ins>
+    </w:p>
+    <w:p>
+      <w:pPr>
+        <w:rPr>
+          <w:ins w:id="82" w:author="kyle O'Reilly" w:date="2026-10-21T20:40:00Z" w16du:dateUtc="2026-10-21T19:40:00Z"/>
+        </w:rPr>
+      </w:pPr>
+    </w:p>
+    <w:p>
+      <w:pPr>
+        <w:pStyle w:val="Heading1"/>
+        <w:rPr>
+          <w:ins w:id="83" w:author="kyle O'Reilly" w:date="2026-10-21T20:40:00Z" w16du:dateUtc="2026-10-21T19:40:00Z"/>
+        </w:rPr>
+        <w:pPrChange w:id="84" w:author="kyle O'Reilly" w:date="2026-10-21T20:41:00Z" w16du:dateUtc="2026-10-21T19:41:00Z">
+          <w:pPr/>
+        </w:pPrChange>
+      </w:pPr>
+      <w:bookmarkStart w:id="85" w:name="_Toc243507770"/>
+      <w:ins w:id="86" w:author="kyle O'Reilly" w:date="2026-10-21T20:40:00Z" w16du:dateUtc="2026-10-21T19:40:00Z">
+        <w:r>
+          <w:t>6. Methodology</w:t>
+        </w:r>
+        <w:bookmarkEnd w:id="85"/>
+      </w:ins>
+    </w:p>
+    <w:p>
+      <w:pPr>
+        <w:rPr>
+          <w:ins w:id="87" w:author="kyle O'Reilly" w:date="2026-10-21T20:40:00Z" w16du:dateUtc="2026-10-21T19:40:00Z"/>
+        </w:rPr>
+      </w:pPr>
+      <w:ins w:id="88" w:author="kyle O'Reilly" w:date="2026-10-21T20:40:00Z" w16du:dateUtc="2026-10-21T19:40:00Z">
+        <w:r>
+          <w:t>?</w:t>
+        </w:r>
+      </w:ins>
+    </w:p>
+    <w:p>
+      <w:pPr>
+        <w:rPr>
+          <w:ins w:id="89" w:author="kyle O'Reilly" w:date="2026-10-21T20:40:00Z" w16du:dateUtc="2026-10-21T19:40:00Z"/>
+        </w:rPr>
+      </w:pPr>
+    </w:p>
+    <w:p>
+      <w:pPr>
+        <w:pStyle w:val="Heading1"/>
+        <w:rPr>
+          <w:ins w:id="90" w:author="kyle O'Reilly" w:date="2026-10-21T20:41:00Z" w16du:dateUtc="2026-10-21T19:41:00Z"/>
+        </w:rPr>
+        <w:pPrChange w:id="91" w:author="kyle O'Reilly" w:date="2026-10-21T20:41:00Z" w16du:dateUtc="2026-10-21T19:41:00Z">
+          <w:pPr/>
+        </w:pPrChange>
+      </w:pPr>
+      <w:bookmarkStart w:id="92" w:name="_Toc243507771"/>
+      <w:ins w:id="93" w:author="kyle O'Reilly" w:date="2026-10-21T20:41:00Z" w16du:dateUtc="2026-10-21T19:41:00Z">
+        <w:r>
+          <w:t xml:space="preserve">7. </w:t>
+        </w:r>
+      </w:ins>
+      <w:ins w:id="94" w:author="kyle O'Reilly" w:date="2026-10-21T20:40:00Z" w16du:dateUtc="2026-10-21T19:40:00Z">
+        <w:r>
+          <w:t>Data Sources</w:t>
+        </w:r>
+      </w:ins>
+      <w:bookmarkEnd w:id="92"/>
+    </w:p>
+    <w:p>
+      <w:pPr>
+        <w:rPr>
+          <w:ins w:id="95" w:author="kyle O'Reilly" w:date="2026-10-21T20:41:00Z" w16du:dateUtc="2026-10-21T19:41:00Z"/>
+        </w:rPr>
+      </w:pPr>
+      <w:ins w:id="96" w:author="kyle O'Reilly" w:date="2026-10-21T20:41:00Z" w16du:dateUtc="2026-10-21T19:41:00Z">
+        <w:r>
+          <w:t>?</w:t>
+        </w:r>
+      </w:ins>
+    </w:p>
+    <w:p>
+      <w:pPr>
+        <w:rPr>
+          <w:ins w:id="97" w:author="kyle O'Reilly" w:date="2026-10-21T20:41:00Z" w16du:dateUtc="2026-10-21T19:41:00Z"/>
+        </w:rPr>
+      </w:pPr>
+    </w:p>
+    <w:p>
+      <w:pPr>
+        <w:pStyle w:val="Heading1"/>
+        <w:rPr>
+          <w:ins w:id="98" w:author="kyle O'Reilly" w:date="2026-10-21T20:41:00Z" w16du:dateUtc="2026-10-21T19:41:00Z"/>
+        </w:rPr>
+        <w:pPrChange w:id="99" w:author="kyle O'Reilly" w:date="2026-10-21T20:41:00Z" w16du:dateUtc="2026-10-21T19:41:00Z">
+          <w:pPr/>
+        </w:pPrChange>
+      </w:pPr>
+      <w:bookmarkStart w:id="100" w:name="_Toc243507772"/>
+      <w:ins w:id="101" w:author="kyle O'Reilly" w:date="2026-10-21T20:41:00Z" w16du:dateUtc="2026-10-21T19:41:00Z">
+        <w:r>
+          <w:t>8. Expected Deliverables</w:t>
+        </w:r>
+        <w:bookmarkEnd w:id="100"/>
+      </w:ins>
+    </w:p>
+    <w:p>
+      <w:pPr>
+        <w:rPr>
+          <w:ins w:id="102" w:author="kyle O'Reilly" w:date="2026-10-21T20:41:00Z" w16du:dateUtc="2026-10-21T19:41:00Z"/>
+        </w:rPr>
+      </w:pPr>
+      <w:ins w:id="103" w:author="kyle O'Reilly" w:date="2026-10-21T20:41:00Z" w16du:dateUtc="2026-10-21T19:41:00Z">
+        <w:r>
+          <w:t>?</w:t>
+        </w:r>
+      </w:ins>
+    </w:p>
+    <w:p>
+      <w:pPr>
+        <w:rPr>
+          <w:ins w:id="104" w:author="kyle O'Reilly" w:date="2026-10-21T20:41:00Z" w16du:dateUtc="2026-10-21T19:41:00Z"/>
+        </w:rPr>
+      </w:pPr>
+    </w:p>
+    <w:p>
+      <w:pPr>
+        <w:pStyle w:val="Heading1"/>
+        <w:pPrChange w:id="105" w:author="kyle O'Reilly" w:date="2026-10-21T20:41:00Z" w16du:dateUtc="2026-10-21T19:41:00Z">
+          <w:pPr/>
+        </w:pPrChange>
+      </w:pPr>
+      <w:bookmarkStart w:id="106" w:name="_Toc243507773"/>
+      <w:ins w:id="107" w:author="kyle O'Reilly" w:date="2026-10-21T20:41:00Z" w16du:dateUtc="2026-10-21T19:41:00Z">
+        <w:r>
+          <w:t>9. Project Timeline</w:t>
+        </w:r>
+      </w:ins>
+      <w:bookmarkEnd w:id="106"/>
+    </w:p>
+    <w:p>
+      <w:ins w:id="108" w:author="kyle O'Reilly" w:date="2026-10-21T20:41:00Z" w16du:dateUtc="2026-10-21T19:41:00Z">
+        <w:r>
+          <w:t>?</w:t>
+        </w:r>
+      </w:ins>
+    </w:p>
+    <w:p>
+      <w:pPr>
+        <w:rPr>
+          <w:ins w:id="109" w:author="kyle O'Reilly" w:date="2026-10-21T20:41:00Z" w16du:dateUtc="2026-10-21T19:41:00Z"/>
+        </w:rPr>
+      </w:pPr>
+    </w:p>
+    <w:p>
+      <w:pPr>
+        <w:pStyle w:val="Heading1"/>
+        <w:rPr>
+          <w:ins w:id="110" w:author="kyle O'Reilly" w:date="2026-10-21T20:41:00Z" w16du:dateUtc="2026-10-21T19:41:00Z"/>
+        </w:rPr>
+        <w:pPrChange w:id="111" w:author="kyle O'Reilly" w:date="2026-10-21T20:42:00Z" w16du:dateUtc="2026-10-21T19:42:00Z">
+          <w:pPr/>
+        </w:pPrChange>
+      </w:pPr>
+      <w:bookmarkStart w:id="112" w:name="_Toc243507774"/>
+      <w:ins w:id="113" w:author="kyle O'Reilly" w:date="2026-10-21T20:41:00Z" w16du:dateUtc="2026-10-21T19:41:00Z">
+        <w:r>
+          <w:t>10. Ethical and Legal Considerations</w:t>
+        </w:r>
+        <w:bookmarkEnd w:id="112"/>
+      </w:ins>
+    </w:p>
+    <w:p>
+      <w:pPr>
+        <w:rPr>
+          <w:ins w:id="114" w:author="kyle O'Reilly" w:date="2026-10-21T20:46:00Z" w16du:dateUtc="2026-10-21T19:46:00Z"/>
+        </w:rPr>
+      </w:pPr>
+      <w:ins w:id="115" w:author="kyle O'Reilly" w:date="2026-10-21T20:42:00Z" w16du:dateUtc="2026-10-21T19:42:00Z">
+        <w:r>
+          <w:t>This C</w:t>
+        </w:r>
+      </w:ins>
+      <w:ins w:id="116" w:author="kyle O'Reilly" w:date="2026-10-21T20:43:00Z" w16du:dateUtc="2026-10-21T19:43:00Z">
+        <w:r>
+          <w:t xml:space="preserve">apstone Project will use </w:t>
+        </w:r>
+        <w:r>
+          <w:t xml:space="preserve">publicly available </w:t>
+        </w:r>
+        <w:r>
+          <w:t>historical stock</w:t>
+        </w:r>
+      </w:ins>
+      <w:ins w:id="117" w:author="kyle O'Reilly" w:date="2026-10-21T22:01:00Z" w16du:dateUtc="2026-10-21T21:01:00Z">
+        <w:r>
+          <w:t xml:space="preserve"> </w:t>
+        </w:r>
+      </w:ins>
+      <w:ins w:id="118" w:author="kyle O'Reilly" w:date="2026-10-21T20:43:00Z" w16du:dateUtc="2026-10-21T19:43:00Z">
+        <w:r>
+          <w:t xml:space="preserve">data </w:t>
+        </w:r>
+        <w:r>
+          <w:t xml:space="preserve">and will not </w:t>
+        </w:r>
+        <w:r>
+          <w:t xml:space="preserve">collect personal information or involve human </w:t>
+        </w:r>
+      </w:ins>
+      <w:ins w:id="119" w:author="kyle O'Reilly" w:date="2026-10-21T20:44:00Z" w16du:dateUtc="2026-10-21T19:44:00Z">
+        <w:r>
+          <w:t>participants. Stooq data access and usage conditions, and any Trading 212</w:t>
+        </w:r>
+        <w:r>
+          <w:t xml:space="preserve"> information reused in the report, will be reviewed and appropriately attributed</w:t>
+        </w:r>
+      </w:ins>
+      <w:ins w:id="120" w:author="kyle O'Reilly" w:date="2026-10-21T20:45:00Z" w16du:dateUtc="2026-10-21T19:45:00Z">
+        <w:r>
+          <w:t xml:space="preserve">. Historical stock </w:t>
+        </w:r>
+      </w:ins>
+      <w:ins w:id="121" w:author="kyle O'Reilly" w:date="2026-10-21T22:03:00Z" w16du:dateUtc="2026-10-21T21:03:00Z">
+        <w:r>
+          <w:t xml:space="preserve">market </w:t>
+        </w:r>
+      </w:ins>
+      <w:ins w:id="122" w:author="kyle O'Reilly" w:date="2026-10-21T20:45:00Z" w16du:dateUtc="2026-10-21T19:45:00Z">
+        <w:r>
+          <w:t xml:space="preserve">data </w:t>
+        </w:r>
+      </w:ins>
+      <w:ins w:id="123" w:author="kyle O'Reilly" w:date="2026-10-21T22:11:00Z" w16du:dateUtc="2026-10-21T21:11:00Z">
+        <w:r>
+          <w:t>Comma</w:t>
+        </w:r>
+        <w:r>
+          <w:t xml:space="preserve">-Separated Values </w:t>
+        </w:r>
+        <w:r>
+          <w:t>(</w:t>
+        </w:r>
+      </w:ins>
+      <w:ins w:id="124" w:author="kyle O'Reilly" w:date="2026-10-21T22:05:00Z" w16du:dateUtc="2026-10-21T21:05:00Z">
+        <w:r>
+          <w:t>CSV</w:t>
+        </w:r>
+      </w:ins>
+      <w:ins w:id="125" w:author="kyle O'Reilly" w:date="2026-10-21T22:11:00Z" w16du:dateUtc="2026-10-21T21:11:00Z">
+        <w:r>
+          <w:t>)</w:t>
+        </w:r>
+      </w:ins>
+      <w:ins w:id="126" w:author="kyle O'Reilly" w:date="2026-10-21T22:05:00Z" w16du:dateUtc="2026-10-21T21:05:00Z">
+        <w:r>
+          <w:t xml:space="preserve"> </w:t>
+        </w:r>
+      </w:ins>
+      <w:ins w:id="127" w:author="kyle O'Reilly" w:date="2026-10-21T20:45:00Z" w16du:dateUtc="2026-10-21T19:45:00Z">
+        <w:r>
+          <w:t>files</w:t>
+        </w:r>
+      </w:ins>
+      <w:ins w:id="128" w:author="kyle O'Reilly" w:date="2026-10-21T22:07:00Z" w16du:dateUtc="2026-10-21T21:07:00Z">
+        <w:r>
+          <w:t xml:space="preserve"> downloaded from S</w:t>
+        </w:r>
+      </w:ins>
+      <w:ins w:id="129" w:author="kyle O'Reilly" w:date="2026-10-21T22:08:00Z" w16du:dateUtc="2026-10-21T21:08:00Z">
+        <w:r>
+          <w:t>tooq</w:t>
+        </w:r>
+      </w:ins>
+      <w:ins w:id="130" w:author="kyle O'Reilly" w:date="2026-10-21T20:45:00Z" w16du:dateUtc="2026-10-21T19:45:00Z">
+        <w:r>
+          <w:t xml:space="preserve"> </w:t>
+        </w:r>
+        <w:r>
+          <w:t xml:space="preserve">will only be </w:t>
+        </w:r>
+      </w:ins>
+      <w:ins w:id="131" w:author="kyle O'Reilly" w:date="2026-10-21T22:08:00Z" w16du:dateUtc="2026-10-21T21:08:00Z">
+        <w:r>
+          <w:t>uploaded to</w:t>
+        </w:r>
+      </w:ins>
+      <w:ins w:id="132" w:author="kyle O'Reilly" w:date="2026-10-21T20:45:00Z" w16du:dateUtc="2026-10-21T19:45:00Z">
+        <w:r>
+          <w:t xml:space="preserve"> </w:t>
+        </w:r>
+      </w:ins>
+      <w:ins w:id="133" w:author="kyle O'Reilly" w:date="2026-10-21T20:48:00Z" w16du:dateUtc="2026-10-21T19:48:00Z">
+        <w:r>
+          <w:t>GitHub</w:t>
+        </w:r>
+      </w:ins>
+      <w:ins w:id="134" w:author="kyle O'Reilly" w:date="2026-10-21T20:45:00Z" w16du:dateUtc="2026-10-21T19:45:00Z">
+        <w:r>
+          <w:t xml:space="preserve"> </w:t>
+        </w:r>
+      </w:ins>
+      <w:ins w:id="135" w:author="kyle O'Reilly" w:date="2026-10-21T22:07:00Z" w16du:dateUtc="2026-10-21T21:07:00Z">
+        <w:r>
+          <w:t>if permitted by Stooq’s terms of service</w:t>
+        </w:r>
+      </w:ins>
+      <w:ins w:id="136" w:author="kyle O'Reilly" w:date="2026-10-21T20:45:00Z" w16du:dateUtc="2026-10-21T19:45:00Z">
+        <w:r>
+          <w:t xml:space="preserve">; otherwise, </w:t>
+        </w:r>
+      </w:ins>
+      <w:ins w:id="137" w:author="kyle O'Reilly" w:date="2026-10-21T22:07:00Z" w16du:dateUtc="2026-10-21T21:07:00Z">
+        <w:r>
+          <w:t xml:space="preserve">the </w:t>
+        </w:r>
+        <w:r>
+          <w:t xml:space="preserve">Phyton </w:t>
+        </w:r>
+      </w:ins>
+      <w:ins w:id="138" w:author="kyle O'Reilly" w:date="2026-10-21T20:45:00Z" w16du:dateUtc="2026-10-21T19:45:00Z">
+        <w:r>
+          <w:t xml:space="preserve">code and retrieval </w:t>
+        </w:r>
+      </w:ins>
+      <w:ins w:id="139" w:author="kyle O'Reilly" w:date="2026-10-21T20:46:00Z" w16du:dateUtc="2026-10-21T19:46:00Z">
+        <w:r>
+          <w:t xml:space="preserve">instructions will be provided. </w:t>
+        </w:r>
+      </w:ins>
+    </w:p>
+    <w:p>
+      <w:pPr>
+        <w:rPr>
+          <w:ins w:id="140" w:author="kyle O'Reilly" w:date="2026-10-21T20:42:00Z" w16du:dateUtc="2026-10-21T19:42:00Z"/>
+        </w:rPr>
+      </w:pPr>
+      <w:ins w:id="141" w:author="kyle O'Reilly" w:date="2026-10-21T22:09:00Z" w16du:dateUtc="2026-10-21T21:09:00Z">
+        <w:r>
+          <w:t>All results</w:t>
+        </w:r>
+        <w:r>
+          <w:t>,</w:t>
+        </w:r>
+      </w:ins>
+      <w:ins w:id="142" w:author="kyle O'Reilly" w:date="2026-10-21T20:47:00Z" w16du:dateUtc="2026-10-21T19:47:00Z">
+        <w:r>
+          <w:t xml:space="preserve"> including </w:t>
+        </w:r>
+      </w:ins>
+      <w:ins w:id="143" w:author="kyle O'Reilly" w:date="2026-10-21T22:10:00Z" w16du:dateUtc="2026-10-21T21:10:00Z">
+        <w:r>
+          <w:t>inaccurate</w:t>
+        </w:r>
+      </w:ins>
+      <w:ins w:id="144" w:author="kyle O'Reilly" w:date="2026-10-21T20:47:00Z" w16du:dateUtc="2026-10-21T19:47:00Z">
+        <w:r>
+          <w:t xml:space="preserve"> predictions, will be reported transparently. Th</w:t>
+        </w:r>
+      </w:ins>
+      <w:ins w:id="145" w:author="kyle O'Reilly" w:date="2026-10-21T22:10:00Z" w16du:dateUtc="2026-10-21T21:10:00Z">
+        <w:r>
+          <w:t>is Capstone Project</w:t>
+        </w:r>
+      </w:ins>
+      <w:ins w:id="146" w:author="kyle O'Reilly" w:date="2026-10-21T20:47:00Z" w16du:dateUtc="2026-10-21T19:47:00Z">
+        <w:r>
+          <w:t xml:space="preserve"> work is for academic purposes</w:t>
+        </w:r>
+      </w:ins>
+      <w:ins w:id="147" w:author="kyle O'Reilly" w:date="2026-10-21T22:10:00Z" w16du:dateUtc="2026-10-21T21:10:00Z">
+        <w:r>
+          <w:t xml:space="preserve"> only</w:t>
+        </w:r>
+      </w:ins>
+      <w:ins w:id="148" w:author="kyle O'Reilly" w:date="2026-10-21T20:47:00Z" w16du:dateUtc="2026-10-21T19:47:00Z">
+        <w:r>
+          <w:t xml:space="preserve"> and does constitute financial inv</w:t>
+        </w:r>
+      </w:ins>
+      <w:ins w:id="149" w:author="kyle O'Reilly" w:date="2026-10-21T20:48:00Z" w16du:dateUtc="2026-10-21T19:48:00Z">
+        <w:r>
+          <w:t>estment</w:t>
+        </w:r>
+      </w:ins>
+      <w:ins w:id="150" w:author="kyle O'Reilly" w:date="2026-10-21T20:47:00Z" w16du:dateUtc="2026-10-21T19:47:00Z">
+        <w:r>
+          <w:t xml:space="preserve"> advice.</w:t>
+        </w:r>
+      </w:ins>
+    </w:p>
+    <w:p>
+      <w:pPr>
+        <w:rPr>
+          <w:ins w:id="151" w:author="kyle O'Reilly" w:date="2026-10-21T20:42:00Z" w16du:dateUtc="2026-10-21T19:42:00Z"/>
+        </w:rPr>
+      </w:pPr>
+    </w:p>
+    <w:p>
+      <w:pPr>
+        <w:pStyle w:val="Heading1"/>
+        <w:rPr>
+          <w:ins w:id="152" w:author="kyle O'Reilly" w:date="2026-10-21T20:42:00Z" w16du:dateUtc="2026-10-21T19:42:00Z"/>
+        </w:rPr>
+        <w:pPrChange w:id="153" w:author="kyle O'Reilly" w:date="2026-10-21T20:42:00Z" w16du:dateUtc="2026-10-21T19:42:00Z">
+          <w:pPr/>
+        </w:pPrChange>
+      </w:pPr>
+      <w:bookmarkStart w:id="154" w:name="_Toc243507775"/>
+      <w:ins w:id="155" w:author="kyle O'Reilly" w:date="2026-10-21T20:42:00Z" w16du:dateUtc="2026-10-21T19:42:00Z">
+        <w:r>
+          <w:t>References</w:t>
+        </w:r>
+        <w:bookmarkEnd w:id="154"/>
+        <w:r>
+          <w:t xml:space="preserve"> </w:t>
+        </w:r>
+      </w:ins>
+    </w:p>
+    <w:p>
+      <w:pPr>
+        <w:rPr>
+          <w:ins w:id="156" w:author="kyle O'Reilly" w:date="2026-10-21T20:41:00Z" w16du:dateUtc="2026-10-21T19:41:00Z"/>
+        </w:rPr>
+      </w:pPr>
+      <w:ins w:id="157" w:author="kyle O'Reilly" w:date="2026-10-21T20:42:00Z" w16du:dateUtc="2026-10-21T19:42:00Z">
+        <w:r>
+          <w:t>?</w:t>
+        </w:r>
+      </w:ins>
+    </w:p>
+    <w:p>
+      <w:pPr>
+        <w:rPr>
+          <w:ins w:id="158" w:author="kyle O'Reilly" w:date="2026-10-21T20:41:00Z" w16du:dateUtc="2026-10-21T19:41:00Z"/>
+        </w:rPr>
+      </w:pPr>
+    </w:p>
     <w:p/>
     <w:sectPr>
       <w:headerReference w:type="default" r:id="rId14"/>
@@ -4037,20 +5700,6 @@
 </file>
 
 <file path=customXml/item1.xml><?xml version="1.0" encoding="utf-8"?>
-<p:properties xmlns:p="http://schemas.microsoft.com/office/2006/metadata/properties" xmlns:xsi="http://www.w3.org/2001/XMLSchema-instance" xmlns:pc="http://schemas.microsoft.com/office/infopath/2007/PartnerControls">
-  <documentManagement>
-    <_activity xmlns="b16a9495-4dfd-42d3-807b-98cb11f03b43" xsi:nil="true"/>
-  </documentManagement>
-</p:properties>
-</file>
-
-<file path=customXml/item2.xml><?xml version="1.0" encoding="utf-8"?>
-<go:gDocsCustomXmlDataStorage xmlns:go="http://customooxmlschemas.google.com/" xmlns:r="http://schemas.openxmlformats.org/officeDocument/2006/relationships" uri="GoogleDocsCustomDataVersion2">
-  <go:docsCustomData xmlns:go="http://customooxmlschemas.google.com/" roundtripDataSignature="AMtx7miehlgh2pzFvkmpnhkVaeODs3Wnuw==">CgMxLjAyCGguZ2pkZ3hzMgloLjMwajB6bGwyCWguMWZvYjl0ZTIJaC4zem55c2g3MgloLjJldDkycDAyDmgua2ZranMzcndsMmMxOAByITF6bEVRVXYyWkdtTjZWemdfYk5uaGpmb0x1c2hhYUo3dw==</go:docsCustomData>
-</go:gDocsCustomXmlDataStorage>
-</file>
-
-<file path=customXml/item3.xml><?xml version="1.0" encoding="utf-8"?>
 <ct:contentTypeSchema xmlns:ct="http://schemas.microsoft.com/office/2006/metadata/contentType" xmlns:ma="http://schemas.microsoft.com/office/2006/metadata/properties/metaAttributes" ct:_="" ma:_="" ma:contentTypeName="Document" ma:contentTypeID="0x01010091CA7052A48FB44E8BAE44044031FC77" ma:contentTypeVersion="5" ma:contentTypeDescription="Create a new document." ma:contentTypeScope="" ma:versionID="72110da391d7bf7bbbd9879cda66318c">
   <xsd:schema xmlns:xsd="http://www.w3.org/2001/XMLSchema" xmlns:xs="http://www.w3.org/2001/XMLSchema" xmlns:p="http://schemas.microsoft.com/office/2006/metadata/properties" xmlns:ns3="b16a9495-4dfd-42d3-807b-98cb11f03b43" targetNamespace="http://schemas.microsoft.com/office/2006/metadata/properties" ma:root="true" ma:fieldsID="65d4c4ab10123b5e2192ffab3149626d" ns3:_="">
     <xsd:import namespace="b16a9495-4dfd-42d3-807b-98cb11f03b43"/>
@@ -4200,11 +5849,21 @@
 </ct:contentTypeSchema>
 </file>
 
-<file path=customXml/item4.xml><?xml version="1.0" encoding="utf-8"?>
-<b:Sources xmlns:b="http://schemas.openxmlformats.org/officeDocument/2006/bibliography" xmlns="http://schemas.openxmlformats.org/officeDocument/2006/bibliography" SelectedStyle="\APASixthEditionOfficeOnline.xsl" StyleName="APA" Version="6"/>
+<file path=customXml/item2.xml><?xml version="1.0" encoding="utf-8"?>
+<go:gDocsCustomXmlDataStorage xmlns:go="http://customooxmlschemas.google.com/" xmlns:r="http://schemas.openxmlformats.org/officeDocument/2006/relationships" uri="GoogleDocsCustomDataVersion2">
+  <go:docsCustomData xmlns:go="http://customooxmlschemas.google.com/" roundtripDataSignature="AMtx7miehlgh2pzFvkmpnhkVaeODs3Wnuw==">CgMxLjAyCGguZ2pkZ3hzMgloLjMwajB6bGwyCWguMWZvYjl0ZTIJaC4zem55c2g3MgloLjJldDkycDAyDmgua2ZranMzcndsMmMxOAByITF6bEVRVXYyWkdtTjZWemdfYk5uaGpmb0x1c2hhYUo3dw==</go:docsCustomData>
+</go:gDocsCustomXmlDataStorage>
 </file>
 
-<file path=customXml/item5.xml><?xml version="1.0" encoding="utf-8"?>
+<file path=customXml/item3.xml><?xml version="1.0" encoding="utf-8"?>
+<p:properties xmlns:p="http://schemas.microsoft.com/office/2006/metadata/properties" xmlns:xsi="http://www.w3.org/2001/XMLSchema-instance" xmlns:pc="http://schemas.microsoft.com/office/infopath/2007/PartnerControls">
+  <documentManagement>
+    <_activity xmlns="b16a9495-4dfd-42d3-807b-98cb11f03b43" xsi:nil="true"/>
+  </documentManagement>
+</p:properties>
+</file>
+
+<file path=customXml/item4.xml><?xml version="1.0" encoding="utf-8"?>
 <?mso-contentType ?>
 <FormTemplates xmlns="http://schemas.microsoft.com/sharepoint/v3/contenttype/forms">
   <Display>DocumentLibraryForm</Display>
@@ -4213,26 +5872,11 @@
 </FormTemplates>
 </file>
 
-<file path=customXml/itemProps1.xml><?xml version="1.0" encoding="utf-8"?>
-<ds:datastoreItem xmlns:ds="http://schemas.openxmlformats.org/officeDocument/2006/customXml" ds:itemID="{D51EB97A-8C7A-4EE1-A3AD-E57FDBFA6BEE}">
-  <ds:schemaRefs>
-    <ds:schemaRef ds:uri="http://schemas.microsoft.com/office/2006/metadata/properties"/>
-    <ds:schemaRef ds:uri="http://schemas.microsoft.com/office/infopath/2007/PartnerControls"/>
-    <ds:schemaRef ds:uri="b16a9495-4dfd-42d3-807b-98cb11f03b43"/>
-  </ds:schemaRefs>
-</ds:datastoreItem>
+<file path=customXml/item5.xml><?xml version="1.0" encoding="utf-8"?>
+<b:Sources xmlns:b="http://schemas.openxmlformats.org/officeDocument/2006/bibliography" xmlns="http://schemas.openxmlformats.org/officeDocument/2006/bibliography" SelectedStyle="\APASixthEditionOfficeOnline.xsl" StyleName="APA" Version="6"/>
 </file>
 
-<file path=customXml/itemProps2.xml><?xml version="1.0" encoding="utf-8"?>
-<ds:datastoreItem xmlns:ds="http://schemas.openxmlformats.org/officeDocument/2006/customXml" ds:itemID="{11111111-1234-1234-1234-123412341234}">
-  <ds:schemaRefs>
-    <ds:schemaRef ds:uri="http://customooxmlschemas.google.com/"/>
-    <ds:schemaRef ds:uri="http://schemas.openxmlformats.org/officeDocument/2006/relationships"/>
-  </ds:schemaRefs>
-</ds:datastoreItem>
-</file>
-
-<file path=customXml/itemProps3.xml><?xml version="1.0" encoding="utf-8"?>
+<file path=customXml/itemProps1.xml><?xml version="1.0" encoding="utf-8"?>
 <ds:datastoreItem xmlns:ds="http://schemas.openxmlformats.org/officeDocument/2006/customXml" ds:itemID="{1CD39011-2B34-4226-8638-59B13D86301D}">
   <ds:schemaRefs>
     <ds:schemaRef ds:uri="http://schemas.microsoft.com/office/2006/metadata/contentType"/>
@@ -4250,18 +5894,37 @@
 </ds:datastoreItem>
 </file>
 
+<file path=customXml/itemProps2.xml><?xml version="1.0" encoding="utf-8"?>
+<ds:datastoreItem xmlns:ds="http://schemas.openxmlformats.org/officeDocument/2006/customXml" ds:itemID="{11111111-1234-1234-1234-123412341234}">
+  <ds:schemaRefs>
+    <ds:schemaRef ds:uri="http://customooxmlschemas.google.com/"/>
+    <ds:schemaRef ds:uri="http://schemas.openxmlformats.org/officeDocument/2006/relationships"/>
+  </ds:schemaRefs>
+</ds:datastoreItem>
+</file>
+
+<file path=customXml/itemProps3.xml><?xml version="1.0" encoding="utf-8"?>
+<ds:datastoreItem xmlns:ds="http://schemas.openxmlformats.org/officeDocument/2006/customXml" ds:itemID="{D51EB97A-8C7A-4EE1-A3AD-E57FDBFA6BEE}">
+  <ds:schemaRefs>
+    <ds:schemaRef ds:uri="http://schemas.microsoft.com/office/2006/metadata/properties"/>
+    <ds:schemaRef ds:uri="http://schemas.microsoft.com/office/infopath/2007/PartnerControls"/>
+    <ds:schemaRef ds:uri="b16a9495-4dfd-42d3-807b-98cb11f03b43"/>
+  </ds:schemaRefs>
+</ds:datastoreItem>
+</file>
+
 <file path=customXml/itemProps4.xml><?xml version="1.0" encoding="utf-8"?>
+<ds:datastoreItem xmlns:ds="http://schemas.openxmlformats.org/officeDocument/2006/customXml" ds:itemID="{AD64260C-1345-4C21-A804-B9FBE7B91489}">
+  <ds:schemaRefs>
+    <ds:schemaRef ds:uri="http://schemas.microsoft.com/sharepoint/v3/contenttype/forms"/>
+  </ds:schemaRefs>
+</ds:datastoreItem>
+</file>
+
+<file path=customXml/itemProps5.xml><?xml version="1.0" encoding="utf-8"?>
 <ds:datastoreItem xmlns:ds="http://schemas.openxmlformats.org/officeDocument/2006/customXml" ds:itemID="{A5C61161-19E4-4D42-A5DA-EC591AFE0A7D}">
   <ds:schemaRefs>
     <ds:schemaRef ds:uri="http://schemas.openxmlformats.org/officeDocument/2006/bibliography"/>
   </ds:schemaRefs>
 </ds:datastoreItem>
-</file>
-
-<file path=customXml/itemProps5.xml><?xml version="1.0" encoding="utf-8"?>
-<ds:datastoreItem xmlns:ds="http://schemas.openxmlformats.org/officeDocument/2006/customXml" ds:itemID="{AD64260C-1345-4C21-A804-B9FBE7B91489}">
-  <ds:schemaRefs>
-    <ds:schemaRef ds:uri="http://schemas.microsoft.com/sharepoint/v3/contenttype/forms"/>
-  </ds:schemaRefs>
-</ds:datastoreItem>
 </file>
</xml_diff>

<commit_message>
Compleetd Aims, Objectives and Hypothesis section
</commit_message>
<xml_diff>
--- a/HDSDAB - Strategic Thinking - Capstone Project.docx
+++ b/HDSDAB - Strategic Thinking - Capstone Project.docx
@@ -499,6 +499,7 @@
           <w:szCs w:val="32"/>
         </w:rPr>
       </w:pPr>
+      <w:proofErr w:type="spellStart"/>
       <w:ins w:id="4" w:author="kyle O'Reilly" w:date="2026-10-20T21:24:00Z" w16du:dateUtc="2026-10-20T20:24:00Z">
         <w:r>
           <w:rPr>
@@ -507,7 +508,17 @@
             <w:sz w:val="32"/>
             <w:szCs w:val="32"/>
           </w:rPr>
-          <w:t>Taufique Ahmed</w:t>
+          <w:t>Taufique</w:t>
+        </w:r>
+        <w:proofErr w:type="spellEnd"/>
+        <w:r>
+          <w:rPr>
+            <w:i/>
+            <w:color w:val="EE0000"/>
+            <w:sz w:val="32"/>
+            <w:szCs w:val="32"/>
+          </w:rPr>
+          <w:t xml:space="preserve"> Ahmed</w:t>
         </w:r>
       </w:ins>
     </w:p>
@@ -640,6 +651,7 @@
           <w:szCs w:val="32"/>
         </w:rPr>
       </w:pPr>
+      <w:proofErr w:type="spellStart"/>
       <w:r>
         <w:rPr>
           <w:i/>
@@ -648,7 +660,17 @@
           <w:szCs w:val="32"/>
         </w:rPr>
         <w:lastRenderedPageBreak/>
-        <w:t xml:space="preserve">Github Repository </w:t>
+        <w:t>Github</w:t>
+      </w:r>
+      <w:proofErr w:type="spellEnd"/>
+      <w:r>
+        <w:rPr>
+          <w:i/>
+          <w:color w:val="156082"/>
+          <w:sz w:val="32"/>
+          <w:szCs w:val="32"/>
+        </w:rPr>
+        <w:t xml:space="preserve"> Repository </w:t>
       </w:r>
     </w:p>
     <w:p>
@@ -672,9 +694,22 @@
             <w:sz w:val="32"/>
             <w:szCs w:val="32"/>
           </w:rPr>
-          <w:t>https://github.com/sba26104-KOR/HDSDAB---Strategic-Thinking---Capstone-Project.git</w:t>
-        </w:r>
-      </w:ins>
+          <w:t>https://github.com/sba26104-KOR/HDSDAB---Strategic-Thinking---Capstone-</w:t>
+        </w:r>
+        <w:proofErr w:type="spellStart"/>
+        <w:r>
+          <w:rPr>
+            <w:bCs/>
+            <w:i/>
+            <w:iCs/>
+            <w:color w:val="EE0000"/>
+            <w:sz w:val="32"/>
+            <w:szCs w:val="32"/>
+          </w:rPr>
+          <w:t>Project.git</w:t>
+        </w:r>
+      </w:ins>
+      <w:proofErr w:type="spellEnd"/>
     </w:p>
     <w:p>
       <w:pPr>
@@ -790,7 +825,23 @@
                                 <w:color w:val="000000"/>
                                 <w:sz w:val="28"/>
                               </w:rPr>
-                              <w:t xml:space="preserve">By submitting this assessment, I confirm that I have read the CCT policy on academic misconduct and understand the implications of submitting work that is not my own or does not appropriately reference material taken from a third party or other source. </w:t>
+                              <w:t xml:space="preserve">By submitting this assessment, I confirm that I have read the CCT policy on academic misconduct and understand the implications of submitting work that is not my own or does not appropriately reference material </w:t>
+                            </w:r>
+                            <w:proofErr w:type="gramStart"/>
+                            <w:r>
+                              <w:rPr>
+                                <w:color w:val="000000"/>
+                                <w:sz w:val="28"/>
+                              </w:rPr>
+                              <w:t>taken</w:t>
+                            </w:r>
+                            <w:proofErr w:type="gramEnd"/>
+                            <w:r>
+                              <w:rPr>
+                                <w:color w:val="000000"/>
+                                <w:sz w:val="28"/>
+                              </w:rPr>
+                              <w:t xml:space="preserve"> from a third party or other source. </w:t>
                             </w:r>
                           </w:p>
                           <w:p>
@@ -1234,12 +1285,14 @@
               </w:rPr>
               <w:instrText xml:space="preserve"> PAGEREF _Toc243507765 \h </w:instrText>
             </w:r>
-            <w:r>
-              <w:rPr>
-                <w:noProof/>
-                <w:webHidden/>
-              </w:rPr>
-            </w:r>
+          </w:ins>
+          <w:r>
+            <w:rPr>
+              <w:noProof/>
+              <w:webHidden/>
+            </w:rPr>
+          </w:r>
+          <w:ins w:id="10" w:author="kyle O'Reilly" w:date="2026-10-21T20:42:00Z" w16du:dateUtc="2026-10-21T19:42:00Z">
             <w:r>
               <w:rPr>
                 <w:noProof/>
@@ -1277,7 +1330,7 @@
               <w:tab w:val="right" w:leader="dot" w:pos="9016"/>
             </w:tabs>
             <w:rPr>
-              <w:ins w:id="10" w:author="kyle O'Reilly" w:date="2026-10-21T20:42:00Z" w16du:dateUtc="2026-10-21T19:42:00Z"/>
+              <w:ins w:id="11" w:author="kyle O'Reilly" w:date="2026-10-21T20:42:00Z" w16du:dateUtc="2026-10-21T19:42:00Z"/>
               <w:rFonts w:asciiTheme="minorHAnsi" w:eastAsiaTheme="minorEastAsia" w:hAnsiTheme="minorHAnsi" w:cstheme="minorBidi"/>
               <w:noProof/>
               <w:kern w:val="2"/>
@@ -1286,7 +1339,7 @@
               <w14:ligatures w14:val="standardContextual"/>
             </w:rPr>
           </w:pPr>
-          <w:ins w:id="11" w:author="kyle O'Reilly" w:date="2026-10-21T20:42:00Z" w16du:dateUtc="2026-10-21T19:42:00Z">
+          <w:ins w:id="12" w:author="kyle O'Reilly" w:date="2026-10-21T20:42:00Z" w16du:dateUtc="2026-10-21T19:42:00Z">
             <w:r>
               <w:rPr>
                 <w:rStyle w:val="Hyperlink"/>
@@ -1355,133 +1408,14 @@
               </w:rPr>
               <w:instrText xml:space="preserve"> PAGEREF _Toc243507766 \h </w:instrText>
             </w:r>
-            <w:r>
-              <w:rPr>
-                <w:noProof/>
-                <w:webHidden/>
-              </w:rPr>
-            </w:r>
-            <w:r>
-              <w:rPr>
-                <w:noProof/>
-                <w:webHidden/>
-              </w:rPr>
-              <w:fldChar w:fldCharType="separate"/>
-            </w:r>
-            <w:r>
-              <w:rPr>
-                <w:noProof/>
-                <w:webHidden/>
-              </w:rPr>
-              <w:t>1</w:t>
-            </w:r>
-            <w:r>
-              <w:rPr>
-                <w:noProof/>
-                <w:webHidden/>
-              </w:rPr>
-              <w:fldChar w:fldCharType="end"/>
-            </w:r>
-            <w:r>
-              <w:rPr>
-                <w:rStyle w:val="Hyperlink"/>
-                <w:noProof/>
-              </w:rPr>
-              <w:fldChar w:fldCharType="end"/>
-            </w:r>
           </w:ins>
-        </w:p>
-        <w:p>
-          <w:pPr>
-            <w:pStyle w:val="TOC1"/>
-            <w:tabs>
-              <w:tab w:val="right" w:leader="dot" w:pos="9016"/>
-            </w:tabs>
+          <w:r>
             <w:rPr>
-              <w:ins w:id="12" w:author="kyle O'Reilly" w:date="2026-10-21T20:42:00Z" w16du:dateUtc="2026-10-21T19:42:00Z"/>
-              <w:rFonts w:asciiTheme="minorHAnsi" w:eastAsiaTheme="minorEastAsia" w:hAnsiTheme="minorHAnsi" w:cstheme="minorBidi"/>
               <w:noProof/>
-              <w:kern w:val="2"/>
-              <w:sz w:val="24"/>
-              <w:szCs w:val="24"/>
-              <w14:ligatures w14:val="standardContextual"/>
+              <w:webHidden/>
             </w:rPr>
-          </w:pPr>
+          </w:r>
           <w:ins w:id="13" w:author="kyle O'Reilly" w:date="2026-10-21T20:42:00Z" w16du:dateUtc="2026-10-21T19:42:00Z">
-            <w:r>
-              <w:rPr>
-                <w:rStyle w:val="Hyperlink"/>
-                <w:noProof/>
-              </w:rPr>
-              <w:fldChar w:fldCharType="begin"/>
-            </w:r>
-            <w:r>
-              <w:rPr>
-                <w:rStyle w:val="Hyperlink"/>
-                <w:noProof/>
-              </w:rPr>
-              <w:instrText xml:space="preserve"> </w:instrText>
-            </w:r>
-            <w:r>
-              <w:rPr>
-                <w:noProof/>
-              </w:rPr>
-              <w:instrText>HYPERLINK \l "_Toc243507767"</w:instrText>
-            </w:r>
-            <w:r>
-              <w:rPr>
-                <w:rStyle w:val="Hyperlink"/>
-                <w:noProof/>
-              </w:rPr>
-              <w:instrText xml:space="preserve"> </w:instrText>
-            </w:r>
-            <w:r>
-              <w:rPr>
-                <w:rStyle w:val="Hyperlink"/>
-                <w:noProof/>
-              </w:rPr>
-            </w:r>
-            <w:r>
-              <w:rPr>
-                <w:rStyle w:val="Hyperlink"/>
-                <w:noProof/>
-              </w:rPr>
-              <w:fldChar w:fldCharType="separate"/>
-            </w:r>
-            <w:r>
-              <w:rPr>
-                <w:rStyle w:val="Hyperlink"/>
-                <w:noProof/>
-              </w:rPr>
-              <w:t>3. Problem Definition</w:t>
-            </w:r>
-            <w:r>
-              <w:rPr>
-                <w:noProof/>
-                <w:webHidden/>
-              </w:rPr>
-              <w:tab/>
-            </w:r>
-            <w:r>
-              <w:rPr>
-                <w:noProof/>
-                <w:webHidden/>
-              </w:rPr>
-              <w:fldChar w:fldCharType="begin"/>
-            </w:r>
-            <w:r>
-              <w:rPr>
-                <w:noProof/>
-                <w:webHidden/>
-              </w:rPr>
-              <w:instrText xml:space="preserve"> PAGEREF _Toc243507767 \h </w:instrText>
-            </w:r>
-            <w:r>
-              <w:rPr>
-                <w:noProof/>
-                <w:webHidden/>
-              </w:rPr>
-            </w:r>
             <w:r>
               <w:rPr>
                 <w:noProof/>
@@ -1547,7 +1481,7 @@
               <w:rPr>
                 <w:noProof/>
               </w:rPr>
-              <w:instrText>HYPERLINK \l "_Toc243507768"</w:instrText>
+              <w:instrText>HYPERLINK \l "_Toc243507767"</w:instrText>
             </w:r>
             <w:r>
               <w:rPr>
@@ -1574,7 +1508,7 @@
                 <w:rStyle w:val="Hyperlink"/>
                 <w:noProof/>
               </w:rPr>
-              <w:t>4. Aim, Objectives and Hypothesis</w:t>
+              <w:t>3. Problem Definition</w:t>
             </w:r>
             <w:r>
               <w:rPr>
@@ -1595,14 +1529,16 @@
                 <w:noProof/>
                 <w:webHidden/>
               </w:rPr>
-              <w:instrText xml:space="preserve"> PAGEREF _Toc243507768 \h </w:instrText>
-            </w:r>
-            <w:r>
-              <w:rPr>
-                <w:noProof/>
-                <w:webHidden/>
-              </w:rPr>
-            </w:r>
+              <w:instrText xml:space="preserve"> PAGEREF _Toc243507767 \h </w:instrText>
+            </w:r>
+          </w:ins>
+          <w:r>
+            <w:rPr>
+              <w:noProof/>
+              <w:webHidden/>
+            </w:rPr>
+          </w:r>
+          <w:ins w:id="16" w:author="kyle O'Reilly" w:date="2026-10-21T20:42:00Z" w16du:dateUtc="2026-10-21T19:42:00Z">
             <w:r>
               <w:rPr>
                 <w:noProof/>
@@ -1640,7 +1576,7 @@
               <w:tab w:val="right" w:leader="dot" w:pos="9016"/>
             </w:tabs>
             <w:rPr>
-              <w:ins w:id="16" w:author="kyle O'Reilly" w:date="2026-10-21T20:42:00Z" w16du:dateUtc="2026-10-21T19:42:00Z"/>
+              <w:ins w:id="17" w:author="kyle O'Reilly" w:date="2026-10-21T20:42:00Z" w16du:dateUtc="2026-10-21T19:42:00Z"/>
               <w:rFonts w:asciiTheme="minorHAnsi" w:eastAsiaTheme="minorEastAsia" w:hAnsiTheme="minorHAnsi" w:cstheme="minorBidi"/>
               <w:noProof/>
               <w:kern w:val="2"/>
@@ -1649,7 +1585,7 @@
               <w14:ligatures w14:val="standardContextual"/>
             </w:rPr>
           </w:pPr>
-          <w:ins w:id="17" w:author="kyle O'Reilly" w:date="2026-10-21T20:42:00Z" w16du:dateUtc="2026-10-21T19:42:00Z">
+          <w:ins w:id="18" w:author="kyle O'Reilly" w:date="2026-10-21T20:42:00Z" w16du:dateUtc="2026-10-21T19:42:00Z">
             <w:r>
               <w:rPr>
                 <w:rStyle w:val="Hyperlink"/>
@@ -1668,7 +1604,7 @@
               <w:rPr>
                 <w:noProof/>
               </w:rPr>
-              <w:instrText>HYPERLINK \l "_Toc243507769"</w:instrText>
+              <w:instrText>HYPERLINK \l "_Toc243507768"</w:instrText>
             </w:r>
             <w:r>
               <w:rPr>
@@ -1695,7 +1631,7 @@
                 <w:rStyle w:val="Hyperlink"/>
                 <w:noProof/>
               </w:rPr>
-              <w:t>5. Project Scope</w:t>
+              <w:t>4. Aim, Objectives and Hypothesis</w:t>
             </w:r>
             <w:r>
               <w:rPr>
@@ -1716,135 +1652,16 @@
                 <w:noProof/>
                 <w:webHidden/>
               </w:rPr>
-              <w:instrText xml:space="preserve"> PAGEREF _Toc243507769 \h </w:instrText>
-            </w:r>
-            <w:r>
-              <w:rPr>
-                <w:noProof/>
-                <w:webHidden/>
-              </w:rPr>
-            </w:r>
-            <w:r>
-              <w:rPr>
-                <w:noProof/>
-                <w:webHidden/>
-              </w:rPr>
-              <w:fldChar w:fldCharType="separate"/>
-            </w:r>
-            <w:r>
-              <w:rPr>
-                <w:noProof/>
-                <w:webHidden/>
-              </w:rPr>
-              <w:t>1</w:t>
-            </w:r>
-            <w:r>
-              <w:rPr>
-                <w:noProof/>
-                <w:webHidden/>
-              </w:rPr>
-              <w:fldChar w:fldCharType="end"/>
-            </w:r>
-            <w:r>
-              <w:rPr>
-                <w:rStyle w:val="Hyperlink"/>
-                <w:noProof/>
-              </w:rPr>
-              <w:fldChar w:fldCharType="end"/>
+              <w:instrText xml:space="preserve"> PAGEREF _Toc243507768 \h </w:instrText>
             </w:r>
           </w:ins>
-        </w:p>
-        <w:p>
-          <w:pPr>
-            <w:pStyle w:val="TOC1"/>
-            <w:tabs>
-              <w:tab w:val="right" w:leader="dot" w:pos="9016"/>
-            </w:tabs>
+          <w:r>
             <w:rPr>
-              <w:ins w:id="18" w:author="kyle O'Reilly" w:date="2026-10-21T20:42:00Z" w16du:dateUtc="2026-10-21T19:42:00Z"/>
-              <w:rFonts w:asciiTheme="minorHAnsi" w:eastAsiaTheme="minorEastAsia" w:hAnsiTheme="minorHAnsi" w:cstheme="minorBidi"/>
               <w:noProof/>
-              <w:kern w:val="2"/>
-              <w:sz w:val="24"/>
-              <w:szCs w:val="24"/>
-              <w14:ligatures w14:val="standardContextual"/>
+              <w:webHidden/>
             </w:rPr>
-          </w:pPr>
+          </w:r>
           <w:ins w:id="19" w:author="kyle O'Reilly" w:date="2026-10-21T20:42:00Z" w16du:dateUtc="2026-10-21T19:42:00Z">
-            <w:r>
-              <w:rPr>
-                <w:rStyle w:val="Hyperlink"/>
-                <w:noProof/>
-              </w:rPr>
-              <w:fldChar w:fldCharType="begin"/>
-            </w:r>
-            <w:r>
-              <w:rPr>
-                <w:rStyle w:val="Hyperlink"/>
-                <w:noProof/>
-              </w:rPr>
-              <w:instrText xml:space="preserve"> </w:instrText>
-            </w:r>
-            <w:r>
-              <w:rPr>
-                <w:noProof/>
-              </w:rPr>
-              <w:instrText>HYPERLINK \l "_Toc243507770"</w:instrText>
-            </w:r>
-            <w:r>
-              <w:rPr>
-                <w:rStyle w:val="Hyperlink"/>
-                <w:noProof/>
-              </w:rPr>
-              <w:instrText xml:space="preserve"> </w:instrText>
-            </w:r>
-            <w:r>
-              <w:rPr>
-                <w:rStyle w:val="Hyperlink"/>
-                <w:noProof/>
-              </w:rPr>
-            </w:r>
-            <w:r>
-              <w:rPr>
-                <w:rStyle w:val="Hyperlink"/>
-                <w:noProof/>
-              </w:rPr>
-              <w:fldChar w:fldCharType="separate"/>
-            </w:r>
-            <w:r>
-              <w:rPr>
-                <w:rStyle w:val="Hyperlink"/>
-                <w:noProof/>
-              </w:rPr>
-              <w:t>6. Methodology</w:t>
-            </w:r>
-            <w:r>
-              <w:rPr>
-                <w:noProof/>
-                <w:webHidden/>
-              </w:rPr>
-              <w:tab/>
-            </w:r>
-            <w:r>
-              <w:rPr>
-                <w:noProof/>
-                <w:webHidden/>
-              </w:rPr>
-              <w:fldChar w:fldCharType="begin"/>
-            </w:r>
-            <w:r>
-              <w:rPr>
-                <w:noProof/>
-                <w:webHidden/>
-              </w:rPr>
-              <w:instrText xml:space="preserve"> PAGEREF _Toc243507770 \h </w:instrText>
-            </w:r>
-            <w:r>
-              <w:rPr>
-                <w:noProof/>
-                <w:webHidden/>
-              </w:rPr>
-            </w:r>
             <w:r>
               <w:rPr>
                 <w:noProof/>
@@ -1910,7 +1727,7 @@
               <w:rPr>
                 <w:noProof/>
               </w:rPr>
-              <w:instrText>HYPERLINK \l "_Toc243507771"</w:instrText>
+              <w:instrText>HYPERLINK \l "_Toc243507769"</w:instrText>
             </w:r>
             <w:r>
               <w:rPr>
@@ -1937,7 +1754,7 @@
                 <w:rStyle w:val="Hyperlink"/>
                 <w:noProof/>
               </w:rPr>
-              <w:t>7. Data Sources</w:t>
+              <w:t>5. Project Scope</w:t>
             </w:r>
             <w:r>
               <w:rPr>
@@ -1958,14 +1775,16 @@
                 <w:noProof/>
                 <w:webHidden/>
               </w:rPr>
-              <w:instrText xml:space="preserve"> PAGEREF _Toc243507771 \h </w:instrText>
-            </w:r>
-            <w:r>
-              <w:rPr>
-                <w:noProof/>
-                <w:webHidden/>
-              </w:rPr>
-            </w:r>
+              <w:instrText xml:space="preserve"> PAGEREF _Toc243507769 \h </w:instrText>
+            </w:r>
+          </w:ins>
+          <w:r>
+            <w:rPr>
+              <w:noProof/>
+              <w:webHidden/>
+            </w:rPr>
+          </w:r>
+          <w:ins w:id="22" w:author="kyle O'Reilly" w:date="2026-10-21T20:42:00Z" w16du:dateUtc="2026-10-21T19:42:00Z">
             <w:r>
               <w:rPr>
                 <w:noProof/>
@@ -2003,7 +1822,7 @@
               <w:tab w:val="right" w:leader="dot" w:pos="9016"/>
             </w:tabs>
             <w:rPr>
-              <w:ins w:id="22" w:author="kyle O'Reilly" w:date="2026-10-21T20:42:00Z" w16du:dateUtc="2026-10-21T19:42:00Z"/>
+              <w:ins w:id="23" w:author="kyle O'Reilly" w:date="2026-10-21T20:42:00Z" w16du:dateUtc="2026-10-21T19:42:00Z"/>
               <w:rFonts w:asciiTheme="minorHAnsi" w:eastAsiaTheme="minorEastAsia" w:hAnsiTheme="minorHAnsi" w:cstheme="minorBidi"/>
               <w:noProof/>
               <w:kern w:val="2"/>
@@ -2012,7 +1831,7 @@
               <w14:ligatures w14:val="standardContextual"/>
             </w:rPr>
           </w:pPr>
-          <w:ins w:id="23" w:author="kyle O'Reilly" w:date="2026-10-21T20:42:00Z" w16du:dateUtc="2026-10-21T19:42:00Z">
+          <w:ins w:id="24" w:author="kyle O'Reilly" w:date="2026-10-21T20:42:00Z" w16du:dateUtc="2026-10-21T19:42:00Z">
             <w:r>
               <w:rPr>
                 <w:rStyle w:val="Hyperlink"/>
@@ -2031,7 +1850,7 @@
               <w:rPr>
                 <w:noProof/>
               </w:rPr>
-              <w:instrText>HYPERLINK \l "_Toc243507772"</w:instrText>
+              <w:instrText>HYPERLINK \l "_Toc243507770"</w:instrText>
             </w:r>
             <w:r>
               <w:rPr>
@@ -2058,7 +1877,7 @@
                 <w:rStyle w:val="Hyperlink"/>
                 <w:noProof/>
               </w:rPr>
-              <w:t>8. Expected Deliverables</w:t>
+              <w:t>6. Methodology</w:t>
             </w:r>
             <w:r>
               <w:rPr>
@@ -2079,14 +1898,16 @@
                 <w:noProof/>
                 <w:webHidden/>
               </w:rPr>
-              <w:instrText xml:space="preserve"> PAGEREF _Toc243507772 \h </w:instrText>
-            </w:r>
-            <w:r>
-              <w:rPr>
-                <w:noProof/>
-                <w:webHidden/>
-              </w:rPr>
-            </w:r>
+              <w:instrText xml:space="preserve"> PAGEREF _Toc243507770 \h </w:instrText>
+            </w:r>
+          </w:ins>
+          <w:r>
+            <w:rPr>
+              <w:noProof/>
+              <w:webHidden/>
+            </w:rPr>
+          </w:r>
+          <w:ins w:id="25" w:author="kyle O'Reilly" w:date="2026-10-21T20:42:00Z" w16du:dateUtc="2026-10-21T19:42:00Z">
             <w:r>
               <w:rPr>
                 <w:noProof/>
@@ -2100,127 +1921,6 @@
                 <w:webHidden/>
               </w:rPr>
               <w:t>1</w:t>
-            </w:r>
-            <w:r>
-              <w:rPr>
-                <w:noProof/>
-                <w:webHidden/>
-              </w:rPr>
-              <w:fldChar w:fldCharType="end"/>
-            </w:r>
-            <w:r>
-              <w:rPr>
-                <w:rStyle w:val="Hyperlink"/>
-                <w:noProof/>
-              </w:rPr>
-              <w:fldChar w:fldCharType="end"/>
-            </w:r>
-          </w:ins>
-        </w:p>
-        <w:p>
-          <w:pPr>
-            <w:pStyle w:val="TOC1"/>
-            <w:tabs>
-              <w:tab w:val="right" w:leader="dot" w:pos="9016"/>
-            </w:tabs>
-            <w:rPr>
-              <w:ins w:id="24" w:author="kyle O'Reilly" w:date="2026-10-21T20:42:00Z" w16du:dateUtc="2026-10-21T19:42:00Z"/>
-              <w:rFonts w:asciiTheme="minorHAnsi" w:eastAsiaTheme="minorEastAsia" w:hAnsiTheme="minorHAnsi" w:cstheme="minorBidi"/>
-              <w:noProof/>
-              <w:kern w:val="2"/>
-              <w:sz w:val="24"/>
-              <w:szCs w:val="24"/>
-              <w14:ligatures w14:val="standardContextual"/>
-            </w:rPr>
-          </w:pPr>
-          <w:ins w:id="25" w:author="kyle O'Reilly" w:date="2026-10-21T20:42:00Z" w16du:dateUtc="2026-10-21T19:42:00Z">
-            <w:r>
-              <w:rPr>
-                <w:rStyle w:val="Hyperlink"/>
-                <w:noProof/>
-              </w:rPr>
-              <w:fldChar w:fldCharType="begin"/>
-            </w:r>
-            <w:r>
-              <w:rPr>
-                <w:rStyle w:val="Hyperlink"/>
-                <w:noProof/>
-              </w:rPr>
-              <w:instrText xml:space="preserve"> </w:instrText>
-            </w:r>
-            <w:r>
-              <w:rPr>
-                <w:noProof/>
-              </w:rPr>
-              <w:instrText>HYPERLINK \l "_Toc243507773"</w:instrText>
-            </w:r>
-            <w:r>
-              <w:rPr>
-                <w:rStyle w:val="Hyperlink"/>
-                <w:noProof/>
-              </w:rPr>
-              <w:instrText xml:space="preserve"> </w:instrText>
-            </w:r>
-            <w:r>
-              <w:rPr>
-                <w:rStyle w:val="Hyperlink"/>
-                <w:noProof/>
-              </w:rPr>
-            </w:r>
-            <w:r>
-              <w:rPr>
-                <w:rStyle w:val="Hyperlink"/>
-                <w:noProof/>
-              </w:rPr>
-              <w:fldChar w:fldCharType="separate"/>
-            </w:r>
-            <w:r>
-              <w:rPr>
-                <w:rStyle w:val="Hyperlink"/>
-                <w:noProof/>
-              </w:rPr>
-              <w:t>9. Project Timeline</w:t>
-            </w:r>
-            <w:r>
-              <w:rPr>
-                <w:noProof/>
-                <w:webHidden/>
-              </w:rPr>
-              <w:tab/>
-            </w:r>
-            <w:r>
-              <w:rPr>
-                <w:noProof/>
-                <w:webHidden/>
-              </w:rPr>
-              <w:fldChar w:fldCharType="begin"/>
-            </w:r>
-            <w:r>
-              <w:rPr>
-                <w:noProof/>
-                <w:webHidden/>
-              </w:rPr>
-              <w:instrText xml:space="preserve"> PAGEREF _Toc243507773 \h </w:instrText>
-            </w:r>
-            <w:r>
-              <w:rPr>
-                <w:noProof/>
-                <w:webHidden/>
-              </w:rPr>
-            </w:r>
-            <w:r>
-              <w:rPr>
-                <w:noProof/>
-                <w:webHidden/>
-              </w:rPr>
-              <w:fldChar w:fldCharType="separate"/>
-            </w:r>
-            <w:r>
-              <w:rPr>
-                <w:noProof/>
-                <w:webHidden/>
-              </w:rPr>
-              <w:t>2</w:t>
             </w:r>
             <w:r>
               <w:rPr>
@@ -2273,7 +1973,7 @@
               <w:rPr>
                 <w:noProof/>
               </w:rPr>
-              <w:instrText>HYPERLINK \l "_Toc243507774"</w:instrText>
+              <w:instrText>HYPERLINK \l "_Toc243507771"</w:instrText>
             </w:r>
             <w:r>
               <w:rPr>
@@ -2300,7 +2000,7 @@
                 <w:rStyle w:val="Hyperlink"/>
                 <w:noProof/>
               </w:rPr>
-              <w:t>10. Ethical and Legal Considerations</w:t>
+              <w:t>7. Data Sources</w:t>
             </w:r>
             <w:r>
               <w:rPr>
@@ -2321,14 +2021,16 @@
                 <w:noProof/>
                 <w:webHidden/>
               </w:rPr>
-              <w:instrText xml:space="preserve"> PAGEREF _Toc243507774 \h </w:instrText>
-            </w:r>
-            <w:r>
-              <w:rPr>
-                <w:noProof/>
-                <w:webHidden/>
-              </w:rPr>
-            </w:r>
+              <w:instrText xml:space="preserve"> PAGEREF _Toc243507771 \h </w:instrText>
+            </w:r>
+          </w:ins>
+          <w:r>
+            <w:rPr>
+              <w:noProof/>
+              <w:webHidden/>
+            </w:rPr>
+          </w:r>
+          <w:ins w:id="28" w:author="kyle O'Reilly" w:date="2026-10-21T20:42:00Z" w16du:dateUtc="2026-10-21T19:42:00Z">
             <w:r>
               <w:rPr>
                 <w:noProof/>
@@ -2341,7 +2043,7 @@
                 <w:noProof/>
                 <w:webHidden/>
               </w:rPr>
-              <w:t>2</w:t>
+              <w:t>1</w:t>
             </w:r>
             <w:r>
               <w:rPr>
@@ -2366,7 +2068,7 @@
               <w:tab w:val="right" w:leader="dot" w:pos="9016"/>
             </w:tabs>
             <w:rPr>
-              <w:ins w:id="28" w:author="kyle O'Reilly" w:date="2026-10-21T20:42:00Z" w16du:dateUtc="2026-10-21T19:42:00Z"/>
+              <w:ins w:id="29" w:author="kyle O'Reilly" w:date="2026-10-21T20:42:00Z" w16du:dateUtc="2026-10-21T19:42:00Z"/>
               <w:rFonts w:asciiTheme="minorHAnsi" w:eastAsiaTheme="minorEastAsia" w:hAnsiTheme="minorHAnsi" w:cstheme="minorBidi"/>
               <w:noProof/>
               <w:kern w:val="2"/>
@@ -2375,7 +2077,7 @@
               <w14:ligatures w14:val="standardContextual"/>
             </w:rPr>
           </w:pPr>
-          <w:ins w:id="29" w:author="kyle O'Reilly" w:date="2026-10-21T20:42:00Z" w16du:dateUtc="2026-10-21T19:42:00Z">
+          <w:ins w:id="30" w:author="kyle O'Reilly" w:date="2026-10-21T20:42:00Z" w16du:dateUtc="2026-10-21T19:42:00Z">
             <w:r>
               <w:rPr>
                 <w:rStyle w:val="Hyperlink"/>
@@ -2394,7 +2096,7 @@
               <w:rPr>
                 <w:noProof/>
               </w:rPr>
-              <w:instrText>HYPERLINK \l "_Toc243507775"</w:instrText>
+              <w:instrText>HYPERLINK \l "_Toc243507772"</w:instrText>
             </w:r>
             <w:r>
               <w:rPr>
@@ -2421,7 +2123,7 @@
                 <w:rStyle w:val="Hyperlink"/>
                 <w:noProof/>
               </w:rPr>
-              <w:t>References</w:t>
+              <w:t>8. Expected Deliverables</w:t>
             </w:r>
             <w:r>
               <w:rPr>
@@ -2442,14 +2144,16 @@
                 <w:noProof/>
                 <w:webHidden/>
               </w:rPr>
-              <w:instrText xml:space="preserve"> PAGEREF _Toc243507775 \h </w:instrText>
-            </w:r>
-            <w:r>
-              <w:rPr>
-                <w:noProof/>
-                <w:webHidden/>
-              </w:rPr>
-            </w:r>
+              <w:instrText xml:space="preserve"> PAGEREF _Toc243507772 \h </w:instrText>
+            </w:r>
+          </w:ins>
+          <w:r>
+            <w:rPr>
+              <w:noProof/>
+              <w:webHidden/>
+            </w:rPr>
+          </w:r>
+          <w:ins w:id="31" w:author="kyle O'Reilly" w:date="2026-10-21T20:42:00Z" w16du:dateUtc="2026-10-21T19:42:00Z">
             <w:r>
               <w:rPr>
                 <w:noProof/>
@@ -2462,7 +2166,7 @@
                 <w:noProof/>
                 <w:webHidden/>
               </w:rPr>
-              <w:t>2</w:t>
+              <w:t>1</w:t>
             </w:r>
             <w:r>
               <w:rPr>
@@ -2481,7 +2185,376 @@
           </w:ins>
         </w:p>
         <w:p>
-          <w:del w:id="30" w:author="kyle O'Reilly" w:date="2026-10-20T21:26:00Z" w16du:dateUtc="2026-10-20T20:26:00Z">
+          <w:pPr>
+            <w:pStyle w:val="TOC1"/>
+            <w:tabs>
+              <w:tab w:val="right" w:leader="dot" w:pos="9016"/>
+            </w:tabs>
+            <w:rPr>
+              <w:ins w:id="32" w:author="kyle O'Reilly" w:date="2026-10-21T20:42:00Z" w16du:dateUtc="2026-10-21T19:42:00Z"/>
+              <w:rFonts w:asciiTheme="minorHAnsi" w:eastAsiaTheme="minorEastAsia" w:hAnsiTheme="minorHAnsi" w:cstheme="minorBidi"/>
+              <w:noProof/>
+              <w:kern w:val="2"/>
+              <w:sz w:val="24"/>
+              <w:szCs w:val="24"/>
+              <w14:ligatures w14:val="standardContextual"/>
+            </w:rPr>
+          </w:pPr>
+          <w:ins w:id="33" w:author="kyle O'Reilly" w:date="2026-10-21T20:42:00Z" w16du:dateUtc="2026-10-21T19:42:00Z">
+            <w:r>
+              <w:rPr>
+                <w:rStyle w:val="Hyperlink"/>
+                <w:noProof/>
+              </w:rPr>
+              <w:fldChar w:fldCharType="begin"/>
+            </w:r>
+            <w:r>
+              <w:rPr>
+                <w:rStyle w:val="Hyperlink"/>
+                <w:noProof/>
+              </w:rPr>
+              <w:instrText xml:space="preserve"> </w:instrText>
+            </w:r>
+            <w:r>
+              <w:rPr>
+                <w:noProof/>
+              </w:rPr>
+              <w:instrText>HYPERLINK \l "_Toc243507773"</w:instrText>
+            </w:r>
+            <w:r>
+              <w:rPr>
+                <w:rStyle w:val="Hyperlink"/>
+                <w:noProof/>
+              </w:rPr>
+              <w:instrText xml:space="preserve"> </w:instrText>
+            </w:r>
+            <w:r>
+              <w:rPr>
+                <w:rStyle w:val="Hyperlink"/>
+                <w:noProof/>
+              </w:rPr>
+            </w:r>
+            <w:r>
+              <w:rPr>
+                <w:rStyle w:val="Hyperlink"/>
+                <w:noProof/>
+              </w:rPr>
+              <w:fldChar w:fldCharType="separate"/>
+            </w:r>
+            <w:r>
+              <w:rPr>
+                <w:rStyle w:val="Hyperlink"/>
+                <w:noProof/>
+              </w:rPr>
+              <w:t>9. Project Timeline</w:t>
+            </w:r>
+            <w:r>
+              <w:rPr>
+                <w:noProof/>
+                <w:webHidden/>
+              </w:rPr>
+              <w:tab/>
+            </w:r>
+            <w:r>
+              <w:rPr>
+                <w:noProof/>
+                <w:webHidden/>
+              </w:rPr>
+              <w:fldChar w:fldCharType="begin"/>
+            </w:r>
+            <w:r>
+              <w:rPr>
+                <w:noProof/>
+                <w:webHidden/>
+              </w:rPr>
+              <w:instrText xml:space="preserve"> PAGEREF _Toc243507773 \h </w:instrText>
+            </w:r>
+          </w:ins>
+          <w:r>
+            <w:rPr>
+              <w:noProof/>
+              <w:webHidden/>
+            </w:rPr>
+          </w:r>
+          <w:ins w:id="34" w:author="kyle O'Reilly" w:date="2026-10-21T20:42:00Z" w16du:dateUtc="2026-10-21T19:42:00Z">
+            <w:r>
+              <w:rPr>
+                <w:noProof/>
+                <w:webHidden/>
+              </w:rPr>
+              <w:fldChar w:fldCharType="separate"/>
+            </w:r>
+            <w:r>
+              <w:rPr>
+                <w:noProof/>
+                <w:webHidden/>
+              </w:rPr>
+              <w:t>2</w:t>
+            </w:r>
+            <w:r>
+              <w:rPr>
+                <w:noProof/>
+                <w:webHidden/>
+              </w:rPr>
+              <w:fldChar w:fldCharType="end"/>
+            </w:r>
+            <w:r>
+              <w:rPr>
+                <w:rStyle w:val="Hyperlink"/>
+                <w:noProof/>
+              </w:rPr>
+              <w:fldChar w:fldCharType="end"/>
+            </w:r>
+          </w:ins>
+        </w:p>
+        <w:p>
+          <w:pPr>
+            <w:pStyle w:val="TOC1"/>
+            <w:tabs>
+              <w:tab w:val="right" w:leader="dot" w:pos="9016"/>
+            </w:tabs>
+            <w:rPr>
+              <w:ins w:id="35" w:author="kyle O'Reilly" w:date="2026-10-21T20:42:00Z" w16du:dateUtc="2026-10-21T19:42:00Z"/>
+              <w:rFonts w:asciiTheme="minorHAnsi" w:eastAsiaTheme="minorEastAsia" w:hAnsiTheme="minorHAnsi" w:cstheme="minorBidi"/>
+              <w:noProof/>
+              <w:kern w:val="2"/>
+              <w:sz w:val="24"/>
+              <w:szCs w:val="24"/>
+              <w14:ligatures w14:val="standardContextual"/>
+            </w:rPr>
+          </w:pPr>
+          <w:ins w:id="36" w:author="kyle O'Reilly" w:date="2026-10-21T20:42:00Z" w16du:dateUtc="2026-10-21T19:42:00Z">
+            <w:r>
+              <w:rPr>
+                <w:rStyle w:val="Hyperlink"/>
+                <w:noProof/>
+              </w:rPr>
+              <w:fldChar w:fldCharType="begin"/>
+            </w:r>
+            <w:r>
+              <w:rPr>
+                <w:rStyle w:val="Hyperlink"/>
+                <w:noProof/>
+              </w:rPr>
+              <w:instrText xml:space="preserve"> </w:instrText>
+            </w:r>
+            <w:r>
+              <w:rPr>
+                <w:noProof/>
+              </w:rPr>
+              <w:instrText>HYPERLINK \l "_Toc243507774"</w:instrText>
+            </w:r>
+            <w:r>
+              <w:rPr>
+                <w:rStyle w:val="Hyperlink"/>
+                <w:noProof/>
+              </w:rPr>
+              <w:instrText xml:space="preserve"> </w:instrText>
+            </w:r>
+            <w:r>
+              <w:rPr>
+                <w:rStyle w:val="Hyperlink"/>
+                <w:noProof/>
+              </w:rPr>
+            </w:r>
+            <w:r>
+              <w:rPr>
+                <w:rStyle w:val="Hyperlink"/>
+                <w:noProof/>
+              </w:rPr>
+              <w:fldChar w:fldCharType="separate"/>
+            </w:r>
+            <w:r>
+              <w:rPr>
+                <w:rStyle w:val="Hyperlink"/>
+                <w:noProof/>
+              </w:rPr>
+              <w:t>10. Ethical and Legal Considerations</w:t>
+            </w:r>
+            <w:r>
+              <w:rPr>
+                <w:noProof/>
+                <w:webHidden/>
+              </w:rPr>
+              <w:tab/>
+            </w:r>
+            <w:r>
+              <w:rPr>
+                <w:noProof/>
+                <w:webHidden/>
+              </w:rPr>
+              <w:fldChar w:fldCharType="begin"/>
+            </w:r>
+            <w:r>
+              <w:rPr>
+                <w:noProof/>
+                <w:webHidden/>
+              </w:rPr>
+              <w:instrText xml:space="preserve"> PAGEREF _Toc243507774 \h </w:instrText>
+            </w:r>
+          </w:ins>
+          <w:r>
+            <w:rPr>
+              <w:noProof/>
+              <w:webHidden/>
+            </w:rPr>
+          </w:r>
+          <w:ins w:id="37" w:author="kyle O'Reilly" w:date="2026-10-21T20:42:00Z" w16du:dateUtc="2026-10-21T19:42:00Z">
+            <w:r>
+              <w:rPr>
+                <w:noProof/>
+                <w:webHidden/>
+              </w:rPr>
+              <w:fldChar w:fldCharType="separate"/>
+            </w:r>
+            <w:r>
+              <w:rPr>
+                <w:noProof/>
+                <w:webHidden/>
+              </w:rPr>
+              <w:t>2</w:t>
+            </w:r>
+            <w:r>
+              <w:rPr>
+                <w:noProof/>
+                <w:webHidden/>
+              </w:rPr>
+              <w:fldChar w:fldCharType="end"/>
+            </w:r>
+            <w:r>
+              <w:rPr>
+                <w:rStyle w:val="Hyperlink"/>
+                <w:noProof/>
+              </w:rPr>
+              <w:fldChar w:fldCharType="end"/>
+            </w:r>
+          </w:ins>
+        </w:p>
+        <w:p>
+          <w:pPr>
+            <w:pStyle w:val="TOC1"/>
+            <w:tabs>
+              <w:tab w:val="right" w:leader="dot" w:pos="9016"/>
+            </w:tabs>
+            <w:rPr>
+              <w:ins w:id="38" w:author="kyle O'Reilly" w:date="2026-10-21T20:42:00Z" w16du:dateUtc="2026-10-21T19:42:00Z"/>
+              <w:rFonts w:asciiTheme="minorHAnsi" w:eastAsiaTheme="minorEastAsia" w:hAnsiTheme="minorHAnsi" w:cstheme="minorBidi"/>
+              <w:noProof/>
+              <w:kern w:val="2"/>
+              <w:sz w:val="24"/>
+              <w:szCs w:val="24"/>
+              <w14:ligatures w14:val="standardContextual"/>
+            </w:rPr>
+          </w:pPr>
+          <w:ins w:id="39" w:author="kyle O'Reilly" w:date="2026-10-21T20:42:00Z" w16du:dateUtc="2026-10-21T19:42:00Z">
+            <w:r>
+              <w:rPr>
+                <w:rStyle w:val="Hyperlink"/>
+                <w:noProof/>
+              </w:rPr>
+              <w:fldChar w:fldCharType="begin"/>
+            </w:r>
+            <w:r>
+              <w:rPr>
+                <w:rStyle w:val="Hyperlink"/>
+                <w:noProof/>
+              </w:rPr>
+              <w:instrText xml:space="preserve"> </w:instrText>
+            </w:r>
+            <w:r>
+              <w:rPr>
+                <w:noProof/>
+              </w:rPr>
+              <w:instrText>HYPERLINK \l "_Toc243507775"</w:instrText>
+            </w:r>
+            <w:r>
+              <w:rPr>
+                <w:rStyle w:val="Hyperlink"/>
+                <w:noProof/>
+              </w:rPr>
+              <w:instrText xml:space="preserve"> </w:instrText>
+            </w:r>
+            <w:r>
+              <w:rPr>
+                <w:rStyle w:val="Hyperlink"/>
+                <w:noProof/>
+              </w:rPr>
+            </w:r>
+            <w:r>
+              <w:rPr>
+                <w:rStyle w:val="Hyperlink"/>
+                <w:noProof/>
+              </w:rPr>
+              <w:fldChar w:fldCharType="separate"/>
+            </w:r>
+            <w:r>
+              <w:rPr>
+                <w:rStyle w:val="Hyperlink"/>
+                <w:noProof/>
+              </w:rPr>
+              <w:t>References</w:t>
+            </w:r>
+            <w:r>
+              <w:rPr>
+                <w:noProof/>
+                <w:webHidden/>
+              </w:rPr>
+              <w:tab/>
+            </w:r>
+            <w:r>
+              <w:rPr>
+                <w:noProof/>
+                <w:webHidden/>
+              </w:rPr>
+              <w:fldChar w:fldCharType="begin"/>
+            </w:r>
+            <w:r>
+              <w:rPr>
+                <w:noProof/>
+                <w:webHidden/>
+              </w:rPr>
+              <w:instrText xml:space="preserve"> PAGEREF _Toc243507775 \h </w:instrText>
+            </w:r>
+          </w:ins>
+          <w:r>
+            <w:rPr>
+              <w:noProof/>
+              <w:webHidden/>
+            </w:rPr>
+          </w:r>
+          <w:ins w:id="40" w:author="kyle O'Reilly" w:date="2026-10-21T20:42:00Z" w16du:dateUtc="2026-10-21T19:42:00Z">
+            <w:r>
+              <w:rPr>
+                <w:noProof/>
+                <w:webHidden/>
+              </w:rPr>
+              <w:fldChar w:fldCharType="separate"/>
+            </w:r>
+            <w:r>
+              <w:rPr>
+                <w:noProof/>
+                <w:webHidden/>
+              </w:rPr>
+              <w:t>2</w:t>
+            </w:r>
+            <w:r>
+              <w:rPr>
+                <w:noProof/>
+                <w:webHidden/>
+              </w:rPr>
+              <w:fldChar w:fldCharType="end"/>
+            </w:r>
+            <w:r>
+              <w:rPr>
+                <w:rStyle w:val="Hyperlink"/>
+                <w:noProof/>
+              </w:rPr>
+              <w:fldChar w:fldCharType="end"/>
+            </w:r>
+          </w:ins>
+        </w:p>
+        <w:p>
+          <w:del w:id="41" w:author="kyle O'Reilly" w:date="2026-10-20T21:26:00Z" w16du:dateUtc="2026-10-20T20:26:00Z">
             <w:r>
               <w:rPr>
                 <w:b/>
@@ -2524,42 +2597,42 @@
     <w:p>
       <w:pPr>
         <w:rPr>
-          <w:del w:id="31" w:author="kyle O'Reilly" w:date="2026-10-21T20:42:00Z" w16du:dateUtc="2026-10-21T19:42:00Z"/>
-        </w:rPr>
-      </w:pPr>
-    </w:p>
-    <w:p>
-      <w:pPr>
-        <w:rPr>
-          <w:del w:id="32" w:author="kyle O'Reilly" w:date="2026-10-21T20:42:00Z" w16du:dateUtc="2026-10-21T19:42:00Z"/>
-        </w:rPr>
-      </w:pPr>
-    </w:p>
-    <w:p>
-      <w:pPr>
-        <w:rPr>
-          <w:del w:id="33" w:author="kyle O'Reilly" w:date="2026-10-21T20:42:00Z" w16du:dateUtc="2026-10-21T19:42:00Z"/>
-        </w:rPr>
-      </w:pPr>
-    </w:p>
-    <w:p>
-      <w:pPr>
-        <w:rPr>
-          <w:del w:id="34" w:author="kyle O'Reilly" w:date="2026-10-21T20:42:00Z" w16du:dateUtc="2026-10-21T19:42:00Z"/>
-        </w:rPr>
-      </w:pPr>
-    </w:p>
-    <w:p>
-      <w:pPr>
-        <w:rPr>
-          <w:del w:id="35" w:author="kyle O'Reilly" w:date="2026-10-21T20:42:00Z" w16du:dateUtc="2026-10-21T19:42:00Z"/>
-        </w:rPr>
-      </w:pPr>
-    </w:p>
-    <w:p>
-      <w:pPr>
-        <w:rPr>
-          <w:del w:id="36" w:author="kyle O'Reilly" w:date="2026-10-21T20:42:00Z" w16du:dateUtc="2026-10-21T19:42:00Z"/>
+          <w:del w:id="42" w:author="kyle O'Reilly" w:date="2026-10-21T20:42:00Z" w16du:dateUtc="2026-10-21T19:42:00Z"/>
+        </w:rPr>
+      </w:pPr>
+    </w:p>
+    <w:p>
+      <w:pPr>
+        <w:rPr>
+          <w:del w:id="43" w:author="kyle O'Reilly" w:date="2026-10-21T20:42:00Z" w16du:dateUtc="2026-10-21T19:42:00Z"/>
+        </w:rPr>
+      </w:pPr>
+    </w:p>
+    <w:p>
+      <w:pPr>
+        <w:rPr>
+          <w:del w:id="44" w:author="kyle O'Reilly" w:date="2026-10-21T20:42:00Z" w16du:dateUtc="2026-10-21T19:42:00Z"/>
+        </w:rPr>
+      </w:pPr>
+    </w:p>
+    <w:p>
+      <w:pPr>
+        <w:rPr>
+          <w:del w:id="45" w:author="kyle O'Reilly" w:date="2026-10-21T20:42:00Z" w16du:dateUtc="2026-10-21T19:42:00Z"/>
+        </w:rPr>
+      </w:pPr>
+    </w:p>
+    <w:p>
+      <w:pPr>
+        <w:rPr>
+          <w:del w:id="46" w:author="kyle O'Reilly" w:date="2026-10-21T20:42:00Z" w16du:dateUtc="2026-10-21T19:42:00Z"/>
+        </w:rPr>
+      </w:pPr>
+    </w:p>
+    <w:p>
+      <w:pPr>
+        <w:rPr>
+          <w:del w:id="47" w:author="kyle O'Reilly" w:date="2026-10-21T20:42:00Z" w16du:dateUtc="2026-10-21T19:42:00Z"/>
         </w:rPr>
       </w:pPr>
     </w:p>
@@ -2567,14 +2640,14 @@
     <w:p>
       <w:pPr>
         <w:rPr>
-          <w:del w:id="37" w:author="kyle O'Reilly" w:date="2026-10-21T20:42:00Z" w16du:dateUtc="2026-10-21T19:42:00Z"/>
-        </w:rPr>
-      </w:pPr>
-    </w:p>
-    <w:p>
-      <w:pPr>
-        <w:rPr>
-          <w:del w:id="38" w:author="kyle O'Reilly" w:date="2026-10-21T20:42:00Z" w16du:dateUtc="2026-10-21T19:42:00Z"/>
+          <w:del w:id="48" w:author="kyle O'Reilly" w:date="2026-10-21T20:42:00Z" w16du:dateUtc="2026-10-21T19:42:00Z"/>
+        </w:rPr>
+      </w:pPr>
+    </w:p>
+    <w:p>
+      <w:pPr>
+        <w:rPr>
+          <w:del w:id="49" w:author="kyle O'Reilly" w:date="2026-10-21T20:42:00Z" w16du:dateUtc="2026-10-21T19:42:00Z"/>
         </w:rPr>
       </w:pPr>
     </w:p>
@@ -2582,14 +2655,14 @@
     <w:p>
       <w:pPr>
         <w:rPr>
-          <w:del w:id="39" w:author="kyle O'Reilly" w:date="2026-10-21T20:28:00Z" w16du:dateUtc="2026-10-21T19:28:00Z"/>
-        </w:rPr>
-      </w:pPr>
-    </w:p>
-    <w:p>
-      <w:pPr>
-        <w:rPr>
-          <w:del w:id="40" w:author="kyle O'Reilly" w:date="2026-10-20T21:26:00Z" w16du:dateUtc="2026-10-20T20:26:00Z"/>
+          <w:del w:id="50" w:author="kyle O'Reilly" w:date="2026-10-21T20:28:00Z" w16du:dateUtc="2026-10-21T19:28:00Z"/>
+        </w:rPr>
+      </w:pPr>
+    </w:p>
+    <w:p>
+      <w:pPr>
+        <w:rPr>
+          <w:del w:id="51" w:author="kyle O'Reilly" w:date="2026-10-20T21:26:00Z" w16du:dateUtc="2026-10-20T20:26:00Z"/>
         </w:rPr>
       </w:pPr>
     </w:p>
@@ -2611,31 +2684,31 @@
         <w:spacing w:line="360" w:lineRule="auto"/>
         <w:jc w:val="both"/>
         <w:rPr>
-          <w:ins w:id="41" w:author="kyle O'Reilly" w:date="2026-10-21T20:28:00Z" w16du:dateUtc="2026-10-21T19:28:00Z"/>
-        </w:rPr>
-        <w:pPrChange w:id="42" w:author="kyle O'Reilly" w:date="2026-10-21T20:33:00Z" w16du:dateUtc="2026-10-21T19:33:00Z">
+          <w:ins w:id="52" w:author="kyle O'Reilly" w:date="2026-10-21T20:28:00Z" w16du:dateUtc="2026-10-21T19:28:00Z"/>
+        </w:rPr>
+        <w:pPrChange w:id="53" w:author="kyle O'Reilly" w:date="2026-10-21T20:33:00Z" w16du:dateUtc="2026-10-21T19:33:00Z">
           <w:pPr>
             <w:pStyle w:val="Heading1"/>
           </w:pPr>
         </w:pPrChange>
       </w:pPr>
-      <w:bookmarkStart w:id="43" w:name="_Toc243507765"/>
-      <w:ins w:id="44" w:author="kyle O'Reilly" w:date="2026-10-20T21:25:00Z" w16du:dateUtc="2026-10-20T20:25:00Z">
+      <w:bookmarkStart w:id="54" w:name="_Toc243507765"/>
+      <w:ins w:id="55" w:author="kyle O'Reilly" w:date="2026-10-20T21:25:00Z" w16du:dateUtc="2026-10-20T20:25:00Z">
         <w:r>
           <w:lastRenderedPageBreak/>
           <w:t>1.</w:t>
         </w:r>
       </w:ins>
-      <w:ins w:id="45" w:author="kyle O'Reilly" w:date="2026-10-20T21:26:00Z" w16du:dateUtc="2026-10-20T20:26:00Z">
+      <w:ins w:id="56" w:author="kyle O'Reilly" w:date="2026-10-20T21:26:00Z" w16du:dateUtc="2026-10-20T20:26:00Z">
         <w:r>
           <w:t xml:space="preserve"> </w:t>
         </w:r>
       </w:ins>
-      <w:ins w:id="46" w:author="kyle O'Reilly" w:date="2026-10-21T20:28:00Z" w16du:dateUtc="2026-10-21T19:28:00Z">
+      <w:ins w:id="57" w:author="kyle O'Reilly" w:date="2026-10-21T20:28:00Z" w16du:dateUtc="2026-10-21T19:28:00Z">
         <w:r>
           <w:t>Project Title</w:t>
         </w:r>
-        <w:bookmarkEnd w:id="43"/>
+        <w:bookmarkEnd w:id="54"/>
       </w:ins>
     </w:p>
     <w:p>
@@ -2643,18 +2716,18 @@
         <w:spacing w:line="360" w:lineRule="auto"/>
         <w:jc w:val="both"/>
         <w:rPr>
-          <w:ins w:id="47" w:author="kyle O'Reilly" w:date="2026-10-21T20:32:00Z" w16du:dateUtc="2026-10-21T19:32:00Z"/>
-        </w:rPr>
-        <w:pPrChange w:id="48" w:author="kyle O'Reilly" w:date="2026-10-21T20:33:00Z" w16du:dateUtc="2026-10-21T19:33:00Z">
+          <w:ins w:id="58" w:author="kyle O'Reilly" w:date="2026-10-21T20:32:00Z" w16du:dateUtc="2026-10-21T19:32:00Z"/>
+        </w:rPr>
+        <w:pPrChange w:id="59" w:author="kyle O'Reilly" w:date="2026-10-21T20:33:00Z" w16du:dateUtc="2026-10-21T19:33:00Z">
           <w:pPr/>
         </w:pPrChange>
       </w:pPr>
-      <w:ins w:id="49" w:author="kyle O'Reilly" w:date="2026-10-21T20:28:00Z" w16du:dateUtc="2026-10-21T19:28:00Z">
+      <w:ins w:id="60" w:author="kyle O'Reilly" w:date="2026-10-21T20:28:00Z" w16du:dateUtc="2026-10-21T19:28:00Z">
         <w:r>
           <w:t xml:space="preserve">Assessing the Accuracy of Machine </w:t>
         </w:r>
       </w:ins>
-      <w:ins w:id="50" w:author="kyle O'Reilly" w:date="2026-10-21T20:29:00Z" w16du:dateUtc="2026-10-21T19:29:00Z">
+      <w:ins w:id="61" w:author="kyle O'Reilly" w:date="2026-10-21T20:29:00Z" w16du:dateUtc="2026-10-21T19:29:00Z">
         <w:r>
           <w:t>Learning Models in Predicting F</w:t>
         </w:r>
@@ -2677,7 +2750,7 @@
           <w:t>wi</w:t>
         </w:r>
       </w:ins>
-      <w:ins w:id="51" w:author="kyle O'Reilly" w:date="2026-10-21T20:30:00Z" w16du:dateUtc="2026-10-21T19:30:00Z">
+      <w:ins w:id="62" w:author="kyle O'Reilly" w:date="2026-10-21T20:30:00Z" w16du:dateUtc="2026-10-21T19:30:00Z">
         <w:r>
           <w:t xml:space="preserve">th Different </w:t>
         </w:r>
@@ -2689,7 +2762,7 @@
     <w:p>
       <w:pPr>
         <w:rPr>
-          <w:ins w:id="52" w:author="kyle O'Reilly" w:date="2026-10-21T20:28:00Z" w16du:dateUtc="2026-10-21T19:28:00Z"/>
+          <w:ins w:id="63" w:author="kyle O'Reilly" w:date="2026-10-21T20:28:00Z" w16du:dateUtc="2026-10-21T19:28:00Z"/>
         </w:rPr>
       </w:pPr>
     </w:p>
@@ -2697,29 +2770,29 @@
       <w:pPr>
         <w:pStyle w:val="Heading1"/>
         <w:rPr>
-          <w:ins w:id="53" w:author="kyle O'Reilly" w:date="2026-10-21T20:39:00Z" w16du:dateUtc="2026-10-21T19:39:00Z"/>
-        </w:rPr>
-      </w:pPr>
-      <w:bookmarkStart w:id="54" w:name="_Toc243507766"/>
-      <w:ins w:id="55" w:author="kyle O'Reilly" w:date="2026-10-21T20:28:00Z" w16du:dateUtc="2026-10-21T19:28:00Z">
+          <w:ins w:id="64" w:author="kyle O'Reilly" w:date="2026-10-21T20:39:00Z" w16du:dateUtc="2026-10-21T19:39:00Z"/>
+        </w:rPr>
+      </w:pPr>
+      <w:bookmarkStart w:id="65" w:name="_Toc243507766"/>
+      <w:ins w:id="66" w:author="kyle O'Reilly" w:date="2026-10-21T20:28:00Z" w16du:dateUtc="2026-10-21T19:28:00Z">
         <w:r>
           <w:t>2. Introduction</w:t>
         </w:r>
       </w:ins>
-      <w:bookmarkEnd w:id="54"/>
-    </w:p>
-    <w:p>
-      <w:pPr>
-        <w:rPr>
-          <w:ins w:id="56" w:author="kyle O'Reilly" w:date="2026-10-20T21:26:00Z" w16du:dateUtc="2026-10-20T20:26:00Z"/>
-        </w:rPr>
-        <w:pPrChange w:id="57" w:author="kyle O'Reilly" w:date="2026-10-21T20:39:00Z" w16du:dateUtc="2026-10-21T19:39:00Z">
+      <w:bookmarkEnd w:id="65"/>
+    </w:p>
+    <w:p>
+      <w:pPr>
+        <w:rPr>
+          <w:ins w:id="67" w:author="kyle O'Reilly" w:date="2026-10-20T21:26:00Z" w16du:dateUtc="2026-10-20T20:26:00Z"/>
+        </w:rPr>
+        <w:pPrChange w:id="68" w:author="kyle O'Reilly" w:date="2026-10-21T20:39:00Z" w16du:dateUtc="2026-10-21T19:39:00Z">
           <w:pPr>
             <w:pStyle w:val="Heading1"/>
           </w:pPr>
         </w:pPrChange>
       </w:pPr>
-      <w:ins w:id="58" w:author="kyle O'Reilly" w:date="2026-10-21T20:39:00Z" w16du:dateUtc="2026-10-21T19:39:00Z">
+      <w:ins w:id="69" w:author="kyle O'Reilly" w:date="2026-10-21T20:39:00Z" w16du:dateUtc="2026-10-21T19:39:00Z">
         <w:r>
           <w:t>?</w:t>
         </w:r>
@@ -2728,7 +2801,7 @@
     <w:p>
       <w:pPr>
         <w:rPr>
-          <w:ins w:id="59" w:author="kyle O'Reilly" w:date="2026-10-21T20:39:00Z" w16du:dateUtc="2026-10-21T19:39:00Z"/>
+          <w:ins w:id="70" w:author="kyle O'Reilly" w:date="2026-10-21T20:39:00Z" w16du:dateUtc="2026-10-21T19:39:00Z"/>
         </w:rPr>
       </w:pPr>
     </w:p>
@@ -2736,18 +2809,18 @@
       <w:pPr>
         <w:pStyle w:val="Heading1"/>
         <w:rPr>
-          <w:ins w:id="60" w:author="kyle O'Reilly" w:date="2026-10-21T20:39:00Z" w16du:dateUtc="2026-10-21T19:39:00Z"/>
-        </w:rPr>
-        <w:pPrChange w:id="61" w:author="kyle O'Reilly" w:date="2026-10-21T20:40:00Z" w16du:dateUtc="2026-10-21T19:40:00Z">
+          <w:ins w:id="71" w:author="kyle O'Reilly" w:date="2026-10-21T20:39:00Z" w16du:dateUtc="2026-10-21T19:39:00Z"/>
+        </w:rPr>
+        <w:pPrChange w:id="72" w:author="kyle O'Reilly" w:date="2026-10-21T20:40:00Z" w16du:dateUtc="2026-10-21T19:40:00Z">
           <w:pPr/>
         </w:pPrChange>
       </w:pPr>
-      <w:bookmarkStart w:id="62" w:name="_Toc243507767"/>
-      <w:ins w:id="63" w:author="kyle O'Reilly" w:date="2026-10-21T20:39:00Z" w16du:dateUtc="2026-10-21T19:39:00Z">
+      <w:bookmarkStart w:id="73" w:name="_Toc243507767"/>
+      <w:ins w:id="74" w:author="kyle O'Reilly" w:date="2026-10-21T20:39:00Z" w16du:dateUtc="2026-10-21T19:39:00Z">
         <w:r>
           <w:t>3. Problem Definition</w:t>
         </w:r>
-        <w:bookmarkEnd w:id="62"/>
+        <w:bookmarkEnd w:id="73"/>
         <w:r>
           <w:t xml:space="preserve"> </w:t>
         </w:r>
@@ -2756,10 +2829,10 @@
     <w:p>
       <w:pPr>
         <w:rPr>
-          <w:ins w:id="64" w:author="kyle O'Reilly" w:date="2026-10-21T20:39:00Z" w16du:dateUtc="2026-10-21T19:39:00Z"/>
-        </w:rPr>
-      </w:pPr>
-      <w:ins w:id="65" w:author="kyle O'Reilly" w:date="2026-10-21T20:39:00Z" w16du:dateUtc="2026-10-21T19:39:00Z">
+          <w:ins w:id="75" w:author="kyle O'Reilly" w:date="2026-10-21T20:39:00Z" w16du:dateUtc="2026-10-21T19:39:00Z"/>
+        </w:rPr>
+      </w:pPr>
+      <w:ins w:id="76" w:author="kyle O'Reilly" w:date="2026-10-21T20:39:00Z" w16du:dateUtc="2026-10-21T19:39:00Z">
         <w:r>
           <w:t>?</w:t>
         </w:r>
@@ -2769,9 +2842,9 @@
       <w:pPr>
         <w:pStyle w:val="Heading1"/>
         <w:rPr>
-          <w:ins w:id="66" w:author="kyle O'Reilly" w:date="2026-10-21T20:39:00Z" w16du:dateUtc="2026-10-21T19:39:00Z"/>
-        </w:rPr>
-        <w:pPrChange w:id="67" w:author="kyle O'Reilly" w:date="2026-10-21T20:40:00Z" w16du:dateUtc="2026-10-21T19:40:00Z">
+          <w:ins w:id="77" w:author="kyle O'Reilly" w:date="2026-10-21T20:39:00Z" w16du:dateUtc="2026-10-21T19:39:00Z"/>
+        </w:rPr>
+        <w:pPrChange w:id="78" w:author="kyle O'Reilly" w:date="2026-10-21T20:40:00Z" w16du:dateUtc="2026-10-21T19:40:00Z">
           <w:pPr/>
         </w:pPrChange>
       </w:pPr>
@@ -2779,24 +2852,26 @@
     <w:p>
       <w:pPr>
         <w:pStyle w:val="Heading1"/>
-        <w:rPr>
-          <w:ins w:id="68" w:author="kyle O'Reilly" w:date="2026-10-21T20:40:00Z" w16du:dateUtc="2026-10-21T19:40:00Z"/>
-        </w:rPr>
-        <w:pPrChange w:id="69" w:author="kyle O'Reilly" w:date="2026-10-21T20:40:00Z" w16du:dateUtc="2026-10-21T19:40:00Z">
+        <w:spacing w:line="360" w:lineRule="auto"/>
+        <w:jc w:val="both"/>
+        <w:rPr>
+          <w:ins w:id="79" w:author="kyle O'Reilly" w:date="2026-10-21T20:40:00Z" w16du:dateUtc="2026-10-21T19:40:00Z"/>
+        </w:rPr>
+        <w:pPrChange w:id="80" w:author="kyle O'Reilly" w:date="2026-10-21T23:18:00Z" w16du:dateUtc="2026-10-21T22:18:00Z">
           <w:pPr/>
         </w:pPrChange>
       </w:pPr>
-      <w:bookmarkStart w:id="70" w:name="_Toc243507768"/>
-      <w:ins w:id="71" w:author="kyle O'Reilly" w:date="2026-10-21T20:39:00Z" w16du:dateUtc="2026-10-21T19:39:00Z">
+      <w:bookmarkStart w:id="81" w:name="_Toc243507768"/>
+      <w:ins w:id="82" w:author="kyle O'Reilly" w:date="2026-10-21T20:39:00Z" w16du:dateUtc="2026-10-21T19:39:00Z">
         <w:r>
           <w:t>4. Aim</w:t>
         </w:r>
       </w:ins>
-      <w:ins w:id="72" w:author="kyle O'Reilly" w:date="2026-10-21T20:40:00Z" w16du:dateUtc="2026-10-21T19:40:00Z">
+      <w:ins w:id="83" w:author="kyle O'Reilly" w:date="2026-10-21T20:40:00Z" w16du:dateUtc="2026-10-21T19:40:00Z">
         <w:r>
           <w:t>, Objectives and Hypothesis</w:t>
         </w:r>
-        <w:bookmarkEnd w:id="70"/>
+        <w:bookmarkEnd w:id="81"/>
         <w:r>
           <w:t xml:space="preserve"> </w:t>
         </w:r>
@@ -2804,202 +2879,348 @@
     </w:p>
     <w:p>
       <w:pPr>
-        <w:rPr>
-          <w:ins w:id="73" w:author="kyle O'Reilly" w:date="2026-10-21T20:39:00Z" w16du:dateUtc="2026-10-21T19:39:00Z"/>
-        </w:rPr>
-      </w:pPr>
-      <w:ins w:id="74" w:author="kyle O'Reilly" w:date="2026-10-21T20:40:00Z" w16du:dateUtc="2026-10-21T19:40:00Z">
-        <w:r>
-          <w:t>?</w:t>
-        </w:r>
-      </w:ins>
-    </w:p>
-    <w:p>
-      <w:pPr>
-        <w:rPr>
-          <w:ins w:id="75" w:author="kyle O'Reilly" w:date="2026-10-21T20:40:00Z" w16du:dateUtc="2026-10-21T19:40:00Z"/>
-        </w:rPr>
-      </w:pPr>
-    </w:p>
-    <w:p>
-      <w:pPr>
-        <w:pStyle w:val="Heading1"/>
-        <w:rPr>
-          <w:ins w:id="76" w:author="kyle O'Reilly" w:date="2026-10-21T20:40:00Z" w16du:dateUtc="2026-10-21T19:40:00Z"/>
-        </w:rPr>
-        <w:pPrChange w:id="77" w:author="kyle O'Reilly" w:date="2026-10-21T20:41:00Z" w16du:dateUtc="2026-10-21T19:41:00Z">
+        <w:spacing w:line="360" w:lineRule="auto"/>
+        <w:jc w:val="both"/>
+        <w:rPr>
+          <w:ins w:id="84" w:author="kyle O'Reilly" w:date="2026-10-21T23:16:00Z" w16du:dateUtc="2026-10-21T22:16:00Z"/>
+        </w:rPr>
+        <w:pPrChange w:id="85" w:author="kyle O'Reilly" w:date="2026-10-21T23:18:00Z" w16du:dateUtc="2026-10-21T22:18:00Z">
           <w:pPr/>
         </w:pPrChange>
       </w:pPr>
-      <w:bookmarkStart w:id="78" w:name="_Toc243507769"/>
-      <w:ins w:id="79" w:author="kyle O'Reilly" w:date="2026-10-21T20:40:00Z" w16du:dateUtc="2026-10-21T19:40:00Z">
-        <w:r>
-          <w:t>5. Project Scope</w:t>
-        </w:r>
-        <w:bookmarkEnd w:id="78"/>
-      </w:ins>
-    </w:p>
-    <w:p>
-      <w:pPr>
-        <w:rPr>
-          <w:ins w:id="80" w:author="kyle O'Reilly" w:date="2026-10-21T20:40:00Z" w16du:dateUtc="2026-10-21T19:40:00Z"/>
-        </w:rPr>
-      </w:pPr>
-      <w:ins w:id="81" w:author="kyle O'Reilly" w:date="2026-10-21T20:40:00Z" w16du:dateUtc="2026-10-21T19:40:00Z">
-        <w:r>
-          <w:t>?</w:t>
-        </w:r>
-      </w:ins>
-    </w:p>
-    <w:p>
-      <w:pPr>
-        <w:rPr>
-          <w:ins w:id="82" w:author="kyle O'Reilly" w:date="2026-10-21T20:40:00Z" w16du:dateUtc="2026-10-21T19:40:00Z"/>
-        </w:rPr>
-      </w:pPr>
-    </w:p>
-    <w:p>
-      <w:pPr>
-        <w:pStyle w:val="Heading1"/>
-        <w:rPr>
-          <w:ins w:id="83" w:author="kyle O'Reilly" w:date="2026-10-21T20:40:00Z" w16du:dateUtc="2026-10-21T19:40:00Z"/>
-        </w:rPr>
-        <w:pPrChange w:id="84" w:author="kyle O'Reilly" w:date="2026-10-21T20:41:00Z" w16du:dateUtc="2026-10-21T19:41:00Z">
+      <w:ins w:id="86" w:author="kyle O'Reilly" w:date="2026-10-21T23:10:00Z" w16du:dateUtc="2026-10-21T22:10:00Z">
+        <w:r>
+          <w:rPr>
+            <w:b/>
+            <w:bCs/>
+            <w:rPrChange w:id="87" w:author="kyle O'Reilly" w:date="2026-10-21T23:11:00Z" w16du:dateUtc="2026-10-21T22:11:00Z">
+              <w:rPr/>
+            </w:rPrChange>
+          </w:rPr>
+          <w:t>Aim:</w:t>
+        </w:r>
+        <w:r>
+          <w:t xml:space="preserve"> </w:t>
+        </w:r>
+      </w:ins>
+    </w:p>
+    <w:p>
+      <w:pPr>
+        <w:spacing w:line="360" w:lineRule="auto"/>
+        <w:jc w:val="both"/>
+        <w:rPr>
+          <w:ins w:id="88" w:author="kyle O'Reilly" w:date="2026-10-21T23:11:00Z" w16du:dateUtc="2026-10-21T22:11:00Z"/>
+        </w:rPr>
+        <w:pPrChange w:id="89" w:author="kyle O'Reilly" w:date="2026-10-21T23:18:00Z" w16du:dateUtc="2026-10-21T22:18:00Z">
           <w:pPr/>
         </w:pPrChange>
       </w:pPr>
-      <w:bookmarkStart w:id="85" w:name="_Toc243507770"/>
-      <w:ins w:id="86" w:author="kyle O'Reilly" w:date="2026-10-21T20:40:00Z" w16du:dateUtc="2026-10-21T19:40:00Z">
-        <w:r>
-          <w:t>6. Methodology</w:t>
-        </w:r>
-        <w:bookmarkEnd w:id="85"/>
-      </w:ins>
-    </w:p>
-    <w:p>
-      <w:pPr>
-        <w:rPr>
-          <w:ins w:id="87" w:author="kyle O'Reilly" w:date="2026-10-21T20:40:00Z" w16du:dateUtc="2026-10-21T19:40:00Z"/>
-        </w:rPr>
-      </w:pPr>
-      <w:ins w:id="88" w:author="kyle O'Reilly" w:date="2026-10-21T20:40:00Z" w16du:dateUtc="2026-10-21T19:40:00Z">
-        <w:r>
-          <w:t>?</w:t>
-        </w:r>
-      </w:ins>
-    </w:p>
-    <w:p>
-      <w:pPr>
-        <w:rPr>
-          <w:ins w:id="89" w:author="kyle O'Reilly" w:date="2026-10-21T20:40:00Z" w16du:dateUtc="2026-10-21T19:40:00Z"/>
-        </w:rPr>
-      </w:pPr>
-    </w:p>
-    <w:p>
-      <w:pPr>
-        <w:pStyle w:val="Heading1"/>
-        <w:rPr>
-          <w:ins w:id="90" w:author="kyle O'Reilly" w:date="2026-10-21T20:41:00Z" w16du:dateUtc="2026-10-21T19:41:00Z"/>
-        </w:rPr>
-        <w:pPrChange w:id="91" w:author="kyle O'Reilly" w:date="2026-10-21T20:41:00Z" w16du:dateUtc="2026-10-21T19:41:00Z">
+      <w:ins w:id="90" w:author="kyle O'Reilly" w:date="2026-10-21T23:10:00Z" w16du:dateUtc="2026-10-21T22:10:00Z">
+        <w:r>
+          <w:t xml:space="preserve">To compare the accuracy of Linear Regression, Random Forest and a </w:t>
+        </w:r>
+      </w:ins>
+      <w:ins w:id="91" w:author="kyle O'Reilly" w:date="2026-10-21T23:14:00Z" w16du:dateUtc="2026-10-21T22:14:00Z">
+        <w:r>
+          <w:t>n</w:t>
+        </w:r>
+      </w:ins>
+      <w:ins w:id="92" w:author="kyle O'Reilly" w:date="2026-10-21T23:10:00Z" w16du:dateUtc="2026-10-21T22:10:00Z">
+        <w:r>
+          <w:t xml:space="preserve">aïve </w:t>
+        </w:r>
+      </w:ins>
+      <w:ins w:id="93" w:author="kyle O'Reilly" w:date="2026-10-21T23:14:00Z" w16du:dateUtc="2026-10-21T22:14:00Z">
+        <w:r>
+          <w:t>b</w:t>
+        </w:r>
+      </w:ins>
+      <w:ins w:id="94" w:author="kyle O'Reilly" w:date="2026-10-21T23:10:00Z" w16du:dateUtc="2026-10-21T22:10:00Z">
+        <w:r>
+          <w:t xml:space="preserve">aseline when predicting stock </w:t>
+        </w:r>
+        <w:r>
+          <w:t xml:space="preserve">prices twenty days after one </w:t>
+        </w:r>
+      </w:ins>
+      <w:ins w:id="95" w:author="kyle O'Reilly" w:date="2026-10-21T23:11:00Z" w16du:dateUtc="2026-10-21T22:11:00Z">
+        <w:r>
+          <w:t xml:space="preserve">historical cut-off stock date from the JPM, KO and </w:t>
+        </w:r>
+        <w:r>
+          <w:t>INTC.</w:t>
+        </w:r>
+      </w:ins>
+    </w:p>
+    <w:p>
+      <w:pPr>
+        <w:spacing w:line="360" w:lineRule="auto"/>
+        <w:jc w:val="both"/>
+        <w:rPr>
+          <w:ins w:id="96" w:author="kyle O'Reilly" w:date="2026-10-21T23:11:00Z" w16du:dateUtc="2026-10-21T22:11:00Z"/>
+          <w:b/>
+          <w:bCs/>
+          <w:rPrChange w:id="97" w:author="kyle O'Reilly" w:date="2026-10-21T23:16:00Z" w16du:dateUtc="2026-10-21T22:16:00Z">
+            <w:rPr>
+              <w:ins w:id="98" w:author="kyle O'Reilly" w:date="2026-10-21T23:11:00Z" w16du:dateUtc="2026-10-21T22:11:00Z"/>
+            </w:rPr>
+          </w:rPrChange>
+        </w:rPr>
+        <w:pPrChange w:id="99" w:author="kyle O'Reilly" w:date="2026-10-21T23:18:00Z" w16du:dateUtc="2026-10-21T22:18:00Z">
           <w:pPr/>
         </w:pPrChange>
       </w:pPr>
-      <w:bookmarkStart w:id="92" w:name="_Toc243507771"/>
-      <w:ins w:id="93" w:author="kyle O'Reilly" w:date="2026-10-21T20:41:00Z" w16du:dateUtc="2026-10-21T19:41:00Z">
-        <w:r>
-          <w:t xml:space="preserve">7. </w:t>
-        </w:r>
-      </w:ins>
-      <w:ins w:id="94" w:author="kyle O'Reilly" w:date="2026-10-21T20:40:00Z" w16du:dateUtc="2026-10-21T19:40:00Z">
-        <w:r>
-          <w:t>Data Sources</w:t>
-        </w:r>
-      </w:ins>
-      <w:bookmarkEnd w:id="92"/>
-    </w:p>
-    <w:p>
-      <w:pPr>
-        <w:rPr>
-          <w:ins w:id="95" w:author="kyle O'Reilly" w:date="2026-10-21T20:41:00Z" w16du:dateUtc="2026-10-21T19:41:00Z"/>
-        </w:rPr>
-      </w:pPr>
-      <w:ins w:id="96" w:author="kyle O'Reilly" w:date="2026-10-21T20:41:00Z" w16du:dateUtc="2026-10-21T19:41:00Z">
-        <w:r>
-          <w:t>?</w:t>
-        </w:r>
-      </w:ins>
-    </w:p>
-    <w:p>
-      <w:pPr>
-        <w:rPr>
-          <w:ins w:id="97" w:author="kyle O'Reilly" w:date="2026-10-21T20:41:00Z" w16du:dateUtc="2026-10-21T19:41:00Z"/>
-        </w:rPr>
-      </w:pPr>
-    </w:p>
-    <w:p>
-      <w:pPr>
-        <w:pStyle w:val="Heading1"/>
-        <w:rPr>
-          <w:ins w:id="98" w:author="kyle O'Reilly" w:date="2026-10-21T20:41:00Z" w16du:dateUtc="2026-10-21T19:41:00Z"/>
-        </w:rPr>
-        <w:pPrChange w:id="99" w:author="kyle O'Reilly" w:date="2026-10-21T20:41:00Z" w16du:dateUtc="2026-10-21T19:41:00Z">
+      <w:ins w:id="100" w:author="kyle O'Reilly" w:date="2026-10-21T23:11:00Z" w16du:dateUtc="2026-10-21T22:11:00Z">
+        <w:r>
+          <w:rPr>
+            <w:b/>
+            <w:bCs/>
+            <w:rPrChange w:id="101" w:author="kyle O'Reilly" w:date="2026-10-21T23:16:00Z" w16du:dateUtc="2026-10-21T22:16:00Z">
+              <w:rPr/>
+            </w:rPrChange>
+          </w:rPr>
+          <w:t>Objectives:</w:t>
+        </w:r>
+      </w:ins>
+    </w:p>
+    <w:p>
+      <w:pPr>
+        <w:pStyle w:val="ListParagraph"/>
+        <w:numPr>
+          <w:ilvl w:val="0"/>
+          <w:numId w:val="7"/>
+        </w:numPr>
+        <w:spacing w:line="360" w:lineRule="auto"/>
+        <w:jc w:val="both"/>
+        <w:rPr>
+          <w:ins w:id="102" w:author="kyle O'Reilly" w:date="2026-10-21T23:13:00Z" w16du:dateUtc="2026-10-21T22:13:00Z"/>
+        </w:rPr>
+        <w:pPrChange w:id="103" w:author="kyle O'Reilly" w:date="2026-10-21T23:18:00Z" w16du:dateUtc="2026-10-21T22:18:00Z">
+          <w:pPr>
+            <w:pStyle w:val="ListParagraph"/>
+            <w:numPr>
+              <w:numId w:val="7"/>
+            </w:numPr>
+            <w:ind w:hanging="360"/>
+          </w:pPr>
+        </w:pPrChange>
+      </w:pPr>
+      <w:ins w:id="104" w:author="kyle O'Reilly" w:date="2026-10-21T23:11:00Z" w16du:dateUtc="2026-10-21T22:11:00Z">
+        <w:r>
+          <w:t>S</w:t>
+        </w:r>
+      </w:ins>
+      <w:ins w:id="105" w:author="kyle O'Reilly" w:date="2026-10-21T23:12:00Z" w16du:dateUtc="2026-10-21T22:12:00Z">
+        <w:r>
+          <w:t>elect JPM,</w:t>
+        </w:r>
+        <w:r>
+          <w:t xml:space="preserve"> KO and INTC, and examine comparable published volatility information to justify their proposed contra</w:t>
+        </w:r>
+      </w:ins>
+      <w:ins w:id="106" w:author="kyle O'Reilly" w:date="2026-10-21T23:13:00Z" w16du:dateUtc="2026-10-21T22:13:00Z">
+        <w:r>
+          <w:t>sting volatility levels.</w:t>
+        </w:r>
+      </w:ins>
+    </w:p>
+    <w:p>
+      <w:pPr>
+        <w:pStyle w:val="ListParagraph"/>
+        <w:numPr>
+          <w:ilvl w:val="0"/>
+          <w:numId w:val="7"/>
+        </w:numPr>
+        <w:spacing w:line="360" w:lineRule="auto"/>
+        <w:jc w:val="both"/>
+        <w:rPr>
+          <w:ins w:id="107" w:author="kyle O'Reilly" w:date="2026-10-21T23:14:00Z" w16du:dateUtc="2026-10-21T22:14:00Z"/>
+        </w:rPr>
+        <w:pPrChange w:id="108" w:author="kyle O'Reilly" w:date="2026-10-21T23:18:00Z" w16du:dateUtc="2026-10-21T22:18:00Z">
+          <w:pPr>
+            <w:pStyle w:val="ListParagraph"/>
+            <w:numPr>
+              <w:numId w:val="7"/>
+            </w:numPr>
+            <w:ind w:hanging="360"/>
+          </w:pPr>
+        </w:pPrChange>
+      </w:pPr>
+      <w:ins w:id="109" w:author="kyle O'Reilly" w:date="2026-10-21T23:13:00Z" w16du:dateUtc="2026-10-21T22:13:00Z">
+        <w:r>
+          <w:t xml:space="preserve">Collect, clean and analyse historical stock data </w:t>
+        </w:r>
+        <w:r>
+          <w:t>from Stooq, and prepare simple historical</w:t>
+        </w:r>
+      </w:ins>
+      <w:ins w:id="110" w:author="kyle O'Reilly" w:date="2026-10-21T23:14:00Z" w16du:dateUtc="2026-10-21T22:14:00Z">
+        <w:r>
+          <w:t xml:space="preserve"> price features for the forecasting models.</w:t>
+        </w:r>
+      </w:ins>
+    </w:p>
+    <w:p>
+      <w:pPr>
+        <w:pStyle w:val="ListParagraph"/>
+        <w:numPr>
+          <w:ilvl w:val="0"/>
+          <w:numId w:val="7"/>
+        </w:numPr>
+        <w:spacing w:line="360" w:lineRule="auto"/>
+        <w:jc w:val="both"/>
+        <w:rPr>
+          <w:ins w:id="111" w:author="kyle O'Reilly" w:date="2026-10-21T23:14:00Z" w16du:dateUtc="2026-10-21T22:14:00Z"/>
+        </w:rPr>
+        <w:pPrChange w:id="112" w:author="kyle O'Reilly" w:date="2026-10-21T23:18:00Z" w16du:dateUtc="2026-10-21T22:18:00Z">
+          <w:pPr>
+            <w:pStyle w:val="ListParagraph"/>
+            <w:numPr>
+              <w:numId w:val="7"/>
+            </w:numPr>
+            <w:ind w:hanging="360"/>
+          </w:pPr>
+        </w:pPrChange>
+      </w:pPr>
+      <w:ins w:id="113" w:author="kyle O'Reilly" w:date="2026-10-21T23:14:00Z" w16du:dateUtc="2026-10-21T22:14:00Z">
+        <w:r>
+          <w:t>Develop Linear Regression and Random Forest models and establish a naïve baseline for each selected stock.</w:t>
+        </w:r>
+      </w:ins>
+    </w:p>
+    <w:p>
+      <w:pPr>
+        <w:pStyle w:val="ListParagraph"/>
+        <w:numPr>
+          <w:ilvl w:val="0"/>
+          <w:numId w:val="7"/>
+        </w:numPr>
+        <w:spacing w:line="360" w:lineRule="auto"/>
+        <w:jc w:val="both"/>
+        <w:rPr>
+          <w:ins w:id="114" w:author="kyle O'Reilly" w:date="2026-10-21T23:15:00Z" w16du:dateUtc="2026-10-21T22:15:00Z"/>
+        </w:rPr>
+        <w:pPrChange w:id="115" w:author="kyle O'Reilly" w:date="2026-10-21T23:18:00Z" w16du:dateUtc="2026-10-21T22:18:00Z">
+          <w:pPr>
+            <w:pStyle w:val="ListParagraph"/>
+            <w:numPr>
+              <w:numId w:val="7"/>
+            </w:numPr>
+            <w:ind w:hanging="360"/>
+          </w:pPr>
+        </w:pPrChange>
+      </w:pPr>
+      <w:ins w:id="116" w:author="kyle O'Reilly" w:date="2026-10-21T23:14:00Z" w16du:dateUtc="2026-10-21T22:14:00Z">
+        <w:r>
+          <w:t>Generate nine predic</w:t>
+        </w:r>
+      </w:ins>
+      <w:ins w:id="117" w:author="kyle O'Reilly" w:date="2026-10-21T23:15:00Z" w16du:dateUtc="2026-10-21T22:15:00Z">
+        <w:r>
+          <w:t>tions and compare them with three actual closing stock prices twenty days after the historical cut-off stock date.</w:t>
+        </w:r>
+      </w:ins>
+    </w:p>
+    <w:p>
+      <w:pPr>
+        <w:pStyle w:val="ListParagraph"/>
+        <w:numPr>
+          <w:ilvl w:val="0"/>
+          <w:numId w:val="7"/>
+        </w:numPr>
+        <w:spacing w:line="360" w:lineRule="auto"/>
+        <w:jc w:val="both"/>
+        <w:rPr>
+          <w:ins w:id="118" w:author="kyle O'Reilly" w:date="2026-10-21T23:16:00Z" w16du:dateUtc="2026-10-21T22:16:00Z"/>
+        </w:rPr>
+        <w:pPrChange w:id="119" w:author="kyle O'Reilly" w:date="2026-10-21T23:18:00Z" w16du:dateUtc="2026-10-21T22:18:00Z">
+          <w:pPr>
+            <w:pStyle w:val="ListParagraph"/>
+            <w:numPr>
+              <w:numId w:val="7"/>
+            </w:numPr>
+            <w:ind w:hanging="360"/>
+          </w:pPr>
+        </w:pPrChange>
+      </w:pPr>
+      <w:ins w:id="120" w:author="kyle O'Reilly" w:date="2026-10-21T23:15:00Z" w16du:dateUtc="2026-10-21T22:15:00Z">
+        <w:r>
+          <w:t>Calculate individual prediction errors</w:t>
+        </w:r>
+        <w:r>
+          <w:t>, compare approaches and discuss observed difference between the s</w:t>
+        </w:r>
+      </w:ins>
+      <w:ins w:id="121" w:author="kyle O'Reilly" w:date="2026-10-21T23:16:00Z" w16du:dateUtc="2026-10-21T22:16:00Z">
+        <w:r>
+          <w:t>elected stocks.</w:t>
+        </w:r>
+      </w:ins>
+    </w:p>
+    <w:p>
+      <w:pPr>
+        <w:spacing w:line="360" w:lineRule="auto"/>
+        <w:jc w:val="both"/>
+        <w:rPr>
+          <w:ins w:id="122" w:author="kyle O'Reilly" w:date="2026-10-21T23:16:00Z" w16du:dateUtc="2026-10-21T22:16:00Z"/>
+          <w:b/>
+          <w:bCs/>
+          <w:rPrChange w:id="123" w:author="kyle O'Reilly" w:date="2026-10-21T23:16:00Z" w16du:dateUtc="2026-10-21T22:16:00Z">
+            <w:rPr>
+              <w:ins w:id="124" w:author="kyle O'Reilly" w:date="2026-10-21T23:16:00Z" w16du:dateUtc="2026-10-21T22:16:00Z"/>
+            </w:rPr>
+          </w:rPrChange>
+        </w:rPr>
+        <w:pPrChange w:id="125" w:author="kyle O'Reilly" w:date="2026-10-21T23:18:00Z" w16du:dateUtc="2026-10-21T22:18:00Z">
           <w:pPr/>
         </w:pPrChange>
       </w:pPr>
-      <w:bookmarkStart w:id="100" w:name="_Toc243507772"/>
-      <w:ins w:id="101" w:author="kyle O'Reilly" w:date="2026-10-21T20:41:00Z" w16du:dateUtc="2026-10-21T19:41:00Z">
-        <w:r>
-          <w:t>8. Expected Deliverables</w:t>
-        </w:r>
-        <w:bookmarkEnd w:id="100"/>
-      </w:ins>
-    </w:p>
-    <w:p>
-      <w:pPr>
-        <w:rPr>
-          <w:ins w:id="102" w:author="kyle O'Reilly" w:date="2026-10-21T20:41:00Z" w16du:dateUtc="2026-10-21T19:41:00Z"/>
-        </w:rPr>
-      </w:pPr>
-      <w:ins w:id="103" w:author="kyle O'Reilly" w:date="2026-10-21T20:41:00Z" w16du:dateUtc="2026-10-21T19:41:00Z">
-        <w:r>
-          <w:t>?</w:t>
-        </w:r>
-      </w:ins>
-    </w:p>
-    <w:p>
-      <w:pPr>
-        <w:rPr>
-          <w:ins w:id="104" w:author="kyle O'Reilly" w:date="2026-10-21T20:41:00Z" w16du:dateUtc="2026-10-21T19:41:00Z"/>
-        </w:rPr>
-      </w:pPr>
-    </w:p>
-    <w:p>
-      <w:pPr>
-        <w:pStyle w:val="Heading1"/>
-        <w:pPrChange w:id="105" w:author="kyle O'Reilly" w:date="2026-10-21T20:41:00Z" w16du:dateUtc="2026-10-21T19:41:00Z">
+      <w:ins w:id="126" w:author="kyle O'Reilly" w:date="2026-10-21T23:16:00Z" w16du:dateUtc="2026-10-21T22:16:00Z">
+        <w:r>
+          <w:rPr>
+            <w:b/>
+            <w:bCs/>
+            <w:rPrChange w:id="127" w:author="kyle O'Reilly" w:date="2026-10-21T23:16:00Z" w16du:dateUtc="2026-10-21T22:16:00Z">
+              <w:rPr/>
+            </w:rPrChange>
+          </w:rPr>
+          <w:t>Hypothesis:</w:t>
+        </w:r>
+      </w:ins>
+    </w:p>
+    <w:p>
+      <w:pPr>
+        <w:spacing w:line="360" w:lineRule="auto"/>
+        <w:jc w:val="both"/>
+        <w:rPr>
+          <w:ins w:id="128" w:author="kyle O'Reilly" w:date="2026-10-21T20:39:00Z" w16du:dateUtc="2026-10-21T19:39:00Z"/>
+        </w:rPr>
+        <w:pPrChange w:id="129" w:author="kyle O'Reilly" w:date="2026-10-21T23:18:00Z" w16du:dateUtc="2026-10-21T22:18:00Z">
           <w:pPr/>
         </w:pPrChange>
       </w:pPr>
-      <w:bookmarkStart w:id="106" w:name="_Toc243507773"/>
-      <w:ins w:id="107" w:author="kyle O'Reilly" w:date="2026-10-21T20:41:00Z" w16du:dateUtc="2026-10-21T19:41:00Z">
-        <w:r>
-          <w:t>9. Project Timeline</w:t>
-        </w:r>
-      </w:ins>
-      <w:bookmarkEnd w:id="106"/>
-    </w:p>
-    <w:p>
-      <w:ins w:id="108" w:author="kyle O'Reilly" w:date="2026-10-21T20:41:00Z" w16du:dateUtc="2026-10-21T19:41:00Z">
-        <w:r>
-          <w:t>?</w:t>
-        </w:r>
-      </w:ins>
-    </w:p>
-    <w:p>
-      <w:pPr>
-        <w:rPr>
-          <w:ins w:id="109" w:author="kyle O'Reilly" w:date="2026-10-21T20:41:00Z" w16du:dateUtc="2026-10-21T19:41:00Z"/>
+      <w:ins w:id="130" w:author="kyle O'Reilly" w:date="2026-10-21T23:16:00Z" w16du:dateUtc="2026-10-21T22:16:00Z">
+        <w:r>
+          <w:lastRenderedPageBreak/>
+          <w:t xml:space="preserve">The stock with the highest documented </w:t>
+        </w:r>
+        <w:r>
+          <w:t>historical volatility will have the highest</w:t>
+        </w:r>
+      </w:ins>
+      <w:ins w:id="131" w:author="kyle O'Reilly" w:date="2026-10-21T23:17:00Z" w16du:dateUtc="2026-10-21T22:17:00Z">
+        <w:r>
+          <w:t xml:space="preserve"> average absolute percentage forecasting error across the three forecasting methods. This explo</w:t>
+        </w:r>
+        <w:r>
+          <w:t>ratory hypothesis cannot be generalised from one target date per stock.</w:t>
+        </w:r>
+      </w:ins>
+    </w:p>
+    <w:p>
+      <w:pPr>
+        <w:rPr>
+          <w:ins w:id="132" w:author="kyle O'Reilly" w:date="2026-10-21T20:40:00Z" w16du:dateUtc="2026-10-21T19:40:00Z"/>
         </w:rPr>
       </w:pPr>
     </w:p>
@@ -3007,243 +3228,36 @@
       <w:pPr>
         <w:pStyle w:val="Heading1"/>
         <w:rPr>
-          <w:ins w:id="110" w:author="kyle O'Reilly" w:date="2026-10-21T20:41:00Z" w16du:dateUtc="2026-10-21T19:41:00Z"/>
-        </w:rPr>
-        <w:pPrChange w:id="111" w:author="kyle O'Reilly" w:date="2026-10-21T20:42:00Z" w16du:dateUtc="2026-10-21T19:42:00Z">
+          <w:ins w:id="133" w:author="kyle O'Reilly" w:date="2026-10-21T20:40:00Z" w16du:dateUtc="2026-10-21T19:40:00Z"/>
+        </w:rPr>
+        <w:pPrChange w:id="134" w:author="kyle O'Reilly" w:date="2026-10-21T20:41:00Z" w16du:dateUtc="2026-10-21T19:41:00Z">
           <w:pPr/>
         </w:pPrChange>
       </w:pPr>
-      <w:bookmarkStart w:id="112" w:name="_Toc243507774"/>
-      <w:ins w:id="113" w:author="kyle O'Reilly" w:date="2026-10-21T20:41:00Z" w16du:dateUtc="2026-10-21T19:41:00Z">
-        <w:r>
-          <w:t>10. Ethical and Legal Considerations</w:t>
-        </w:r>
-        <w:bookmarkEnd w:id="112"/>
-      </w:ins>
-    </w:p>
-    <w:p>
-      <w:pPr>
-        <w:rPr>
-          <w:ins w:id="114" w:author="kyle O'Reilly" w:date="2026-10-21T20:46:00Z" w16du:dateUtc="2026-10-21T19:46:00Z"/>
-        </w:rPr>
-      </w:pPr>
-      <w:ins w:id="115" w:author="kyle O'Reilly" w:date="2026-10-21T20:42:00Z" w16du:dateUtc="2026-10-21T19:42:00Z">
-        <w:r>
-          <w:t>This C</w:t>
-        </w:r>
-      </w:ins>
-      <w:ins w:id="116" w:author="kyle O'Reilly" w:date="2026-10-21T20:43:00Z" w16du:dateUtc="2026-10-21T19:43:00Z">
-        <w:r>
-          <w:t xml:space="preserve">apstone Project will use </w:t>
-        </w:r>
-        <w:r>
-          <w:t xml:space="preserve">publicly available </w:t>
-        </w:r>
-        <w:r>
-          <w:t>historical stock</w:t>
-        </w:r>
-      </w:ins>
-      <w:ins w:id="117" w:author="kyle O'Reilly" w:date="2026-10-21T22:01:00Z" w16du:dateUtc="2026-10-21T21:01:00Z">
-        <w:r>
-          <w:t xml:space="preserve"> </w:t>
-        </w:r>
-      </w:ins>
-      <w:ins w:id="118" w:author="kyle O'Reilly" w:date="2026-10-21T20:43:00Z" w16du:dateUtc="2026-10-21T19:43:00Z">
-        <w:r>
-          <w:t xml:space="preserve">data </w:t>
-        </w:r>
-        <w:r>
-          <w:t xml:space="preserve">and will not </w:t>
-        </w:r>
-        <w:r>
-          <w:t xml:space="preserve">collect personal information or involve human </w:t>
-        </w:r>
-      </w:ins>
-      <w:ins w:id="119" w:author="kyle O'Reilly" w:date="2026-10-21T20:44:00Z" w16du:dateUtc="2026-10-21T19:44:00Z">
-        <w:r>
-          <w:t>participants. Stooq data access and usage conditions, and any Trading 212</w:t>
-        </w:r>
-        <w:r>
-          <w:t xml:space="preserve"> information reused in the report, will be reviewed and appropriately attributed</w:t>
-        </w:r>
-      </w:ins>
-      <w:ins w:id="120" w:author="kyle O'Reilly" w:date="2026-10-21T20:45:00Z" w16du:dateUtc="2026-10-21T19:45:00Z">
-        <w:r>
-          <w:t xml:space="preserve">. Historical stock </w:t>
-        </w:r>
-      </w:ins>
-      <w:ins w:id="121" w:author="kyle O'Reilly" w:date="2026-10-21T22:03:00Z" w16du:dateUtc="2026-10-21T21:03:00Z">
-        <w:r>
-          <w:t xml:space="preserve">market </w:t>
-        </w:r>
-      </w:ins>
-      <w:ins w:id="122" w:author="kyle O'Reilly" w:date="2026-10-21T20:45:00Z" w16du:dateUtc="2026-10-21T19:45:00Z">
-        <w:r>
-          <w:t xml:space="preserve">data </w:t>
-        </w:r>
-      </w:ins>
-      <w:ins w:id="123" w:author="kyle O'Reilly" w:date="2026-10-21T22:11:00Z" w16du:dateUtc="2026-10-21T21:11:00Z">
-        <w:r>
-          <w:t>Comma</w:t>
-        </w:r>
-        <w:r>
-          <w:t xml:space="preserve">-Separated Values </w:t>
-        </w:r>
-        <w:r>
-          <w:t>(</w:t>
-        </w:r>
-      </w:ins>
-      <w:ins w:id="124" w:author="kyle O'Reilly" w:date="2026-10-21T22:05:00Z" w16du:dateUtc="2026-10-21T21:05:00Z">
-        <w:r>
-          <w:t>CSV</w:t>
-        </w:r>
-      </w:ins>
-      <w:ins w:id="125" w:author="kyle O'Reilly" w:date="2026-10-21T22:11:00Z" w16du:dateUtc="2026-10-21T21:11:00Z">
-        <w:r>
-          <w:t>)</w:t>
-        </w:r>
-      </w:ins>
-      <w:ins w:id="126" w:author="kyle O'Reilly" w:date="2026-10-21T22:05:00Z" w16du:dateUtc="2026-10-21T21:05:00Z">
-        <w:r>
-          <w:t xml:space="preserve"> </w:t>
-        </w:r>
-      </w:ins>
-      <w:ins w:id="127" w:author="kyle O'Reilly" w:date="2026-10-21T20:45:00Z" w16du:dateUtc="2026-10-21T19:45:00Z">
-        <w:r>
-          <w:t>files</w:t>
-        </w:r>
-      </w:ins>
-      <w:ins w:id="128" w:author="kyle O'Reilly" w:date="2026-10-21T22:07:00Z" w16du:dateUtc="2026-10-21T21:07:00Z">
-        <w:r>
-          <w:t xml:space="preserve"> downloaded from S</w:t>
-        </w:r>
-      </w:ins>
-      <w:ins w:id="129" w:author="kyle O'Reilly" w:date="2026-10-21T22:08:00Z" w16du:dateUtc="2026-10-21T21:08:00Z">
-        <w:r>
-          <w:t>tooq</w:t>
-        </w:r>
-      </w:ins>
-      <w:ins w:id="130" w:author="kyle O'Reilly" w:date="2026-10-21T20:45:00Z" w16du:dateUtc="2026-10-21T19:45:00Z">
-        <w:r>
-          <w:t xml:space="preserve"> </w:t>
-        </w:r>
-        <w:r>
-          <w:t xml:space="preserve">will only be </w:t>
-        </w:r>
-      </w:ins>
-      <w:ins w:id="131" w:author="kyle O'Reilly" w:date="2026-10-21T22:08:00Z" w16du:dateUtc="2026-10-21T21:08:00Z">
-        <w:r>
-          <w:t>uploaded to</w:t>
-        </w:r>
-      </w:ins>
-      <w:ins w:id="132" w:author="kyle O'Reilly" w:date="2026-10-21T20:45:00Z" w16du:dateUtc="2026-10-21T19:45:00Z">
-        <w:r>
-          <w:t xml:space="preserve"> </w:t>
-        </w:r>
-      </w:ins>
-      <w:ins w:id="133" w:author="kyle O'Reilly" w:date="2026-10-21T20:48:00Z" w16du:dateUtc="2026-10-21T19:48:00Z">
-        <w:r>
-          <w:t>GitHub</w:t>
-        </w:r>
-      </w:ins>
-      <w:ins w:id="134" w:author="kyle O'Reilly" w:date="2026-10-21T20:45:00Z" w16du:dateUtc="2026-10-21T19:45:00Z">
-        <w:r>
-          <w:t xml:space="preserve"> </w:t>
-        </w:r>
-      </w:ins>
-      <w:ins w:id="135" w:author="kyle O'Reilly" w:date="2026-10-21T22:07:00Z" w16du:dateUtc="2026-10-21T21:07:00Z">
-        <w:r>
-          <w:t>if permitted by Stooq’s terms of service</w:t>
-        </w:r>
-      </w:ins>
-      <w:ins w:id="136" w:author="kyle O'Reilly" w:date="2026-10-21T20:45:00Z" w16du:dateUtc="2026-10-21T19:45:00Z">
-        <w:r>
-          <w:t xml:space="preserve">; otherwise, </w:t>
-        </w:r>
-      </w:ins>
-      <w:ins w:id="137" w:author="kyle O'Reilly" w:date="2026-10-21T22:07:00Z" w16du:dateUtc="2026-10-21T21:07:00Z">
-        <w:r>
-          <w:t xml:space="preserve">the </w:t>
-        </w:r>
-        <w:r>
-          <w:t xml:space="preserve">Phyton </w:t>
-        </w:r>
-      </w:ins>
-      <w:ins w:id="138" w:author="kyle O'Reilly" w:date="2026-10-21T20:45:00Z" w16du:dateUtc="2026-10-21T19:45:00Z">
-        <w:r>
-          <w:t xml:space="preserve">code and retrieval </w:t>
-        </w:r>
-      </w:ins>
-      <w:ins w:id="139" w:author="kyle O'Reilly" w:date="2026-10-21T20:46:00Z" w16du:dateUtc="2026-10-21T19:46:00Z">
-        <w:r>
-          <w:t xml:space="preserve">instructions will be provided. </w:t>
-        </w:r>
-      </w:ins>
-    </w:p>
-    <w:p>
-      <w:pPr>
-        <w:rPr>
-          <w:ins w:id="140" w:author="kyle O'Reilly" w:date="2026-10-21T20:42:00Z" w16du:dateUtc="2026-10-21T19:42:00Z"/>
-        </w:rPr>
-      </w:pPr>
-      <w:ins w:id="141" w:author="kyle O'Reilly" w:date="2026-10-21T22:09:00Z" w16du:dateUtc="2026-10-21T21:09:00Z">
-        <w:r>
-          <w:t>All results</w:t>
-        </w:r>
-        <w:r>
-          <w:t>,</w:t>
-        </w:r>
-      </w:ins>
-      <w:ins w:id="142" w:author="kyle O'Reilly" w:date="2026-10-21T20:47:00Z" w16du:dateUtc="2026-10-21T19:47:00Z">
-        <w:r>
-          <w:t xml:space="preserve"> including </w:t>
-        </w:r>
-      </w:ins>
-      <w:ins w:id="143" w:author="kyle O'Reilly" w:date="2026-10-21T22:10:00Z" w16du:dateUtc="2026-10-21T21:10:00Z">
-        <w:r>
-          <w:t>inaccurate</w:t>
-        </w:r>
-      </w:ins>
-      <w:ins w:id="144" w:author="kyle O'Reilly" w:date="2026-10-21T20:47:00Z" w16du:dateUtc="2026-10-21T19:47:00Z">
-        <w:r>
-          <w:t xml:space="preserve"> predictions, will be reported transparently. Th</w:t>
-        </w:r>
-      </w:ins>
-      <w:ins w:id="145" w:author="kyle O'Reilly" w:date="2026-10-21T22:10:00Z" w16du:dateUtc="2026-10-21T21:10:00Z">
-        <w:r>
-          <w:t>is Capstone Project</w:t>
-        </w:r>
-      </w:ins>
-      <w:ins w:id="146" w:author="kyle O'Reilly" w:date="2026-10-21T20:47:00Z" w16du:dateUtc="2026-10-21T19:47:00Z">
-        <w:r>
-          <w:t xml:space="preserve"> work is for academic purposes</w:t>
-        </w:r>
-      </w:ins>
-      <w:ins w:id="147" w:author="kyle O'Reilly" w:date="2026-10-21T22:10:00Z" w16du:dateUtc="2026-10-21T21:10:00Z">
-        <w:r>
-          <w:t xml:space="preserve"> only</w:t>
-        </w:r>
-      </w:ins>
-      <w:ins w:id="148" w:author="kyle O'Reilly" w:date="2026-10-21T20:47:00Z" w16du:dateUtc="2026-10-21T19:47:00Z">
-        <w:r>
-          <w:t xml:space="preserve"> and does constitute financial inv</w:t>
-        </w:r>
-      </w:ins>
-      <w:ins w:id="149" w:author="kyle O'Reilly" w:date="2026-10-21T20:48:00Z" w16du:dateUtc="2026-10-21T19:48:00Z">
-        <w:r>
-          <w:t>estment</w:t>
-        </w:r>
-      </w:ins>
-      <w:ins w:id="150" w:author="kyle O'Reilly" w:date="2026-10-21T20:47:00Z" w16du:dateUtc="2026-10-21T19:47:00Z">
-        <w:r>
-          <w:t xml:space="preserve"> advice.</w:t>
-        </w:r>
-      </w:ins>
-    </w:p>
-    <w:p>
-      <w:pPr>
-        <w:rPr>
-          <w:ins w:id="151" w:author="kyle O'Reilly" w:date="2026-10-21T20:42:00Z" w16du:dateUtc="2026-10-21T19:42:00Z"/>
+      <w:bookmarkStart w:id="135" w:name="_Toc243507769"/>
+      <w:ins w:id="136" w:author="kyle O'Reilly" w:date="2026-10-21T20:40:00Z" w16du:dateUtc="2026-10-21T19:40:00Z">
+        <w:r>
+          <w:t>5. Project Scope</w:t>
+        </w:r>
+        <w:bookmarkEnd w:id="135"/>
+      </w:ins>
+    </w:p>
+    <w:p>
+      <w:pPr>
+        <w:rPr>
+          <w:ins w:id="137" w:author="kyle O'Reilly" w:date="2026-10-21T20:40:00Z" w16du:dateUtc="2026-10-21T19:40:00Z"/>
+        </w:rPr>
+      </w:pPr>
+      <w:ins w:id="138" w:author="kyle O'Reilly" w:date="2026-10-21T20:40:00Z" w16du:dateUtc="2026-10-21T19:40:00Z">
+        <w:r>
+          <w:t>?</w:t>
+        </w:r>
+      </w:ins>
+    </w:p>
+    <w:p>
+      <w:pPr>
+        <w:rPr>
+          <w:ins w:id="139" w:author="kyle O'Reilly" w:date="2026-10-21T20:40:00Z" w16du:dateUtc="2026-10-21T19:40:00Z"/>
         </w:rPr>
       </w:pPr>
     </w:p>
@@ -3251,18 +3265,420 @@
       <w:pPr>
         <w:pStyle w:val="Heading1"/>
         <w:rPr>
-          <w:ins w:id="152" w:author="kyle O'Reilly" w:date="2026-10-21T20:42:00Z" w16du:dateUtc="2026-10-21T19:42:00Z"/>
-        </w:rPr>
-        <w:pPrChange w:id="153" w:author="kyle O'Reilly" w:date="2026-10-21T20:42:00Z" w16du:dateUtc="2026-10-21T19:42:00Z">
+          <w:ins w:id="140" w:author="kyle O'Reilly" w:date="2026-10-21T20:40:00Z" w16du:dateUtc="2026-10-21T19:40:00Z"/>
+        </w:rPr>
+        <w:pPrChange w:id="141" w:author="kyle O'Reilly" w:date="2026-10-21T20:41:00Z" w16du:dateUtc="2026-10-21T19:41:00Z">
           <w:pPr/>
         </w:pPrChange>
       </w:pPr>
-      <w:bookmarkStart w:id="154" w:name="_Toc243507775"/>
-      <w:ins w:id="155" w:author="kyle O'Reilly" w:date="2026-10-21T20:42:00Z" w16du:dateUtc="2026-10-21T19:42:00Z">
+      <w:bookmarkStart w:id="142" w:name="_Toc243507770"/>
+      <w:ins w:id="143" w:author="kyle O'Reilly" w:date="2026-10-21T20:40:00Z" w16du:dateUtc="2026-10-21T19:40:00Z">
+        <w:r>
+          <w:t>6. Methodology</w:t>
+        </w:r>
+        <w:bookmarkEnd w:id="142"/>
+      </w:ins>
+    </w:p>
+    <w:p>
+      <w:pPr>
+        <w:rPr>
+          <w:ins w:id="144" w:author="kyle O'Reilly" w:date="2026-10-21T20:40:00Z" w16du:dateUtc="2026-10-21T19:40:00Z"/>
+        </w:rPr>
+      </w:pPr>
+      <w:ins w:id="145" w:author="kyle O'Reilly" w:date="2026-10-21T20:40:00Z" w16du:dateUtc="2026-10-21T19:40:00Z">
+        <w:r>
+          <w:t>?</w:t>
+        </w:r>
+      </w:ins>
+    </w:p>
+    <w:p>
+      <w:pPr>
+        <w:rPr>
+          <w:ins w:id="146" w:author="kyle O'Reilly" w:date="2026-10-21T20:40:00Z" w16du:dateUtc="2026-10-21T19:40:00Z"/>
+        </w:rPr>
+      </w:pPr>
+    </w:p>
+    <w:p>
+      <w:pPr>
+        <w:pStyle w:val="Heading1"/>
+        <w:rPr>
+          <w:ins w:id="147" w:author="kyle O'Reilly" w:date="2026-10-21T20:41:00Z" w16du:dateUtc="2026-10-21T19:41:00Z"/>
+        </w:rPr>
+        <w:pPrChange w:id="148" w:author="kyle O'Reilly" w:date="2026-10-21T20:41:00Z" w16du:dateUtc="2026-10-21T19:41:00Z">
+          <w:pPr/>
+        </w:pPrChange>
+      </w:pPr>
+      <w:bookmarkStart w:id="149" w:name="_Toc243507771"/>
+      <w:ins w:id="150" w:author="kyle O'Reilly" w:date="2026-10-21T20:41:00Z" w16du:dateUtc="2026-10-21T19:41:00Z">
+        <w:r>
+          <w:t xml:space="preserve">7. </w:t>
+        </w:r>
+      </w:ins>
+      <w:ins w:id="151" w:author="kyle O'Reilly" w:date="2026-10-21T20:40:00Z" w16du:dateUtc="2026-10-21T19:40:00Z">
+        <w:r>
+          <w:t>Data Sources</w:t>
+        </w:r>
+      </w:ins>
+      <w:bookmarkEnd w:id="149"/>
+    </w:p>
+    <w:p>
+      <w:pPr>
+        <w:rPr>
+          <w:ins w:id="152" w:author="kyle O'Reilly" w:date="2026-10-21T20:41:00Z" w16du:dateUtc="2026-10-21T19:41:00Z"/>
+        </w:rPr>
+      </w:pPr>
+      <w:ins w:id="153" w:author="kyle O'Reilly" w:date="2026-10-21T20:41:00Z" w16du:dateUtc="2026-10-21T19:41:00Z">
+        <w:r>
+          <w:t>?</w:t>
+        </w:r>
+      </w:ins>
+    </w:p>
+    <w:p>
+      <w:pPr>
+        <w:rPr>
+          <w:ins w:id="154" w:author="kyle O'Reilly" w:date="2026-10-21T20:41:00Z" w16du:dateUtc="2026-10-21T19:41:00Z"/>
+        </w:rPr>
+      </w:pPr>
+    </w:p>
+    <w:p>
+      <w:pPr>
+        <w:pStyle w:val="Heading1"/>
+        <w:rPr>
+          <w:ins w:id="155" w:author="kyle O'Reilly" w:date="2026-10-21T20:41:00Z" w16du:dateUtc="2026-10-21T19:41:00Z"/>
+        </w:rPr>
+        <w:pPrChange w:id="156" w:author="kyle O'Reilly" w:date="2026-10-21T20:41:00Z" w16du:dateUtc="2026-10-21T19:41:00Z">
+          <w:pPr/>
+        </w:pPrChange>
+      </w:pPr>
+      <w:bookmarkStart w:id="157" w:name="_Toc243507772"/>
+      <w:ins w:id="158" w:author="kyle O'Reilly" w:date="2026-10-21T20:41:00Z" w16du:dateUtc="2026-10-21T19:41:00Z">
+        <w:r>
+          <w:t>8. Expected Deliverables</w:t>
+        </w:r>
+        <w:bookmarkEnd w:id="157"/>
+      </w:ins>
+    </w:p>
+    <w:p>
+      <w:pPr>
+        <w:rPr>
+          <w:ins w:id="159" w:author="kyle O'Reilly" w:date="2026-10-21T20:41:00Z" w16du:dateUtc="2026-10-21T19:41:00Z"/>
+        </w:rPr>
+      </w:pPr>
+      <w:ins w:id="160" w:author="kyle O'Reilly" w:date="2026-10-21T20:41:00Z" w16du:dateUtc="2026-10-21T19:41:00Z">
+        <w:r>
+          <w:t>?</w:t>
+        </w:r>
+      </w:ins>
+    </w:p>
+    <w:p>
+      <w:pPr>
+        <w:rPr>
+          <w:ins w:id="161" w:author="kyle O'Reilly" w:date="2026-10-21T20:41:00Z" w16du:dateUtc="2026-10-21T19:41:00Z"/>
+        </w:rPr>
+      </w:pPr>
+    </w:p>
+    <w:p>
+      <w:pPr>
+        <w:pStyle w:val="Heading1"/>
+        <w:pPrChange w:id="162" w:author="kyle O'Reilly" w:date="2026-10-21T20:41:00Z" w16du:dateUtc="2026-10-21T19:41:00Z">
+          <w:pPr/>
+        </w:pPrChange>
+      </w:pPr>
+      <w:bookmarkStart w:id="163" w:name="_Toc243507773"/>
+      <w:ins w:id="164" w:author="kyle O'Reilly" w:date="2026-10-21T20:41:00Z" w16du:dateUtc="2026-10-21T19:41:00Z">
+        <w:r>
+          <w:t>9. Project Timeline</w:t>
+        </w:r>
+      </w:ins>
+      <w:bookmarkEnd w:id="163"/>
+    </w:p>
+    <w:p>
+      <w:ins w:id="165" w:author="kyle O'Reilly" w:date="2026-10-21T20:41:00Z" w16du:dateUtc="2026-10-21T19:41:00Z">
+        <w:r>
+          <w:t>?</w:t>
+        </w:r>
+      </w:ins>
+    </w:p>
+    <w:p>
+      <w:pPr>
+        <w:rPr>
+          <w:ins w:id="166" w:author="kyle O'Reilly" w:date="2026-10-21T20:41:00Z" w16du:dateUtc="2026-10-21T19:41:00Z"/>
+        </w:rPr>
+      </w:pPr>
+    </w:p>
+    <w:p>
+      <w:pPr>
+        <w:pStyle w:val="Heading1"/>
+        <w:spacing w:line="360" w:lineRule="auto"/>
+        <w:jc w:val="both"/>
+        <w:rPr>
+          <w:ins w:id="167" w:author="kyle O'Reilly" w:date="2026-10-21T20:41:00Z" w16du:dateUtc="2026-10-21T19:41:00Z"/>
+        </w:rPr>
+        <w:pPrChange w:id="168" w:author="kyle O'Reilly" w:date="2026-10-21T23:07:00Z" w16du:dateUtc="2026-10-21T22:07:00Z">
+          <w:pPr/>
+        </w:pPrChange>
+      </w:pPr>
+      <w:bookmarkStart w:id="169" w:name="_Toc243507774"/>
+      <w:ins w:id="170" w:author="kyle O'Reilly" w:date="2026-10-21T20:41:00Z" w16du:dateUtc="2026-10-21T19:41:00Z">
+        <w:r>
+          <w:t>10. Ethical and Legal Considerations</w:t>
+        </w:r>
+        <w:bookmarkEnd w:id="169"/>
+      </w:ins>
+    </w:p>
+    <w:p>
+      <w:pPr>
+        <w:spacing w:line="360" w:lineRule="auto"/>
+        <w:jc w:val="both"/>
+        <w:rPr>
+          <w:ins w:id="171" w:author="kyle O'Reilly" w:date="2026-10-21T20:46:00Z" w16du:dateUtc="2026-10-21T19:46:00Z"/>
+        </w:rPr>
+        <w:pPrChange w:id="172" w:author="kyle O'Reilly" w:date="2026-10-21T23:07:00Z" w16du:dateUtc="2026-10-21T22:07:00Z">
+          <w:pPr/>
+        </w:pPrChange>
+      </w:pPr>
+      <w:ins w:id="173" w:author="kyle O'Reilly" w:date="2026-10-21T20:42:00Z" w16du:dateUtc="2026-10-21T19:42:00Z">
+        <w:r>
+          <w:t>This C</w:t>
+        </w:r>
+      </w:ins>
+      <w:ins w:id="174" w:author="kyle O'Reilly" w:date="2026-10-21T20:43:00Z" w16du:dateUtc="2026-10-21T19:43:00Z">
+        <w:r>
+          <w:t xml:space="preserve">apstone Project will use </w:t>
+        </w:r>
+        <w:r>
+          <w:t xml:space="preserve">publicly available </w:t>
+        </w:r>
+        <w:r>
+          <w:t>historical stock</w:t>
+        </w:r>
+      </w:ins>
+      <w:ins w:id="175" w:author="kyle O'Reilly" w:date="2026-10-21T22:01:00Z" w16du:dateUtc="2026-10-21T21:01:00Z">
+        <w:r>
+          <w:t xml:space="preserve"> </w:t>
+        </w:r>
+      </w:ins>
+      <w:ins w:id="176" w:author="kyle O'Reilly" w:date="2026-10-21T20:43:00Z" w16du:dateUtc="2026-10-21T19:43:00Z">
+        <w:r>
+          <w:t xml:space="preserve">data </w:t>
+        </w:r>
+        <w:r>
+          <w:t xml:space="preserve">and will not </w:t>
+        </w:r>
+        <w:r>
+          <w:t xml:space="preserve">collect personal information or involve human </w:t>
+        </w:r>
+      </w:ins>
+      <w:ins w:id="177" w:author="kyle O'Reilly" w:date="2026-10-21T20:44:00Z" w16du:dateUtc="2026-10-21T19:44:00Z">
+        <w:r>
+          <w:t>participants. Stooq data access and usage conditions, and any Trading 212</w:t>
+        </w:r>
+        <w:r>
+          <w:t xml:space="preserve"> information reused in the report, will be reviewed and appropriately attributed</w:t>
+        </w:r>
+      </w:ins>
+      <w:ins w:id="178" w:author="kyle O'Reilly" w:date="2026-10-21T20:45:00Z" w16du:dateUtc="2026-10-21T19:45:00Z">
+        <w:r>
+          <w:t xml:space="preserve">. Historical stock </w:t>
+        </w:r>
+      </w:ins>
+      <w:ins w:id="179" w:author="kyle O'Reilly" w:date="2026-10-21T22:03:00Z" w16du:dateUtc="2026-10-21T21:03:00Z">
+        <w:r>
+          <w:t xml:space="preserve">market </w:t>
+        </w:r>
+      </w:ins>
+      <w:ins w:id="180" w:author="kyle O'Reilly" w:date="2026-10-21T20:45:00Z" w16du:dateUtc="2026-10-21T19:45:00Z">
+        <w:r>
+          <w:t xml:space="preserve">data </w:t>
+        </w:r>
+      </w:ins>
+      <w:ins w:id="181" w:author="kyle O'Reilly" w:date="2026-10-21T22:11:00Z" w16du:dateUtc="2026-10-21T21:11:00Z">
+        <w:r>
+          <w:t>Comma</w:t>
+        </w:r>
+        <w:r>
+          <w:t xml:space="preserve">-Separated Values </w:t>
+        </w:r>
+        <w:r>
+          <w:t>(</w:t>
+        </w:r>
+      </w:ins>
+      <w:ins w:id="182" w:author="kyle O'Reilly" w:date="2026-10-21T22:05:00Z" w16du:dateUtc="2026-10-21T21:05:00Z">
+        <w:r>
+          <w:t>CSV</w:t>
+        </w:r>
+      </w:ins>
+      <w:ins w:id="183" w:author="kyle O'Reilly" w:date="2026-10-21T22:11:00Z" w16du:dateUtc="2026-10-21T21:11:00Z">
+        <w:r>
+          <w:t>)</w:t>
+        </w:r>
+      </w:ins>
+      <w:ins w:id="184" w:author="kyle O'Reilly" w:date="2026-10-21T22:05:00Z" w16du:dateUtc="2026-10-21T21:05:00Z">
+        <w:r>
+          <w:t xml:space="preserve"> </w:t>
+        </w:r>
+      </w:ins>
+      <w:ins w:id="185" w:author="kyle O'Reilly" w:date="2026-10-21T20:45:00Z" w16du:dateUtc="2026-10-21T19:45:00Z">
+        <w:r>
+          <w:t>files</w:t>
+        </w:r>
+      </w:ins>
+      <w:ins w:id="186" w:author="kyle O'Reilly" w:date="2026-10-21T22:07:00Z" w16du:dateUtc="2026-10-21T21:07:00Z">
+        <w:r>
+          <w:t xml:space="preserve"> downloaded from S</w:t>
+        </w:r>
+      </w:ins>
+      <w:ins w:id="187" w:author="kyle O'Reilly" w:date="2026-10-21T22:08:00Z" w16du:dateUtc="2026-10-21T21:08:00Z">
+        <w:r>
+          <w:t>tooq</w:t>
+        </w:r>
+      </w:ins>
+      <w:ins w:id="188" w:author="kyle O'Reilly" w:date="2026-10-21T20:45:00Z" w16du:dateUtc="2026-10-21T19:45:00Z">
+        <w:r>
+          <w:t xml:space="preserve"> </w:t>
+        </w:r>
+        <w:r>
+          <w:t xml:space="preserve">will only be </w:t>
+        </w:r>
+      </w:ins>
+      <w:ins w:id="189" w:author="kyle O'Reilly" w:date="2026-10-21T22:08:00Z" w16du:dateUtc="2026-10-21T21:08:00Z">
+        <w:r>
+          <w:t>uploaded to</w:t>
+        </w:r>
+      </w:ins>
+      <w:ins w:id="190" w:author="kyle O'Reilly" w:date="2026-10-21T20:45:00Z" w16du:dateUtc="2026-10-21T19:45:00Z">
+        <w:r>
+          <w:t xml:space="preserve"> </w:t>
+        </w:r>
+      </w:ins>
+      <w:ins w:id="191" w:author="kyle O'Reilly" w:date="2026-10-21T20:48:00Z" w16du:dateUtc="2026-10-21T19:48:00Z">
+        <w:r>
+          <w:t>GitHub</w:t>
+        </w:r>
+      </w:ins>
+      <w:ins w:id="192" w:author="kyle O'Reilly" w:date="2026-10-21T20:45:00Z" w16du:dateUtc="2026-10-21T19:45:00Z">
+        <w:r>
+          <w:t xml:space="preserve"> </w:t>
+        </w:r>
+      </w:ins>
+      <w:ins w:id="193" w:author="kyle O'Reilly" w:date="2026-10-21T22:07:00Z" w16du:dateUtc="2026-10-21T21:07:00Z">
+        <w:r>
+          <w:t>if permitted by Stooq’s terms of service</w:t>
+        </w:r>
+      </w:ins>
+      <w:ins w:id="194" w:author="kyle O'Reilly" w:date="2026-10-21T20:45:00Z" w16du:dateUtc="2026-10-21T19:45:00Z">
+        <w:r>
+          <w:t xml:space="preserve">; otherwise, </w:t>
+        </w:r>
+      </w:ins>
+      <w:ins w:id="195" w:author="kyle O'Reilly" w:date="2026-10-21T22:07:00Z" w16du:dateUtc="2026-10-21T21:07:00Z">
+        <w:r>
+          <w:t xml:space="preserve">the </w:t>
+        </w:r>
+        <w:r>
+          <w:t xml:space="preserve">Phyton </w:t>
+        </w:r>
+      </w:ins>
+      <w:ins w:id="196" w:author="kyle O'Reilly" w:date="2026-10-21T20:45:00Z" w16du:dateUtc="2026-10-21T19:45:00Z">
+        <w:r>
+          <w:t xml:space="preserve">code and retrieval </w:t>
+        </w:r>
+      </w:ins>
+      <w:ins w:id="197" w:author="kyle O'Reilly" w:date="2026-10-21T20:46:00Z" w16du:dateUtc="2026-10-21T19:46:00Z">
+        <w:r>
+          <w:t xml:space="preserve">instructions will be provided. </w:t>
+        </w:r>
+      </w:ins>
+    </w:p>
+    <w:p>
+      <w:pPr>
+        <w:spacing w:line="360" w:lineRule="auto"/>
+        <w:jc w:val="both"/>
+        <w:rPr>
+          <w:ins w:id="198" w:author="kyle O'Reilly" w:date="2026-10-21T20:42:00Z" w16du:dateUtc="2026-10-21T19:42:00Z"/>
+        </w:rPr>
+        <w:pPrChange w:id="199" w:author="kyle O'Reilly" w:date="2026-10-21T23:07:00Z" w16du:dateUtc="2026-10-21T22:07:00Z">
+          <w:pPr/>
+        </w:pPrChange>
+      </w:pPr>
+      <w:ins w:id="200" w:author="kyle O'Reilly" w:date="2026-10-21T22:09:00Z" w16du:dateUtc="2026-10-21T21:09:00Z">
+        <w:r>
+          <w:lastRenderedPageBreak/>
+          <w:t>All results</w:t>
+        </w:r>
+        <w:r>
+          <w:t>,</w:t>
+        </w:r>
+      </w:ins>
+      <w:ins w:id="201" w:author="kyle O'Reilly" w:date="2026-10-21T20:47:00Z" w16du:dateUtc="2026-10-21T19:47:00Z">
+        <w:r>
+          <w:t xml:space="preserve"> including </w:t>
+        </w:r>
+      </w:ins>
+      <w:ins w:id="202" w:author="kyle O'Reilly" w:date="2026-10-21T22:10:00Z" w16du:dateUtc="2026-10-21T21:10:00Z">
+        <w:r>
+          <w:t>inaccurate</w:t>
+        </w:r>
+      </w:ins>
+      <w:ins w:id="203" w:author="kyle O'Reilly" w:date="2026-10-21T20:47:00Z" w16du:dateUtc="2026-10-21T19:47:00Z">
+        <w:r>
+          <w:t xml:space="preserve"> predictions, will be reported transparently. Th</w:t>
+        </w:r>
+      </w:ins>
+      <w:ins w:id="204" w:author="kyle O'Reilly" w:date="2026-10-21T22:10:00Z" w16du:dateUtc="2026-10-21T21:10:00Z">
+        <w:r>
+          <w:t>is Capstone Project</w:t>
+        </w:r>
+      </w:ins>
+      <w:ins w:id="205" w:author="kyle O'Reilly" w:date="2026-10-21T20:47:00Z" w16du:dateUtc="2026-10-21T19:47:00Z">
+        <w:r>
+          <w:t xml:space="preserve"> work is for academic purposes</w:t>
+        </w:r>
+      </w:ins>
+      <w:ins w:id="206" w:author="kyle O'Reilly" w:date="2026-10-21T22:10:00Z" w16du:dateUtc="2026-10-21T21:10:00Z">
+        <w:r>
+          <w:t xml:space="preserve"> only</w:t>
+        </w:r>
+      </w:ins>
+      <w:ins w:id="207" w:author="kyle O'Reilly" w:date="2026-10-21T20:47:00Z" w16du:dateUtc="2026-10-21T19:47:00Z">
+        <w:r>
+          <w:t xml:space="preserve"> and does constitute financial inv</w:t>
+        </w:r>
+      </w:ins>
+      <w:ins w:id="208" w:author="kyle O'Reilly" w:date="2026-10-21T20:48:00Z" w16du:dateUtc="2026-10-21T19:48:00Z">
+        <w:r>
+          <w:t>estment</w:t>
+        </w:r>
+      </w:ins>
+      <w:ins w:id="209" w:author="kyle O'Reilly" w:date="2026-10-21T20:47:00Z" w16du:dateUtc="2026-10-21T19:47:00Z">
+        <w:r>
+          <w:t xml:space="preserve"> advice.</w:t>
+        </w:r>
+      </w:ins>
+    </w:p>
+    <w:p>
+      <w:pPr>
+        <w:rPr>
+          <w:ins w:id="210" w:author="kyle O'Reilly" w:date="2026-10-21T20:42:00Z" w16du:dateUtc="2026-10-21T19:42:00Z"/>
+        </w:rPr>
+      </w:pPr>
+    </w:p>
+    <w:p>
+      <w:pPr>
+        <w:pStyle w:val="Heading1"/>
+        <w:rPr>
+          <w:ins w:id="211" w:author="kyle O'Reilly" w:date="2026-10-21T20:42:00Z" w16du:dateUtc="2026-10-21T19:42:00Z"/>
+        </w:rPr>
+        <w:pPrChange w:id="212" w:author="kyle O'Reilly" w:date="2026-10-21T20:42:00Z" w16du:dateUtc="2026-10-21T19:42:00Z">
+          <w:pPr/>
+        </w:pPrChange>
+      </w:pPr>
+      <w:bookmarkStart w:id="213" w:name="_Toc243507775"/>
+      <w:ins w:id="214" w:author="kyle O'Reilly" w:date="2026-10-21T20:42:00Z" w16du:dateUtc="2026-10-21T19:42:00Z">
         <w:r>
           <w:t>References</w:t>
         </w:r>
-        <w:bookmarkEnd w:id="154"/>
+        <w:bookmarkEnd w:id="213"/>
         <w:r>
           <w:t xml:space="preserve"> </w:t>
         </w:r>
@@ -3271,10 +3687,10 @@
     <w:p>
       <w:pPr>
         <w:rPr>
-          <w:ins w:id="156" w:author="kyle O'Reilly" w:date="2026-10-21T20:41:00Z" w16du:dateUtc="2026-10-21T19:41:00Z"/>
-        </w:rPr>
-      </w:pPr>
-      <w:ins w:id="157" w:author="kyle O'Reilly" w:date="2026-10-21T20:42:00Z" w16du:dateUtc="2026-10-21T19:42:00Z">
+          <w:ins w:id="215" w:author="kyle O'Reilly" w:date="2026-10-21T20:41:00Z" w16du:dateUtc="2026-10-21T19:41:00Z"/>
+        </w:rPr>
+      </w:pPr>
+      <w:ins w:id="216" w:author="kyle O'Reilly" w:date="2026-10-21T20:42:00Z" w16du:dateUtc="2026-10-21T19:42:00Z">
         <w:r>
           <w:t>?</w:t>
         </w:r>
@@ -3283,7 +3699,7 @@
     <w:p>
       <w:pPr>
         <w:rPr>
-          <w:ins w:id="158" w:author="kyle O'Reilly" w:date="2026-10-21T20:41:00Z" w16du:dateUtc="2026-10-21T19:41:00Z"/>
+          <w:ins w:id="217" w:author="kyle O'Reilly" w:date="2026-10-21T20:41:00Z" w16du:dateUtc="2026-10-21T19:41:00Z"/>
         </w:rPr>
       </w:pPr>
     </w:p>
@@ -4262,6 +4678,119 @@
       </w:rPr>
     </w:lvl>
   </w:abstractNum>
+  <w:abstractNum w:abstractNumId="6" w15:restartNumberingAfterBreak="0">
+    <w:nsid w:val="7B2D3B08"/>
+    <w:multiLevelType w:val="hybridMultilevel"/>
+    <w:tmpl w:val="CCDCAB7E"/>
+    <w:lvl w:ilvl="0" w:tplc="18090001">
+      <w:start w:val="1"/>
+      <w:numFmt w:val="bullet"/>
+      <w:lvlText w:val=""/>
+      <w:lvlJc w:val="left"/>
+      <w:pPr>
+        <w:ind w:left="720" w:hanging="360"/>
+      </w:pPr>
+      <w:rPr>
+        <w:rFonts w:ascii="Symbol" w:hAnsi="Symbol" w:hint="default"/>
+      </w:rPr>
+    </w:lvl>
+    <w:lvl w:ilvl="1" w:tplc="18090003" w:tentative="1">
+      <w:start w:val="1"/>
+      <w:numFmt w:val="bullet"/>
+      <w:lvlText w:val="o"/>
+      <w:lvlJc w:val="left"/>
+      <w:pPr>
+        <w:ind w:left="1440" w:hanging="360"/>
+      </w:pPr>
+      <w:rPr>
+        <w:rFonts w:ascii="Courier New" w:hAnsi="Courier New" w:cs="Courier New" w:hint="default"/>
+      </w:rPr>
+    </w:lvl>
+    <w:lvl w:ilvl="2" w:tplc="18090005" w:tentative="1">
+      <w:start w:val="1"/>
+      <w:numFmt w:val="bullet"/>
+      <w:lvlText w:val=""/>
+      <w:lvlJc w:val="left"/>
+      <w:pPr>
+        <w:ind w:left="2160" w:hanging="360"/>
+      </w:pPr>
+      <w:rPr>
+        <w:rFonts w:ascii="Wingdings" w:hAnsi="Wingdings" w:hint="default"/>
+      </w:rPr>
+    </w:lvl>
+    <w:lvl w:ilvl="3" w:tplc="18090001" w:tentative="1">
+      <w:start w:val="1"/>
+      <w:numFmt w:val="bullet"/>
+      <w:lvlText w:val=""/>
+      <w:lvlJc w:val="left"/>
+      <w:pPr>
+        <w:ind w:left="2880" w:hanging="360"/>
+      </w:pPr>
+      <w:rPr>
+        <w:rFonts w:ascii="Symbol" w:hAnsi="Symbol" w:hint="default"/>
+      </w:rPr>
+    </w:lvl>
+    <w:lvl w:ilvl="4" w:tplc="18090003" w:tentative="1">
+      <w:start w:val="1"/>
+      <w:numFmt w:val="bullet"/>
+      <w:lvlText w:val="o"/>
+      <w:lvlJc w:val="left"/>
+      <w:pPr>
+        <w:ind w:left="3600" w:hanging="360"/>
+      </w:pPr>
+      <w:rPr>
+        <w:rFonts w:ascii="Courier New" w:hAnsi="Courier New" w:cs="Courier New" w:hint="default"/>
+      </w:rPr>
+    </w:lvl>
+    <w:lvl w:ilvl="5" w:tplc="18090005" w:tentative="1">
+      <w:start w:val="1"/>
+      <w:numFmt w:val="bullet"/>
+      <w:lvlText w:val=""/>
+      <w:lvlJc w:val="left"/>
+      <w:pPr>
+        <w:ind w:left="4320" w:hanging="360"/>
+      </w:pPr>
+      <w:rPr>
+        <w:rFonts w:ascii="Wingdings" w:hAnsi="Wingdings" w:hint="default"/>
+      </w:rPr>
+    </w:lvl>
+    <w:lvl w:ilvl="6" w:tplc="18090001" w:tentative="1">
+      <w:start w:val="1"/>
+      <w:numFmt w:val="bullet"/>
+      <w:lvlText w:val=""/>
+      <w:lvlJc w:val="left"/>
+      <w:pPr>
+        <w:ind w:left="5040" w:hanging="360"/>
+      </w:pPr>
+      <w:rPr>
+        <w:rFonts w:ascii="Symbol" w:hAnsi="Symbol" w:hint="default"/>
+      </w:rPr>
+    </w:lvl>
+    <w:lvl w:ilvl="7" w:tplc="18090003" w:tentative="1">
+      <w:start w:val="1"/>
+      <w:numFmt w:val="bullet"/>
+      <w:lvlText w:val="o"/>
+      <w:lvlJc w:val="left"/>
+      <w:pPr>
+        <w:ind w:left="5760" w:hanging="360"/>
+      </w:pPr>
+      <w:rPr>
+        <w:rFonts w:ascii="Courier New" w:hAnsi="Courier New" w:cs="Courier New" w:hint="default"/>
+      </w:rPr>
+    </w:lvl>
+    <w:lvl w:ilvl="8" w:tplc="18090005" w:tentative="1">
+      <w:start w:val="1"/>
+      <w:numFmt w:val="bullet"/>
+      <w:lvlText w:val=""/>
+      <w:lvlJc w:val="left"/>
+      <w:pPr>
+        <w:ind w:left="6480" w:hanging="360"/>
+      </w:pPr>
+      <w:rPr>
+        <w:rFonts w:ascii="Wingdings" w:hAnsi="Wingdings" w:hint="default"/>
+      </w:rPr>
+    </w:lvl>
+  </w:abstractNum>
   <w:num w:numId="1" w16cid:durableId="243073450">
     <w:abstractNumId w:val="2"/>
   </w:num>
@@ -4279,6 +4808,9 @@
   </w:num>
   <w:num w:numId="6" w16cid:durableId="720325003">
     <w:abstractNumId w:val="3"/>
+  </w:num>
+  <w:num w:numId="7" w16cid:durableId="844242845">
+    <w:abstractNumId w:val="6"/>
   </w:num>
 </w:numbering>
 </file>
@@ -5700,6 +6232,33 @@
 </file>
 
 <file path=customXml/item1.xml><?xml version="1.0" encoding="utf-8"?>
+<go:gDocsCustomXmlDataStorage xmlns:go="http://customooxmlschemas.google.com/" xmlns:r="http://schemas.openxmlformats.org/officeDocument/2006/relationships" uri="GoogleDocsCustomDataVersion2">
+  <go:docsCustomData xmlns:go="http://customooxmlschemas.google.com/" roundtripDataSignature="AMtx7miehlgh2pzFvkmpnhkVaeODs3Wnuw==">CgMxLjAyCGguZ2pkZ3hzMgloLjMwajB6bGwyCWguMWZvYjl0ZTIJaC4zem55c2g3MgloLjJldDkycDAyDmgua2ZranMzcndsMmMxOAByITF6bEVRVXYyWkdtTjZWemdfYk5uaGpmb0x1c2hhYUo3dw==</go:docsCustomData>
+</go:gDocsCustomXmlDataStorage>
+</file>
+
+<file path=customXml/item2.xml><?xml version="1.0" encoding="utf-8"?>
+<p:properties xmlns:p="http://schemas.microsoft.com/office/2006/metadata/properties" xmlns:xsi="http://www.w3.org/2001/XMLSchema-instance" xmlns:pc="http://schemas.microsoft.com/office/infopath/2007/PartnerControls">
+  <documentManagement>
+    <_activity xmlns="b16a9495-4dfd-42d3-807b-98cb11f03b43" xsi:nil="true"/>
+  </documentManagement>
+</p:properties>
+</file>
+
+<file path=customXml/item3.xml><?xml version="1.0" encoding="utf-8"?>
+<?mso-contentType ?>
+<FormTemplates xmlns="http://schemas.microsoft.com/sharepoint/v3/contenttype/forms">
+  <Display>DocumentLibraryForm</Display>
+  <Edit>DocumentLibraryForm</Edit>
+  <New>DocumentLibraryForm</New>
+</FormTemplates>
+</file>
+
+<file path=customXml/item4.xml><?xml version="1.0" encoding="utf-8"?>
+<b:Sources xmlns:b="http://schemas.openxmlformats.org/officeDocument/2006/bibliography" xmlns="http://schemas.openxmlformats.org/officeDocument/2006/bibliography" SelectedStyle="\APASixthEditionOfficeOnline.xsl" StyleName="APA" Version="6"/>
+</file>
+
+<file path=customXml/item5.xml><?xml version="1.0" encoding="utf-8"?>
 <ct:contentTypeSchema xmlns:ct="http://schemas.microsoft.com/office/2006/metadata/contentType" xmlns:ma="http://schemas.microsoft.com/office/2006/metadata/properties/metaAttributes" ct:_="" ma:_="" ma:contentTypeName="Document" ma:contentTypeID="0x01010091CA7052A48FB44E8BAE44044031FC77" ma:contentTypeVersion="5" ma:contentTypeDescription="Create a new document." ma:contentTypeScope="" ma:versionID="72110da391d7bf7bbbd9879cda66318c">
   <xsd:schema xmlns:xsd="http://www.w3.org/2001/XMLSchema" xmlns:xs="http://www.w3.org/2001/XMLSchema" xmlns:p="http://schemas.microsoft.com/office/2006/metadata/properties" xmlns:ns3="b16a9495-4dfd-42d3-807b-98cb11f03b43" targetNamespace="http://schemas.microsoft.com/office/2006/metadata/properties" ma:root="true" ma:fieldsID="65d4c4ab10123b5e2192ffab3149626d" ns3:_="">
     <xsd:import namespace="b16a9495-4dfd-42d3-807b-98cb11f03b43"/>
@@ -5849,34 +6408,42 @@
 </ct:contentTypeSchema>
 </file>
 
-<file path=customXml/item2.xml><?xml version="1.0" encoding="utf-8"?>
-<go:gDocsCustomXmlDataStorage xmlns:go="http://customooxmlschemas.google.com/" xmlns:r="http://schemas.openxmlformats.org/officeDocument/2006/relationships" uri="GoogleDocsCustomDataVersion2">
-  <go:docsCustomData xmlns:go="http://customooxmlschemas.google.com/" roundtripDataSignature="AMtx7miehlgh2pzFvkmpnhkVaeODs3Wnuw==">CgMxLjAyCGguZ2pkZ3hzMgloLjMwajB6bGwyCWguMWZvYjl0ZTIJaC4zem55c2g3MgloLjJldDkycDAyDmgua2ZranMzcndsMmMxOAByITF6bEVRVXYyWkdtTjZWemdfYk5uaGpmb0x1c2hhYUo3dw==</go:docsCustomData>
-</go:gDocsCustomXmlDataStorage>
+<file path=customXml/itemProps1.xml><?xml version="1.0" encoding="utf-8"?>
+<ds:datastoreItem xmlns:ds="http://schemas.openxmlformats.org/officeDocument/2006/customXml" ds:itemID="{11111111-1234-1234-1234-123412341234}">
+  <ds:schemaRefs>
+    <ds:schemaRef ds:uri="http://customooxmlschemas.google.com/"/>
+    <ds:schemaRef ds:uri="http://schemas.openxmlformats.org/officeDocument/2006/relationships"/>
+  </ds:schemaRefs>
+</ds:datastoreItem>
 </file>
 
-<file path=customXml/item3.xml><?xml version="1.0" encoding="utf-8"?>
-<p:properties xmlns:p="http://schemas.microsoft.com/office/2006/metadata/properties" xmlns:xsi="http://www.w3.org/2001/XMLSchema-instance" xmlns:pc="http://schemas.microsoft.com/office/infopath/2007/PartnerControls">
-  <documentManagement>
-    <_activity xmlns="b16a9495-4dfd-42d3-807b-98cb11f03b43" xsi:nil="true"/>
-  </documentManagement>
-</p:properties>
+<file path=customXml/itemProps2.xml><?xml version="1.0" encoding="utf-8"?>
+<ds:datastoreItem xmlns:ds="http://schemas.openxmlformats.org/officeDocument/2006/customXml" ds:itemID="{D51EB97A-8C7A-4EE1-A3AD-E57FDBFA6BEE}">
+  <ds:schemaRefs>
+    <ds:schemaRef ds:uri="http://schemas.microsoft.com/office/2006/metadata/properties"/>
+    <ds:schemaRef ds:uri="http://schemas.microsoft.com/office/infopath/2007/PartnerControls"/>
+    <ds:schemaRef ds:uri="b16a9495-4dfd-42d3-807b-98cb11f03b43"/>
+  </ds:schemaRefs>
+</ds:datastoreItem>
 </file>
 
-<file path=customXml/item4.xml><?xml version="1.0" encoding="utf-8"?>
-<?mso-contentType ?>
-<FormTemplates xmlns="http://schemas.microsoft.com/sharepoint/v3/contenttype/forms">
-  <Display>DocumentLibraryForm</Display>
-  <Edit>DocumentLibraryForm</Edit>
-  <New>DocumentLibraryForm</New>
-</FormTemplates>
+<file path=customXml/itemProps3.xml><?xml version="1.0" encoding="utf-8"?>
+<ds:datastoreItem xmlns:ds="http://schemas.openxmlformats.org/officeDocument/2006/customXml" ds:itemID="{AD64260C-1345-4C21-A804-B9FBE7B91489}">
+  <ds:schemaRefs>
+    <ds:schemaRef ds:uri="http://schemas.microsoft.com/sharepoint/v3/contenttype/forms"/>
+  </ds:schemaRefs>
+</ds:datastoreItem>
 </file>
 
-<file path=customXml/item5.xml><?xml version="1.0" encoding="utf-8"?>
-<b:Sources xmlns:b="http://schemas.openxmlformats.org/officeDocument/2006/bibliography" xmlns="http://schemas.openxmlformats.org/officeDocument/2006/bibliography" SelectedStyle="\APASixthEditionOfficeOnline.xsl" StyleName="APA" Version="6"/>
+<file path=customXml/itemProps4.xml><?xml version="1.0" encoding="utf-8"?>
+<ds:datastoreItem xmlns:ds="http://schemas.openxmlformats.org/officeDocument/2006/customXml" ds:itemID="{A5C61161-19E4-4D42-A5DA-EC591AFE0A7D}">
+  <ds:schemaRefs>
+    <ds:schemaRef ds:uri="http://schemas.openxmlformats.org/officeDocument/2006/bibliography"/>
+  </ds:schemaRefs>
+</ds:datastoreItem>
 </file>
 
-<file path=customXml/itemProps1.xml><?xml version="1.0" encoding="utf-8"?>
+<file path=customXml/itemProps5.xml><?xml version="1.0" encoding="utf-8"?>
 <ds:datastoreItem xmlns:ds="http://schemas.openxmlformats.org/officeDocument/2006/customXml" ds:itemID="{1CD39011-2B34-4226-8638-59B13D86301D}">
   <ds:schemaRefs>
     <ds:schemaRef ds:uri="http://schemas.microsoft.com/office/2006/metadata/contentType"/>
@@ -5892,39 +6459,4 @@
     <ds:schemaRef ds:uri="http://schemas.microsoft.com/internal/obd"/>
   </ds:schemaRefs>
 </ds:datastoreItem>
-</file>
-
-<file path=customXml/itemProps2.xml><?xml version="1.0" encoding="utf-8"?>
-<ds:datastoreItem xmlns:ds="http://schemas.openxmlformats.org/officeDocument/2006/customXml" ds:itemID="{11111111-1234-1234-1234-123412341234}">
-  <ds:schemaRefs>
-    <ds:schemaRef ds:uri="http://customooxmlschemas.google.com/"/>
-    <ds:schemaRef ds:uri="http://schemas.openxmlformats.org/officeDocument/2006/relationships"/>
-  </ds:schemaRefs>
-</ds:datastoreItem>
-</file>
-
-<file path=customXml/itemProps3.xml><?xml version="1.0" encoding="utf-8"?>
-<ds:datastoreItem xmlns:ds="http://schemas.openxmlformats.org/officeDocument/2006/customXml" ds:itemID="{D51EB97A-8C7A-4EE1-A3AD-E57FDBFA6BEE}">
-  <ds:schemaRefs>
-    <ds:schemaRef ds:uri="http://schemas.microsoft.com/office/2006/metadata/properties"/>
-    <ds:schemaRef ds:uri="http://schemas.microsoft.com/office/infopath/2007/PartnerControls"/>
-    <ds:schemaRef ds:uri="b16a9495-4dfd-42d3-807b-98cb11f03b43"/>
-  </ds:schemaRefs>
-</ds:datastoreItem>
-</file>
-
-<file path=customXml/itemProps4.xml><?xml version="1.0" encoding="utf-8"?>
-<ds:datastoreItem xmlns:ds="http://schemas.openxmlformats.org/officeDocument/2006/customXml" ds:itemID="{AD64260C-1345-4C21-A804-B9FBE7B91489}">
-  <ds:schemaRefs>
-    <ds:schemaRef ds:uri="http://schemas.microsoft.com/sharepoint/v3/contenttype/forms"/>
-  </ds:schemaRefs>
-</ds:datastoreItem>
-</file>
-
-<file path=customXml/itemProps5.xml><?xml version="1.0" encoding="utf-8"?>
-<ds:datastoreItem xmlns:ds="http://schemas.openxmlformats.org/officeDocument/2006/customXml" ds:itemID="{A5C61161-19E4-4D42-A5DA-EC591AFE0A7D}">
-  <ds:schemaRefs>
-    <ds:schemaRef ds:uri="http://schemas.openxmlformats.org/officeDocument/2006/bibliography"/>
-  </ds:schemaRefs>
-</ds:datastoreItem>
 </file>
</xml_diff>

<commit_message>
Updated Data Sources and References sections
</commit_message>
<xml_diff>
--- a/HDSDAB - Strategic Thinking - Capstone Project.docx
+++ b/HDSDAB - Strategic Thinking - Capstone Project.docx
@@ -499,7 +499,6 @@
           <w:szCs w:val="32"/>
         </w:rPr>
       </w:pPr>
-      <w:proofErr w:type="spellStart"/>
       <w:ins w:id="4" w:author="kyle O'Reilly" w:date="2026-10-20T21:24:00Z" w16du:dateUtc="2026-10-20T20:24:00Z">
         <w:r>
           <w:rPr>
@@ -508,17 +507,7 @@
             <w:sz w:val="32"/>
             <w:szCs w:val="32"/>
           </w:rPr>
-          <w:t>Taufique</w:t>
-        </w:r>
-        <w:proofErr w:type="spellEnd"/>
-        <w:r>
-          <w:rPr>
-            <w:i/>
-            <w:color w:val="EE0000"/>
-            <w:sz w:val="32"/>
-            <w:szCs w:val="32"/>
-          </w:rPr>
-          <w:t xml:space="preserve"> Ahmed</w:t>
+          <w:t>Taufique Ahmed</w:t>
         </w:r>
       </w:ins>
     </w:p>
@@ -651,7 +640,6 @@
           <w:szCs w:val="32"/>
         </w:rPr>
       </w:pPr>
-      <w:proofErr w:type="spellStart"/>
       <w:r>
         <w:rPr>
           <w:i/>
@@ -660,17 +648,7 @@
           <w:szCs w:val="32"/>
         </w:rPr>
         <w:lastRenderedPageBreak/>
-        <w:t>Github</w:t>
-      </w:r>
-      <w:proofErr w:type="spellEnd"/>
-      <w:r>
-        <w:rPr>
-          <w:i/>
-          <w:color w:val="156082"/>
-          <w:sz w:val="32"/>
-          <w:szCs w:val="32"/>
-        </w:rPr>
-        <w:t xml:space="preserve"> Repository </w:t>
+        <w:t xml:space="preserve">Github Repository </w:t>
       </w:r>
     </w:p>
     <w:p>
@@ -694,22 +672,9 @@
             <w:sz w:val="32"/>
             <w:szCs w:val="32"/>
           </w:rPr>
-          <w:t>https://github.com/sba26104-KOR/HDSDAB---Strategic-Thinking---Capstone-</w:t>
-        </w:r>
-        <w:proofErr w:type="spellStart"/>
-        <w:r>
-          <w:rPr>
-            <w:bCs/>
-            <w:i/>
-            <w:iCs/>
-            <w:color w:val="EE0000"/>
-            <w:sz w:val="32"/>
-            <w:szCs w:val="32"/>
-          </w:rPr>
-          <w:t>Project.git</w:t>
-        </w:r>
-      </w:ins>
-      <w:proofErr w:type="spellEnd"/>
+          <w:t>https://github.com/sba26104-KOR/HDSDAB---Strategic-Thinking---Capstone-Project.git</w:t>
+        </w:r>
+      </w:ins>
     </w:p>
     <w:p>
       <w:pPr>
@@ -825,23 +790,7 @@
                                 <w:color w:val="000000"/>
                                 <w:sz w:val="28"/>
                               </w:rPr>
-                              <w:t xml:space="preserve">By submitting this assessment, I confirm that I have read the CCT policy on academic misconduct and understand the implications of submitting work that is not my own or does not appropriately reference material </w:t>
-                            </w:r>
-                            <w:proofErr w:type="gramStart"/>
-                            <w:r>
-                              <w:rPr>
-                                <w:color w:val="000000"/>
-                                <w:sz w:val="28"/>
-                              </w:rPr>
-                              <w:t>taken</w:t>
-                            </w:r>
-                            <w:proofErr w:type="gramEnd"/>
-                            <w:r>
-                              <w:rPr>
-                                <w:color w:val="000000"/>
-                                <w:sz w:val="28"/>
-                              </w:rPr>
-                              <w:t xml:space="preserve"> from a third party or other source. </w:t>
+                              <w:t xml:space="preserve">By submitting this assessment, I confirm that I have read the CCT policy on academic misconduct and understand the implications of submitting work that is not my own or does not appropriately reference material taken from a third party or other source. </w:t>
                             </w:r>
                           </w:p>
                           <w:p>
@@ -935,23 +884,7 @@
                           <w:color w:val="000000"/>
                           <w:sz w:val="28"/>
                         </w:rPr>
-                        <w:t xml:space="preserve">By submitting this assessment, I confirm that I have read the CCT policy on academic misconduct and understand the implications of submitting work that is not my own or does not appropriately reference material </w:t>
-                      </w:r>
-                      <w:proofErr w:type="gramStart"/>
-                      <w:r>
-                        <w:rPr>
-                          <w:color w:val="000000"/>
-                          <w:sz w:val="28"/>
-                        </w:rPr>
-                        <w:t>taken</w:t>
-                      </w:r>
-                      <w:proofErr w:type="gramEnd"/>
-                      <w:r>
-                        <w:rPr>
-                          <w:color w:val="000000"/>
-                          <w:sz w:val="28"/>
-                        </w:rPr>
-                        <w:t xml:space="preserve"> from a third party or other source. </w:t>
+                        <w:t xml:space="preserve">By submitting this assessment, I confirm that I have read the CCT policy on academic misconduct and understand the implications of submitting work that is not my own or does not appropriately reference material taken from a third party or other source. </w:t>
                       </w:r>
                     </w:p>
                     <w:p>
@@ -2945,10 +2878,35 @@
       </w:ins>
       <w:ins w:id="95" w:author="kyle O'Reilly" w:date="2026-10-21T23:11:00Z" w16du:dateUtc="2026-10-21T22:11:00Z">
         <w:r>
-          <w:t xml:space="preserve">historical cut-off stock date from the JPM, KO and </w:t>
+          <w:t>historical cut-off stock date from the JPM</w:t>
+        </w:r>
+      </w:ins>
+      <w:ins w:id="96" w:author="kyle O'Reilly" w:date="2026-10-22T00:04:00Z" w16du:dateUtc="2026-10-21T23:04:00Z">
+        <w:r>
+          <w:t>.US</w:t>
+        </w:r>
+      </w:ins>
+      <w:ins w:id="97" w:author="kyle O'Reilly" w:date="2026-10-21T23:11:00Z" w16du:dateUtc="2026-10-21T22:11:00Z">
+        <w:r>
+          <w:t>, KO</w:t>
+        </w:r>
+      </w:ins>
+      <w:ins w:id="98" w:author="kyle O'Reilly" w:date="2026-10-22T00:04:00Z" w16du:dateUtc="2026-10-21T23:04:00Z">
+        <w:r>
+          <w:t>.US</w:t>
+        </w:r>
+      </w:ins>
+      <w:ins w:id="99" w:author="kyle O'Reilly" w:date="2026-10-21T23:11:00Z" w16du:dateUtc="2026-10-21T22:11:00Z">
+        <w:r>
+          <w:t xml:space="preserve"> and </w:t>
         </w:r>
         <w:r>
           <w:t>INTC.</w:t>
+        </w:r>
+      </w:ins>
+      <w:ins w:id="100" w:author="kyle O'Reilly" w:date="2026-10-22T00:04:00Z" w16du:dateUtc="2026-10-21T23:04:00Z">
+        <w:r>
+          <w:t>US.</w:t>
         </w:r>
       </w:ins>
     </w:p>
@@ -2957,25 +2915,25 @@
         <w:spacing w:line="360" w:lineRule="auto"/>
         <w:jc w:val="both"/>
         <w:rPr>
-          <w:ins w:id="96" w:author="kyle O'Reilly" w:date="2026-10-21T23:11:00Z" w16du:dateUtc="2026-10-21T22:11:00Z"/>
+          <w:ins w:id="101" w:author="kyle O'Reilly" w:date="2026-10-21T23:11:00Z" w16du:dateUtc="2026-10-21T22:11:00Z"/>
           <w:b/>
           <w:bCs/>
-          <w:rPrChange w:id="97" w:author="kyle O'Reilly" w:date="2026-10-21T23:16:00Z" w16du:dateUtc="2026-10-21T22:16:00Z">
+          <w:rPrChange w:id="102" w:author="kyle O'Reilly" w:date="2026-10-21T23:16:00Z" w16du:dateUtc="2026-10-21T22:16:00Z">
             <w:rPr>
-              <w:ins w:id="98" w:author="kyle O'Reilly" w:date="2026-10-21T23:11:00Z" w16du:dateUtc="2026-10-21T22:11:00Z"/>
+              <w:ins w:id="103" w:author="kyle O'Reilly" w:date="2026-10-21T23:11:00Z" w16du:dateUtc="2026-10-21T22:11:00Z"/>
             </w:rPr>
           </w:rPrChange>
         </w:rPr>
-        <w:pPrChange w:id="99" w:author="kyle O'Reilly" w:date="2026-10-21T23:18:00Z" w16du:dateUtc="2026-10-21T22:18:00Z">
+        <w:pPrChange w:id="104" w:author="kyle O'Reilly" w:date="2026-10-21T23:18:00Z" w16du:dateUtc="2026-10-21T22:18:00Z">
           <w:pPr/>
         </w:pPrChange>
       </w:pPr>
-      <w:ins w:id="100" w:author="kyle O'Reilly" w:date="2026-10-21T23:11:00Z" w16du:dateUtc="2026-10-21T22:11:00Z">
+      <w:ins w:id="105" w:author="kyle O'Reilly" w:date="2026-10-21T23:11:00Z" w16du:dateUtc="2026-10-21T22:11:00Z">
         <w:r>
           <w:rPr>
             <w:b/>
             <w:bCs/>
-            <w:rPrChange w:id="101" w:author="kyle O'Reilly" w:date="2026-10-21T23:16:00Z" w16du:dateUtc="2026-10-21T22:16:00Z">
+            <w:rPrChange w:id="106" w:author="kyle O'Reilly" w:date="2026-10-21T23:16:00Z" w16du:dateUtc="2026-10-21T22:16:00Z">
               <w:rPr/>
             </w:rPrChange>
           </w:rPr>
@@ -2993,48 +2951,7 @@
         <w:spacing w:line="360" w:lineRule="auto"/>
         <w:jc w:val="both"/>
         <w:rPr>
-          <w:ins w:id="102" w:author="kyle O'Reilly" w:date="2026-10-21T23:13:00Z" w16du:dateUtc="2026-10-21T22:13:00Z"/>
-        </w:rPr>
-        <w:pPrChange w:id="103" w:author="kyle O'Reilly" w:date="2026-10-21T23:18:00Z" w16du:dateUtc="2026-10-21T22:18:00Z">
-          <w:pPr>
-            <w:pStyle w:val="ListParagraph"/>
-            <w:numPr>
-              <w:numId w:val="7"/>
-            </w:numPr>
-            <w:ind w:hanging="360"/>
-          </w:pPr>
-        </w:pPrChange>
-      </w:pPr>
-      <w:ins w:id="104" w:author="kyle O'Reilly" w:date="2026-10-21T23:11:00Z" w16du:dateUtc="2026-10-21T22:11:00Z">
-        <w:r>
-          <w:t>S</w:t>
-        </w:r>
-      </w:ins>
-      <w:ins w:id="105" w:author="kyle O'Reilly" w:date="2026-10-21T23:12:00Z" w16du:dateUtc="2026-10-21T22:12:00Z">
-        <w:r>
-          <w:t>elect JPM,</w:t>
-        </w:r>
-        <w:r>
-          <w:t xml:space="preserve"> KO and INTC, and examine comparable published volatility information to justify their proposed contra</w:t>
-        </w:r>
-      </w:ins>
-      <w:ins w:id="106" w:author="kyle O'Reilly" w:date="2026-10-21T23:13:00Z" w16du:dateUtc="2026-10-21T22:13:00Z">
-        <w:r>
-          <w:t>sting volatility levels.</w:t>
-        </w:r>
-      </w:ins>
-    </w:p>
-    <w:p>
-      <w:pPr>
-        <w:pStyle w:val="ListParagraph"/>
-        <w:numPr>
-          <w:ilvl w:val="0"/>
-          <w:numId w:val="7"/>
-        </w:numPr>
-        <w:spacing w:line="360" w:lineRule="auto"/>
-        <w:jc w:val="both"/>
-        <w:rPr>
-          <w:ins w:id="107" w:author="kyle O'Reilly" w:date="2026-10-21T23:14:00Z" w16du:dateUtc="2026-10-21T22:14:00Z"/>
+          <w:ins w:id="107" w:author="kyle O'Reilly" w:date="2026-10-21T23:13:00Z" w16du:dateUtc="2026-10-21T22:13:00Z"/>
         </w:rPr>
         <w:pPrChange w:id="108" w:author="kyle O'Reilly" w:date="2026-10-21T23:18:00Z" w16du:dateUtc="2026-10-21T22:18:00Z">
           <w:pPr>
@@ -3046,17 +2963,62 @@
           </w:pPr>
         </w:pPrChange>
       </w:pPr>
-      <w:ins w:id="109" w:author="kyle O'Reilly" w:date="2026-10-21T23:13:00Z" w16du:dateUtc="2026-10-21T22:13:00Z">
-        <w:r>
-          <w:t xml:space="preserve">Collect, clean and analyse historical stock data </w:t>
-        </w:r>
-        <w:r>
-          <w:t>from Stooq, and prepare simple historical</w:t>
-        </w:r>
-      </w:ins>
-      <w:ins w:id="110" w:author="kyle O'Reilly" w:date="2026-10-21T23:14:00Z" w16du:dateUtc="2026-10-21T22:14:00Z">
-        <w:r>
-          <w:t xml:space="preserve"> price features for the forecasting models.</w:t>
+      <w:ins w:id="109" w:author="kyle O'Reilly" w:date="2026-10-21T23:11:00Z" w16du:dateUtc="2026-10-21T22:11:00Z">
+        <w:r>
+          <w:t>S</w:t>
+        </w:r>
+      </w:ins>
+      <w:ins w:id="110" w:author="kyle O'Reilly" w:date="2026-10-21T23:12:00Z" w16du:dateUtc="2026-10-21T22:12:00Z">
+        <w:r>
+          <w:t>elect JPM</w:t>
+        </w:r>
+      </w:ins>
+      <w:ins w:id="111" w:author="kyle O'Reilly" w:date="2026-10-21T23:57:00Z" w16du:dateUtc="2026-10-21T22:57:00Z">
+        <w:r>
+          <w:t>.US</w:t>
+        </w:r>
+      </w:ins>
+      <w:ins w:id="112" w:author="kyle O'Reilly" w:date="2026-10-21T23:12:00Z" w16du:dateUtc="2026-10-21T22:12:00Z">
+        <w:r>
+          <w:t>,</w:t>
+        </w:r>
+        <w:r>
+          <w:t xml:space="preserve"> KO</w:t>
+        </w:r>
+      </w:ins>
+      <w:ins w:id="113" w:author="kyle O'Reilly" w:date="2026-10-21T23:57:00Z" w16du:dateUtc="2026-10-21T22:57:00Z">
+        <w:r>
+          <w:t>.US</w:t>
+        </w:r>
+      </w:ins>
+      <w:ins w:id="114" w:author="kyle O'Reilly" w:date="2026-10-21T23:12:00Z" w16du:dateUtc="2026-10-21T22:12:00Z">
+        <w:r>
+          <w:t xml:space="preserve"> and INTC</w:t>
+        </w:r>
+      </w:ins>
+      <w:ins w:id="115" w:author="kyle O'Reilly" w:date="2026-10-21T23:57:00Z" w16du:dateUtc="2026-10-21T22:57:00Z">
+        <w:r>
+          <w:t>.US</w:t>
+        </w:r>
+      </w:ins>
+      <w:ins w:id="116" w:author="kyle O'Reilly" w:date="2026-10-21T23:12:00Z" w16du:dateUtc="2026-10-21T22:12:00Z">
+        <w:r>
+          <w:t>, and examine comparable published</w:t>
+        </w:r>
+      </w:ins>
+      <w:ins w:id="117" w:author="kyle O'Reilly" w:date="2026-10-21T23:58:00Z" w16du:dateUtc="2026-10-21T22:58:00Z">
+        <w:r>
+          <w:t xml:space="preserve"> Trading 212</w:t>
+        </w:r>
+      </w:ins>
+      <w:ins w:id="118" w:author="kyle O'Reilly" w:date="2026-10-21T23:12:00Z" w16du:dateUtc="2026-10-21T22:12:00Z">
+        <w:r>
+          <w:t xml:space="preserve"> volatility information to justify their proposed contra</w:t>
+        </w:r>
+      </w:ins>
+      <w:ins w:id="119" w:author="kyle O'Reilly" w:date="2026-10-21T23:13:00Z" w16du:dateUtc="2026-10-21T22:13:00Z">
+        <w:r>
+          <w:t>sting volatility levels.</w:t>
         </w:r>
       </w:ins>
     </w:p>
@@ -3070,9 +3032,9 @@
         <w:spacing w:line="360" w:lineRule="auto"/>
         <w:jc w:val="both"/>
         <w:rPr>
-          <w:ins w:id="111" w:author="kyle O'Reilly" w:date="2026-10-21T23:14:00Z" w16du:dateUtc="2026-10-21T22:14:00Z"/>
-        </w:rPr>
-        <w:pPrChange w:id="112" w:author="kyle O'Reilly" w:date="2026-10-21T23:18:00Z" w16du:dateUtc="2026-10-21T22:18:00Z">
+          <w:ins w:id="120" w:author="kyle O'Reilly" w:date="2026-10-21T23:14:00Z" w16du:dateUtc="2026-10-21T22:14:00Z"/>
+        </w:rPr>
+        <w:pPrChange w:id="121" w:author="kyle O'Reilly" w:date="2026-10-21T23:18:00Z" w16du:dateUtc="2026-10-21T22:18:00Z">
           <w:pPr>
             <w:pStyle w:val="ListParagraph"/>
             <w:numPr>
@@ -3082,9 +3044,17 @@
           </w:pPr>
         </w:pPrChange>
       </w:pPr>
-      <w:ins w:id="113" w:author="kyle O'Reilly" w:date="2026-10-21T23:14:00Z" w16du:dateUtc="2026-10-21T22:14:00Z">
-        <w:r>
-          <w:t>Develop Linear Regression and Random Forest models and establish a naïve baseline for each selected stock.</w:t>
+      <w:ins w:id="122" w:author="kyle O'Reilly" w:date="2026-10-21T23:13:00Z" w16du:dateUtc="2026-10-21T22:13:00Z">
+        <w:r>
+          <w:t xml:space="preserve">Collect, clean and analyse historical stock data </w:t>
+        </w:r>
+        <w:r>
+          <w:t>from Stooq, and prepare simple historical</w:t>
+        </w:r>
+      </w:ins>
+      <w:ins w:id="123" w:author="kyle O'Reilly" w:date="2026-10-21T23:14:00Z" w16du:dateUtc="2026-10-21T22:14:00Z">
+        <w:r>
+          <w:t xml:space="preserve"> price features for the forecasting models.</w:t>
         </w:r>
       </w:ins>
     </w:p>
@@ -3098,9 +3068,9 @@
         <w:spacing w:line="360" w:lineRule="auto"/>
         <w:jc w:val="both"/>
         <w:rPr>
-          <w:ins w:id="114" w:author="kyle O'Reilly" w:date="2026-10-21T23:15:00Z" w16du:dateUtc="2026-10-21T22:15:00Z"/>
-        </w:rPr>
-        <w:pPrChange w:id="115" w:author="kyle O'Reilly" w:date="2026-10-21T23:18:00Z" w16du:dateUtc="2026-10-21T22:18:00Z">
+          <w:ins w:id="124" w:author="kyle O'Reilly" w:date="2026-10-21T23:14:00Z" w16du:dateUtc="2026-10-21T22:14:00Z"/>
+        </w:rPr>
+        <w:pPrChange w:id="125" w:author="kyle O'Reilly" w:date="2026-10-21T23:18:00Z" w16du:dateUtc="2026-10-21T22:18:00Z">
           <w:pPr>
             <w:pStyle w:val="ListParagraph"/>
             <w:numPr>
@@ -3110,14 +3080,9 @@
           </w:pPr>
         </w:pPrChange>
       </w:pPr>
-      <w:ins w:id="116" w:author="kyle O'Reilly" w:date="2026-10-21T23:14:00Z" w16du:dateUtc="2026-10-21T22:14:00Z">
-        <w:r>
-          <w:t>Generate nine predic</w:t>
-        </w:r>
-      </w:ins>
-      <w:ins w:id="117" w:author="kyle O'Reilly" w:date="2026-10-21T23:15:00Z" w16du:dateUtc="2026-10-21T22:15:00Z">
-        <w:r>
-          <w:t>tions and compare them with three actual closing stock prices twenty days after the historical cut-off stock date.</w:t>
+      <w:ins w:id="126" w:author="kyle O'Reilly" w:date="2026-10-21T23:14:00Z" w16du:dateUtc="2026-10-21T22:14:00Z">
+        <w:r>
+          <w:t>Develop Linear Regression and Random Forest models and establish a naïve baseline for each selected stock.</w:t>
         </w:r>
       </w:ins>
     </w:p>
@@ -3131,9 +3096,9 @@
         <w:spacing w:line="360" w:lineRule="auto"/>
         <w:jc w:val="both"/>
         <w:rPr>
-          <w:ins w:id="118" w:author="kyle O'Reilly" w:date="2026-10-21T23:16:00Z" w16du:dateUtc="2026-10-21T22:16:00Z"/>
-        </w:rPr>
-        <w:pPrChange w:id="119" w:author="kyle O'Reilly" w:date="2026-10-21T23:18:00Z" w16du:dateUtc="2026-10-21T22:18:00Z">
+          <w:ins w:id="127" w:author="kyle O'Reilly" w:date="2026-10-21T23:15:00Z" w16du:dateUtc="2026-10-21T22:15:00Z"/>
+        </w:rPr>
+        <w:pPrChange w:id="128" w:author="kyle O'Reilly" w:date="2026-10-21T23:18:00Z" w16du:dateUtc="2026-10-21T22:18:00Z">
           <w:pPr>
             <w:pStyle w:val="ListParagraph"/>
             <w:numPr>
@@ -3143,44 +3108,77 @@
           </w:pPr>
         </w:pPrChange>
       </w:pPr>
-      <w:ins w:id="120" w:author="kyle O'Reilly" w:date="2026-10-21T23:15:00Z" w16du:dateUtc="2026-10-21T22:15:00Z">
-        <w:r>
-          <w:t>Calculate individual prediction errors</w:t>
-        </w:r>
-        <w:r>
-          <w:t>, compare approaches and discuss observed difference between the s</w:t>
-        </w:r>
-      </w:ins>
-      <w:ins w:id="121" w:author="kyle O'Reilly" w:date="2026-10-21T23:16:00Z" w16du:dateUtc="2026-10-21T22:16:00Z">
-        <w:r>
-          <w:t>elected stocks.</w:t>
-        </w:r>
-      </w:ins>
-    </w:p>
-    <w:p>
-      <w:pPr>
+      <w:ins w:id="129" w:author="kyle O'Reilly" w:date="2026-10-21T23:14:00Z" w16du:dateUtc="2026-10-21T22:14:00Z">
+        <w:r>
+          <w:t>Generate nine predic</w:t>
+        </w:r>
+      </w:ins>
+      <w:ins w:id="130" w:author="kyle O'Reilly" w:date="2026-10-21T23:15:00Z" w16du:dateUtc="2026-10-21T22:15:00Z">
+        <w:r>
+          <w:t>tions and compare them with three actual closing stock prices twenty days after the historical cut-off stock date.</w:t>
+        </w:r>
+      </w:ins>
+    </w:p>
+    <w:p>
+      <w:pPr>
+        <w:pStyle w:val="ListParagraph"/>
+        <w:numPr>
+          <w:ilvl w:val="0"/>
+          <w:numId w:val="7"/>
+        </w:numPr>
         <w:spacing w:line="360" w:lineRule="auto"/>
         <w:jc w:val="both"/>
         <w:rPr>
-          <w:ins w:id="122" w:author="kyle O'Reilly" w:date="2026-10-21T23:16:00Z" w16du:dateUtc="2026-10-21T22:16:00Z"/>
+          <w:ins w:id="131" w:author="kyle O'Reilly" w:date="2026-10-21T23:16:00Z" w16du:dateUtc="2026-10-21T22:16:00Z"/>
+        </w:rPr>
+        <w:pPrChange w:id="132" w:author="kyle O'Reilly" w:date="2026-10-21T23:18:00Z" w16du:dateUtc="2026-10-21T22:18:00Z">
+          <w:pPr>
+            <w:pStyle w:val="ListParagraph"/>
+            <w:numPr>
+              <w:numId w:val="7"/>
+            </w:numPr>
+            <w:ind w:hanging="360"/>
+          </w:pPr>
+        </w:pPrChange>
+      </w:pPr>
+      <w:ins w:id="133" w:author="kyle O'Reilly" w:date="2026-10-21T23:15:00Z" w16du:dateUtc="2026-10-21T22:15:00Z">
+        <w:r>
+          <w:t>Calculate individual prediction errors</w:t>
+        </w:r>
+        <w:r>
+          <w:t>, compare approaches and discuss observed difference between the s</w:t>
+        </w:r>
+      </w:ins>
+      <w:ins w:id="134" w:author="kyle O'Reilly" w:date="2026-10-21T23:16:00Z" w16du:dateUtc="2026-10-21T22:16:00Z">
+        <w:r>
+          <w:t>elected stocks.</w:t>
+        </w:r>
+      </w:ins>
+    </w:p>
+    <w:p>
+      <w:pPr>
+        <w:spacing w:line="360" w:lineRule="auto"/>
+        <w:jc w:val="both"/>
+        <w:rPr>
+          <w:ins w:id="135" w:author="kyle O'Reilly" w:date="2026-10-21T23:16:00Z" w16du:dateUtc="2026-10-21T22:16:00Z"/>
           <w:b/>
           <w:bCs/>
-          <w:rPrChange w:id="123" w:author="kyle O'Reilly" w:date="2026-10-21T23:16:00Z" w16du:dateUtc="2026-10-21T22:16:00Z">
+          <w:rPrChange w:id="136" w:author="kyle O'Reilly" w:date="2026-10-21T23:16:00Z" w16du:dateUtc="2026-10-21T22:16:00Z">
             <w:rPr>
-              <w:ins w:id="124" w:author="kyle O'Reilly" w:date="2026-10-21T23:16:00Z" w16du:dateUtc="2026-10-21T22:16:00Z"/>
+              <w:ins w:id="137" w:author="kyle O'Reilly" w:date="2026-10-21T23:16:00Z" w16du:dateUtc="2026-10-21T22:16:00Z"/>
             </w:rPr>
           </w:rPrChange>
         </w:rPr>
-        <w:pPrChange w:id="125" w:author="kyle O'Reilly" w:date="2026-10-21T23:18:00Z" w16du:dateUtc="2026-10-21T22:18:00Z">
+        <w:pPrChange w:id="138" w:author="kyle O'Reilly" w:date="2026-10-21T23:18:00Z" w16du:dateUtc="2026-10-21T22:18:00Z">
           <w:pPr/>
         </w:pPrChange>
       </w:pPr>
-      <w:ins w:id="126" w:author="kyle O'Reilly" w:date="2026-10-21T23:16:00Z" w16du:dateUtc="2026-10-21T22:16:00Z">
+      <w:ins w:id="139" w:author="kyle O'Reilly" w:date="2026-10-21T23:16:00Z" w16du:dateUtc="2026-10-21T22:16:00Z">
         <w:r>
           <w:rPr>
             <w:b/>
             <w:bCs/>
-            <w:rPrChange w:id="127" w:author="kyle O'Reilly" w:date="2026-10-21T23:16:00Z" w16du:dateUtc="2026-10-21T22:16:00Z">
+            <w:rPrChange w:id="140" w:author="kyle O'Reilly" w:date="2026-10-21T23:16:00Z" w16du:dateUtc="2026-10-21T22:16:00Z">
               <w:rPr/>
             </w:rPrChange>
           </w:rPr>
@@ -3193,13 +3191,13 @@
         <w:spacing w:line="360" w:lineRule="auto"/>
         <w:jc w:val="both"/>
         <w:rPr>
-          <w:ins w:id="128" w:author="kyle O'Reilly" w:date="2026-10-21T20:39:00Z" w16du:dateUtc="2026-10-21T19:39:00Z"/>
-        </w:rPr>
-        <w:pPrChange w:id="129" w:author="kyle O'Reilly" w:date="2026-10-21T23:18:00Z" w16du:dateUtc="2026-10-21T22:18:00Z">
+          <w:ins w:id="141" w:author="kyle O'Reilly" w:date="2026-10-21T20:39:00Z" w16du:dateUtc="2026-10-21T19:39:00Z"/>
+        </w:rPr>
+        <w:pPrChange w:id="142" w:author="kyle O'Reilly" w:date="2026-10-21T23:18:00Z" w16du:dateUtc="2026-10-21T22:18:00Z">
           <w:pPr/>
         </w:pPrChange>
       </w:pPr>
-      <w:ins w:id="130" w:author="kyle O'Reilly" w:date="2026-10-21T23:16:00Z" w16du:dateUtc="2026-10-21T22:16:00Z">
+      <w:ins w:id="143" w:author="kyle O'Reilly" w:date="2026-10-21T23:16:00Z" w16du:dateUtc="2026-10-21T22:16:00Z">
         <w:r>
           <w:lastRenderedPageBreak/>
           <w:t xml:space="preserve">The stock with the highest documented </w:t>
@@ -3208,7 +3206,7 @@
           <w:t>historical volatility will have the highest</w:t>
         </w:r>
       </w:ins>
-      <w:ins w:id="131" w:author="kyle O'Reilly" w:date="2026-10-21T23:17:00Z" w16du:dateUtc="2026-10-21T22:17:00Z">
+      <w:ins w:id="144" w:author="kyle O'Reilly" w:date="2026-10-21T23:17:00Z" w16du:dateUtc="2026-10-21T22:17:00Z">
         <w:r>
           <w:t xml:space="preserve"> average absolute percentage forecasting error across the three forecasting methods. This explo</w:t>
         </w:r>
@@ -3220,7 +3218,7 @@
     <w:p>
       <w:pPr>
         <w:rPr>
-          <w:ins w:id="132" w:author="kyle O'Reilly" w:date="2026-10-21T20:40:00Z" w16du:dateUtc="2026-10-21T19:40:00Z"/>
+          <w:ins w:id="145" w:author="kyle O'Reilly" w:date="2026-10-21T20:40:00Z" w16du:dateUtc="2026-10-21T19:40:00Z"/>
         </w:rPr>
       </w:pPr>
     </w:p>
@@ -3228,27 +3226,27 @@
       <w:pPr>
         <w:pStyle w:val="Heading1"/>
         <w:rPr>
-          <w:ins w:id="133" w:author="kyle O'Reilly" w:date="2026-10-21T20:40:00Z" w16du:dateUtc="2026-10-21T19:40:00Z"/>
-        </w:rPr>
-        <w:pPrChange w:id="134" w:author="kyle O'Reilly" w:date="2026-10-21T20:41:00Z" w16du:dateUtc="2026-10-21T19:41:00Z">
+          <w:ins w:id="146" w:author="kyle O'Reilly" w:date="2026-10-21T20:40:00Z" w16du:dateUtc="2026-10-21T19:40:00Z"/>
+        </w:rPr>
+        <w:pPrChange w:id="147" w:author="kyle O'Reilly" w:date="2026-10-21T20:41:00Z" w16du:dateUtc="2026-10-21T19:41:00Z">
           <w:pPr/>
         </w:pPrChange>
       </w:pPr>
-      <w:bookmarkStart w:id="135" w:name="_Toc243507769"/>
-      <w:ins w:id="136" w:author="kyle O'Reilly" w:date="2026-10-21T20:40:00Z" w16du:dateUtc="2026-10-21T19:40:00Z">
+      <w:bookmarkStart w:id="148" w:name="_Toc243507769"/>
+      <w:ins w:id="149" w:author="kyle O'Reilly" w:date="2026-10-21T20:40:00Z" w16du:dateUtc="2026-10-21T19:40:00Z">
         <w:r>
           <w:t>5. Project Scope</w:t>
         </w:r>
-        <w:bookmarkEnd w:id="135"/>
-      </w:ins>
-    </w:p>
-    <w:p>
-      <w:pPr>
-        <w:rPr>
-          <w:ins w:id="137" w:author="kyle O'Reilly" w:date="2026-10-21T20:40:00Z" w16du:dateUtc="2026-10-21T19:40:00Z"/>
-        </w:rPr>
-      </w:pPr>
-      <w:ins w:id="138" w:author="kyle O'Reilly" w:date="2026-10-21T20:40:00Z" w16du:dateUtc="2026-10-21T19:40:00Z">
+        <w:bookmarkEnd w:id="148"/>
+      </w:ins>
+    </w:p>
+    <w:p>
+      <w:pPr>
+        <w:rPr>
+          <w:ins w:id="150" w:author="kyle O'Reilly" w:date="2026-10-21T20:40:00Z" w16du:dateUtc="2026-10-21T19:40:00Z"/>
+        </w:rPr>
+      </w:pPr>
+      <w:ins w:id="151" w:author="kyle O'Reilly" w:date="2026-10-21T20:40:00Z" w16du:dateUtc="2026-10-21T19:40:00Z">
         <w:r>
           <w:t>?</w:t>
         </w:r>
@@ -3257,7 +3255,7 @@
     <w:p>
       <w:pPr>
         <w:rPr>
-          <w:ins w:id="139" w:author="kyle O'Reilly" w:date="2026-10-21T20:40:00Z" w16du:dateUtc="2026-10-21T19:40:00Z"/>
+          <w:ins w:id="152" w:author="kyle O'Reilly" w:date="2026-10-21T20:40:00Z" w16du:dateUtc="2026-10-21T19:40:00Z"/>
         </w:rPr>
       </w:pPr>
     </w:p>
@@ -3265,27 +3263,27 @@
       <w:pPr>
         <w:pStyle w:val="Heading1"/>
         <w:rPr>
-          <w:ins w:id="140" w:author="kyle O'Reilly" w:date="2026-10-21T20:40:00Z" w16du:dateUtc="2026-10-21T19:40:00Z"/>
-        </w:rPr>
-        <w:pPrChange w:id="141" w:author="kyle O'Reilly" w:date="2026-10-21T20:41:00Z" w16du:dateUtc="2026-10-21T19:41:00Z">
+          <w:ins w:id="153" w:author="kyle O'Reilly" w:date="2026-10-21T20:40:00Z" w16du:dateUtc="2026-10-21T19:40:00Z"/>
+        </w:rPr>
+        <w:pPrChange w:id="154" w:author="kyle O'Reilly" w:date="2026-10-21T20:41:00Z" w16du:dateUtc="2026-10-21T19:41:00Z">
           <w:pPr/>
         </w:pPrChange>
       </w:pPr>
-      <w:bookmarkStart w:id="142" w:name="_Toc243507770"/>
-      <w:ins w:id="143" w:author="kyle O'Reilly" w:date="2026-10-21T20:40:00Z" w16du:dateUtc="2026-10-21T19:40:00Z">
+      <w:bookmarkStart w:id="155" w:name="_Toc243507770"/>
+      <w:ins w:id="156" w:author="kyle O'Reilly" w:date="2026-10-21T20:40:00Z" w16du:dateUtc="2026-10-21T19:40:00Z">
         <w:r>
           <w:t>6. Methodology</w:t>
         </w:r>
-        <w:bookmarkEnd w:id="142"/>
-      </w:ins>
-    </w:p>
-    <w:p>
-      <w:pPr>
-        <w:rPr>
-          <w:ins w:id="144" w:author="kyle O'Reilly" w:date="2026-10-21T20:40:00Z" w16du:dateUtc="2026-10-21T19:40:00Z"/>
-        </w:rPr>
-      </w:pPr>
-      <w:ins w:id="145" w:author="kyle O'Reilly" w:date="2026-10-21T20:40:00Z" w16du:dateUtc="2026-10-21T19:40:00Z">
+        <w:bookmarkEnd w:id="155"/>
+      </w:ins>
+    </w:p>
+    <w:p>
+      <w:pPr>
+        <w:rPr>
+          <w:ins w:id="157" w:author="kyle O'Reilly" w:date="2026-10-21T20:40:00Z" w16du:dateUtc="2026-10-21T19:40:00Z"/>
+        </w:rPr>
+      </w:pPr>
+      <w:ins w:id="158" w:author="kyle O'Reilly" w:date="2026-10-21T20:40:00Z" w16du:dateUtc="2026-10-21T19:40:00Z">
         <w:r>
           <w:t>?</w:t>
         </w:r>
@@ -3294,7 +3292,7 @@
     <w:p>
       <w:pPr>
         <w:rPr>
-          <w:ins w:id="146" w:author="kyle O'Reilly" w:date="2026-10-21T20:40:00Z" w16du:dateUtc="2026-10-21T19:40:00Z"/>
+          <w:ins w:id="159" w:author="kyle O'Reilly" w:date="2026-10-21T20:40:00Z" w16du:dateUtc="2026-10-21T19:40:00Z"/>
         </w:rPr>
       </w:pPr>
     </w:p>
@@ -3302,41 +3300,369 @@
       <w:pPr>
         <w:pStyle w:val="Heading1"/>
         <w:rPr>
-          <w:ins w:id="147" w:author="kyle O'Reilly" w:date="2026-10-21T20:41:00Z" w16du:dateUtc="2026-10-21T19:41:00Z"/>
-        </w:rPr>
-        <w:pPrChange w:id="148" w:author="kyle O'Reilly" w:date="2026-10-21T20:41:00Z" w16du:dateUtc="2026-10-21T19:41:00Z">
+          <w:ins w:id="160" w:author="kyle O'Reilly" w:date="2026-10-21T20:41:00Z" w16du:dateUtc="2026-10-21T19:41:00Z"/>
+        </w:rPr>
+        <w:pPrChange w:id="161" w:author="kyle O'Reilly" w:date="2026-10-21T20:41:00Z" w16du:dateUtc="2026-10-21T19:41:00Z">
           <w:pPr/>
         </w:pPrChange>
       </w:pPr>
-      <w:bookmarkStart w:id="149" w:name="_Toc243507771"/>
-      <w:ins w:id="150" w:author="kyle O'Reilly" w:date="2026-10-21T20:41:00Z" w16du:dateUtc="2026-10-21T19:41:00Z">
+      <w:bookmarkStart w:id="162" w:name="_Toc243507771"/>
+      <w:ins w:id="163" w:author="kyle O'Reilly" w:date="2026-10-21T20:41:00Z" w16du:dateUtc="2026-10-21T19:41:00Z">
         <w:r>
           <w:t xml:space="preserve">7. </w:t>
         </w:r>
       </w:ins>
-      <w:ins w:id="151" w:author="kyle O'Reilly" w:date="2026-10-21T20:40:00Z" w16du:dateUtc="2026-10-21T19:40:00Z">
+      <w:ins w:id="164" w:author="kyle O'Reilly" w:date="2026-10-21T20:40:00Z" w16du:dateUtc="2026-10-21T19:40:00Z">
         <w:r>
           <w:t>Data Sources</w:t>
         </w:r>
       </w:ins>
-      <w:bookmarkEnd w:id="149"/>
-    </w:p>
-    <w:p>
-      <w:pPr>
-        <w:rPr>
-          <w:ins w:id="152" w:author="kyle O'Reilly" w:date="2026-10-21T20:41:00Z" w16du:dateUtc="2026-10-21T19:41:00Z"/>
-        </w:rPr>
-      </w:pPr>
-      <w:ins w:id="153" w:author="kyle O'Reilly" w:date="2026-10-21T20:41:00Z" w16du:dateUtc="2026-10-21T19:41:00Z">
-        <w:r>
-          <w:t>?</w:t>
-        </w:r>
-      </w:ins>
-    </w:p>
-    <w:p>
-      <w:pPr>
-        <w:rPr>
-          <w:ins w:id="154" w:author="kyle O'Reilly" w:date="2026-10-21T20:41:00Z" w16du:dateUtc="2026-10-21T19:41:00Z"/>
+      <w:bookmarkEnd w:id="162"/>
+    </w:p>
+    <w:p>
+      <w:pPr>
+        <w:rPr>
+          <w:ins w:id="165" w:author="kyle O'Reilly" w:date="2026-10-21T23:35:00Z" w16du:dateUtc="2026-10-21T22:35:00Z"/>
+        </w:rPr>
+      </w:pPr>
+      <w:ins w:id="166" w:author="kyle O'Reilly" w:date="2026-10-21T23:39:00Z" w16du:dateUtc="2026-10-21T22:39:00Z">
+        <w:r>
+          <w:t>Tradi</w:t>
+        </w:r>
+      </w:ins>
+      <w:ins w:id="167" w:author="kyle O'Reilly" w:date="2026-10-21T23:40:00Z" w16du:dateUtc="2026-10-21T22:40:00Z">
+        <w:r>
+          <w:t xml:space="preserve">ng 212 will be consulted to verify </w:t>
+        </w:r>
+      </w:ins>
+      <w:ins w:id="168" w:author="kyle O'Reilly" w:date="2026-10-21T23:46:00Z" w16du:dateUtc="2026-10-21T22:46:00Z">
+        <w:r>
+          <w:t xml:space="preserve">the </w:t>
+        </w:r>
+      </w:ins>
+      <w:ins w:id="169" w:author="kyle O'Reilly" w:date="2026-10-21T23:40:00Z" w16du:dateUtc="2026-10-21T22:40:00Z">
+        <w:r>
+          <w:t>volatility rating</w:t>
+        </w:r>
+      </w:ins>
+      <w:ins w:id="170" w:author="kyle O'Reilly" w:date="2026-10-21T23:41:00Z" w16du:dateUtc="2026-10-21T22:41:00Z">
+        <w:r>
+          <w:t>s</w:t>
+        </w:r>
+      </w:ins>
+      <w:ins w:id="171" w:author="kyle O'Reilly" w:date="2026-10-21T23:40:00Z" w16du:dateUtc="2026-10-21T22:40:00Z">
+        <w:r>
+          <w:t xml:space="preserve"> of</w:t>
+        </w:r>
+      </w:ins>
+      <w:ins w:id="172" w:author="kyle O'Reilly" w:date="2026-10-21T23:46:00Z" w16du:dateUtc="2026-10-21T22:46:00Z">
+        <w:r>
+          <w:t xml:space="preserve"> all the</w:t>
+        </w:r>
+      </w:ins>
+      <w:ins w:id="173" w:author="kyle O'Reilly" w:date="2026-10-21T23:40:00Z" w16du:dateUtc="2026-10-21T22:40:00Z">
+        <w:r>
+          <w:t xml:space="preserve"> three </w:t>
+        </w:r>
+      </w:ins>
+      <w:ins w:id="174" w:author="kyle O'Reilly" w:date="2026-10-21T23:46:00Z" w16du:dateUtc="2026-10-21T22:46:00Z">
+        <w:r>
+          <w:t xml:space="preserve">selected </w:t>
+        </w:r>
+      </w:ins>
+      <w:ins w:id="175" w:author="kyle O'Reilly" w:date="2026-10-21T23:40:00Z" w16du:dateUtc="2026-10-21T22:40:00Z">
+        <w:r>
+          <w:t>stocks.</w:t>
+        </w:r>
+      </w:ins>
+      <w:ins w:id="176" w:author="kyle O'Reilly" w:date="2026-10-21T23:38:00Z" w16du:dateUtc="2026-10-21T22:38:00Z">
+        <w:r>
+          <w:t xml:space="preserve"> </w:t>
+        </w:r>
+      </w:ins>
+      <w:ins w:id="177" w:author="kyle O'Reilly" w:date="2026-10-21T23:46:00Z" w16du:dateUtc="2026-10-21T22:46:00Z">
+        <w:r>
+          <w:t>JPM</w:t>
+        </w:r>
+      </w:ins>
+      <w:ins w:id="178" w:author="kyle O'Reilly" w:date="2026-10-21T23:54:00Z" w16du:dateUtc="2026-10-21T22:54:00Z">
+        <w:r>
+          <w:t>.US</w:t>
+        </w:r>
+      </w:ins>
+      <w:ins w:id="179" w:author="kyle O'Reilly" w:date="2026-10-21T23:46:00Z" w16du:dateUtc="2026-10-21T22:46:00Z">
+        <w:r>
+          <w:t xml:space="preserve"> (low)</w:t>
+        </w:r>
+        <w:r>
+          <w:t>, KO</w:t>
+        </w:r>
+      </w:ins>
+      <w:ins w:id="180" w:author="kyle O'Reilly" w:date="2026-10-21T23:54:00Z" w16du:dateUtc="2026-10-21T22:54:00Z">
+        <w:r>
+          <w:t>.US</w:t>
+        </w:r>
+      </w:ins>
+      <w:ins w:id="181" w:author="kyle O'Reilly" w:date="2026-10-21T23:46:00Z" w16du:dateUtc="2026-10-21T22:46:00Z">
+        <w:r>
+          <w:t xml:space="preserve"> (medium)</w:t>
+        </w:r>
+        <w:r>
+          <w:t>, and INTC</w:t>
+        </w:r>
+      </w:ins>
+      <w:ins w:id="182" w:author="kyle O'Reilly" w:date="2026-10-21T23:54:00Z" w16du:dateUtc="2026-10-21T22:54:00Z">
+        <w:r>
+          <w:t>.US</w:t>
+        </w:r>
+      </w:ins>
+      <w:ins w:id="183" w:author="kyle O'Reilly" w:date="2026-10-21T23:47:00Z" w16du:dateUtc="2026-10-21T22:47:00Z">
+        <w:r>
+          <w:t xml:space="preserve"> (high), as displayed on the trading 212 platform</w:t>
+        </w:r>
+      </w:ins>
+      <w:ins w:id="184" w:author="kyle O'Reilly" w:date="2026-10-21T23:46:00Z" w16du:dateUtc="2026-10-21T22:46:00Z">
+        <w:r>
+          <w:t xml:space="preserve"> </w:t>
+        </w:r>
+      </w:ins>
+      <w:ins w:id="185" w:author="kyle O'Reilly" w:date="2026-10-21T23:38:00Z" w16du:dateUtc="2026-10-21T22:38:00Z">
+        <w:r>
+          <w:t>(</w:t>
+        </w:r>
+      </w:ins>
+      <w:ins w:id="186" w:author="kyle O'Reilly" w:date="2026-10-21T23:44:00Z" w16du:dateUtc="2026-10-21T22:44:00Z">
+        <w:r>
+          <w:t>Trading 212, n.d.)</w:t>
+        </w:r>
+      </w:ins>
+      <w:ins w:id="187" w:author="kyle O'Reilly" w:date="2026-10-21T23:47:00Z" w16du:dateUtc="2026-10-21T22:47:00Z">
+        <w:r>
+          <w:t xml:space="preserve">. Screenshots of </w:t>
+        </w:r>
+      </w:ins>
+      <w:ins w:id="188" w:author="kyle O'Reilly" w:date="2026-10-22T00:01:00Z" w16du:dateUtc="2026-10-21T23:01:00Z">
+        <w:r>
+          <w:t>each stock’s volatility</w:t>
+        </w:r>
+      </w:ins>
+      <w:ins w:id="189" w:author="kyle O'Reilly" w:date="2026-10-21T23:47:00Z" w16du:dateUtc="2026-10-21T22:47:00Z">
+        <w:r>
+          <w:t xml:space="preserve"> </w:t>
+        </w:r>
+      </w:ins>
+      <w:ins w:id="190" w:author="kyle O'Reilly" w:date="2026-10-22T00:01:00Z" w16du:dateUtc="2026-10-21T23:01:00Z">
+        <w:r>
+          <w:t xml:space="preserve">risk </w:t>
+        </w:r>
+      </w:ins>
+      <w:ins w:id="191" w:author="kyle O'Reilly" w:date="2026-10-21T23:47:00Z" w16du:dateUtc="2026-10-21T22:47:00Z">
+        <w:r>
+          <w:t>rating</w:t>
+        </w:r>
+      </w:ins>
+      <w:ins w:id="192" w:author="kyle O'Reilly" w:date="2026-10-22T00:01:00Z" w16du:dateUtc="2026-10-21T23:01:00Z">
+        <w:r>
+          <w:t xml:space="preserve"> </w:t>
+        </w:r>
+      </w:ins>
+      <w:ins w:id="193" w:author="kyle O'Reilly" w:date="2026-10-21T23:47:00Z" w16du:dateUtc="2026-10-21T22:47:00Z">
+        <w:r>
+          <w:t xml:space="preserve">will be provided in Appendix A to support the stock </w:t>
+        </w:r>
+      </w:ins>
+      <w:ins w:id="194" w:author="kyle O'Reilly" w:date="2026-10-21T23:48:00Z" w16du:dateUtc="2026-10-21T22:48:00Z">
+        <w:r>
+          <w:t>selection</w:t>
+        </w:r>
+      </w:ins>
+      <w:ins w:id="195" w:author="kyle O'Reilly" w:date="2026-10-21T23:47:00Z" w16du:dateUtc="2026-10-21T22:47:00Z">
+        <w:r>
+          <w:t>.</w:t>
+        </w:r>
+      </w:ins>
+    </w:p>
+    <w:p>
+      <w:pPr>
+        <w:rPr>
+          <w:ins w:id="196" w:author="kyle O'Reilly" w:date="2026-10-21T20:41:00Z" w16du:dateUtc="2026-10-21T19:41:00Z"/>
+        </w:rPr>
+      </w:pPr>
+      <w:ins w:id="197" w:author="kyle O'Reilly" w:date="2026-10-21T23:28:00Z" w16du:dateUtc="2026-10-21T22:28:00Z">
+        <w:r>
+          <w:t xml:space="preserve">Stooq will be </w:t>
+        </w:r>
+      </w:ins>
+      <w:ins w:id="198" w:author="kyle O'Reilly" w:date="2026-10-21T23:58:00Z" w16du:dateUtc="2026-10-21T22:58:00Z">
+        <w:r>
+          <w:t>used to obtain</w:t>
+        </w:r>
+      </w:ins>
+      <w:ins w:id="199" w:author="kyle O'Reilly" w:date="2026-10-21T23:28:00Z" w16du:dateUtc="2026-10-21T22:28:00Z">
+        <w:r>
+          <w:t xml:space="preserve"> downloadable historical stock data for JPM</w:t>
+        </w:r>
+      </w:ins>
+      <w:ins w:id="200" w:author="kyle O'Reilly" w:date="2026-10-21T23:58:00Z" w16du:dateUtc="2026-10-21T22:58:00Z">
+        <w:r>
+          <w:t>.US</w:t>
+        </w:r>
+      </w:ins>
+      <w:ins w:id="201" w:author="kyle O'Reilly" w:date="2026-10-21T23:28:00Z" w16du:dateUtc="2026-10-21T22:28:00Z">
+        <w:r>
+          <w:t>, KO</w:t>
+        </w:r>
+      </w:ins>
+      <w:ins w:id="202" w:author="kyle O'Reilly" w:date="2026-10-21T23:58:00Z" w16du:dateUtc="2026-10-21T22:58:00Z">
+        <w:r>
+          <w:t>.US</w:t>
+        </w:r>
+      </w:ins>
+      <w:ins w:id="203" w:author="kyle O'Reilly" w:date="2026-10-21T23:28:00Z" w16du:dateUtc="2026-10-21T22:28:00Z">
+        <w:r>
+          <w:t xml:space="preserve"> and INTC</w:t>
+        </w:r>
+      </w:ins>
+      <w:ins w:id="204" w:author="kyle O'Reilly" w:date="2026-10-21T23:58:00Z" w16du:dateUtc="2026-10-21T22:58:00Z">
+        <w:r>
+          <w:t>.US</w:t>
+        </w:r>
+      </w:ins>
+      <w:ins w:id="205" w:author="kyle O'Reilly" w:date="2026-10-21T23:59:00Z" w16du:dateUtc="2026-10-21T22:59:00Z">
+        <w:r>
+          <w:t xml:space="preserve"> (Stooq</w:t>
+        </w:r>
+        <w:r>
+          <w:t>, n.d.a; Stooq, n.d.b</w:t>
+        </w:r>
+      </w:ins>
+      <w:ins w:id="206" w:author="kyle O'Reilly" w:date="2026-10-22T00:00:00Z" w16du:dateUtc="2026-10-21T23:00:00Z">
+        <w:r>
+          <w:t>; Stooq, n.d.c).</w:t>
+        </w:r>
+      </w:ins>
+      <w:ins w:id="207" w:author="kyle O'Reilly" w:date="2026-10-21T23:28:00Z" w16du:dateUtc="2026-10-21T22:28:00Z">
+        <w:r>
+          <w:t xml:space="preserve"> The </w:t>
+        </w:r>
+      </w:ins>
+      <w:ins w:id="208" w:author="kyle O'Reilly" w:date="2026-10-22T00:00:00Z" w16du:dateUtc="2026-10-21T23:00:00Z">
+        <w:r>
+          <w:t xml:space="preserve">independent </w:t>
+        </w:r>
+        <w:r>
+          <w:t xml:space="preserve">dataset </w:t>
+        </w:r>
+      </w:ins>
+      <w:ins w:id="209" w:author="kyle O'Reilly" w:date="2026-10-21T23:28:00Z" w16du:dateUtc="2026-10-21T22:28:00Z">
+        <w:r>
+          <w:t xml:space="preserve">variables </w:t>
+        </w:r>
+        <w:r>
+          <w:t>will</w:t>
+        </w:r>
+      </w:ins>
+      <w:ins w:id="210" w:author="kyle O'Reilly" w:date="2026-10-22T00:00:00Z" w16du:dateUtc="2026-10-21T23:00:00Z">
+        <w:r>
+          <w:t xml:space="preserve"> include</w:t>
+        </w:r>
+      </w:ins>
+      <w:ins w:id="211" w:author="kyle O'Reilly" w:date="2026-10-21T23:28:00Z" w16du:dateUtc="2026-10-21T22:28:00Z">
+        <w:r>
+          <w:t xml:space="preserve"> </w:t>
+        </w:r>
+      </w:ins>
+      <w:ins w:id="212" w:author="kyle O'Reilly" w:date="2026-10-21T23:31:00Z" w16du:dateUtc="2026-10-21T22:31:00Z">
+        <w:r>
+          <w:t xml:space="preserve">sequential index number, </w:t>
+        </w:r>
+        <w:r>
+          <w:t>the cale</w:t>
+        </w:r>
+      </w:ins>
+      <w:ins w:id="213" w:author="kyle O'Reilly" w:date="2026-10-21T23:32:00Z" w16du:dateUtc="2026-10-21T22:32:00Z">
+        <w:r>
+          <w:t xml:space="preserve">ndar date, the opening price, the maximum </w:t>
+        </w:r>
+      </w:ins>
+      <w:ins w:id="214" w:author="kyle O'Reilly" w:date="2026-10-22T00:01:00Z" w16du:dateUtc="2026-10-21T23:01:00Z">
+        <w:r>
+          <w:t xml:space="preserve">and minimum </w:t>
+        </w:r>
+      </w:ins>
+      <w:ins w:id="215" w:author="kyle O'Reilly" w:date="2026-10-21T23:32:00Z" w16du:dateUtc="2026-10-21T22:32:00Z">
+        <w:r>
+          <w:t>price</w:t>
+        </w:r>
+      </w:ins>
+      <w:ins w:id="216" w:author="kyle O'Reilly" w:date="2026-10-22T00:01:00Z" w16du:dateUtc="2026-10-21T23:01:00Z">
+        <w:r>
+          <w:t>s</w:t>
+        </w:r>
+      </w:ins>
+      <w:ins w:id="217" w:author="kyle O'Reilly" w:date="2026-10-21T23:32:00Z" w16du:dateUtc="2026-10-21T22:32:00Z">
+        <w:r>
+          <w:t xml:space="preserve"> the stock reached </w:t>
+        </w:r>
+      </w:ins>
+      <w:ins w:id="218" w:author="kyle O'Reilly" w:date="2026-10-22T00:02:00Z" w16du:dateUtc="2026-10-21T23:02:00Z">
+        <w:r>
+          <w:t>during each trading</w:t>
+        </w:r>
+      </w:ins>
+      <w:ins w:id="219" w:author="kyle O'Reilly" w:date="2026-10-21T23:32:00Z" w16du:dateUtc="2026-10-21T22:32:00Z">
+        <w:r>
+          <w:t xml:space="preserve"> date,</w:t>
+        </w:r>
+      </w:ins>
+      <w:ins w:id="220" w:author="kyle O'Reilly" w:date="2026-10-21T23:33:00Z" w16du:dateUtc="2026-10-21T22:33:00Z">
+        <w:r>
+          <w:t xml:space="preserve"> closing price,</w:t>
+        </w:r>
+      </w:ins>
+      <w:ins w:id="221" w:author="kyle O'Reilly" w:date="2026-10-22T00:02:00Z" w16du:dateUtc="2026-10-21T23:02:00Z">
+        <w:r>
+          <w:t xml:space="preserve"> daily </w:t>
+        </w:r>
+      </w:ins>
+      <w:ins w:id="222" w:author="kyle O'Reilly" w:date="2026-10-22T00:03:00Z" w16du:dateUtc="2026-10-21T23:03:00Z">
+        <w:r>
+          <w:t>percentage</w:t>
+        </w:r>
+      </w:ins>
+      <w:ins w:id="223" w:author="kyle O'Reilly" w:date="2026-10-22T00:02:00Z" w16du:dateUtc="2026-10-21T23:02:00Z">
+        <w:r>
+          <w:t xml:space="preserve"> and a</w:t>
+        </w:r>
+      </w:ins>
+      <w:ins w:id="224" w:author="kyle O'Reilly" w:date="2026-10-22T00:03:00Z" w16du:dateUtc="2026-10-21T23:03:00Z">
+        <w:r>
+          <w:t>bsolute price change compared with the previous day’s closing price</w:t>
+        </w:r>
+        <w:r>
+          <w:t>,</w:t>
+        </w:r>
+      </w:ins>
+      <w:ins w:id="225" w:author="kyle O'Reilly" w:date="2026-10-21T23:33:00Z" w16du:dateUtc="2026-10-21T22:33:00Z">
+        <w:r>
+          <w:t xml:space="preserve"> and </w:t>
+        </w:r>
+      </w:ins>
+      <w:ins w:id="226" w:author="kyle O'Reilly" w:date="2026-10-21T23:34:00Z" w16du:dateUtc="2026-10-21T22:34:00Z">
+        <w:r>
+          <w:t xml:space="preserve">the total number of shares traded </w:t>
+        </w:r>
+      </w:ins>
+      <w:ins w:id="227" w:author="kyle O'Reilly" w:date="2026-10-22T00:03:00Z" w16du:dateUtc="2026-10-21T23:03:00Z">
+        <w:r>
+          <w:t>each date.</w:t>
+        </w:r>
+      </w:ins>
+    </w:p>
+    <w:p>
+      <w:pPr>
+        <w:rPr>
+          <w:ins w:id="228" w:author="kyle O'Reilly" w:date="2026-10-21T20:41:00Z" w16du:dateUtc="2026-10-21T19:41:00Z"/>
         </w:rPr>
       </w:pPr>
     </w:p>
@@ -3344,27 +3670,27 @@
       <w:pPr>
         <w:pStyle w:val="Heading1"/>
         <w:rPr>
-          <w:ins w:id="155" w:author="kyle O'Reilly" w:date="2026-10-21T20:41:00Z" w16du:dateUtc="2026-10-21T19:41:00Z"/>
-        </w:rPr>
-        <w:pPrChange w:id="156" w:author="kyle O'Reilly" w:date="2026-10-21T20:41:00Z" w16du:dateUtc="2026-10-21T19:41:00Z">
+          <w:ins w:id="229" w:author="kyle O'Reilly" w:date="2026-10-21T20:41:00Z" w16du:dateUtc="2026-10-21T19:41:00Z"/>
+        </w:rPr>
+        <w:pPrChange w:id="230" w:author="kyle O'Reilly" w:date="2026-10-21T20:41:00Z" w16du:dateUtc="2026-10-21T19:41:00Z">
           <w:pPr/>
         </w:pPrChange>
       </w:pPr>
-      <w:bookmarkStart w:id="157" w:name="_Toc243507772"/>
-      <w:ins w:id="158" w:author="kyle O'Reilly" w:date="2026-10-21T20:41:00Z" w16du:dateUtc="2026-10-21T19:41:00Z">
+      <w:bookmarkStart w:id="231" w:name="_Toc243507772"/>
+      <w:ins w:id="232" w:author="kyle O'Reilly" w:date="2026-10-21T20:41:00Z" w16du:dateUtc="2026-10-21T19:41:00Z">
         <w:r>
           <w:t>8. Expected Deliverables</w:t>
         </w:r>
-        <w:bookmarkEnd w:id="157"/>
-      </w:ins>
-    </w:p>
-    <w:p>
-      <w:pPr>
-        <w:rPr>
-          <w:ins w:id="159" w:author="kyle O'Reilly" w:date="2026-10-21T20:41:00Z" w16du:dateUtc="2026-10-21T19:41:00Z"/>
-        </w:rPr>
-      </w:pPr>
-      <w:ins w:id="160" w:author="kyle O'Reilly" w:date="2026-10-21T20:41:00Z" w16du:dateUtc="2026-10-21T19:41:00Z">
+        <w:bookmarkEnd w:id="231"/>
+      </w:ins>
+    </w:p>
+    <w:p>
+      <w:pPr>
+        <w:rPr>
+          <w:ins w:id="233" w:author="kyle O'Reilly" w:date="2026-10-21T20:41:00Z" w16du:dateUtc="2026-10-21T19:41:00Z"/>
+        </w:rPr>
+      </w:pPr>
+      <w:ins w:id="234" w:author="kyle O'Reilly" w:date="2026-10-21T20:41:00Z" w16du:dateUtc="2026-10-21T19:41:00Z">
         <w:r>
           <w:t>?</w:t>
         </w:r>
@@ -3373,27 +3699,27 @@
     <w:p>
       <w:pPr>
         <w:rPr>
-          <w:ins w:id="161" w:author="kyle O'Reilly" w:date="2026-10-21T20:41:00Z" w16du:dateUtc="2026-10-21T19:41:00Z"/>
+          <w:ins w:id="235" w:author="kyle O'Reilly" w:date="2026-10-21T20:41:00Z" w16du:dateUtc="2026-10-21T19:41:00Z"/>
         </w:rPr>
       </w:pPr>
     </w:p>
     <w:p>
       <w:pPr>
         <w:pStyle w:val="Heading1"/>
-        <w:pPrChange w:id="162" w:author="kyle O'Reilly" w:date="2026-10-21T20:41:00Z" w16du:dateUtc="2026-10-21T19:41:00Z">
+        <w:pPrChange w:id="236" w:author="kyle O'Reilly" w:date="2026-10-21T20:41:00Z" w16du:dateUtc="2026-10-21T19:41:00Z">
           <w:pPr/>
         </w:pPrChange>
       </w:pPr>
-      <w:bookmarkStart w:id="163" w:name="_Toc243507773"/>
-      <w:ins w:id="164" w:author="kyle O'Reilly" w:date="2026-10-21T20:41:00Z" w16du:dateUtc="2026-10-21T19:41:00Z">
+      <w:bookmarkStart w:id="237" w:name="_Toc243507773"/>
+      <w:ins w:id="238" w:author="kyle O'Reilly" w:date="2026-10-21T20:41:00Z" w16du:dateUtc="2026-10-21T19:41:00Z">
         <w:r>
           <w:t>9. Project Timeline</w:t>
         </w:r>
       </w:ins>
-      <w:bookmarkEnd w:id="163"/>
-    </w:p>
-    <w:p>
-      <w:ins w:id="165" w:author="kyle O'Reilly" w:date="2026-10-21T20:41:00Z" w16du:dateUtc="2026-10-21T19:41:00Z">
+      <w:bookmarkEnd w:id="237"/>
+    </w:p>
+    <w:p>
+      <w:ins w:id="239" w:author="kyle O'Reilly" w:date="2026-10-21T20:41:00Z" w16du:dateUtc="2026-10-21T19:41:00Z">
         <w:r>
           <w:t>?</w:t>
         </w:r>
@@ -3402,7 +3728,7 @@
     <w:p>
       <w:pPr>
         <w:rPr>
-          <w:ins w:id="166" w:author="kyle O'Reilly" w:date="2026-10-21T20:41:00Z" w16du:dateUtc="2026-10-21T19:41:00Z"/>
+          <w:ins w:id="240" w:author="kyle O'Reilly" w:date="2026-10-21T20:41:00Z" w16du:dateUtc="2026-10-21T19:41:00Z"/>
         </w:rPr>
       </w:pPr>
     </w:p>
@@ -3412,18 +3738,19 @@
         <w:spacing w:line="360" w:lineRule="auto"/>
         <w:jc w:val="both"/>
         <w:rPr>
-          <w:ins w:id="167" w:author="kyle O'Reilly" w:date="2026-10-21T20:41:00Z" w16du:dateUtc="2026-10-21T19:41:00Z"/>
-        </w:rPr>
-        <w:pPrChange w:id="168" w:author="kyle O'Reilly" w:date="2026-10-21T23:07:00Z" w16du:dateUtc="2026-10-21T22:07:00Z">
+          <w:ins w:id="241" w:author="kyle O'Reilly" w:date="2026-10-21T20:41:00Z" w16du:dateUtc="2026-10-21T19:41:00Z"/>
+        </w:rPr>
+        <w:pPrChange w:id="242" w:author="kyle O'Reilly" w:date="2026-10-21T23:07:00Z" w16du:dateUtc="2026-10-21T22:07:00Z">
           <w:pPr/>
         </w:pPrChange>
       </w:pPr>
-      <w:bookmarkStart w:id="169" w:name="_Toc243507774"/>
-      <w:ins w:id="170" w:author="kyle O'Reilly" w:date="2026-10-21T20:41:00Z" w16du:dateUtc="2026-10-21T19:41:00Z">
-        <w:r>
+      <w:bookmarkStart w:id="243" w:name="_Toc243507774"/>
+      <w:ins w:id="244" w:author="kyle O'Reilly" w:date="2026-10-21T20:41:00Z" w16du:dateUtc="2026-10-21T19:41:00Z">
+        <w:r>
+          <w:lastRenderedPageBreak/>
           <w:t>10. Ethical and Legal Considerations</w:t>
         </w:r>
-        <w:bookmarkEnd w:id="169"/>
+        <w:bookmarkEnd w:id="243"/>
       </w:ins>
     </w:p>
     <w:p>
@@ -3431,18 +3758,18 @@
         <w:spacing w:line="360" w:lineRule="auto"/>
         <w:jc w:val="both"/>
         <w:rPr>
-          <w:ins w:id="171" w:author="kyle O'Reilly" w:date="2026-10-21T20:46:00Z" w16du:dateUtc="2026-10-21T19:46:00Z"/>
-        </w:rPr>
-        <w:pPrChange w:id="172" w:author="kyle O'Reilly" w:date="2026-10-21T23:07:00Z" w16du:dateUtc="2026-10-21T22:07:00Z">
+          <w:ins w:id="245" w:author="kyle O'Reilly" w:date="2026-10-21T20:46:00Z" w16du:dateUtc="2026-10-21T19:46:00Z"/>
+        </w:rPr>
+        <w:pPrChange w:id="246" w:author="kyle O'Reilly" w:date="2026-10-21T23:07:00Z" w16du:dateUtc="2026-10-21T22:07:00Z">
           <w:pPr/>
         </w:pPrChange>
       </w:pPr>
-      <w:ins w:id="173" w:author="kyle O'Reilly" w:date="2026-10-21T20:42:00Z" w16du:dateUtc="2026-10-21T19:42:00Z">
+      <w:ins w:id="247" w:author="kyle O'Reilly" w:date="2026-10-21T20:42:00Z" w16du:dateUtc="2026-10-21T19:42:00Z">
         <w:r>
           <w:t>This C</w:t>
         </w:r>
       </w:ins>
-      <w:ins w:id="174" w:author="kyle O'Reilly" w:date="2026-10-21T20:43:00Z" w16du:dateUtc="2026-10-21T19:43:00Z">
+      <w:ins w:id="248" w:author="kyle O'Reilly" w:date="2026-10-21T20:43:00Z" w16du:dateUtc="2026-10-21T19:43:00Z">
         <w:r>
           <w:t xml:space="preserve">apstone Project will use </w:t>
         </w:r>
@@ -3453,12 +3780,12 @@
           <w:t>historical stock</w:t>
         </w:r>
       </w:ins>
-      <w:ins w:id="175" w:author="kyle O'Reilly" w:date="2026-10-21T22:01:00Z" w16du:dateUtc="2026-10-21T21:01:00Z">
+      <w:ins w:id="249" w:author="kyle O'Reilly" w:date="2026-10-21T22:01:00Z" w16du:dateUtc="2026-10-21T21:01:00Z">
         <w:r>
           <w:t xml:space="preserve"> </w:t>
         </w:r>
       </w:ins>
-      <w:ins w:id="176" w:author="kyle O'Reilly" w:date="2026-10-21T20:43:00Z" w16du:dateUtc="2026-10-21T19:43:00Z">
+      <w:ins w:id="250" w:author="kyle O'Reilly" w:date="2026-10-21T20:43:00Z" w16du:dateUtc="2026-10-21T19:43:00Z">
         <w:r>
           <w:t xml:space="preserve">data </w:t>
         </w:r>
@@ -3469,7 +3796,7 @@
           <w:t xml:space="preserve">collect personal information or involve human </w:t>
         </w:r>
       </w:ins>
-      <w:ins w:id="177" w:author="kyle O'Reilly" w:date="2026-10-21T20:44:00Z" w16du:dateUtc="2026-10-21T19:44:00Z">
+      <w:ins w:id="251" w:author="kyle O'Reilly" w:date="2026-10-21T20:44:00Z" w16du:dateUtc="2026-10-21T19:44:00Z">
         <w:r>
           <w:t>participants. Stooq data access and usage conditions, and any Trading 212</w:t>
         </w:r>
@@ -3477,22 +3804,22 @@
           <w:t xml:space="preserve"> information reused in the report, will be reviewed and appropriately attributed</w:t>
         </w:r>
       </w:ins>
-      <w:ins w:id="178" w:author="kyle O'Reilly" w:date="2026-10-21T20:45:00Z" w16du:dateUtc="2026-10-21T19:45:00Z">
+      <w:ins w:id="252" w:author="kyle O'Reilly" w:date="2026-10-21T20:45:00Z" w16du:dateUtc="2026-10-21T19:45:00Z">
         <w:r>
           <w:t xml:space="preserve">. Historical stock </w:t>
         </w:r>
       </w:ins>
-      <w:ins w:id="179" w:author="kyle O'Reilly" w:date="2026-10-21T22:03:00Z" w16du:dateUtc="2026-10-21T21:03:00Z">
+      <w:ins w:id="253" w:author="kyle O'Reilly" w:date="2026-10-21T22:03:00Z" w16du:dateUtc="2026-10-21T21:03:00Z">
         <w:r>
           <w:t xml:space="preserve">market </w:t>
         </w:r>
       </w:ins>
-      <w:ins w:id="180" w:author="kyle O'Reilly" w:date="2026-10-21T20:45:00Z" w16du:dateUtc="2026-10-21T19:45:00Z">
+      <w:ins w:id="254" w:author="kyle O'Reilly" w:date="2026-10-21T20:45:00Z" w16du:dateUtc="2026-10-21T19:45:00Z">
         <w:r>
           <w:t xml:space="preserve">data </w:t>
         </w:r>
       </w:ins>
-      <w:ins w:id="181" w:author="kyle O'Reilly" w:date="2026-10-21T22:11:00Z" w16du:dateUtc="2026-10-21T21:11:00Z">
+      <w:ins w:id="255" w:author="kyle O'Reilly" w:date="2026-10-21T22:11:00Z" w16du:dateUtc="2026-10-21T21:11:00Z">
         <w:r>
           <w:t>Comma</w:t>
         </w:r>
@@ -3503,37 +3830,37 @@
           <w:t>(</w:t>
         </w:r>
       </w:ins>
-      <w:ins w:id="182" w:author="kyle O'Reilly" w:date="2026-10-21T22:05:00Z" w16du:dateUtc="2026-10-21T21:05:00Z">
+      <w:ins w:id="256" w:author="kyle O'Reilly" w:date="2026-10-21T22:05:00Z" w16du:dateUtc="2026-10-21T21:05:00Z">
         <w:r>
           <w:t>CSV</w:t>
         </w:r>
       </w:ins>
-      <w:ins w:id="183" w:author="kyle O'Reilly" w:date="2026-10-21T22:11:00Z" w16du:dateUtc="2026-10-21T21:11:00Z">
+      <w:ins w:id="257" w:author="kyle O'Reilly" w:date="2026-10-21T22:11:00Z" w16du:dateUtc="2026-10-21T21:11:00Z">
         <w:r>
           <w:t>)</w:t>
         </w:r>
       </w:ins>
-      <w:ins w:id="184" w:author="kyle O'Reilly" w:date="2026-10-21T22:05:00Z" w16du:dateUtc="2026-10-21T21:05:00Z">
+      <w:ins w:id="258" w:author="kyle O'Reilly" w:date="2026-10-21T22:05:00Z" w16du:dateUtc="2026-10-21T21:05:00Z">
         <w:r>
           <w:t xml:space="preserve"> </w:t>
         </w:r>
       </w:ins>
-      <w:ins w:id="185" w:author="kyle O'Reilly" w:date="2026-10-21T20:45:00Z" w16du:dateUtc="2026-10-21T19:45:00Z">
+      <w:ins w:id="259" w:author="kyle O'Reilly" w:date="2026-10-21T20:45:00Z" w16du:dateUtc="2026-10-21T19:45:00Z">
         <w:r>
           <w:t>files</w:t>
         </w:r>
       </w:ins>
-      <w:ins w:id="186" w:author="kyle O'Reilly" w:date="2026-10-21T22:07:00Z" w16du:dateUtc="2026-10-21T21:07:00Z">
+      <w:ins w:id="260" w:author="kyle O'Reilly" w:date="2026-10-21T22:07:00Z" w16du:dateUtc="2026-10-21T21:07:00Z">
         <w:r>
           <w:t xml:space="preserve"> downloaded from S</w:t>
         </w:r>
       </w:ins>
-      <w:ins w:id="187" w:author="kyle O'Reilly" w:date="2026-10-21T22:08:00Z" w16du:dateUtc="2026-10-21T21:08:00Z">
+      <w:ins w:id="261" w:author="kyle O'Reilly" w:date="2026-10-21T22:08:00Z" w16du:dateUtc="2026-10-21T21:08:00Z">
         <w:r>
           <w:t>tooq</w:t>
         </w:r>
       </w:ins>
-      <w:ins w:id="188" w:author="kyle O'Reilly" w:date="2026-10-21T20:45:00Z" w16du:dateUtc="2026-10-21T19:45:00Z">
+      <w:ins w:id="262" w:author="kyle O'Reilly" w:date="2026-10-21T20:45:00Z" w16du:dateUtc="2026-10-21T19:45:00Z">
         <w:r>
           <w:t xml:space="preserve"> </w:t>
         </w:r>
@@ -3541,37 +3868,37 @@
           <w:t xml:space="preserve">will only be </w:t>
         </w:r>
       </w:ins>
-      <w:ins w:id="189" w:author="kyle O'Reilly" w:date="2026-10-21T22:08:00Z" w16du:dateUtc="2026-10-21T21:08:00Z">
+      <w:ins w:id="263" w:author="kyle O'Reilly" w:date="2026-10-21T22:08:00Z" w16du:dateUtc="2026-10-21T21:08:00Z">
         <w:r>
           <w:t>uploaded to</w:t>
         </w:r>
       </w:ins>
-      <w:ins w:id="190" w:author="kyle O'Reilly" w:date="2026-10-21T20:45:00Z" w16du:dateUtc="2026-10-21T19:45:00Z">
+      <w:ins w:id="264" w:author="kyle O'Reilly" w:date="2026-10-21T20:45:00Z" w16du:dateUtc="2026-10-21T19:45:00Z">
         <w:r>
           <w:t xml:space="preserve"> </w:t>
         </w:r>
       </w:ins>
-      <w:ins w:id="191" w:author="kyle O'Reilly" w:date="2026-10-21T20:48:00Z" w16du:dateUtc="2026-10-21T19:48:00Z">
+      <w:ins w:id="265" w:author="kyle O'Reilly" w:date="2026-10-21T20:48:00Z" w16du:dateUtc="2026-10-21T19:48:00Z">
         <w:r>
           <w:t>GitHub</w:t>
         </w:r>
       </w:ins>
-      <w:ins w:id="192" w:author="kyle O'Reilly" w:date="2026-10-21T20:45:00Z" w16du:dateUtc="2026-10-21T19:45:00Z">
+      <w:ins w:id="266" w:author="kyle O'Reilly" w:date="2026-10-21T20:45:00Z" w16du:dateUtc="2026-10-21T19:45:00Z">
         <w:r>
           <w:t xml:space="preserve"> </w:t>
         </w:r>
       </w:ins>
-      <w:ins w:id="193" w:author="kyle O'Reilly" w:date="2026-10-21T22:07:00Z" w16du:dateUtc="2026-10-21T21:07:00Z">
+      <w:ins w:id="267" w:author="kyle O'Reilly" w:date="2026-10-21T22:07:00Z" w16du:dateUtc="2026-10-21T21:07:00Z">
         <w:r>
           <w:t>if permitted by Stooq’s terms of service</w:t>
         </w:r>
       </w:ins>
-      <w:ins w:id="194" w:author="kyle O'Reilly" w:date="2026-10-21T20:45:00Z" w16du:dateUtc="2026-10-21T19:45:00Z">
+      <w:ins w:id="268" w:author="kyle O'Reilly" w:date="2026-10-21T20:45:00Z" w16du:dateUtc="2026-10-21T19:45:00Z">
         <w:r>
           <w:t xml:space="preserve">; otherwise, </w:t>
         </w:r>
       </w:ins>
-      <w:ins w:id="195" w:author="kyle O'Reilly" w:date="2026-10-21T22:07:00Z" w16du:dateUtc="2026-10-21T21:07:00Z">
+      <w:ins w:id="269" w:author="kyle O'Reilly" w:date="2026-10-21T22:07:00Z" w16du:dateUtc="2026-10-21T21:07:00Z">
         <w:r>
           <w:t xml:space="preserve">the </w:t>
         </w:r>
@@ -3579,12 +3906,12 @@
           <w:t xml:space="preserve">Phyton </w:t>
         </w:r>
       </w:ins>
-      <w:ins w:id="196" w:author="kyle O'Reilly" w:date="2026-10-21T20:45:00Z" w16du:dateUtc="2026-10-21T19:45:00Z">
+      <w:ins w:id="270" w:author="kyle O'Reilly" w:date="2026-10-21T20:45:00Z" w16du:dateUtc="2026-10-21T19:45:00Z">
         <w:r>
           <w:t xml:space="preserve">code and retrieval </w:t>
         </w:r>
       </w:ins>
-      <w:ins w:id="197" w:author="kyle O'Reilly" w:date="2026-10-21T20:46:00Z" w16du:dateUtc="2026-10-21T19:46:00Z">
+      <w:ins w:id="271" w:author="kyle O'Reilly" w:date="2026-10-21T20:46:00Z" w16du:dateUtc="2026-10-21T19:46:00Z">
         <w:r>
           <w:t xml:space="preserve">instructions will be provided. </w:t>
         </w:r>
@@ -3595,62 +3922,61 @@
         <w:spacing w:line="360" w:lineRule="auto"/>
         <w:jc w:val="both"/>
         <w:rPr>
-          <w:ins w:id="198" w:author="kyle O'Reilly" w:date="2026-10-21T20:42:00Z" w16du:dateUtc="2026-10-21T19:42:00Z"/>
-        </w:rPr>
-        <w:pPrChange w:id="199" w:author="kyle O'Reilly" w:date="2026-10-21T23:07:00Z" w16du:dateUtc="2026-10-21T22:07:00Z">
+          <w:ins w:id="272" w:author="kyle O'Reilly" w:date="2026-10-21T20:42:00Z" w16du:dateUtc="2026-10-21T19:42:00Z"/>
+        </w:rPr>
+        <w:pPrChange w:id="273" w:author="kyle O'Reilly" w:date="2026-10-21T23:07:00Z" w16du:dateUtc="2026-10-21T22:07:00Z">
           <w:pPr/>
         </w:pPrChange>
       </w:pPr>
-      <w:ins w:id="200" w:author="kyle O'Reilly" w:date="2026-10-21T22:09:00Z" w16du:dateUtc="2026-10-21T21:09:00Z">
-        <w:r>
-          <w:lastRenderedPageBreak/>
+      <w:ins w:id="274" w:author="kyle O'Reilly" w:date="2026-10-21T22:09:00Z" w16du:dateUtc="2026-10-21T21:09:00Z">
+        <w:r>
           <w:t>All results</w:t>
         </w:r>
         <w:r>
           <w:t>,</w:t>
         </w:r>
       </w:ins>
-      <w:ins w:id="201" w:author="kyle O'Reilly" w:date="2026-10-21T20:47:00Z" w16du:dateUtc="2026-10-21T19:47:00Z">
+      <w:ins w:id="275" w:author="kyle O'Reilly" w:date="2026-10-21T20:47:00Z" w16du:dateUtc="2026-10-21T19:47:00Z">
         <w:r>
           <w:t xml:space="preserve"> including </w:t>
         </w:r>
       </w:ins>
-      <w:ins w:id="202" w:author="kyle O'Reilly" w:date="2026-10-21T22:10:00Z" w16du:dateUtc="2026-10-21T21:10:00Z">
+      <w:ins w:id="276" w:author="kyle O'Reilly" w:date="2026-10-21T22:10:00Z" w16du:dateUtc="2026-10-21T21:10:00Z">
         <w:r>
           <w:t>inaccurate</w:t>
         </w:r>
       </w:ins>
-      <w:ins w:id="203" w:author="kyle O'Reilly" w:date="2026-10-21T20:47:00Z" w16du:dateUtc="2026-10-21T19:47:00Z">
+      <w:ins w:id="277" w:author="kyle O'Reilly" w:date="2026-10-21T20:47:00Z" w16du:dateUtc="2026-10-21T19:47:00Z">
         <w:r>
           <w:t xml:space="preserve"> predictions, will be reported transparently. Th</w:t>
         </w:r>
       </w:ins>
-      <w:ins w:id="204" w:author="kyle O'Reilly" w:date="2026-10-21T22:10:00Z" w16du:dateUtc="2026-10-21T21:10:00Z">
+      <w:ins w:id="278" w:author="kyle O'Reilly" w:date="2026-10-21T22:10:00Z" w16du:dateUtc="2026-10-21T21:10:00Z">
         <w:r>
           <w:t>is Capstone Project</w:t>
         </w:r>
       </w:ins>
-      <w:ins w:id="205" w:author="kyle O'Reilly" w:date="2026-10-21T20:47:00Z" w16du:dateUtc="2026-10-21T19:47:00Z">
+      <w:ins w:id="279" w:author="kyle O'Reilly" w:date="2026-10-21T20:47:00Z" w16du:dateUtc="2026-10-21T19:47:00Z">
         <w:r>
           <w:t xml:space="preserve"> work is for academic purposes</w:t>
         </w:r>
       </w:ins>
-      <w:ins w:id="206" w:author="kyle O'Reilly" w:date="2026-10-21T22:10:00Z" w16du:dateUtc="2026-10-21T21:10:00Z">
+      <w:ins w:id="280" w:author="kyle O'Reilly" w:date="2026-10-21T22:10:00Z" w16du:dateUtc="2026-10-21T21:10:00Z">
         <w:r>
           <w:t xml:space="preserve"> only</w:t>
         </w:r>
       </w:ins>
-      <w:ins w:id="207" w:author="kyle O'Reilly" w:date="2026-10-21T20:47:00Z" w16du:dateUtc="2026-10-21T19:47:00Z">
+      <w:ins w:id="281" w:author="kyle O'Reilly" w:date="2026-10-21T20:47:00Z" w16du:dateUtc="2026-10-21T19:47:00Z">
         <w:r>
           <w:t xml:space="preserve"> and does constitute financial inv</w:t>
         </w:r>
       </w:ins>
-      <w:ins w:id="208" w:author="kyle O'Reilly" w:date="2026-10-21T20:48:00Z" w16du:dateUtc="2026-10-21T19:48:00Z">
+      <w:ins w:id="282" w:author="kyle O'Reilly" w:date="2026-10-21T20:48:00Z" w16du:dateUtc="2026-10-21T19:48:00Z">
         <w:r>
           <w:t>estment</w:t>
         </w:r>
       </w:ins>
-      <w:ins w:id="209" w:author="kyle O'Reilly" w:date="2026-10-21T20:47:00Z" w16du:dateUtc="2026-10-21T19:47:00Z">
+      <w:ins w:id="283" w:author="kyle O'Reilly" w:date="2026-10-21T20:47:00Z" w16du:dateUtc="2026-10-21T19:47:00Z">
         <w:r>
           <w:t xml:space="preserve"> advice.</w:t>
         </w:r>
@@ -3659,7 +3985,7 @@
     <w:p>
       <w:pPr>
         <w:rPr>
-          <w:ins w:id="210" w:author="kyle O'Reilly" w:date="2026-10-21T20:42:00Z" w16du:dateUtc="2026-10-21T19:42:00Z"/>
+          <w:ins w:id="284" w:author="kyle O'Reilly" w:date="2026-10-21T20:42:00Z" w16du:dateUtc="2026-10-21T19:42:00Z"/>
         </w:rPr>
       </w:pPr>
     </w:p>
@@ -3667,18 +3993,18 @@
       <w:pPr>
         <w:pStyle w:val="Heading1"/>
         <w:rPr>
-          <w:ins w:id="211" w:author="kyle O'Reilly" w:date="2026-10-21T20:42:00Z" w16du:dateUtc="2026-10-21T19:42:00Z"/>
-        </w:rPr>
-        <w:pPrChange w:id="212" w:author="kyle O'Reilly" w:date="2026-10-21T20:42:00Z" w16du:dateUtc="2026-10-21T19:42:00Z">
+          <w:ins w:id="285" w:author="kyle O'Reilly" w:date="2026-10-21T20:42:00Z" w16du:dateUtc="2026-10-21T19:42:00Z"/>
+        </w:rPr>
+        <w:pPrChange w:id="286" w:author="kyle O'Reilly" w:date="2026-10-21T20:42:00Z" w16du:dateUtc="2026-10-21T19:42:00Z">
           <w:pPr/>
         </w:pPrChange>
       </w:pPr>
-      <w:bookmarkStart w:id="213" w:name="_Toc243507775"/>
-      <w:ins w:id="214" w:author="kyle O'Reilly" w:date="2026-10-21T20:42:00Z" w16du:dateUtc="2026-10-21T19:42:00Z">
+      <w:bookmarkStart w:id="287" w:name="_Toc243507775"/>
+      <w:ins w:id="288" w:author="kyle O'Reilly" w:date="2026-10-21T20:42:00Z" w16du:dateUtc="2026-10-21T19:42:00Z">
         <w:r>
           <w:t>References</w:t>
         </w:r>
-        <w:bookmarkEnd w:id="213"/>
+        <w:bookmarkEnd w:id="287"/>
         <w:r>
           <w:t xml:space="preserve"> </w:t>
         </w:r>
@@ -3687,23 +4013,469 @@
     <w:p>
       <w:pPr>
         <w:rPr>
-          <w:ins w:id="215" w:author="kyle O'Reilly" w:date="2026-10-21T20:41:00Z" w16du:dateUtc="2026-10-21T19:41:00Z"/>
-        </w:rPr>
-      </w:pPr>
-      <w:ins w:id="216" w:author="kyle O'Reilly" w:date="2026-10-21T20:42:00Z" w16du:dateUtc="2026-10-21T19:42:00Z">
-        <w:r>
-          <w:t>?</w:t>
-        </w:r>
-      </w:ins>
-    </w:p>
-    <w:p>
-      <w:pPr>
-        <w:rPr>
-          <w:ins w:id="217" w:author="kyle O'Reilly" w:date="2026-10-21T20:41:00Z" w16du:dateUtc="2026-10-21T19:41:00Z"/>
-        </w:rPr>
-      </w:pPr>
-    </w:p>
-    <w:p/>
+          <w:ins w:id="289" w:author="kyle O'Reilly" w:date="2026-10-21T23:38:00Z" w16du:dateUtc="2026-10-21T22:38:00Z"/>
+        </w:rPr>
+      </w:pPr>
+    </w:p>
+    <w:p>
+      <w:pPr>
+        <w:rPr>
+          <w:ins w:id="290" w:author="kyle O'Reilly" w:date="2026-10-21T23:38:00Z" w16du:dateUtc="2026-10-21T22:38:00Z"/>
+        </w:rPr>
+      </w:pPr>
+      <w:ins w:id="291" w:author="kyle O'Reilly" w:date="2026-10-21T23:38:00Z" w16du:dateUtc="2026-10-21T22:38:00Z">
+        <w:r>
+          <w:t xml:space="preserve">Section 7 </w:t>
+        </w:r>
+      </w:ins>
+    </w:p>
+    <w:p>
+      <w:pPr>
+        <w:rPr>
+          <w:ins w:id="292" w:author="kyle O'Reilly" w:date="2026-10-21T23:48:00Z" w16du:dateUtc="2026-10-21T22:48:00Z"/>
+        </w:rPr>
+      </w:pPr>
+      <w:ins w:id="293" w:author="kyle O'Reilly" w:date="2026-10-21T23:50:00Z" w16du:dateUtc="2026-10-21T22:50:00Z">
+        <w:r>
+          <w:t>Trading 212</w:t>
+        </w:r>
+      </w:ins>
+      <w:ins w:id="294" w:author="kyle O'Reilly" w:date="2026-10-21T23:52:00Z" w16du:dateUtc="2026-10-21T22:52:00Z">
+        <w:r>
+          <w:t xml:space="preserve"> </w:t>
+        </w:r>
+      </w:ins>
+      <w:ins w:id="295" w:author="kyle O'Reilly" w:date="2026-10-21T23:50:00Z" w16du:dateUtc="2026-10-21T22:50:00Z">
+        <w:r>
+          <w:t>(n.d.) Trading 212 investment platform. Available at:</w:t>
+        </w:r>
+      </w:ins>
+      <w:ins w:id="296" w:author="kyle O'Reilly" w:date="2026-10-21T23:51:00Z" w16du:dateUtc="2026-10-21T22:51:00Z">
+        <w:r>
+          <w:t xml:space="preserve"> </w:t>
+        </w:r>
+        <w:r>
+          <w:fldChar w:fldCharType="begin"/>
+        </w:r>
+        <w:r>
+          <w:instrText>HYPERLINK "</w:instrText>
+        </w:r>
+        <w:r>
+          <w:instrText>https://www.trading212.com</w:instrText>
+        </w:r>
+        <w:r>
+          <w:instrText>/"</w:instrText>
+        </w:r>
+        <w:r>
+          <w:fldChar w:fldCharType="separate"/>
+        </w:r>
+        <w:r>
+          <w:rPr>
+            <w:rStyle w:val="Hyperlink"/>
+          </w:rPr>
+          <w:t>https://www.trading212.com/</w:t>
+        </w:r>
+        <w:r>
+          <w:fldChar w:fldCharType="end"/>
+        </w:r>
+        <w:r>
+          <w:t xml:space="preserve">  (</w:t>
+        </w:r>
+      </w:ins>
+      <w:ins w:id="297" w:author="kyle O'Reilly" w:date="2026-10-21T23:50:00Z" w16du:dateUtc="2026-10-21T22:50:00Z">
+        <w:r>
+          <w:t>Accessed: 2</w:t>
+        </w:r>
+      </w:ins>
+      <w:ins w:id="298" w:author="kyle O'Reilly" w:date="2026-10-21T23:51:00Z" w16du:dateUtc="2026-10-21T22:51:00Z">
+        <w:r>
+          <w:t>1 October 2026).</w:t>
+        </w:r>
+      </w:ins>
+    </w:p>
+    <w:p>
+      <w:pPr>
+        <w:rPr>
+          <w:ins w:id="299" w:author="kyle O'Reilly" w:date="2026-10-21T23:53:00Z" w16du:dateUtc="2026-10-21T22:53:00Z"/>
+        </w:rPr>
+      </w:pPr>
+      <w:ins w:id="300" w:author="kyle O'Reilly" w:date="2026-10-21T23:52:00Z" w16du:dateUtc="2026-10-21T22:52:00Z">
+        <w:r>
+          <w:t xml:space="preserve">Stooq (n.d.a) </w:t>
+        </w:r>
+        <w:r>
+          <w:t>JPMorgan Chase &amp; Co. (JPM.</w:t>
+        </w:r>
+      </w:ins>
+      <w:ins w:id="301" w:author="kyle O'Reilly" w:date="2026-10-21T23:53:00Z" w16du:dateUtc="2026-10-21T22:53:00Z">
+        <w:r>
+          <w:t>US) – Historical data. Available at:</w:t>
+        </w:r>
+      </w:ins>
+      <w:ins w:id="302" w:author="kyle O'Reilly" w:date="2026-10-21T23:57:00Z" w16du:dateUtc="2026-10-21T22:57:00Z">
+        <w:r>
+          <w:t xml:space="preserve"> </w:t>
+        </w:r>
+        <w:r>
+          <w:fldChar w:fldCharType="begin"/>
+        </w:r>
+        <w:r>
+          <w:instrText>HYPERLINK "</w:instrText>
+        </w:r>
+        <w:r>
+          <w:rPr>
+            <w:rPrChange w:id="303" w:author="kyle O'Reilly" w:date="2026-10-21T23:57:00Z" w16du:dateUtc="2026-10-21T22:57:00Z">
+              <w:rPr>
+                <w:rStyle w:val="Hyperlink"/>
+              </w:rPr>
+            </w:rPrChange>
+          </w:rPr>
+          <w:instrText>https://stooq.com/q/d/?s=jpm.us</w:instrText>
+        </w:r>
+        <w:r>
+          <w:instrText>"</w:instrText>
+        </w:r>
+        <w:r>
+          <w:fldChar w:fldCharType="separate"/>
+        </w:r>
+        <w:r>
+          <w:rPr>
+            <w:rStyle w:val="Hyperlink"/>
+          </w:rPr>
+          <w:t>https://stooq.com/q/d/?s=jpm.us</w:t>
+        </w:r>
+        <w:r>
+          <w:fldChar w:fldCharType="end"/>
+        </w:r>
+        <w:r>
+          <w:t xml:space="preserve"> </w:t>
+        </w:r>
+      </w:ins>
+      <w:ins w:id="304" w:author="kyle O'Reilly" w:date="2026-10-21T23:53:00Z" w16du:dateUtc="2026-10-21T22:53:00Z">
+        <w:r>
+          <w:t>(Accessed</w:t>
+        </w:r>
+        <w:r>
+          <w:t xml:space="preserve">: 21 </w:t>
+        </w:r>
+      </w:ins>
+      <w:ins w:id="305" w:author="kyle O'Reilly" w:date="2026-10-21T23:55:00Z" w16du:dateUtc="2026-10-21T22:55:00Z">
+        <w:r>
+          <w:t>October</w:t>
+        </w:r>
+      </w:ins>
+      <w:ins w:id="306" w:author="kyle O'Reilly" w:date="2026-10-21T23:53:00Z" w16du:dateUtc="2026-10-21T22:53:00Z">
+        <w:r>
+          <w:t xml:space="preserve"> 2026).</w:t>
+        </w:r>
+      </w:ins>
+    </w:p>
+    <w:p>
+      <w:pPr>
+        <w:rPr>
+          <w:ins w:id="307" w:author="kyle O'Reilly" w:date="2026-10-21T23:54:00Z" w16du:dateUtc="2026-10-21T22:54:00Z"/>
+        </w:rPr>
+      </w:pPr>
+      <w:ins w:id="308" w:author="kyle O'Reilly" w:date="2026-10-21T23:53:00Z" w16du:dateUtc="2026-10-21T22:53:00Z">
+        <w:r>
+          <w:t xml:space="preserve">Stooq (n.d.b) Coca-Cola </w:t>
+        </w:r>
+      </w:ins>
+      <w:ins w:id="309" w:author="kyle O'Reilly" w:date="2026-10-21T23:54:00Z" w16du:dateUtc="2026-10-21T22:54:00Z">
+        <w:r>
+          <w:t>Co</w:t>
+        </w:r>
+      </w:ins>
+      <w:ins w:id="310" w:author="kyle O'Reilly" w:date="2026-10-22T00:04:00Z" w16du:dateUtc="2026-10-21T23:04:00Z">
+        <w:r>
+          <w:t>.</w:t>
+        </w:r>
+      </w:ins>
+      <w:ins w:id="311" w:author="kyle O'Reilly" w:date="2026-10-21T23:54:00Z" w16du:dateUtc="2026-10-21T22:54:00Z">
+        <w:r>
+          <w:t xml:space="preserve"> </w:t>
+        </w:r>
+      </w:ins>
+      <w:ins w:id="312" w:author="kyle O'Reilly" w:date="2026-10-21T23:53:00Z" w16du:dateUtc="2026-10-21T22:53:00Z">
+        <w:r>
+          <w:t>(KO.U</w:t>
+        </w:r>
+      </w:ins>
+      <w:ins w:id="313" w:author="kyle O'Reilly" w:date="2026-10-21T23:54:00Z" w16du:dateUtc="2026-10-21T22:54:00Z">
+        <w:r>
+          <w:t>S)</w:t>
+        </w:r>
+      </w:ins>
+      <w:ins w:id="314" w:author="kyle O'Reilly" w:date="2026-10-21T23:55:00Z" w16du:dateUtc="2026-10-21T22:55:00Z">
+        <w:r>
+          <w:t xml:space="preserve"> – Historical data. Available at:</w:t>
+        </w:r>
+      </w:ins>
+      <w:ins w:id="315" w:author="kyle O'Reilly" w:date="2026-10-21T23:56:00Z" w16du:dateUtc="2026-10-21T22:56:00Z">
+        <w:r>
+          <w:t xml:space="preserve"> </w:t>
+        </w:r>
+        <w:r>
+          <w:fldChar w:fldCharType="begin"/>
+        </w:r>
+        <w:r>
+          <w:instrText>HYPERLINK "</w:instrText>
+        </w:r>
+        <w:r>
+          <w:instrText>https://stooq.com/q/d/?s=ko.us</w:instrText>
+        </w:r>
+        <w:r>
+          <w:instrText>"</w:instrText>
+        </w:r>
+        <w:r>
+          <w:fldChar w:fldCharType="separate"/>
+        </w:r>
+        <w:r>
+          <w:rPr>
+            <w:rStyle w:val="Hyperlink"/>
+          </w:rPr>
+          <w:t>https://stooq.com/q/d/?s=ko.us</w:t>
+        </w:r>
+        <w:r>
+          <w:fldChar w:fldCharType="end"/>
+        </w:r>
+        <w:r>
+          <w:t xml:space="preserve"> </w:t>
+        </w:r>
+      </w:ins>
+      <w:ins w:id="316" w:author="kyle O'Reilly" w:date="2026-10-21T23:55:00Z" w16du:dateUtc="2026-10-21T22:55:00Z">
+        <w:r>
+          <w:t>(Accessed: 21 October 2026).</w:t>
+        </w:r>
+      </w:ins>
+    </w:p>
+    <w:p>
+      <w:pPr>
+        <w:rPr>
+          <w:ins w:id="317" w:author="kyle O'Reilly" w:date="2026-10-21T23:49:00Z" w16du:dateUtc="2026-10-21T22:49:00Z"/>
+        </w:rPr>
+      </w:pPr>
+      <w:ins w:id="318" w:author="kyle O'Reilly" w:date="2026-10-21T23:54:00Z" w16du:dateUtc="2026-10-21T22:54:00Z">
+        <w:r>
+          <w:t xml:space="preserve">Stooq (n.d.c) Intel </w:t>
+        </w:r>
+      </w:ins>
+      <w:ins w:id="319" w:author="kyle O'Reilly" w:date="2026-10-22T00:04:00Z" w16du:dateUtc="2026-10-21T23:04:00Z">
+        <w:r>
+          <w:t xml:space="preserve">Corp. </w:t>
+        </w:r>
+      </w:ins>
+      <w:ins w:id="320" w:author="kyle O'Reilly" w:date="2026-10-21T23:54:00Z" w16du:dateUtc="2026-10-21T22:54:00Z">
+        <w:r>
+          <w:t>(INTC.US)</w:t>
+        </w:r>
+      </w:ins>
+      <w:ins w:id="321" w:author="kyle O'Reilly" w:date="2026-10-21T23:55:00Z" w16du:dateUtc="2026-10-21T22:55:00Z">
+        <w:r>
+          <w:t xml:space="preserve"> – Historical data. Available at</w:t>
+        </w:r>
+        <w:r>
+          <w:t>:</w:t>
+        </w:r>
+      </w:ins>
+      <w:ins w:id="322" w:author="kyle O'Reilly" w:date="2026-10-21T23:56:00Z" w16du:dateUtc="2026-10-21T22:56:00Z">
+        <w:r>
+          <w:t xml:space="preserve"> </w:t>
+        </w:r>
+        <w:r>
+          <w:fldChar w:fldCharType="begin"/>
+        </w:r>
+        <w:r>
+          <w:instrText>HYPERLINK "</w:instrText>
+        </w:r>
+        <w:r>
+          <w:instrText>https://stooq.com/q/d/?s=intc.us</w:instrText>
+        </w:r>
+        <w:r>
+          <w:instrText>"</w:instrText>
+        </w:r>
+        <w:r>
+          <w:fldChar w:fldCharType="separate"/>
+        </w:r>
+        <w:r>
+          <w:rPr>
+            <w:rStyle w:val="Hyperlink"/>
+          </w:rPr>
+          <w:t>https://stooq.com/q/d/?s=intc.us</w:t>
+        </w:r>
+        <w:r>
+          <w:fldChar w:fldCharType="end"/>
+        </w:r>
+        <w:r>
+          <w:t xml:space="preserve"> </w:t>
+        </w:r>
+      </w:ins>
+      <w:ins w:id="323" w:author="kyle O'Reilly" w:date="2026-10-21T23:55:00Z" w16du:dateUtc="2026-10-21T22:55:00Z">
+        <w:r>
+          <w:t xml:space="preserve"> </w:t>
+        </w:r>
+        <w:r>
+          <w:t>(Accessed: 21 Otcober 2026).</w:t>
+        </w:r>
+      </w:ins>
+    </w:p>
+    <w:p>
+      <w:pPr>
+        <w:rPr>
+          <w:ins w:id="324" w:author="kyle O'Reilly" w:date="2026-10-21T23:49:00Z" w16du:dateUtc="2026-10-21T22:49:00Z"/>
+        </w:rPr>
+      </w:pPr>
+    </w:p>
+    <w:p>
+      <w:pPr>
+        <w:rPr>
+          <w:ins w:id="325" w:author="kyle O'Reilly" w:date="2026-10-21T23:49:00Z" w16du:dateUtc="2026-10-21T22:49:00Z"/>
+        </w:rPr>
+      </w:pPr>
+    </w:p>
+    <w:p>
+      <w:pPr>
+        <w:rPr>
+          <w:ins w:id="326" w:author="kyle O'Reilly" w:date="2026-10-21T23:49:00Z" w16du:dateUtc="2026-10-21T22:49:00Z"/>
+        </w:rPr>
+      </w:pPr>
+    </w:p>
+    <w:p>
+      <w:pPr>
+        <w:rPr>
+          <w:ins w:id="327" w:author="kyle O'Reilly" w:date="2026-10-21T23:49:00Z" w16du:dateUtc="2026-10-21T22:49:00Z"/>
+        </w:rPr>
+      </w:pPr>
+    </w:p>
+    <w:p>
+      <w:pPr>
+        <w:rPr>
+          <w:ins w:id="328" w:author="kyle O'Reilly" w:date="2026-10-21T23:49:00Z" w16du:dateUtc="2026-10-21T22:49:00Z"/>
+        </w:rPr>
+      </w:pPr>
+    </w:p>
+    <w:p>
+      <w:pPr>
+        <w:rPr>
+          <w:ins w:id="329" w:author="kyle O'Reilly" w:date="2026-10-21T23:49:00Z" w16du:dateUtc="2026-10-21T22:49:00Z"/>
+        </w:rPr>
+      </w:pPr>
+    </w:p>
+    <w:p>
+      <w:pPr>
+        <w:rPr>
+          <w:ins w:id="330" w:author="kyle O'Reilly" w:date="2026-10-21T23:49:00Z" w16du:dateUtc="2026-10-21T22:49:00Z"/>
+        </w:rPr>
+      </w:pPr>
+    </w:p>
+    <w:p>
+      <w:pPr>
+        <w:rPr>
+          <w:ins w:id="331" w:author="kyle O'Reilly" w:date="2026-10-21T23:49:00Z" w16du:dateUtc="2026-10-21T22:49:00Z"/>
+        </w:rPr>
+      </w:pPr>
+    </w:p>
+    <w:p>
+      <w:pPr>
+        <w:rPr>
+          <w:ins w:id="332" w:author="kyle O'Reilly" w:date="2026-10-21T23:49:00Z" w16du:dateUtc="2026-10-21T22:49:00Z"/>
+        </w:rPr>
+      </w:pPr>
+    </w:p>
+    <w:p>
+      <w:pPr>
+        <w:rPr>
+          <w:ins w:id="333" w:author="kyle O'Reilly" w:date="2026-10-21T23:49:00Z" w16du:dateUtc="2026-10-21T22:49:00Z"/>
+        </w:rPr>
+      </w:pPr>
+    </w:p>
+    <w:p>
+      <w:pPr>
+        <w:rPr>
+          <w:ins w:id="334" w:author="kyle O'Reilly" w:date="2026-10-21T23:49:00Z" w16du:dateUtc="2026-10-21T22:49:00Z"/>
+        </w:rPr>
+      </w:pPr>
+    </w:p>
+    <w:p>
+      <w:pPr>
+        <w:rPr>
+          <w:ins w:id="335" w:author="kyle O'Reilly" w:date="2026-10-21T23:49:00Z" w16du:dateUtc="2026-10-21T22:49:00Z"/>
+        </w:rPr>
+      </w:pPr>
+    </w:p>
+    <w:p>
+      <w:pPr>
+        <w:rPr>
+          <w:ins w:id="336" w:author="kyle O'Reilly" w:date="2026-10-21T23:49:00Z" w16du:dateUtc="2026-10-21T22:49:00Z"/>
+        </w:rPr>
+      </w:pPr>
+    </w:p>
+    <w:p>
+      <w:pPr>
+        <w:rPr>
+          <w:ins w:id="337" w:author="kyle O'Reilly" w:date="2026-10-21T23:49:00Z" w16du:dateUtc="2026-10-21T22:49:00Z"/>
+        </w:rPr>
+      </w:pPr>
+    </w:p>
+    <w:p>
+      <w:pPr>
+        <w:rPr>
+          <w:ins w:id="338" w:author="kyle O'Reilly" w:date="2026-10-21T23:49:00Z" w16du:dateUtc="2026-10-21T22:49:00Z"/>
+        </w:rPr>
+      </w:pPr>
+    </w:p>
+    <w:p>
+      <w:pPr>
+        <w:rPr>
+          <w:ins w:id="339" w:author="kyle O'Reilly" w:date="2026-10-21T23:49:00Z" w16du:dateUtc="2026-10-21T22:49:00Z"/>
+        </w:rPr>
+      </w:pPr>
+    </w:p>
+    <w:p>
+      <w:pPr>
+        <w:jc w:val="center"/>
+        <w:rPr>
+          <w:ins w:id="340" w:author="kyle O'Reilly" w:date="2026-10-21T23:49:00Z" w16du:dateUtc="2026-10-21T22:49:00Z"/>
+          <w:sz w:val="96"/>
+          <w:szCs w:val="96"/>
+          <w:rPrChange w:id="341" w:author="kyle O'Reilly" w:date="2026-10-21T23:49:00Z" w16du:dateUtc="2026-10-21T22:49:00Z">
+            <w:rPr>
+              <w:ins w:id="342" w:author="kyle O'Reilly" w:date="2026-10-21T23:49:00Z" w16du:dateUtc="2026-10-21T22:49:00Z"/>
+            </w:rPr>
+          </w:rPrChange>
+        </w:rPr>
+        <w:pPrChange w:id="343" w:author="kyle O'Reilly" w:date="2026-10-21T23:49:00Z" w16du:dateUtc="2026-10-21T22:49:00Z">
+          <w:pPr/>
+        </w:pPrChange>
+      </w:pPr>
+    </w:p>
+    <w:p>
+      <w:pPr>
+        <w:jc w:val="center"/>
+        <w:rPr>
+          <w:sz w:val="96"/>
+          <w:szCs w:val="96"/>
+          <w:rPrChange w:id="344" w:author="kyle O'Reilly" w:date="2026-10-21T23:49:00Z" w16du:dateUtc="2026-10-21T22:49:00Z">
+            <w:rPr/>
+          </w:rPrChange>
+        </w:rPr>
+        <w:pPrChange w:id="345" w:author="kyle O'Reilly" w:date="2026-10-21T23:49:00Z" w16du:dateUtc="2026-10-21T22:49:00Z">
+          <w:pPr/>
+        </w:pPrChange>
+      </w:pPr>
+      <w:ins w:id="346" w:author="kyle O'Reilly" w:date="2026-10-21T23:49:00Z" w16du:dateUtc="2026-10-21T22:49:00Z">
+        <w:r>
+          <w:rPr>
+            <w:sz w:val="96"/>
+            <w:szCs w:val="96"/>
+            <w:rPrChange w:id="347" w:author="kyle O'Reilly" w:date="2026-10-21T23:49:00Z" w16du:dateUtc="2026-10-21T22:49:00Z">
+              <w:rPr/>
+            </w:rPrChange>
+          </w:rPr>
+          <w:t>APPENDIX A</w:t>
+        </w:r>
+      </w:ins>
+    </w:p>
     <w:sectPr>
       <w:headerReference w:type="default" r:id="rId14"/>
       <w:footerReference w:type="default" r:id="rId15"/>
@@ -5423,7 +6195,6 @@
   <w:style w:type="character" w:default="1" w:styleId="DefaultParagraphFont">
     <w:name w:val="Default Paragraph Font"/>
     <w:uiPriority w:val="1"/>
-    <w:semiHidden/>
     <w:unhideWhenUsed/>
   </w:style>
   <w:style w:type="table" w:default="1" w:styleId="TableNormal">
@@ -5932,6 +6703,30 @@
     <w:pPr>
       <w:spacing w:after="0" w:line="240" w:lineRule="auto"/>
     </w:pPr>
+  </w:style>
+  <w:style w:type="character" w:styleId="UnresolvedMention">
+    <w:name w:val="Unresolved Mention"/>
+    <w:basedOn w:val="DefaultParagraphFont"/>
+    <w:uiPriority w:val="99"/>
+    <w:semiHidden/>
+    <w:unhideWhenUsed/>
+    <w:rsid w:val="00AB12D3"/>
+    <w:rPr>
+      <w:color w:val="605E5C"/>
+      <w:shd w:val="clear" w:color="auto" w:fill="E1DFDD"/>
+    </w:rPr>
+  </w:style>
+  <w:style w:type="character" w:styleId="FollowedHyperlink">
+    <w:name w:val="FollowedHyperlink"/>
+    <w:basedOn w:val="DefaultParagraphFont"/>
+    <w:uiPriority w:val="99"/>
+    <w:semiHidden/>
+    <w:unhideWhenUsed/>
+    <w:rsid w:val="002A7E31"/>
+    <w:rPr>
+      <w:color w:val="96607D" w:themeColor="followedHyperlink"/>
+      <w:u w:val="single"/>
+    </w:rPr>
   </w:style>
 </w:styles>
 </file>

</xml_diff>

<commit_message>
Fixed spelling mistakes and document formatting issues.
</commit_message>
<xml_diff>
--- a/HDSDAB - Strategic Thinking - Capstone Project.docx
+++ b/HDSDAB - Strategic Thinking - Capstone Project.docx
@@ -640,6 +640,7 @@
           <w:szCs w:val="32"/>
         </w:rPr>
       </w:pPr>
+      <w:proofErr w:type="spellStart"/>
       <w:r>
         <w:rPr>
           <w:i/>
@@ -648,7 +649,17 @@
           <w:szCs w:val="32"/>
         </w:rPr>
         <w:lastRenderedPageBreak/>
-        <w:t xml:space="preserve">Github Repository </w:t>
+        <w:t>Github</w:t>
+      </w:r>
+      <w:proofErr w:type="spellEnd"/>
+      <w:r>
+        <w:rPr>
+          <w:i/>
+          <w:color w:val="156082"/>
+          <w:sz w:val="32"/>
+          <w:szCs w:val="32"/>
+        </w:rPr>
+        <w:t xml:space="preserve"> Repository </w:t>
       </w:r>
     </w:p>
     <w:p>
@@ -672,9 +683,22 @@
             <w:sz w:val="32"/>
             <w:szCs w:val="32"/>
           </w:rPr>
-          <w:t>https://github.com/sba26104-KOR/HDSDAB---Strategic-Thinking---Capstone-Project.git</w:t>
-        </w:r>
-      </w:ins>
+          <w:t>https://github.com/sba26104-KOR/HDSDAB---Strategic-Thinking---Capstone-</w:t>
+        </w:r>
+        <w:proofErr w:type="spellStart"/>
+        <w:r>
+          <w:rPr>
+            <w:bCs/>
+            <w:i/>
+            <w:iCs/>
+            <w:color w:val="EE0000"/>
+            <w:sz w:val="32"/>
+            <w:szCs w:val="32"/>
+          </w:rPr>
+          <w:t>Project.git</w:t>
+        </w:r>
+      </w:ins>
+      <w:proofErr w:type="spellEnd"/>
     </w:p>
     <w:p>
       <w:pPr>
@@ -790,7 +814,23 @@
                                 <w:color w:val="000000"/>
                                 <w:sz w:val="28"/>
                               </w:rPr>
-                              <w:t xml:space="preserve">By submitting this assessment, I confirm that I have read the CCT policy on academic misconduct and understand the implications of submitting work that is not my own or does not appropriately reference material taken from a third party or other source. </w:t>
+                              <w:t xml:space="preserve">By submitting this assessment, I confirm that I have read the CCT policy on academic misconduct and understand the implications of submitting work that is not my own or does not appropriately reference material </w:t>
+                            </w:r>
+                            <w:proofErr w:type="gramStart"/>
+                            <w:r>
+                              <w:rPr>
+                                <w:color w:val="000000"/>
+                                <w:sz w:val="28"/>
+                              </w:rPr>
+                              <w:t>taken</w:t>
+                            </w:r>
+                            <w:proofErr w:type="gramEnd"/>
+                            <w:r>
+                              <w:rPr>
+                                <w:color w:val="000000"/>
+                                <w:sz w:val="28"/>
+                              </w:rPr>
+                              <w:t xml:space="preserve"> from a third party or other source. </w:t>
                             </w:r>
                           </w:p>
                           <w:p>
@@ -884,7 +924,23 @@
                           <w:color w:val="000000"/>
                           <w:sz w:val="28"/>
                         </w:rPr>
-                        <w:t xml:space="preserve">By submitting this assessment, I confirm that I have read the CCT policy on academic misconduct and understand the implications of submitting work that is not my own or does not appropriately reference material taken from a third party or other source. </w:t>
+                        <w:t xml:space="preserve">By submitting this assessment, I confirm that I have read the CCT policy on academic misconduct and understand the implications of submitting work that is not my own or does not appropriately reference material </w:t>
+                      </w:r>
+                      <w:proofErr w:type="gramStart"/>
+                      <w:r>
+                        <w:rPr>
+                          <w:color w:val="000000"/>
+                          <w:sz w:val="28"/>
+                        </w:rPr>
+                        <w:t>taken</w:t>
+                      </w:r>
+                      <w:proofErr w:type="gramEnd"/>
+                      <w:r>
+                        <w:rPr>
+                          <w:color w:val="000000"/>
+                          <w:sz w:val="28"/>
+                        </w:rPr>
+                        <w:t xml:space="preserve"> from a third party or other source. </w:t>
                       </w:r>
                     </w:p>
                     <w:p>
@@ -1131,7 +1187,7 @@
               <w:tab w:val="right" w:leader="dot" w:pos="9016"/>
             </w:tabs>
             <w:rPr>
-              <w:ins w:id="8" w:author="kyle O'Reilly" w:date="2026-10-21T20:42:00Z" w16du:dateUtc="2026-10-21T19:42:00Z"/>
+              <w:ins w:id="8" w:author="kyle O'Reilly" w:date="2026-10-22T00:15:00Z" w16du:dateUtc="2026-10-21T23:15:00Z"/>
               <w:rFonts w:asciiTheme="minorHAnsi" w:eastAsiaTheme="minorEastAsia" w:hAnsiTheme="minorHAnsi" w:cstheme="minorBidi"/>
               <w:noProof/>
               <w:kern w:val="2"/>
@@ -1149,7 +1205,7 @@
           <w:r>
             <w:fldChar w:fldCharType="separate"/>
           </w:r>
-          <w:ins w:id="9" w:author="kyle O'Reilly" w:date="2026-10-21T20:42:00Z" w16du:dateUtc="2026-10-21T19:42:00Z">
+          <w:ins w:id="9" w:author="kyle O'Reilly" w:date="2026-10-22T00:15:00Z" w16du:dateUtc="2026-10-21T23:15:00Z">
             <w:r>
               <w:rPr>
                 <w:rStyle w:val="Hyperlink"/>
@@ -1168,7 +1224,7 @@
               <w:rPr>
                 <w:noProof/>
               </w:rPr>
-              <w:instrText>HYPERLINK \l "_Toc243507765"</w:instrText>
+              <w:instrText>HYPERLINK \l "_Toc243520523"</w:instrText>
             </w:r>
             <w:r>
               <w:rPr>
@@ -1216,16 +1272,14 @@
                 <w:noProof/>
                 <w:webHidden/>
               </w:rPr>
-              <w:instrText xml:space="preserve"> PAGEREF _Toc243507765 \h </w:instrText>
-            </w:r>
-          </w:ins>
-          <w:r>
-            <w:rPr>
-              <w:noProof/>
-              <w:webHidden/>
-            </w:rPr>
-          </w:r>
-          <w:ins w:id="10" w:author="kyle O'Reilly" w:date="2026-10-21T20:42:00Z" w16du:dateUtc="2026-10-21T19:42:00Z">
+              <w:instrText xml:space="preserve"> PAGEREF _Toc243520523 \h </w:instrText>
+            </w:r>
+            <w:r>
+              <w:rPr>
+                <w:noProof/>
+                <w:webHidden/>
+              </w:rPr>
+            </w:r>
             <w:r>
               <w:rPr>
                 <w:noProof/>
@@ -1263,7 +1317,7 @@
               <w:tab w:val="right" w:leader="dot" w:pos="9016"/>
             </w:tabs>
             <w:rPr>
-              <w:ins w:id="11" w:author="kyle O'Reilly" w:date="2026-10-21T20:42:00Z" w16du:dateUtc="2026-10-21T19:42:00Z"/>
+              <w:ins w:id="10" w:author="kyle O'Reilly" w:date="2026-10-22T00:15:00Z" w16du:dateUtc="2026-10-21T23:15:00Z"/>
               <w:rFonts w:asciiTheme="minorHAnsi" w:eastAsiaTheme="minorEastAsia" w:hAnsiTheme="minorHAnsi" w:cstheme="minorBidi"/>
               <w:noProof/>
               <w:kern w:val="2"/>
@@ -1272,7 +1326,7 @@
               <w14:ligatures w14:val="standardContextual"/>
             </w:rPr>
           </w:pPr>
-          <w:ins w:id="12" w:author="kyle O'Reilly" w:date="2026-10-21T20:42:00Z" w16du:dateUtc="2026-10-21T19:42:00Z">
+          <w:ins w:id="11" w:author="kyle O'Reilly" w:date="2026-10-22T00:15:00Z" w16du:dateUtc="2026-10-21T23:15:00Z">
             <w:r>
               <w:rPr>
                 <w:rStyle w:val="Hyperlink"/>
@@ -1291,7 +1345,7 @@
               <w:rPr>
                 <w:noProof/>
               </w:rPr>
-              <w:instrText>HYPERLINK \l "_Toc243507766"</w:instrText>
+              <w:instrText>HYPERLINK \l "_Toc243520524"</w:instrText>
             </w:r>
             <w:r>
               <w:rPr>
@@ -1339,16 +1393,14 @@
                 <w:noProof/>
                 <w:webHidden/>
               </w:rPr>
-              <w:instrText xml:space="preserve"> PAGEREF _Toc243507766 \h </w:instrText>
-            </w:r>
-          </w:ins>
-          <w:r>
-            <w:rPr>
-              <w:noProof/>
-              <w:webHidden/>
-            </w:rPr>
-          </w:r>
-          <w:ins w:id="13" w:author="kyle O'Reilly" w:date="2026-10-21T20:42:00Z" w16du:dateUtc="2026-10-21T19:42:00Z">
+              <w:instrText xml:space="preserve"> PAGEREF _Toc243520524 \h </w:instrText>
+            </w:r>
+            <w:r>
+              <w:rPr>
+                <w:noProof/>
+                <w:webHidden/>
+              </w:rPr>
+            </w:r>
             <w:r>
               <w:rPr>
                 <w:noProof/>
@@ -1386,7 +1438,7 @@
               <w:tab w:val="right" w:leader="dot" w:pos="9016"/>
             </w:tabs>
             <w:rPr>
-              <w:ins w:id="14" w:author="kyle O'Reilly" w:date="2026-10-21T20:42:00Z" w16du:dateUtc="2026-10-21T19:42:00Z"/>
+              <w:ins w:id="12" w:author="kyle O'Reilly" w:date="2026-10-22T00:15:00Z" w16du:dateUtc="2026-10-21T23:15:00Z"/>
               <w:rFonts w:asciiTheme="minorHAnsi" w:eastAsiaTheme="minorEastAsia" w:hAnsiTheme="minorHAnsi" w:cstheme="minorBidi"/>
               <w:noProof/>
               <w:kern w:val="2"/>
@@ -1395,7 +1447,7 @@
               <w14:ligatures w14:val="standardContextual"/>
             </w:rPr>
           </w:pPr>
-          <w:ins w:id="15" w:author="kyle O'Reilly" w:date="2026-10-21T20:42:00Z" w16du:dateUtc="2026-10-21T19:42:00Z">
+          <w:ins w:id="13" w:author="kyle O'Reilly" w:date="2026-10-22T00:15:00Z" w16du:dateUtc="2026-10-21T23:15:00Z">
             <w:r>
               <w:rPr>
                 <w:rStyle w:val="Hyperlink"/>
@@ -1414,7 +1466,7 @@
               <w:rPr>
                 <w:noProof/>
               </w:rPr>
-              <w:instrText>HYPERLINK \l "_Toc243507767"</w:instrText>
+              <w:instrText>HYPERLINK \l "_Toc243520525"</w:instrText>
             </w:r>
             <w:r>
               <w:rPr>
@@ -1462,16 +1514,14 @@
                 <w:noProof/>
                 <w:webHidden/>
               </w:rPr>
-              <w:instrText xml:space="preserve"> PAGEREF _Toc243507767 \h </w:instrText>
-            </w:r>
-          </w:ins>
-          <w:r>
-            <w:rPr>
-              <w:noProof/>
-              <w:webHidden/>
-            </w:rPr>
-          </w:r>
-          <w:ins w:id="16" w:author="kyle O'Reilly" w:date="2026-10-21T20:42:00Z" w16du:dateUtc="2026-10-21T19:42:00Z">
+              <w:instrText xml:space="preserve"> PAGEREF _Toc243520525 \h </w:instrText>
+            </w:r>
+            <w:r>
+              <w:rPr>
+                <w:noProof/>
+                <w:webHidden/>
+              </w:rPr>
+            </w:r>
             <w:r>
               <w:rPr>
                 <w:noProof/>
@@ -1509,7 +1559,7 @@
               <w:tab w:val="right" w:leader="dot" w:pos="9016"/>
             </w:tabs>
             <w:rPr>
-              <w:ins w:id="17" w:author="kyle O'Reilly" w:date="2026-10-21T20:42:00Z" w16du:dateUtc="2026-10-21T19:42:00Z"/>
+              <w:ins w:id="14" w:author="kyle O'Reilly" w:date="2026-10-22T00:15:00Z" w16du:dateUtc="2026-10-21T23:15:00Z"/>
               <w:rFonts w:asciiTheme="minorHAnsi" w:eastAsiaTheme="minorEastAsia" w:hAnsiTheme="minorHAnsi" w:cstheme="minorBidi"/>
               <w:noProof/>
               <w:kern w:val="2"/>
@@ -1518,7 +1568,7 @@
               <w14:ligatures w14:val="standardContextual"/>
             </w:rPr>
           </w:pPr>
-          <w:ins w:id="18" w:author="kyle O'Reilly" w:date="2026-10-21T20:42:00Z" w16du:dateUtc="2026-10-21T19:42:00Z">
+          <w:ins w:id="15" w:author="kyle O'Reilly" w:date="2026-10-22T00:15:00Z" w16du:dateUtc="2026-10-21T23:15:00Z">
             <w:r>
               <w:rPr>
                 <w:rStyle w:val="Hyperlink"/>
@@ -1537,7 +1587,7 @@
               <w:rPr>
                 <w:noProof/>
               </w:rPr>
-              <w:instrText>HYPERLINK \l "_Toc243507768"</w:instrText>
+              <w:instrText>HYPERLINK \l "_Toc243520526"</w:instrText>
             </w:r>
             <w:r>
               <w:rPr>
@@ -1585,16 +1635,14 @@
                 <w:noProof/>
                 <w:webHidden/>
               </w:rPr>
-              <w:instrText xml:space="preserve"> PAGEREF _Toc243507768 \h </w:instrText>
-            </w:r>
-          </w:ins>
-          <w:r>
-            <w:rPr>
-              <w:noProof/>
-              <w:webHidden/>
-            </w:rPr>
-          </w:r>
-          <w:ins w:id="19" w:author="kyle O'Reilly" w:date="2026-10-21T20:42:00Z" w16du:dateUtc="2026-10-21T19:42:00Z">
+              <w:instrText xml:space="preserve"> PAGEREF _Toc243520526 \h </w:instrText>
+            </w:r>
+            <w:r>
+              <w:rPr>
+                <w:noProof/>
+                <w:webHidden/>
+              </w:rPr>
+            </w:r>
             <w:r>
               <w:rPr>
                 <w:noProof/>
@@ -1632,7 +1680,7 @@
               <w:tab w:val="right" w:leader="dot" w:pos="9016"/>
             </w:tabs>
             <w:rPr>
-              <w:ins w:id="20" w:author="kyle O'Reilly" w:date="2026-10-21T20:42:00Z" w16du:dateUtc="2026-10-21T19:42:00Z"/>
+              <w:ins w:id="16" w:author="kyle O'Reilly" w:date="2026-10-22T00:15:00Z" w16du:dateUtc="2026-10-21T23:15:00Z"/>
               <w:rFonts w:asciiTheme="minorHAnsi" w:eastAsiaTheme="minorEastAsia" w:hAnsiTheme="minorHAnsi" w:cstheme="minorBidi"/>
               <w:noProof/>
               <w:kern w:val="2"/>
@@ -1641,7 +1689,7 @@
               <w14:ligatures w14:val="standardContextual"/>
             </w:rPr>
           </w:pPr>
-          <w:ins w:id="21" w:author="kyle O'Reilly" w:date="2026-10-21T20:42:00Z" w16du:dateUtc="2026-10-21T19:42:00Z">
+          <w:ins w:id="17" w:author="kyle O'Reilly" w:date="2026-10-22T00:15:00Z" w16du:dateUtc="2026-10-21T23:15:00Z">
             <w:r>
               <w:rPr>
                 <w:rStyle w:val="Hyperlink"/>
@@ -1660,7 +1708,7 @@
               <w:rPr>
                 <w:noProof/>
               </w:rPr>
-              <w:instrText>HYPERLINK \l "_Toc243507769"</w:instrText>
+              <w:instrText>HYPERLINK \l "_Toc243520527"</w:instrText>
             </w:r>
             <w:r>
               <w:rPr>
@@ -1708,16 +1756,14 @@
                 <w:noProof/>
                 <w:webHidden/>
               </w:rPr>
-              <w:instrText xml:space="preserve"> PAGEREF _Toc243507769 \h </w:instrText>
-            </w:r>
-          </w:ins>
-          <w:r>
-            <w:rPr>
-              <w:noProof/>
-              <w:webHidden/>
-            </w:rPr>
-          </w:r>
-          <w:ins w:id="22" w:author="kyle O'Reilly" w:date="2026-10-21T20:42:00Z" w16du:dateUtc="2026-10-21T19:42:00Z">
+              <w:instrText xml:space="preserve"> PAGEREF _Toc243520527 \h </w:instrText>
+            </w:r>
+            <w:r>
+              <w:rPr>
+                <w:noProof/>
+                <w:webHidden/>
+              </w:rPr>
+            </w:r>
             <w:r>
               <w:rPr>
                 <w:noProof/>
@@ -1730,7 +1776,7 @@
                 <w:noProof/>
                 <w:webHidden/>
               </w:rPr>
-              <w:t>1</w:t>
+              <w:t>2</w:t>
             </w:r>
             <w:r>
               <w:rPr>
@@ -1755,7 +1801,7 @@
               <w:tab w:val="right" w:leader="dot" w:pos="9016"/>
             </w:tabs>
             <w:rPr>
-              <w:ins w:id="23" w:author="kyle O'Reilly" w:date="2026-10-21T20:42:00Z" w16du:dateUtc="2026-10-21T19:42:00Z"/>
+              <w:ins w:id="18" w:author="kyle O'Reilly" w:date="2026-10-22T00:15:00Z" w16du:dateUtc="2026-10-21T23:15:00Z"/>
               <w:rFonts w:asciiTheme="minorHAnsi" w:eastAsiaTheme="minorEastAsia" w:hAnsiTheme="minorHAnsi" w:cstheme="minorBidi"/>
               <w:noProof/>
               <w:kern w:val="2"/>
@@ -1764,7 +1810,7 @@
               <w14:ligatures w14:val="standardContextual"/>
             </w:rPr>
           </w:pPr>
-          <w:ins w:id="24" w:author="kyle O'Reilly" w:date="2026-10-21T20:42:00Z" w16du:dateUtc="2026-10-21T19:42:00Z">
+          <w:ins w:id="19" w:author="kyle O'Reilly" w:date="2026-10-22T00:15:00Z" w16du:dateUtc="2026-10-21T23:15:00Z">
             <w:r>
               <w:rPr>
                 <w:rStyle w:val="Hyperlink"/>
@@ -1783,7 +1829,7 @@
               <w:rPr>
                 <w:noProof/>
               </w:rPr>
-              <w:instrText>HYPERLINK \l "_Toc243507770"</w:instrText>
+              <w:instrText>HYPERLINK \l "_Toc243520528"</w:instrText>
             </w:r>
             <w:r>
               <w:rPr>
@@ -1831,16 +1877,14 @@
                 <w:noProof/>
                 <w:webHidden/>
               </w:rPr>
-              <w:instrText xml:space="preserve"> PAGEREF _Toc243507770 \h </w:instrText>
-            </w:r>
-          </w:ins>
-          <w:r>
-            <w:rPr>
-              <w:noProof/>
-              <w:webHidden/>
-            </w:rPr>
-          </w:r>
-          <w:ins w:id="25" w:author="kyle O'Reilly" w:date="2026-10-21T20:42:00Z" w16du:dateUtc="2026-10-21T19:42:00Z">
+              <w:instrText xml:space="preserve"> PAGEREF _Toc243520528 \h </w:instrText>
+            </w:r>
+            <w:r>
+              <w:rPr>
+                <w:noProof/>
+                <w:webHidden/>
+              </w:rPr>
+            </w:r>
             <w:r>
               <w:rPr>
                 <w:noProof/>
@@ -1853,7 +1897,7 @@
                 <w:noProof/>
                 <w:webHidden/>
               </w:rPr>
-              <w:t>1</w:t>
+              <w:t>2</w:t>
             </w:r>
             <w:r>
               <w:rPr>
@@ -1878,7 +1922,7 @@
               <w:tab w:val="right" w:leader="dot" w:pos="9016"/>
             </w:tabs>
             <w:rPr>
-              <w:ins w:id="26" w:author="kyle O'Reilly" w:date="2026-10-21T20:42:00Z" w16du:dateUtc="2026-10-21T19:42:00Z"/>
+              <w:ins w:id="20" w:author="kyle O'Reilly" w:date="2026-10-22T00:15:00Z" w16du:dateUtc="2026-10-21T23:15:00Z"/>
               <w:rFonts w:asciiTheme="minorHAnsi" w:eastAsiaTheme="minorEastAsia" w:hAnsiTheme="minorHAnsi" w:cstheme="minorBidi"/>
               <w:noProof/>
               <w:kern w:val="2"/>
@@ -1887,7 +1931,7 @@
               <w14:ligatures w14:val="standardContextual"/>
             </w:rPr>
           </w:pPr>
-          <w:ins w:id="27" w:author="kyle O'Reilly" w:date="2026-10-21T20:42:00Z" w16du:dateUtc="2026-10-21T19:42:00Z">
+          <w:ins w:id="21" w:author="kyle O'Reilly" w:date="2026-10-22T00:15:00Z" w16du:dateUtc="2026-10-21T23:15:00Z">
             <w:r>
               <w:rPr>
                 <w:rStyle w:val="Hyperlink"/>
@@ -1906,7 +1950,7 @@
               <w:rPr>
                 <w:noProof/>
               </w:rPr>
-              <w:instrText>HYPERLINK \l "_Toc243507771"</w:instrText>
+              <w:instrText>HYPERLINK \l "_Toc243520529"</w:instrText>
             </w:r>
             <w:r>
               <w:rPr>
@@ -1954,16 +1998,14 @@
                 <w:noProof/>
                 <w:webHidden/>
               </w:rPr>
-              <w:instrText xml:space="preserve"> PAGEREF _Toc243507771 \h </w:instrText>
-            </w:r>
-          </w:ins>
-          <w:r>
-            <w:rPr>
-              <w:noProof/>
-              <w:webHidden/>
-            </w:rPr>
-          </w:r>
-          <w:ins w:id="28" w:author="kyle O'Reilly" w:date="2026-10-21T20:42:00Z" w16du:dateUtc="2026-10-21T19:42:00Z">
+              <w:instrText xml:space="preserve"> PAGEREF _Toc243520529 \h </w:instrText>
+            </w:r>
+            <w:r>
+              <w:rPr>
+                <w:noProof/>
+                <w:webHidden/>
+              </w:rPr>
+            </w:r>
             <w:r>
               <w:rPr>
                 <w:noProof/>
@@ -1976,7 +2018,7 @@
                 <w:noProof/>
                 <w:webHidden/>
               </w:rPr>
-              <w:t>1</w:t>
+              <w:t>2</w:t>
             </w:r>
             <w:r>
               <w:rPr>
@@ -2001,7 +2043,7 @@
               <w:tab w:val="right" w:leader="dot" w:pos="9016"/>
             </w:tabs>
             <w:rPr>
-              <w:ins w:id="29" w:author="kyle O'Reilly" w:date="2026-10-21T20:42:00Z" w16du:dateUtc="2026-10-21T19:42:00Z"/>
+              <w:ins w:id="22" w:author="kyle O'Reilly" w:date="2026-10-22T00:15:00Z" w16du:dateUtc="2026-10-21T23:15:00Z"/>
               <w:rFonts w:asciiTheme="minorHAnsi" w:eastAsiaTheme="minorEastAsia" w:hAnsiTheme="minorHAnsi" w:cstheme="minorBidi"/>
               <w:noProof/>
               <w:kern w:val="2"/>
@@ -2010,7 +2052,7 @@
               <w14:ligatures w14:val="standardContextual"/>
             </w:rPr>
           </w:pPr>
-          <w:ins w:id="30" w:author="kyle O'Reilly" w:date="2026-10-21T20:42:00Z" w16du:dateUtc="2026-10-21T19:42:00Z">
+          <w:ins w:id="23" w:author="kyle O'Reilly" w:date="2026-10-22T00:15:00Z" w16du:dateUtc="2026-10-21T23:15:00Z">
             <w:r>
               <w:rPr>
                 <w:rStyle w:val="Hyperlink"/>
@@ -2029,7 +2071,7 @@
               <w:rPr>
                 <w:noProof/>
               </w:rPr>
-              <w:instrText>HYPERLINK \l "_Toc243507772"</w:instrText>
+              <w:instrText>HYPERLINK \l "_Toc243520530"</w:instrText>
             </w:r>
             <w:r>
               <w:rPr>
@@ -2077,16 +2119,14 @@
                 <w:noProof/>
                 <w:webHidden/>
               </w:rPr>
-              <w:instrText xml:space="preserve"> PAGEREF _Toc243507772 \h </w:instrText>
-            </w:r>
-          </w:ins>
-          <w:r>
-            <w:rPr>
-              <w:noProof/>
-              <w:webHidden/>
-            </w:rPr>
-          </w:r>
-          <w:ins w:id="31" w:author="kyle O'Reilly" w:date="2026-10-21T20:42:00Z" w16du:dateUtc="2026-10-21T19:42:00Z">
+              <w:instrText xml:space="preserve"> PAGEREF _Toc243520530 \h </w:instrText>
+            </w:r>
+            <w:r>
+              <w:rPr>
+                <w:noProof/>
+                <w:webHidden/>
+              </w:rPr>
+            </w:r>
             <w:r>
               <w:rPr>
                 <w:noProof/>
@@ -2099,7 +2139,7 @@
                 <w:noProof/>
                 <w:webHidden/>
               </w:rPr>
-              <w:t>1</w:t>
+              <w:t>2</w:t>
             </w:r>
             <w:r>
               <w:rPr>
@@ -2124,7 +2164,7 @@
               <w:tab w:val="right" w:leader="dot" w:pos="9016"/>
             </w:tabs>
             <w:rPr>
-              <w:ins w:id="32" w:author="kyle O'Reilly" w:date="2026-10-21T20:42:00Z" w16du:dateUtc="2026-10-21T19:42:00Z"/>
+              <w:ins w:id="24" w:author="kyle O'Reilly" w:date="2026-10-22T00:15:00Z" w16du:dateUtc="2026-10-21T23:15:00Z"/>
               <w:rFonts w:asciiTheme="minorHAnsi" w:eastAsiaTheme="minorEastAsia" w:hAnsiTheme="minorHAnsi" w:cstheme="minorBidi"/>
               <w:noProof/>
               <w:kern w:val="2"/>
@@ -2133,7 +2173,7 @@
               <w14:ligatures w14:val="standardContextual"/>
             </w:rPr>
           </w:pPr>
-          <w:ins w:id="33" w:author="kyle O'Reilly" w:date="2026-10-21T20:42:00Z" w16du:dateUtc="2026-10-21T19:42:00Z">
+          <w:ins w:id="25" w:author="kyle O'Reilly" w:date="2026-10-22T00:15:00Z" w16du:dateUtc="2026-10-21T23:15:00Z">
             <w:r>
               <w:rPr>
                 <w:rStyle w:val="Hyperlink"/>
@@ -2152,7 +2192,7 @@
               <w:rPr>
                 <w:noProof/>
               </w:rPr>
-              <w:instrText>HYPERLINK \l "_Toc243507773"</w:instrText>
+              <w:instrText>HYPERLINK \l "_Toc243520531"</w:instrText>
             </w:r>
             <w:r>
               <w:rPr>
@@ -2200,16 +2240,14 @@
                 <w:noProof/>
                 <w:webHidden/>
               </w:rPr>
-              <w:instrText xml:space="preserve"> PAGEREF _Toc243507773 \h </w:instrText>
-            </w:r>
-          </w:ins>
-          <w:r>
-            <w:rPr>
-              <w:noProof/>
-              <w:webHidden/>
-            </w:rPr>
-          </w:r>
-          <w:ins w:id="34" w:author="kyle O'Reilly" w:date="2026-10-21T20:42:00Z" w16du:dateUtc="2026-10-21T19:42:00Z">
+              <w:instrText xml:space="preserve"> PAGEREF _Toc243520531 \h </w:instrText>
+            </w:r>
+            <w:r>
+              <w:rPr>
+                <w:noProof/>
+                <w:webHidden/>
+              </w:rPr>
+            </w:r>
             <w:r>
               <w:rPr>
                 <w:noProof/>
@@ -2247,7 +2285,7 @@
               <w:tab w:val="right" w:leader="dot" w:pos="9016"/>
             </w:tabs>
             <w:rPr>
-              <w:ins w:id="35" w:author="kyle O'Reilly" w:date="2026-10-21T20:42:00Z" w16du:dateUtc="2026-10-21T19:42:00Z"/>
+              <w:ins w:id="26" w:author="kyle O'Reilly" w:date="2026-10-22T00:15:00Z" w16du:dateUtc="2026-10-21T23:15:00Z"/>
               <w:rFonts w:asciiTheme="minorHAnsi" w:eastAsiaTheme="minorEastAsia" w:hAnsiTheme="minorHAnsi" w:cstheme="minorBidi"/>
               <w:noProof/>
               <w:kern w:val="2"/>
@@ -2256,7 +2294,7 @@
               <w14:ligatures w14:val="standardContextual"/>
             </w:rPr>
           </w:pPr>
-          <w:ins w:id="36" w:author="kyle O'Reilly" w:date="2026-10-21T20:42:00Z" w16du:dateUtc="2026-10-21T19:42:00Z">
+          <w:ins w:id="27" w:author="kyle O'Reilly" w:date="2026-10-22T00:15:00Z" w16du:dateUtc="2026-10-21T23:15:00Z">
             <w:r>
               <w:rPr>
                 <w:rStyle w:val="Hyperlink"/>
@@ -2275,7 +2313,7 @@
               <w:rPr>
                 <w:noProof/>
               </w:rPr>
-              <w:instrText>HYPERLINK \l "_Toc243507774"</w:instrText>
+              <w:instrText>HYPERLINK \l "_Toc243520532"</w:instrText>
             </w:r>
             <w:r>
               <w:rPr>
@@ -2323,16 +2361,14 @@
                 <w:noProof/>
                 <w:webHidden/>
               </w:rPr>
-              <w:instrText xml:space="preserve"> PAGEREF _Toc243507774 \h </w:instrText>
-            </w:r>
-          </w:ins>
-          <w:r>
-            <w:rPr>
-              <w:noProof/>
-              <w:webHidden/>
-            </w:rPr>
-          </w:r>
-          <w:ins w:id="37" w:author="kyle O'Reilly" w:date="2026-10-21T20:42:00Z" w16du:dateUtc="2026-10-21T19:42:00Z">
+              <w:instrText xml:space="preserve"> PAGEREF _Toc243520532 \h </w:instrText>
+            </w:r>
+            <w:r>
+              <w:rPr>
+                <w:noProof/>
+                <w:webHidden/>
+              </w:rPr>
+            </w:r>
             <w:r>
               <w:rPr>
                 <w:noProof/>
@@ -2345,7 +2381,7 @@
                 <w:noProof/>
                 <w:webHidden/>
               </w:rPr>
-              <w:t>2</w:t>
+              <w:t>3</w:t>
             </w:r>
             <w:r>
               <w:rPr>
@@ -2370,7 +2406,7 @@
               <w:tab w:val="right" w:leader="dot" w:pos="9016"/>
             </w:tabs>
             <w:rPr>
-              <w:ins w:id="38" w:author="kyle O'Reilly" w:date="2026-10-21T20:42:00Z" w16du:dateUtc="2026-10-21T19:42:00Z"/>
+              <w:ins w:id="28" w:author="kyle O'Reilly" w:date="2026-10-22T00:15:00Z" w16du:dateUtc="2026-10-21T23:15:00Z"/>
               <w:rFonts w:asciiTheme="minorHAnsi" w:eastAsiaTheme="minorEastAsia" w:hAnsiTheme="minorHAnsi" w:cstheme="minorBidi"/>
               <w:noProof/>
               <w:kern w:val="2"/>
@@ -2379,7 +2415,7 @@
               <w14:ligatures w14:val="standardContextual"/>
             </w:rPr>
           </w:pPr>
-          <w:ins w:id="39" w:author="kyle O'Reilly" w:date="2026-10-21T20:42:00Z" w16du:dateUtc="2026-10-21T19:42:00Z">
+          <w:ins w:id="29" w:author="kyle O'Reilly" w:date="2026-10-22T00:15:00Z" w16du:dateUtc="2026-10-21T23:15:00Z">
             <w:r>
               <w:rPr>
                 <w:rStyle w:val="Hyperlink"/>
@@ -2398,7 +2434,7 @@
               <w:rPr>
                 <w:noProof/>
               </w:rPr>
-              <w:instrText>HYPERLINK \l "_Toc243507775"</w:instrText>
+              <w:instrText>HYPERLINK \l "_Toc243520533"</w:instrText>
             </w:r>
             <w:r>
               <w:rPr>
@@ -2446,16 +2482,14 @@
                 <w:noProof/>
                 <w:webHidden/>
               </w:rPr>
-              <w:instrText xml:space="preserve"> PAGEREF _Toc243507775 \h </w:instrText>
-            </w:r>
-          </w:ins>
-          <w:r>
-            <w:rPr>
-              <w:noProof/>
-              <w:webHidden/>
-            </w:rPr>
-          </w:r>
-          <w:ins w:id="40" w:author="kyle O'Reilly" w:date="2026-10-21T20:42:00Z" w16du:dateUtc="2026-10-21T19:42:00Z">
+              <w:instrText xml:space="preserve"> PAGEREF _Toc243520533 \h </w:instrText>
+            </w:r>
+            <w:r>
+              <w:rPr>
+                <w:noProof/>
+                <w:webHidden/>
+              </w:rPr>
+            </w:r>
             <w:r>
               <w:rPr>
                 <w:noProof/>
@@ -2468,7 +2502,7 @@
                 <w:noProof/>
                 <w:webHidden/>
               </w:rPr>
-              <w:t>2</w:t>
+              <w:t>3</w:t>
             </w:r>
             <w:r>
               <w:rPr>
@@ -2487,7 +2521,7 @@
           </w:ins>
         </w:p>
         <w:p>
-          <w:del w:id="41" w:author="kyle O'Reilly" w:date="2026-10-20T21:26:00Z" w16du:dateUtc="2026-10-20T20:26:00Z">
+          <w:del w:id="30" w:author="kyle O'Reilly" w:date="2026-10-20T21:26:00Z" w16du:dateUtc="2026-10-20T20:26:00Z">
             <w:r>
               <w:rPr>
                 <w:b/>
@@ -2530,42 +2564,42 @@
     <w:p>
       <w:pPr>
         <w:rPr>
-          <w:del w:id="42" w:author="kyle O'Reilly" w:date="2026-10-21T20:42:00Z" w16du:dateUtc="2026-10-21T19:42:00Z"/>
-        </w:rPr>
-      </w:pPr>
-    </w:p>
-    <w:p>
-      <w:pPr>
-        <w:rPr>
-          <w:del w:id="43" w:author="kyle O'Reilly" w:date="2026-10-21T20:42:00Z" w16du:dateUtc="2026-10-21T19:42:00Z"/>
-        </w:rPr>
-      </w:pPr>
-    </w:p>
-    <w:p>
-      <w:pPr>
-        <w:rPr>
-          <w:del w:id="44" w:author="kyle O'Reilly" w:date="2026-10-21T20:42:00Z" w16du:dateUtc="2026-10-21T19:42:00Z"/>
-        </w:rPr>
-      </w:pPr>
-    </w:p>
-    <w:p>
-      <w:pPr>
-        <w:rPr>
-          <w:del w:id="45" w:author="kyle O'Reilly" w:date="2026-10-21T20:42:00Z" w16du:dateUtc="2026-10-21T19:42:00Z"/>
-        </w:rPr>
-      </w:pPr>
-    </w:p>
-    <w:p>
-      <w:pPr>
-        <w:rPr>
-          <w:del w:id="46" w:author="kyle O'Reilly" w:date="2026-10-21T20:42:00Z" w16du:dateUtc="2026-10-21T19:42:00Z"/>
-        </w:rPr>
-      </w:pPr>
-    </w:p>
-    <w:p>
-      <w:pPr>
-        <w:rPr>
-          <w:del w:id="47" w:author="kyle O'Reilly" w:date="2026-10-21T20:42:00Z" w16du:dateUtc="2026-10-21T19:42:00Z"/>
+          <w:del w:id="31" w:author="kyle O'Reilly" w:date="2026-10-21T20:42:00Z" w16du:dateUtc="2026-10-21T19:42:00Z"/>
+        </w:rPr>
+      </w:pPr>
+    </w:p>
+    <w:p>
+      <w:pPr>
+        <w:rPr>
+          <w:del w:id="32" w:author="kyle O'Reilly" w:date="2026-10-21T20:42:00Z" w16du:dateUtc="2026-10-21T19:42:00Z"/>
+        </w:rPr>
+      </w:pPr>
+    </w:p>
+    <w:p>
+      <w:pPr>
+        <w:rPr>
+          <w:del w:id="33" w:author="kyle O'Reilly" w:date="2026-10-21T20:42:00Z" w16du:dateUtc="2026-10-21T19:42:00Z"/>
+        </w:rPr>
+      </w:pPr>
+    </w:p>
+    <w:p>
+      <w:pPr>
+        <w:rPr>
+          <w:del w:id="34" w:author="kyle O'Reilly" w:date="2026-10-21T20:42:00Z" w16du:dateUtc="2026-10-21T19:42:00Z"/>
+        </w:rPr>
+      </w:pPr>
+    </w:p>
+    <w:p>
+      <w:pPr>
+        <w:rPr>
+          <w:del w:id="35" w:author="kyle O'Reilly" w:date="2026-10-21T20:42:00Z" w16du:dateUtc="2026-10-21T19:42:00Z"/>
+        </w:rPr>
+      </w:pPr>
+    </w:p>
+    <w:p>
+      <w:pPr>
+        <w:rPr>
+          <w:del w:id="36" w:author="kyle O'Reilly" w:date="2026-10-21T20:42:00Z" w16du:dateUtc="2026-10-21T19:42:00Z"/>
         </w:rPr>
       </w:pPr>
     </w:p>
@@ -2573,14 +2607,14 @@
     <w:p>
       <w:pPr>
         <w:rPr>
-          <w:del w:id="48" w:author="kyle O'Reilly" w:date="2026-10-21T20:42:00Z" w16du:dateUtc="2026-10-21T19:42:00Z"/>
-        </w:rPr>
-      </w:pPr>
-    </w:p>
-    <w:p>
-      <w:pPr>
-        <w:rPr>
-          <w:del w:id="49" w:author="kyle O'Reilly" w:date="2026-10-21T20:42:00Z" w16du:dateUtc="2026-10-21T19:42:00Z"/>
+          <w:del w:id="37" w:author="kyle O'Reilly" w:date="2026-10-21T20:42:00Z" w16du:dateUtc="2026-10-21T19:42:00Z"/>
+        </w:rPr>
+      </w:pPr>
+    </w:p>
+    <w:p>
+      <w:pPr>
+        <w:rPr>
+          <w:del w:id="38" w:author="kyle O'Reilly" w:date="2026-10-21T20:42:00Z" w16du:dateUtc="2026-10-21T19:42:00Z"/>
         </w:rPr>
       </w:pPr>
     </w:p>
@@ -2588,14 +2622,14 @@
     <w:p>
       <w:pPr>
         <w:rPr>
-          <w:del w:id="50" w:author="kyle O'Reilly" w:date="2026-10-21T20:28:00Z" w16du:dateUtc="2026-10-21T19:28:00Z"/>
-        </w:rPr>
-      </w:pPr>
-    </w:p>
-    <w:p>
-      <w:pPr>
-        <w:rPr>
-          <w:del w:id="51" w:author="kyle O'Reilly" w:date="2026-10-20T21:26:00Z" w16du:dateUtc="2026-10-20T20:26:00Z"/>
+          <w:del w:id="39" w:author="kyle O'Reilly" w:date="2026-10-21T20:28:00Z" w16du:dateUtc="2026-10-21T19:28:00Z"/>
+        </w:rPr>
+      </w:pPr>
+    </w:p>
+    <w:p>
+      <w:pPr>
+        <w:rPr>
+          <w:del w:id="40" w:author="kyle O'Reilly" w:date="2026-10-20T21:26:00Z" w16du:dateUtc="2026-10-20T20:26:00Z"/>
         </w:rPr>
       </w:pPr>
     </w:p>
@@ -2617,31 +2651,31 @@
         <w:spacing w:line="360" w:lineRule="auto"/>
         <w:jc w:val="both"/>
         <w:rPr>
-          <w:ins w:id="52" w:author="kyle O'Reilly" w:date="2026-10-21T20:28:00Z" w16du:dateUtc="2026-10-21T19:28:00Z"/>
-        </w:rPr>
-        <w:pPrChange w:id="53" w:author="kyle O'Reilly" w:date="2026-10-21T20:33:00Z" w16du:dateUtc="2026-10-21T19:33:00Z">
+          <w:ins w:id="41" w:author="kyle O'Reilly" w:date="2026-10-21T20:28:00Z" w16du:dateUtc="2026-10-21T19:28:00Z"/>
+        </w:rPr>
+        <w:pPrChange w:id="42" w:author="kyle O'Reilly" w:date="2026-10-21T20:33:00Z" w16du:dateUtc="2026-10-21T19:33:00Z">
           <w:pPr>
             <w:pStyle w:val="Heading1"/>
           </w:pPr>
         </w:pPrChange>
       </w:pPr>
-      <w:bookmarkStart w:id="54" w:name="_Toc243507765"/>
-      <w:ins w:id="55" w:author="kyle O'Reilly" w:date="2026-10-20T21:25:00Z" w16du:dateUtc="2026-10-20T20:25:00Z">
+      <w:bookmarkStart w:id="43" w:name="_Toc243520523"/>
+      <w:ins w:id="44" w:author="kyle O'Reilly" w:date="2026-10-20T21:25:00Z" w16du:dateUtc="2026-10-20T20:25:00Z">
         <w:r>
           <w:lastRenderedPageBreak/>
           <w:t>1.</w:t>
         </w:r>
       </w:ins>
-      <w:ins w:id="56" w:author="kyle O'Reilly" w:date="2026-10-20T21:26:00Z" w16du:dateUtc="2026-10-20T20:26:00Z">
+      <w:ins w:id="45" w:author="kyle O'Reilly" w:date="2026-10-20T21:26:00Z" w16du:dateUtc="2026-10-20T20:26:00Z">
         <w:r>
           <w:t xml:space="preserve"> </w:t>
         </w:r>
       </w:ins>
-      <w:ins w:id="57" w:author="kyle O'Reilly" w:date="2026-10-21T20:28:00Z" w16du:dateUtc="2026-10-21T19:28:00Z">
+      <w:ins w:id="46" w:author="kyle O'Reilly" w:date="2026-10-21T20:28:00Z" w16du:dateUtc="2026-10-21T19:28:00Z">
         <w:r>
           <w:t>Project Title</w:t>
         </w:r>
-        <w:bookmarkEnd w:id="54"/>
+        <w:bookmarkEnd w:id="43"/>
       </w:ins>
     </w:p>
     <w:p>
@@ -2649,18 +2683,18 @@
         <w:spacing w:line="360" w:lineRule="auto"/>
         <w:jc w:val="both"/>
         <w:rPr>
-          <w:ins w:id="58" w:author="kyle O'Reilly" w:date="2026-10-21T20:32:00Z" w16du:dateUtc="2026-10-21T19:32:00Z"/>
-        </w:rPr>
-        <w:pPrChange w:id="59" w:author="kyle O'Reilly" w:date="2026-10-21T20:33:00Z" w16du:dateUtc="2026-10-21T19:33:00Z">
+          <w:ins w:id="47" w:author="kyle O'Reilly" w:date="2026-10-21T20:32:00Z" w16du:dateUtc="2026-10-21T19:32:00Z"/>
+        </w:rPr>
+        <w:pPrChange w:id="48" w:author="kyle O'Reilly" w:date="2026-10-21T20:33:00Z" w16du:dateUtc="2026-10-21T19:33:00Z">
           <w:pPr/>
         </w:pPrChange>
       </w:pPr>
-      <w:ins w:id="60" w:author="kyle O'Reilly" w:date="2026-10-21T20:28:00Z" w16du:dateUtc="2026-10-21T19:28:00Z">
+      <w:ins w:id="49" w:author="kyle O'Reilly" w:date="2026-10-21T20:28:00Z" w16du:dateUtc="2026-10-21T19:28:00Z">
         <w:r>
           <w:t xml:space="preserve">Assessing the Accuracy of Machine </w:t>
         </w:r>
       </w:ins>
-      <w:ins w:id="61" w:author="kyle O'Reilly" w:date="2026-10-21T20:29:00Z" w16du:dateUtc="2026-10-21T19:29:00Z">
+      <w:ins w:id="50" w:author="kyle O'Reilly" w:date="2026-10-21T20:29:00Z" w16du:dateUtc="2026-10-21T19:29:00Z">
         <w:r>
           <w:t>Learning Models in Predicting F</w:t>
         </w:r>
@@ -2683,7 +2717,7 @@
           <w:t>wi</w:t>
         </w:r>
       </w:ins>
-      <w:ins w:id="62" w:author="kyle O'Reilly" w:date="2026-10-21T20:30:00Z" w16du:dateUtc="2026-10-21T19:30:00Z">
+      <w:ins w:id="51" w:author="kyle O'Reilly" w:date="2026-10-21T20:30:00Z" w16du:dateUtc="2026-10-21T19:30:00Z">
         <w:r>
           <w:t xml:space="preserve">th Different </w:t>
         </w:r>
@@ -2695,7 +2729,7 @@
     <w:p>
       <w:pPr>
         <w:rPr>
-          <w:ins w:id="63" w:author="kyle O'Reilly" w:date="2026-10-21T20:28:00Z" w16du:dateUtc="2026-10-21T19:28:00Z"/>
+          <w:ins w:id="52" w:author="kyle O'Reilly" w:date="2026-10-21T20:28:00Z" w16du:dateUtc="2026-10-21T19:28:00Z"/>
         </w:rPr>
       </w:pPr>
     </w:p>
@@ -2703,29 +2737,29 @@
       <w:pPr>
         <w:pStyle w:val="Heading1"/>
         <w:rPr>
-          <w:ins w:id="64" w:author="kyle O'Reilly" w:date="2026-10-21T20:39:00Z" w16du:dateUtc="2026-10-21T19:39:00Z"/>
-        </w:rPr>
-      </w:pPr>
-      <w:bookmarkStart w:id="65" w:name="_Toc243507766"/>
-      <w:ins w:id="66" w:author="kyle O'Reilly" w:date="2026-10-21T20:28:00Z" w16du:dateUtc="2026-10-21T19:28:00Z">
+          <w:ins w:id="53" w:author="kyle O'Reilly" w:date="2026-10-21T20:39:00Z" w16du:dateUtc="2026-10-21T19:39:00Z"/>
+        </w:rPr>
+      </w:pPr>
+      <w:bookmarkStart w:id="54" w:name="_Toc243520524"/>
+      <w:ins w:id="55" w:author="kyle O'Reilly" w:date="2026-10-21T20:28:00Z" w16du:dateUtc="2026-10-21T19:28:00Z">
         <w:r>
           <w:t>2. Introduction</w:t>
         </w:r>
       </w:ins>
-      <w:bookmarkEnd w:id="65"/>
-    </w:p>
-    <w:p>
-      <w:pPr>
-        <w:rPr>
-          <w:ins w:id="67" w:author="kyle O'Reilly" w:date="2026-10-20T21:26:00Z" w16du:dateUtc="2026-10-20T20:26:00Z"/>
-        </w:rPr>
-        <w:pPrChange w:id="68" w:author="kyle O'Reilly" w:date="2026-10-21T20:39:00Z" w16du:dateUtc="2026-10-21T19:39:00Z">
+      <w:bookmarkEnd w:id="54"/>
+    </w:p>
+    <w:p>
+      <w:pPr>
+        <w:rPr>
+          <w:ins w:id="56" w:author="kyle O'Reilly" w:date="2026-10-20T21:26:00Z" w16du:dateUtc="2026-10-20T20:26:00Z"/>
+        </w:rPr>
+        <w:pPrChange w:id="57" w:author="kyle O'Reilly" w:date="2026-10-21T20:39:00Z" w16du:dateUtc="2026-10-21T19:39:00Z">
           <w:pPr>
             <w:pStyle w:val="Heading1"/>
           </w:pPr>
         </w:pPrChange>
       </w:pPr>
-      <w:ins w:id="69" w:author="kyle O'Reilly" w:date="2026-10-21T20:39:00Z" w16du:dateUtc="2026-10-21T19:39:00Z">
+      <w:ins w:id="58" w:author="kyle O'Reilly" w:date="2026-10-21T20:39:00Z" w16du:dateUtc="2026-10-21T19:39:00Z">
         <w:r>
           <w:t>?</w:t>
         </w:r>
@@ -2734,7 +2768,7 @@
     <w:p>
       <w:pPr>
         <w:rPr>
-          <w:ins w:id="70" w:author="kyle O'Reilly" w:date="2026-10-21T20:39:00Z" w16du:dateUtc="2026-10-21T19:39:00Z"/>
+          <w:ins w:id="59" w:author="kyle O'Reilly" w:date="2026-10-21T20:39:00Z" w16du:dateUtc="2026-10-21T19:39:00Z"/>
         </w:rPr>
       </w:pPr>
     </w:p>
@@ -2742,18 +2776,18 @@
       <w:pPr>
         <w:pStyle w:val="Heading1"/>
         <w:rPr>
-          <w:ins w:id="71" w:author="kyle O'Reilly" w:date="2026-10-21T20:39:00Z" w16du:dateUtc="2026-10-21T19:39:00Z"/>
-        </w:rPr>
-        <w:pPrChange w:id="72" w:author="kyle O'Reilly" w:date="2026-10-21T20:40:00Z" w16du:dateUtc="2026-10-21T19:40:00Z">
+          <w:ins w:id="60" w:author="kyle O'Reilly" w:date="2026-10-21T20:39:00Z" w16du:dateUtc="2026-10-21T19:39:00Z"/>
+        </w:rPr>
+        <w:pPrChange w:id="61" w:author="kyle O'Reilly" w:date="2026-10-21T20:40:00Z" w16du:dateUtc="2026-10-21T19:40:00Z">
           <w:pPr/>
         </w:pPrChange>
       </w:pPr>
-      <w:bookmarkStart w:id="73" w:name="_Toc243507767"/>
-      <w:ins w:id="74" w:author="kyle O'Reilly" w:date="2026-10-21T20:39:00Z" w16du:dateUtc="2026-10-21T19:39:00Z">
+      <w:bookmarkStart w:id="62" w:name="_Toc243520525"/>
+      <w:ins w:id="63" w:author="kyle O'Reilly" w:date="2026-10-21T20:39:00Z" w16du:dateUtc="2026-10-21T19:39:00Z">
         <w:r>
           <w:t>3. Problem Definition</w:t>
         </w:r>
-        <w:bookmarkEnd w:id="73"/>
+        <w:bookmarkEnd w:id="62"/>
         <w:r>
           <w:t xml:space="preserve"> </w:t>
         </w:r>
@@ -2762,10 +2796,10 @@
     <w:p>
       <w:pPr>
         <w:rPr>
-          <w:ins w:id="75" w:author="kyle O'Reilly" w:date="2026-10-21T20:39:00Z" w16du:dateUtc="2026-10-21T19:39:00Z"/>
-        </w:rPr>
-      </w:pPr>
-      <w:ins w:id="76" w:author="kyle O'Reilly" w:date="2026-10-21T20:39:00Z" w16du:dateUtc="2026-10-21T19:39:00Z">
+          <w:ins w:id="64" w:author="kyle O'Reilly" w:date="2026-10-21T20:39:00Z" w16du:dateUtc="2026-10-21T19:39:00Z"/>
+        </w:rPr>
+      </w:pPr>
+      <w:ins w:id="65" w:author="kyle O'Reilly" w:date="2026-10-21T20:39:00Z" w16du:dateUtc="2026-10-21T19:39:00Z">
         <w:r>
           <w:t>?</w:t>
         </w:r>
@@ -2775,9 +2809,9 @@
       <w:pPr>
         <w:pStyle w:val="Heading1"/>
         <w:rPr>
-          <w:ins w:id="77" w:author="kyle O'Reilly" w:date="2026-10-21T20:39:00Z" w16du:dateUtc="2026-10-21T19:39:00Z"/>
-        </w:rPr>
-        <w:pPrChange w:id="78" w:author="kyle O'Reilly" w:date="2026-10-21T20:40:00Z" w16du:dateUtc="2026-10-21T19:40:00Z">
+          <w:ins w:id="66" w:author="kyle O'Reilly" w:date="2026-10-21T20:39:00Z" w16du:dateUtc="2026-10-21T19:39:00Z"/>
+        </w:rPr>
+        <w:pPrChange w:id="67" w:author="kyle O'Reilly" w:date="2026-10-21T20:40:00Z" w16du:dateUtc="2026-10-21T19:40:00Z">
           <w:pPr/>
         </w:pPrChange>
       </w:pPr>
@@ -2788,23 +2822,23 @@
         <w:spacing w:line="360" w:lineRule="auto"/>
         <w:jc w:val="both"/>
         <w:rPr>
-          <w:ins w:id="79" w:author="kyle O'Reilly" w:date="2026-10-21T20:40:00Z" w16du:dateUtc="2026-10-21T19:40:00Z"/>
-        </w:rPr>
-        <w:pPrChange w:id="80" w:author="kyle O'Reilly" w:date="2026-10-21T23:18:00Z" w16du:dateUtc="2026-10-21T22:18:00Z">
+          <w:ins w:id="68" w:author="kyle O'Reilly" w:date="2026-10-21T20:40:00Z" w16du:dateUtc="2026-10-21T19:40:00Z"/>
+        </w:rPr>
+        <w:pPrChange w:id="69" w:author="kyle O'Reilly" w:date="2026-10-21T23:18:00Z" w16du:dateUtc="2026-10-21T22:18:00Z">
           <w:pPr/>
         </w:pPrChange>
       </w:pPr>
-      <w:bookmarkStart w:id="81" w:name="_Toc243507768"/>
-      <w:ins w:id="82" w:author="kyle O'Reilly" w:date="2026-10-21T20:39:00Z" w16du:dateUtc="2026-10-21T19:39:00Z">
+      <w:bookmarkStart w:id="70" w:name="_Toc243520526"/>
+      <w:ins w:id="71" w:author="kyle O'Reilly" w:date="2026-10-21T20:39:00Z" w16du:dateUtc="2026-10-21T19:39:00Z">
         <w:r>
           <w:t>4. Aim</w:t>
         </w:r>
       </w:ins>
-      <w:ins w:id="83" w:author="kyle O'Reilly" w:date="2026-10-21T20:40:00Z" w16du:dateUtc="2026-10-21T19:40:00Z">
+      <w:ins w:id="72" w:author="kyle O'Reilly" w:date="2026-10-21T20:40:00Z" w16du:dateUtc="2026-10-21T19:40:00Z">
         <w:r>
           <w:t>, Objectives and Hypothesis</w:t>
         </w:r>
-        <w:bookmarkEnd w:id="81"/>
+        <w:bookmarkEnd w:id="70"/>
         <w:r>
           <w:t xml:space="preserve"> </w:t>
         </w:r>
@@ -2815,18 +2849,18 @@
         <w:spacing w:line="360" w:lineRule="auto"/>
         <w:jc w:val="both"/>
         <w:rPr>
-          <w:ins w:id="84" w:author="kyle O'Reilly" w:date="2026-10-21T23:16:00Z" w16du:dateUtc="2026-10-21T22:16:00Z"/>
-        </w:rPr>
-        <w:pPrChange w:id="85" w:author="kyle O'Reilly" w:date="2026-10-21T23:18:00Z" w16du:dateUtc="2026-10-21T22:18:00Z">
+          <w:ins w:id="73" w:author="kyle O'Reilly" w:date="2026-10-21T23:16:00Z" w16du:dateUtc="2026-10-21T22:16:00Z"/>
+        </w:rPr>
+        <w:pPrChange w:id="74" w:author="kyle O'Reilly" w:date="2026-10-21T23:18:00Z" w16du:dateUtc="2026-10-21T22:18:00Z">
           <w:pPr/>
         </w:pPrChange>
       </w:pPr>
-      <w:ins w:id="86" w:author="kyle O'Reilly" w:date="2026-10-21T23:10:00Z" w16du:dateUtc="2026-10-21T22:10:00Z">
+      <w:ins w:id="75" w:author="kyle O'Reilly" w:date="2026-10-21T23:10:00Z" w16du:dateUtc="2026-10-21T22:10:00Z">
         <w:r>
           <w:rPr>
             <w:b/>
             <w:bCs/>
-            <w:rPrChange w:id="87" w:author="kyle O'Reilly" w:date="2026-10-21T23:11:00Z" w16du:dateUtc="2026-10-21T22:11:00Z">
+            <w:rPrChange w:id="76" w:author="kyle O'Reilly" w:date="2026-10-21T23:11:00Z" w16du:dateUtc="2026-10-21T22:11:00Z">
               <w:rPr/>
             </w:rPrChange>
           </w:rPr>
@@ -2842,61 +2876,71 @@
         <w:spacing w:line="360" w:lineRule="auto"/>
         <w:jc w:val="both"/>
         <w:rPr>
-          <w:ins w:id="88" w:author="kyle O'Reilly" w:date="2026-10-21T23:11:00Z" w16du:dateUtc="2026-10-21T22:11:00Z"/>
-        </w:rPr>
-        <w:pPrChange w:id="89" w:author="kyle O'Reilly" w:date="2026-10-21T23:18:00Z" w16du:dateUtc="2026-10-21T22:18:00Z">
+          <w:ins w:id="77" w:author="kyle O'Reilly" w:date="2026-10-21T23:11:00Z" w16du:dateUtc="2026-10-21T22:11:00Z"/>
+        </w:rPr>
+        <w:pPrChange w:id="78" w:author="kyle O'Reilly" w:date="2026-10-21T23:18:00Z" w16du:dateUtc="2026-10-21T22:18:00Z">
           <w:pPr/>
         </w:pPrChange>
       </w:pPr>
-      <w:ins w:id="90" w:author="kyle O'Reilly" w:date="2026-10-21T23:10:00Z" w16du:dateUtc="2026-10-21T22:10:00Z">
+      <w:ins w:id="79" w:author="kyle O'Reilly" w:date="2026-10-21T23:10:00Z" w16du:dateUtc="2026-10-21T22:10:00Z">
         <w:r>
           <w:t xml:space="preserve">To compare the accuracy of Linear Regression, Random Forest and a </w:t>
         </w:r>
       </w:ins>
-      <w:ins w:id="91" w:author="kyle O'Reilly" w:date="2026-10-21T23:14:00Z" w16du:dateUtc="2026-10-21T22:14:00Z">
+      <w:ins w:id="80" w:author="kyle O'Reilly" w:date="2026-10-21T23:14:00Z" w16du:dateUtc="2026-10-21T22:14:00Z">
         <w:r>
           <w:t>n</w:t>
         </w:r>
       </w:ins>
-      <w:ins w:id="92" w:author="kyle O'Reilly" w:date="2026-10-21T23:10:00Z" w16du:dateUtc="2026-10-21T22:10:00Z">
+      <w:ins w:id="81" w:author="kyle O'Reilly" w:date="2026-10-21T23:10:00Z" w16du:dateUtc="2026-10-21T22:10:00Z">
         <w:r>
           <w:t xml:space="preserve">aïve </w:t>
         </w:r>
       </w:ins>
-      <w:ins w:id="93" w:author="kyle O'Reilly" w:date="2026-10-21T23:14:00Z" w16du:dateUtc="2026-10-21T22:14:00Z">
+      <w:ins w:id="82" w:author="kyle O'Reilly" w:date="2026-10-21T23:14:00Z" w16du:dateUtc="2026-10-21T22:14:00Z">
         <w:r>
           <w:t>b</w:t>
         </w:r>
       </w:ins>
-      <w:ins w:id="94" w:author="kyle O'Reilly" w:date="2026-10-21T23:10:00Z" w16du:dateUtc="2026-10-21T22:10:00Z">
+      <w:ins w:id="83" w:author="kyle O'Reilly" w:date="2026-10-21T23:10:00Z" w16du:dateUtc="2026-10-21T22:10:00Z">
         <w:r>
           <w:t xml:space="preserve">aseline when predicting stock </w:t>
         </w:r>
         <w:r>
-          <w:t xml:space="preserve">prices twenty days after one </w:t>
-        </w:r>
-      </w:ins>
-      <w:ins w:id="95" w:author="kyle O'Reilly" w:date="2026-10-21T23:11:00Z" w16du:dateUtc="2026-10-21T22:11:00Z">
+          <w:t xml:space="preserve">prices twenty </w:t>
+        </w:r>
+      </w:ins>
+      <w:ins w:id="84" w:author="kyle O'Reilly" w:date="2026-10-22T00:14:00Z" w16du:dateUtc="2026-10-21T23:14:00Z">
+        <w:r>
+          <w:t xml:space="preserve">trading </w:t>
+        </w:r>
+      </w:ins>
+      <w:ins w:id="85" w:author="kyle O'Reilly" w:date="2026-10-21T23:10:00Z" w16du:dateUtc="2026-10-21T22:10:00Z">
+        <w:r>
+          <w:t xml:space="preserve">days after one </w:t>
+        </w:r>
+      </w:ins>
+      <w:ins w:id="86" w:author="kyle O'Reilly" w:date="2026-10-21T23:11:00Z" w16du:dateUtc="2026-10-21T22:11:00Z">
         <w:r>
           <w:t>historical cut-off stock date from the JPM</w:t>
         </w:r>
       </w:ins>
-      <w:ins w:id="96" w:author="kyle O'Reilly" w:date="2026-10-22T00:04:00Z" w16du:dateUtc="2026-10-21T23:04:00Z">
+      <w:ins w:id="87" w:author="kyle O'Reilly" w:date="2026-10-22T00:04:00Z" w16du:dateUtc="2026-10-21T23:04:00Z">
         <w:r>
           <w:t>.US</w:t>
         </w:r>
       </w:ins>
-      <w:ins w:id="97" w:author="kyle O'Reilly" w:date="2026-10-21T23:11:00Z" w16du:dateUtc="2026-10-21T22:11:00Z">
+      <w:ins w:id="88" w:author="kyle O'Reilly" w:date="2026-10-21T23:11:00Z" w16du:dateUtc="2026-10-21T22:11:00Z">
         <w:r>
           <w:t>, KO</w:t>
         </w:r>
       </w:ins>
-      <w:ins w:id="98" w:author="kyle O'Reilly" w:date="2026-10-22T00:04:00Z" w16du:dateUtc="2026-10-21T23:04:00Z">
+      <w:ins w:id="89" w:author="kyle O'Reilly" w:date="2026-10-22T00:04:00Z" w16du:dateUtc="2026-10-21T23:04:00Z">
         <w:r>
           <w:t>.US</w:t>
         </w:r>
       </w:ins>
-      <w:ins w:id="99" w:author="kyle O'Reilly" w:date="2026-10-21T23:11:00Z" w16du:dateUtc="2026-10-21T22:11:00Z">
+      <w:ins w:id="90" w:author="kyle O'Reilly" w:date="2026-10-21T23:11:00Z" w16du:dateUtc="2026-10-21T22:11:00Z">
         <w:r>
           <w:t xml:space="preserve"> and </w:t>
         </w:r>
@@ -2904,7 +2948,7 @@
           <w:t>INTC.</w:t>
         </w:r>
       </w:ins>
-      <w:ins w:id="100" w:author="kyle O'Reilly" w:date="2026-10-22T00:04:00Z" w16du:dateUtc="2026-10-21T23:04:00Z">
+      <w:ins w:id="91" w:author="kyle O'Reilly" w:date="2026-10-22T00:04:00Z" w16du:dateUtc="2026-10-21T23:04:00Z">
         <w:r>
           <w:t>US.</w:t>
         </w:r>
@@ -2915,25 +2959,25 @@
         <w:spacing w:line="360" w:lineRule="auto"/>
         <w:jc w:val="both"/>
         <w:rPr>
-          <w:ins w:id="101" w:author="kyle O'Reilly" w:date="2026-10-21T23:11:00Z" w16du:dateUtc="2026-10-21T22:11:00Z"/>
+          <w:ins w:id="92" w:author="kyle O'Reilly" w:date="2026-10-21T23:11:00Z" w16du:dateUtc="2026-10-21T22:11:00Z"/>
           <w:b/>
           <w:bCs/>
-          <w:rPrChange w:id="102" w:author="kyle O'Reilly" w:date="2026-10-21T23:16:00Z" w16du:dateUtc="2026-10-21T22:16:00Z">
+          <w:rPrChange w:id="93" w:author="kyle O'Reilly" w:date="2026-10-21T23:16:00Z" w16du:dateUtc="2026-10-21T22:16:00Z">
             <w:rPr>
-              <w:ins w:id="103" w:author="kyle O'Reilly" w:date="2026-10-21T23:11:00Z" w16du:dateUtc="2026-10-21T22:11:00Z"/>
+              <w:ins w:id="94" w:author="kyle O'Reilly" w:date="2026-10-21T23:11:00Z" w16du:dateUtc="2026-10-21T22:11:00Z"/>
             </w:rPr>
           </w:rPrChange>
         </w:rPr>
-        <w:pPrChange w:id="104" w:author="kyle O'Reilly" w:date="2026-10-21T23:18:00Z" w16du:dateUtc="2026-10-21T22:18:00Z">
+        <w:pPrChange w:id="95" w:author="kyle O'Reilly" w:date="2026-10-21T23:18:00Z" w16du:dateUtc="2026-10-21T22:18:00Z">
           <w:pPr/>
         </w:pPrChange>
       </w:pPr>
-      <w:ins w:id="105" w:author="kyle O'Reilly" w:date="2026-10-21T23:11:00Z" w16du:dateUtc="2026-10-21T22:11:00Z">
+      <w:ins w:id="96" w:author="kyle O'Reilly" w:date="2026-10-21T23:11:00Z" w16du:dateUtc="2026-10-21T22:11:00Z">
         <w:r>
           <w:rPr>
             <w:b/>
             <w:bCs/>
-            <w:rPrChange w:id="106" w:author="kyle O'Reilly" w:date="2026-10-21T23:16:00Z" w16du:dateUtc="2026-10-21T22:16:00Z">
+            <w:rPrChange w:id="97" w:author="kyle O'Reilly" w:date="2026-10-21T23:16:00Z" w16du:dateUtc="2026-10-21T22:16:00Z">
               <w:rPr/>
             </w:rPrChange>
           </w:rPr>
@@ -2951,9 +2995,9 @@
         <w:spacing w:line="360" w:lineRule="auto"/>
         <w:jc w:val="both"/>
         <w:rPr>
-          <w:ins w:id="107" w:author="kyle O'Reilly" w:date="2026-10-21T23:13:00Z" w16du:dateUtc="2026-10-21T22:13:00Z"/>
-        </w:rPr>
-        <w:pPrChange w:id="108" w:author="kyle O'Reilly" w:date="2026-10-21T23:18:00Z" w16du:dateUtc="2026-10-21T22:18:00Z">
+          <w:ins w:id="98" w:author="kyle O'Reilly" w:date="2026-10-21T23:13:00Z" w16du:dateUtc="2026-10-21T22:13:00Z"/>
+        </w:rPr>
+        <w:pPrChange w:id="99" w:author="kyle O'Reilly" w:date="2026-10-21T23:18:00Z" w16du:dateUtc="2026-10-21T22:18:00Z">
           <w:pPr>
             <w:pStyle w:val="ListParagraph"/>
             <w:numPr>
@@ -2963,22 +3007,22 @@
           </w:pPr>
         </w:pPrChange>
       </w:pPr>
-      <w:ins w:id="109" w:author="kyle O'Reilly" w:date="2026-10-21T23:11:00Z" w16du:dateUtc="2026-10-21T22:11:00Z">
+      <w:ins w:id="100" w:author="kyle O'Reilly" w:date="2026-10-21T23:11:00Z" w16du:dateUtc="2026-10-21T22:11:00Z">
         <w:r>
           <w:t>S</w:t>
         </w:r>
       </w:ins>
-      <w:ins w:id="110" w:author="kyle O'Reilly" w:date="2026-10-21T23:12:00Z" w16du:dateUtc="2026-10-21T22:12:00Z">
+      <w:ins w:id="101" w:author="kyle O'Reilly" w:date="2026-10-21T23:12:00Z" w16du:dateUtc="2026-10-21T22:12:00Z">
         <w:r>
           <w:t>elect JPM</w:t>
         </w:r>
       </w:ins>
-      <w:ins w:id="111" w:author="kyle O'Reilly" w:date="2026-10-21T23:57:00Z" w16du:dateUtc="2026-10-21T22:57:00Z">
+      <w:ins w:id="102" w:author="kyle O'Reilly" w:date="2026-10-21T23:57:00Z" w16du:dateUtc="2026-10-21T22:57:00Z">
         <w:r>
           <w:t>.US</w:t>
         </w:r>
       </w:ins>
-      <w:ins w:id="112" w:author="kyle O'Reilly" w:date="2026-10-21T23:12:00Z" w16du:dateUtc="2026-10-21T22:12:00Z">
+      <w:ins w:id="103" w:author="kyle O'Reilly" w:date="2026-10-21T23:12:00Z" w16du:dateUtc="2026-10-21T22:12:00Z">
         <w:r>
           <w:t>,</w:t>
         </w:r>
@@ -2986,37 +3030,37 @@
           <w:t xml:space="preserve"> KO</w:t>
         </w:r>
       </w:ins>
-      <w:ins w:id="113" w:author="kyle O'Reilly" w:date="2026-10-21T23:57:00Z" w16du:dateUtc="2026-10-21T22:57:00Z">
+      <w:ins w:id="104" w:author="kyle O'Reilly" w:date="2026-10-21T23:57:00Z" w16du:dateUtc="2026-10-21T22:57:00Z">
         <w:r>
           <w:t>.US</w:t>
         </w:r>
       </w:ins>
-      <w:ins w:id="114" w:author="kyle O'Reilly" w:date="2026-10-21T23:12:00Z" w16du:dateUtc="2026-10-21T22:12:00Z">
+      <w:ins w:id="105" w:author="kyle O'Reilly" w:date="2026-10-21T23:12:00Z" w16du:dateUtc="2026-10-21T22:12:00Z">
         <w:r>
           <w:t xml:space="preserve"> and INTC</w:t>
         </w:r>
       </w:ins>
-      <w:ins w:id="115" w:author="kyle O'Reilly" w:date="2026-10-21T23:57:00Z" w16du:dateUtc="2026-10-21T22:57:00Z">
+      <w:ins w:id="106" w:author="kyle O'Reilly" w:date="2026-10-21T23:57:00Z" w16du:dateUtc="2026-10-21T22:57:00Z">
         <w:r>
           <w:t>.US</w:t>
         </w:r>
       </w:ins>
-      <w:ins w:id="116" w:author="kyle O'Reilly" w:date="2026-10-21T23:12:00Z" w16du:dateUtc="2026-10-21T22:12:00Z">
+      <w:ins w:id="107" w:author="kyle O'Reilly" w:date="2026-10-21T23:12:00Z" w16du:dateUtc="2026-10-21T22:12:00Z">
         <w:r>
           <w:t>, and examine comparable published</w:t>
         </w:r>
       </w:ins>
-      <w:ins w:id="117" w:author="kyle O'Reilly" w:date="2026-10-21T23:58:00Z" w16du:dateUtc="2026-10-21T22:58:00Z">
+      <w:ins w:id="108" w:author="kyle O'Reilly" w:date="2026-10-21T23:58:00Z" w16du:dateUtc="2026-10-21T22:58:00Z">
         <w:r>
           <w:t xml:space="preserve"> Trading 212</w:t>
         </w:r>
       </w:ins>
-      <w:ins w:id="118" w:author="kyle O'Reilly" w:date="2026-10-21T23:12:00Z" w16du:dateUtc="2026-10-21T22:12:00Z">
+      <w:ins w:id="109" w:author="kyle O'Reilly" w:date="2026-10-21T23:12:00Z" w16du:dateUtc="2026-10-21T22:12:00Z">
         <w:r>
           <w:t xml:space="preserve"> volatility information to justify their proposed contra</w:t>
         </w:r>
       </w:ins>
-      <w:ins w:id="119" w:author="kyle O'Reilly" w:date="2026-10-21T23:13:00Z" w16du:dateUtc="2026-10-21T22:13:00Z">
+      <w:ins w:id="110" w:author="kyle O'Reilly" w:date="2026-10-21T23:13:00Z" w16du:dateUtc="2026-10-21T22:13:00Z">
         <w:r>
           <w:t>sting volatility levels.</w:t>
         </w:r>
@@ -3032,9 +3076,9 @@
         <w:spacing w:line="360" w:lineRule="auto"/>
         <w:jc w:val="both"/>
         <w:rPr>
-          <w:ins w:id="120" w:author="kyle O'Reilly" w:date="2026-10-21T23:14:00Z" w16du:dateUtc="2026-10-21T22:14:00Z"/>
-        </w:rPr>
-        <w:pPrChange w:id="121" w:author="kyle O'Reilly" w:date="2026-10-21T23:18:00Z" w16du:dateUtc="2026-10-21T22:18:00Z">
+          <w:ins w:id="111" w:author="kyle O'Reilly" w:date="2026-10-21T23:14:00Z" w16du:dateUtc="2026-10-21T22:14:00Z"/>
+        </w:rPr>
+        <w:pPrChange w:id="112" w:author="kyle O'Reilly" w:date="2026-10-21T23:18:00Z" w16du:dateUtc="2026-10-21T22:18:00Z">
           <w:pPr>
             <w:pStyle w:val="ListParagraph"/>
             <w:numPr>
@@ -3044,7 +3088,7 @@
           </w:pPr>
         </w:pPrChange>
       </w:pPr>
-      <w:ins w:id="122" w:author="kyle O'Reilly" w:date="2026-10-21T23:13:00Z" w16du:dateUtc="2026-10-21T22:13:00Z">
+      <w:ins w:id="113" w:author="kyle O'Reilly" w:date="2026-10-21T23:13:00Z" w16du:dateUtc="2026-10-21T22:13:00Z">
         <w:r>
           <w:t xml:space="preserve">Collect, clean and analyse historical stock data </w:t>
         </w:r>
@@ -3052,7 +3096,7 @@
           <w:t>from Stooq, and prepare simple historical</w:t>
         </w:r>
       </w:ins>
-      <w:ins w:id="123" w:author="kyle O'Reilly" w:date="2026-10-21T23:14:00Z" w16du:dateUtc="2026-10-21T22:14:00Z">
+      <w:ins w:id="114" w:author="kyle O'Reilly" w:date="2026-10-21T23:14:00Z" w16du:dateUtc="2026-10-21T22:14:00Z">
         <w:r>
           <w:t xml:space="preserve"> price features for the forecasting models.</w:t>
         </w:r>
@@ -3068,9 +3112,9 @@
         <w:spacing w:line="360" w:lineRule="auto"/>
         <w:jc w:val="both"/>
         <w:rPr>
-          <w:ins w:id="124" w:author="kyle O'Reilly" w:date="2026-10-21T23:14:00Z" w16du:dateUtc="2026-10-21T22:14:00Z"/>
-        </w:rPr>
-        <w:pPrChange w:id="125" w:author="kyle O'Reilly" w:date="2026-10-21T23:18:00Z" w16du:dateUtc="2026-10-21T22:18:00Z">
+          <w:ins w:id="115" w:author="kyle O'Reilly" w:date="2026-10-21T23:14:00Z" w16du:dateUtc="2026-10-21T22:14:00Z"/>
+        </w:rPr>
+        <w:pPrChange w:id="116" w:author="kyle O'Reilly" w:date="2026-10-21T23:18:00Z" w16du:dateUtc="2026-10-21T22:18:00Z">
           <w:pPr>
             <w:pStyle w:val="ListParagraph"/>
             <w:numPr>
@@ -3080,7 +3124,7 @@
           </w:pPr>
         </w:pPrChange>
       </w:pPr>
-      <w:ins w:id="126" w:author="kyle O'Reilly" w:date="2026-10-21T23:14:00Z" w16du:dateUtc="2026-10-21T22:14:00Z">
+      <w:ins w:id="117" w:author="kyle O'Reilly" w:date="2026-10-21T23:14:00Z" w16du:dateUtc="2026-10-21T22:14:00Z">
         <w:r>
           <w:t>Develop Linear Regression and Random Forest models and establish a naïve baseline for each selected stock.</w:t>
         </w:r>
@@ -3096,9 +3140,9 @@
         <w:spacing w:line="360" w:lineRule="auto"/>
         <w:jc w:val="both"/>
         <w:rPr>
-          <w:ins w:id="127" w:author="kyle O'Reilly" w:date="2026-10-21T23:15:00Z" w16du:dateUtc="2026-10-21T22:15:00Z"/>
-        </w:rPr>
-        <w:pPrChange w:id="128" w:author="kyle O'Reilly" w:date="2026-10-21T23:18:00Z" w16du:dateUtc="2026-10-21T22:18:00Z">
+          <w:ins w:id="118" w:author="kyle O'Reilly" w:date="2026-10-21T23:15:00Z" w16du:dateUtc="2026-10-21T22:15:00Z"/>
+        </w:rPr>
+        <w:pPrChange w:id="119" w:author="kyle O'Reilly" w:date="2026-10-21T23:18:00Z" w16du:dateUtc="2026-10-21T22:18:00Z">
           <w:pPr>
             <w:pStyle w:val="ListParagraph"/>
             <w:numPr>
@@ -3108,12 +3152,12 @@
           </w:pPr>
         </w:pPrChange>
       </w:pPr>
-      <w:ins w:id="129" w:author="kyle O'Reilly" w:date="2026-10-21T23:14:00Z" w16du:dateUtc="2026-10-21T22:14:00Z">
+      <w:ins w:id="120" w:author="kyle O'Reilly" w:date="2026-10-21T23:14:00Z" w16du:dateUtc="2026-10-21T22:14:00Z">
         <w:r>
           <w:t>Generate nine predic</w:t>
         </w:r>
       </w:ins>
-      <w:ins w:id="130" w:author="kyle O'Reilly" w:date="2026-10-21T23:15:00Z" w16du:dateUtc="2026-10-21T22:15:00Z">
+      <w:ins w:id="121" w:author="kyle O'Reilly" w:date="2026-10-21T23:15:00Z" w16du:dateUtc="2026-10-21T22:15:00Z">
         <w:r>
           <w:t>tions and compare them with three actual closing stock prices twenty days after the historical cut-off stock date.</w:t>
         </w:r>
@@ -3129,9 +3173,9 @@
         <w:spacing w:line="360" w:lineRule="auto"/>
         <w:jc w:val="both"/>
         <w:rPr>
-          <w:ins w:id="131" w:author="kyle O'Reilly" w:date="2026-10-21T23:16:00Z" w16du:dateUtc="2026-10-21T22:16:00Z"/>
-        </w:rPr>
-        <w:pPrChange w:id="132" w:author="kyle O'Reilly" w:date="2026-10-21T23:18:00Z" w16du:dateUtc="2026-10-21T22:18:00Z">
+          <w:ins w:id="122" w:author="kyle O'Reilly" w:date="2026-10-21T23:16:00Z" w16du:dateUtc="2026-10-21T22:16:00Z"/>
+        </w:rPr>
+        <w:pPrChange w:id="123" w:author="kyle O'Reilly" w:date="2026-10-21T23:18:00Z" w16du:dateUtc="2026-10-21T22:18:00Z">
           <w:pPr>
             <w:pStyle w:val="ListParagraph"/>
             <w:numPr>
@@ -3141,7 +3185,7 @@
           </w:pPr>
         </w:pPrChange>
       </w:pPr>
-      <w:ins w:id="133" w:author="kyle O'Reilly" w:date="2026-10-21T23:15:00Z" w16du:dateUtc="2026-10-21T22:15:00Z">
+      <w:ins w:id="124" w:author="kyle O'Reilly" w:date="2026-10-21T23:15:00Z" w16du:dateUtc="2026-10-21T22:15:00Z">
         <w:r>
           <w:t>Calculate individual prediction errors</w:t>
         </w:r>
@@ -3149,7 +3193,7 @@
           <w:t>, compare approaches and discuss observed difference between the s</w:t>
         </w:r>
       </w:ins>
-      <w:ins w:id="134" w:author="kyle O'Reilly" w:date="2026-10-21T23:16:00Z" w16du:dateUtc="2026-10-21T22:16:00Z">
+      <w:ins w:id="125" w:author="kyle O'Reilly" w:date="2026-10-21T23:16:00Z" w16du:dateUtc="2026-10-21T22:16:00Z">
         <w:r>
           <w:t>elected stocks.</w:t>
         </w:r>
@@ -3160,25 +3204,25 @@
         <w:spacing w:line="360" w:lineRule="auto"/>
         <w:jc w:val="both"/>
         <w:rPr>
-          <w:ins w:id="135" w:author="kyle O'Reilly" w:date="2026-10-21T23:16:00Z" w16du:dateUtc="2026-10-21T22:16:00Z"/>
+          <w:ins w:id="126" w:author="kyle O'Reilly" w:date="2026-10-21T23:16:00Z" w16du:dateUtc="2026-10-21T22:16:00Z"/>
           <w:b/>
           <w:bCs/>
-          <w:rPrChange w:id="136" w:author="kyle O'Reilly" w:date="2026-10-21T23:16:00Z" w16du:dateUtc="2026-10-21T22:16:00Z">
+          <w:rPrChange w:id="127" w:author="kyle O'Reilly" w:date="2026-10-21T23:16:00Z" w16du:dateUtc="2026-10-21T22:16:00Z">
             <w:rPr>
-              <w:ins w:id="137" w:author="kyle O'Reilly" w:date="2026-10-21T23:16:00Z" w16du:dateUtc="2026-10-21T22:16:00Z"/>
+              <w:ins w:id="128" w:author="kyle O'Reilly" w:date="2026-10-21T23:16:00Z" w16du:dateUtc="2026-10-21T22:16:00Z"/>
             </w:rPr>
           </w:rPrChange>
         </w:rPr>
-        <w:pPrChange w:id="138" w:author="kyle O'Reilly" w:date="2026-10-21T23:18:00Z" w16du:dateUtc="2026-10-21T22:18:00Z">
+        <w:pPrChange w:id="129" w:author="kyle O'Reilly" w:date="2026-10-21T23:18:00Z" w16du:dateUtc="2026-10-21T22:18:00Z">
           <w:pPr/>
         </w:pPrChange>
       </w:pPr>
-      <w:ins w:id="139" w:author="kyle O'Reilly" w:date="2026-10-21T23:16:00Z" w16du:dateUtc="2026-10-21T22:16:00Z">
+      <w:ins w:id="130" w:author="kyle O'Reilly" w:date="2026-10-21T23:16:00Z" w16du:dateUtc="2026-10-21T22:16:00Z">
         <w:r>
           <w:rPr>
             <w:b/>
             <w:bCs/>
-            <w:rPrChange w:id="140" w:author="kyle O'Reilly" w:date="2026-10-21T23:16:00Z" w16du:dateUtc="2026-10-21T22:16:00Z">
+            <w:rPrChange w:id="131" w:author="kyle O'Reilly" w:date="2026-10-21T23:16:00Z" w16du:dateUtc="2026-10-21T22:16:00Z">
               <w:rPr/>
             </w:rPrChange>
           </w:rPr>
@@ -3191,13 +3235,13 @@
         <w:spacing w:line="360" w:lineRule="auto"/>
         <w:jc w:val="both"/>
         <w:rPr>
-          <w:ins w:id="141" w:author="kyle O'Reilly" w:date="2026-10-21T20:39:00Z" w16du:dateUtc="2026-10-21T19:39:00Z"/>
-        </w:rPr>
-        <w:pPrChange w:id="142" w:author="kyle O'Reilly" w:date="2026-10-21T23:18:00Z" w16du:dateUtc="2026-10-21T22:18:00Z">
+          <w:ins w:id="132" w:author="kyle O'Reilly" w:date="2026-10-21T20:39:00Z" w16du:dateUtc="2026-10-21T19:39:00Z"/>
+        </w:rPr>
+        <w:pPrChange w:id="133" w:author="kyle O'Reilly" w:date="2026-10-21T23:18:00Z" w16du:dateUtc="2026-10-21T22:18:00Z">
           <w:pPr/>
         </w:pPrChange>
       </w:pPr>
-      <w:ins w:id="143" w:author="kyle O'Reilly" w:date="2026-10-21T23:16:00Z" w16du:dateUtc="2026-10-21T22:16:00Z">
+      <w:ins w:id="134" w:author="kyle O'Reilly" w:date="2026-10-21T23:16:00Z" w16du:dateUtc="2026-10-21T22:16:00Z">
         <w:r>
           <w:lastRenderedPageBreak/>
           <w:t xml:space="preserve">The stock with the highest documented </w:t>
@@ -3206,7 +3250,7 @@
           <w:t>historical volatility will have the highest</w:t>
         </w:r>
       </w:ins>
-      <w:ins w:id="144" w:author="kyle O'Reilly" w:date="2026-10-21T23:17:00Z" w16du:dateUtc="2026-10-21T22:17:00Z">
+      <w:ins w:id="135" w:author="kyle O'Reilly" w:date="2026-10-21T23:17:00Z" w16du:dateUtc="2026-10-21T22:17:00Z">
         <w:r>
           <w:t xml:space="preserve"> average absolute percentage forecasting error across the three forecasting methods. This explo</w:t>
         </w:r>
@@ -3218,7 +3262,7 @@
     <w:p>
       <w:pPr>
         <w:rPr>
-          <w:ins w:id="145" w:author="kyle O'Reilly" w:date="2026-10-21T20:40:00Z" w16du:dateUtc="2026-10-21T19:40:00Z"/>
+          <w:ins w:id="136" w:author="kyle O'Reilly" w:date="2026-10-21T20:40:00Z" w16du:dateUtc="2026-10-21T19:40:00Z"/>
         </w:rPr>
       </w:pPr>
     </w:p>
@@ -3226,27 +3270,27 @@
       <w:pPr>
         <w:pStyle w:val="Heading1"/>
         <w:rPr>
-          <w:ins w:id="146" w:author="kyle O'Reilly" w:date="2026-10-21T20:40:00Z" w16du:dateUtc="2026-10-21T19:40:00Z"/>
-        </w:rPr>
-        <w:pPrChange w:id="147" w:author="kyle O'Reilly" w:date="2026-10-21T20:41:00Z" w16du:dateUtc="2026-10-21T19:41:00Z">
+          <w:ins w:id="137" w:author="kyle O'Reilly" w:date="2026-10-21T20:40:00Z" w16du:dateUtc="2026-10-21T19:40:00Z"/>
+        </w:rPr>
+        <w:pPrChange w:id="138" w:author="kyle O'Reilly" w:date="2026-10-21T20:41:00Z" w16du:dateUtc="2026-10-21T19:41:00Z">
           <w:pPr/>
         </w:pPrChange>
       </w:pPr>
-      <w:bookmarkStart w:id="148" w:name="_Toc243507769"/>
-      <w:ins w:id="149" w:author="kyle O'Reilly" w:date="2026-10-21T20:40:00Z" w16du:dateUtc="2026-10-21T19:40:00Z">
+      <w:bookmarkStart w:id="139" w:name="_Toc243520527"/>
+      <w:ins w:id="140" w:author="kyle O'Reilly" w:date="2026-10-21T20:40:00Z" w16du:dateUtc="2026-10-21T19:40:00Z">
         <w:r>
           <w:t>5. Project Scope</w:t>
         </w:r>
-        <w:bookmarkEnd w:id="148"/>
-      </w:ins>
-    </w:p>
-    <w:p>
-      <w:pPr>
-        <w:rPr>
-          <w:ins w:id="150" w:author="kyle O'Reilly" w:date="2026-10-21T20:40:00Z" w16du:dateUtc="2026-10-21T19:40:00Z"/>
-        </w:rPr>
-      </w:pPr>
-      <w:ins w:id="151" w:author="kyle O'Reilly" w:date="2026-10-21T20:40:00Z" w16du:dateUtc="2026-10-21T19:40:00Z">
+        <w:bookmarkEnd w:id="139"/>
+      </w:ins>
+    </w:p>
+    <w:p>
+      <w:pPr>
+        <w:rPr>
+          <w:ins w:id="141" w:author="kyle O'Reilly" w:date="2026-10-21T20:40:00Z" w16du:dateUtc="2026-10-21T19:40:00Z"/>
+        </w:rPr>
+      </w:pPr>
+      <w:ins w:id="142" w:author="kyle O'Reilly" w:date="2026-10-21T20:40:00Z" w16du:dateUtc="2026-10-21T19:40:00Z">
         <w:r>
           <w:t>?</w:t>
         </w:r>
@@ -3255,7 +3299,7 @@
     <w:p>
       <w:pPr>
         <w:rPr>
-          <w:ins w:id="152" w:author="kyle O'Reilly" w:date="2026-10-21T20:40:00Z" w16du:dateUtc="2026-10-21T19:40:00Z"/>
+          <w:ins w:id="143" w:author="kyle O'Reilly" w:date="2026-10-21T20:40:00Z" w16du:dateUtc="2026-10-21T19:40:00Z"/>
         </w:rPr>
       </w:pPr>
     </w:p>
@@ -3263,27 +3307,27 @@
       <w:pPr>
         <w:pStyle w:val="Heading1"/>
         <w:rPr>
-          <w:ins w:id="153" w:author="kyle O'Reilly" w:date="2026-10-21T20:40:00Z" w16du:dateUtc="2026-10-21T19:40:00Z"/>
-        </w:rPr>
-        <w:pPrChange w:id="154" w:author="kyle O'Reilly" w:date="2026-10-21T20:41:00Z" w16du:dateUtc="2026-10-21T19:41:00Z">
+          <w:ins w:id="144" w:author="kyle O'Reilly" w:date="2026-10-21T20:40:00Z" w16du:dateUtc="2026-10-21T19:40:00Z"/>
+        </w:rPr>
+        <w:pPrChange w:id="145" w:author="kyle O'Reilly" w:date="2026-10-21T20:41:00Z" w16du:dateUtc="2026-10-21T19:41:00Z">
           <w:pPr/>
         </w:pPrChange>
       </w:pPr>
-      <w:bookmarkStart w:id="155" w:name="_Toc243507770"/>
-      <w:ins w:id="156" w:author="kyle O'Reilly" w:date="2026-10-21T20:40:00Z" w16du:dateUtc="2026-10-21T19:40:00Z">
+      <w:bookmarkStart w:id="146" w:name="_Toc243520528"/>
+      <w:ins w:id="147" w:author="kyle O'Reilly" w:date="2026-10-21T20:40:00Z" w16du:dateUtc="2026-10-21T19:40:00Z">
         <w:r>
           <w:t>6. Methodology</w:t>
         </w:r>
-        <w:bookmarkEnd w:id="155"/>
-      </w:ins>
-    </w:p>
-    <w:p>
-      <w:pPr>
-        <w:rPr>
-          <w:ins w:id="157" w:author="kyle O'Reilly" w:date="2026-10-21T20:40:00Z" w16du:dateUtc="2026-10-21T19:40:00Z"/>
-        </w:rPr>
-      </w:pPr>
-      <w:ins w:id="158" w:author="kyle O'Reilly" w:date="2026-10-21T20:40:00Z" w16du:dateUtc="2026-10-21T19:40:00Z">
+        <w:bookmarkEnd w:id="146"/>
+      </w:ins>
+    </w:p>
+    <w:p>
+      <w:pPr>
+        <w:rPr>
+          <w:ins w:id="148" w:author="kyle O'Reilly" w:date="2026-10-21T20:40:00Z" w16du:dateUtc="2026-10-21T19:40:00Z"/>
+        </w:rPr>
+      </w:pPr>
+      <w:ins w:id="149" w:author="kyle O'Reilly" w:date="2026-10-21T20:40:00Z" w16du:dateUtc="2026-10-21T19:40:00Z">
         <w:r>
           <w:t>?</w:t>
         </w:r>
@@ -3292,443 +3336,7 @@
     <w:p>
       <w:pPr>
         <w:rPr>
-          <w:ins w:id="159" w:author="kyle O'Reilly" w:date="2026-10-21T20:40:00Z" w16du:dateUtc="2026-10-21T19:40:00Z"/>
-        </w:rPr>
-      </w:pPr>
-    </w:p>
-    <w:p>
-      <w:pPr>
-        <w:pStyle w:val="Heading1"/>
-        <w:rPr>
-          <w:ins w:id="160" w:author="kyle O'Reilly" w:date="2026-10-21T20:41:00Z" w16du:dateUtc="2026-10-21T19:41:00Z"/>
-        </w:rPr>
-        <w:pPrChange w:id="161" w:author="kyle O'Reilly" w:date="2026-10-21T20:41:00Z" w16du:dateUtc="2026-10-21T19:41:00Z">
-          <w:pPr/>
-        </w:pPrChange>
-      </w:pPr>
-      <w:bookmarkStart w:id="162" w:name="_Toc243507771"/>
-      <w:ins w:id="163" w:author="kyle O'Reilly" w:date="2026-10-21T20:41:00Z" w16du:dateUtc="2026-10-21T19:41:00Z">
-        <w:r>
-          <w:t xml:space="preserve">7. </w:t>
-        </w:r>
-      </w:ins>
-      <w:ins w:id="164" w:author="kyle O'Reilly" w:date="2026-10-21T20:40:00Z" w16du:dateUtc="2026-10-21T19:40:00Z">
-        <w:r>
-          <w:t>Data Sources</w:t>
-        </w:r>
-      </w:ins>
-      <w:bookmarkEnd w:id="162"/>
-    </w:p>
-    <w:p>
-      <w:pPr>
-        <w:rPr>
-          <w:ins w:id="165" w:author="kyle O'Reilly" w:date="2026-10-21T23:35:00Z" w16du:dateUtc="2026-10-21T22:35:00Z"/>
-        </w:rPr>
-      </w:pPr>
-      <w:ins w:id="166" w:author="kyle O'Reilly" w:date="2026-10-21T23:39:00Z" w16du:dateUtc="2026-10-21T22:39:00Z">
-        <w:r>
-          <w:t>Tradi</w:t>
-        </w:r>
-      </w:ins>
-      <w:ins w:id="167" w:author="kyle O'Reilly" w:date="2026-10-21T23:40:00Z" w16du:dateUtc="2026-10-21T22:40:00Z">
-        <w:r>
-          <w:t xml:space="preserve">ng 212 will be consulted to verify </w:t>
-        </w:r>
-      </w:ins>
-      <w:ins w:id="168" w:author="kyle O'Reilly" w:date="2026-10-21T23:46:00Z" w16du:dateUtc="2026-10-21T22:46:00Z">
-        <w:r>
-          <w:t xml:space="preserve">the </w:t>
-        </w:r>
-      </w:ins>
-      <w:ins w:id="169" w:author="kyle O'Reilly" w:date="2026-10-21T23:40:00Z" w16du:dateUtc="2026-10-21T22:40:00Z">
-        <w:r>
-          <w:t>volatility rating</w:t>
-        </w:r>
-      </w:ins>
-      <w:ins w:id="170" w:author="kyle O'Reilly" w:date="2026-10-21T23:41:00Z" w16du:dateUtc="2026-10-21T22:41:00Z">
-        <w:r>
-          <w:t>s</w:t>
-        </w:r>
-      </w:ins>
-      <w:ins w:id="171" w:author="kyle O'Reilly" w:date="2026-10-21T23:40:00Z" w16du:dateUtc="2026-10-21T22:40:00Z">
-        <w:r>
-          <w:t xml:space="preserve"> of</w:t>
-        </w:r>
-      </w:ins>
-      <w:ins w:id="172" w:author="kyle O'Reilly" w:date="2026-10-21T23:46:00Z" w16du:dateUtc="2026-10-21T22:46:00Z">
-        <w:r>
-          <w:t xml:space="preserve"> all the</w:t>
-        </w:r>
-      </w:ins>
-      <w:ins w:id="173" w:author="kyle O'Reilly" w:date="2026-10-21T23:40:00Z" w16du:dateUtc="2026-10-21T22:40:00Z">
-        <w:r>
-          <w:t xml:space="preserve"> three </w:t>
-        </w:r>
-      </w:ins>
-      <w:ins w:id="174" w:author="kyle O'Reilly" w:date="2026-10-21T23:46:00Z" w16du:dateUtc="2026-10-21T22:46:00Z">
-        <w:r>
-          <w:t xml:space="preserve">selected </w:t>
-        </w:r>
-      </w:ins>
-      <w:ins w:id="175" w:author="kyle O'Reilly" w:date="2026-10-21T23:40:00Z" w16du:dateUtc="2026-10-21T22:40:00Z">
-        <w:r>
-          <w:t>stocks.</w:t>
-        </w:r>
-      </w:ins>
-      <w:ins w:id="176" w:author="kyle O'Reilly" w:date="2026-10-21T23:38:00Z" w16du:dateUtc="2026-10-21T22:38:00Z">
-        <w:r>
-          <w:t xml:space="preserve"> </w:t>
-        </w:r>
-      </w:ins>
-      <w:ins w:id="177" w:author="kyle O'Reilly" w:date="2026-10-21T23:46:00Z" w16du:dateUtc="2026-10-21T22:46:00Z">
-        <w:r>
-          <w:t>JPM</w:t>
-        </w:r>
-      </w:ins>
-      <w:ins w:id="178" w:author="kyle O'Reilly" w:date="2026-10-21T23:54:00Z" w16du:dateUtc="2026-10-21T22:54:00Z">
-        <w:r>
-          <w:t>.US</w:t>
-        </w:r>
-      </w:ins>
-      <w:ins w:id="179" w:author="kyle O'Reilly" w:date="2026-10-21T23:46:00Z" w16du:dateUtc="2026-10-21T22:46:00Z">
-        <w:r>
-          <w:t xml:space="preserve"> (low)</w:t>
-        </w:r>
-        <w:r>
-          <w:t>, KO</w:t>
-        </w:r>
-      </w:ins>
-      <w:ins w:id="180" w:author="kyle O'Reilly" w:date="2026-10-21T23:54:00Z" w16du:dateUtc="2026-10-21T22:54:00Z">
-        <w:r>
-          <w:t>.US</w:t>
-        </w:r>
-      </w:ins>
-      <w:ins w:id="181" w:author="kyle O'Reilly" w:date="2026-10-21T23:46:00Z" w16du:dateUtc="2026-10-21T22:46:00Z">
-        <w:r>
-          <w:t xml:space="preserve"> (medium)</w:t>
-        </w:r>
-        <w:r>
-          <w:t>, and INTC</w:t>
-        </w:r>
-      </w:ins>
-      <w:ins w:id="182" w:author="kyle O'Reilly" w:date="2026-10-21T23:54:00Z" w16du:dateUtc="2026-10-21T22:54:00Z">
-        <w:r>
-          <w:t>.US</w:t>
-        </w:r>
-      </w:ins>
-      <w:ins w:id="183" w:author="kyle O'Reilly" w:date="2026-10-21T23:47:00Z" w16du:dateUtc="2026-10-21T22:47:00Z">
-        <w:r>
-          <w:t xml:space="preserve"> (high), as displayed on the trading 212 platform</w:t>
-        </w:r>
-      </w:ins>
-      <w:ins w:id="184" w:author="kyle O'Reilly" w:date="2026-10-21T23:46:00Z" w16du:dateUtc="2026-10-21T22:46:00Z">
-        <w:r>
-          <w:t xml:space="preserve"> </w:t>
-        </w:r>
-      </w:ins>
-      <w:ins w:id="185" w:author="kyle O'Reilly" w:date="2026-10-21T23:38:00Z" w16du:dateUtc="2026-10-21T22:38:00Z">
-        <w:r>
-          <w:t>(</w:t>
-        </w:r>
-      </w:ins>
-      <w:ins w:id="186" w:author="kyle O'Reilly" w:date="2026-10-21T23:44:00Z" w16du:dateUtc="2026-10-21T22:44:00Z">
-        <w:r>
-          <w:t>Trading 212, n.d.)</w:t>
-        </w:r>
-      </w:ins>
-      <w:ins w:id="187" w:author="kyle O'Reilly" w:date="2026-10-21T23:47:00Z" w16du:dateUtc="2026-10-21T22:47:00Z">
-        <w:r>
-          <w:t xml:space="preserve">. Screenshots of </w:t>
-        </w:r>
-      </w:ins>
-      <w:ins w:id="188" w:author="kyle O'Reilly" w:date="2026-10-22T00:01:00Z" w16du:dateUtc="2026-10-21T23:01:00Z">
-        <w:r>
-          <w:t>each stock’s volatility</w:t>
-        </w:r>
-      </w:ins>
-      <w:ins w:id="189" w:author="kyle O'Reilly" w:date="2026-10-21T23:47:00Z" w16du:dateUtc="2026-10-21T22:47:00Z">
-        <w:r>
-          <w:t xml:space="preserve"> </w:t>
-        </w:r>
-      </w:ins>
-      <w:ins w:id="190" w:author="kyle O'Reilly" w:date="2026-10-22T00:01:00Z" w16du:dateUtc="2026-10-21T23:01:00Z">
-        <w:r>
-          <w:t xml:space="preserve">risk </w:t>
-        </w:r>
-      </w:ins>
-      <w:ins w:id="191" w:author="kyle O'Reilly" w:date="2026-10-21T23:47:00Z" w16du:dateUtc="2026-10-21T22:47:00Z">
-        <w:r>
-          <w:t>rating</w:t>
-        </w:r>
-      </w:ins>
-      <w:ins w:id="192" w:author="kyle O'Reilly" w:date="2026-10-22T00:01:00Z" w16du:dateUtc="2026-10-21T23:01:00Z">
-        <w:r>
-          <w:t xml:space="preserve"> </w:t>
-        </w:r>
-      </w:ins>
-      <w:ins w:id="193" w:author="kyle O'Reilly" w:date="2026-10-21T23:47:00Z" w16du:dateUtc="2026-10-21T22:47:00Z">
-        <w:r>
-          <w:t xml:space="preserve">will be provided in Appendix A to support the stock </w:t>
-        </w:r>
-      </w:ins>
-      <w:ins w:id="194" w:author="kyle O'Reilly" w:date="2026-10-21T23:48:00Z" w16du:dateUtc="2026-10-21T22:48:00Z">
-        <w:r>
-          <w:t>selection</w:t>
-        </w:r>
-      </w:ins>
-      <w:ins w:id="195" w:author="kyle O'Reilly" w:date="2026-10-21T23:47:00Z" w16du:dateUtc="2026-10-21T22:47:00Z">
-        <w:r>
-          <w:t>.</w:t>
-        </w:r>
-      </w:ins>
-    </w:p>
-    <w:p>
-      <w:pPr>
-        <w:rPr>
-          <w:ins w:id="196" w:author="kyle O'Reilly" w:date="2026-10-21T20:41:00Z" w16du:dateUtc="2026-10-21T19:41:00Z"/>
-        </w:rPr>
-      </w:pPr>
-      <w:ins w:id="197" w:author="kyle O'Reilly" w:date="2026-10-21T23:28:00Z" w16du:dateUtc="2026-10-21T22:28:00Z">
-        <w:r>
-          <w:t xml:space="preserve">Stooq will be </w:t>
-        </w:r>
-      </w:ins>
-      <w:ins w:id="198" w:author="kyle O'Reilly" w:date="2026-10-21T23:58:00Z" w16du:dateUtc="2026-10-21T22:58:00Z">
-        <w:r>
-          <w:t>used to obtain</w:t>
-        </w:r>
-      </w:ins>
-      <w:ins w:id="199" w:author="kyle O'Reilly" w:date="2026-10-21T23:28:00Z" w16du:dateUtc="2026-10-21T22:28:00Z">
-        <w:r>
-          <w:t xml:space="preserve"> downloadable historical stock data for JPM</w:t>
-        </w:r>
-      </w:ins>
-      <w:ins w:id="200" w:author="kyle O'Reilly" w:date="2026-10-21T23:58:00Z" w16du:dateUtc="2026-10-21T22:58:00Z">
-        <w:r>
-          <w:t>.US</w:t>
-        </w:r>
-      </w:ins>
-      <w:ins w:id="201" w:author="kyle O'Reilly" w:date="2026-10-21T23:28:00Z" w16du:dateUtc="2026-10-21T22:28:00Z">
-        <w:r>
-          <w:t>, KO</w:t>
-        </w:r>
-      </w:ins>
-      <w:ins w:id="202" w:author="kyle O'Reilly" w:date="2026-10-21T23:58:00Z" w16du:dateUtc="2026-10-21T22:58:00Z">
-        <w:r>
-          <w:t>.US</w:t>
-        </w:r>
-      </w:ins>
-      <w:ins w:id="203" w:author="kyle O'Reilly" w:date="2026-10-21T23:28:00Z" w16du:dateUtc="2026-10-21T22:28:00Z">
-        <w:r>
-          <w:t xml:space="preserve"> and INTC</w:t>
-        </w:r>
-      </w:ins>
-      <w:ins w:id="204" w:author="kyle O'Reilly" w:date="2026-10-21T23:58:00Z" w16du:dateUtc="2026-10-21T22:58:00Z">
-        <w:r>
-          <w:t>.US</w:t>
-        </w:r>
-      </w:ins>
-      <w:ins w:id="205" w:author="kyle O'Reilly" w:date="2026-10-21T23:59:00Z" w16du:dateUtc="2026-10-21T22:59:00Z">
-        <w:r>
-          <w:t xml:space="preserve"> (Stooq</w:t>
-        </w:r>
-        <w:r>
-          <w:t>, n.d.a; Stooq, n.d.b</w:t>
-        </w:r>
-      </w:ins>
-      <w:ins w:id="206" w:author="kyle O'Reilly" w:date="2026-10-22T00:00:00Z" w16du:dateUtc="2026-10-21T23:00:00Z">
-        <w:r>
-          <w:t>; Stooq, n.d.c).</w:t>
-        </w:r>
-      </w:ins>
-      <w:ins w:id="207" w:author="kyle O'Reilly" w:date="2026-10-21T23:28:00Z" w16du:dateUtc="2026-10-21T22:28:00Z">
-        <w:r>
-          <w:t xml:space="preserve"> The </w:t>
-        </w:r>
-      </w:ins>
-      <w:ins w:id="208" w:author="kyle O'Reilly" w:date="2026-10-22T00:00:00Z" w16du:dateUtc="2026-10-21T23:00:00Z">
-        <w:r>
-          <w:t xml:space="preserve">independent </w:t>
-        </w:r>
-        <w:r>
-          <w:t xml:space="preserve">dataset </w:t>
-        </w:r>
-      </w:ins>
-      <w:ins w:id="209" w:author="kyle O'Reilly" w:date="2026-10-21T23:28:00Z" w16du:dateUtc="2026-10-21T22:28:00Z">
-        <w:r>
-          <w:t xml:space="preserve">variables </w:t>
-        </w:r>
-        <w:r>
-          <w:t>will</w:t>
-        </w:r>
-      </w:ins>
-      <w:ins w:id="210" w:author="kyle O'Reilly" w:date="2026-10-22T00:00:00Z" w16du:dateUtc="2026-10-21T23:00:00Z">
-        <w:r>
-          <w:t xml:space="preserve"> include</w:t>
-        </w:r>
-      </w:ins>
-      <w:ins w:id="211" w:author="kyle O'Reilly" w:date="2026-10-21T23:28:00Z" w16du:dateUtc="2026-10-21T22:28:00Z">
-        <w:r>
-          <w:t xml:space="preserve"> </w:t>
-        </w:r>
-      </w:ins>
-      <w:ins w:id="212" w:author="kyle O'Reilly" w:date="2026-10-21T23:31:00Z" w16du:dateUtc="2026-10-21T22:31:00Z">
-        <w:r>
-          <w:t xml:space="preserve">sequential index number, </w:t>
-        </w:r>
-        <w:r>
-          <w:t>the cale</w:t>
-        </w:r>
-      </w:ins>
-      <w:ins w:id="213" w:author="kyle O'Reilly" w:date="2026-10-21T23:32:00Z" w16du:dateUtc="2026-10-21T22:32:00Z">
-        <w:r>
-          <w:t xml:space="preserve">ndar date, the opening price, the maximum </w:t>
-        </w:r>
-      </w:ins>
-      <w:ins w:id="214" w:author="kyle O'Reilly" w:date="2026-10-22T00:01:00Z" w16du:dateUtc="2026-10-21T23:01:00Z">
-        <w:r>
-          <w:t xml:space="preserve">and minimum </w:t>
-        </w:r>
-      </w:ins>
-      <w:ins w:id="215" w:author="kyle O'Reilly" w:date="2026-10-21T23:32:00Z" w16du:dateUtc="2026-10-21T22:32:00Z">
-        <w:r>
-          <w:t>price</w:t>
-        </w:r>
-      </w:ins>
-      <w:ins w:id="216" w:author="kyle O'Reilly" w:date="2026-10-22T00:01:00Z" w16du:dateUtc="2026-10-21T23:01:00Z">
-        <w:r>
-          <w:t>s</w:t>
-        </w:r>
-      </w:ins>
-      <w:ins w:id="217" w:author="kyle O'Reilly" w:date="2026-10-21T23:32:00Z" w16du:dateUtc="2026-10-21T22:32:00Z">
-        <w:r>
-          <w:t xml:space="preserve"> the stock reached </w:t>
-        </w:r>
-      </w:ins>
-      <w:ins w:id="218" w:author="kyle O'Reilly" w:date="2026-10-22T00:02:00Z" w16du:dateUtc="2026-10-21T23:02:00Z">
-        <w:r>
-          <w:t>during each trading</w:t>
-        </w:r>
-      </w:ins>
-      <w:ins w:id="219" w:author="kyle O'Reilly" w:date="2026-10-21T23:32:00Z" w16du:dateUtc="2026-10-21T22:32:00Z">
-        <w:r>
-          <w:t xml:space="preserve"> date,</w:t>
-        </w:r>
-      </w:ins>
-      <w:ins w:id="220" w:author="kyle O'Reilly" w:date="2026-10-21T23:33:00Z" w16du:dateUtc="2026-10-21T22:33:00Z">
-        <w:r>
-          <w:t xml:space="preserve"> closing price,</w:t>
-        </w:r>
-      </w:ins>
-      <w:ins w:id="221" w:author="kyle O'Reilly" w:date="2026-10-22T00:02:00Z" w16du:dateUtc="2026-10-21T23:02:00Z">
-        <w:r>
-          <w:t xml:space="preserve"> daily </w:t>
-        </w:r>
-      </w:ins>
-      <w:ins w:id="222" w:author="kyle O'Reilly" w:date="2026-10-22T00:03:00Z" w16du:dateUtc="2026-10-21T23:03:00Z">
-        <w:r>
-          <w:t>percentage</w:t>
-        </w:r>
-      </w:ins>
-      <w:ins w:id="223" w:author="kyle O'Reilly" w:date="2026-10-22T00:02:00Z" w16du:dateUtc="2026-10-21T23:02:00Z">
-        <w:r>
-          <w:t xml:space="preserve"> and a</w:t>
-        </w:r>
-      </w:ins>
-      <w:ins w:id="224" w:author="kyle O'Reilly" w:date="2026-10-22T00:03:00Z" w16du:dateUtc="2026-10-21T23:03:00Z">
-        <w:r>
-          <w:t>bsolute price change compared with the previous day’s closing price</w:t>
-        </w:r>
-        <w:r>
-          <w:t>,</w:t>
-        </w:r>
-      </w:ins>
-      <w:ins w:id="225" w:author="kyle O'Reilly" w:date="2026-10-21T23:33:00Z" w16du:dateUtc="2026-10-21T22:33:00Z">
-        <w:r>
-          <w:t xml:space="preserve"> and </w:t>
-        </w:r>
-      </w:ins>
-      <w:ins w:id="226" w:author="kyle O'Reilly" w:date="2026-10-21T23:34:00Z" w16du:dateUtc="2026-10-21T22:34:00Z">
-        <w:r>
-          <w:t xml:space="preserve">the total number of shares traded </w:t>
-        </w:r>
-      </w:ins>
-      <w:ins w:id="227" w:author="kyle O'Reilly" w:date="2026-10-22T00:03:00Z" w16du:dateUtc="2026-10-21T23:03:00Z">
-        <w:r>
-          <w:t>each date.</w:t>
-        </w:r>
-      </w:ins>
-    </w:p>
-    <w:p>
-      <w:pPr>
-        <w:rPr>
-          <w:ins w:id="228" w:author="kyle O'Reilly" w:date="2026-10-21T20:41:00Z" w16du:dateUtc="2026-10-21T19:41:00Z"/>
-        </w:rPr>
-      </w:pPr>
-    </w:p>
-    <w:p>
-      <w:pPr>
-        <w:pStyle w:val="Heading1"/>
-        <w:rPr>
-          <w:ins w:id="229" w:author="kyle O'Reilly" w:date="2026-10-21T20:41:00Z" w16du:dateUtc="2026-10-21T19:41:00Z"/>
-        </w:rPr>
-        <w:pPrChange w:id="230" w:author="kyle O'Reilly" w:date="2026-10-21T20:41:00Z" w16du:dateUtc="2026-10-21T19:41:00Z">
-          <w:pPr/>
-        </w:pPrChange>
-      </w:pPr>
-      <w:bookmarkStart w:id="231" w:name="_Toc243507772"/>
-      <w:ins w:id="232" w:author="kyle O'Reilly" w:date="2026-10-21T20:41:00Z" w16du:dateUtc="2026-10-21T19:41:00Z">
-        <w:r>
-          <w:t>8. Expected Deliverables</w:t>
-        </w:r>
-        <w:bookmarkEnd w:id="231"/>
-      </w:ins>
-    </w:p>
-    <w:p>
-      <w:pPr>
-        <w:rPr>
-          <w:ins w:id="233" w:author="kyle O'Reilly" w:date="2026-10-21T20:41:00Z" w16du:dateUtc="2026-10-21T19:41:00Z"/>
-        </w:rPr>
-      </w:pPr>
-      <w:ins w:id="234" w:author="kyle O'Reilly" w:date="2026-10-21T20:41:00Z" w16du:dateUtc="2026-10-21T19:41:00Z">
-        <w:r>
-          <w:t>?</w:t>
-        </w:r>
-      </w:ins>
-    </w:p>
-    <w:p>
-      <w:pPr>
-        <w:rPr>
-          <w:ins w:id="235" w:author="kyle O'Reilly" w:date="2026-10-21T20:41:00Z" w16du:dateUtc="2026-10-21T19:41:00Z"/>
-        </w:rPr>
-      </w:pPr>
-    </w:p>
-    <w:p>
-      <w:pPr>
-        <w:pStyle w:val="Heading1"/>
-        <w:pPrChange w:id="236" w:author="kyle O'Reilly" w:date="2026-10-21T20:41:00Z" w16du:dateUtc="2026-10-21T19:41:00Z">
-          <w:pPr/>
-        </w:pPrChange>
-      </w:pPr>
-      <w:bookmarkStart w:id="237" w:name="_Toc243507773"/>
-      <w:ins w:id="238" w:author="kyle O'Reilly" w:date="2026-10-21T20:41:00Z" w16du:dateUtc="2026-10-21T19:41:00Z">
-        <w:r>
-          <w:t>9. Project Timeline</w:t>
-        </w:r>
-      </w:ins>
-      <w:bookmarkEnd w:id="237"/>
-    </w:p>
-    <w:p>
-      <w:ins w:id="239" w:author="kyle O'Reilly" w:date="2026-10-21T20:41:00Z" w16du:dateUtc="2026-10-21T19:41:00Z">
-        <w:r>
-          <w:t>?</w:t>
-        </w:r>
-      </w:ins>
-    </w:p>
-    <w:p>
-      <w:pPr>
-        <w:rPr>
-          <w:ins w:id="240" w:author="kyle O'Reilly" w:date="2026-10-21T20:41:00Z" w16du:dateUtc="2026-10-21T19:41:00Z"/>
+          <w:ins w:id="150" w:author="kyle O'Reilly" w:date="2026-10-21T20:40:00Z" w16du:dateUtc="2026-10-21T19:40:00Z"/>
         </w:rPr>
       </w:pPr>
     </w:p>
@@ -3738,19 +3346,467 @@
         <w:spacing w:line="360" w:lineRule="auto"/>
         <w:jc w:val="both"/>
         <w:rPr>
-          <w:ins w:id="241" w:author="kyle O'Reilly" w:date="2026-10-21T20:41:00Z" w16du:dateUtc="2026-10-21T19:41:00Z"/>
-        </w:rPr>
-        <w:pPrChange w:id="242" w:author="kyle O'Reilly" w:date="2026-10-21T23:07:00Z" w16du:dateUtc="2026-10-21T22:07:00Z">
+          <w:ins w:id="151" w:author="kyle O'Reilly" w:date="2026-10-21T20:41:00Z" w16du:dateUtc="2026-10-21T19:41:00Z"/>
+        </w:rPr>
+        <w:pPrChange w:id="152" w:author="kyle O'Reilly" w:date="2026-10-22T00:14:00Z" w16du:dateUtc="2026-10-21T23:14:00Z">
           <w:pPr/>
         </w:pPrChange>
       </w:pPr>
-      <w:bookmarkStart w:id="243" w:name="_Toc243507774"/>
-      <w:ins w:id="244" w:author="kyle O'Reilly" w:date="2026-10-21T20:41:00Z" w16du:dateUtc="2026-10-21T19:41:00Z">
+      <w:bookmarkStart w:id="153" w:name="_Toc243520529"/>
+      <w:ins w:id="154" w:author="kyle O'Reilly" w:date="2026-10-21T20:41:00Z" w16du:dateUtc="2026-10-21T19:41:00Z">
+        <w:r>
+          <w:t xml:space="preserve">7. </w:t>
+        </w:r>
+      </w:ins>
+      <w:ins w:id="155" w:author="kyle O'Reilly" w:date="2026-10-21T20:40:00Z" w16du:dateUtc="2026-10-21T19:40:00Z">
+        <w:r>
+          <w:t>Data Sources</w:t>
+        </w:r>
+      </w:ins>
+      <w:bookmarkEnd w:id="153"/>
+    </w:p>
+    <w:p>
+      <w:pPr>
+        <w:spacing w:line="360" w:lineRule="auto"/>
+        <w:jc w:val="both"/>
+        <w:rPr>
+          <w:ins w:id="156" w:author="kyle O'Reilly" w:date="2026-10-21T23:35:00Z" w16du:dateUtc="2026-10-21T22:35:00Z"/>
+        </w:rPr>
+        <w:pPrChange w:id="157" w:author="kyle O'Reilly" w:date="2026-10-22T00:14:00Z" w16du:dateUtc="2026-10-21T23:14:00Z">
+          <w:pPr/>
+        </w:pPrChange>
+      </w:pPr>
+      <w:ins w:id="158" w:author="kyle O'Reilly" w:date="2026-10-21T23:39:00Z" w16du:dateUtc="2026-10-21T22:39:00Z">
+        <w:r>
+          <w:t>Tradi</w:t>
+        </w:r>
+      </w:ins>
+      <w:ins w:id="159" w:author="kyle O'Reilly" w:date="2026-10-21T23:40:00Z" w16du:dateUtc="2026-10-21T22:40:00Z">
+        <w:r>
+          <w:t xml:space="preserve">ng 212 will be consulted to verify </w:t>
+        </w:r>
+      </w:ins>
+      <w:ins w:id="160" w:author="kyle O'Reilly" w:date="2026-10-21T23:46:00Z" w16du:dateUtc="2026-10-21T22:46:00Z">
+        <w:r>
+          <w:t xml:space="preserve">the </w:t>
+        </w:r>
+      </w:ins>
+      <w:ins w:id="161" w:author="kyle O'Reilly" w:date="2026-10-21T23:40:00Z" w16du:dateUtc="2026-10-21T22:40:00Z">
+        <w:r>
+          <w:t>volatility rating</w:t>
+        </w:r>
+      </w:ins>
+      <w:ins w:id="162" w:author="kyle O'Reilly" w:date="2026-10-21T23:41:00Z" w16du:dateUtc="2026-10-21T22:41:00Z">
+        <w:r>
+          <w:t>s</w:t>
+        </w:r>
+      </w:ins>
+      <w:ins w:id="163" w:author="kyle O'Reilly" w:date="2026-10-21T23:40:00Z" w16du:dateUtc="2026-10-21T22:40:00Z">
+        <w:r>
+          <w:t xml:space="preserve"> of</w:t>
+        </w:r>
+      </w:ins>
+      <w:ins w:id="164" w:author="kyle O'Reilly" w:date="2026-10-21T23:46:00Z" w16du:dateUtc="2026-10-21T22:46:00Z">
+        <w:r>
+          <w:t xml:space="preserve"> all the</w:t>
+        </w:r>
+      </w:ins>
+      <w:ins w:id="165" w:author="kyle O'Reilly" w:date="2026-10-21T23:40:00Z" w16du:dateUtc="2026-10-21T22:40:00Z">
+        <w:r>
+          <w:t xml:space="preserve"> three </w:t>
+        </w:r>
+      </w:ins>
+      <w:ins w:id="166" w:author="kyle O'Reilly" w:date="2026-10-21T23:46:00Z" w16du:dateUtc="2026-10-21T22:46:00Z">
+        <w:r>
+          <w:t xml:space="preserve">selected </w:t>
+        </w:r>
+      </w:ins>
+      <w:ins w:id="167" w:author="kyle O'Reilly" w:date="2026-10-21T23:40:00Z" w16du:dateUtc="2026-10-21T22:40:00Z">
+        <w:r>
+          <w:t>stocks.</w:t>
+        </w:r>
+      </w:ins>
+      <w:ins w:id="168" w:author="kyle O'Reilly" w:date="2026-10-21T23:38:00Z" w16du:dateUtc="2026-10-21T22:38:00Z">
+        <w:r>
+          <w:t xml:space="preserve"> </w:t>
+        </w:r>
+      </w:ins>
+      <w:ins w:id="169" w:author="kyle O'Reilly" w:date="2026-10-21T23:46:00Z" w16du:dateUtc="2026-10-21T22:46:00Z">
+        <w:r>
+          <w:t>JPM</w:t>
+        </w:r>
+      </w:ins>
+      <w:ins w:id="170" w:author="kyle O'Reilly" w:date="2026-10-21T23:54:00Z" w16du:dateUtc="2026-10-21T22:54:00Z">
+        <w:r>
+          <w:t>.US</w:t>
+        </w:r>
+      </w:ins>
+      <w:ins w:id="171" w:author="kyle O'Reilly" w:date="2026-10-21T23:46:00Z" w16du:dateUtc="2026-10-21T22:46:00Z">
+        <w:r>
+          <w:t xml:space="preserve"> (low)</w:t>
+        </w:r>
+        <w:r>
+          <w:t>, KO</w:t>
+        </w:r>
+      </w:ins>
+      <w:ins w:id="172" w:author="kyle O'Reilly" w:date="2026-10-21T23:54:00Z" w16du:dateUtc="2026-10-21T22:54:00Z">
+        <w:r>
+          <w:t>.US</w:t>
+        </w:r>
+      </w:ins>
+      <w:ins w:id="173" w:author="kyle O'Reilly" w:date="2026-10-21T23:46:00Z" w16du:dateUtc="2026-10-21T22:46:00Z">
+        <w:r>
+          <w:t xml:space="preserve"> (medium)</w:t>
+        </w:r>
+        <w:r>
+          <w:t>, and INTC</w:t>
+        </w:r>
+      </w:ins>
+      <w:ins w:id="174" w:author="kyle O'Reilly" w:date="2026-10-21T23:54:00Z" w16du:dateUtc="2026-10-21T22:54:00Z">
+        <w:r>
+          <w:t>.US</w:t>
+        </w:r>
+      </w:ins>
+      <w:ins w:id="175" w:author="kyle O'Reilly" w:date="2026-10-21T23:47:00Z" w16du:dateUtc="2026-10-21T22:47:00Z">
+        <w:r>
+          <w:t xml:space="preserve"> (high), as displayed on the trading 212 platform</w:t>
+        </w:r>
+      </w:ins>
+      <w:ins w:id="176" w:author="kyle O'Reilly" w:date="2026-10-21T23:46:00Z" w16du:dateUtc="2026-10-21T22:46:00Z">
+        <w:r>
+          <w:t xml:space="preserve"> </w:t>
+        </w:r>
+      </w:ins>
+      <w:ins w:id="177" w:author="kyle O'Reilly" w:date="2026-10-21T23:38:00Z" w16du:dateUtc="2026-10-21T22:38:00Z">
+        <w:r>
+          <w:t>(</w:t>
+        </w:r>
+      </w:ins>
+      <w:ins w:id="178" w:author="kyle O'Reilly" w:date="2026-10-21T23:44:00Z" w16du:dateUtc="2026-10-21T22:44:00Z">
+        <w:r>
+          <w:t>Trading 212, n.d.)</w:t>
+        </w:r>
+      </w:ins>
+      <w:ins w:id="179" w:author="kyle O'Reilly" w:date="2026-10-21T23:47:00Z" w16du:dateUtc="2026-10-21T22:47:00Z">
+        <w:r>
+          <w:t xml:space="preserve">. Screenshots of </w:t>
+        </w:r>
+      </w:ins>
+      <w:ins w:id="180" w:author="kyle O'Reilly" w:date="2026-10-22T00:01:00Z" w16du:dateUtc="2026-10-21T23:01:00Z">
+        <w:r>
+          <w:t>each stock’s volatility</w:t>
+        </w:r>
+      </w:ins>
+      <w:ins w:id="181" w:author="kyle O'Reilly" w:date="2026-10-21T23:47:00Z" w16du:dateUtc="2026-10-21T22:47:00Z">
+        <w:r>
+          <w:t xml:space="preserve"> </w:t>
+        </w:r>
+      </w:ins>
+      <w:ins w:id="182" w:author="kyle O'Reilly" w:date="2026-10-22T00:01:00Z" w16du:dateUtc="2026-10-21T23:01:00Z">
+        <w:r>
+          <w:t xml:space="preserve">risk </w:t>
+        </w:r>
+      </w:ins>
+      <w:ins w:id="183" w:author="kyle O'Reilly" w:date="2026-10-21T23:47:00Z" w16du:dateUtc="2026-10-21T22:47:00Z">
+        <w:r>
+          <w:t>rating</w:t>
+        </w:r>
+      </w:ins>
+      <w:ins w:id="184" w:author="kyle O'Reilly" w:date="2026-10-22T00:01:00Z" w16du:dateUtc="2026-10-21T23:01:00Z">
+        <w:r>
+          <w:t xml:space="preserve"> </w:t>
+        </w:r>
+      </w:ins>
+      <w:ins w:id="185" w:author="kyle O'Reilly" w:date="2026-10-21T23:47:00Z" w16du:dateUtc="2026-10-21T22:47:00Z">
+        <w:r>
+          <w:t xml:space="preserve">will be provided in Appendix A to support the stock </w:t>
+        </w:r>
+      </w:ins>
+      <w:ins w:id="186" w:author="kyle O'Reilly" w:date="2026-10-21T23:48:00Z" w16du:dateUtc="2026-10-21T22:48:00Z">
+        <w:r>
+          <w:t>selection</w:t>
+        </w:r>
+      </w:ins>
+      <w:ins w:id="187" w:author="kyle O'Reilly" w:date="2026-10-21T23:47:00Z" w16du:dateUtc="2026-10-21T22:47:00Z">
+        <w:r>
+          <w:t>.</w:t>
+        </w:r>
+      </w:ins>
+    </w:p>
+    <w:p>
+      <w:pPr>
+        <w:spacing w:line="360" w:lineRule="auto"/>
+        <w:jc w:val="both"/>
+        <w:rPr>
+          <w:ins w:id="188" w:author="kyle O'Reilly" w:date="2026-10-21T20:41:00Z" w16du:dateUtc="2026-10-21T19:41:00Z"/>
+        </w:rPr>
+        <w:pPrChange w:id="189" w:author="kyle O'Reilly" w:date="2026-10-22T00:14:00Z" w16du:dateUtc="2026-10-21T23:14:00Z">
+          <w:pPr/>
+        </w:pPrChange>
+      </w:pPr>
+      <w:ins w:id="190" w:author="kyle O'Reilly" w:date="2026-10-21T23:28:00Z" w16du:dateUtc="2026-10-21T22:28:00Z">
+        <w:r>
+          <w:t xml:space="preserve">Stooq will be </w:t>
+        </w:r>
+      </w:ins>
+      <w:ins w:id="191" w:author="kyle O'Reilly" w:date="2026-10-21T23:58:00Z" w16du:dateUtc="2026-10-21T22:58:00Z">
+        <w:r>
+          <w:t>used to obtain</w:t>
+        </w:r>
+      </w:ins>
+      <w:ins w:id="192" w:author="kyle O'Reilly" w:date="2026-10-21T23:28:00Z" w16du:dateUtc="2026-10-21T22:28:00Z">
+        <w:r>
+          <w:t xml:space="preserve"> downloadable historical stock data for JPM</w:t>
+        </w:r>
+      </w:ins>
+      <w:ins w:id="193" w:author="kyle O'Reilly" w:date="2026-10-21T23:58:00Z" w16du:dateUtc="2026-10-21T22:58:00Z">
+        <w:r>
+          <w:t>.US</w:t>
+        </w:r>
+      </w:ins>
+      <w:ins w:id="194" w:author="kyle O'Reilly" w:date="2026-10-21T23:28:00Z" w16du:dateUtc="2026-10-21T22:28:00Z">
+        <w:r>
+          <w:t>, KO</w:t>
+        </w:r>
+      </w:ins>
+      <w:ins w:id="195" w:author="kyle O'Reilly" w:date="2026-10-21T23:58:00Z" w16du:dateUtc="2026-10-21T22:58:00Z">
+        <w:r>
+          <w:t>.US</w:t>
+        </w:r>
+      </w:ins>
+      <w:ins w:id="196" w:author="kyle O'Reilly" w:date="2026-10-21T23:28:00Z" w16du:dateUtc="2026-10-21T22:28:00Z">
+        <w:r>
+          <w:t xml:space="preserve"> and INTC</w:t>
+        </w:r>
+      </w:ins>
+      <w:ins w:id="197" w:author="kyle O'Reilly" w:date="2026-10-21T23:58:00Z" w16du:dateUtc="2026-10-21T22:58:00Z">
+        <w:r>
+          <w:t>.US</w:t>
+        </w:r>
+      </w:ins>
+      <w:ins w:id="198" w:author="kyle O'Reilly" w:date="2026-10-21T23:59:00Z" w16du:dateUtc="2026-10-21T22:59:00Z">
+        <w:r>
+          <w:t xml:space="preserve"> (Stooq</w:t>
+        </w:r>
+        <w:r>
+          <w:t>, n.d.a; Stooq, n.d.b</w:t>
+        </w:r>
+      </w:ins>
+      <w:ins w:id="199" w:author="kyle O'Reilly" w:date="2026-10-22T00:00:00Z" w16du:dateUtc="2026-10-21T23:00:00Z">
+        <w:r>
+          <w:t>; Stooq, n.d.c).</w:t>
+        </w:r>
+      </w:ins>
+      <w:ins w:id="200" w:author="kyle O'Reilly" w:date="2026-10-21T23:28:00Z" w16du:dateUtc="2026-10-21T22:28:00Z">
+        <w:r>
+          <w:t xml:space="preserve"> The </w:t>
+        </w:r>
+      </w:ins>
+      <w:ins w:id="201" w:author="kyle O'Reilly" w:date="2026-10-22T00:00:00Z" w16du:dateUtc="2026-10-21T23:00:00Z">
+        <w:r>
+          <w:t xml:space="preserve">independent </w:t>
+        </w:r>
+        <w:r>
+          <w:t xml:space="preserve">dataset </w:t>
+        </w:r>
+      </w:ins>
+      <w:ins w:id="202" w:author="kyle O'Reilly" w:date="2026-10-21T23:28:00Z" w16du:dateUtc="2026-10-21T22:28:00Z">
+        <w:r>
+          <w:t xml:space="preserve">variables </w:t>
+        </w:r>
+        <w:r>
+          <w:t>will</w:t>
+        </w:r>
+      </w:ins>
+      <w:ins w:id="203" w:author="kyle O'Reilly" w:date="2026-10-22T00:00:00Z" w16du:dateUtc="2026-10-21T23:00:00Z">
+        <w:r>
+          <w:t xml:space="preserve"> include</w:t>
+        </w:r>
+      </w:ins>
+      <w:ins w:id="204" w:author="kyle O'Reilly" w:date="2026-10-21T23:28:00Z" w16du:dateUtc="2026-10-21T22:28:00Z">
+        <w:r>
+          <w:t xml:space="preserve"> </w:t>
+        </w:r>
+      </w:ins>
+      <w:ins w:id="205" w:author="kyle O'Reilly" w:date="2026-10-21T23:31:00Z" w16du:dateUtc="2026-10-21T22:31:00Z">
+        <w:r>
+          <w:t xml:space="preserve">sequential index number, </w:t>
+        </w:r>
+        <w:r>
+          <w:t>the cale</w:t>
+        </w:r>
+      </w:ins>
+      <w:ins w:id="206" w:author="kyle O'Reilly" w:date="2026-10-21T23:32:00Z" w16du:dateUtc="2026-10-21T22:32:00Z">
+        <w:r>
+          <w:t xml:space="preserve">ndar date, the opening price, the maximum </w:t>
+        </w:r>
+      </w:ins>
+      <w:ins w:id="207" w:author="kyle O'Reilly" w:date="2026-10-22T00:01:00Z" w16du:dateUtc="2026-10-21T23:01:00Z">
+        <w:r>
+          <w:t xml:space="preserve">and minimum </w:t>
+        </w:r>
+      </w:ins>
+      <w:ins w:id="208" w:author="kyle O'Reilly" w:date="2026-10-21T23:32:00Z" w16du:dateUtc="2026-10-21T22:32:00Z">
+        <w:r>
+          <w:t>price</w:t>
+        </w:r>
+      </w:ins>
+      <w:ins w:id="209" w:author="kyle O'Reilly" w:date="2026-10-22T00:01:00Z" w16du:dateUtc="2026-10-21T23:01:00Z">
+        <w:r>
+          <w:t>s</w:t>
+        </w:r>
+      </w:ins>
+      <w:ins w:id="210" w:author="kyle O'Reilly" w:date="2026-10-21T23:32:00Z" w16du:dateUtc="2026-10-21T22:32:00Z">
+        <w:r>
+          <w:t xml:space="preserve"> the stock reached </w:t>
+        </w:r>
+      </w:ins>
+      <w:ins w:id="211" w:author="kyle O'Reilly" w:date="2026-10-22T00:02:00Z" w16du:dateUtc="2026-10-21T23:02:00Z">
+        <w:r>
+          <w:t>during each trading</w:t>
+        </w:r>
+      </w:ins>
+      <w:ins w:id="212" w:author="kyle O'Reilly" w:date="2026-10-21T23:32:00Z" w16du:dateUtc="2026-10-21T22:32:00Z">
+        <w:r>
+          <w:t xml:space="preserve"> date,</w:t>
+        </w:r>
+      </w:ins>
+      <w:ins w:id="213" w:author="kyle O'Reilly" w:date="2026-10-21T23:33:00Z" w16du:dateUtc="2026-10-21T22:33:00Z">
+        <w:r>
+          <w:t xml:space="preserve"> closing price,</w:t>
+        </w:r>
+      </w:ins>
+      <w:ins w:id="214" w:author="kyle O'Reilly" w:date="2026-10-22T00:02:00Z" w16du:dateUtc="2026-10-21T23:02:00Z">
+        <w:r>
+          <w:t xml:space="preserve"> daily </w:t>
+        </w:r>
+      </w:ins>
+      <w:ins w:id="215" w:author="kyle O'Reilly" w:date="2026-10-22T00:03:00Z" w16du:dateUtc="2026-10-21T23:03:00Z">
+        <w:r>
+          <w:t>percentage</w:t>
+        </w:r>
+      </w:ins>
+      <w:ins w:id="216" w:author="kyle O'Reilly" w:date="2026-10-22T00:02:00Z" w16du:dateUtc="2026-10-21T23:02:00Z">
+        <w:r>
+          <w:t xml:space="preserve"> and a</w:t>
+        </w:r>
+      </w:ins>
+      <w:ins w:id="217" w:author="kyle O'Reilly" w:date="2026-10-22T00:03:00Z" w16du:dateUtc="2026-10-21T23:03:00Z">
+        <w:r>
+          <w:t>bsolute price change compared with the previous day’s closing price</w:t>
+        </w:r>
+        <w:r>
+          <w:t>,</w:t>
+        </w:r>
+      </w:ins>
+      <w:ins w:id="218" w:author="kyle O'Reilly" w:date="2026-10-21T23:33:00Z" w16du:dateUtc="2026-10-21T22:33:00Z">
+        <w:r>
+          <w:t xml:space="preserve"> and </w:t>
+        </w:r>
+      </w:ins>
+      <w:ins w:id="219" w:author="kyle O'Reilly" w:date="2026-10-21T23:34:00Z" w16du:dateUtc="2026-10-21T22:34:00Z">
+        <w:r>
+          <w:t xml:space="preserve">the total number of shares traded </w:t>
+        </w:r>
+      </w:ins>
+      <w:ins w:id="220" w:author="kyle O'Reilly" w:date="2026-10-22T00:03:00Z" w16du:dateUtc="2026-10-21T23:03:00Z">
+        <w:r>
+          <w:t>each date.</w:t>
+        </w:r>
+      </w:ins>
+    </w:p>
+    <w:p>
+      <w:pPr>
+        <w:rPr>
+          <w:ins w:id="221" w:author="kyle O'Reilly" w:date="2026-10-21T20:41:00Z" w16du:dateUtc="2026-10-21T19:41:00Z"/>
+        </w:rPr>
+      </w:pPr>
+    </w:p>
+    <w:p>
+      <w:pPr>
+        <w:pStyle w:val="Heading1"/>
+        <w:rPr>
+          <w:ins w:id="222" w:author="kyle O'Reilly" w:date="2026-10-21T20:41:00Z" w16du:dateUtc="2026-10-21T19:41:00Z"/>
+        </w:rPr>
+        <w:pPrChange w:id="223" w:author="kyle O'Reilly" w:date="2026-10-21T20:41:00Z" w16du:dateUtc="2026-10-21T19:41:00Z">
+          <w:pPr/>
+        </w:pPrChange>
+      </w:pPr>
+      <w:bookmarkStart w:id="224" w:name="_Toc243520530"/>
+      <w:ins w:id="225" w:author="kyle O'Reilly" w:date="2026-10-21T20:41:00Z" w16du:dateUtc="2026-10-21T19:41:00Z">
+        <w:r>
+          <w:t>8. Expected Deliverables</w:t>
+        </w:r>
+        <w:bookmarkEnd w:id="224"/>
+      </w:ins>
+    </w:p>
+    <w:p>
+      <w:pPr>
+        <w:rPr>
+          <w:ins w:id="226" w:author="kyle O'Reilly" w:date="2026-10-21T20:41:00Z" w16du:dateUtc="2026-10-21T19:41:00Z"/>
+        </w:rPr>
+      </w:pPr>
+      <w:ins w:id="227" w:author="kyle O'Reilly" w:date="2026-10-21T20:41:00Z" w16du:dateUtc="2026-10-21T19:41:00Z">
+        <w:r>
+          <w:t>?</w:t>
+        </w:r>
+      </w:ins>
+    </w:p>
+    <w:p>
+      <w:pPr>
+        <w:rPr>
+          <w:ins w:id="228" w:author="kyle O'Reilly" w:date="2026-10-21T20:41:00Z" w16du:dateUtc="2026-10-21T19:41:00Z"/>
+        </w:rPr>
+      </w:pPr>
+    </w:p>
+    <w:p>
+      <w:pPr>
+        <w:pStyle w:val="Heading1"/>
+        <w:pPrChange w:id="229" w:author="kyle O'Reilly" w:date="2026-10-21T20:41:00Z" w16du:dateUtc="2026-10-21T19:41:00Z">
+          <w:pPr/>
+        </w:pPrChange>
+      </w:pPr>
+      <w:bookmarkStart w:id="230" w:name="_Toc243520531"/>
+      <w:ins w:id="231" w:author="kyle O'Reilly" w:date="2026-10-21T20:41:00Z" w16du:dateUtc="2026-10-21T19:41:00Z">
+        <w:r>
+          <w:t>9. Project Timeline</w:t>
+        </w:r>
+      </w:ins>
+      <w:bookmarkEnd w:id="230"/>
+    </w:p>
+    <w:p>
+      <w:ins w:id="232" w:author="kyle O'Reilly" w:date="2026-10-21T20:41:00Z" w16du:dateUtc="2026-10-21T19:41:00Z">
+        <w:r>
+          <w:t>?</w:t>
+        </w:r>
+      </w:ins>
+    </w:p>
+    <w:p>
+      <w:pPr>
+        <w:rPr>
+          <w:ins w:id="233" w:author="kyle O'Reilly" w:date="2026-10-21T20:41:00Z" w16du:dateUtc="2026-10-21T19:41:00Z"/>
+        </w:rPr>
+      </w:pPr>
+    </w:p>
+    <w:p>
+      <w:pPr>
+        <w:pStyle w:val="Heading1"/>
+        <w:spacing w:line="360" w:lineRule="auto"/>
+        <w:jc w:val="both"/>
+        <w:rPr>
+          <w:ins w:id="234" w:author="kyle O'Reilly" w:date="2026-10-21T20:41:00Z" w16du:dateUtc="2026-10-21T19:41:00Z"/>
+        </w:rPr>
+        <w:pPrChange w:id="235" w:author="kyle O'Reilly" w:date="2026-10-21T23:07:00Z" w16du:dateUtc="2026-10-21T22:07:00Z">
+          <w:pPr/>
+        </w:pPrChange>
+      </w:pPr>
+      <w:bookmarkStart w:id="236" w:name="_Toc243520532"/>
+      <w:ins w:id="237" w:author="kyle O'Reilly" w:date="2026-10-21T20:41:00Z" w16du:dateUtc="2026-10-21T19:41:00Z">
         <w:r>
           <w:lastRenderedPageBreak/>
           <w:t>10. Ethical and Legal Considerations</w:t>
         </w:r>
-        <w:bookmarkEnd w:id="243"/>
+        <w:bookmarkEnd w:id="236"/>
       </w:ins>
     </w:p>
     <w:p>
@@ -3758,18 +3814,18 @@
         <w:spacing w:line="360" w:lineRule="auto"/>
         <w:jc w:val="both"/>
         <w:rPr>
-          <w:ins w:id="245" w:author="kyle O'Reilly" w:date="2026-10-21T20:46:00Z" w16du:dateUtc="2026-10-21T19:46:00Z"/>
-        </w:rPr>
-        <w:pPrChange w:id="246" w:author="kyle O'Reilly" w:date="2026-10-21T23:07:00Z" w16du:dateUtc="2026-10-21T22:07:00Z">
+          <w:ins w:id="238" w:author="kyle O'Reilly" w:date="2026-10-21T20:46:00Z" w16du:dateUtc="2026-10-21T19:46:00Z"/>
+        </w:rPr>
+        <w:pPrChange w:id="239" w:author="kyle O'Reilly" w:date="2026-10-21T23:07:00Z" w16du:dateUtc="2026-10-21T22:07:00Z">
           <w:pPr/>
         </w:pPrChange>
       </w:pPr>
-      <w:ins w:id="247" w:author="kyle O'Reilly" w:date="2026-10-21T20:42:00Z" w16du:dateUtc="2026-10-21T19:42:00Z">
+      <w:ins w:id="240" w:author="kyle O'Reilly" w:date="2026-10-21T20:42:00Z" w16du:dateUtc="2026-10-21T19:42:00Z">
         <w:r>
           <w:t>This C</w:t>
         </w:r>
       </w:ins>
-      <w:ins w:id="248" w:author="kyle O'Reilly" w:date="2026-10-21T20:43:00Z" w16du:dateUtc="2026-10-21T19:43:00Z">
+      <w:ins w:id="241" w:author="kyle O'Reilly" w:date="2026-10-21T20:43:00Z" w16du:dateUtc="2026-10-21T19:43:00Z">
         <w:r>
           <w:t xml:space="preserve">apstone Project will use </w:t>
         </w:r>
@@ -3780,12 +3836,12 @@
           <w:t>historical stock</w:t>
         </w:r>
       </w:ins>
-      <w:ins w:id="249" w:author="kyle O'Reilly" w:date="2026-10-21T22:01:00Z" w16du:dateUtc="2026-10-21T21:01:00Z">
+      <w:ins w:id="242" w:author="kyle O'Reilly" w:date="2026-10-21T22:01:00Z" w16du:dateUtc="2026-10-21T21:01:00Z">
         <w:r>
           <w:t xml:space="preserve"> </w:t>
         </w:r>
       </w:ins>
-      <w:ins w:id="250" w:author="kyle O'Reilly" w:date="2026-10-21T20:43:00Z" w16du:dateUtc="2026-10-21T19:43:00Z">
+      <w:ins w:id="243" w:author="kyle O'Reilly" w:date="2026-10-21T20:43:00Z" w16du:dateUtc="2026-10-21T19:43:00Z">
         <w:r>
           <w:t xml:space="preserve">data </w:t>
         </w:r>
@@ -3796,7 +3852,7 @@
           <w:t xml:space="preserve">collect personal information or involve human </w:t>
         </w:r>
       </w:ins>
-      <w:ins w:id="251" w:author="kyle O'Reilly" w:date="2026-10-21T20:44:00Z" w16du:dateUtc="2026-10-21T19:44:00Z">
+      <w:ins w:id="244" w:author="kyle O'Reilly" w:date="2026-10-21T20:44:00Z" w16du:dateUtc="2026-10-21T19:44:00Z">
         <w:r>
           <w:t>participants. Stooq data access and usage conditions, and any Trading 212</w:t>
         </w:r>
@@ -3804,114 +3860,124 @@
           <w:t xml:space="preserve"> information reused in the report, will be reviewed and appropriately attributed</w:t>
         </w:r>
       </w:ins>
+      <w:ins w:id="245" w:author="kyle O'Reilly" w:date="2026-10-21T20:45:00Z" w16du:dateUtc="2026-10-21T19:45:00Z">
+        <w:r>
+          <w:t xml:space="preserve">. Historical stock </w:t>
+        </w:r>
+      </w:ins>
+      <w:ins w:id="246" w:author="kyle O'Reilly" w:date="2026-10-21T22:03:00Z" w16du:dateUtc="2026-10-21T21:03:00Z">
+        <w:r>
+          <w:t xml:space="preserve">market </w:t>
+        </w:r>
+      </w:ins>
+      <w:ins w:id="247" w:author="kyle O'Reilly" w:date="2026-10-21T20:45:00Z" w16du:dateUtc="2026-10-21T19:45:00Z">
+        <w:r>
+          <w:t xml:space="preserve">data </w:t>
+        </w:r>
+      </w:ins>
+      <w:ins w:id="248" w:author="kyle O'Reilly" w:date="2026-10-21T22:11:00Z" w16du:dateUtc="2026-10-21T21:11:00Z">
+        <w:r>
+          <w:t>Comma</w:t>
+        </w:r>
+        <w:r>
+          <w:t xml:space="preserve">-Separated Values </w:t>
+        </w:r>
+        <w:r>
+          <w:t>(</w:t>
+        </w:r>
+      </w:ins>
+      <w:ins w:id="249" w:author="kyle O'Reilly" w:date="2026-10-21T22:05:00Z" w16du:dateUtc="2026-10-21T21:05:00Z">
+        <w:r>
+          <w:t>CSV</w:t>
+        </w:r>
+      </w:ins>
+      <w:ins w:id="250" w:author="kyle O'Reilly" w:date="2026-10-21T22:11:00Z" w16du:dateUtc="2026-10-21T21:11:00Z">
+        <w:r>
+          <w:t>)</w:t>
+        </w:r>
+      </w:ins>
+      <w:ins w:id="251" w:author="kyle O'Reilly" w:date="2026-10-21T22:05:00Z" w16du:dateUtc="2026-10-21T21:05:00Z">
+        <w:r>
+          <w:t xml:space="preserve"> </w:t>
+        </w:r>
+      </w:ins>
       <w:ins w:id="252" w:author="kyle O'Reilly" w:date="2026-10-21T20:45:00Z" w16du:dateUtc="2026-10-21T19:45:00Z">
         <w:r>
-          <w:t xml:space="preserve">. Historical stock </w:t>
-        </w:r>
-      </w:ins>
-      <w:ins w:id="253" w:author="kyle O'Reilly" w:date="2026-10-21T22:03:00Z" w16du:dateUtc="2026-10-21T21:03:00Z">
-        <w:r>
-          <w:t xml:space="preserve">market </w:t>
-        </w:r>
-      </w:ins>
-      <w:ins w:id="254" w:author="kyle O'Reilly" w:date="2026-10-21T20:45:00Z" w16du:dateUtc="2026-10-21T19:45:00Z">
-        <w:r>
-          <w:t xml:space="preserve">data </w:t>
-        </w:r>
-      </w:ins>
-      <w:ins w:id="255" w:author="kyle O'Reilly" w:date="2026-10-21T22:11:00Z" w16du:dateUtc="2026-10-21T21:11:00Z">
-        <w:r>
-          <w:t>Comma</w:t>
-        </w:r>
-        <w:r>
-          <w:t xml:space="preserve">-Separated Values </w:t>
-        </w:r>
-        <w:r>
-          <w:t>(</w:t>
-        </w:r>
-      </w:ins>
-      <w:ins w:id="256" w:author="kyle O'Reilly" w:date="2026-10-21T22:05:00Z" w16du:dateUtc="2026-10-21T21:05:00Z">
-        <w:r>
-          <w:t>CSV</w:t>
-        </w:r>
-      </w:ins>
-      <w:ins w:id="257" w:author="kyle O'Reilly" w:date="2026-10-21T22:11:00Z" w16du:dateUtc="2026-10-21T21:11:00Z">
-        <w:r>
-          <w:t>)</w:t>
-        </w:r>
-      </w:ins>
-      <w:ins w:id="258" w:author="kyle O'Reilly" w:date="2026-10-21T22:05:00Z" w16du:dateUtc="2026-10-21T21:05:00Z">
+          <w:t>files</w:t>
+        </w:r>
+      </w:ins>
+      <w:ins w:id="253" w:author="kyle O'Reilly" w:date="2026-10-21T22:07:00Z" w16du:dateUtc="2026-10-21T21:07:00Z">
+        <w:r>
+          <w:t xml:space="preserve"> downloaded from S</w:t>
+        </w:r>
+      </w:ins>
+      <w:ins w:id="254" w:author="kyle O'Reilly" w:date="2026-10-21T22:08:00Z" w16du:dateUtc="2026-10-21T21:08:00Z">
+        <w:r>
+          <w:t>tooq</w:t>
+        </w:r>
+      </w:ins>
+      <w:ins w:id="255" w:author="kyle O'Reilly" w:date="2026-10-21T20:45:00Z" w16du:dateUtc="2026-10-21T19:45:00Z">
         <w:r>
           <w:t xml:space="preserve"> </w:t>
         </w:r>
+        <w:r>
+          <w:t xml:space="preserve">will only be </w:t>
+        </w:r>
+      </w:ins>
+      <w:ins w:id="256" w:author="kyle O'Reilly" w:date="2026-10-21T22:08:00Z" w16du:dateUtc="2026-10-21T21:08:00Z">
+        <w:r>
+          <w:t>uploaded to</w:t>
+        </w:r>
+      </w:ins>
+      <w:ins w:id="257" w:author="kyle O'Reilly" w:date="2026-10-21T20:45:00Z" w16du:dateUtc="2026-10-21T19:45:00Z">
+        <w:r>
+          <w:t xml:space="preserve"> </w:t>
+        </w:r>
+      </w:ins>
+      <w:ins w:id="258" w:author="kyle O'Reilly" w:date="2026-10-21T20:48:00Z" w16du:dateUtc="2026-10-21T19:48:00Z">
+        <w:r>
+          <w:t>GitHub</w:t>
+        </w:r>
       </w:ins>
       <w:ins w:id="259" w:author="kyle O'Reilly" w:date="2026-10-21T20:45:00Z" w16du:dateUtc="2026-10-21T19:45:00Z">
         <w:r>
-          <w:t>files</w:t>
+          <w:t xml:space="preserve"> </w:t>
         </w:r>
       </w:ins>
       <w:ins w:id="260" w:author="kyle O'Reilly" w:date="2026-10-21T22:07:00Z" w16du:dateUtc="2026-10-21T21:07:00Z">
         <w:r>
-          <w:t xml:space="preserve"> downloaded from S</w:t>
-        </w:r>
-      </w:ins>
-      <w:ins w:id="261" w:author="kyle O'Reilly" w:date="2026-10-21T22:08:00Z" w16du:dateUtc="2026-10-21T21:08:00Z">
-        <w:r>
-          <w:t>tooq</w:t>
-        </w:r>
-      </w:ins>
-      <w:ins w:id="262" w:author="kyle O'Reilly" w:date="2026-10-21T20:45:00Z" w16du:dateUtc="2026-10-21T19:45:00Z">
-        <w:r>
-          <w:t xml:space="preserve"> </w:t>
-        </w:r>
-        <w:r>
-          <w:t xml:space="preserve">will only be </w:t>
-        </w:r>
-      </w:ins>
-      <w:ins w:id="263" w:author="kyle O'Reilly" w:date="2026-10-21T22:08:00Z" w16du:dateUtc="2026-10-21T21:08:00Z">
-        <w:r>
-          <w:t>uploaded to</w:t>
-        </w:r>
-      </w:ins>
-      <w:ins w:id="264" w:author="kyle O'Reilly" w:date="2026-10-21T20:45:00Z" w16du:dateUtc="2026-10-21T19:45:00Z">
-        <w:r>
-          <w:t xml:space="preserve"> </w:t>
-        </w:r>
-      </w:ins>
-      <w:ins w:id="265" w:author="kyle O'Reilly" w:date="2026-10-21T20:48:00Z" w16du:dateUtc="2026-10-21T19:48:00Z">
-        <w:r>
-          <w:t>GitHub</w:t>
-        </w:r>
-      </w:ins>
-      <w:ins w:id="266" w:author="kyle O'Reilly" w:date="2026-10-21T20:45:00Z" w16du:dateUtc="2026-10-21T19:45:00Z">
-        <w:r>
-          <w:t xml:space="preserve"> </w:t>
-        </w:r>
-      </w:ins>
-      <w:ins w:id="267" w:author="kyle O'Reilly" w:date="2026-10-21T22:07:00Z" w16du:dateUtc="2026-10-21T21:07:00Z">
-        <w:r>
           <w:t>if permitted by Stooq’s terms of service</w:t>
         </w:r>
       </w:ins>
-      <w:ins w:id="268" w:author="kyle O'Reilly" w:date="2026-10-21T20:45:00Z" w16du:dateUtc="2026-10-21T19:45:00Z">
+      <w:ins w:id="261" w:author="kyle O'Reilly" w:date="2026-10-21T20:45:00Z" w16du:dateUtc="2026-10-21T19:45:00Z">
         <w:r>
           <w:t xml:space="preserve">; otherwise, </w:t>
         </w:r>
       </w:ins>
-      <w:ins w:id="269" w:author="kyle O'Reilly" w:date="2026-10-21T22:07:00Z" w16du:dateUtc="2026-10-21T21:07:00Z">
+      <w:ins w:id="262" w:author="kyle O'Reilly" w:date="2026-10-21T22:07:00Z" w16du:dateUtc="2026-10-21T21:07:00Z">
         <w:r>
           <w:t xml:space="preserve">the </w:t>
         </w:r>
         <w:r>
-          <w:t xml:space="preserve">Phyton </w:t>
-        </w:r>
-      </w:ins>
-      <w:ins w:id="270" w:author="kyle O'Reilly" w:date="2026-10-21T20:45:00Z" w16du:dateUtc="2026-10-21T19:45:00Z">
+          <w:t>Pyt</w:t>
+        </w:r>
+      </w:ins>
+      <w:ins w:id="263" w:author="kyle O'Reilly" w:date="2026-10-22T00:14:00Z" w16du:dateUtc="2026-10-21T23:14:00Z">
+        <w:r>
+          <w:t>h</w:t>
+        </w:r>
+      </w:ins>
+      <w:ins w:id="264" w:author="kyle O'Reilly" w:date="2026-10-21T22:07:00Z" w16du:dateUtc="2026-10-21T21:07:00Z">
+        <w:r>
+          <w:t xml:space="preserve">on </w:t>
+        </w:r>
+      </w:ins>
+      <w:ins w:id="265" w:author="kyle O'Reilly" w:date="2026-10-21T20:45:00Z" w16du:dateUtc="2026-10-21T19:45:00Z">
         <w:r>
           <w:t xml:space="preserve">code and retrieval </w:t>
         </w:r>
       </w:ins>
-      <w:ins w:id="271" w:author="kyle O'Reilly" w:date="2026-10-21T20:46:00Z" w16du:dateUtc="2026-10-21T19:46:00Z">
+      <w:ins w:id="266" w:author="kyle O'Reilly" w:date="2026-10-21T20:46:00Z" w16du:dateUtc="2026-10-21T19:46:00Z">
         <w:r>
           <w:t xml:space="preserve">instructions will be provided. </w:t>
         </w:r>
@@ -3922,13 +3988,13 @@
         <w:spacing w:line="360" w:lineRule="auto"/>
         <w:jc w:val="both"/>
         <w:rPr>
-          <w:ins w:id="272" w:author="kyle O'Reilly" w:date="2026-10-21T20:42:00Z" w16du:dateUtc="2026-10-21T19:42:00Z"/>
-        </w:rPr>
-        <w:pPrChange w:id="273" w:author="kyle O'Reilly" w:date="2026-10-21T23:07:00Z" w16du:dateUtc="2026-10-21T22:07:00Z">
+          <w:ins w:id="267" w:author="kyle O'Reilly" w:date="2026-10-21T20:42:00Z" w16du:dateUtc="2026-10-21T19:42:00Z"/>
+        </w:rPr>
+        <w:pPrChange w:id="268" w:author="kyle O'Reilly" w:date="2026-10-21T23:07:00Z" w16du:dateUtc="2026-10-21T22:07:00Z">
           <w:pPr/>
         </w:pPrChange>
       </w:pPr>
-      <w:ins w:id="274" w:author="kyle O'Reilly" w:date="2026-10-21T22:09:00Z" w16du:dateUtc="2026-10-21T21:09:00Z">
+      <w:ins w:id="269" w:author="kyle O'Reilly" w:date="2026-10-21T22:09:00Z" w16du:dateUtc="2026-10-21T21:09:00Z">
         <w:r>
           <w:t>All results</w:t>
         </w:r>
@@ -3936,47 +4002,57 @@
           <w:t>,</w:t>
         </w:r>
       </w:ins>
-      <w:ins w:id="275" w:author="kyle O'Reilly" w:date="2026-10-21T20:47:00Z" w16du:dateUtc="2026-10-21T19:47:00Z">
+      <w:ins w:id="270" w:author="kyle O'Reilly" w:date="2026-10-21T20:47:00Z" w16du:dateUtc="2026-10-21T19:47:00Z">
         <w:r>
           <w:t xml:space="preserve"> including </w:t>
         </w:r>
       </w:ins>
-      <w:ins w:id="276" w:author="kyle O'Reilly" w:date="2026-10-21T22:10:00Z" w16du:dateUtc="2026-10-21T21:10:00Z">
+      <w:ins w:id="271" w:author="kyle O'Reilly" w:date="2026-10-21T22:10:00Z" w16du:dateUtc="2026-10-21T21:10:00Z">
         <w:r>
           <w:t>inaccurate</w:t>
         </w:r>
       </w:ins>
-      <w:ins w:id="277" w:author="kyle O'Reilly" w:date="2026-10-21T20:47:00Z" w16du:dateUtc="2026-10-21T19:47:00Z">
+      <w:ins w:id="272" w:author="kyle O'Reilly" w:date="2026-10-21T20:47:00Z" w16du:dateUtc="2026-10-21T19:47:00Z">
         <w:r>
           <w:t xml:space="preserve"> predictions, will be reported transparently. Th</w:t>
         </w:r>
       </w:ins>
-      <w:ins w:id="278" w:author="kyle O'Reilly" w:date="2026-10-21T22:10:00Z" w16du:dateUtc="2026-10-21T21:10:00Z">
+      <w:ins w:id="273" w:author="kyle O'Reilly" w:date="2026-10-21T22:10:00Z" w16du:dateUtc="2026-10-21T21:10:00Z">
         <w:r>
           <w:t>is Capstone Project</w:t>
         </w:r>
       </w:ins>
-      <w:ins w:id="279" w:author="kyle O'Reilly" w:date="2026-10-21T20:47:00Z" w16du:dateUtc="2026-10-21T19:47:00Z">
+      <w:ins w:id="274" w:author="kyle O'Reilly" w:date="2026-10-21T20:47:00Z" w16du:dateUtc="2026-10-21T19:47:00Z">
         <w:r>
           <w:t xml:space="preserve"> work is for academic purposes</w:t>
         </w:r>
       </w:ins>
-      <w:ins w:id="280" w:author="kyle O'Reilly" w:date="2026-10-21T22:10:00Z" w16du:dateUtc="2026-10-21T21:10:00Z">
+      <w:ins w:id="275" w:author="kyle O'Reilly" w:date="2026-10-21T22:10:00Z" w16du:dateUtc="2026-10-21T21:10:00Z">
         <w:r>
           <w:t xml:space="preserve"> only</w:t>
         </w:r>
       </w:ins>
-      <w:ins w:id="281" w:author="kyle O'Reilly" w:date="2026-10-21T20:47:00Z" w16du:dateUtc="2026-10-21T19:47:00Z">
-        <w:r>
-          <w:t xml:space="preserve"> and does constitute financial inv</w:t>
-        </w:r>
-      </w:ins>
-      <w:ins w:id="282" w:author="kyle O'Reilly" w:date="2026-10-21T20:48:00Z" w16du:dateUtc="2026-10-21T19:48:00Z">
+      <w:ins w:id="276" w:author="kyle O'Reilly" w:date="2026-10-21T20:47:00Z" w16du:dateUtc="2026-10-21T19:47:00Z">
+        <w:r>
+          <w:t xml:space="preserve"> and does </w:t>
+        </w:r>
+      </w:ins>
+      <w:ins w:id="277" w:author="kyle O'Reilly" w:date="2026-10-22T00:14:00Z" w16du:dateUtc="2026-10-21T23:14:00Z">
+        <w:r>
+          <w:t xml:space="preserve">not </w:t>
+        </w:r>
+      </w:ins>
+      <w:ins w:id="278" w:author="kyle O'Reilly" w:date="2026-10-21T20:47:00Z" w16du:dateUtc="2026-10-21T19:47:00Z">
+        <w:r>
+          <w:t>constitute financial inv</w:t>
+        </w:r>
+      </w:ins>
+      <w:ins w:id="279" w:author="kyle O'Reilly" w:date="2026-10-21T20:48:00Z" w16du:dateUtc="2026-10-21T19:48:00Z">
         <w:r>
           <w:t>estment</w:t>
         </w:r>
       </w:ins>
-      <w:ins w:id="283" w:author="kyle O'Reilly" w:date="2026-10-21T20:47:00Z" w16du:dateUtc="2026-10-21T19:47:00Z">
+      <w:ins w:id="280" w:author="kyle O'Reilly" w:date="2026-10-21T20:47:00Z" w16du:dateUtc="2026-10-21T19:47:00Z">
         <w:r>
           <w:t xml:space="preserve"> advice.</w:t>
         </w:r>
@@ -3985,7 +4061,7 @@
     <w:p>
       <w:pPr>
         <w:rPr>
-          <w:ins w:id="284" w:author="kyle O'Reilly" w:date="2026-10-21T20:42:00Z" w16du:dateUtc="2026-10-21T19:42:00Z"/>
+          <w:ins w:id="281" w:author="kyle O'Reilly" w:date="2026-10-21T20:42:00Z" w16du:dateUtc="2026-10-21T19:42:00Z"/>
         </w:rPr>
       </w:pPr>
     </w:p>
@@ -3993,18 +4069,18 @@
       <w:pPr>
         <w:pStyle w:val="Heading1"/>
         <w:rPr>
-          <w:ins w:id="285" w:author="kyle O'Reilly" w:date="2026-10-21T20:42:00Z" w16du:dateUtc="2026-10-21T19:42:00Z"/>
-        </w:rPr>
-        <w:pPrChange w:id="286" w:author="kyle O'Reilly" w:date="2026-10-21T20:42:00Z" w16du:dateUtc="2026-10-21T19:42:00Z">
+          <w:ins w:id="282" w:author="kyle O'Reilly" w:date="2026-10-21T20:42:00Z" w16du:dateUtc="2026-10-21T19:42:00Z"/>
+        </w:rPr>
+        <w:pPrChange w:id="283" w:author="kyle O'Reilly" w:date="2026-10-21T20:42:00Z" w16du:dateUtc="2026-10-21T19:42:00Z">
           <w:pPr/>
         </w:pPrChange>
       </w:pPr>
-      <w:bookmarkStart w:id="287" w:name="_Toc243507775"/>
-      <w:ins w:id="288" w:author="kyle O'Reilly" w:date="2026-10-21T20:42:00Z" w16du:dateUtc="2026-10-21T19:42:00Z">
+      <w:bookmarkStart w:id="284" w:name="_Toc243520533"/>
+      <w:ins w:id="285" w:author="kyle O'Reilly" w:date="2026-10-21T20:42:00Z" w16du:dateUtc="2026-10-21T19:42:00Z">
         <w:r>
           <w:t>References</w:t>
         </w:r>
-        <w:bookmarkEnd w:id="287"/>
+        <w:bookmarkEnd w:id="284"/>
         <w:r>
           <w:t xml:space="preserve"> </w:t>
         </w:r>
@@ -4013,17 +4089,17 @@
     <w:p>
       <w:pPr>
         <w:rPr>
-          <w:ins w:id="289" w:author="kyle O'Reilly" w:date="2026-10-21T23:38:00Z" w16du:dateUtc="2026-10-21T22:38:00Z"/>
-        </w:rPr>
-      </w:pPr>
-    </w:p>
-    <w:p>
-      <w:pPr>
-        <w:rPr>
-          <w:ins w:id="290" w:author="kyle O'Reilly" w:date="2026-10-21T23:38:00Z" w16du:dateUtc="2026-10-21T22:38:00Z"/>
-        </w:rPr>
-      </w:pPr>
-      <w:ins w:id="291" w:author="kyle O'Reilly" w:date="2026-10-21T23:38:00Z" w16du:dateUtc="2026-10-21T22:38:00Z">
+          <w:ins w:id="286" w:author="kyle O'Reilly" w:date="2026-10-21T23:38:00Z" w16du:dateUtc="2026-10-21T22:38:00Z"/>
+        </w:rPr>
+      </w:pPr>
+    </w:p>
+    <w:p>
+      <w:pPr>
+        <w:rPr>
+          <w:ins w:id="287" w:author="kyle O'Reilly" w:date="2026-10-21T23:38:00Z" w16du:dateUtc="2026-10-21T22:38:00Z"/>
+        </w:rPr>
+      </w:pPr>
+      <w:ins w:id="288" w:author="kyle O'Reilly" w:date="2026-10-21T23:38:00Z" w16du:dateUtc="2026-10-21T22:38:00Z">
         <w:r>
           <w:t xml:space="preserve">Section 7 </w:t>
         </w:r>
@@ -4032,25 +4108,25 @@
     <w:p>
       <w:pPr>
         <w:rPr>
-          <w:ins w:id="292" w:author="kyle O'Reilly" w:date="2026-10-21T23:48:00Z" w16du:dateUtc="2026-10-21T22:48:00Z"/>
-        </w:rPr>
-      </w:pPr>
-      <w:ins w:id="293" w:author="kyle O'Reilly" w:date="2026-10-21T23:50:00Z" w16du:dateUtc="2026-10-21T22:50:00Z">
+          <w:ins w:id="289" w:author="kyle O'Reilly" w:date="2026-10-21T23:48:00Z" w16du:dateUtc="2026-10-21T22:48:00Z"/>
+        </w:rPr>
+      </w:pPr>
+      <w:ins w:id="290" w:author="kyle O'Reilly" w:date="2026-10-21T23:50:00Z" w16du:dateUtc="2026-10-21T22:50:00Z">
         <w:r>
           <w:t>Trading 212</w:t>
         </w:r>
       </w:ins>
-      <w:ins w:id="294" w:author="kyle O'Reilly" w:date="2026-10-21T23:52:00Z" w16du:dateUtc="2026-10-21T22:52:00Z">
+      <w:ins w:id="291" w:author="kyle O'Reilly" w:date="2026-10-21T23:52:00Z" w16du:dateUtc="2026-10-21T22:52:00Z">
         <w:r>
           <w:t xml:space="preserve"> </w:t>
         </w:r>
       </w:ins>
-      <w:ins w:id="295" w:author="kyle O'Reilly" w:date="2026-10-21T23:50:00Z" w16du:dateUtc="2026-10-21T22:50:00Z">
+      <w:ins w:id="292" w:author="kyle O'Reilly" w:date="2026-10-21T23:50:00Z" w16du:dateUtc="2026-10-21T22:50:00Z">
         <w:r>
           <w:t>(n.d.) Trading 212 investment platform. Available at:</w:t>
         </w:r>
       </w:ins>
-      <w:ins w:id="296" w:author="kyle O'Reilly" w:date="2026-10-21T23:51:00Z" w16du:dateUtc="2026-10-21T22:51:00Z">
+      <w:ins w:id="293" w:author="kyle O'Reilly" w:date="2026-10-21T23:51:00Z" w16du:dateUtc="2026-10-21T22:51:00Z">
         <w:r>
           <w:t xml:space="preserve"> </w:t>
         </w:r>
@@ -4082,12 +4158,12 @@
           <w:t xml:space="preserve">  (</w:t>
         </w:r>
       </w:ins>
-      <w:ins w:id="297" w:author="kyle O'Reilly" w:date="2026-10-21T23:50:00Z" w16du:dateUtc="2026-10-21T22:50:00Z">
+      <w:ins w:id="294" w:author="kyle O'Reilly" w:date="2026-10-21T23:50:00Z" w16du:dateUtc="2026-10-21T22:50:00Z">
         <w:r>
           <w:t>Accessed: 2</w:t>
         </w:r>
       </w:ins>
-      <w:ins w:id="298" w:author="kyle O'Reilly" w:date="2026-10-21T23:51:00Z" w16du:dateUtc="2026-10-21T22:51:00Z">
+      <w:ins w:id="295" w:author="kyle O'Reilly" w:date="2026-10-21T23:51:00Z" w16du:dateUtc="2026-10-21T22:51:00Z">
         <w:r>
           <w:t>1 October 2026).</w:t>
         </w:r>
@@ -4096,10 +4172,10 @@
     <w:p>
       <w:pPr>
         <w:rPr>
-          <w:ins w:id="299" w:author="kyle O'Reilly" w:date="2026-10-21T23:53:00Z" w16du:dateUtc="2026-10-21T22:53:00Z"/>
-        </w:rPr>
-      </w:pPr>
-      <w:ins w:id="300" w:author="kyle O'Reilly" w:date="2026-10-21T23:52:00Z" w16du:dateUtc="2026-10-21T22:52:00Z">
+          <w:ins w:id="296" w:author="kyle O'Reilly" w:date="2026-10-21T23:53:00Z" w16du:dateUtc="2026-10-21T22:53:00Z"/>
+        </w:rPr>
+      </w:pPr>
+      <w:ins w:id="297" w:author="kyle O'Reilly" w:date="2026-10-21T23:52:00Z" w16du:dateUtc="2026-10-21T22:52:00Z">
         <w:r>
           <w:t xml:space="preserve">Stooq (n.d.a) </w:t>
         </w:r>
@@ -4107,12 +4183,12 @@
           <w:t>JPMorgan Chase &amp; Co. (JPM.</w:t>
         </w:r>
       </w:ins>
-      <w:ins w:id="301" w:author="kyle O'Reilly" w:date="2026-10-21T23:53:00Z" w16du:dateUtc="2026-10-21T22:53:00Z">
+      <w:ins w:id="298" w:author="kyle O'Reilly" w:date="2026-10-21T23:53:00Z" w16du:dateUtc="2026-10-21T22:53:00Z">
         <w:r>
           <w:t>US) – Historical data. Available at:</w:t>
         </w:r>
       </w:ins>
-      <w:ins w:id="302" w:author="kyle O'Reilly" w:date="2026-10-21T23:57:00Z" w16du:dateUtc="2026-10-21T22:57:00Z">
+      <w:ins w:id="299" w:author="kyle O'Reilly" w:date="2026-10-21T23:57:00Z" w16du:dateUtc="2026-10-21T22:57:00Z">
         <w:r>
           <w:t xml:space="preserve"> </w:t>
         </w:r>
@@ -4124,7 +4200,7 @@
         </w:r>
         <w:r>
           <w:rPr>
-            <w:rPrChange w:id="303" w:author="kyle O'Reilly" w:date="2026-10-21T23:57:00Z" w16du:dateUtc="2026-10-21T22:57:00Z">
+            <w:rPrChange w:id="300" w:author="kyle O'Reilly" w:date="2026-10-21T23:57:00Z" w16du:dateUtc="2026-10-21T22:57:00Z">
               <w:rPr>
                 <w:rStyle w:val="Hyperlink"/>
               </w:rPr>
@@ -4151,7 +4227,7 @@
           <w:t xml:space="preserve"> </w:t>
         </w:r>
       </w:ins>
-      <w:ins w:id="304" w:author="kyle O'Reilly" w:date="2026-10-21T23:53:00Z" w16du:dateUtc="2026-10-21T22:53:00Z">
+      <w:ins w:id="301" w:author="kyle O'Reilly" w:date="2026-10-21T23:53:00Z" w16du:dateUtc="2026-10-21T22:53:00Z">
         <w:r>
           <w:t>(Accessed</w:t>
         </w:r>
@@ -4159,12 +4235,12 @@
           <w:t xml:space="preserve">: 21 </w:t>
         </w:r>
       </w:ins>
-      <w:ins w:id="305" w:author="kyle O'Reilly" w:date="2026-10-21T23:55:00Z" w16du:dateUtc="2026-10-21T22:55:00Z">
+      <w:ins w:id="302" w:author="kyle O'Reilly" w:date="2026-10-21T23:55:00Z" w16du:dateUtc="2026-10-21T22:55:00Z">
         <w:r>
           <w:t>October</w:t>
         </w:r>
       </w:ins>
-      <w:ins w:id="306" w:author="kyle O'Reilly" w:date="2026-10-21T23:53:00Z" w16du:dateUtc="2026-10-21T22:53:00Z">
+      <w:ins w:id="303" w:author="kyle O'Reilly" w:date="2026-10-21T23:53:00Z" w16du:dateUtc="2026-10-21T22:53:00Z">
         <w:r>
           <w:t xml:space="preserve"> 2026).</w:t>
         </w:r>
@@ -4173,45 +4249,45 @@
     <w:p>
       <w:pPr>
         <w:rPr>
-          <w:ins w:id="307" w:author="kyle O'Reilly" w:date="2026-10-21T23:54:00Z" w16du:dateUtc="2026-10-21T22:54:00Z"/>
-        </w:rPr>
-      </w:pPr>
-      <w:ins w:id="308" w:author="kyle O'Reilly" w:date="2026-10-21T23:53:00Z" w16du:dateUtc="2026-10-21T22:53:00Z">
+          <w:ins w:id="304" w:author="kyle O'Reilly" w:date="2026-10-21T23:54:00Z" w16du:dateUtc="2026-10-21T22:54:00Z"/>
+        </w:rPr>
+      </w:pPr>
+      <w:ins w:id="305" w:author="kyle O'Reilly" w:date="2026-10-21T23:53:00Z" w16du:dateUtc="2026-10-21T22:53:00Z">
         <w:r>
           <w:t xml:space="preserve">Stooq (n.d.b) Coca-Cola </w:t>
         </w:r>
       </w:ins>
-      <w:ins w:id="309" w:author="kyle O'Reilly" w:date="2026-10-21T23:54:00Z" w16du:dateUtc="2026-10-21T22:54:00Z">
+      <w:ins w:id="306" w:author="kyle O'Reilly" w:date="2026-10-21T23:54:00Z" w16du:dateUtc="2026-10-21T22:54:00Z">
         <w:r>
           <w:t>Co</w:t>
         </w:r>
       </w:ins>
-      <w:ins w:id="310" w:author="kyle O'Reilly" w:date="2026-10-22T00:04:00Z" w16du:dateUtc="2026-10-21T23:04:00Z">
+      <w:ins w:id="307" w:author="kyle O'Reilly" w:date="2026-10-22T00:04:00Z" w16du:dateUtc="2026-10-21T23:04:00Z">
         <w:r>
           <w:t>.</w:t>
         </w:r>
       </w:ins>
-      <w:ins w:id="311" w:author="kyle O'Reilly" w:date="2026-10-21T23:54:00Z" w16du:dateUtc="2026-10-21T22:54:00Z">
+      <w:ins w:id="308" w:author="kyle O'Reilly" w:date="2026-10-21T23:54:00Z" w16du:dateUtc="2026-10-21T22:54:00Z">
         <w:r>
           <w:t xml:space="preserve"> </w:t>
         </w:r>
       </w:ins>
-      <w:ins w:id="312" w:author="kyle O'Reilly" w:date="2026-10-21T23:53:00Z" w16du:dateUtc="2026-10-21T22:53:00Z">
+      <w:ins w:id="309" w:author="kyle O'Reilly" w:date="2026-10-21T23:53:00Z" w16du:dateUtc="2026-10-21T22:53:00Z">
         <w:r>
           <w:t>(KO.U</w:t>
         </w:r>
       </w:ins>
-      <w:ins w:id="313" w:author="kyle O'Reilly" w:date="2026-10-21T23:54:00Z" w16du:dateUtc="2026-10-21T22:54:00Z">
+      <w:ins w:id="310" w:author="kyle O'Reilly" w:date="2026-10-21T23:54:00Z" w16du:dateUtc="2026-10-21T22:54:00Z">
         <w:r>
           <w:t>S)</w:t>
         </w:r>
       </w:ins>
-      <w:ins w:id="314" w:author="kyle O'Reilly" w:date="2026-10-21T23:55:00Z" w16du:dateUtc="2026-10-21T22:55:00Z">
+      <w:ins w:id="311" w:author="kyle O'Reilly" w:date="2026-10-21T23:55:00Z" w16du:dateUtc="2026-10-21T22:55:00Z">
         <w:r>
           <w:t xml:space="preserve"> – Historical data. Available at:</w:t>
         </w:r>
       </w:ins>
-      <w:ins w:id="315" w:author="kyle O'Reilly" w:date="2026-10-21T23:56:00Z" w16du:dateUtc="2026-10-21T22:56:00Z">
+      <w:ins w:id="312" w:author="kyle O'Reilly" w:date="2026-10-21T23:56:00Z" w16du:dateUtc="2026-10-21T22:56:00Z">
         <w:r>
           <w:t xml:space="preserve"> </w:t>
         </w:r>
@@ -4243,7 +4319,7 @@
           <w:t xml:space="preserve"> </w:t>
         </w:r>
       </w:ins>
-      <w:ins w:id="316" w:author="kyle O'Reilly" w:date="2026-10-21T23:55:00Z" w16du:dateUtc="2026-10-21T22:55:00Z">
+      <w:ins w:id="313" w:author="kyle O'Reilly" w:date="2026-10-21T23:55:00Z" w16du:dateUtc="2026-10-21T22:55:00Z">
         <w:r>
           <w:t>(Accessed: 21 October 2026).</w:t>
         </w:r>
@@ -4252,25 +4328,25 @@
     <w:p>
       <w:pPr>
         <w:rPr>
-          <w:ins w:id="317" w:author="kyle O'Reilly" w:date="2026-10-21T23:49:00Z" w16du:dateUtc="2026-10-21T22:49:00Z"/>
-        </w:rPr>
-      </w:pPr>
-      <w:ins w:id="318" w:author="kyle O'Reilly" w:date="2026-10-21T23:54:00Z" w16du:dateUtc="2026-10-21T22:54:00Z">
+          <w:ins w:id="314" w:author="kyle O'Reilly" w:date="2026-10-21T23:49:00Z" w16du:dateUtc="2026-10-21T22:49:00Z"/>
+        </w:rPr>
+      </w:pPr>
+      <w:ins w:id="315" w:author="kyle O'Reilly" w:date="2026-10-21T23:54:00Z" w16du:dateUtc="2026-10-21T22:54:00Z">
         <w:r>
           <w:t xml:space="preserve">Stooq (n.d.c) Intel </w:t>
         </w:r>
       </w:ins>
-      <w:ins w:id="319" w:author="kyle O'Reilly" w:date="2026-10-22T00:04:00Z" w16du:dateUtc="2026-10-21T23:04:00Z">
+      <w:ins w:id="316" w:author="kyle O'Reilly" w:date="2026-10-22T00:04:00Z" w16du:dateUtc="2026-10-21T23:04:00Z">
         <w:r>
           <w:t xml:space="preserve">Corp. </w:t>
         </w:r>
       </w:ins>
-      <w:ins w:id="320" w:author="kyle O'Reilly" w:date="2026-10-21T23:54:00Z" w16du:dateUtc="2026-10-21T22:54:00Z">
+      <w:ins w:id="317" w:author="kyle O'Reilly" w:date="2026-10-21T23:54:00Z" w16du:dateUtc="2026-10-21T22:54:00Z">
         <w:r>
           <w:t>(INTC.US)</w:t>
         </w:r>
       </w:ins>
-      <w:ins w:id="321" w:author="kyle O'Reilly" w:date="2026-10-21T23:55:00Z" w16du:dateUtc="2026-10-21T22:55:00Z">
+      <w:ins w:id="318" w:author="kyle O'Reilly" w:date="2026-10-21T23:55:00Z" w16du:dateUtc="2026-10-21T22:55:00Z">
         <w:r>
           <w:t xml:space="preserve"> – Historical data. Available at</w:t>
         </w:r>
@@ -4278,7 +4354,7 @@
           <w:t>:</w:t>
         </w:r>
       </w:ins>
-      <w:ins w:id="322" w:author="kyle O'Reilly" w:date="2026-10-21T23:56:00Z" w16du:dateUtc="2026-10-21T22:56:00Z">
+      <w:ins w:id="319" w:author="kyle O'Reilly" w:date="2026-10-21T23:56:00Z" w16du:dateUtc="2026-10-21T22:56:00Z">
         <w:r>
           <w:t xml:space="preserve"> </w:t>
         </w:r>
@@ -4310,14 +4386,31 @@
           <w:t xml:space="preserve"> </w:t>
         </w:r>
       </w:ins>
-      <w:ins w:id="323" w:author="kyle O'Reilly" w:date="2026-10-21T23:55:00Z" w16du:dateUtc="2026-10-21T22:55:00Z">
+      <w:ins w:id="320" w:author="kyle O'Reilly" w:date="2026-10-21T23:55:00Z" w16du:dateUtc="2026-10-21T22:55:00Z">
         <w:r>
           <w:t xml:space="preserve"> </w:t>
         </w:r>
         <w:r>
-          <w:t>(Accessed: 21 Otcober 2026).</w:t>
-        </w:r>
-      </w:ins>
+          <w:t xml:space="preserve">(Accessed: 21 </w:t>
+        </w:r>
+      </w:ins>
+      <w:ins w:id="321" w:author="kyle O'Reilly" w:date="2026-10-22T00:14:00Z" w16du:dateUtc="2026-10-21T23:14:00Z">
+        <w:r>
+          <w:t>October</w:t>
+        </w:r>
+      </w:ins>
+      <w:ins w:id="322" w:author="kyle O'Reilly" w:date="2026-10-21T23:55:00Z" w16du:dateUtc="2026-10-21T22:55:00Z">
+        <w:r>
+          <w:t xml:space="preserve"> 2026).</w:t>
+        </w:r>
+      </w:ins>
+    </w:p>
+    <w:p>
+      <w:pPr>
+        <w:rPr>
+          <w:ins w:id="323" w:author="kyle O'Reilly" w:date="2026-10-21T23:49:00Z" w16du:dateUtc="2026-10-21T22:49:00Z"/>
+        </w:rPr>
+      </w:pPr>
     </w:p>
     <w:p>
       <w:pPr>
@@ -4392,83 +4485,46 @@
     <w:p>
       <w:pPr>
         <w:rPr>
-          <w:ins w:id="334" w:author="kyle O'Reilly" w:date="2026-10-21T23:49:00Z" w16du:dateUtc="2026-10-21T22:49:00Z"/>
-        </w:rPr>
-      </w:pPr>
-    </w:p>
-    <w:p>
-      <w:pPr>
-        <w:rPr>
-          <w:ins w:id="335" w:author="kyle O'Reilly" w:date="2026-10-21T23:49:00Z" w16du:dateUtc="2026-10-21T22:49:00Z"/>
-        </w:rPr>
-      </w:pPr>
-    </w:p>
-    <w:p>
-      <w:pPr>
-        <w:rPr>
-          <w:ins w:id="336" w:author="kyle O'Reilly" w:date="2026-10-21T23:49:00Z" w16du:dateUtc="2026-10-21T22:49:00Z"/>
-        </w:rPr>
-      </w:pPr>
-    </w:p>
-    <w:p>
-      <w:pPr>
-        <w:rPr>
-          <w:ins w:id="337" w:author="kyle O'Reilly" w:date="2026-10-21T23:49:00Z" w16du:dateUtc="2026-10-21T22:49:00Z"/>
-        </w:rPr>
-      </w:pPr>
-    </w:p>
-    <w:p>
-      <w:pPr>
-        <w:rPr>
-          <w:ins w:id="338" w:author="kyle O'Reilly" w:date="2026-10-21T23:49:00Z" w16du:dateUtc="2026-10-21T22:49:00Z"/>
-        </w:rPr>
-      </w:pPr>
-    </w:p>
-    <w:p>
-      <w:pPr>
-        <w:rPr>
-          <w:ins w:id="339" w:author="kyle O'Reilly" w:date="2026-10-21T23:49:00Z" w16du:dateUtc="2026-10-21T22:49:00Z"/>
-        </w:rPr>
-      </w:pPr>
-    </w:p>
-    <w:p>
-      <w:pPr>
-        <w:jc w:val="center"/>
-        <w:rPr>
-          <w:ins w:id="340" w:author="kyle O'Reilly" w:date="2026-10-21T23:49:00Z" w16du:dateUtc="2026-10-21T22:49:00Z"/>
+          <w:ins w:id="334" w:author="kyle O'Reilly" w:date="2026-10-22T00:15:00Z" w16du:dateUtc="2026-10-21T23:15:00Z"/>
           <w:sz w:val="96"/>
           <w:szCs w:val="96"/>
-          <w:rPrChange w:id="341" w:author="kyle O'Reilly" w:date="2026-10-21T23:49:00Z" w16du:dateUtc="2026-10-21T22:49:00Z">
+        </w:rPr>
+      </w:pPr>
+    </w:p>
+    <w:p>
+      <w:pPr>
+        <w:rPr>
+          <w:ins w:id="335" w:author="kyle O'Reilly" w:date="2026-10-21T23:49:00Z" w16du:dateUtc="2026-10-21T22:49:00Z"/>
+          <w:sz w:val="96"/>
+          <w:szCs w:val="96"/>
+          <w:rPrChange w:id="336" w:author="kyle O'Reilly" w:date="2026-10-21T23:49:00Z" w16du:dateUtc="2026-10-21T22:49:00Z">
             <w:rPr>
-              <w:ins w:id="342" w:author="kyle O'Reilly" w:date="2026-10-21T23:49:00Z" w16du:dateUtc="2026-10-21T22:49:00Z"/>
+              <w:ins w:id="337" w:author="kyle O'Reilly" w:date="2026-10-21T23:49:00Z" w16du:dateUtc="2026-10-21T22:49:00Z"/>
             </w:rPr>
           </w:rPrChange>
         </w:rPr>
-        <w:pPrChange w:id="343" w:author="kyle O'Reilly" w:date="2026-10-21T23:49:00Z" w16du:dateUtc="2026-10-21T22:49:00Z">
+      </w:pPr>
+    </w:p>
+    <w:p>
+      <w:pPr>
+        <w:jc w:val="center"/>
+        <w:rPr>
+          <w:sz w:val="96"/>
+          <w:szCs w:val="96"/>
+          <w:rPrChange w:id="338" w:author="kyle O'Reilly" w:date="2026-10-21T23:49:00Z" w16du:dateUtc="2026-10-21T22:49:00Z">
+            <w:rPr/>
+          </w:rPrChange>
+        </w:rPr>
+        <w:pPrChange w:id="339" w:author="kyle O'Reilly" w:date="2026-10-21T23:49:00Z" w16du:dateUtc="2026-10-21T22:49:00Z">
           <w:pPr/>
         </w:pPrChange>
       </w:pPr>
-    </w:p>
-    <w:p>
-      <w:pPr>
-        <w:jc w:val="center"/>
-        <w:rPr>
-          <w:sz w:val="96"/>
-          <w:szCs w:val="96"/>
-          <w:rPrChange w:id="344" w:author="kyle O'Reilly" w:date="2026-10-21T23:49:00Z" w16du:dateUtc="2026-10-21T22:49:00Z">
-            <w:rPr/>
-          </w:rPrChange>
-        </w:rPr>
-        <w:pPrChange w:id="345" w:author="kyle O'Reilly" w:date="2026-10-21T23:49:00Z" w16du:dateUtc="2026-10-21T22:49:00Z">
-          <w:pPr/>
-        </w:pPrChange>
-      </w:pPr>
-      <w:ins w:id="346" w:author="kyle O'Reilly" w:date="2026-10-21T23:49:00Z" w16du:dateUtc="2026-10-21T22:49:00Z">
+      <w:ins w:id="340" w:author="kyle O'Reilly" w:date="2026-10-21T23:49:00Z" w16du:dateUtc="2026-10-21T22:49:00Z">
         <w:r>
           <w:rPr>
             <w:sz w:val="96"/>
             <w:szCs w:val="96"/>
-            <w:rPrChange w:id="347" w:author="kyle O'Reilly" w:date="2026-10-21T23:49:00Z" w16du:dateUtc="2026-10-21T22:49:00Z">
+            <w:rPrChange w:id="341" w:author="kyle O'Reilly" w:date="2026-10-21T23:49:00Z" w16du:dateUtc="2026-10-21T22:49:00Z">
               <w:rPr/>
             </w:rPrChange>
           </w:rPr>
@@ -6195,6 +6251,7 @@
   <w:style w:type="character" w:default="1" w:styleId="DefaultParagraphFont">
     <w:name w:val="Default Paragraph Font"/>
     <w:uiPriority w:val="1"/>
+    <w:semiHidden/>
     <w:unhideWhenUsed/>
   </w:style>
   <w:style w:type="table" w:default="1" w:styleId="TableNormal">
@@ -7027,12 +7084,6 @@
 </file>
 
 <file path=customXml/item1.xml><?xml version="1.0" encoding="utf-8"?>
-<go:gDocsCustomXmlDataStorage xmlns:go="http://customooxmlschemas.google.com/" xmlns:r="http://schemas.openxmlformats.org/officeDocument/2006/relationships" uri="GoogleDocsCustomDataVersion2">
-  <go:docsCustomData xmlns:go="http://customooxmlschemas.google.com/" roundtripDataSignature="AMtx7miehlgh2pzFvkmpnhkVaeODs3Wnuw==">CgMxLjAyCGguZ2pkZ3hzMgloLjMwajB6bGwyCWguMWZvYjl0ZTIJaC4zem55c2g3MgloLjJldDkycDAyDmgua2ZranMzcndsMmMxOAByITF6bEVRVXYyWkdtTjZWemdfYk5uaGpmb0x1c2hhYUo3dw==</go:docsCustomData>
-</go:gDocsCustomXmlDataStorage>
-</file>
-
-<file path=customXml/item2.xml><?xml version="1.0" encoding="utf-8"?>
 <p:properties xmlns:p="http://schemas.microsoft.com/office/2006/metadata/properties" xmlns:xsi="http://www.w3.org/2001/XMLSchema-instance" xmlns:pc="http://schemas.microsoft.com/office/infopath/2007/PartnerControls">
   <documentManagement>
     <_activity xmlns="b16a9495-4dfd-42d3-807b-98cb11f03b43" xsi:nil="true"/>
@@ -7040,20 +7091,13 @@
 </p:properties>
 </file>
 
-<file path=customXml/item3.xml><?xml version="1.0" encoding="utf-8"?>
-<?mso-contentType ?>
-<FormTemplates xmlns="http://schemas.microsoft.com/sharepoint/v3/contenttype/forms">
-  <Display>DocumentLibraryForm</Display>
-  <Edit>DocumentLibraryForm</Edit>
-  <New>DocumentLibraryForm</New>
-</FormTemplates>
+<file path=customXml/item2.xml><?xml version="1.0" encoding="utf-8"?>
+<go:gDocsCustomXmlDataStorage xmlns:go="http://customooxmlschemas.google.com/" xmlns:r="http://schemas.openxmlformats.org/officeDocument/2006/relationships" uri="GoogleDocsCustomDataVersion2">
+  <go:docsCustomData xmlns:go="http://customooxmlschemas.google.com/" roundtripDataSignature="AMtx7miehlgh2pzFvkmpnhkVaeODs3Wnuw==">CgMxLjAyCGguZ2pkZ3hzMgloLjMwajB6bGwyCWguMWZvYjl0ZTIJaC4zem55c2g3MgloLjJldDkycDAyDmgua2ZranMzcndsMmMxOAByITF6bEVRVXYyWkdtTjZWemdfYk5uaGpmb0x1c2hhYUo3dw==</go:docsCustomData>
+</go:gDocsCustomXmlDataStorage>
 </file>
 
-<file path=customXml/item4.xml><?xml version="1.0" encoding="utf-8"?>
-<b:Sources xmlns:b="http://schemas.openxmlformats.org/officeDocument/2006/bibliography" xmlns="http://schemas.openxmlformats.org/officeDocument/2006/bibliography" SelectedStyle="\APASixthEditionOfficeOnline.xsl" StyleName="APA" Version="6"/>
-</file>
-
-<file path=customXml/item5.xml><?xml version="1.0" encoding="utf-8"?>
+<file path=customXml/item3.xml><?xml version="1.0" encoding="utf-8"?>
 <ct:contentTypeSchema xmlns:ct="http://schemas.microsoft.com/office/2006/metadata/contentType" xmlns:ma="http://schemas.microsoft.com/office/2006/metadata/properties/metaAttributes" ct:_="" ma:_="" ma:contentTypeName="Document" ma:contentTypeID="0x01010091CA7052A48FB44E8BAE44044031FC77" ma:contentTypeVersion="5" ma:contentTypeDescription="Create a new document." ma:contentTypeScope="" ma:versionID="72110da391d7bf7bbbd9879cda66318c">
   <xsd:schema xmlns:xsd="http://www.w3.org/2001/XMLSchema" xmlns:xs="http://www.w3.org/2001/XMLSchema" xmlns:p="http://schemas.microsoft.com/office/2006/metadata/properties" xmlns:ns3="b16a9495-4dfd-42d3-807b-98cb11f03b43" targetNamespace="http://schemas.microsoft.com/office/2006/metadata/properties" ma:root="true" ma:fieldsID="65d4c4ab10123b5e2192ffab3149626d" ns3:_="">
     <xsd:import namespace="b16a9495-4dfd-42d3-807b-98cb11f03b43"/>
@@ -7203,16 +7247,20 @@
 </ct:contentTypeSchema>
 </file>
 
-<file path=customXml/itemProps1.xml><?xml version="1.0" encoding="utf-8"?>
-<ds:datastoreItem xmlns:ds="http://schemas.openxmlformats.org/officeDocument/2006/customXml" ds:itemID="{11111111-1234-1234-1234-123412341234}">
-  <ds:schemaRefs>
-    <ds:schemaRef ds:uri="http://customooxmlschemas.google.com/"/>
-    <ds:schemaRef ds:uri="http://schemas.openxmlformats.org/officeDocument/2006/relationships"/>
-  </ds:schemaRefs>
-</ds:datastoreItem>
+<file path=customXml/item4.xml><?xml version="1.0" encoding="utf-8"?>
+<b:Sources xmlns:b="http://schemas.openxmlformats.org/officeDocument/2006/bibliography" xmlns="http://schemas.openxmlformats.org/officeDocument/2006/bibliography" SelectedStyle="\APASixthEditionOfficeOnline.xsl" StyleName="APA" Version="6"/>
 </file>
 
-<file path=customXml/itemProps2.xml><?xml version="1.0" encoding="utf-8"?>
+<file path=customXml/item5.xml><?xml version="1.0" encoding="utf-8"?>
+<?mso-contentType ?>
+<FormTemplates xmlns="http://schemas.microsoft.com/sharepoint/v3/contenttype/forms">
+  <Display>DocumentLibraryForm</Display>
+  <Edit>DocumentLibraryForm</Edit>
+  <New>DocumentLibraryForm</New>
+</FormTemplates>
+</file>
+
+<file path=customXml/itemProps1.xml><?xml version="1.0" encoding="utf-8"?>
 <ds:datastoreItem xmlns:ds="http://schemas.openxmlformats.org/officeDocument/2006/customXml" ds:itemID="{D51EB97A-8C7A-4EE1-A3AD-E57FDBFA6BEE}">
   <ds:schemaRefs>
     <ds:schemaRef ds:uri="http://schemas.microsoft.com/office/2006/metadata/properties"/>
@@ -7222,23 +7270,16 @@
 </ds:datastoreItem>
 </file>
 
-<file path=customXml/itemProps3.xml><?xml version="1.0" encoding="utf-8"?>
-<ds:datastoreItem xmlns:ds="http://schemas.openxmlformats.org/officeDocument/2006/customXml" ds:itemID="{AD64260C-1345-4C21-A804-B9FBE7B91489}">
+<file path=customXml/itemProps2.xml><?xml version="1.0" encoding="utf-8"?>
+<ds:datastoreItem xmlns:ds="http://schemas.openxmlformats.org/officeDocument/2006/customXml" ds:itemID="{11111111-1234-1234-1234-123412341234}">
   <ds:schemaRefs>
-    <ds:schemaRef ds:uri="http://schemas.microsoft.com/sharepoint/v3/contenttype/forms"/>
+    <ds:schemaRef ds:uri="http://customooxmlschemas.google.com/"/>
+    <ds:schemaRef ds:uri="http://schemas.openxmlformats.org/officeDocument/2006/relationships"/>
   </ds:schemaRefs>
 </ds:datastoreItem>
 </file>
 
-<file path=customXml/itemProps4.xml><?xml version="1.0" encoding="utf-8"?>
-<ds:datastoreItem xmlns:ds="http://schemas.openxmlformats.org/officeDocument/2006/customXml" ds:itemID="{A5C61161-19E4-4D42-A5DA-EC591AFE0A7D}">
-  <ds:schemaRefs>
-    <ds:schemaRef ds:uri="http://schemas.openxmlformats.org/officeDocument/2006/bibliography"/>
-  </ds:schemaRefs>
-</ds:datastoreItem>
-</file>
-
-<file path=customXml/itemProps5.xml><?xml version="1.0" encoding="utf-8"?>
+<file path=customXml/itemProps3.xml><?xml version="1.0" encoding="utf-8"?>
 <ds:datastoreItem xmlns:ds="http://schemas.openxmlformats.org/officeDocument/2006/customXml" ds:itemID="{1CD39011-2B34-4226-8638-59B13D86301D}">
   <ds:schemaRefs>
     <ds:schemaRef ds:uri="http://schemas.microsoft.com/office/2006/metadata/contentType"/>
@@ -7254,4 +7295,20 @@
     <ds:schemaRef ds:uri="http://schemas.microsoft.com/internal/obd"/>
   </ds:schemaRefs>
 </ds:datastoreItem>
+</file>
+
+<file path=customXml/itemProps4.xml><?xml version="1.0" encoding="utf-8"?>
+<ds:datastoreItem xmlns:ds="http://schemas.openxmlformats.org/officeDocument/2006/customXml" ds:itemID="{A5C61161-19E4-4D42-A5DA-EC591AFE0A7D}">
+  <ds:schemaRefs>
+    <ds:schemaRef ds:uri="http://schemas.openxmlformats.org/officeDocument/2006/bibliography"/>
+  </ds:schemaRefs>
+</ds:datastoreItem>
+</file>
+
+<file path=customXml/itemProps5.xml><?xml version="1.0" encoding="utf-8"?>
+<ds:datastoreItem xmlns:ds="http://schemas.openxmlformats.org/officeDocument/2006/customXml" ds:itemID="{AD64260C-1345-4C21-A804-B9FBE7B91489}">
+  <ds:schemaRefs>
+    <ds:schemaRef ds:uri="http://schemas.microsoft.com/sharepoint/v3/contenttype/forms"/>
+  </ds:schemaRefs>
+</ds:datastoreItem>
 </file>
</xml_diff>

<commit_message>
Completed Expected Deliverables section
</commit_message>
<xml_diff>
--- a/HDSDAB - Strategic Thinking - Capstone Project.docx
+++ b/HDSDAB - Strategic Thinking - Capstone Project.docx
@@ -816,21 +816,12 @@
                               </w:rPr>
                               <w:t xml:space="preserve">By submitting this assessment, I confirm that I have read the CCT policy on academic misconduct and understand the implications of submitting work that is not my own or does not appropriately reference material </w:t>
                             </w:r>
-                            <w:proofErr w:type="gramStart"/>
                             <w:r>
                               <w:rPr>
                                 <w:color w:val="000000"/>
                                 <w:sz w:val="28"/>
                               </w:rPr>
-                              <w:t>taken</w:t>
-                            </w:r>
-                            <w:proofErr w:type="gramEnd"/>
-                            <w:r>
-                              <w:rPr>
-                                <w:color w:val="000000"/>
-                                <w:sz w:val="28"/>
-                              </w:rPr>
-                              <w:t xml:space="preserve"> from a third party or other source. </w:t>
+                              <w:t xml:space="preserve">taken from a third party or other source. </w:t>
                             </w:r>
                           </w:p>
                           <w:p>
@@ -926,21 +917,12 @@
                         </w:rPr>
                         <w:t xml:space="preserve">By submitting this assessment, I confirm that I have read the CCT policy on academic misconduct and understand the implications of submitting work that is not my own or does not appropriately reference material </w:t>
                       </w:r>
-                      <w:proofErr w:type="gramStart"/>
                       <w:r>
                         <w:rPr>
                           <w:color w:val="000000"/>
                           <w:sz w:val="28"/>
                         </w:rPr>
-                        <w:t>taken</w:t>
-                      </w:r>
-                      <w:proofErr w:type="gramEnd"/>
-                      <w:r>
-                        <w:rPr>
-                          <w:color w:val="000000"/>
-                          <w:sz w:val="28"/>
-                        </w:rPr>
-                        <w:t xml:space="preserve"> from a third party or other source. </w:t>
+                        <w:t xml:space="preserve">taken from a third party or other source. </w:t>
                       </w:r>
                     </w:p>
                     <w:p>
@@ -1274,12 +1256,14 @@
               </w:rPr>
               <w:instrText xml:space="preserve"> PAGEREF _Toc243520523 \h </w:instrText>
             </w:r>
-            <w:r>
-              <w:rPr>
-                <w:noProof/>
-                <w:webHidden/>
-              </w:rPr>
-            </w:r>
+          </w:ins>
+          <w:r>
+            <w:rPr>
+              <w:noProof/>
+              <w:webHidden/>
+            </w:rPr>
+          </w:r>
+          <w:ins w:id="10" w:author="kyle O'Reilly" w:date="2026-10-22T00:15:00Z" w16du:dateUtc="2026-10-21T23:15:00Z">
             <w:r>
               <w:rPr>
                 <w:noProof/>
@@ -1317,7 +1301,7 @@
               <w:tab w:val="right" w:leader="dot" w:pos="9016"/>
             </w:tabs>
             <w:rPr>
-              <w:ins w:id="10" w:author="kyle O'Reilly" w:date="2026-10-22T00:15:00Z" w16du:dateUtc="2026-10-21T23:15:00Z"/>
+              <w:ins w:id="11" w:author="kyle O'Reilly" w:date="2026-10-22T00:15:00Z" w16du:dateUtc="2026-10-21T23:15:00Z"/>
               <w:rFonts w:asciiTheme="minorHAnsi" w:eastAsiaTheme="minorEastAsia" w:hAnsiTheme="minorHAnsi" w:cstheme="minorBidi"/>
               <w:noProof/>
               <w:kern w:val="2"/>
@@ -1326,7 +1310,7 @@
               <w14:ligatures w14:val="standardContextual"/>
             </w:rPr>
           </w:pPr>
-          <w:ins w:id="11" w:author="kyle O'Reilly" w:date="2026-10-22T00:15:00Z" w16du:dateUtc="2026-10-21T23:15:00Z">
+          <w:ins w:id="12" w:author="kyle O'Reilly" w:date="2026-10-22T00:15:00Z" w16du:dateUtc="2026-10-21T23:15:00Z">
             <w:r>
               <w:rPr>
                 <w:rStyle w:val="Hyperlink"/>
@@ -1395,133 +1379,14 @@
               </w:rPr>
               <w:instrText xml:space="preserve"> PAGEREF _Toc243520524 \h </w:instrText>
             </w:r>
-            <w:r>
-              <w:rPr>
-                <w:noProof/>
-                <w:webHidden/>
-              </w:rPr>
-            </w:r>
-            <w:r>
-              <w:rPr>
-                <w:noProof/>
-                <w:webHidden/>
-              </w:rPr>
-              <w:fldChar w:fldCharType="separate"/>
-            </w:r>
-            <w:r>
-              <w:rPr>
-                <w:noProof/>
-                <w:webHidden/>
-              </w:rPr>
-              <w:t>1</w:t>
-            </w:r>
-            <w:r>
-              <w:rPr>
-                <w:noProof/>
-                <w:webHidden/>
-              </w:rPr>
-              <w:fldChar w:fldCharType="end"/>
-            </w:r>
-            <w:r>
-              <w:rPr>
-                <w:rStyle w:val="Hyperlink"/>
-                <w:noProof/>
-              </w:rPr>
-              <w:fldChar w:fldCharType="end"/>
-            </w:r>
           </w:ins>
-        </w:p>
-        <w:p>
-          <w:pPr>
-            <w:pStyle w:val="TOC1"/>
-            <w:tabs>
-              <w:tab w:val="right" w:leader="dot" w:pos="9016"/>
-            </w:tabs>
+          <w:r>
             <w:rPr>
-              <w:ins w:id="12" w:author="kyle O'Reilly" w:date="2026-10-22T00:15:00Z" w16du:dateUtc="2026-10-21T23:15:00Z"/>
-              <w:rFonts w:asciiTheme="minorHAnsi" w:eastAsiaTheme="minorEastAsia" w:hAnsiTheme="minorHAnsi" w:cstheme="minorBidi"/>
               <w:noProof/>
-              <w:kern w:val="2"/>
-              <w:sz w:val="24"/>
-              <w:szCs w:val="24"/>
-              <w14:ligatures w14:val="standardContextual"/>
+              <w:webHidden/>
             </w:rPr>
-          </w:pPr>
+          </w:r>
           <w:ins w:id="13" w:author="kyle O'Reilly" w:date="2026-10-22T00:15:00Z" w16du:dateUtc="2026-10-21T23:15:00Z">
-            <w:r>
-              <w:rPr>
-                <w:rStyle w:val="Hyperlink"/>
-                <w:noProof/>
-              </w:rPr>
-              <w:fldChar w:fldCharType="begin"/>
-            </w:r>
-            <w:r>
-              <w:rPr>
-                <w:rStyle w:val="Hyperlink"/>
-                <w:noProof/>
-              </w:rPr>
-              <w:instrText xml:space="preserve"> </w:instrText>
-            </w:r>
-            <w:r>
-              <w:rPr>
-                <w:noProof/>
-              </w:rPr>
-              <w:instrText>HYPERLINK \l "_Toc243520525"</w:instrText>
-            </w:r>
-            <w:r>
-              <w:rPr>
-                <w:rStyle w:val="Hyperlink"/>
-                <w:noProof/>
-              </w:rPr>
-              <w:instrText xml:space="preserve"> </w:instrText>
-            </w:r>
-            <w:r>
-              <w:rPr>
-                <w:rStyle w:val="Hyperlink"/>
-                <w:noProof/>
-              </w:rPr>
-            </w:r>
-            <w:r>
-              <w:rPr>
-                <w:rStyle w:val="Hyperlink"/>
-                <w:noProof/>
-              </w:rPr>
-              <w:fldChar w:fldCharType="separate"/>
-            </w:r>
-            <w:r>
-              <w:rPr>
-                <w:rStyle w:val="Hyperlink"/>
-                <w:noProof/>
-              </w:rPr>
-              <w:t>3. Problem Definition</w:t>
-            </w:r>
-            <w:r>
-              <w:rPr>
-                <w:noProof/>
-                <w:webHidden/>
-              </w:rPr>
-              <w:tab/>
-            </w:r>
-            <w:r>
-              <w:rPr>
-                <w:noProof/>
-                <w:webHidden/>
-              </w:rPr>
-              <w:fldChar w:fldCharType="begin"/>
-            </w:r>
-            <w:r>
-              <w:rPr>
-                <w:noProof/>
-                <w:webHidden/>
-              </w:rPr>
-              <w:instrText xml:space="preserve"> PAGEREF _Toc243520525 \h </w:instrText>
-            </w:r>
-            <w:r>
-              <w:rPr>
-                <w:noProof/>
-                <w:webHidden/>
-              </w:rPr>
-            </w:r>
             <w:r>
               <w:rPr>
                 <w:noProof/>
@@ -1587,7 +1452,7 @@
               <w:rPr>
                 <w:noProof/>
               </w:rPr>
-              <w:instrText>HYPERLINK \l "_Toc243520526"</w:instrText>
+              <w:instrText>HYPERLINK \l "_Toc243520525"</w:instrText>
             </w:r>
             <w:r>
               <w:rPr>
@@ -1614,7 +1479,7 @@
                 <w:rStyle w:val="Hyperlink"/>
                 <w:noProof/>
               </w:rPr>
-              <w:t>4. Aim, Objectives and Hypothesis</w:t>
+              <w:t>3. Problem Definition</w:t>
             </w:r>
             <w:r>
               <w:rPr>
@@ -1635,14 +1500,16 @@
                 <w:noProof/>
                 <w:webHidden/>
               </w:rPr>
-              <w:instrText xml:space="preserve"> PAGEREF _Toc243520526 \h </w:instrText>
-            </w:r>
-            <w:r>
-              <w:rPr>
-                <w:noProof/>
-                <w:webHidden/>
-              </w:rPr>
-            </w:r>
+              <w:instrText xml:space="preserve"> PAGEREF _Toc243520525 \h </w:instrText>
+            </w:r>
+          </w:ins>
+          <w:r>
+            <w:rPr>
+              <w:noProof/>
+              <w:webHidden/>
+            </w:rPr>
+          </w:r>
+          <w:ins w:id="16" w:author="kyle O'Reilly" w:date="2026-10-22T00:15:00Z" w16du:dateUtc="2026-10-21T23:15:00Z">
             <w:r>
               <w:rPr>
                 <w:noProof/>
@@ -1680,7 +1547,7 @@
               <w:tab w:val="right" w:leader="dot" w:pos="9016"/>
             </w:tabs>
             <w:rPr>
-              <w:ins w:id="16" w:author="kyle O'Reilly" w:date="2026-10-22T00:15:00Z" w16du:dateUtc="2026-10-21T23:15:00Z"/>
+              <w:ins w:id="17" w:author="kyle O'Reilly" w:date="2026-10-22T00:15:00Z" w16du:dateUtc="2026-10-21T23:15:00Z"/>
               <w:rFonts w:asciiTheme="minorHAnsi" w:eastAsiaTheme="minorEastAsia" w:hAnsiTheme="minorHAnsi" w:cstheme="minorBidi"/>
               <w:noProof/>
               <w:kern w:val="2"/>
@@ -1689,7 +1556,7 @@
               <w14:ligatures w14:val="standardContextual"/>
             </w:rPr>
           </w:pPr>
-          <w:ins w:id="17" w:author="kyle O'Reilly" w:date="2026-10-22T00:15:00Z" w16du:dateUtc="2026-10-21T23:15:00Z">
+          <w:ins w:id="18" w:author="kyle O'Reilly" w:date="2026-10-22T00:15:00Z" w16du:dateUtc="2026-10-21T23:15:00Z">
             <w:r>
               <w:rPr>
                 <w:rStyle w:val="Hyperlink"/>
@@ -1708,7 +1575,7 @@
               <w:rPr>
                 <w:noProof/>
               </w:rPr>
-              <w:instrText>HYPERLINK \l "_Toc243520527"</w:instrText>
+              <w:instrText>HYPERLINK \l "_Toc243520526"</w:instrText>
             </w:r>
             <w:r>
               <w:rPr>
@@ -1735,7 +1602,7 @@
                 <w:rStyle w:val="Hyperlink"/>
                 <w:noProof/>
               </w:rPr>
-              <w:t>5. Project Scope</w:t>
+              <w:t>4. Aim, Objectives and Hypothesis</w:t>
             </w:r>
             <w:r>
               <w:rPr>
@@ -1756,148 +1623,29 @@
                 <w:noProof/>
                 <w:webHidden/>
               </w:rPr>
-              <w:instrText xml:space="preserve"> PAGEREF _Toc243520527 \h </w:instrText>
-            </w:r>
+              <w:instrText xml:space="preserve"> PAGEREF _Toc243520526 \h </w:instrText>
+            </w:r>
+          </w:ins>
+          <w:r>
+            <w:rPr>
+              <w:noProof/>
+              <w:webHidden/>
+            </w:rPr>
+          </w:r>
+          <w:ins w:id="19" w:author="kyle O'Reilly" w:date="2026-10-22T00:15:00Z" w16du:dateUtc="2026-10-21T23:15:00Z">
             <w:r>
               <w:rPr>
                 <w:noProof/>
                 <w:webHidden/>
               </w:rPr>
+              <w:fldChar w:fldCharType="separate"/>
             </w:r>
             <w:r>
               <w:rPr>
                 <w:noProof/>
                 <w:webHidden/>
               </w:rPr>
-              <w:fldChar w:fldCharType="separate"/>
-            </w:r>
-            <w:r>
-              <w:rPr>
-                <w:noProof/>
-                <w:webHidden/>
-              </w:rPr>
-              <w:t>2</w:t>
-            </w:r>
-            <w:r>
-              <w:rPr>
-                <w:noProof/>
-                <w:webHidden/>
-              </w:rPr>
-              <w:fldChar w:fldCharType="end"/>
-            </w:r>
-            <w:r>
-              <w:rPr>
-                <w:rStyle w:val="Hyperlink"/>
-                <w:noProof/>
-              </w:rPr>
-              <w:fldChar w:fldCharType="end"/>
-            </w:r>
-          </w:ins>
-        </w:p>
-        <w:p>
-          <w:pPr>
-            <w:pStyle w:val="TOC1"/>
-            <w:tabs>
-              <w:tab w:val="right" w:leader="dot" w:pos="9016"/>
-            </w:tabs>
-            <w:rPr>
-              <w:ins w:id="18" w:author="kyle O'Reilly" w:date="2026-10-22T00:15:00Z" w16du:dateUtc="2026-10-21T23:15:00Z"/>
-              <w:rFonts w:asciiTheme="minorHAnsi" w:eastAsiaTheme="minorEastAsia" w:hAnsiTheme="minorHAnsi" w:cstheme="minorBidi"/>
-              <w:noProof/>
-              <w:kern w:val="2"/>
-              <w:sz w:val="24"/>
-              <w:szCs w:val="24"/>
-              <w14:ligatures w14:val="standardContextual"/>
-            </w:rPr>
-          </w:pPr>
-          <w:ins w:id="19" w:author="kyle O'Reilly" w:date="2026-10-22T00:15:00Z" w16du:dateUtc="2026-10-21T23:15:00Z">
-            <w:r>
-              <w:rPr>
-                <w:rStyle w:val="Hyperlink"/>
-                <w:noProof/>
-              </w:rPr>
-              <w:fldChar w:fldCharType="begin"/>
-            </w:r>
-            <w:r>
-              <w:rPr>
-                <w:rStyle w:val="Hyperlink"/>
-                <w:noProof/>
-              </w:rPr>
-              <w:instrText xml:space="preserve"> </w:instrText>
-            </w:r>
-            <w:r>
-              <w:rPr>
-                <w:noProof/>
-              </w:rPr>
-              <w:instrText>HYPERLINK \l "_Toc243520528"</w:instrText>
-            </w:r>
-            <w:r>
-              <w:rPr>
-                <w:rStyle w:val="Hyperlink"/>
-                <w:noProof/>
-              </w:rPr>
-              <w:instrText xml:space="preserve"> </w:instrText>
-            </w:r>
-            <w:r>
-              <w:rPr>
-                <w:rStyle w:val="Hyperlink"/>
-                <w:noProof/>
-              </w:rPr>
-            </w:r>
-            <w:r>
-              <w:rPr>
-                <w:rStyle w:val="Hyperlink"/>
-                <w:noProof/>
-              </w:rPr>
-              <w:fldChar w:fldCharType="separate"/>
-            </w:r>
-            <w:r>
-              <w:rPr>
-                <w:rStyle w:val="Hyperlink"/>
-                <w:noProof/>
-              </w:rPr>
-              <w:t>6. Methodology</w:t>
-            </w:r>
-            <w:r>
-              <w:rPr>
-                <w:noProof/>
-                <w:webHidden/>
-              </w:rPr>
-              <w:tab/>
-            </w:r>
-            <w:r>
-              <w:rPr>
-                <w:noProof/>
-                <w:webHidden/>
-              </w:rPr>
-              <w:fldChar w:fldCharType="begin"/>
-            </w:r>
-            <w:r>
-              <w:rPr>
-                <w:noProof/>
-                <w:webHidden/>
-              </w:rPr>
-              <w:instrText xml:space="preserve"> PAGEREF _Toc243520528 \h </w:instrText>
-            </w:r>
-            <w:r>
-              <w:rPr>
-                <w:noProof/>
-                <w:webHidden/>
-              </w:rPr>
-            </w:r>
-            <w:r>
-              <w:rPr>
-                <w:noProof/>
-                <w:webHidden/>
-              </w:rPr>
-              <w:fldChar w:fldCharType="separate"/>
-            </w:r>
-            <w:r>
-              <w:rPr>
-                <w:noProof/>
-                <w:webHidden/>
-              </w:rPr>
-              <w:t>2</w:t>
+              <w:t>1</w:t>
             </w:r>
             <w:r>
               <w:rPr>
@@ -1950,7 +1698,7 @@
               <w:rPr>
                 <w:noProof/>
               </w:rPr>
-              <w:instrText>HYPERLINK \l "_Toc243520529"</w:instrText>
+              <w:instrText>HYPERLINK \l "_Toc243520527"</w:instrText>
             </w:r>
             <w:r>
               <w:rPr>
@@ -1977,7 +1725,7 @@
                 <w:rStyle w:val="Hyperlink"/>
                 <w:noProof/>
               </w:rPr>
-              <w:t>7. Data Sources</w:t>
+              <w:t>5. Project Scope</w:t>
             </w:r>
             <w:r>
               <w:rPr>
@@ -1998,14 +1746,16 @@
                 <w:noProof/>
                 <w:webHidden/>
               </w:rPr>
-              <w:instrText xml:space="preserve"> PAGEREF _Toc243520529 \h </w:instrText>
-            </w:r>
-            <w:r>
-              <w:rPr>
-                <w:noProof/>
-                <w:webHidden/>
-              </w:rPr>
-            </w:r>
+              <w:instrText xml:space="preserve"> PAGEREF _Toc243520527 \h </w:instrText>
+            </w:r>
+          </w:ins>
+          <w:r>
+            <w:rPr>
+              <w:noProof/>
+              <w:webHidden/>
+            </w:rPr>
+          </w:r>
+          <w:ins w:id="22" w:author="kyle O'Reilly" w:date="2026-10-22T00:15:00Z" w16du:dateUtc="2026-10-21T23:15:00Z">
             <w:r>
               <w:rPr>
                 <w:noProof/>
@@ -2043,7 +1793,7 @@
               <w:tab w:val="right" w:leader="dot" w:pos="9016"/>
             </w:tabs>
             <w:rPr>
-              <w:ins w:id="22" w:author="kyle O'Reilly" w:date="2026-10-22T00:15:00Z" w16du:dateUtc="2026-10-21T23:15:00Z"/>
+              <w:ins w:id="23" w:author="kyle O'Reilly" w:date="2026-10-22T00:15:00Z" w16du:dateUtc="2026-10-21T23:15:00Z"/>
               <w:rFonts w:asciiTheme="minorHAnsi" w:eastAsiaTheme="minorEastAsia" w:hAnsiTheme="minorHAnsi" w:cstheme="minorBidi"/>
               <w:noProof/>
               <w:kern w:val="2"/>
@@ -2052,7 +1802,7 @@
               <w14:ligatures w14:val="standardContextual"/>
             </w:rPr>
           </w:pPr>
-          <w:ins w:id="23" w:author="kyle O'Reilly" w:date="2026-10-22T00:15:00Z" w16du:dateUtc="2026-10-21T23:15:00Z">
+          <w:ins w:id="24" w:author="kyle O'Reilly" w:date="2026-10-22T00:15:00Z" w16du:dateUtc="2026-10-21T23:15:00Z">
             <w:r>
               <w:rPr>
                 <w:rStyle w:val="Hyperlink"/>
@@ -2071,7 +1821,7 @@
               <w:rPr>
                 <w:noProof/>
               </w:rPr>
-              <w:instrText>HYPERLINK \l "_Toc243520530"</w:instrText>
+              <w:instrText>HYPERLINK \l "_Toc243520528"</w:instrText>
             </w:r>
             <w:r>
               <w:rPr>
@@ -2098,7 +1848,7 @@
                 <w:rStyle w:val="Hyperlink"/>
                 <w:noProof/>
               </w:rPr>
-              <w:t>8. Expected Deliverables</w:t>
+              <w:t>6. Methodology</w:t>
             </w:r>
             <w:r>
               <w:rPr>
@@ -2119,135 +1869,16 @@
                 <w:noProof/>
                 <w:webHidden/>
               </w:rPr>
-              <w:instrText xml:space="preserve"> PAGEREF _Toc243520530 \h </w:instrText>
-            </w:r>
-            <w:r>
-              <w:rPr>
-                <w:noProof/>
-                <w:webHidden/>
-              </w:rPr>
-            </w:r>
-            <w:r>
-              <w:rPr>
-                <w:noProof/>
-                <w:webHidden/>
-              </w:rPr>
-              <w:fldChar w:fldCharType="separate"/>
-            </w:r>
-            <w:r>
-              <w:rPr>
-                <w:noProof/>
-                <w:webHidden/>
-              </w:rPr>
-              <w:t>2</w:t>
-            </w:r>
-            <w:r>
-              <w:rPr>
-                <w:noProof/>
-                <w:webHidden/>
-              </w:rPr>
-              <w:fldChar w:fldCharType="end"/>
-            </w:r>
-            <w:r>
-              <w:rPr>
-                <w:rStyle w:val="Hyperlink"/>
-                <w:noProof/>
-              </w:rPr>
-              <w:fldChar w:fldCharType="end"/>
+              <w:instrText xml:space="preserve"> PAGEREF _Toc243520528 \h </w:instrText>
             </w:r>
           </w:ins>
-        </w:p>
-        <w:p>
-          <w:pPr>
-            <w:pStyle w:val="TOC1"/>
-            <w:tabs>
-              <w:tab w:val="right" w:leader="dot" w:pos="9016"/>
-            </w:tabs>
+          <w:r>
             <w:rPr>
-              <w:ins w:id="24" w:author="kyle O'Reilly" w:date="2026-10-22T00:15:00Z" w16du:dateUtc="2026-10-21T23:15:00Z"/>
-              <w:rFonts w:asciiTheme="minorHAnsi" w:eastAsiaTheme="minorEastAsia" w:hAnsiTheme="minorHAnsi" w:cstheme="minorBidi"/>
               <w:noProof/>
-              <w:kern w:val="2"/>
-              <w:sz w:val="24"/>
-              <w:szCs w:val="24"/>
-              <w14:ligatures w14:val="standardContextual"/>
+              <w:webHidden/>
             </w:rPr>
-          </w:pPr>
+          </w:r>
           <w:ins w:id="25" w:author="kyle O'Reilly" w:date="2026-10-22T00:15:00Z" w16du:dateUtc="2026-10-21T23:15:00Z">
-            <w:r>
-              <w:rPr>
-                <w:rStyle w:val="Hyperlink"/>
-                <w:noProof/>
-              </w:rPr>
-              <w:fldChar w:fldCharType="begin"/>
-            </w:r>
-            <w:r>
-              <w:rPr>
-                <w:rStyle w:val="Hyperlink"/>
-                <w:noProof/>
-              </w:rPr>
-              <w:instrText xml:space="preserve"> </w:instrText>
-            </w:r>
-            <w:r>
-              <w:rPr>
-                <w:noProof/>
-              </w:rPr>
-              <w:instrText>HYPERLINK \l "_Toc243520531"</w:instrText>
-            </w:r>
-            <w:r>
-              <w:rPr>
-                <w:rStyle w:val="Hyperlink"/>
-                <w:noProof/>
-              </w:rPr>
-              <w:instrText xml:space="preserve"> </w:instrText>
-            </w:r>
-            <w:r>
-              <w:rPr>
-                <w:rStyle w:val="Hyperlink"/>
-                <w:noProof/>
-              </w:rPr>
-            </w:r>
-            <w:r>
-              <w:rPr>
-                <w:rStyle w:val="Hyperlink"/>
-                <w:noProof/>
-              </w:rPr>
-              <w:fldChar w:fldCharType="separate"/>
-            </w:r>
-            <w:r>
-              <w:rPr>
-                <w:rStyle w:val="Hyperlink"/>
-                <w:noProof/>
-              </w:rPr>
-              <w:t>9. Project Timeline</w:t>
-            </w:r>
-            <w:r>
-              <w:rPr>
-                <w:noProof/>
-                <w:webHidden/>
-              </w:rPr>
-              <w:tab/>
-            </w:r>
-            <w:r>
-              <w:rPr>
-                <w:noProof/>
-                <w:webHidden/>
-              </w:rPr>
-              <w:fldChar w:fldCharType="begin"/>
-            </w:r>
-            <w:r>
-              <w:rPr>
-                <w:noProof/>
-                <w:webHidden/>
-              </w:rPr>
-              <w:instrText xml:space="preserve"> PAGEREF _Toc243520531 \h </w:instrText>
-            </w:r>
-            <w:r>
-              <w:rPr>
-                <w:noProof/>
-                <w:webHidden/>
-              </w:rPr>
-            </w:r>
             <w:r>
               <w:rPr>
                 <w:noProof/>
@@ -2313,7 +1944,7 @@
               <w:rPr>
                 <w:noProof/>
               </w:rPr>
-              <w:instrText>HYPERLINK \l "_Toc243520532"</w:instrText>
+              <w:instrText>HYPERLINK \l "_Toc243520529"</w:instrText>
             </w:r>
             <w:r>
               <w:rPr>
@@ -2340,7 +1971,7 @@
                 <w:rStyle w:val="Hyperlink"/>
                 <w:noProof/>
               </w:rPr>
-              <w:t>10. Ethical and Legal Considerations</w:t>
+              <w:t>7. Data Sources</w:t>
             </w:r>
             <w:r>
               <w:rPr>
@@ -2361,27 +1992,29 @@
                 <w:noProof/>
                 <w:webHidden/>
               </w:rPr>
-              <w:instrText xml:space="preserve"> PAGEREF _Toc243520532 \h </w:instrText>
-            </w:r>
+              <w:instrText xml:space="preserve"> PAGEREF _Toc243520529 \h </w:instrText>
+            </w:r>
+          </w:ins>
+          <w:r>
+            <w:rPr>
+              <w:noProof/>
+              <w:webHidden/>
+            </w:rPr>
+          </w:r>
+          <w:ins w:id="28" w:author="kyle O'Reilly" w:date="2026-10-22T00:15:00Z" w16du:dateUtc="2026-10-21T23:15:00Z">
             <w:r>
               <w:rPr>
                 <w:noProof/>
                 <w:webHidden/>
               </w:rPr>
+              <w:fldChar w:fldCharType="separate"/>
             </w:r>
             <w:r>
               <w:rPr>
                 <w:noProof/>
                 <w:webHidden/>
               </w:rPr>
-              <w:fldChar w:fldCharType="separate"/>
-            </w:r>
-            <w:r>
-              <w:rPr>
-                <w:noProof/>
-                <w:webHidden/>
-              </w:rPr>
-              <w:t>3</w:t>
+              <w:t>2</w:t>
             </w:r>
             <w:r>
               <w:rPr>
@@ -2406,7 +2039,7 @@
               <w:tab w:val="right" w:leader="dot" w:pos="9016"/>
             </w:tabs>
             <w:rPr>
-              <w:ins w:id="28" w:author="kyle O'Reilly" w:date="2026-10-22T00:15:00Z" w16du:dateUtc="2026-10-21T23:15:00Z"/>
+              <w:ins w:id="29" w:author="kyle O'Reilly" w:date="2026-10-22T00:15:00Z" w16du:dateUtc="2026-10-21T23:15:00Z"/>
               <w:rFonts w:asciiTheme="minorHAnsi" w:eastAsiaTheme="minorEastAsia" w:hAnsiTheme="minorHAnsi" w:cstheme="minorBidi"/>
               <w:noProof/>
               <w:kern w:val="2"/>
@@ -2415,7 +2048,7 @@
               <w14:ligatures w14:val="standardContextual"/>
             </w:rPr>
           </w:pPr>
-          <w:ins w:id="29" w:author="kyle O'Reilly" w:date="2026-10-22T00:15:00Z" w16du:dateUtc="2026-10-21T23:15:00Z">
+          <w:ins w:id="30" w:author="kyle O'Reilly" w:date="2026-10-22T00:15:00Z" w16du:dateUtc="2026-10-21T23:15:00Z">
             <w:r>
               <w:rPr>
                 <w:rStyle w:val="Hyperlink"/>
@@ -2434,7 +2067,7 @@
               <w:rPr>
                 <w:noProof/>
               </w:rPr>
-              <w:instrText>HYPERLINK \l "_Toc243520533"</w:instrText>
+              <w:instrText>HYPERLINK \l "_Toc243520530"</w:instrText>
             </w:r>
             <w:r>
               <w:rPr>
@@ -2461,7 +2094,7 @@
                 <w:rStyle w:val="Hyperlink"/>
                 <w:noProof/>
               </w:rPr>
-              <w:t>References</w:t>
+              <w:t>8. Expected Deliverables</w:t>
             </w:r>
             <w:r>
               <w:rPr>
@@ -2482,27 +2115,29 @@
                 <w:noProof/>
                 <w:webHidden/>
               </w:rPr>
-              <w:instrText xml:space="preserve"> PAGEREF _Toc243520533 \h </w:instrText>
-            </w:r>
+              <w:instrText xml:space="preserve"> PAGEREF _Toc243520530 \h </w:instrText>
+            </w:r>
+          </w:ins>
+          <w:r>
+            <w:rPr>
+              <w:noProof/>
+              <w:webHidden/>
+            </w:rPr>
+          </w:r>
+          <w:ins w:id="31" w:author="kyle O'Reilly" w:date="2026-10-22T00:15:00Z" w16du:dateUtc="2026-10-21T23:15:00Z">
             <w:r>
               <w:rPr>
                 <w:noProof/>
                 <w:webHidden/>
               </w:rPr>
+              <w:fldChar w:fldCharType="separate"/>
             </w:r>
             <w:r>
               <w:rPr>
                 <w:noProof/>
                 <w:webHidden/>
               </w:rPr>
-              <w:fldChar w:fldCharType="separate"/>
-            </w:r>
-            <w:r>
-              <w:rPr>
-                <w:noProof/>
-                <w:webHidden/>
-              </w:rPr>
-              <w:t>3</w:t>
+              <w:t>2</w:t>
             </w:r>
             <w:r>
               <w:rPr>
@@ -2521,7 +2156,376 @@
           </w:ins>
         </w:p>
         <w:p>
-          <w:del w:id="30" w:author="kyle O'Reilly" w:date="2026-10-20T21:26:00Z" w16du:dateUtc="2026-10-20T20:26:00Z">
+          <w:pPr>
+            <w:pStyle w:val="TOC1"/>
+            <w:tabs>
+              <w:tab w:val="right" w:leader="dot" w:pos="9016"/>
+            </w:tabs>
+            <w:rPr>
+              <w:ins w:id="32" w:author="kyle O'Reilly" w:date="2026-10-22T00:15:00Z" w16du:dateUtc="2026-10-21T23:15:00Z"/>
+              <w:rFonts w:asciiTheme="minorHAnsi" w:eastAsiaTheme="minorEastAsia" w:hAnsiTheme="minorHAnsi" w:cstheme="minorBidi"/>
+              <w:noProof/>
+              <w:kern w:val="2"/>
+              <w:sz w:val="24"/>
+              <w:szCs w:val="24"/>
+              <w14:ligatures w14:val="standardContextual"/>
+            </w:rPr>
+          </w:pPr>
+          <w:ins w:id="33" w:author="kyle O'Reilly" w:date="2026-10-22T00:15:00Z" w16du:dateUtc="2026-10-21T23:15:00Z">
+            <w:r>
+              <w:rPr>
+                <w:rStyle w:val="Hyperlink"/>
+                <w:noProof/>
+              </w:rPr>
+              <w:fldChar w:fldCharType="begin"/>
+            </w:r>
+            <w:r>
+              <w:rPr>
+                <w:rStyle w:val="Hyperlink"/>
+                <w:noProof/>
+              </w:rPr>
+              <w:instrText xml:space="preserve"> </w:instrText>
+            </w:r>
+            <w:r>
+              <w:rPr>
+                <w:noProof/>
+              </w:rPr>
+              <w:instrText>HYPERLINK \l "_Toc243520531"</w:instrText>
+            </w:r>
+            <w:r>
+              <w:rPr>
+                <w:rStyle w:val="Hyperlink"/>
+                <w:noProof/>
+              </w:rPr>
+              <w:instrText xml:space="preserve"> </w:instrText>
+            </w:r>
+            <w:r>
+              <w:rPr>
+                <w:rStyle w:val="Hyperlink"/>
+                <w:noProof/>
+              </w:rPr>
+            </w:r>
+            <w:r>
+              <w:rPr>
+                <w:rStyle w:val="Hyperlink"/>
+                <w:noProof/>
+              </w:rPr>
+              <w:fldChar w:fldCharType="separate"/>
+            </w:r>
+            <w:r>
+              <w:rPr>
+                <w:rStyle w:val="Hyperlink"/>
+                <w:noProof/>
+              </w:rPr>
+              <w:t>9. Project Timeline</w:t>
+            </w:r>
+            <w:r>
+              <w:rPr>
+                <w:noProof/>
+                <w:webHidden/>
+              </w:rPr>
+              <w:tab/>
+            </w:r>
+            <w:r>
+              <w:rPr>
+                <w:noProof/>
+                <w:webHidden/>
+              </w:rPr>
+              <w:fldChar w:fldCharType="begin"/>
+            </w:r>
+            <w:r>
+              <w:rPr>
+                <w:noProof/>
+                <w:webHidden/>
+              </w:rPr>
+              <w:instrText xml:space="preserve"> PAGEREF _Toc243520531 \h </w:instrText>
+            </w:r>
+          </w:ins>
+          <w:r>
+            <w:rPr>
+              <w:noProof/>
+              <w:webHidden/>
+            </w:rPr>
+          </w:r>
+          <w:ins w:id="34" w:author="kyle O'Reilly" w:date="2026-10-22T00:15:00Z" w16du:dateUtc="2026-10-21T23:15:00Z">
+            <w:r>
+              <w:rPr>
+                <w:noProof/>
+                <w:webHidden/>
+              </w:rPr>
+              <w:fldChar w:fldCharType="separate"/>
+            </w:r>
+            <w:r>
+              <w:rPr>
+                <w:noProof/>
+                <w:webHidden/>
+              </w:rPr>
+              <w:t>2</w:t>
+            </w:r>
+            <w:r>
+              <w:rPr>
+                <w:noProof/>
+                <w:webHidden/>
+              </w:rPr>
+              <w:fldChar w:fldCharType="end"/>
+            </w:r>
+            <w:r>
+              <w:rPr>
+                <w:rStyle w:val="Hyperlink"/>
+                <w:noProof/>
+              </w:rPr>
+              <w:fldChar w:fldCharType="end"/>
+            </w:r>
+          </w:ins>
+        </w:p>
+        <w:p>
+          <w:pPr>
+            <w:pStyle w:val="TOC1"/>
+            <w:tabs>
+              <w:tab w:val="right" w:leader="dot" w:pos="9016"/>
+            </w:tabs>
+            <w:rPr>
+              <w:ins w:id="35" w:author="kyle O'Reilly" w:date="2026-10-22T00:15:00Z" w16du:dateUtc="2026-10-21T23:15:00Z"/>
+              <w:rFonts w:asciiTheme="minorHAnsi" w:eastAsiaTheme="minorEastAsia" w:hAnsiTheme="minorHAnsi" w:cstheme="minorBidi"/>
+              <w:noProof/>
+              <w:kern w:val="2"/>
+              <w:sz w:val="24"/>
+              <w:szCs w:val="24"/>
+              <w14:ligatures w14:val="standardContextual"/>
+            </w:rPr>
+          </w:pPr>
+          <w:ins w:id="36" w:author="kyle O'Reilly" w:date="2026-10-22T00:15:00Z" w16du:dateUtc="2026-10-21T23:15:00Z">
+            <w:r>
+              <w:rPr>
+                <w:rStyle w:val="Hyperlink"/>
+                <w:noProof/>
+              </w:rPr>
+              <w:fldChar w:fldCharType="begin"/>
+            </w:r>
+            <w:r>
+              <w:rPr>
+                <w:rStyle w:val="Hyperlink"/>
+                <w:noProof/>
+              </w:rPr>
+              <w:instrText xml:space="preserve"> </w:instrText>
+            </w:r>
+            <w:r>
+              <w:rPr>
+                <w:noProof/>
+              </w:rPr>
+              <w:instrText>HYPERLINK \l "_Toc243520532"</w:instrText>
+            </w:r>
+            <w:r>
+              <w:rPr>
+                <w:rStyle w:val="Hyperlink"/>
+                <w:noProof/>
+              </w:rPr>
+              <w:instrText xml:space="preserve"> </w:instrText>
+            </w:r>
+            <w:r>
+              <w:rPr>
+                <w:rStyle w:val="Hyperlink"/>
+                <w:noProof/>
+              </w:rPr>
+            </w:r>
+            <w:r>
+              <w:rPr>
+                <w:rStyle w:val="Hyperlink"/>
+                <w:noProof/>
+              </w:rPr>
+              <w:fldChar w:fldCharType="separate"/>
+            </w:r>
+            <w:r>
+              <w:rPr>
+                <w:rStyle w:val="Hyperlink"/>
+                <w:noProof/>
+              </w:rPr>
+              <w:t>10. Ethical and Legal Considerations</w:t>
+            </w:r>
+            <w:r>
+              <w:rPr>
+                <w:noProof/>
+                <w:webHidden/>
+              </w:rPr>
+              <w:tab/>
+            </w:r>
+            <w:r>
+              <w:rPr>
+                <w:noProof/>
+                <w:webHidden/>
+              </w:rPr>
+              <w:fldChar w:fldCharType="begin"/>
+            </w:r>
+            <w:r>
+              <w:rPr>
+                <w:noProof/>
+                <w:webHidden/>
+              </w:rPr>
+              <w:instrText xml:space="preserve"> PAGEREF _Toc243520532 \h </w:instrText>
+            </w:r>
+          </w:ins>
+          <w:r>
+            <w:rPr>
+              <w:noProof/>
+              <w:webHidden/>
+            </w:rPr>
+          </w:r>
+          <w:ins w:id="37" w:author="kyle O'Reilly" w:date="2026-10-22T00:15:00Z" w16du:dateUtc="2026-10-21T23:15:00Z">
+            <w:r>
+              <w:rPr>
+                <w:noProof/>
+                <w:webHidden/>
+              </w:rPr>
+              <w:fldChar w:fldCharType="separate"/>
+            </w:r>
+            <w:r>
+              <w:rPr>
+                <w:noProof/>
+                <w:webHidden/>
+              </w:rPr>
+              <w:t>3</w:t>
+            </w:r>
+            <w:r>
+              <w:rPr>
+                <w:noProof/>
+                <w:webHidden/>
+              </w:rPr>
+              <w:fldChar w:fldCharType="end"/>
+            </w:r>
+            <w:r>
+              <w:rPr>
+                <w:rStyle w:val="Hyperlink"/>
+                <w:noProof/>
+              </w:rPr>
+              <w:fldChar w:fldCharType="end"/>
+            </w:r>
+          </w:ins>
+        </w:p>
+        <w:p>
+          <w:pPr>
+            <w:pStyle w:val="TOC1"/>
+            <w:tabs>
+              <w:tab w:val="right" w:leader="dot" w:pos="9016"/>
+            </w:tabs>
+            <w:rPr>
+              <w:ins w:id="38" w:author="kyle O'Reilly" w:date="2026-10-22T00:15:00Z" w16du:dateUtc="2026-10-21T23:15:00Z"/>
+              <w:rFonts w:asciiTheme="minorHAnsi" w:eastAsiaTheme="minorEastAsia" w:hAnsiTheme="minorHAnsi" w:cstheme="minorBidi"/>
+              <w:noProof/>
+              <w:kern w:val="2"/>
+              <w:sz w:val="24"/>
+              <w:szCs w:val="24"/>
+              <w14:ligatures w14:val="standardContextual"/>
+            </w:rPr>
+          </w:pPr>
+          <w:ins w:id="39" w:author="kyle O'Reilly" w:date="2026-10-22T00:15:00Z" w16du:dateUtc="2026-10-21T23:15:00Z">
+            <w:r>
+              <w:rPr>
+                <w:rStyle w:val="Hyperlink"/>
+                <w:noProof/>
+              </w:rPr>
+              <w:fldChar w:fldCharType="begin"/>
+            </w:r>
+            <w:r>
+              <w:rPr>
+                <w:rStyle w:val="Hyperlink"/>
+                <w:noProof/>
+              </w:rPr>
+              <w:instrText xml:space="preserve"> </w:instrText>
+            </w:r>
+            <w:r>
+              <w:rPr>
+                <w:noProof/>
+              </w:rPr>
+              <w:instrText>HYPERLINK \l "_Toc243520533"</w:instrText>
+            </w:r>
+            <w:r>
+              <w:rPr>
+                <w:rStyle w:val="Hyperlink"/>
+                <w:noProof/>
+              </w:rPr>
+              <w:instrText xml:space="preserve"> </w:instrText>
+            </w:r>
+            <w:r>
+              <w:rPr>
+                <w:rStyle w:val="Hyperlink"/>
+                <w:noProof/>
+              </w:rPr>
+            </w:r>
+            <w:r>
+              <w:rPr>
+                <w:rStyle w:val="Hyperlink"/>
+                <w:noProof/>
+              </w:rPr>
+              <w:fldChar w:fldCharType="separate"/>
+            </w:r>
+            <w:r>
+              <w:rPr>
+                <w:rStyle w:val="Hyperlink"/>
+                <w:noProof/>
+              </w:rPr>
+              <w:t>References</w:t>
+            </w:r>
+            <w:r>
+              <w:rPr>
+                <w:noProof/>
+                <w:webHidden/>
+              </w:rPr>
+              <w:tab/>
+            </w:r>
+            <w:r>
+              <w:rPr>
+                <w:noProof/>
+                <w:webHidden/>
+              </w:rPr>
+              <w:fldChar w:fldCharType="begin"/>
+            </w:r>
+            <w:r>
+              <w:rPr>
+                <w:noProof/>
+                <w:webHidden/>
+              </w:rPr>
+              <w:instrText xml:space="preserve"> PAGEREF _Toc243520533 \h </w:instrText>
+            </w:r>
+          </w:ins>
+          <w:r>
+            <w:rPr>
+              <w:noProof/>
+              <w:webHidden/>
+            </w:rPr>
+          </w:r>
+          <w:ins w:id="40" w:author="kyle O'Reilly" w:date="2026-10-22T00:15:00Z" w16du:dateUtc="2026-10-21T23:15:00Z">
+            <w:r>
+              <w:rPr>
+                <w:noProof/>
+                <w:webHidden/>
+              </w:rPr>
+              <w:fldChar w:fldCharType="separate"/>
+            </w:r>
+            <w:r>
+              <w:rPr>
+                <w:noProof/>
+                <w:webHidden/>
+              </w:rPr>
+              <w:t>3</w:t>
+            </w:r>
+            <w:r>
+              <w:rPr>
+                <w:noProof/>
+                <w:webHidden/>
+              </w:rPr>
+              <w:fldChar w:fldCharType="end"/>
+            </w:r>
+            <w:r>
+              <w:rPr>
+                <w:rStyle w:val="Hyperlink"/>
+                <w:noProof/>
+              </w:rPr>
+              <w:fldChar w:fldCharType="end"/>
+            </w:r>
+          </w:ins>
+        </w:p>
+        <w:p>
+          <w:del w:id="41" w:author="kyle O'Reilly" w:date="2026-10-20T21:26:00Z" w16du:dateUtc="2026-10-20T20:26:00Z">
             <w:r>
               <w:rPr>
                 <w:b/>
@@ -2564,42 +2568,42 @@
     <w:p>
       <w:pPr>
         <w:rPr>
-          <w:del w:id="31" w:author="kyle O'Reilly" w:date="2026-10-21T20:42:00Z" w16du:dateUtc="2026-10-21T19:42:00Z"/>
-        </w:rPr>
-      </w:pPr>
-    </w:p>
-    <w:p>
-      <w:pPr>
-        <w:rPr>
-          <w:del w:id="32" w:author="kyle O'Reilly" w:date="2026-10-21T20:42:00Z" w16du:dateUtc="2026-10-21T19:42:00Z"/>
-        </w:rPr>
-      </w:pPr>
-    </w:p>
-    <w:p>
-      <w:pPr>
-        <w:rPr>
-          <w:del w:id="33" w:author="kyle O'Reilly" w:date="2026-10-21T20:42:00Z" w16du:dateUtc="2026-10-21T19:42:00Z"/>
-        </w:rPr>
-      </w:pPr>
-    </w:p>
-    <w:p>
-      <w:pPr>
-        <w:rPr>
-          <w:del w:id="34" w:author="kyle O'Reilly" w:date="2026-10-21T20:42:00Z" w16du:dateUtc="2026-10-21T19:42:00Z"/>
-        </w:rPr>
-      </w:pPr>
-    </w:p>
-    <w:p>
-      <w:pPr>
-        <w:rPr>
-          <w:del w:id="35" w:author="kyle O'Reilly" w:date="2026-10-21T20:42:00Z" w16du:dateUtc="2026-10-21T19:42:00Z"/>
-        </w:rPr>
-      </w:pPr>
-    </w:p>
-    <w:p>
-      <w:pPr>
-        <w:rPr>
-          <w:del w:id="36" w:author="kyle O'Reilly" w:date="2026-10-21T20:42:00Z" w16du:dateUtc="2026-10-21T19:42:00Z"/>
+          <w:del w:id="42" w:author="kyle O'Reilly" w:date="2026-10-21T20:42:00Z" w16du:dateUtc="2026-10-21T19:42:00Z"/>
+        </w:rPr>
+      </w:pPr>
+    </w:p>
+    <w:p>
+      <w:pPr>
+        <w:rPr>
+          <w:del w:id="43" w:author="kyle O'Reilly" w:date="2026-10-21T20:42:00Z" w16du:dateUtc="2026-10-21T19:42:00Z"/>
+        </w:rPr>
+      </w:pPr>
+    </w:p>
+    <w:p>
+      <w:pPr>
+        <w:rPr>
+          <w:del w:id="44" w:author="kyle O'Reilly" w:date="2026-10-21T20:42:00Z" w16du:dateUtc="2026-10-21T19:42:00Z"/>
+        </w:rPr>
+      </w:pPr>
+    </w:p>
+    <w:p>
+      <w:pPr>
+        <w:rPr>
+          <w:del w:id="45" w:author="kyle O'Reilly" w:date="2026-10-21T20:42:00Z" w16du:dateUtc="2026-10-21T19:42:00Z"/>
+        </w:rPr>
+      </w:pPr>
+    </w:p>
+    <w:p>
+      <w:pPr>
+        <w:rPr>
+          <w:del w:id="46" w:author="kyle O'Reilly" w:date="2026-10-21T20:42:00Z" w16du:dateUtc="2026-10-21T19:42:00Z"/>
+        </w:rPr>
+      </w:pPr>
+    </w:p>
+    <w:p>
+      <w:pPr>
+        <w:rPr>
+          <w:del w:id="47" w:author="kyle O'Reilly" w:date="2026-10-21T20:42:00Z" w16du:dateUtc="2026-10-21T19:42:00Z"/>
         </w:rPr>
       </w:pPr>
     </w:p>
@@ -2607,14 +2611,14 @@
     <w:p>
       <w:pPr>
         <w:rPr>
-          <w:del w:id="37" w:author="kyle O'Reilly" w:date="2026-10-21T20:42:00Z" w16du:dateUtc="2026-10-21T19:42:00Z"/>
-        </w:rPr>
-      </w:pPr>
-    </w:p>
-    <w:p>
-      <w:pPr>
-        <w:rPr>
-          <w:del w:id="38" w:author="kyle O'Reilly" w:date="2026-10-21T20:42:00Z" w16du:dateUtc="2026-10-21T19:42:00Z"/>
+          <w:del w:id="48" w:author="kyle O'Reilly" w:date="2026-10-21T20:42:00Z" w16du:dateUtc="2026-10-21T19:42:00Z"/>
+        </w:rPr>
+      </w:pPr>
+    </w:p>
+    <w:p>
+      <w:pPr>
+        <w:rPr>
+          <w:del w:id="49" w:author="kyle O'Reilly" w:date="2026-10-21T20:42:00Z" w16du:dateUtc="2026-10-21T19:42:00Z"/>
         </w:rPr>
       </w:pPr>
     </w:p>
@@ -2622,14 +2626,14 @@
     <w:p>
       <w:pPr>
         <w:rPr>
-          <w:del w:id="39" w:author="kyle O'Reilly" w:date="2026-10-21T20:28:00Z" w16du:dateUtc="2026-10-21T19:28:00Z"/>
-        </w:rPr>
-      </w:pPr>
-    </w:p>
-    <w:p>
-      <w:pPr>
-        <w:rPr>
-          <w:del w:id="40" w:author="kyle O'Reilly" w:date="2026-10-20T21:26:00Z" w16du:dateUtc="2026-10-20T20:26:00Z"/>
+          <w:del w:id="50" w:author="kyle O'Reilly" w:date="2026-10-21T20:28:00Z" w16du:dateUtc="2026-10-21T19:28:00Z"/>
+        </w:rPr>
+      </w:pPr>
+    </w:p>
+    <w:p>
+      <w:pPr>
+        <w:rPr>
+          <w:del w:id="51" w:author="kyle O'Reilly" w:date="2026-10-20T21:26:00Z" w16du:dateUtc="2026-10-20T20:26:00Z"/>
         </w:rPr>
       </w:pPr>
     </w:p>
@@ -2651,31 +2655,31 @@
         <w:spacing w:line="360" w:lineRule="auto"/>
         <w:jc w:val="both"/>
         <w:rPr>
-          <w:ins w:id="41" w:author="kyle O'Reilly" w:date="2026-10-21T20:28:00Z" w16du:dateUtc="2026-10-21T19:28:00Z"/>
-        </w:rPr>
-        <w:pPrChange w:id="42" w:author="kyle O'Reilly" w:date="2026-10-21T20:33:00Z" w16du:dateUtc="2026-10-21T19:33:00Z">
+          <w:ins w:id="52" w:author="kyle O'Reilly" w:date="2026-10-21T20:28:00Z" w16du:dateUtc="2026-10-21T19:28:00Z"/>
+        </w:rPr>
+        <w:pPrChange w:id="53" w:author="kyle O'Reilly" w:date="2026-10-21T20:33:00Z" w16du:dateUtc="2026-10-21T19:33:00Z">
           <w:pPr>
             <w:pStyle w:val="Heading1"/>
           </w:pPr>
         </w:pPrChange>
       </w:pPr>
-      <w:bookmarkStart w:id="43" w:name="_Toc243520523"/>
-      <w:ins w:id="44" w:author="kyle O'Reilly" w:date="2026-10-20T21:25:00Z" w16du:dateUtc="2026-10-20T20:25:00Z">
+      <w:bookmarkStart w:id="54" w:name="_Toc243520523"/>
+      <w:ins w:id="55" w:author="kyle O'Reilly" w:date="2026-10-20T21:25:00Z" w16du:dateUtc="2026-10-20T20:25:00Z">
         <w:r>
           <w:lastRenderedPageBreak/>
           <w:t>1.</w:t>
         </w:r>
       </w:ins>
-      <w:ins w:id="45" w:author="kyle O'Reilly" w:date="2026-10-20T21:26:00Z" w16du:dateUtc="2026-10-20T20:26:00Z">
+      <w:ins w:id="56" w:author="kyle O'Reilly" w:date="2026-10-20T21:26:00Z" w16du:dateUtc="2026-10-20T20:26:00Z">
         <w:r>
           <w:t xml:space="preserve"> </w:t>
         </w:r>
       </w:ins>
-      <w:ins w:id="46" w:author="kyle O'Reilly" w:date="2026-10-21T20:28:00Z" w16du:dateUtc="2026-10-21T19:28:00Z">
+      <w:ins w:id="57" w:author="kyle O'Reilly" w:date="2026-10-21T20:28:00Z" w16du:dateUtc="2026-10-21T19:28:00Z">
         <w:r>
           <w:t>Project Title</w:t>
         </w:r>
-        <w:bookmarkEnd w:id="43"/>
+        <w:bookmarkEnd w:id="54"/>
       </w:ins>
     </w:p>
     <w:p>
@@ -2683,18 +2687,18 @@
         <w:spacing w:line="360" w:lineRule="auto"/>
         <w:jc w:val="both"/>
         <w:rPr>
-          <w:ins w:id="47" w:author="kyle O'Reilly" w:date="2026-10-21T20:32:00Z" w16du:dateUtc="2026-10-21T19:32:00Z"/>
-        </w:rPr>
-        <w:pPrChange w:id="48" w:author="kyle O'Reilly" w:date="2026-10-21T20:33:00Z" w16du:dateUtc="2026-10-21T19:33:00Z">
+          <w:ins w:id="58" w:author="kyle O'Reilly" w:date="2026-10-21T20:32:00Z" w16du:dateUtc="2026-10-21T19:32:00Z"/>
+        </w:rPr>
+        <w:pPrChange w:id="59" w:author="kyle O'Reilly" w:date="2026-10-21T20:33:00Z" w16du:dateUtc="2026-10-21T19:33:00Z">
           <w:pPr/>
         </w:pPrChange>
       </w:pPr>
-      <w:ins w:id="49" w:author="kyle O'Reilly" w:date="2026-10-21T20:28:00Z" w16du:dateUtc="2026-10-21T19:28:00Z">
+      <w:ins w:id="60" w:author="kyle O'Reilly" w:date="2026-10-21T20:28:00Z" w16du:dateUtc="2026-10-21T19:28:00Z">
         <w:r>
           <w:t xml:space="preserve">Assessing the Accuracy of Machine </w:t>
         </w:r>
       </w:ins>
-      <w:ins w:id="50" w:author="kyle O'Reilly" w:date="2026-10-21T20:29:00Z" w16du:dateUtc="2026-10-21T19:29:00Z">
+      <w:ins w:id="61" w:author="kyle O'Reilly" w:date="2026-10-21T20:29:00Z" w16du:dateUtc="2026-10-21T19:29:00Z">
         <w:r>
           <w:t>Learning Models in Predicting F</w:t>
         </w:r>
@@ -2717,7 +2721,7 @@
           <w:t>wi</w:t>
         </w:r>
       </w:ins>
-      <w:ins w:id="51" w:author="kyle O'Reilly" w:date="2026-10-21T20:30:00Z" w16du:dateUtc="2026-10-21T19:30:00Z">
+      <w:ins w:id="62" w:author="kyle O'Reilly" w:date="2026-10-21T20:30:00Z" w16du:dateUtc="2026-10-21T19:30:00Z">
         <w:r>
           <w:t xml:space="preserve">th Different </w:t>
         </w:r>
@@ -2729,7 +2733,7 @@
     <w:p>
       <w:pPr>
         <w:rPr>
-          <w:ins w:id="52" w:author="kyle O'Reilly" w:date="2026-10-21T20:28:00Z" w16du:dateUtc="2026-10-21T19:28:00Z"/>
+          <w:ins w:id="63" w:author="kyle O'Reilly" w:date="2026-10-21T20:28:00Z" w16du:dateUtc="2026-10-21T19:28:00Z"/>
         </w:rPr>
       </w:pPr>
     </w:p>
@@ -2737,29 +2741,29 @@
       <w:pPr>
         <w:pStyle w:val="Heading1"/>
         <w:rPr>
-          <w:ins w:id="53" w:author="kyle O'Reilly" w:date="2026-10-21T20:39:00Z" w16du:dateUtc="2026-10-21T19:39:00Z"/>
-        </w:rPr>
-      </w:pPr>
-      <w:bookmarkStart w:id="54" w:name="_Toc243520524"/>
-      <w:ins w:id="55" w:author="kyle O'Reilly" w:date="2026-10-21T20:28:00Z" w16du:dateUtc="2026-10-21T19:28:00Z">
+          <w:ins w:id="64" w:author="kyle O'Reilly" w:date="2026-10-21T20:39:00Z" w16du:dateUtc="2026-10-21T19:39:00Z"/>
+        </w:rPr>
+      </w:pPr>
+      <w:bookmarkStart w:id="65" w:name="_Toc243520524"/>
+      <w:ins w:id="66" w:author="kyle O'Reilly" w:date="2026-10-21T20:28:00Z" w16du:dateUtc="2026-10-21T19:28:00Z">
         <w:r>
           <w:t>2. Introduction</w:t>
         </w:r>
       </w:ins>
-      <w:bookmarkEnd w:id="54"/>
-    </w:p>
-    <w:p>
-      <w:pPr>
-        <w:rPr>
-          <w:ins w:id="56" w:author="kyle O'Reilly" w:date="2026-10-20T21:26:00Z" w16du:dateUtc="2026-10-20T20:26:00Z"/>
-        </w:rPr>
-        <w:pPrChange w:id="57" w:author="kyle O'Reilly" w:date="2026-10-21T20:39:00Z" w16du:dateUtc="2026-10-21T19:39:00Z">
+      <w:bookmarkEnd w:id="65"/>
+    </w:p>
+    <w:p>
+      <w:pPr>
+        <w:rPr>
+          <w:ins w:id="67" w:author="kyle O'Reilly" w:date="2026-10-20T21:26:00Z" w16du:dateUtc="2026-10-20T20:26:00Z"/>
+        </w:rPr>
+        <w:pPrChange w:id="68" w:author="kyle O'Reilly" w:date="2026-10-21T20:39:00Z" w16du:dateUtc="2026-10-21T19:39:00Z">
           <w:pPr>
             <w:pStyle w:val="Heading1"/>
           </w:pPr>
         </w:pPrChange>
       </w:pPr>
-      <w:ins w:id="58" w:author="kyle O'Reilly" w:date="2026-10-21T20:39:00Z" w16du:dateUtc="2026-10-21T19:39:00Z">
+      <w:ins w:id="69" w:author="kyle O'Reilly" w:date="2026-10-21T20:39:00Z" w16du:dateUtc="2026-10-21T19:39:00Z">
         <w:r>
           <w:t>?</w:t>
         </w:r>
@@ -2768,7 +2772,7 @@
     <w:p>
       <w:pPr>
         <w:rPr>
-          <w:ins w:id="59" w:author="kyle O'Reilly" w:date="2026-10-21T20:39:00Z" w16du:dateUtc="2026-10-21T19:39:00Z"/>
+          <w:ins w:id="70" w:author="kyle O'Reilly" w:date="2026-10-21T20:39:00Z" w16du:dateUtc="2026-10-21T19:39:00Z"/>
         </w:rPr>
       </w:pPr>
     </w:p>
@@ -2776,18 +2780,18 @@
       <w:pPr>
         <w:pStyle w:val="Heading1"/>
         <w:rPr>
-          <w:ins w:id="60" w:author="kyle O'Reilly" w:date="2026-10-21T20:39:00Z" w16du:dateUtc="2026-10-21T19:39:00Z"/>
-        </w:rPr>
-        <w:pPrChange w:id="61" w:author="kyle O'Reilly" w:date="2026-10-21T20:40:00Z" w16du:dateUtc="2026-10-21T19:40:00Z">
+          <w:ins w:id="71" w:author="kyle O'Reilly" w:date="2026-10-21T20:39:00Z" w16du:dateUtc="2026-10-21T19:39:00Z"/>
+        </w:rPr>
+        <w:pPrChange w:id="72" w:author="kyle O'Reilly" w:date="2026-10-21T20:40:00Z" w16du:dateUtc="2026-10-21T19:40:00Z">
           <w:pPr/>
         </w:pPrChange>
       </w:pPr>
-      <w:bookmarkStart w:id="62" w:name="_Toc243520525"/>
-      <w:ins w:id="63" w:author="kyle O'Reilly" w:date="2026-10-21T20:39:00Z" w16du:dateUtc="2026-10-21T19:39:00Z">
+      <w:bookmarkStart w:id="73" w:name="_Toc243520525"/>
+      <w:ins w:id="74" w:author="kyle O'Reilly" w:date="2026-10-21T20:39:00Z" w16du:dateUtc="2026-10-21T19:39:00Z">
         <w:r>
           <w:t>3. Problem Definition</w:t>
         </w:r>
-        <w:bookmarkEnd w:id="62"/>
+        <w:bookmarkEnd w:id="73"/>
         <w:r>
           <w:t xml:space="preserve"> </w:t>
         </w:r>
@@ -2796,10 +2800,10 @@
     <w:p>
       <w:pPr>
         <w:rPr>
-          <w:ins w:id="64" w:author="kyle O'Reilly" w:date="2026-10-21T20:39:00Z" w16du:dateUtc="2026-10-21T19:39:00Z"/>
-        </w:rPr>
-      </w:pPr>
-      <w:ins w:id="65" w:author="kyle O'Reilly" w:date="2026-10-21T20:39:00Z" w16du:dateUtc="2026-10-21T19:39:00Z">
+          <w:ins w:id="75" w:author="kyle O'Reilly" w:date="2026-10-21T20:39:00Z" w16du:dateUtc="2026-10-21T19:39:00Z"/>
+        </w:rPr>
+      </w:pPr>
+      <w:ins w:id="76" w:author="kyle O'Reilly" w:date="2026-10-21T20:39:00Z" w16du:dateUtc="2026-10-21T19:39:00Z">
         <w:r>
           <w:t>?</w:t>
         </w:r>
@@ -2809,9 +2813,9 @@
       <w:pPr>
         <w:pStyle w:val="Heading1"/>
         <w:rPr>
-          <w:ins w:id="66" w:author="kyle O'Reilly" w:date="2026-10-21T20:39:00Z" w16du:dateUtc="2026-10-21T19:39:00Z"/>
-        </w:rPr>
-        <w:pPrChange w:id="67" w:author="kyle O'Reilly" w:date="2026-10-21T20:40:00Z" w16du:dateUtc="2026-10-21T19:40:00Z">
+          <w:ins w:id="77" w:author="kyle O'Reilly" w:date="2026-10-21T20:39:00Z" w16du:dateUtc="2026-10-21T19:39:00Z"/>
+        </w:rPr>
+        <w:pPrChange w:id="78" w:author="kyle O'Reilly" w:date="2026-10-21T20:40:00Z" w16du:dateUtc="2026-10-21T19:40:00Z">
           <w:pPr/>
         </w:pPrChange>
       </w:pPr>
@@ -2822,23 +2826,23 @@
         <w:spacing w:line="360" w:lineRule="auto"/>
         <w:jc w:val="both"/>
         <w:rPr>
-          <w:ins w:id="68" w:author="kyle O'Reilly" w:date="2026-10-21T20:40:00Z" w16du:dateUtc="2026-10-21T19:40:00Z"/>
-        </w:rPr>
-        <w:pPrChange w:id="69" w:author="kyle O'Reilly" w:date="2026-10-21T23:18:00Z" w16du:dateUtc="2026-10-21T22:18:00Z">
+          <w:ins w:id="79" w:author="kyle O'Reilly" w:date="2026-10-21T20:40:00Z" w16du:dateUtc="2026-10-21T19:40:00Z"/>
+        </w:rPr>
+        <w:pPrChange w:id="80" w:author="kyle O'Reilly" w:date="2026-10-21T23:18:00Z" w16du:dateUtc="2026-10-21T22:18:00Z">
           <w:pPr/>
         </w:pPrChange>
       </w:pPr>
-      <w:bookmarkStart w:id="70" w:name="_Toc243520526"/>
-      <w:ins w:id="71" w:author="kyle O'Reilly" w:date="2026-10-21T20:39:00Z" w16du:dateUtc="2026-10-21T19:39:00Z">
+      <w:bookmarkStart w:id="81" w:name="_Toc243520526"/>
+      <w:ins w:id="82" w:author="kyle O'Reilly" w:date="2026-10-21T20:39:00Z" w16du:dateUtc="2026-10-21T19:39:00Z">
         <w:r>
           <w:t>4. Aim</w:t>
         </w:r>
       </w:ins>
-      <w:ins w:id="72" w:author="kyle O'Reilly" w:date="2026-10-21T20:40:00Z" w16du:dateUtc="2026-10-21T19:40:00Z">
+      <w:ins w:id="83" w:author="kyle O'Reilly" w:date="2026-10-21T20:40:00Z" w16du:dateUtc="2026-10-21T19:40:00Z">
         <w:r>
           <w:t>, Objectives and Hypothesis</w:t>
         </w:r>
-        <w:bookmarkEnd w:id="70"/>
+        <w:bookmarkEnd w:id="81"/>
         <w:r>
           <w:t xml:space="preserve"> </w:t>
         </w:r>
@@ -2849,18 +2853,18 @@
         <w:spacing w:line="360" w:lineRule="auto"/>
         <w:jc w:val="both"/>
         <w:rPr>
-          <w:ins w:id="73" w:author="kyle O'Reilly" w:date="2026-10-21T23:16:00Z" w16du:dateUtc="2026-10-21T22:16:00Z"/>
-        </w:rPr>
-        <w:pPrChange w:id="74" w:author="kyle O'Reilly" w:date="2026-10-21T23:18:00Z" w16du:dateUtc="2026-10-21T22:18:00Z">
+          <w:ins w:id="84" w:author="kyle O'Reilly" w:date="2026-10-21T23:16:00Z" w16du:dateUtc="2026-10-21T22:16:00Z"/>
+        </w:rPr>
+        <w:pPrChange w:id="85" w:author="kyle O'Reilly" w:date="2026-10-21T23:18:00Z" w16du:dateUtc="2026-10-21T22:18:00Z">
           <w:pPr/>
         </w:pPrChange>
       </w:pPr>
-      <w:ins w:id="75" w:author="kyle O'Reilly" w:date="2026-10-21T23:10:00Z" w16du:dateUtc="2026-10-21T22:10:00Z">
+      <w:ins w:id="86" w:author="kyle O'Reilly" w:date="2026-10-21T23:10:00Z" w16du:dateUtc="2026-10-21T22:10:00Z">
         <w:r>
           <w:rPr>
             <w:b/>
             <w:bCs/>
-            <w:rPrChange w:id="76" w:author="kyle O'Reilly" w:date="2026-10-21T23:11:00Z" w16du:dateUtc="2026-10-21T22:11:00Z">
+            <w:rPrChange w:id="87" w:author="kyle O'Reilly" w:date="2026-10-21T23:11:00Z" w16du:dateUtc="2026-10-21T22:11:00Z">
               <w:rPr/>
             </w:rPrChange>
           </w:rPr>
@@ -2876,33 +2880,33 @@
         <w:spacing w:line="360" w:lineRule="auto"/>
         <w:jc w:val="both"/>
         <w:rPr>
-          <w:ins w:id="77" w:author="kyle O'Reilly" w:date="2026-10-21T23:11:00Z" w16du:dateUtc="2026-10-21T22:11:00Z"/>
-        </w:rPr>
-        <w:pPrChange w:id="78" w:author="kyle O'Reilly" w:date="2026-10-21T23:18:00Z" w16du:dateUtc="2026-10-21T22:18:00Z">
+          <w:ins w:id="88" w:author="kyle O'Reilly" w:date="2026-10-21T23:11:00Z" w16du:dateUtc="2026-10-21T22:11:00Z"/>
+        </w:rPr>
+        <w:pPrChange w:id="89" w:author="kyle O'Reilly" w:date="2026-10-21T23:18:00Z" w16du:dateUtc="2026-10-21T22:18:00Z">
           <w:pPr/>
         </w:pPrChange>
       </w:pPr>
-      <w:ins w:id="79" w:author="kyle O'Reilly" w:date="2026-10-21T23:10:00Z" w16du:dateUtc="2026-10-21T22:10:00Z">
+      <w:ins w:id="90" w:author="kyle O'Reilly" w:date="2026-10-21T23:10:00Z" w16du:dateUtc="2026-10-21T22:10:00Z">
         <w:r>
           <w:t xml:space="preserve">To compare the accuracy of Linear Regression, Random Forest and a </w:t>
         </w:r>
       </w:ins>
-      <w:ins w:id="80" w:author="kyle O'Reilly" w:date="2026-10-21T23:14:00Z" w16du:dateUtc="2026-10-21T22:14:00Z">
+      <w:ins w:id="91" w:author="kyle O'Reilly" w:date="2026-10-21T23:14:00Z" w16du:dateUtc="2026-10-21T22:14:00Z">
         <w:r>
           <w:t>n</w:t>
         </w:r>
       </w:ins>
-      <w:ins w:id="81" w:author="kyle O'Reilly" w:date="2026-10-21T23:10:00Z" w16du:dateUtc="2026-10-21T22:10:00Z">
+      <w:ins w:id="92" w:author="kyle O'Reilly" w:date="2026-10-21T23:10:00Z" w16du:dateUtc="2026-10-21T22:10:00Z">
         <w:r>
           <w:t xml:space="preserve">aïve </w:t>
         </w:r>
       </w:ins>
-      <w:ins w:id="82" w:author="kyle O'Reilly" w:date="2026-10-21T23:14:00Z" w16du:dateUtc="2026-10-21T22:14:00Z">
+      <w:ins w:id="93" w:author="kyle O'Reilly" w:date="2026-10-21T23:14:00Z" w16du:dateUtc="2026-10-21T22:14:00Z">
         <w:r>
           <w:t>b</w:t>
         </w:r>
       </w:ins>
-      <w:ins w:id="83" w:author="kyle O'Reilly" w:date="2026-10-21T23:10:00Z" w16du:dateUtc="2026-10-21T22:10:00Z">
+      <w:ins w:id="94" w:author="kyle O'Reilly" w:date="2026-10-21T23:10:00Z" w16du:dateUtc="2026-10-21T22:10:00Z">
         <w:r>
           <w:t xml:space="preserve">aseline when predicting stock </w:t>
         </w:r>
@@ -2910,37 +2914,37 @@
           <w:t xml:space="preserve">prices twenty </w:t>
         </w:r>
       </w:ins>
-      <w:ins w:id="84" w:author="kyle O'Reilly" w:date="2026-10-22T00:14:00Z" w16du:dateUtc="2026-10-21T23:14:00Z">
+      <w:ins w:id="95" w:author="kyle O'Reilly" w:date="2026-10-22T00:14:00Z" w16du:dateUtc="2026-10-21T23:14:00Z">
         <w:r>
           <w:t xml:space="preserve">trading </w:t>
         </w:r>
       </w:ins>
-      <w:ins w:id="85" w:author="kyle O'Reilly" w:date="2026-10-21T23:10:00Z" w16du:dateUtc="2026-10-21T22:10:00Z">
+      <w:ins w:id="96" w:author="kyle O'Reilly" w:date="2026-10-21T23:10:00Z" w16du:dateUtc="2026-10-21T22:10:00Z">
         <w:r>
           <w:t xml:space="preserve">days after one </w:t>
         </w:r>
       </w:ins>
-      <w:ins w:id="86" w:author="kyle O'Reilly" w:date="2026-10-21T23:11:00Z" w16du:dateUtc="2026-10-21T22:11:00Z">
+      <w:ins w:id="97" w:author="kyle O'Reilly" w:date="2026-10-21T23:11:00Z" w16du:dateUtc="2026-10-21T22:11:00Z">
         <w:r>
           <w:t>historical cut-off stock date from the JPM</w:t>
         </w:r>
       </w:ins>
-      <w:ins w:id="87" w:author="kyle O'Reilly" w:date="2026-10-22T00:04:00Z" w16du:dateUtc="2026-10-21T23:04:00Z">
+      <w:ins w:id="98" w:author="kyle O'Reilly" w:date="2026-10-22T00:04:00Z" w16du:dateUtc="2026-10-21T23:04:00Z">
         <w:r>
           <w:t>.US</w:t>
         </w:r>
       </w:ins>
-      <w:ins w:id="88" w:author="kyle O'Reilly" w:date="2026-10-21T23:11:00Z" w16du:dateUtc="2026-10-21T22:11:00Z">
+      <w:ins w:id="99" w:author="kyle O'Reilly" w:date="2026-10-21T23:11:00Z" w16du:dateUtc="2026-10-21T22:11:00Z">
         <w:r>
           <w:t>, KO</w:t>
         </w:r>
       </w:ins>
-      <w:ins w:id="89" w:author="kyle O'Reilly" w:date="2026-10-22T00:04:00Z" w16du:dateUtc="2026-10-21T23:04:00Z">
+      <w:ins w:id="100" w:author="kyle O'Reilly" w:date="2026-10-22T00:04:00Z" w16du:dateUtc="2026-10-21T23:04:00Z">
         <w:r>
           <w:t>.US</w:t>
         </w:r>
       </w:ins>
-      <w:ins w:id="90" w:author="kyle O'Reilly" w:date="2026-10-21T23:11:00Z" w16du:dateUtc="2026-10-21T22:11:00Z">
+      <w:ins w:id="101" w:author="kyle O'Reilly" w:date="2026-10-21T23:11:00Z" w16du:dateUtc="2026-10-21T22:11:00Z">
         <w:r>
           <w:t xml:space="preserve"> and </w:t>
         </w:r>
@@ -2948,7 +2952,7 @@
           <w:t>INTC.</w:t>
         </w:r>
       </w:ins>
-      <w:ins w:id="91" w:author="kyle O'Reilly" w:date="2026-10-22T00:04:00Z" w16du:dateUtc="2026-10-21T23:04:00Z">
+      <w:ins w:id="102" w:author="kyle O'Reilly" w:date="2026-10-22T00:04:00Z" w16du:dateUtc="2026-10-21T23:04:00Z">
         <w:r>
           <w:t>US.</w:t>
         </w:r>
@@ -2959,25 +2963,25 @@
         <w:spacing w:line="360" w:lineRule="auto"/>
         <w:jc w:val="both"/>
         <w:rPr>
-          <w:ins w:id="92" w:author="kyle O'Reilly" w:date="2026-10-21T23:11:00Z" w16du:dateUtc="2026-10-21T22:11:00Z"/>
+          <w:ins w:id="103" w:author="kyle O'Reilly" w:date="2026-10-21T23:11:00Z" w16du:dateUtc="2026-10-21T22:11:00Z"/>
           <w:b/>
           <w:bCs/>
-          <w:rPrChange w:id="93" w:author="kyle O'Reilly" w:date="2026-10-21T23:16:00Z" w16du:dateUtc="2026-10-21T22:16:00Z">
+          <w:rPrChange w:id="104" w:author="kyle O'Reilly" w:date="2026-10-21T23:16:00Z" w16du:dateUtc="2026-10-21T22:16:00Z">
             <w:rPr>
-              <w:ins w:id="94" w:author="kyle O'Reilly" w:date="2026-10-21T23:11:00Z" w16du:dateUtc="2026-10-21T22:11:00Z"/>
+              <w:ins w:id="105" w:author="kyle O'Reilly" w:date="2026-10-21T23:11:00Z" w16du:dateUtc="2026-10-21T22:11:00Z"/>
             </w:rPr>
           </w:rPrChange>
         </w:rPr>
-        <w:pPrChange w:id="95" w:author="kyle O'Reilly" w:date="2026-10-21T23:18:00Z" w16du:dateUtc="2026-10-21T22:18:00Z">
+        <w:pPrChange w:id="106" w:author="kyle O'Reilly" w:date="2026-10-21T23:18:00Z" w16du:dateUtc="2026-10-21T22:18:00Z">
           <w:pPr/>
         </w:pPrChange>
       </w:pPr>
-      <w:ins w:id="96" w:author="kyle O'Reilly" w:date="2026-10-21T23:11:00Z" w16du:dateUtc="2026-10-21T22:11:00Z">
+      <w:ins w:id="107" w:author="kyle O'Reilly" w:date="2026-10-21T23:11:00Z" w16du:dateUtc="2026-10-21T22:11:00Z">
         <w:r>
           <w:rPr>
             <w:b/>
             <w:bCs/>
-            <w:rPrChange w:id="97" w:author="kyle O'Reilly" w:date="2026-10-21T23:16:00Z" w16du:dateUtc="2026-10-21T22:16:00Z">
+            <w:rPrChange w:id="108" w:author="kyle O'Reilly" w:date="2026-10-21T23:16:00Z" w16du:dateUtc="2026-10-21T22:16:00Z">
               <w:rPr/>
             </w:rPrChange>
           </w:rPr>
@@ -2995,9 +2999,9 @@
         <w:spacing w:line="360" w:lineRule="auto"/>
         <w:jc w:val="both"/>
         <w:rPr>
-          <w:ins w:id="98" w:author="kyle O'Reilly" w:date="2026-10-21T23:13:00Z" w16du:dateUtc="2026-10-21T22:13:00Z"/>
-        </w:rPr>
-        <w:pPrChange w:id="99" w:author="kyle O'Reilly" w:date="2026-10-21T23:18:00Z" w16du:dateUtc="2026-10-21T22:18:00Z">
+          <w:ins w:id="109" w:author="kyle O'Reilly" w:date="2026-10-21T23:13:00Z" w16du:dateUtc="2026-10-21T22:13:00Z"/>
+        </w:rPr>
+        <w:pPrChange w:id="110" w:author="kyle O'Reilly" w:date="2026-10-21T23:18:00Z" w16du:dateUtc="2026-10-21T22:18:00Z">
           <w:pPr>
             <w:pStyle w:val="ListParagraph"/>
             <w:numPr>
@@ -3007,22 +3011,22 @@
           </w:pPr>
         </w:pPrChange>
       </w:pPr>
-      <w:ins w:id="100" w:author="kyle O'Reilly" w:date="2026-10-21T23:11:00Z" w16du:dateUtc="2026-10-21T22:11:00Z">
+      <w:ins w:id="111" w:author="kyle O'Reilly" w:date="2026-10-21T23:11:00Z" w16du:dateUtc="2026-10-21T22:11:00Z">
         <w:r>
           <w:t>S</w:t>
         </w:r>
       </w:ins>
-      <w:ins w:id="101" w:author="kyle O'Reilly" w:date="2026-10-21T23:12:00Z" w16du:dateUtc="2026-10-21T22:12:00Z">
+      <w:ins w:id="112" w:author="kyle O'Reilly" w:date="2026-10-21T23:12:00Z" w16du:dateUtc="2026-10-21T22:12:00Z">
         <w:r>
           <w:t>elect JPM</w:t>
         </w:r>
       </w:ins>
-      <w:ins w:id="102" w:author="kyle O'Reilly" w:date="2026-10-21T23:57:00Z" w16du:dateUtc="2026-10-21T22:57:00Z">
+      <w:ins w:id="113" w:author="kyle O'Reilly" w:date="2026-10-21T23:57:00Z" w16du:dateUtc="2026-10-21T22:57:00Z">
         <w:r>
           <w:t>.US</w:t>
         </w:r>
       </w:ins>
-      <w:ins w:id="103" w:author="kyle O'Reilly" w:date="2026-10-21T23:12:00Z" w16du:dateUtc="2026-10-21T22:12:00Z">
+      <w:ins w:id="114" w:author="kyle O'Reilly" w:date="2026-10-21T23:12:00Z" w16du:dateUtc="2026-10-21T22:12:00Z">
         <w:r>
           <w:t>,</w:t>
         </w:r>
@@ -3030,37 +3034,37 @@
           <w:t xml:space="preserve"> KO</w:t>
         </w:r>
       </w:ins>
-      <w:ins w:id="104" w:author="kyle O'Reilly" w:date="2026-10-21T23:57:00Z" w16du:dateUtc="2026-10-21T22:57:00Z">
+      <w:ins w:id="115" w:author="kyle O'Reilly" w:date="2026-10-21T23:57:00Z" w16du:dateUtc="2026-10-21T22:57:00Z">
         <w:r>
           <w:t>.US</w:t>
         </w:r>
       </w:ins>
-      <w:ins w:id="105" w:author="kyle O'Reilly" w:date="2026-10-21T23:12:00Z" w16du:dateUtc="2026-10-21T22:12:00Z">
+      <w:ins w:id="116" w:author="kyle O'Reilly" w:date="2026-10-21T23:12:00Z" w16du:dateUtc="2026-10-21T22:12:00Z">
         <w:r>
           <w:t xml:space="preserve"> and INTC</w:t>
         </w:r>
       </w:ins>
-      <w:ins w:id="106" w:author="kyle O'Reilly" w:date="2026-10-21T23:57:00Z" w16du:dateUtc="2026-10-21T22:57:00Z">
+      <w:ins w:id="117" w:author="kyle O'Reilly" w:date="2026-10-21T23:57:00Z" w16du:dateUtc="2026-10-21T22:57:00Z">
         <w:r>
           <w:t>.US</w:t>
         </w:r>
       </w:ins>
-      <w:ins w:id="107" w:author="kyle O'Reilly" w:date="2026-10-21T23:12:00Z" w16du:dateUtc="2026-10-21T22:12:00Z">
+      <w:ins w:id="118" w:author="kyle O'Reilly" w:date="2026-10-21T23:12:00Z" w16du:dateUtc="2026-10-21T22:12:00Z">
         <w:r>
           <w:t>, and examine comparable published</w:t>
         </w:r>
       </w:ins>
-      <w:ins w:id="108" w:author="kyle O'Reilly" w:date="2026-10-21T23:58:00Z" w16du:dateUtc="2026-10-21T22:58:00Z">
+      <w:ins w:id="119" w:author="kyle O'Reilly" w:date="2026-10-21T23:58:00Z" w16du:dateUtc="2026-10-21T22:58:00Z">
         <w:r>
           <w:t xml:space="preserve"> Trading 212</w:t>
         </w:r>
       </w:ins>
-      <w:ins w:id="109" w:author="kyle O'Reilly" w:date="2026-10-21T23:12:00Z" w16du:dateUtc="2026-10-21T22:12:00Z">
+      <w:ins w:id="120" w:author="kyle O'Reilly" w:date="2026-10-21T23:12:00Z" w16du:dateUtc="2026-10-21T22:12:00Z">
         <w:r>
           <w:t xml:space="preserve"> volatility information to justify their proposed contra</w:t>
         </w:r>
       </w:ins>
-      <w:ins w:id="110" w:author="kyle O'Reilly" w:date="2026-10-21T23:13:00Z" w16du:dateUtc="2026-10-21T22:13:00Z">
+      <w:ins w:id="121" w:author="kyle O'Reilly" w:date="2026-10-21T23:13:00Z" w16du:dateUtc="2026-10-21T22:13:00Z">
         <w:r>
           <w:t>sting volatility levels.</w:t>
         </w:r>
@@ -3076,104 +3080,7 @@
         <w:spacing w:line="360" w:lineRule="auto"/>
         <w:jc w:val="both"/>
         <w:rPr>
-          <w:ins w:id="111" w:author="kyle O'Reilly" w:date="2026-10-21T23:14:00Z" w16du:dateUtc="2026-10-21T22:14:00Z"/>
-        </w:rPr>
-        <w:pPrChange w:id="112" w:author="kyle O'Reilly" w:date="2026-10-21T23:18:00Z" w16du:dateUtc="2026-10-21T22:18:00Z">
-          <w:pPr>
-            <w:pStyle w:val="ListParagraph"/>
-            <w:numPr>
-              <w:numId w:val="7"/>
-            </w:numPr>
-            <w:ind w:hanging="360"/>
-          </w:pPr>
-        </w:pPrChange>
-      </w:pPr>
-      <w:ins w:id="113" w:author="kyle O'Reilly" w:date="2026-10-21T23:13:00Z" w16du:dateUtc="2026-10-21T22:13:00Z">
-        <w:r>
-          <w:t xml:space="preserve">Collect, clean and analyse historical stock data </w:t>
-        </w:r>
-        <w:r>
-          <w:t>from Stooq, and prepare simple historical</w:t>
-        </w:r>
-      </w:ins>
-      <w:ins w:id="114" w:author="kyle O'Reilly" w:date="2026-10-21T23:14:00Z" w16du:dateUtc="2026-10-21T22:14:00Z">
-        <w:r>
-          <w:t xml:space="preserve"> price features for the forecasting models.</w:t>
-        </w:r>
-      </w:ins>
-    </w:p>
-    <w:p>
-      <w:pPr>
-        <w:pStyle w:val="ListParagraph"/>
-        <w:numPr>
-          <w:ilvl w:val="0"/>
-          <w:numId w:val="7"/>
-        </w:numPr>
-        <w:spacing w:line="360" w:lineRule="auto"/>
-        <w:jc w:val="both"/>
-        <w:rPr>
-          <w:ins w:id="115" w:author="kyle O'Reilly" w:date="2026-10-21T23:14:00Z" w16du:dateUtc="2026-10-21T22:14:00Z"/>
-        </w:rPr>
-        <w:pPrChange w:id="116" w:author="kyle O'Reilly" w:date="2026-10-21T23:18:00Z" w16du:dateUtc="2026-10-21T22:18:00Z">
-          <w:pPr>
-            <w:pStyle w:val="ListParagraph"/>
-            <w:numPr>
-              <w:numId w:val="7"/>
-            </w:numPr>
-            <w:ind w:hanging="360"/>
-          </w:pPr>
-        </w:pPrChange>
-      </w:pPr>
-      <w:ins w:id="117" w:author="kyle O'Reilly" w:date="2026-10-21T23:14:00Z" w16du:dateUtc="2026-10-21T22:14:00Z">
-        <w:r>
-          <w:t>Develop Linear Regression and Random Forest models and establish a naïve baseline for each selected stock.</w:t>
-        </w:r>
-      </w:ins>
-    </w:p>
-    <w:p>
-      <w:pPr>
-        <w:pStyle w:val="ListParagraph"/>
-        <w:numPr>
-          <w:ilvl w:val="0"/>
-          <w:numId w:val="7"/>
-        </w:numPr>
-        <w:spacing w:line="360" w:lineRule="auto"/>
-        <w:jc w:val="both"/>
-        <w:rPr>
-          <w:ins w:id="118" w:author="kyle O'Reilly" w:date="2026-10-21T23:15:00Z" w16du:dateUtc="2026-10-21T22:15:00Z"/>
-        </w:rPr>
-        <w:pPrChange w:id="119" w:author="kyle O'Reilly" w:date="2026-10-21T23:18:00Z" w16du:dateUtc="2026-10-21T22:18:00Z">
-          <w:pPr>
-            <w:pStyle w:val="ListParagraph"/>
-            <w:numPr>
-              <w:numId w:val="7"/>
-            </w:numPr>
-            <w:ind w:hanging="360"/>
-          </w:pPr>
-        </w:pPrChange>
-      </w:pPr>
-      <w:ins w:id="120" w:author="kyle O'Reilly" w:date="2026-10-21T23:14:00Z" w16du:dateUtc="2026-10-21T22:14:00Z">
-        <w:r>
-          <w:t>Generate nine predic</w:t>
-        </w:r>
-      </w:ins>
-      <w:ins w:id="121" w:author="kyle O'Reilly" w:date="2026-10-21T23:15:00Z" w16du:dateUtc="2026-10-21T22:15:00Z">
-        <w:r>
-          <w:t>tions and compare them with three actual closing stock prices twenty days after the historical cut-off stock date.</w:t>
-        </w:r>
-      </w:ins>
-    </w:p>
-    <w:p>
-      <w:pPr>
-        <w:pStyle w:val="ListParagraph"/>
-        <w:numPr>
-          <w:ilvl w:val="0"/>
-          <w:numId w:val="7"/>
-        </w:numPr>
-        <w:spacing w:line="360" w:lineRule="auto"/>
-        <w:jc w:val="both"/>
-        <w:rPr>
-          <w:ins w:id="122" w:author="kyle O'Reilly" w:date="2026-10-21T23:16:00Z" w16du:dateUtc="2026-10-21T22:16:00Z"/>
+          <w:ins w:id="122" w:author="kyle O'Reilly" w:date="2026-10-21T23:14:00Z" w16du:dateUtc="2026-10-21T22:14:00Z"/>
         </w:rPr>
         <w:pPrChange w:id="123" w:author="kyle O'Reilly" w:date="2026-10-21T23:18:00Z" w16du:dateUtc="2026-10-21T22:18:00Z">
           <w:pPr>
@@ -3185,44 +3092,141 @@
           </w:pPr>
         </w:pPrChange>
       </w:pPr>
-      <w:ins w:id="124" w:author="kyle O'Reilly" w:date="2026-10-21T23:15:00Z" w16du:dateUtc="2026-10-21T22:15:00Z">
-        <w:r>
-          <w:t>Calculate individual prediction errors</w:t>
-        </w:r>
-        <w:r>
-          <w:t>, compare approaches and discuss observed difference between the s</w:t>
-        </w:r>
-      </w:ins>
-      <w:ins w:id="125" w:author="kyle O'Reilly" w:date="2026-10-21T23:16:00Z" w16du:dateUtc="2026-10-21T22:16:00Z">
-        <w:r>
-          <w:t>elected stocks.</w:t>
-        </w:r>
-      </w:ins>
-    </w:p>
-    <w:p>
-      <w:pPr>
+      <w:ins w:id="124" w:author="kyle O'Reilly" w:date="2026-10-21T23:13:00Z" w16du:dateUtc="2026-10-21T22:13:00Z">
+        <w:r>
+          <w:t xml:space="preserve">Collect, clean and analyse historical stock data </w:t>
+        </w:r>
+        <w:r>
+          <w:t>from Stooq, and prepare simple historical</w:t>
+        </w:r>
+      </w:ins>
+      <w:ins w:id="125" w:author="kyle O'Reilly" w:date="2026-10-21T23:14:00Z" w16du:dateUtc="2026-10-21T22:14:00Z">
+        <w:r>
+          <w:t xml:space="preserve"> price features for the forecasting models.</w:t>
+        </w:r>
+      </w:ins>
+    </w:p>
+    <w:p>
+      <w:pPr>
+        <w:pStyle w:val="ListParagraph"/>
+        <w:numPr>
+          <w:ilvl w:val="0"/>
+          <w:numId w:val="7"/>
+        </w:numPr>
         <w:spacing w:line="360" w:lineRule="auto"/>
         <w:jc w:val="both"/>
         <w:rPr>
-          <w:ins w:id="126" w:author="kyle O'Reilly" w:date="2026-10-21T23:16:00Z" w16du:dateUtc="2026-10-21T22:16:00Z"/>
+          <w:ins w:id="126" w:author="kyle O'Reilly" w:date="2026-10-21T23:14:00Z" w16du:dateUtc="2026-10-21T22:14:00Z"/>
+        </w:rPr>
+        <w:pPrChange w:id="127" w:author="kyle O'Reilly" w:date="2026-10-21T23:18:00Z" w16du:dateUtc="2026-10-21T22:18:00Z">
+          <w:pPr>
+            <w:pStyle w:val="ListParagraph"/>
+            <w:numPr>
+              <w:numId w:val="7"/>
+            </w:numPr>
+            <w:ind w:hanging="360"/>
+          </w:pPr>
+        </w:pPrChange>
+      </w:pPr>
+      <w:ins w:id="128" w:author="kyle O'Reilly" w:date="2026-10-21T23:14:00Z" w16du:dateUtc="2026-10-21T22:14:00Z">
+        <w:r>
+          <w:t>Develop Linear Regression and Random Forest models and establish a naïve baseline for each selected stock.</w:t>
+        </w:r>
+      </w:ins>
+    </w:p>
+    <w:p>
+      <w:pPr>
+        <w:pStyle w:val="ListParagraph"/>
+        <w:numPr>
+          <w:ilvl w:val="0"/>
+          <w:numId w:val="7"/>
+        </w:numPr>
+        <w:spacing w:line="360" w:lineRule="auto"/>
+        <w:jc w:val="both"/>
+        <w:rPr>
+          <w:ins w:id="129" w:author="kyle O'Reilly" w:date="2026-10-21T23:15:00Z" w16du:dateUtc="2026-10-21T22:15:00Z"/>
+        </w:rPr>
+        <w:pPrChange w:id="130" w:author="kyle O'Reilly" w:date="2026-10-21T23:18:00Z" w16du:dateUtc="2026-10-21T22:18:00Z">
+          <w:pPr>
+            <w:pStyle w:val="ListParagraph"/>
+            <w:numPr>
+              <w:numId w:val="7"/>
+            </w:numPr>
+            <w:ind w:hanging="360"/>
+          </w:pPr>
+        </w:pPrChange>
+      </w:pPr>
+      <w:ins w:id="131" w:author="kyle O'Reilly" w:date="2026-10-21T23:14:00Z" w16du:dateUtc="2026-10-21T22:14:00Z">
+        <w:r>
+          <w:t>Generate nine predic</w:t>
+        </w:r>
+      </w:ins>
+      <w:ins w:id="132" w:author="kyle O'Reilly" w:date="2026-10-21T23:15:00Z" w16du:dateUtc="2026-10-21T22:15:00Z">
+        <w:r>
+          <w:t>tions and compare them with three actual closing stock prices twenty days after the historical cut-off stock date.</w:t>
+        </w:r>
+      </w:ins>
+    </w:p>
+    <w:p>
+      <w:pPr>
+        <w:pStyle w:val="ListParagraph"/>
+        <w:numPr>
+          <w:ilvl w:val="0"/>
+          <w:numId w:val="7"/>
+        </w:numPr>
+        <w:spacing w:line="360" w:lineRule="auto"/>
+        <w:jc w:val="both"/>
+        <w:rPr>
+          <w:ins w:id="133" w:author="kyle O'Reilly" w:date="2026-10-21T23:16:00Z" w16du:dateUtc="2026-10-21T22:16:00Z"/>
+        </w:rPr>
+        <w:pPrChange w:id="134" w:author="kyle O'Reilly" w:date="2026-10-21T23:18:00Z" w16du:dateUtc="2026-10-21T22:18:00Z">
+          <w:pPr>
+            <w:pStyle w:val="ListParagraph"/>
+            <w:numPr>
+              <w:numId w:val="7"/>
+            </w:numPr>
+            <w:ind w:hanging="360"/>
+          </w:pPr>
+        </w:pPrChange>
+      </w:pPr>
+      <w:ins w:id="135" w:author="kyle O'Reilly" w:date="2026-10-21T23:15:00Z" w16du:dateUtc="2026-10-21T22:15:00Z">
+        <w:r>
+          <w:t>Calculate individual prediction errors</w:t>
+        </w:r>
+        <w:r>
+          <w:t>, compare approaches and discuss observed difference between the s</w:t>
+        </w:r>
+      </w:ins>
+      <w:ins w:id="136" w:author="kyle O'Reilly" w:date="2026-10-21T23:16:00Z" w16du:dateUtc="2026-10-21T22:16:00Z">
+        <w:r>
+          <w:t>elected stocks.</w:t>
+        </w:r>
+      </w:ins>
+    </w:p>
+    <w:p>
+      <w:pPr>
+        <w:spacing w:line="360" w:lineRule="auto"/>
+        <w:jc w:val="both"/>
+        <w:rPr>
+          <w:ins w:id="137" w:author="kyle O'Reilly" w:date="2026-10-21T23:16:00Z" w16du:dateUtc="2026-10-21T22:16:00Z"/>
           <w:b/>
           <w:bCs/>
-          <w:rPrChange w:id="127" w:author="kyle O'Reilly" w:date="2026-10-21T23:16:00Z" w16du:dateUtc="2026-10-21T22:16:00Z">
+          <w:rPrChange w:id="138" w:author="kyle O'Reilly" w:date="2026-10-21T23:16:00Z" w16du:dateUtc="2026-10-21T22:16:00Z">
             <w:rPr>
-              <w:ins w:id="128" w:author="kyle O'Reilly" w:date="2026-10-21T23:16:00Z" w16du:dateUtc="2026-10-21T22:16:00Z"/>
+              <w:ins w:id="139" w:author="kyle O'Reilly" w:date="2026-10-21T23:16:00Z" w16du:dateUtc="2026-10-21T22:16:00Z"/>
             </w:rPr>
           </w:rPrChange>
         </w:rPr>
-        <w:pPrChange w:id="129" w:author="kyle O'Reilly" w:date="2026-10-21T23:18:00Z" w16du:dateUtc="2026-10-21T22:18:00Z">
+        <w:pPrChange w:id="140" w:author="kyle O'Reilly" w:date="2026-10-21T23:18:00Z" w16du:dateUtc="2026-10-21T22:18:00Z">
           <w:pPr/>
         </w:pPrChange>
       </w:pPr>
-      <w:ins w:id="130" w:author="kyle O'Reilly" w:date="2026-10-21T23:16:00Z" w16du:dateUtc="2026-10-21T22:16:00Z">
+      <w:ins w:id="141" w:author="kyle O'Reilly" w:date="2026-10-21T23:16:00Z" w16du:dateUtc="2026-10-21T22:16:00Z">
         <w:r>
           <w:rPr>
             <w:b/>
             <w:bCs/>
-            <w:rPrChange w:id="131" w:author="kyle O'Reilly" w:date="2026-10-21T23:16:00Z" w16du:dateUtc="2026-10-21T22:16:00Z">
+            <w:rPrChange w:id="142" w:author="kyle O'Reilly" w:date="2026-10-21T23:16:00Z" w16du:dateUtc="2026-10-21T22:16:00Z">
               <w:rPr/>
             </w:rPrChange>
           </w:rPr>
@@ -3235,13 +3239,13 @@
         <w:spacing w:line="360" w:lineRule="auto"/>
         <w:jc w:val="both"/>
         <w:rPr>
-          <w:ins w:id="132" w:author="kyle O'Reilly" w:date="2026-10-21T20:39:00Z" w16du:dateUtc="2026-10-21T19:39:00Z"/>
-        </w:rPr>
-        <w:pPrChange w:id="133" w:author="kyle O'Reilly" w:date="2026-10-21T23:18:00Z" w16du:dateUtc="2026-10-21T22:18:00Z">
+          <w:ins w:id="143" w:author="kyle O'Reilly" w:date="2026-10-21T20:39:00Z" w16du:dateUtc="2026-10-21T19:39:00Z"/>
+        </w:rPr>
+        <w:pPrChange w:id="144" w:author="kyle O'Reilly" w:date="2026-10-21T23:18:00Z" w16du:dateUtc="2026-10-21T22:18:00Z">
           <w:pPr/>
         </w:pPrChange>
       </w:pPr>
-      <w:ins w:id="134" w:author="kyle O'Reilly" w:date="2026-10-21T23:16:00Z" w16du:dateUtc="2026-10-21T22:16:00Z">
+      <w:ins w:id="145" w:author="kyle O'Reilly" w:date="2026-10-21T23:16:00Z" w16du:dateUtc="2026-10-21T22:16:00Z">
         <w:r>
           <w:lastRenderedPageBreak/>
           <w:t xml:space="preserve">The stock with the highest documented </w:t>
@@ -3250,7 +3254,7 @@
           <w:t>historical volatility will have the highest</w:t>
         </w:r>
       </w:ins>
-      <w:ins w:id="135" w:author="kyle O'Reilly" w:date="2026-10-21T23:17:00Z" w16du:dateUtc="2026-10-21T22:17:00Z">
+      <w:ins w:id="146" w:author="kyle O'Reilly" w:date="2026-10-21T23:17:00Z" w16du:dateUtc="2026-10-21T22:17:00Z">
         <w:r>
           <w:t xml:space="preserve"> average absolute percentage forecasting error across the three forecasting methods. This explo</w:t>
         </w:r>
@@ -3262,7 +3266,7 @@
     <w:p>
       <w:pPr>
         <w:rPr>
-          <w:ins w:id="136" w:author="kyle O'Reilly" w:date="2026-10-21T20:40:00Z" w16du:dateUtc="2026-10-21T19:40:00Z"/>
+          <w:ins w:id="147" w:author="kyle O'Reilly" w:date="2026-10-21T20:40:00Z" w16du:dateUtc="2026-10-21T19:40:00Z"/>
         </w:rPr>
       </w:pPr>
     </w:p>
@@ -3270,27 +3274,27 @@
       <w:pPr>
         <w:pStyle w:val="Heading1"/>
         <w:rPr>
-          <w:ins w:id="137" w:author="kyle O'Reilly" w:date="2026-10-21T20:40:00Z" w16du:dateUtc="2026-10-21T19:40:00Z"/>
-        </w:rPr>
-        <w:pPrChange w:id="138" w:author="kyle O'Reilly" w:date="2026-10-21T20:41:00Z" w16du:dateUtc="2026-10-21T19:41:00Z">
+          <w:ins w:id="148" w:author="kyle O'Reilly" w:date="2026-10-21T20:40:00Z" w16du:dateUtc="2026-10-21T19:40:00Z"/>
+        </w:rPr>
+        <w:pPrChange w:id="149" w:author="kyle O'Reilly" w:date="2026-10-21T20:41:00Z" w16du:dateUtc="2026-10-21T19:41:00Z">
           <w:pPr/>
         </w:pPrChange>
       </w:pPr>
-      <w:bookmarkStart w:id="139" w:name="_Toc243520527"/>
-      <w:ins w:id="140" w:author="kyle O'Reilly" w:date="2026-10-21T20:40:00Z" w16du:dateUtc="2026-10-21T19:40:00Z">
+      <w:bookmarkStart w:id="150" w:name="_Toc243520527"/>
+      <w:ins w:id="151" w:author="kyle O'Reilly" w:date="2026-10-21T20:40:00Z" w16du:dateUtc="2026-10-21T19:40:00Z">
         <w:r>
           <w:t>5. Project Scope</w:t>
         </w:r>
-        <w:bookmarkEnd w:id="139"/>
-      </w:ins>
-    </w:p>
-    <w:p>
-      <w:pPr>
-        <w:rPr>
-          <w:ins w:id="141" w:author="kyle O'Reilly" w:date="2026-10-21T20:40:00Z" w16du:dateUtc="2026-10-21T19:40:00Z"/>
-        </w:rPr>
-      </w:pPr>
-      <w:ins w:id="142" w:author="kyle O'Reilly" w:date="2026-10-21T20:40:00Z" w16du:dateUtc="2026-10-21T19:40:00Z">
+        <w:bookmarkEnd w:id="150"/>
+      </w:ins>
+    </w:p>
+    <w:p>
+      <w:pPr>
+        <w:rPr>
+          <w:ins w:id="152" w:author="kyle O'Reilly" w:date="2026-10-21T20:40:00Z" w16du:dateUtc="2026-10-21T19:40:00Z"/>
+        </w:rPr>
+      </w:pPr>
+      <w:ins w:id="153" w:author="kyle O'Reilly" w:date="2026-10-21T20:40:00Z" w16du:dateUtc="2026-10-21T19:40:00Z">
         <w:r>
           <w:t>?</w:t>
         </w:r>
@@ -3299,7 +3303,7 @@
     <w:p>
       <w:pPr>
         <w:rPr>
-          <w:ins w:id="143" w:author="kyle O'Reilly" w:date="2026-10-21T20:40:00Z" w16du:dateUtc="2026-10-21T19:40:00Z"/>
+          <w:ins w:id="154" w:author="kyle O'Reilly" w:date="2026-10-21T20:40:00Z" w16du:dateUtc="2026-10-21T19:40:00Z"/>
         </w:rPr>
       </w:pPr>
     </w:p>
@@ -3307,27 +3311,27 @@
       <w:pPr>
         <w:pStyle w:val="Heading1"/>
         <w:rPr>
-          <w:ins w:id="144" w:author="kyle O'Reilly" w:date="2026-10-21T20:40:00Z" w16du:dateUtc="2026-10-21T19:40:00Z"/>
-        </w:rPr>
-        <w:pPrChange w:id="145" w:author="kyle O'Reilly" w:date="2026-10-21T20:41:00Z" w16du:dateUtc="2026-10-21T19:41:00Z">
+          <w:ins w:id="155" w:author="kyle O'Reilly" w:date="2026-10-21T20:40:00Z" w16du:dateUtc="2026-10-21T19:40:00Z"/>
+        </w:rPr>
+        <w:pPrChange w:id="156" w:author="kyle O'Reilly" w:date="2026-10-21T20:41:00Z" w16du:dateUtc="2026-10-21T19:41:00Z">
           <w:pPr/>
         </w:pPrChange>
       </w:pPr>
-      <w:bookmarkStart w:id="146" w:name="_Toc243520528"/>
-      <w:ins w:id="147" w:author="kyle O'Reilly" w:date="2026-10-21T20:40:00Z" w16du:dateUtc="2026-10-21T19:40:00Z">
+      <w:bookmarkStart w:id="157" w:name="_Toc243520528"/>
+      <w:ins w:id="158" w:author="kyle O'Reilly" w:date="2026-10-21T20:40:00Z" w16du:dateUtc="2026-10-21T19:40:00Z">
         <w:r>
           <w:t>6. Methodology</w:t>
         </w:r>
-        <w:bookmarkEnd w:id="146"/>
-      </w:ins>
-    </w:p>
-    <w:p>
-      <w:pPr>
-        <w:rPr>
-          <w:ins w:id="148" w:author="kyle O'Reilly" w:date="2026-10-21T20:40:00Z" w16du:dateUtc="2026-10-21T19:40:00Z"/>
-        </w:rPr>
-      </w:pPr>
-      <w:ins w:id="149" w:author="kyle O'Reilly" w:date="2026-10-21T20:40:00Z" w16du:dateUtc="2026-10-21T19:40:00Z">
+        <w:bookmarkEnd w:id="157"/>
+      </w:ins>
+    </w:p>
+    <w:p>
+      <w:pPr>
+        <w:rPr>
+          <w:ins w:id="159" w:author="kyle O'Reilly" w:date="2026-10-21T20:40:00Z" w16du:dateUtc="2026-10-21T19:40:00Z"/>
+        </w:rPr>
+      </w:pPr>
+      <w:ins w:id="160" w:author="kyle O'Reilly" w:date="2026-10-21T20:40:00Z" w16du:dateUtc="2026-10-21T19:40:00Z">
         <w:r>
           <w:t>?</w:t>
         </w:r>
@@ -3336,7 +3340,7 @@
     <w:p>
       <w:pPr>
         <w:rPr>
-          <w:ins w:id="150" w:author="kyle O'Reilly" w:date="2026-10-21T20:40:00Z" w16du:dateUtc="2026-10-21T19:40:00Z"/>
+          <w:ins w:id="161" w:author="kyle O'Reilly" w:date="2026-10-21T20:40:00Z" w16du:dateUtc="2026-10-21T19:40:00Z"/>
         </w:rPr>
       </w:pPr>
     </w:p>
@@ -3346,102 +3350,102 @@
         <w:spacing w:line="360" w:lineRule="auto"/>
         <w:jc w:val="both"/>
         <w:rPr>
-          <w:ins w:id="151" w:author="kyle O'Reilly" w:date="2026-10-21T20:41:00Z" w16du:dateUtc="2026-10-21T19:41:00Z"/>
-        </w:rPr>
-        <w:pPrChange w:id="152" w:author="kyle O'Reilly" w:date="2026-10-22T00:14:00Z" w16du:dateUtc="2026-10-21T23:14:00Z">
+          <w:ins w:id="162" w:author="kyle O'Reilly" w:date="2026-10-21T20:41:00Z" w16du:dateUtc="2026-10-21T19:41:00Z"/>
+        </w:rPr>
+        <w:pPrChange w:id="163" w:author="kyle O'Reilly" w:date="2026-10-22T00:14:00Z" w16du:dateUtc="2026-10-21T23:14:00Z">
           <w:pPr/>
         </w:pPrChange>
       </w:pPr>
-      <w:bookmarkStart w:id="153" w:name="_Toc243520529"/>
-      <w:ins w:id="154" w:author="kyle O'Reilly" w:date="2026-10-21T20:41:00Z" w16du:dateUtc="2026-10-21T19:41:00Z">
+      <w:bookmarkStart w:id="164" w:name="_Toc243520529"/>
+      <w:ins w:id="165" w:author="kyle O'Reilly" w:date="2026-10-21T20:41:00Z" w16du:dateUtc="2026-10-21T19:41:00Z">
         <w:r>
           <w:t xml:space="preserve">7. </w:t>
         </w:r>
       </w:ins>
-      <w:ins w:id="155" w:author="kyle O'Reilly" w:date="2026-10-21T20:40:00Z" w16du:dateUtc="2026-10-21T19:40:00Z">
+      <w:ins w:id="166" w:author="kyle O'Reilly" w:date="2026-10-21T20:40:00Z" w16du:dateUtc="2026-10-21T19:40:00Z">
         <w:r>
           <w:t>Data Sources</w:t>
         </w:r>
       </w:ins>
-      <w:bookmarkEnd w:id="153"/>
+      <w:bookmarkEnd w:id="164"/>
     </w:p>
     <w:p>
       <w:pPr>
         <w:spacing w:line="360" w:lineRule="auto"/>
         <w:jc w:val="both"/>
         <w:rPr>
-          <w:ins w:id="156" w:author="kyle O'Reilly" w:date="2026-10-21T23:35:00Z" w16du:dateUtc="2026-10-21T22:35:00Z"/>
-        </w:rPr>
-        <w:pPrChange w:id="157" w:author="kyle O'Reilly" w:date="2026-10-22T00:14:00Z" w16du:dateUtc="2026-10-21T23:14:00Z">
+          <w:ins w:id="167" w:author="kyle O'Reilly" w:date="2026-10-21T23:35:00Z" w16du:dateUtc="2026-10-21T22:35:00Z"/>
+        </w:rPr>
+        <w:pPrChange w:id="168" w:author="kyle O'Reilly" w:date="2026-10-22T00:14:00Z" w16du:dateUtc="2026-10-21T23:14:00Z">
           <w:pPr/>
         </w:pPrChange>
       </w:pPr>
-      <w:ins w:id="158" w:author="kyle O'Reilly" w:date="2026-10-21T23:39:00Z" w16du:dateUtc="2026-10-21T22:39:00Z">
+      <w:ins w:id="169" w:author="kyle O'Reilly" w:date="2026-10-21T23:39:00Z" w16du:dateUtc="2026-10-21T22:39:00Z">
         <w:r>
           <w:t>Tradi</w:t>
         </w:r>
       </w:ins>
-      <w:ins w:id="159" w:author="kyle O'Reilly" w:date="2026-10-21T23:40:00Z" w16du:dateUtc="2026-10-21T22:40:00Z">
+      <w:ins w:id="170" w:author="kyle O'Reilly" w:date="2026-10-21T23:40:00Z" w16du:dateUtc="2026-10-21T22:40:00Z">
         <w:r>
           <w:t xml:space="preserve">ng 212 will be consulted to verify </w:t>
         </w:r>
       </w:ins>
-      <w:ins w:id="160" w:author="kyle O'Reilly" w:date="2026-10-21T23:46:00Z" w16du:dateUtc="2026-10-21T22:46:00Z">
+      <w:ins w:id="171" w:author="kyle O'Reilly" w:date="2026-10-21T23:46:00Z" w16du:dateUtc="2026-10-21T22:46:00Z">
         <w:r>
           <w:t xml:space="preserve">the </w:t>
         </w:r>
       </w:ins>
-      <w:ins w:id="161" w:author="kyle O'Reilly" w:date="2026-10-21T23:40:00Z" w16du:dateUtc="2026-10-21T22:40:00Z">
+      <w:ins w:id="172" w:author="kyle O'Reilly" w:date="2026-10-21T23:40:00Z" w16du:dateUtc="2026-10-21T22:40:00Z">
         <w:r>
           <w:t>volatility rating</w:t>
         </w:r>
       </w:ins>
-      <w:ins w:id="162" w:author="kyle O'Reilly" w:date="2026-10-21T23:41:00Z" w16du:dateUtc="2026-10-21T22:41:00Z">
+      <w:ins w:id="173" w:author="kyle O'Reilly" w:date="2026-10-21T23:41:00Z" w16du:dateUtc="2026-10-21T22:41:00Z">
         <w:r>
           <w:t>s</w:t>
         </w:r>
       </w:ins>
-      <w:ins w:id="163" w:author="kyle O'Reilly" w:date="2026-10-21T23:40:00Z" w16du:dateUtc="2026-10-21T22:40:00Z">
+      <w:ins w:id="174" w:author="kyle O'Reilly" w:date="2026-10-21T23:40:00Z" w16du:dateUtc="2026-10-21T22:40:00Z">
         <w:r>
           <w:t xml:space="preserve"> of</w:t>
         </w:r>
       </w:ins>
-      <w:ins w:id="164" w:author="kyle O'Reilly" w:date="2026-10-21T23:46:00Z" w16du:dateUtc="2026-10-21T22:46:00Z">
+      <w:ins w:id="175" w:author="kyle O'Reilly" w:date="2026-10-21T23:46:00Z" w16du:dateUtc="2026-10-21T22:46:00Z">
         <w:r>
           <w:t xml:space="preserve"> all the</w:t>
         </w:r>
       </w:ins>
-      <w:ins w:id="165" w:author="kyle O'Reilly" w:date="2026-10-21T23:40:00Z" w16du:dateUtc="2026-10-21T22:40:00Z">
+      <w:ins w:id="176" w:author="kyle O'Reilly" w:date="2026-10-21T23:40:00Z" w16du:dateUtc="2026-10-21T22:40:00Z">
         <w:r>
           <w:t xml:space="preserve"> three </w:t>
         </w:r>
       </w:ins>
-      <w:ins w:id="166" w:author="kyle O'Reilly" w:date="2026-10-21T23:46:00Z" w16du:dateUtc="2026-10-21T22:46:00Z">
+      <w:ins w:id="177" w:author="kyle O'Reilly" w:date="2026-10-21T23:46:00Z" w16du:dateUtc="2026-10-21T22:46:00Z">
         <w:r>
           <w:t xml:space="preserve">selected </w:t>
         </w:r>
       </w:ins>
-      <w:ins w:id="167" w:author="kyle O'Reilly" w:date="2026-10-21T23:40:00Z" w16du:dateUtc="2026-10-21T22:40:00Z">
+      <w:ins w:id="178" w:author="kyle O'Reilly" w:date="2026-10-21T23:40:00Z" w16du:dateUtc="2026-10-21T22:40:00Z">
         <w:r>
           <w:t>stocks.</w:t>
         </w:r>
       </w:ins>
-      <w:ins w:id="168" w:author="kyle O'Reilly" w:date="2026-10-21T23:38:00Z" w16du:dateUtc="2026-10-21T22:38:00Z">
+      <w:ins w:id="179" w:author="kyle O'Reilly" w:date="2026-10-21T23:38:00Z" w16du:dateUtc="2026-10-21T22:38:00Z">
         <w:r>
           <w:t xml:space="preserve"> </w:t>
         </w:r>
       </w:ins>
-      <w:ins w:id="169" w:author="kyle O'Reilly" w:date="2026-10-21T23:46:00Z" w16du:dateUtc="2026-10-21T22:46:00Z">
+      <w:ins w:id="180" w:author="kyle O'Reilly" w:date="2026-10-21T23:46:00Z" w16du:dateUtc="2026-10-21T22:46:00Z">
         <w:r>
           <w:t>JPM</w:t>
         </w:r>
       </w:ins>
-      <w:ins w:id="170" w:author="kyle O'Reilly" w:date="2026-10-21T23:54:00Z" w16du:dateUtc="2026-10-21T22:54:00Z">
+      <w:ins w:id="181" w:author="kyle O'Reilly" w:date="2026-10-21T23:54:00Z" w16du:dateUtc="2026-10-21T22:54:00Z">
         <w:r>
           <w:t>.US</w:t>
         </w:r>
       </w:ins>
-      <w:ins w:id="171" w:author="kyle O'Reilly" w:date="2026-10-21T23:46:00Z" w16du:dateUtc="2026-10-21T22:46:00Z">
+      <w:ins w:id="182" w:author="kyle O'Reilly" w:date="2026-10-21T23:46:00Z" w16du:dateUtc="2026-10-21T22:46:00Z">
         <w:r>
           <w:t xml:space="preserve"> (low)</w:t>
         </w:r>
@@ -3449,12 +3453,12 @@
           <w:t>, KO</w:t>
         </w:r>
       </w:ins>
-      <w:ins w:id="172" w:author="kyle O'Reilly" w:date="2026-10-21T23:54:00Z" w16du:dateUtc="2026-10-21T22:54:00Z">
+      <w:ins w:id="183" w:author="kyle O'Reilly" w:date="2026-10-21T23:54:00Z" w16du:dateUtc="2026-10-21T22:54:00Z">
         <w:r>
           <w:t>.US</w:t>
         </w:r>
       </w:ins>
-      <w:ins w:id="173" w:author="kyle O'Reilly" w:date="2026-10-21T23:46:00Z" w16du:dateUtc="2026-10-21T22:46:00Z">
+      <w:ins w:id="184" w:author="kyle O'Reilly" w:date="2026-10-21T23:46:00Z" w16du:dateUtc="2026-10-21T22:46:00Z">
         <w:r>
           <w:t xml:space="preserve"> (medium)</w:t>
         </w:r>
@@ -3462,72 +3466,72 @@
           <w:t>, and INTC</w:t>
         </w:r>
       </w:ins>
-      <w:ins w:id="174" w:author="kyle O'Reilly" w:date="2026-10-21T23:54:00Z" w16du:dateUtc="2026-10-21T22:54:00Z">
+      <w:ins w:id="185" w:author="kyle O'Reilly" w:date="2026-10-21T23:54:00Z" w16du:dateUtc="2026-10-21T22:54:00Z">
         <w:r>
           <w:t>.US</w:t>
         </w:r>
       </w:ins>
-      <w:ins w:id="175" w:author="kyle O'Reilly" w:date="2026-10-21T23:47:00Z" w16du:dateUtc="2026-10-21T22:47:00Z">
+      <w:ins w:id="186" w:author="kyle O'Reilly" w:date="2026-10-21T23:47:00Z" w16du:dateUtc="2026-10-21T22:47:00Z">
         <w:r>
           <w:t xml:space="preserve"> (high), as displayed on the trading 212 platform</w:t>
         </w:r>
       </w:ins>
-      <w:ins w:id="176" w:author="kyle O'Reilly" w:date="2026-10-21T23:46:00Z" w16du:dateUtc="2026-10-21T22:46:00Z">
+      <w:ins w:id="187" w:author="kyle O'Reilly" w:date="2026-10-21T23:46:00Z" w16du:dateUtc="2026-10-21T22:46:00Z">
         <w:r>
           <w:t xml:space="preserve"> </w:t>
         </w:r>
       </w:ins>
-      <w:ins w:id="177" w:author="kyle O'Reilly" w:date="2026-10-21T23:38:00Z" w16du:dateUtc="2026-10-21T22:38:00Z">
+      <w:ins w:id="188" w:author="kyle O'Reilly" w:date="2026-10-21T23:38:00Z" w16du:dateUtc="2026-10-21T22:38:00Z">
         <w:r>
           <w:t>(</w:t>
         </w:r>
       </w:ins>
-      <w:ins w:id="178" w:author="kyle O'Reilly" w:date="2026-10-21T23:44:00Z" w16du:dateUtc="2026-10-21T22:44:00Z">
+      <w:ins w:id="189" w:author="kyle O'Reilly" w:date="2026-10-21T23:44:00Z" w16du:dateUtc="2026-10-21T22:44:00Z">
         <w:r>
           <w:t>Trading 212, n.d.)</w:t>
         </w:r>
       </w:ins>
-      <w:ins w:id="179" w:author="kyle O'Reilly" w:date="2026-10-21T23:47:00Z" w16du:dateUtc="2026-10-21T22:47:00Z">
+      <w:ins w:id="190" w:author="kyle O'Reilly" w:date="2026-10-21T23:47:00Z" w16du:dateUtc="2026-10-21T22:47:00Z">
         <w:r>
           <w:t xml:space="preserve">. Screenshots of </w:t>
         </w:r>
       </w:ins>
-      <w:ins w:id="180" w:author="kyle O'Reilly" w:date="2026-10-22T00:01:00Z" w16du:dateUtc="2026-10-21T23:01:00Z">
+      <w:ins w:id="191" w:author="kyle O'Reilly" w:date="2026-10-22T00:01:00Z" w16du:dateUtc="2026-10-21T23:01:00Z">
         <w:r>
           <w:t>each stock’s volatility</w:t>
         </w:r>
       </w:ins>
-      <w:ins w:id="181" w:author="kyle O'Reilly" w:date="2026-10-21T23:47:00Z" w16du:dateUtc="2026-10-21T22:47:00Z">
+      <w:ins w:id="192" w:author="kyle O'Reilly" w:date="2026-10-21T23:47:00Z" w16du:dateUtc="2026-10-21T22:47:00Z">
         <w:r>
           <w:t xml:space="preserve"> </w:t>
         </w:r>
       </w:ins>
-      <w:ins w:id="182" w:author="kyle O'Reilly" w:date="2026-10-22T00:01:00Z" w16du:dateUtc="2026-10-21T23:01:00Z">
+      <w:ins w:id="193" w:author="kyle O'Reilly" w:date="2026-10-22T00:01:00Z" w16du:dateUtc="2026-10-21T23:01:00Z">
         <w:r>
           <w:t xml:space="preserve">risk </w:t>
         </w:r>
       </w:ins>
-      <w:ins w:id="183" w:author="kyle O'Reilly" w:date="2026-10-21T23:47:00Z" w16du:dateUtc="2026-10-21T22:47:00Z">
+      <w:ins w:id="194" w:author="kyle O'Reilly" w:date="2026-10-21T23:47:00Z" w16du:dateUtc="2026-10-21T22:47:00Z">
         <w:r>
           <w:t>rating</w:t>
         </w:r>
       </w:ins>
-      <w:ins w:id="184" w:author="kyle O'Reilly" w:date="2026-10-22T00:01:00Z" w16du:dateUtc="2026-10-21T23:01:00Z">
+      <w:ins w:id="195" w:author="kyle O'Reilly" w:date="2026-10-22T00:01:00Z" w16du:dateUtc="2026-10-21T23:01:00Z">
         <w:r>
           <w:t xml:space="preserve"> </w:t>
         </w:r>
       </w:ins>
-      <w:ins w:id="185" w:author="kyle O'Reilly" w:date="2026-10-21T23:47:00Z" w16du:dateUtc="2026-10-21T22:47:00Z">
+      <w:ins w:id="196" w:author="kyle O'Reilly" w:date="2026-10-21T23:47:00Z" w16du:dateUtc="2026-10-21T22:47:00Z">
         <w:r>
           <w:t xml:space="preserve">will be provided in Appendix A to support the stock </w:t>
         </w:r>
       </w:ins>
-      <w:ins w:id="186" w:author="kyle O'Reilly" w:date="2026-10-21T23:48:00Z" w16du:dateUtc="2026-10-21T22:48:00Z">
+      <w:ins w:id="197" w:author="kyle O'Reilly" w:date="2026-10-21T23:48:00Z" w16du:dateUtc="2026-10-21T22:48:00Z">
         <w:r>
           <w:t>selection</w:t>
         </w:r>
       </w:ins>
-      <w:ins w:id="187" w:author="kyle O'Reilly" w:date="2026-10-21T23:47:00Z" w16du:dateUtc="2026-10-21T22:47:00Z">
+      <w:ins w:id="198" w:author="kyle O'Reilly" w:date="2026-10-21T23:47:00Z" w16du:dateUtc="2026-10-21T22:47:00Z">
         <w:r>
           <w:t>.</w:t>
         </w:r>
@@ -3538,53 +3542,53 @@
         <w:spacing w:line="360" w:lineRule="auto"/>
         <w:jc w:val="both"/>
         <w:rPr>
-          <w:ins w:id="188" w:author="kyle O'Reilly" w:date="2026-10-21T20:41:00Z" w16du:dateUtc="2026-10-21T19:41:00Z"/>
-        </w:rPr>
-        <w:pPrChange w:id="189" w:author="kyle O'Reilly" w:date="2026-10-22T00:14:00Z" w16du:dateUtc="2026-10-21T23:14:00Z">
+          <w:ins w:id="199" w:author="kyle O'Reilly" w:date="2026-10-21T20:41:00Z" w16du:dateUtc="2026-10-21T19:41:00Z"/>
+        </w:rPr>
+        <w:pPrChange w:id="200" w:author="kyle O'Reilly" w:date="2026-10-22T00:14:00Z" w16du:dateUtc="2026-10-21T23:14:00Z">
           <w:pPr/>
         </w:pPrChange>
       </w:pPr>
-      <w:ins w:id="190" w:author="kyle O'Reilly" w:date="2026-10-21T23:28:00Z" w16du:dateUtc="2026-10-21T22:28:00Z">
+      <w:ins w:id="201" w:author="kyle O'Reilly" w:date="2026-10-21T23:28:00Z" w16du:dateUtc="2026-10-21T22:28:00Z">
         <w:r>
           <w:t xml:space="preserve">Stooq will be </w:t>
         </w:r>
       </w:ins>
-      <w:ins w:id="191" w:author="kyle O'Reilly" w:date="2026-10-21T23:58:00Z" w16du:dateUtc="2026-10-21T22:58:00Z">
+      <w:ins w:id="202" w:author="kyle O'Reilly" w:date="2026-10-21T23:58:00Z" w16du:dateUtc="2026-10-21T22:58:00Z">
         <w:r>
           <w:t>used to obtain</w:t>
         </w:r>
       </w:ins>
-      <w:ins w:id="192" w:author="kyle O'Reilly" w:date="2026-10-21T23:28:00Z" w16du:dateUtc="2026-10-21T22:28:00Z">
+      <w:ins w:id="203" w:author="kyle O'Reilly" w:date="2026-10-21T23:28:00Z" w16du:dateUtc="2026-10-21T22:28:00Z">
         <w:r>
           <w:t xml:space="preserve"> downloadable historical stock data for JPM</w:t>
         </w:r>
       </w:ins>
-      <w:ins w:id="193" w:author="kyle O'Reilly" w:date="2026-10-21T23:58:00Z" w16du:dateUtc="2026-10-21T22:58:00Z">
+      <w:ins w:id="204" w:author="kyle O'Reilly" w:date="2026-10-21T23:58:00Z" w16du:dateUtc="2026-10-21T22:58:00Z">
         <w:r>
           <w:t>.US</w:t>
         </w:r>
       </w:ins>
-      <w:ins w:id="194" w:author="kyle O'Reilly" w:date="2026-10-21T23:28:00Z" w16du:dateUtc="2026-10-21T22:28:00Z">
+      <w:ins w:id="205" w:author="kyle O'Reilly" w:date="2026-10-21T23:28:00Z" w16du:dateUtc="2026-10-21T22:28:00Z">
         <w:r>
           <w:t>, KO</w:t>
         </w:r>
       </w:ins>
-      <w:ins w:id="195" w:author="kyle O'Reilly" w:date="2026-10-21T23:58:00Z" w16du:dateUtc="2026-10-21T22:58:00Z">
+      <w:ins w:id="206" w:author="kyle O'Reilly" w:date="2026-10-21T23:58:00Z" w16du:dateUtc="2026-10-21T22:58:00Z">
         <w:r>
           <w:t>.US</w:t>
         </w:r>
       </w:ins>
-      <w:ins w:id="196" w:author="kyle O'Reilly" w:date="2026-10-21T23:28:00Z" w16du:dateUtc="2026-10-21T22:28:00Z">
+      <w:ins w:id="207" w:author="kyle O'Reilly" w:date="2026-10-21T23:28:00Z" w16du:dateUtc="2026-10-21T22:28:00Z">
         <w:r>
           <w:t xml:space="preserve"> and INTC</w:t>
         </w:r>
       </w:ins>
-      <w:ins w:id="197" w:author="kyle O'Reilly" w:date="2026-10-21T23:58:00Z" w16du:dateUtc="2026-10-21T22:58:00Z">
+      <w:ins w:id="208" w:author="kyle O'Reilly" w:date="2026-10-21T23:58:00Z" w16du:dateUtc="2026-10-21T22:58:00Z">
         <w:r>
           <w:t>.US</w:t>
         </w:r>
       </w:ins>
-      <w:ins w:id="198" w:author="kyle O'Reilly" w:date="2026-10-21T23:59:00Z" w16du:dateUtc="2026-10-21T22:59:00Z">
+      <w:ins w:id="209" w:author="kyle O'Reilly" w:date="2026-10-21T23:59:00Z" w16du:dateUtc="2026-10-21T22:59:00Z">
         <w:r>
           <w:t xml:space="preserve"> (Stooq</w:t>
         </w:r>
@@ -3592,17 +3596,17 @@
           <w:t>, n.d.a; Stooq, n.d.b</w:t>
         </w:r>
       </w:ins>
-      <w:ins w:id="199" w:author="kyle O'Reilly" w:date="2026-10-22T00:00:00Z" w16du:dateUtc="2026-10-21T23:00:00Z">
+      <w:ins w:id="210" w:author="kyle O'Reilly" w:date="2026-10-22T00:00:00Z" w16du:dateUtc="2026-10-21T23:00:00Z">
         <w:r>
           <w:t>; Stooq, n.d.c).</w:t>
         </w:r>
       </w:ins>
-      <w:ins w:id="200" w:author="kyle O'Reilly" w:date="2026-10-21T23:28:00Z" w16du:dateUtc="2026-10-21T22:28:00Z">
+      <w:ins w:id="211" w:author="kyle O'Reilly" w:date="2026-10-21T23:28:00Z" w16du:dateUtc="2026-10-21T22:28:00Z">
         <w:r>
           <w:t xml:space="preserve"> The </w:t>
         </w:r>
       </w:ins>
-      <w:ins w:id="201" w:author="kyle O'Reilly" w:date="2026-10-22T00:00:00Z" w16du:dateUtc="2026-10-21T23:00:00Z">
+      <w:ins w:id="212" w:author="kyle O'Reilly" w:date="2026-10-22T00:00:00Z" w16du:dateUtc="2026-10-21T23:00:00Z">
         <w:r>
           <w:t xml:space="preserve">independent </w:t>
         </w:r>
@@ -3610,7 +3614,7 @@
           <w:t xml:space="preserve">dataset </w:t>
         </w:r>
       </w:ins>
-      <w:ins w:id="202" w:author="kyle O'Reilly" w:date="2026-10-21T23:28:00Z" w16du:dateUtc="2026-10-21T22:28:00Z">
+      <w:ins w:id="213" w:author="kyle O'Reilly" w:date="2026-10-21T23:28:00Z" w16du:dateUtc="2026-10-21T22:28:00Z">
         <w:r>
           <w:t xml:space="preserve">variables </w:t>
         </w:r>
@@ -3618,17 +3622,17 @@
           <w:t>will</w:t>
         </w:r>
       </w:ins>
-      <w:ins w:id="203" w:author="kyle O'Reilly" w:date="2026-10-22T00:00:00Z" w16du:dateUtc="2026-10-21T23:00:00Z">
+      <w:ins w:id="214" w:author="kyle O'Reilly" w:date="2026-10-22T00:00:00Z" w16du:dateUtc="2026-10-21T23:00:00Z">
         <w:r>
           <w:t xml:space="preserve"> include</w:t>
         </w:r>
       </w:ins>
-      <w:ins w:id="204" w:author="kyle O'Reilly" w:date="2026-10-21T23:28:00Z" w16du:dateUtc="2026-10-21T22:28:00Z">
+      <w:ins w:id="215" w:author="kyle O'Reilly" w:date="2026-10-21T23:28:00Z" w16du:dateUtc="2026-10-21T22:28:00Z">
         <w:r>
           <w:t xml:space="preserve"> </w:t>
         </w:r>
       </w:ins>
-      <w:ins w:id="205" w:author="kyle O'Reilly" w:date="2026-10-21T23:31:00Z" w16du:dateUtc="2026-10-21T22:31:00Z">
+      <w:ins w:id="216" w:author="kyle O'Reilly" w:date="2026-10-21T23:31:00Z" w16du:dateUtc="2026-10-21T22:31:00Z">
         <w:r>
           <w:t xml:space="preserve">sequential index number, </w:t>
         </w:r>
@@ -3636,62 +3640,62 @@
           <w:t>the cale</w:t>
         </w:r>
       </w:ins>
-      <w:ins w:id="206" w:author="kyle O'Reilly" w:date="2026-10-21T23:32:00Z" w16du:dateUtc="2026-10-21T22:32:00Z">
+      <w:ins w:id="217" w:author="kyle O'Reilly" w:date="2026-10-21T23:32:00Z" w16du:dateUtc="2026-10-21T22:32:00Z">
         <w:r>
           <w:t xml:space="preserve">ndar date, the opening price, the maximum </w:t>
         </w:r>
       </w:ins>
-      <w:ins w:id="207" w:author="kyle O'Reilly" w:date="2026-10-22T00:01:00Z" w16du:dateUtc="2026-10-21T23:01:00Z">
+      <w:ins w:id="218" w:author="kyle O'Reilly" w:date="2026-10-22T00:01:00Z" w16du:dateUtc="2026-10-21T23:01:00Z">
         <w:r>
           <w:t xml:space="preserve">and minimum </w:t>
         </w:r>
       </w:ins>
-      <w:ins w:id="208" w:author="kyle O'Reilly" w:date="2026-10-21T23:32:00Z" w16du:dateUtc="2026-10-21T22:32:00Z">
+      <w:ins w:id="219" w:author="kyle O'Reilly" w:date="2026-10-21T23:32:00Z" w16du:dateUtc="2026-10-21T22:32:00Z">
         <w:r>
           <w:t>price</w:t>
         </w:r>
       </w:ins>
-      <w:ins w:id="209" w:author="kyle O'Reilly" w:date="2026-10-22T00:01:00Z" w16du:dateUtc="2026-10-21T23:01:00Z">
+      <w:ins w:id="220" w:author="kyle O'Reilly" w:date="2026-10-22T00:01:00Z" w16du:dateUtc="2026-10-21T23:01:00Z">
         <w:r>
           <w:t>s</w:t>
         </w:r>
       </w:ins>
-      <w:ins w:id="210" w:author="kyle O'Reilly" w:date="2026-10-21T23:32:00Z" w16du:dateUtc="2026-10-21T22:32:00Z">
+      <w:ins w:id="221" w:author="kyle O'Reilly" w:date="2026-10-21T23:32:00Z" w16du:dateUtc="2026-10-21T22:32:00Z">
         <w:r>
           <w:t xml:space="preserve"> the stock reached </w:t>
         </w:r>
       </w:ins>
-      <w:ins w:id="211" w:author="kyle O'Reilly" w:date="2026-10-22T00:02:00Z" w16du:dateUtc="2026-10-21T23:02:00Z">
+      <w:ins w:id="222" w:author="kyle O'Reilly" w:date="2026-10-22T00:02:00Z" w16du:dateUtc="2026-10-21T23:02:00Z">
         <w:r>
           <w:t>during each trading</w:t>
         </w:r>
       </w:ins>
-      <w:ins w:id="212" w:author="kyle O'Reilly" w:date="2026-10-21T23:32:00Z" w16du:dateUtc="2026-10-21T22:32:00Z">
+      <w:ins w:id="223" w:author="kyle O'Reilly" w:date="2026-10-21T23:32:00Z" w16du:dateUtc="2026-10-21T22:32:00Z">
         <w:r>
           <w:t xml:space="preserve"> date,</w:t>
         </w:r>
       </w:ins>
-      <w:ins w:id="213" w:author="kyle O'Reilly" w:date="2026-10-21T23:33:00Z" w16du:dateUtc="2026-10-21T22:33:00Z">
+      <w:ins w:id="224" w:author="kyle O'Reilly" w:date="2026-10-21T23:33:00Z" w16du:dateUtc="2026-10-21T22:33:00Z">
         <w:r>
           <w:t xml:space="preserve"> closing price,</w:t>
         </w:r>
       </w:ins>
-      <w:ins w:id="214" w:author="kyle O'Reilly" w:date="2026-10-22T00:02:00Z" w16du:dateUtc="2026-10-21T23:02:00Z">
+      <w:ins w:id="225" w:author="kyle O'Reilly" w:date="2026-10-22T00:02:00Z" w16du:dateUtc="2026-10-21T23:02:00Z">
         <w:r>
           <w:t xml:space="preserve"> daily </w:t>
         </w:r>
       </w:ins>
-      <w:ins w:id="215" w:author="kyle O'Reilly" w:date="2026-10-22T00:03:00Z" w16du:dateUtc="2026-10-21T23:03:00Z">
+      <w:ins w:id="226" w:author="kyle O'Reilly" w:date="2026-10-22T00:03:00Z" w16du:dateUtc="2026-10-21T23:03:00Z">
         <w:r>
           <w:t>percentage</w:t>
         </w:r>
       </w:ins>
-      <w:ins w:id="216" w:author="kyle O'Reilly" w:date="2026-10-22T00:02:00Z" w16du:dateUtc="2026-10-21T23:02:00Z">
+      <w:ins w:id="227" w:author="kyle O'Reilly" w:date="2026-10-22T00:02:00Z" w16du:dateUtc="2026-10-21T23:02:00Z">
         <w:r>
           <w:t xml:space="preserve"> and a</w:t>
         </w:r>
       </w:ins>
-      <w:ins w:id="217" w:author="kyle O'Reilly" w:date="2026-10-22T00:03:00Z" w16du:dateUtc="2026-10-21T23:03:00Z">
+      <w:ins w:id="228" w:author="kyle O'Reilly" w:date="2026-10-22T00:03:00Z" w16du:dateUtc="2026-10-21T23:03:00Z">
         <w:r>
           <w:t>bsolute price change compared with the previous day’s closing price</w:t>
         </w:r>
@@ -3699,17 +3703,17 @@
           <w:t>,</w:t>
         </w:r>
       </w:ins>
-      <w:ins w:id="218" w:author="kyle O'Reilly" w:date="2026-10-21T23:33:00Z" w16du:dateUtc="2026-10-21T22:33:00Z">
+      <w:ins w:id="229" w:author="kyle O'Reilly" w:date="2026-10-21T23:33:00Z" w16du:dateUtc="2026-10-21T22:33:00Z">
         <w:r>
           <w:t xml:space="preserve"> and </w:t>
         </w:r>
       </w:ins>
-      <w:ins w:id="219" w:author="kyle O'Reilly" w:date="2026-10-21T23:34:00Z" w16du:dateUtc="2026-10-21T22:34:00Z">
+      <w:ins w:id="230" w:author="kyle O'Reilly" w:date="2026-10-21T23:34:00Z" w16du:dateUtc="2026-10-21T22:34:00Z">
         <w:r>
           <w:t xml:space="preserve">the total number of shares traded </w:t>
         </w:r>
       </w:ins>
-      <w:ins w:id="220" w:author="kyle O'Reilly" w:date="2026-10-22T00:03:00Z" w16du:dateUtc="2026-10-21T23:03:00Z">
+      <w:ins w:id="231" w:author="kyle O'Reilly" w:date="2026-10-22T00:03:00Z" w16du:dateUtc="2026-10-21T23:03:00Z">
         <w:r>
           <w:t>each date.</w:t>
         </w:r>
@@ -3718,73 +3722,7 @@
     <w:p>
       <w:pPr>
         <w:rPr>
-          <w:ins w:id="221" w:author="kyle O'Reilly" w:date="2026-10-21T20:41:00Z" w16du:dateUtc="2026-10-21T19:41:00Z"/>
-        </w:rPr>
-      </w:pPr>
-    </w:p>
-    <w:p>
-      <w:pPr>
-        <w:pStyle w:val="Heading1"/>
-        <w:rPr>
-          <w:ins w:id="222" w:author="kyle O'Reilly" w:date="2026-10-21T20:41:00Z" w16du:dateUtc="2026-10-21T19:41:00Z"/>
-        </w:rPr>
-        <w:pPrChange w:id="223" w:author="kyle O'Reilly" w:date="2026-10-21T20:41:00Z" w16du:dateUtc="2026-10-21T19:41:00Z">
-          <w:pPr/>
-        </w:pPrChange>
-      </w:pPr>
-      <w:bookmarkStart w:id="224" w:name="_Toc243520530"/>
-      <w:ins w:id="225" w:author="kyle O'Reilly" w:date="2026-10-21T20:41:00Z" w16du:dateUtc="2026-10-21T19:41:00Z">
-        <w:r>
-          <w:t>8. Expected Deliverables</w:t>
-        </w:r>
-        <w:bookmarkEnd w:id="224"/>
-      </w:ins>
-    </w:p>
-    <w:p>
-      <w:pPr>
-        <w:rPr>
-          <w:ins w:id="226" w:author="kyle O'Reilly" w:date="2026-10-21T20:41:00Z" w16du:dateUtc="2026-10-21T19:41:00Z"/>
-        </w:rPr>
-      </w:pPr>
-      <w:ins w:id="227" w:author="kyle O'Reilly" w:date="2026-10-21T20:41:00Z" w16du:dateUtc="2026-10-21T19:41:00Z">
-        <w:r>
-          <w:t>?</w:t>
-        </w:r>
-      </w:ins>
-    </w:p>
-    <w:p>
-      <w:pPr>
-        <w:rPr>
-          <w:ins w:id="228" w:author="kyle O'Reilly" w:date="2026-10-21T20:41:00Z" w16du:dateUtc="2026-10-21T19:41:00Z"/>
-        </w:rPr>
-      </w:pPr>
-    </w:p>
-    <w:p>
-      <w:pPr>
-        <w:pStyle w:val="Heading1"/>
-        <w:pPrChange w:id="229" w:author="kyle O'Reilly" w:date="2026-10-21T20:41:00Z" w16du:dateUtc="2026-10-21T19:41:00Z">
-          <w:pPr/>
-        </w:pPrChange>
-      </w:pPr>
-      <w:bookmarkStart w:id="230" w:name="_Toc243520531"/>
-      <w:ins w:id="231" w:author="kyle O'Reilly" w:date="2026-10-21T20:41:00Z" w16du:dateUtc="2026-10-21T19:41:00Z">
-        <w:r>
-          <w:t>9. Project Timeline</w:t>
-        </w:r>
-      </w:ins>
-      <w:bookmarkEnd w:id="230"/>
-    </w:p>
-    <w:p>
-      <w:ins w:id="232" w:author="kyle O'Reilly" w:date="2026-10-21T20:41:00Z" w16du:dateUtc="2026-10-21T19:41:00Z">
-        <w:r>
-          <w:t>?</w:t>
-        </w:r>
-      </w:ins>
-    </w:p>
-    <w:p>
-      <w:pPr>
-        <w:rPr>
-          <w:ins w:id="233" w:author="kyle O'Reilly" w:date="2026-10-21T20:41:00Z" w16du:dateUtc="2026-10-21T19:41:00Z"/>
+          <w:ins w:id="232" w:author="kyle O'Reilly" w:date="2026-10-21T20:41:00Z" w16du:dateUtc="2026-10-21T19:41:00Z"/>
         </w:rPr>
       </w:pPr>
     </w:p>
@@ -3794,19 +3732,18 @@
         <w:spacing w:line="360" w:lineRule="auto"/>
         <w:jc w:val="both"/>
         <w:rPr>
-          <w:ins w:id="234" w:author="kyle O'Reilly" w:date="2026-10-21T20:41:00Z" w16du:dateUtc="2026-10-21T19:41:00Z"/>
-        </w:rPr>
-        <w:pPrChange w:id="235" w:author="kyle O'Reilly" w:date="2026-10-21T23:07:00Z" w16du:dateUtc="2026-10-21T22:07:00Z">
+          <w:ins w:id="233" w:author="kyle O'Reilly" w:date="2026-10-21T20:41:00Z" w16du:dateUtc="2026-10-21T19:41:00Z"/>
+        </w:rPr>
+        <w:pPrChange w:id="234" w:author="kyle O'Reilly" w:date="2026-10-22T18:09:00Z" w16du:dateUtc="2026-10-22T17:09:00Z">
           <w:pPr/>
         </w:pPrChange>
       </w:pPr>
-      <w:bookmarkStart w:id="236" w:name="_Toc243520532"/>
-      <w:ins w:id="237" w:author="kyle O'Reilly" w:date="2026-10-21T20:41:00Z" w16du:dateUtc="2026-10-21T19:41:00Z">
-        <w:r>
-          <w:lastRenderedPageBreak/>
-          <w:t>10. Ethical and Legal Considerations</w:t>
-        </w:r>
-        <w:bookmarkEnd w:id="236"/>
+      <w:bookmarkStart w:id="235" w:name="_Toc243520530"/>
+      <w:ins w:id="236" w:author="kyle O'Reilly" w:date="2026-10-21T20:41:00Z" w16du:dateUtc="2026-10-21T19:41:00Z">
+        <w:r>
+          <w:t>8. Expected Deliverables</w:t>
+        </w:r>
+        <w:bookmarkEnd w:id="235"/>
       </w:ins>
     </w:p>
     <w:p>
@@ -3814,273 +3751,386 @@
         <w:spacing w:line="360" w:lineRule="auto"/>
         <w:jc w:val="both"/>
         <w:rPr>
-          <w:ins w:id="238" w:author="kyle O'Reilly" w:date="2026-10-21T20:46:00Z" w16du:dateUtc="2026-10-21T19:46:00Z"/>
-        </w:rPr>
-        <w:pPrChange w:id="239" w:author="kyle O'Reilly" w:date="2026-10-21T23:07:00Z" w16du:dateUtc="2026-10-21T22:07:00Z">
+          <w:ins w:id="237" w:author="kyle O'Reilly" w:date="2026-10-21T20:41:00Z" w16du:dateUtc="2026-10-21T19:41:00Z"/>
+        </w:rPr>
+        <w:pPrChange w:id="238" w:author="kyle O'Reilly" w:date="2026-10-22T18:09:00Z" w16du:dateUtc="2026-10-22T17:09:00Z">
           <w:pPr/>
         </w:pPrChange>
       </w:pPr>
-      <w:ins w:id="240" w:author="kyle O'Reilly" w:date="2026-10-21T20:42:00Z" w16du:dateUtc="2026-10-21T19:42:00Z">
-        <w:r>
-          <w:t>This C</w:t>
-        </w:r>
-      </w:ins>
-      <w:ins w:id="241" w:author="kyle O'Reilly" w:date="2026-10-21T20:43:00Z" w16du:dateUtc="2026-10-21T19:43:00Z">
-        <w:r>
-          <w:t xml:space="preserve">apstone Project will use </w:t>
-        </w:r>
-        <w:r>
-          <w:t xml:space="preserve">publicly available </w:t>
-        </w:r>
-        <w:r>
-          <w:t>historical stock</w:t>
-        </w:r>
-      </w:ins>
-      <w:ins w:id="242" w:author="kyle O'Reilly" w:date="2026-10-21T22:01:00Z" w16du:dateUtc="2026-10-21T21:01:00Z">
-        <w:r>
-          <w:t xml:space="preserve"> </w:t>
-        </w:r>
-      </w:ins>
-      <w:ins w:id="243" w:author="kyle O'Reilly" w:date="2026-10-21T20:43:00Z" w16du:dateUtc="2026-10-21T19:43:00Z">
-        <w:r>
-          <w:t xml:space="preserve">data </w:t>
-        </w:r>
-        <w:r>
-          <w:t xml:space="preserve">and will not </w:t>
-        </w:r>
-        <w:r>
-          <w:t xml:space="preserve">collect personal information or involve human </w:t>
-        </w:r>
-      </w:ins>
-      <w:ins w:id="244" w:author="kyle O'Reilly" w:date="2026-10-21T20:44:00Z" w16du:dateUtc="2026-10-21T19:44:00Z">
-        <w:r>
-          <w:t>participants. Stooq data access and usage conditions, and any Trading 212</w:t>
-        </w:r>
-        <w:r>
-          <w:t xml:space="preserve"> information reused in the report, will be reviewed and appropriately attributed</w:t>
-        </w:r>
-      </w:ins>
-      <w:ins w:id="245" w:author="kyle O'Reilly" w:date="2026-10-21T20:45:00Z" w16du:dateUtc="2026-10-21T19:45:00Z">
-        <w:r>
-          <w:t xml:space="preserve">. Historical stock </w:t>
-        </w:r>
-      </w:ins>
-      <w:ins w:id="246" w:author="kyle O'Reilly" w:date="2026-10-21T22:03:00Z" w16du:dateUtc="2026-10-21T21:03:00Z">
-        <w:r>
-          <w:t xml:space="preserve">market </w:t>
-        </w:r>
-      </w:ins>
-      <w:ins w:id="247" w:author="kyle O'Reilly" w:date="2026-10-21T20:45:00Z" w16du:dateUtc="2026-10-21T19:45:00Z">
-        <w:r>
-          <w:t xml:space="preserve">data </w:t>
-        </w:r>
-      </w:ins>
-      <w:ins w:id="248" w:author="kyle O'Reilly" w:date="2026-10-21T22:11:00Z" w16du:dateUtc="2026-10-21T21:11:00Z">
-        <w:r>
-          <w:t>Comma</w:t>
-        </w:r>
-        <w:r>
-          <w:t xml:space="preserve">-Separated Values </w:t>
-        </w:r>
-        <w:r>
-          <w:t>(</w:t>
-        </w:r>
-      </w:ins>
-      <w:ins w:id="249" w:author="kyle O'Reilly" w:date="2026-10-21T22:05:00Z" w16du:dateUtc="2026-10-21T21:05:00Z">
-        <w:r>
-          <w:t>CSV</w:t>
-        </w:r>
-      </w:ins>
-      <w:ins w:id="250" w:author="kyle O'Reilly" w:date="2026-10-21T22:11:00Z" w16du:dateUtc="2026-10-21T21:11:00Z">
-        <w:r>
-          <w:t>)</w:t>
-        </w:r>
-      </w:ins>
-      <w:ins w:id="251" w:author="kyle O'Reilly" w:date="2026-10-21T22:05:00Z" w16du:dateUtc="2026-10-21T21:05:00Z">
-        <w:r>
-          <w:t xml:space="preserve"> </w:t>
-        </w:r>
-      </w:ins>
-      <w:ins w:id="252" w:author="kyle O'Reilly" w:date="2026-10-21T20:45:00Z" w16du:dateUtc="2026-10-21T19:45:00Z">
-        <w:r>
-          <w:t>files</w:t>
-        </w:r>
-      </w:ins>
-      <w:ins w:id="253" w:author="kyle O'Reilly" w:date="2026-10-21T22:07:00Z" w16du:dateUtc="2026-10-21T21:07:00Z">
-        <w:r>
-          <w:t xml:space="preserve"> downloaded from S</w:t>
-        </w:r>
-      </w:ins>
-      <w:ins w:id="254" w:author="kyle O'Reilly" w:date="2026-10-21T22:08:00Z" w16du:dateUtc="2026-10-21T21:08:00Z">
-        <w:r>
-          <w:t>tooq</w:t>
-        </w:r>
-      </w:ins>
-      <w:ins w:id="255" w:author="kyle O'Reilly" w:date="2026-10-21T20:45:00Z" w16du:dateUtc="2026-10-21T19:45:00Z">
-        <w:r>
-          <w:t xml:space="preserve"> </w:t>
-        </w:r>
-        <w:r>
-          <w:t xml:space="preserve">will only be </w:t>
-        </w:r>
-      </w:ins>
-      <w:ins w:id="256" w:author="kyle O'Reilly" w:date="2026-10-21T22:08:00Z" w16du:dateUtc="2026-10-21T21:08:00Z">
-        <w:r>
-          <w:t>uploaded to</w:t>
-        </w:r>
-      </w:ins>
-      <w:ins w:id="257" w:author="kyle O'Reilly" w:date="2026-10-21T20:45:00Z" w16du:dateUtc="2026-10-21T19:45:00Z">
-        <w:r>
-          <w:t xml:space="preserve"> </w:t>
-        </w:r>
-      </w:ins>
-      <w:ins w:id="258" w:author="kyle O'Reilly" w:date="2026-10-21T20:48:00Z" w16du:dateUtc="2026-10-21T19:48:00Z">
-        <w:r>
-          <w:t>GitHub</w:t>
-        </w:r>
-      </w:ins>
-      <w:ins w:id="259" w:author="kyle O'Reilly" w:date="2026-10-21T20:45:00Z" w16du:dateUtc="2026-10-21T19:45:00Z">
-        <w:r>
-          <w:t xml:space="preserve"> </w:t>
-        </w:r>
-      </w:ins>
-      <w:ins w:id="260" w:author="kyle O'Reilly" w:date="2026-10-21T22:07:00Z" w16du:dateUtc="2026-10-21T21:07:00Z">
-        <w:r>
-          <w:t>if permitted by Stooq’s terms of service</w:t>
-        </w:r>
-      </w:ins>
-      <w:ins w:id="261" w:author="kyle O'Reilly" w:date="2026-10-21T20:45:00Z" w16du:dateUtc="2026-10-21T19:45:00Z">
-        <w:r>
-          <w:t xml:space="preserve">; otherwise, </w:t>
-        </w:r>
-      </w:ins>
-      <w:ins w:id="262" w:author="kyle O'Reilly" w:date="2026-10-21T22:07:00Z" w16du:dateUtc="2026-10-21T21:07:00Z">
-        <w:r>
-          <w:t xml:space="preserve">the </w:t>
-        </w:r>
-        <w:r>
-          <w:t>Pyt</w:t>
-        </w:r>
-      </w:ins>
-      <w:ins w:id="263" w:author="kyle O'Reilly" w:date="2026-10-22T00:14:00Z" w16du:dateUtc="2026-10-21T23:14:00Z">
-        <w:r>
-          <w:t>h</w:t>
-        </w:r>
-      </w:ins>
-      <w:ins w:id="264" w:author="kyle O'Reilly" w:date="2026-10-21T22:07:00Z" w16du:dateUtc="2026-10-21T21:07:00Z">
-        <w:r>
-          <w:t xml:space="preserve">on </w:t>
-        </w:r>
-      </w:ins>
-      <w:ins w:id="265" w:author="kyle O'Reilly" w:date="2026-10-21T20:45:00Z" w16du:dateUtc="2026-10-21T19:45:00Z">
-        <w:r>
-          <w:t xml:space="preserve">code and retrieval </w:t>
-        </w:r>
-      </w:ins>
-      <w:ins w:id="266" w:author="kyle O'Reilly" w:date="2026-10-21T20:46:00Z" w16du:dateUtc="2026-10-21T19:46:00Z">
-        <w:r>
-          <w:t xml:space="preserve">instructions will be provided. </w:t>
-        </w:r>
-      </w:ins>
-    </w:p>
-    <w:p>
-      <w:pPr>
+      <w:ins w:id="239" w:author="kyle O'Reilly" w:date="2026-10-22T18:05:00Z" w16du:dateUtc="2026-10-22T17:05:00Z">
+        <w:r>
+          <w:t>The expected deliverables for this Capstone P</w:t>
+        </w:r>
+      </w:ins>
+      <w:ins w:id="240" w:author="kyle O'Reilly" w:date="2026-10-22T18:06:00Z" w16du:dateUtc="2026-10-22T17:06:00Z">
+        <w:r>
+          <w:t>roject</w:t>
+        </w:r>
+        <w:r>
+          <w:t xml:space="preserve"> will include a </w:t>
+        </w:r>
+      </w:ins>
+      <w:ins w:id="241" w:author="kyle O'Reilly" w:date="2026-10-22T18:09:00Z" w16du:dateUtc="2026-10-22T17:09:00Z">
+        <w:r>
+          <w:t>Jupyter</w:t>
+        </w:r>
+      </w:ins>
+      <w:ins w:id="242" w:author="kyle O'Reilly" w:date="2026-10-22T18:06:00Z" w16du:dateUtc="2026-10-22T17:06:00Z">
+        <w:r>
+          <w:t xml:space="preserve"> Notebook containing data preparation, model training, nin</w:t>
+        </w:r>
+        <w:r>
+          <w:t xml:space="preserve">e </w:t>
+        </w:r>
+      </w:ins>
+      <w:ins w:id="243" w:author="kyle O'Reilly" w:date="2026-10-22T18:07:00Z" w16du:dateUtc="2026-10-22T17:07:00Z">
+        <w:r>
+          <w:t>predictions and evaluation</w:t>
+        </w:r>
+      </w:ins>
+      <w:ins w:id="244" w:author="kyle O'Reilly" w:date="2026-10-22T18:08:00Z" w16du:dateUtc="2026-10-22T17:08:00Z">
+        <w:r>
+          <w:t>; a comparison on the JPMorgan Chase &amp; Co., Coca-Cola Co., and Intel Corp.</w:t>
+        </w:r>
+        <w:r>
+          <w:t>; three actual closing values; individual error calc</w:t>
+        </w:r>
+      </w:ins>
+      <w:ins w:id="245" w:author="kyle O'Reilly" w:date="2026-10-22T18:09:00Z" w16du:dateUtc="2026-10-22T17:09:00Z">
+        <w:r>
+          <w:t>ulations; a final report discussing findings and limitations; and a GitHub repository with code and permitted files.</w:t>
+        </w:r>
+      </w:ins>
+    </w:p>
+    <w:p>
+      <w:pPr>
+        <w:rPr>
+          <w:ins w:id="246" w:author="kyle O'Reilly" w:date="2026-10-21T20:41:00Z" w16du:dateUtc="2026-10-21T19:41:00Z"/>
+        </w:rPr>
+      </w:pPr>
+    </w:p>
+    <w:p>
+      <w:pPr>
+        <w:pStyle w:val="Heading1"/>
+        <w:pPrChange w:id="247" w:author="kyle O'Reilly" w:date="2026-10-21T20:41:00Z" w16du:dateUtc="2026-10-21T19:41:00Z">
+          <w:pPr/>
+        </w:pPrChange>
+      </w:pPr>
+      <w:bookmarkStart w:id="248" w:name="_Toc243520531"/>
+      <w:ins w:id="249" w:author="kyle O'Reilly" w:date="2026-10-21T20:41:00Z" w16du:dateUtc="2026-10-21T19:41:00Z">
+        <w:r>
+          <w:lastRenderedPageBreak/>
+          <w:t>9. Project Timeline</w:t>
+        </w:r>
+      </w:ins>
+      <w:bookmarkEnd w:id="248"/>
+    </w:p>
+    <w:p>
+      <w:ins w:id="250" w:author="kyle O'Reilly" w:date="2026-10-21T20:41:00Z" w16du:dateUtc="2026-10-21T19:41:00Z">
+        <w:r>
+          <w:t>?</w:t>
+        </w:r>
+      </w:ins>
+    </w:p>
+    <w:p>
+      <w:pPr>
+        <w:rPr>
+          <w:ins w:id="251" w:author="kyle O'Reilly" w:date="2026-10-21T20:41:00Z" w16du:dateUtc="2026-10-21T19:41:00Z"/>
+        </w:rPr>
+      </w:pPr>
+    </w:p>
+    <w:p>
+      <w:pPr>
+        <w:pStyle w:val="Heading1"/>
         <w:spacing w:line="360" w:lineRule="auto"/>
         <w:jc w:val="both"/>
         <w:rPr>
-          <w:ins w:id="267" w:author="kyle O'Reilly" w:date="2026-10-21T20:42:00Z" w16du:dateUtc="2026-10-21T19:42:00Z"/>
-        </w:rPr>
-        <w:pPrChange w:id="268" w:author="kyle O'Reilly" w:date="2026-10-21T23:07:00Z" w16du:dateUtc="2026-10-21T22:07:00Z">
+          <w:ins w:id="252" w:author="kyle O'Reilly" w:date="2026-10-21T20:41:00Z" w16du:dateUtc="2026-10-21T19:41:00Z"/>
+        </w:rPr>
+        <w:pPrChange w:id="253" w:author="kyle O'Reilly" w:date="2026-10-21T23:07:00Z" w16du:dateUtc="2026-10-21T22:07:00Z">
           <w:pPr/>
         </w:pPrChange>
       </w:pPr>
-      <w:ins w:id="269" w:author="kyle O'Reilly" w:date="2026-10-21T22:09:00Z" w16du:dateUtc="2026-10-21T21:09:00Z">
-        <w:r>
-          <w:t>All results</w:t>
-        </w:r>
-        <w:r>
-          <w:t>,</w:t>
-        </w:r>
-      </w:ins>
-      <w:ins w:id="270" w:author="kyle O'Reilly" w:date="2026-10-21T20:47:00Z" w16du:dateUtc="2026-10-21T19:47:00Z">
-        <w:r>
-          <w:t xml:space="preserve"> including </w:t>
-        </w:r>
-      </w:ins>
-      <w:ins w:id="271" w:author="kyle O'Reilly" w:date="2026-10-21T22:10:00Z" w16du:dateUtc="2026-10-21T21:10:00Z">
-        <w:r>
-          <w:t>inaccurate</w:t>
-        </w:r>
-      </w:ins>
-      <w:ins w:id="272" w:author="kyle O'Reilly" w:date="2026-10-21T20:47:00Z" w16du:dateUtc="2026-10-21T19:47:00Z">
-        <w:r>
-          <w:t xml:space="preserve"> predictions, will be reported transparently. Th</w:t>
-        </w:r>
-      </w:ins>
-      <w:ins w:id="273" w:author="kyle O'Reilly" w:date="2026-10-21T22:10:00Z" w16du:dateUtc="2026-10-21T21:10:00Z">
-        <w:r>
-          <w:t>is Capstone Project</w:t>
-        </w:r>
-      </w:ins>
-      <w:ins w:id="274" w:author="kyle O'Reilly" w:date="2026-10-21T20:47:00Z" w16du:dateUtc="2026-10-21T19:47:00Z">
-        <w:r>
-          <w:t xml:space="preserve"> work is for academic purposes</w:t>
-        </w:r>
-      </w:ins>
-      <w:ins w:id="275" w:author="kyle O'Reilly" w:date="2026-10-21T22:10:00Z" w16du:dateUtc="2026-10-21T21:10:00Z">
-        <w:r>
-          <w:t xml:space="preserve"> only</w:t>
-        </w:r>
-      </w:ins>
-      <w:ins w:id="276" w:author="kyle O'Reilly" w:date="2026-10-21T20:47:00Z" w16du:dateUtc="2026-10-21T19:47:00Z">
-        <w:r>
-          <w:t xml:space="preserve"> and does </w:t>
-        </w:r>
-      </w:ins>
-      <w:ins w:id="277" w:author="kyle O'Reilly" w:date="2026-10-22T00:14:00Z" w16du:dateUtc="2026-10-21T23:14:00Z">
-        <w:r>
-          <w:t xml:space="preserve">not </w:t>
-        </w:r>
-      </w:ins>
-      <w:ins w:id="278" w:author="kyle O'Reilly" w:date="2026-10-21T20:47:00Z" w16du:dateUtc="2026-10-21T19:47:00Z">
-        <w:r>
-          <w:t>constitute financial inv</w:t>
-        </w:r>
-      </w:ins>
-      <w:ins w:id="279" w:author="kyle O'Reilly" w:date="2026-10-21T20:48:00Z" w16du:dateUtc="2026-10-21T19:48:00Z">
-        <w:r>
-          <w:t>estment</w:t>
-        </w:r>
-      </w:ins>
-      <w:ins w:id="280" w:author="kyle O'Reilly" w:date="2026-10-21T20:47:00Z" w16du:dateUtc="2026-10-21T19:47:00Z">
-        <w:r>
-          <w:t xml:space="preserve"> advice.</w:t>
-        </w:r>
-      </w:ins>
-    </w:p>
-    <w:p>
-      <w:pPr>
-        <w:rPr>
-          <w:ins w:id="281" w:author="kyle O'Reilly" w:date="2026-10-21T20:42:00Z" w16du:dateUtc="2026-10-21T19:42:00Z"/>
-        </w:rPr>
-      </w:pPr>
-    </w:p>
-    <w:p>
-      <w:pPr>
-        <w:pStyle w:val="Heading1"/>
-        <w:rPr>
-          <w:ins w:id="282" w:author="kyle O'Reilly" w:date="2026-10-21T20:42:00Z" w16du:dateUtc="2026-10-21T19:42:00Z"/>
-        </w:rPr>
-        <w:pPrChange w:id="283" w:author="kyle O'Reilly" w:date="2026-10-21T20:42:00Z" w16du:dateUtc="2026-10-21T19:42:00Z">
+      <w:bookmarkStart w:id="254" w:name="_Toc243520532"/>
+      <w:ins w:id="255" w:author="kyle O'Reilly" w:date="2026-10-21T20:41:00Z" w16du:dateUtc="2026-10-21T19:41:00Z">
+        <w:r>
+          <w:t>10. Ethical and Legal Considerations</w:t>
+        </w:r>
+        <w:bookmarkEnd w:id="254"/>
+      </w:ins>
+    </w:p>
+    <w:p>
+      <w:pPr>
+        <w:spacing w:line="360" w:lineRule="auto"/>
+        <w:jc w:val="both"/>
+        <w:rPr>
+          <w:ins w:id="256" w:author="kyle O'Reilly" w:date="2026-10-21T20:46:00Z" w16du:dateUtc="2026-10-21T19:46:00Z"/>
+        </w:rPr>
+        <w:pPrChange w:id="257" w:author="kyle O'Reilly" w:date="2026-10-21T23:07:00Z" w16du:dateUtc="2026-10-21T22:07:00Z">
           <w:pPr/>
         </w:pPrChange>
       </w:pPr>
-      <w:bookmarkStart w:id="284" w:name="_Toc243520533"/>
-      <w:ins w:id="285" w:author="kyle O'Reilly" w:date="2026-10-21T20:42:00Z" w16du:dateUtc="2026-10-21T19:42:00Z">
+      <w:ins w:id="258" w:author="kyle O'Reilly" w:date="2026-10-21T20:42:00Z" w16du:dateUtc="2026-10-21T19:42:00Z">
+        <w:r>
+          <w:t>This C</w:t>
+        </w:r>
+      </w:ins>
+      <w:ins w:id="259" w:author="kyle O'Reilly" w:date="2026-10-21T20:43:00Z" w16du:dateUtc="2026-10-21T19:43:00Z">
+        <w:r>
+          <w:t xml:space="preserve">apstone Project will use </w:t>
+        </w:r>
+        <w:r>
+          <w:t xml:space="preserve">publicly available </w:t>
+        </w:r>
+        <w:r>
+          <w:t>historical stock</w:t>
+        </w:r>
+      </w:ins>
+      <w:ins w:id="260" w:author="kyle O'Reilly" w:date="2026-10-21T22:01:00Z" w16du:dateUtc="2026-10-21T21:01:00Z">
+        <w:r>
+          <w:t xml:space="preserve"> </w:t>
+        </w:r>
+      </w:ins>
+      <w:ins w:id="261" w:author="kyle O'Reilly" w:date="2026-10-21T20:43:00Z" w16du:dateUtc="2026-10-21T19:43:00Z">
+        <w:r>
+          <w:t xml:space="preserve">data </w:t>
+        </w:r>
+        <w:r>
+          <w:t xml:space="preserve">and will not </w:t>
+        </w:r>
+        <w:r>
+          <w:t xml:space="preserve">collect personal information or involve human </w:t>
+        </w:r>
+      </w:ins>
+      <w:ins w:id="262" w:author="kyle O'Reilly" w:date="2026-10-21T20:44:00Z" w16du:dateUtc="2026-10-21T19:44:00Z">
+        <w:r>
+          <w:t>participants. Stooq data access and usage conditions, and any Trading 212</w:t>
+        </w:r>
+        <w:r>
+          <w:t xml:space="preserve"> information reused in the report, will be reviewed and appropriately attributed</w:t>
+        </w:r>
+      </w:ins>
+      <w:ins w:id="263" w:author="kyle O'Reilly" w:date="2026-10-21T20:45:00Z" w16du:dateUtc="2026-10-21T19:45:00Z">
+        <w:r>
+          <w:t xml:space="preserve">. Historical stock </w:t>
+        </w:r>
+      </w:ins>
+      <w:ins w:id="264" w:author="kyle O'Reilly" w:date="2026-10-21T22:03:00Z" w16du:dateUtc="2026-10-21T21:03:00Z">
+        <w:r>
+          <w:t xml:space="preserve">market </w:t>
+        </w:r>
+      </w:ins>
+      <w:ins w:id="265" w:author="kyle O'Reilly" w:date="2026-10-21T20:45:00Z" w16du:dateUtc="2026-10-21T19:45:00Z">
+        <w:r>
+          <w:t xml:space="preserve">data </w:t>
+        </w:r>
+      </w:ins>
+      <w:ins w:id="266" w:author="kyle O'Reilly" w:date="2026-10-21T22:11:00Z" w16du:dateUtc="2026-10-21T21:11:00Z">
+        <w:r>
+          <w:t>Comma</w:t>
+        </w:r>
+        <w:r>
+          <w:t xml:space="preserve">-Separated Values </w:t>
+        </w:r>
+        <w:r>
+          <w:t>(</w:t>
+        </w:r>
+      </w:ins>
+      <w:ins w:id="267" w:author="kyle O'Reilly" w:date="2026-10-21T22:05:00Z" w16du:dateUtc="2026-10-21T21:05:00Z">
+        <w:r>
+          <w:t>CSV</w:t>
+        </w:r>
+      </w:ins>
+      <w:ins w:id="268" w:author="kyle O'Reilly" w:date="2026-10-21T22:11:00Z" w16du:dateUtc="2026-10-21T21:11:00Z">
+        <w:r>
+          <w:t>)</w:t>
+        </w:r>
+      </w:ins>
+      <w:ins w:id="269" w:author="kyle O'Reilly" w:date="2026-10-21T22:05:00Z" w16du:dateUtc="2026-10-21T21:05:00Z">
+        <w:r>
+          <w:t xml:space="preserve"> </w:t>
+        </w:r>
+      </w:ins>
+      <w:ins w:id="270" w:author="kyle O'Reilly" w:date="2026-10-21T20:45:00Z" w16du:dateUtc="2026-10-21T19:45:00Z">
+        <w:r>
+          <w:t>files</w:t>
+        </w:r>
+      </w:ins>
+      <w:ins w:id="271" w:author="kyle O'Reilly" w:date="2026-10-21T22:07:00Z" w16du:dateUtc="2026-10-21T21:07:00Z">
+        <w:r>
+          <w:t xml:space="preserve"> downloaded from S</w:t>
+        </w:r>
+      </w:ins>
+      <w:ins w:id="272" w:author="kyle O'Reilly" w:date="2026-10-21T22:08:00Z" w16du:dateUtc="2026-10-21T21:08:00Z">
+        <w:r>
+          <w:t>tooq</w:t>
+        </w:r>
+      </w:ins>
+      <w:ins w:id="273" w:author="kyle O'Reilly" w:date="2026-10-21T20:45:00Z" w16du:dateUtc="2026-10-21T19:45:00Z">
+        <w:r>
+          <w:t xml:space="preserve"> </w:t>
+        </w:r>
+        <w:r>
+          <w:t xml:space="preserve">will only be </w:t>
+        </w:r>
+      </w:ins>
+      <w:ins w:id="274" w:author="kyle O'Reilly" w:date="2026-10-21T22:08:00Z" w16du:dateUtc="2026-10-21T21:08:00Z">
+        <w:r>
+          <w:t>uploaded to</w:t>
+        </w:r>
+      </w:ins>
+      <w:ins w:id="275" w:author="kyle O'Reilly" w:date="2026-10-21T20:45:00Z" w16du:dateUtc="2026-10-21T19:45:00Z">
+        <w:r>
+          <w:t xml:space="preserve"> </w:t>
+        </w:r>
+      </w:ins>
+      <w:ins w:id="276" w:author="kyle O'Reilly" w:date="2026-10-21T20:48:00Z" w16du:dateUtc="2026-10-21T19:48:00Z">
+        <w:r>
+          <w:t>GitHub</w:t>
+        </w:r>
+      </w:ins>
+      <w:ins w:id="277" w:author="kyle O'Reilly" w:date="2026-10-21T20:45:00Z" w16du:dateUtc="2026-10-21T19:45:00Z">
+        <w:r>
+          <w:t xml:space="preserve"> </w:t>
+        </w:r>
+      </w:ins>
+      <w:ins w:id="278" w:author="kyle O'Reilly" w:date="2026-10-21T22:07:00Z" w16du:dateUtc="2026-10-21T21:07:00Z">
+        <w:r>
+          <w:t>if permitted by Stooq’s terms of service</w:t>
+        </w:r>
+      </w:ins>
+      <w:ins w:id="279" w:author="kyle O'Reilly" w:date="2026-10-21T20:45:00Z" w16du:dateUtc="2026-10-21T19:45:00Z">
+        <w:r>
+          <w:t xml:space="preserve">; otherwise, </w:t>
+        </w:r>
+      </w:ins>
+      <w:ins w:id="280" w:author="kyle O'Reilly" w:date="2026-10-21T22:07:00Z" w16du:dateUtc="2026-10-21T21:07:00Z">
+        <w:r>
+          <w:t xml:space="preserve">the </w:t>
+        </w:r>
+        <w:r>
+          <w:t>Pyt</w:t>
+        </w:r>
+      </w:ins>
+      <w:ins w:id="281" w:author="kyle O'Reilly" w:date="2026-10-22T00:14:00Z" w16du:dateUtc="2026-10-21T23:14:00Z">
+        <w:r>
+          <w:t>h</w:t>
+        </w:r>
+      </w:ins>
+      <w:ins w:id="282" w:author="kyle O'Reilly" w:date="2026-10-21T22:07:00Z" w16du:dateUtc="2026-10-21T21:07:00Z">
+        <w:r>
+          <w:t xml:space="preserve">on </w:t>
+        </w:r>
+      </w:ins>
+      <w:ins w:id="283" w:author="kyle O'Reilly" w:date="2026-10-21T20:45:00Z" w16du:dateUtc="2026-10-21T19:45:00Z">
+        <w:r>
+          <w:t xml:space="preserve">code and retrieval </w:t>
+        </w:r>
+      </w:ins>
+      <w:ins w:id="284" w:author="kyle O'Reilly" w:date="2026-10-21T20:46:00Z" w16du:dateUtc="2026-10-21T19:46:00Z">
+        <w:r>
+          <w:t xml:space="preserve">instructions will be provided. </w:t>
+        </w:r>
+      </w:ins>
+    </w:p>
+    <w:p>
+      <w:pPr>
+        <w:spacing w:line="360" w:lineRule="auto"/>
+        <w:jc w:val="both"/>
+        <w:rPr>
+          <w:ins w:id="285" w:author="kyle O'Reilly" w:date="2026-10-21T20:42:00Z" w16du:dateUtc="2026-10-21T19:42:00Z"/>
+        </w:rPr>
+        <w:pPrChange w:id="286" w:author="kyle O'Reilly" w:date="2026-10-21T23:07:00Z" w16du:dateUtc="2026-10-21T22:07:00Z">
+          <w:pPr/>
+        </w:pPrChange>
+      </w:pPr>
+      <w:ins w:id="287" w:author="kyle O'Reilly" w:date="2026-10-21T22:09:00Z" w16du:dateUtc="2026-10-21T21:09:00Z">
+        <w:r>
+          <w:t>All results</w:t>
+        </w:r>
+        <w:r>
+          <w:t>,</w:t>
+        </w:r>
+      </w:ins>
+      <w:ins w:id="288" w:author="kyle O'Reilly" w:date="2026-10-21T20:47:00Z" w16du:dateUtc="2026-10-21T19:47:00Z">
+        <w:r>
+          <w:t xml:space="preserve"> including </w:t>
+        </w:r>
+      </w:ins>
+      <w:ins w:id="289" w:author="kyle O'Reilly" w:date="2026-10-21T22:10:00Z" w16du:dateUtc="2026-10-21T21:10:00Z">
+        <w:r>
+          <w:t>inaccurate</w:t>
+        </w:r>
+      </w:ins>
+      <w:ins w:id="290" w:author="kyle O'Reilly" w:date="2026-10-21T20:47:00Z" w16du:dateUtc="2026-10-21T19:47:00Z">
+        <w:r>
+          <w:t xml:space="preserve"> predictions, will be reported transparently. Th</w:t>
+        </w:r>
+      </w:ins>
+      <w:ins w:id="291" w:author="kyle O'Reilly" w:date="2026-10-21T22:10:00Z" w16du:dateUtc="2026-10-21T21:10:00Z">
+        <w:r>
+          <w:t>is Capstone Project</w:t>
+        </w:r>
+      </w:ins>
+      <w:ins w:id="292" w:author="kyle O'Reilly" w:date="2026-10-21T20:47:00Z" w16du:dateUtc="2026-10-21T19:47:00Z">
+        <w:r>
+          <w:t xml:space="preserve"> work is for academic purposes</w:t>
+        </w:r>
+      </w:ins>
+      <w:ins w:id="293" w:author="kyle O'Reilly" w:date="2026-10-21T22:10:00Z" w16du:dateUtc="2026-10-21T21:10:00Z">
+        <w:r>
+          <w:t xml:space="preserve"> only</w:t>
+        </w:r>
+      </w:ins>
+      <w:ins w:id="294" w:author="kyle O'Reilly" w:date="2026-10-21T20:47:00Z" w16du:dateUtc="2026-10-21T19:47:00Z">
+        <w:r>
+          <w:t xml:space="preserve"> and does </w:t>
+        </w:r>
+      </w:ins>
+      <w:ins w:id="295" w:author="kyle O'Reilly" w:date="2026-10-22T00:14:00Z" w16du:dateUtc="2026-10-21T23:14:00Z">
+        <w:r>
+          <w:t xml:space="preserve">not </w:t>
+        </w:r>
+      </w:ins>
+      <w:ins w:id="296" w:author="kyle O'Reilly" w:date="2026-10-21T20:47:00Z" w16du:dateUtc="2026-10-21T19:47:00Z">
+        <w:r>
+          <w:t>constitute financial inv</w:t>
+        </w:r>
+      </w:ins>
+      <w:ins w:id="297" w:author="kyle O'Reilly" w:date="2026-10-21T20:48:00Z" w16du:dateUtc="2026-10-21T19:48:00Z">
+        <w:r>
+          <w:t>estment</w:t>
+        </w:r>
+      </w:ins>
+      <w:ins w:id="298" w:author="kyle O'Reilly" w:date="2026-10-21T20:47:00Z" w16du:dateUtc="2026-10-21T19:47:00Z">
+        <w:r>
+          <w:t xml:space="preserve"> advice.</w:t>
+        </w:r>
+      </w:ins>
+    </w:p>
+    <w:p>
+      <w:pPr>
+        <w:rPr>
+          <w:ins w:id="299" w:author="kyle O'Reilly" w:date="2026-10-21T20:42:00Z" w16du:dateUtc="2026-10-21T19:42:00Z"/>
+        </w:rPr>
+      </w:pPr>
+    </w:p>
+    <w:p>
+      <w:pPr>
+        <w:pStyle w:val="Heading1"/>
+        <w:rPr>
+          <w:ins w:id="300" w:author="kyle O'Reilly" w:date="2026-10-21T20:42:00Z" w16du:dateUtc="2026-10-21T19:42:00Z"/>
+        </w:rPr>
+        <w:pPrChange w:id="301" w:author="kyle O'Reilly" w:date="2026-10-21T20:42:00Z" w16du:dateUtc="2026-10-21T19:42:00Z">
+          <w:pPr/>
+        </w:pPrChange>
+      </w:pPr>
+      <w:bookmarkStart w:id="302" w:name="_Toc243520533"/>
+      <w:ins w:id="303" w:author="kyle O'Reilly" w:date="2026-10-21T20:42:00Z" w16du:dateUtc="2026-10-21T19:42:00Z">
         <w:r>
           <w:t>References</w:t>
         </w:r>
-        <w:bookmarkEnd w:id="284"/>
+        <w:bookmarkEnd w:id="302"/>
         <w:r>
           <w:t xml:space="preserve"> </w:t>
         </w:r>
@@ -4089,17 +4139,17 @@
     <w:p>
       <w:pPr>
         <w:rPr>
-          <w:ins w:id="286" w:author="kyle O'Reilly" w:date="2026-10-21T23:38:00Z" w16du:dateUtc="2026-10-21T22:38:00Z"/>
-        </w:rPr>
-      </w:pPr>
-    </w:p>
-    <w:p>
-      <w:pPr>
-        <w:rPr>
-          <w:ins w:id="287" w:author="kyle O'Reilly" w:date="2026-10-21T23:38:00Z" w16du:dateUtc="2026-10-21T22:38:00Z"/>
-        </w:rPr>
-      </w:pPr>
-      <w:ins w:id="288" w:author="kyle O'Reilly" w:date="2026-10-21T23:38:00Z" w16du:dateUtc="2026-10-21T22:38:00Z">
+          <w:ins w:id="304" w:author="kyle O'Reilly" w:date="2026-10-21T23:38:00Z" w16du:dateUtc="2026-10-21T22:38:00Z"/>
+        </w:rPr>
+      </w:pPr>
+    </w:p>
+    <w:p>
+      <w:pPr>
+        <w:rPr>
+          <w:ins w:id="305" w:author="kyle O'Reilly" w:date="2026-10-21T23:38:00Z" w16du:dateUtc="2026-10-21T22:38:00Z"/>
+        </w:rPr>
+      </w:pPr>
+      <w:ins w:id="306" w:author="kyle O'Reilly" w:date="2026-10-21T23:38:00Z" w16du:dateUtc="2026-10-21T22:38:00Z">
         <w:r>
           <w:t xml:space="preserve">Section 7 </w:t>
         </w:r>
@@ -4108,25 +4158,25 @@
     <w:p>
       <w:pPr>
         <w:rPr>
-          <w:ins w:id="289" w:author="kyle O'Reilly" w:date="2026-10-21T23:48:00Z" w16du:dateUtc="2026-10-21T22:48:00Z"/>
-        </w:rPr>
-      </w:pPr>
-      <w:ins w:id="290" w:author="kyle O'Reilly" w:date="2026-10-21T23:50:00Z" w16du:dateUtc="2026-10-21T22:50:00Z">
+          <w:ins w:id="307" w:author="kyle O'Reilly" w:date="2026-10-21T23:48:00Z" w16du:dateUtc="2026-10-21T22:48:00Z"/>
+        </w:rPr>
+      </w:pPr>
+      <w:ins w:id="308" w:author="kyle O'Reilly" w:date="2026-10-21T23:50:00Z" w16du:dateUtc="2026-10-21T22:50:00Z">
         <w:r>
           <w:t>Trading 212</w:t>
         </w:r>
       </w:ins>
-      <w:ins w:id="291" w:author="kyle O'Reilly" w:date="2026-10-21T23:52:00Z" w16du:dateUtc="2026-10-21T22:52:00Z">
+      <w:ins w:id="309" w:author="kyle O'Reilly" w:date="2026-10-21T23:52:00Z" w16du:dateUtc="2026-10-21T22:52:00Z">
         <w:r>
           <w:t xml:space="preserve"> </w:t>
         </w:r>
       </w:ins>
-      <w:ins w:id="292" w:author="kyle O'Reilly" w:date="2026-10-21T23:50:00Z" w16du:dateUtc="2026-10-21T22:50:00Z">
+      <w:ins w:id="310" w:author="kyle O'Reilly" w:date="2026-10-21T23:50:00Z" w16du:dateUtc="2026-10-21T22:50:00Z">
         <w:r>
           <w:t>(n.d.) Trading 212 investment platform. Available at:</w:t>
         </w:r>
       </w:ins>
-      <w:ins w:id="293" w:author="kyle O'Reilly" w:date="2026-10-21T23:51:00Z" w16du:dateUtc="2026-10-21T22:51:00Z">
+      <w:ins w:id="311" w:author="kyle O'Reilly" w:date="2026-10-21T23:51:00Z" w16du:dateUtc="2026-10-21T22:51:00Z">
         <w:r>
           <w:t xml:space="preserve"> </w:t>
         </w:r>
@@ -4158,12 +4208,12 @@
           <w:t xml:space="preserve">  (</w:t>
         </w:r>
       </w:ins>
-      <w:ins w:id="294" w:author="kyle O'Reilly" w:date="2026-10-21T23:50:00Z" w16du:dateUtc="2026-10-21T22:50:00Z">
+      <w:ins w:id="312" w:author="kyle O'Reilly" w:date="2026-10-21T23:50:00Z" w16du:dateUtc="2026-10-21T22:50:00Z">
         <w:r>
           <w:t>Accessed: 2</w:t>
         </w:r>
       </w:ins>
-      <w:ins w:id="295" w:author="kyle O'Reilly" w:date="2026-10-21T23:51:00Z" w16du:dateUtc="2026-10-21T22:51:00Z">
+      <w:ins w:id="313" w:author="kyle O'Reilly" w:date="2026-10-21T23:51:00Z" w16du:dateUtc="2026-10-21T22:51:00Z">
         <w:r>
           <w:t>1 October 2026).</w:t>
         </w:r>
@@ -4172,10 +4222,10 @@
     <w:p>
       <w:pPr>
         <w:rPr>
-          <w:ins w:id="296" w:author="kyle O'Reilly" w:date="2026-10-21T23:53:00Z" w16du:dateUtc="2026-10-21T22:53:00Z"/>
-        </w:rPr>
-      </w:pPr>
-      <w:ins w:id="297" w:author="kyle O'Reilly" w:date="2026-10-21T23:52:00Z" w16du:dateUtc="2026-10-21T22:52:00Z">
+          <w:ins w:id="314" w:author="kyle O'Reilly" w:date="2026-10-21T23:53:00Z" w16du:dateUtc="2026-10-21T22:53:00Z"/>
+        </w:rPr>
+      </w:pPr>
+      <w:ins w:id="315" w:author="kyle O'Reilly" w:date="2026-10-21T23:52:00Z" w16du:dateUtc="2026-10-21T22:52:00Z">
         <w:r>
           <w:t xml:space="preserve">Stooq (n.d.a) </w:t>
         </w:r>
@@ -4183,12 +4233,12 @@
           <w:t>JPMorgan Chase &amp; Co. (JPM.</w:t>
         </w:r>
       </w:ins>
-      <w:ins w:id="298" w:author="kyle O'Reilly" w:date="2026-10-21T23:53:00Z" w16du:dateUtc="2026-10-21T22:53:00Z">
+      <w:ins w:id="316" w:author="kyle O'Reilly" w:date="2026-10-21T23:53:00Z" w16du:dateUtc="2026-10-21T22:53:00Z">
         <w:r>
           <w:t>US) – Historical data. Available at:</w:t>
         </w:r>
       </w:ins>
-      <w:ins w:id="299" w:author="kyle O'Reilly" w:date="2026-10-21T23:57:00Z" w16du:dateUtc="2026-10-21T22:57:00Z">
+      <w:ins w:id="317" w:author="kyle O'Reilly" w:date="2026-10-21T23:57:00Z" w16du:dateUtc="2026-10-21T22:57:00Z">
         <w:r>
           <w:t xml:space="preserve"> </w:t>
         </w:r>
@@ -4200,7 +4250,7 @@
         </w:r>
         <w:r>
           <w:rPr>
-            <w:rPrChange w:id="300" w:author="kyle O'Reilly" w:date="2026-10-21T23:57:00Z" w16du:dateUtc="2026-10-21T22:57:00Z">
+            <w:rPrChange w:id="318" w:author="kyle O'Reilly" w:date="2026-10-21T23:57:00Z" w16du:dateUtc="2026-10-21T22:57:00Z">
               <w:rPr>
                 <w:rStyle w:val="Hyperlink"/>
               </w:rPr>
@@ -4227,7 +4277,7 @@
           <w:t xml:space="preserve"> </w:t>
         </w:r>
       </w:ins>
-      <w:ins w:id="301" w:author="kyle O'Reilly" w:date="2026-10-21T23:53:00Z" w16du:dateUtc="2026-10-21T22:53:00Z">
+      <w:ins w:id="319" w:author="kyle O'Reilly" w:date="2026-10-21T23:53:00Z" w16du:dateUtc="2026-10-21T22:53:00Z">
         <w:r>
           <w:t>(Accessed</w:t>
         </w:r>
@@ -4235,12 +4285,12 @@
           <w:t xml:space="preserve">: 21 </w:t>
         </w:r>
       </w:ins>
-      <w:ins w:id="302" w:author="kyle O'Reilly" w:date="2026-10-21T23:55:00Z" w16du:dateUtc="2026-10-21T22:55:00Z">
+      <w:ins w:id="320" w:author="kyle O'Reilly" w:date="2026-10-21T23:55:00Z" w16du:dateUtc="2026-10-21T22:55:00Z">
         <w:r>
           <w:t>October</w:t>
         </w:r>
       </w:ins>
-      <w:ins w:id="303" w:author="kyle O'Reilly" w:date="2026-10-21T23:53:00Z" w16du:dateUtc="2026-10-21T22:53:00Z">
+      <w:ins w:id="321" w:author="kyle O'Reilly" w:date="2026-10-21T23:53:00Z" w16du:dateUtc="2026-10-21T22:53:00Z">
         <w:r>
           <w:t xml:space="preserve"> 2026).</w:t>
         </w:r>
@@ -4249,45 +4299,45 @@
     <w:p>
       <w:pPr>
         <w:rPr>
-          <w:ins w:id="304" w:author="kyle O'Reilly" w:date="2026-10-21T23:54:00Z" w16du:dateUtc="2026-10-21T22:54:00Z"/>
-        </w:rPr>
-      </w:pPr>
-      <w:ins w:id="305" w:author="kyle O'Reilly" w:date="2026-10-21T23:53:00Z" w16du:dateUtc="2026-10-21T22:53:00Z">
+          <w:ins w:id="322" w:author="kyle O'Reilly" w:date="2026-10-21T23:54:00Z" w16du:dateUtc="2026-10-21T22:54:00Z"/>
+        </w:rPr>
+      </w:pPr>
+      <w:ins w:id="323" w:author="kyle O'Reilly" w:date="2026-10-21T23:53:00Z" w16du:dateUtc="2026-10-21T22:53:00Z">
         <w:r>
           <w:t xml:space="preserve">Stooq (n.d.b) Coca-Cola </w:t>
         </w:r>
       </w:ins>
-      <w:ins w:id="306" w:author="kyle O'Reilly" w:date="2026-10-21T23:54:00Z" w16du:dateUtc="2026-10-21T22:54:00Z">
+      <w:ins w:id="324" w:author="kyle O'Reilly" w:date="2026-10-21T23:54:00Z" w16du:dateUtc="2026-10-21T22:54:00Z">
         <w:r>
           <w:t>Co</w:t>
         </w:r>
       </w:ins>
-      <w:ins w:id="307" w:author="kyle O'Reilly" w:date="2026-10-22T00:04:00Z" w16du:dateUtc="2026-10-21T23:04:00Z">
+      <w:ins w:id="325" w:author="kyle O'Reilly" w:date="2026-10-22T00:04:00Z" w16du:dateUtc="2026-10-21T23:04:00Z">
         <w:r>
           <w:t>.</w:t>
         </w:r>
       </w:ins>
-      <w:ins w:id="308" w:author="kyle O'Reilly" w:date="2026-10-21T23:54:00Z" w16du:dateUtc="2026-10-21T22:54:00Z">
+      <w:ins w:id="326" w:author="kyle O'Reilly" w:date="2026-10-21T23:54:00Z" w16du:dateUtc="2026-10-21T22:54:00Z">
         <w:r>
           <w:t xml:space="preserve"> </w:t>
         </w:r>
       </w:ins>
-      <w:ins w:id="309" w:author="kyle O'Reilly" w:date="2026-10-21T23:53:00Z" w16du:dateUtc="2026-10-21T22:53:00Z">
+      <w:ins w:id="327" w:author="kyle O'Reilly" w:date="2026-10-21T23:53:00Z" w16du:dateUtc="2026-10-21T22:53:00Z">
         <w:r>
           <w:t>(KO.U</w:t>
         </w:r>
       </w:ins>
-      <w:ins w:id="310" w:author="kyle O'Reilly" w:date="2026-10-21T23:54:00Z" w16du:dateUtc="2026-10-21T22:54:00Z">
+      <w:ins w:id="328" w:author="kyle O'Reilly" w:date="2026-10-21T23:54:00Z" w16du:dateUtc="2026-10-21T22:54:00Z">
         <w:r>
           <w:t>S)</w:t>
         </w:r>
       </w:ins>
-      <w:ins w:id="311" w:author="kyle O'Reilly" w:date="2026-10-21T23:55:00Z" w16du:dateUtc="2026-10-21T22:55:00Z">
+      <w:ins w:id="329" w:author="kyle O'Reilly" w:date="2026-10-21T23:55:00Z" w16du:dateUtc="2026-10-21T22:55:00Z">
         <w:r>
           <w:t xml:space="preserve"> – Historical data. Available at:</w:t>
         </w:r>
       </w:ins>
-      <w:ins w:id="312" w:author="kyle O'Reilly" w:date="2026-10-21T23:56:00Z" w16du:dateUtc="2026-10-21T22:56:00Z">
+      <w:ins w:id="330" w:author="kyle O'Reilly" w:date="2026-10-21T23:56:00Z" w16du:dateUtc="2026-10-21T22:56:00Z">
         <w:r>
           <w:t xml:space="preserve"> </w:t>
         </w:r>
@@ -4319,7 +4369,7 @@
           <w:t xml:space="preserve"> </w:t>
         </w:r>
       </w:ins>
-      <w:ins w:id="313" w:author="kyle O'Reilly" w:date="2026-10-21T23:55:00Z" w16du:dateUtc="2026-10-21T22:55:00Z">
+      <w:ins w:id="331" w:author="kyle O'Reilly" w:date="2026-10-21T23:55:00Z" w16du:dateUtc="2026-10-21T22:55:00Z">
         <w:r>
           <w:t>(Accessed: 21 October 2026).</w:t>
         </w:r>
@@ -4328,25 +4378,25 @@
     <w:p>
       <w:pPr>
         <w:rPr>
-          <w:ins w:id="314" w:author="kyle O'Reilly" w:date="2026-10-21T23:49:00Z" w16du:dateUtc="2026-10-21T22:49:00Z"/>
-        </w:rPr>
-      </w:pPr>
-      <w:ins w:id="315" w:author="kyle O'Reilly" w:date="2026-10-21T23:54:00Z" w16du:dateUtc="2026-10-21T22:54:00Z">
+          <w:ins w:id="332" w:author="kyle O'Reilly" w:date="2026-10-21T23:49:00Z" w16du:dateUtc="2026-10-21T22:49:00Z"/>
+        </w:rPr>
+      </w:pPr>
+      <w:ins w:id="333" w:author="kyle O'Reilly" w:date="2026-10-21T23:54:00Z" w16du:dateUtc="2026-10-21T22:54:00Z">
         <w:r>
           <w:t xml:space="preserve">Stooq (n.d.c) Intel </w:t>
         </w:r>
       </w:ins>
-      <w:ins w:id="316" w:author="kyle O'Reilly" w:date="2026-10-22T00:04:00Z" w16du:dateUtc="2026-10-21T23:04:00Z">
+      <w:ins w:id="334" w:author="kyle O'Reilly" w:date="2026-10-22T00:04:00Z" w16du:dateUtc="2026-10-21T23:04:00Z">
         <w:r>
           <w:t xml:space="preserve">Corp. </w:t>
         </w:r>
       </w:ins>
-      <w:ins w:id="317" w:author="kyle O'Reilly" w:date="2026-10-21T23:54:00Z" w16du:dateUtc="2026-10-21T22:54:00Z">
+      <w:ins w:id="335" w:author="kyle O'Reilly" w:date="2026-10-21T23:54:00Z" w16du:dateUtc="2026-10-21T22:54:00Z">
         <w:r>
           <w:t>(INTC.US)</w:t>
         </w:r>
       </w:ins>
-      <w:ins w:id="318" w:author="kyle O'Reilly" w:date="2026-10-21T23:55:00Z" w16du:dateUtc="2026-10-21T22:55:00Z">
+      <w:ins w:id="336" w:author="kyle O'Reilly" w:date="2026-10-21T23:55:00Z" w16du:dateUtc="2026-10-21T22:55:00Z">
         <w:r>
           <w:t xml:space="preserve"> – Historical data. Available at</w:t>
         </w:r>
@@ -4354,7 +4404,7 @@
           <w:t>:</w:t>
         </w:r>
       </w:ins>
-      <w:ins w:id="319" w:author="kyle O'Reilly" w:date="2026-10-21T23:56:00Z" w16du:dateUtc="2026-10-21T22:56:00Z">
+      <w:ins w:id="337" w:author="kyle O'Reilly" w:date="2026-10-21T23:56:00Z" w16du:dateUtc="2026-10-21T22:56:00Z">
         <w:r>
           <w:t xml:space="preserve"> </w:t>
         </w:r>
@@ -4386,7 +4436,7 @@
           <w:t xml:space="preserve"> </w:t>
         </w:r>
       </w:ins>
-      <w:ins w:id="320" w:author="kyle O'Reilly" w:date="2026-10-21T23:55:00Z" w16du:dateUtc="2026-10-21T22:55:00Z">
+      <w:ins w:id="338" w:author="kyle O'Reilly" w:date="2026-10-21T23:55:00Z" w16du:dateUtc="2026-10-21T22:55:00Z">
         <w:r>
           <w:t xml:space="preserve"> </w:t>
         </w:r>
@@ -4394,12 +4444,12 @@
           <w:t xml:space="preserve">(Accessed: 21 </w:t>
         </w:r>
       </w:ins>
-      <w:ins w:id="321" w:author="kyle O'Reilly" w:date="2026-10-22T00:14:00Z" w16du:dateUtc="2026-10-21T23:14:00Z">
+      <w:ins w:id="339" w:author="kyle O'Reilly" w:date="2026-10-22T00:14:00Z" w16du:dateUtc="2026-10-21T23:14:00Z">
         <w:r>
           <w:t>October</w:t>
         </w:r>
       </w:ins>
-      <w:ins w:id="322" w:author="kyle O'Reilly" w:date="2026-10-21T23:55:00Z" w16du:dateUtc="2026-10-21T22:55:00Z">
+      <w:ins w:id="340" w:author="kyle O'Reilly" w:date="2026-10-21T23:55:00Z" w16du:dateUtc="2026-10-21T22:55:00Z">
         <w:r>
           <w:t xml:space="preserve"> 2026).</w:t>
         </w:r>
@@ -4408,84 +4458,84 @@
     <w:p>
       <w:pPr>
         <w:rPr>
-          <w:ins w:id="323" w:author="kyle O'Reilly" w:date="2026-10-21T23:49:00Z" w16du:dateUtc="2026-10-21T22:49:00Z"/>
-        </w:rPr>
-      </w:pPr>
-    </w:p>
-    <w:p>
-      <w:pPr>
-        <w:rPr>
-          <w:ins w:id="324" w:author="kyle O'Reilly" w:date="2026-10-21T23:49:00Z" w16du:dateUtc="2026-10-21T22:49:00Z"/>
-        </w:rPr>
-      </w:pPr>
-    </w:p>
-    <w:p>
-      <w:pPr>
-        <w:rPr>
-          <w:ins w:id="325" w:author="kyle O'Reilly" w:date="2026-10-21T23:49:00Z" w16du:dateUtc="2026-10-21T22:49:00Z"/>
-        </w:rPr>
-      </w:pPr>
-    </w:p>
-    <w:p>
-      <w:pPr>
-        <w:rPr>
-          <w:ins w:id="326" w:author="kyle O'Reilly" w:date="2026-10-21T23:49:00Z" w16du:dateUtc="2026-10-21T22:49:00Z"/>
-        </w:rPr>
-      </w:pPr>
-    </w:p>
-    <w:p>
-      <w:pPr>
-        <w:rPr>
-          <w:ins w:id="327" w:author="kyle O'Reilly" w:date="2026-10-21T23:49:00Z" w16du:dateUtc="2026-10-21T22:49:00Z"/>
-        </w:rPr>
-      </w:pPr>
-    </w:p>
-    <w:p>
-      <w:pPr>
-        <w:rPr>
-          <w:ins w:id="328" w:author="kyle O'Reilly" w:date="2026-10-21T23:49:00Z" w16du:dateUtc="2026-10-21T22:49:00Z"/>
-        </w:rPr>
-      </w:pPr>
-    </w:p>
-    <w:p>
-      <w:pPr>
-        <w:rPr>
-          <w:ins w:id="329" w:author="kyle O'Reilly" w:date="2026-10-21T23:49:00Z" w16du:dateUtc="2026-10-21T22:49:00Z"/>
-        </w:rPr>
-      </w:pPr>
-    </w:p>
-    <w:p>
-      <w:pPr>
-        <w:rPr>
-          <w:ins w:id="330" w:author="kyle O'Reilly" w:date="2026-10-21T23:49:00Z" w16du:dateUtc="2026-10-21T22:49:00Z"/>
-        </w:rPr>
-      </w:pPr>
-    </w:p>
-    <w:p>
-      <w:pPr>
-        <w:rPr>
-          <w:ins w:id="331" w:author="kyle O'Reilly" w:date="2026-10-21T23:49:00Z" w16du:dateUtc="2026-10-21T22:49:00Z"/>
-        </w:rPr>
-      </w:pPr>
-    </w:p>
-    <w:p>
-      <w:pPr>
-        <w:rPr>
-          <w:ins w:id="332" w:author="kyle O'Reilly" w:date="2026-10-21T23:49:00Z" w16du:dateUtc="2026-10-21T22:49:00Z"/>
-        </w:rPr>
-      </w:pPr>
-    </w:p>
-    <w:p>
-      <w:pPr>
-        <w:rPr>
-          <w:ins w:id="333" w:author="kyle O'Reilly" w:date="2026-10-21T23:49:00Z" w16du:dateUtc="2026-10-21T22:49:00Z"/>
-        </w:rPr>
-      </w:pPr>
-    </w:p>
-    <w:p>
-      <w:pPr>
-        <w:rPr>
-          <w:ins w:id="334" w:author="kyle O'Reilly" w:date="2026-10-22T00:15:00Z" w16du:dateUtc="2026-10-21T23:15:00Z"/>
+          <w:ins w:id="341" w:author="kyle O'Reilly" w:date="2026-10-21T23:49:00Z" w16du:dateUtc="2026-10-21T22:49:00Z"/>
+        </w:rPr>
+      </w:pPr>
+    </w:p>
+    <w:p>
+      <w:pPr>
+        <w:rPr>
+          <w:ins w:id="342" w:author="kyle O'Reilly" w:date="2026-10-21T23:49:00Z" w16du:dateUtc="2026-10-21T22:49:00Z"/>
+        </w:rPr>
+      </w:pPr>
+    </w:p>
+    <w:p>
+      <w:pPr>
+        <w:rPr>
+          <w:ins w:id="343" w:author="kyle O'Reilly" w:date="2026-10-21T23:49:00Z" w16du:dateUtc="2026-10-21T22:49:00Z"/>
+        </w:rPr>
+      </w:pPr>
+    </w:p>
+    <w:p>
+      <w:pPr>
+        <w:rPr>
+          <w:ins w:id="344" w:author="kyle O'Reilly" w:date="2026-10-21T23:49:00Z" w16du:dateUtc="2026-10-21T22:49:00Z"/>
+        </w:rPr>
+      </w:pPr>
+    </w:p>
+    <w:p>
+      <w:pPr>
+        <w:rPr>
+          <w:ins w:id="345" w:author="kyle O'Reilly" w:date="2026-10-21T23:49:00Z" w16du:dateUtc="2026-10-21T22:49:00Z"/>
+        </w:rPr>
+      </w:pPr>
+    </w:p>
+    <w:p>
+      <w:pPr>
+        <w:rPr>
+          <w:ins w:id="346" w:author="kyle O'Reilly" w:date="2026-10-21T23:49:00Z" w16du:dateUtc="2026-10-21T22:49:00Z"/>
+        </w:rPr>
+      </w:pPr>
+    </w:p>
+    <w:p>
+      <w:pPr>
+        <w:rPr>
+          <w:ins w:id="347" w:author="kyle O'Reilly" w:date="2026-10-21T23:49:00Z" w16du:dateUtc="2026-10-21T22:49:00Z"/>
+        </w:rPr>
+      </w:pPr>
+    </w:p>
+    <w:p>
+      <w:pPr>
+        <w:rPr>
+          <w:ins w:id="348" w:author="kyle O'Reilly" w:date="2026-10-21T23:49:00Z" w16du:dateUtc="2026-10-21T22:49:00Z"/>
+        </w:rPr>
+      </w:pPr>
+    </w:p>
+    <w:p>
+      <w:pPr>
+        <w:rPr>
+          <w:ins w:id="349" w:author="kyle O'Reilly" w:date="2026-10-21T23:49:00Z" w16du:dateUtc="2026-10-21T22:49:00Z"/>
+        </w:rPr>
+      </w:pPr>
+    </w:p>
+    <w:p>
+      <w:pPr>
+        <w:rPr>
+          <w:ins w:id="350" w:author="kyle O'Reilly" w:date="2026-10-21T23:49:00Z" w16du:dateUtc="2026-10-21T22:49:00Z"/>
+        </w:rPr>
+      </w:pPr>
+    </w:p>
+    <w:p>
+      <w:pPr>
+        <w:rPr>
+          <w:ins w:id="351" w:author="kyle O'Reilly" w:date="2026-10-21T23:49:00Z" w16du:dateUtc="2026-10-21T22:49:00Z"/>
+        </w:rPr>
+      </w:pPr>
+    </w:p>
+    <w:p>
+      <w:pPr>
+        <w:rPr>
+          <w:ins w:id="352" w:author="kyle O'Reilly" w:date="2026-10-22T00:15:00Z" w16du:dateUtc="2026-10-21T23:15:00Z"/>
           <w:sz w:val="96"/>
           <w:szCs w:val="96"/>
         </w:rPr>
@@ -4494,12 +4544,12 @@
     <w:p>
       <w:pPr>
         <w:rPr>
-          <w:ins w:id="335" w:author="kyle O'Reilly" w:date="2026-10-21T23:49:00Z" w16du:dateUtc="2026-10-21T22:49:00Z"/>
+          <w:ins w:id="353" w:author="kyle O'Reilly" w:date="2026-10-21T23:49:00Z" w16du:dateUtc="2026-10-21T22:49:00Z"/>
           <w:sz w:val="96"/>
           <w:szCs w:val="96"/>
-          <w:rPrChange w:id="336" w:author="kyle O'Reilly" w:date="2026-10-21T23:49:00Z" w16du:dateUtc="2026-10-21T22:49:00Z">
+          <w:rPrChange w:id="354" w:author="kyle O'Reilly" w:date="2026-10-21T23:49:00Z" w16du:dateUtc="2026-10-21T22:49:00Z">
             <w:rPr>
-              <w:ins w:id="337" w:author="kyle O'Reilly" w:date="2026-10-21T23:49:00Z" w16du:dateUtc="2026-10-21T22:49:00Z"/>
+              <w:ins w:id="355" w:author="kyle O'Reilly" w:date="2026-10-21T23:49:00Z" w16du:dateUtc="2026-10-21T22:49:00Z"/>
             </w:rPr>
           </w:rPrChange>
         </w:rPr>
@@ -4511,20 +4561,20 @@
         <w:rPr>
           <w:sz w:val="96"/>
           <w:szCs w:val="96"/>
-          <w:rPrChange w:id="338" w:author="kyle O'Reilly" w:date="2026-10-21T23:49:00Z" w16du:dateUtc="2026-10-21T22:49:00Z">
+          <w:rPrChange w:id="356" w:author="kyle O'Reilly" w:date="2026-10-21T23:49:00Z" w16du:dateUtc="2026-10-21T22:49:00Z">
             <w:rPr/>
           </w:rPrChange>
         </w:rPr>
-        <w:pPrChange w:id="339" w:author="kyle O'Reilly" w:date="2026-10-21T23:49:00Z" w16du:dateUtc="2026-10-21T22:49:00Z">
+        <w:pPrChange w:id="357" w:author="kyle O'Reilly" w:date="2026-10-21T23:49:00Z" w16du:dateUtc="2026-10-21T22:49:00Z">
           <w:pPr/>
         </w:pPrChange>
       </w:pPr>
-      <w:ins w:id="340" w:author="kyle O'Reilly" w:date="2026-10-21T23:49:00Z" w16du:dateUtc="2026-10-21T22:49:00Z">
+      <w:ins w:id="358" w:author="kyle O'Reilly" w:date="2026-10-21T23:49:00Z" w16du:dateUtc="2026-10-21T22:49:00Z">
         <w:r>
           <w:rPr>
             <w:sz w:val="96"/>
             <w:szCs w:val="96"/>
-            <w:rPrChange w:id="341" w:author="kyle O'Reilly" w:date="2026-10-21T23:49:00Z" w16du:dateUtc="2026-10-21T22:49:00Z">
+            <w:rPrChange w:id="359" w:author="kyle O'Reilly" w:date="2026-10-21T23:49:00Z" w16du:dateUtc="2026-10-21T22:49:00Z">
               <w:rPr/>
             </w:rPrChange>
           </w:rPr>
@@ -7084,6 +7134,12 @@
 </file>
 
 <file path=customXml/item1.xml><?xml version="1.0" encoding="utf-8"?>
+<go:gDocsCustomXmlDataStorage xmlns:go="http://customooxmlschemas.google.com/" xmlns:r="http://schemas.openxmlformats.org/officeDocument/2006/relationships" uri="GoogleDocsCustomDataVersion2">
+  <go:docsCustomData xmlns:go="http://customooxmlschemas.google.com/" roundtripDataSignature="AMtx7miehlgh2pzFvkmpnhkVaeODs3Wnuw==">CgMxLjAyCGguZ2pkZ3hzMgloLjMwajB6bGwyCWguMWZvYjl0ZTIJaC4zem55c2g3MgloLjJldDkycDAyDmgua2ZranMzcndsMmMxOAByITF6bEVRVXYyWkdtTjZWemdfYk5uaGpmb0x1c2hhYUo3dw==</go:docsCustomData>
+</go:gDocsCustomXmlDataStorage>
+</file>
+
+<file path=customXml/item2.xml><?xml version="1.0" encoding="utf-8"?>
 <p:properties xmlns:p="http://schemas.microsoft.com/office/2006/metadata/properties" xmlns:xsi="http://www.w3.org/2001/XMLSchema-instance" xmlns:pc="http://schemas.microsoft.com/office/infopath/2007/PartnerControls">
   <documentManagement>
     <_activity xmlns="b16a9495-4dfd-42d3-807b-98cb11f03b43" xsi:nil="true"/>
@@ -7091,13 +7147,20 @@
 </p:properties>
 </file>
 
-<file path=customXml/item2.xml><?xml version="1.0" encoding="utf-8"?>
-<go:gDocsCustomXmlDataStorage xmlns:go="http://customooxmlschemas.google.com/" xmlns:r="http://schemas.openxmlformats.org/officeDocument/2006/relationships" uri="GoogleDocsCustomDataVersion2">
-  <go:docsCustomData xmlns:go="http://customooxmlschemas.google.com/" roundtripDataSignature="AMtx7miehlgh2pzFvkmpnhkVaeODs3Wnuw==">CgMxLjAyCGguZ2pkZ3hzMgloLjMwajB6bGwyCWguMWZvYjl0ZTIJaC4zem55c2g3MgloLjJldDkycDAyDmgua2ZranMzcndsMmMxOAByITF6bEVRVXYyWkdtTjZWemdfYk5uaGpmb0x1c2hhYUo3dw==</go:docsCustomData>
-</go:gDocsCustomXmlDataStorage>
+<file path=customXml/item3.xml><?xml version="1.0" encoding="utf-8"?>
+<?mso-contentType ?>
+<FormTemplates xmlns="http://schemas.microsoft.com/sharepoint/v3/contenttype/forms">
+  <Display>DocumentLibraryForm</Display>
+  <Edit>DocumentLibraryForm</Edit>
+  <New>DocumentLibraryForm</New>
+</FormTemplates>
 </file>
 
-<file path=customXml/item3.xml><?xml version="1.0" encoding="utf-8"?>
+<file path=customXml/item4.xml><?xml version="1.0" encoding="utf-8"?>
+<b:Sources xmlns:b="http://schemas.openxmlformats.org/officeDocument/2006/bibliography" xmlns="http://schemas.openxmlformats.org/officeDocument/2006/bibliography" SelectedStyle="\APASixthEditionOfficeOnline.xsl" StyleName="APA" Version="6"/>
+</file>
+
+<file path=customXml/item5.xml><?xml version="1.0" encoding="utf-8"?>
 <ct:contentTypeSchema xmlns:ct="http://schemas.microsoft.com/office/2006/metadata/contentType" xmlns:ma="http://schemas.microsoft.com/office/2006/metadata/properties/metaAttributes" ct:_="" ma:_="" ma:contentTypeName="Document" ma:contentTypeID="0x01010091CA7052A48FB44E8BAE44044031FC77" ma:contentTypeVersion="5" ma:contentTypeDescription="Create a new document." ma:contentTypeScope="" ma:versionID="72110da391d7bf7bbbd9879cda66318c">
   <xsd:schema xmlns:xsd="http://www.w3.org/2001/XMLSchema" xmlns:xs="http://www.w3.org/2001/XMLSchema" xmlns:p="http://schemas.microsoft.com/office/2006/metadata/properties" xmlns:ns3="b16a9495-4dfd-42d3-807b-98cb11f03b43" targetNamespace="http://schemas.microsoft.com/office/2006/metadata/properties" ma:root="true" ma:fieldsID="65d4c4ab10123b5e2192ffab3149626d" ns3:_="">
     <xsd:import namespace="b16a9495-4dfd-42d3-807b-98cb11f03b43"/>
@@ -7247,20 +7310,16 @@
 </ct:contentTypeSchema>
 </file>
 
-<file path=customXml/item4.xml><?xml version="1.0" encoding="utf-8"?>
-<b:Sources xmlns:b="http://schemas.openxmlformats.org/officeDocument/2006/bibliography" xmlns="http://schemas.openxmlformats.org/officeDocument/2006/bibliography" SelectedStyle="\APASixthEditionOfficeOnline.xsl" StyleName="APA" Version="6"/>
+<file path=customXml/itemProps1.xml><?xml version="1.0" encoding="utf-8"?>
+<ds:datastoreItem xmlns:ds="http://schemas.openxmlformats.org/officeDocument/2006/customXml" ds:itemID="{11111111-1234-1234-1234-123412341234}">
+  <ds:schemaRefs>
+    <ds:schemaRef ds:uri="http://customooxmlschemas.google.com/"/>
+    <ds:schemaRef ds:uri="http://schemas.openxmlformats.org/officeDocument/2006/relationships"/>
+  </ds:schemaRefs>
+</ds:datastoreItem>
 </file>
 
-<file path=customXml/item5.xml><?xml version="1.0" encoding="utf-8"?>
-<?mso-contentType ?>
-<FormTemplates xmlns="http://schemas.microsoft.com/sharepoint/v3/contenttype/forms">
-  <Display>DocumentLibraryForm</Display>
-  <Edit>DocumentLibraryForm</Edit>
-  <New>DocumentLibraryForm</New>
-</FormTemplates>
-</file>
-
-<file path=customXml/itemProps1.xml><?xml version="1.0" encoding="utf-8"?>
+<file path=customXml/itemProps2.xml><?xml version="1.0" encoding="utf-8"?>
 <ds:datastoreItem xmlns:ds="http://schemas.openxmlformats.org/officeDocument/2006/customXml" ds:itemID="{D51EB97A-8C7A-4EE1-A3AD-E57FDBFA6BEE}">
   <ds:schemaRefs>
     <ds:schemaRef ds:uri="http://schemas.microsoft.com/office/2006/metadata/properties"/>
@@ -7270,16 +7329,23 @@
 </ds:datastoreItem>
 </file>
 
-<file path=customXml/itemProps2.xml><?xml version="1.0" encoding="utf-8"?>
-<ds:datastoreItem xmlns:ds="http://schemas.openxmlformats.org/officeDocument/2006/customXml" ds:itemID="{11111111-1234-1234-1234-123412341234}">
+<file path=customXml/itemProps3.xml><?xml version="1.0" encoding="utf-8"?>
+<ds:datastoreItem xmlns:ds="http://schemas.openxmlformats.org/officeDocument/2006/customXml" ds:itemID="{AD64260C-1345-4C21-A804-B9FBE7B91489}">
   <ds:schemaRefs>
-    <ds:schemaRef ds:uri="http://customooxmlschemas.google.com/"/>
-    <ds:schemaRef ds:uri="http://schemas.openxmlformats.org/officeDocument/2006/relationships"/>
+    <ds:schemaRef ds:uri="http://schemas.microsoft.com/sharepoint/v3/contenttype/forms"/>
   </ds:schemaRefs>
 </ds:datastoreItem>
 </file>
 
-<file path=customXml/itemProps3.xml><?xml version="1.0" encoding="utf-8"?>
+<file path=customXml/itemProps4.xml><?xml version="1.0" encoding="utf-8"?>
+<ds:datastoreItem xmlns:ds="http://schemas.openxmlformats.org/officeDocument/2006/customXml" ds:itemID="{A5C61161-19E4-4D42-A5DA-EC591AFE0A7D}">
+  <ds:schemaRefs>
+    <ds:schemaRef ds:uri="http://schemas.openxmlformats.org/officeDocument/2006/bibliography"/>
+  </ds:schemaRefs>
+</ds:datastoreItem>
+</file>
+
+<file path=customXml/itemProps5.xml><?xml version="1.0" encoding="utf-8"?>
 <ds:datastoreItem xmlns:ds="http://schemas.openxmlformats.org/officeDocument/2006/customXml" ds:itemID="{1CD39011-2B34-4226-8638-59B13D86301D}">
   <ds:schemaRefs>
     <ds:schemaRef ds:uri="http://schemas.microsoft.com/office/2006/metadata/contentType"/>
@@ -7295,20 +7361,4 @@
     <ds:schemaRef ds:uri="http://schemas.microsoft.com/internal/obd"/>
   </ds:schemaRefs>
 </ds:datastoreItem>
-</file>
-
-<file path=customXml/itemProps4.xml><?xml version="1.0" encoding="utf-8"?>
-<ds:datastoreItem xmlns:ds="http://schemas.openxmlformats.org/officeDocument/2006/customXml" ds:itemID="{A5C61161-19E4-4D42-A5DA-EC591AFE0A7D}">
-  <ds:schemaRefs>
-    <ds:schemaRef ds:uri="http://schemas.openxmlformats.org/officeDocument/2006/bibliography"/>
-  </ds:schemaRefs>
-</ds:datastoreItem>
-</file>
-
-<file path=customXml/itemProps5.xml><?xml version="1.0" encoding="utf-8"?>
-<ds:datastoreItem xmlns:ds="http://schemas.openxmlformats.org/officeDocument/2006/customXml" ds:itemID="{AD64260C-1345-4C21-A804-B9FBE7B91489}">
-  <ds:schemaRefs>
-    <ds:schemaRef ds:uri="http://schemas.microsoft.com/sharepoint/v3/contenttype/forms"/>
-  </ds:schemaRefs>
-</ds:datastoreItem>
 </file>
</xml_diff>

<commit_message>
Completed Project Timeline section
</commit_message>
<xml_diff>
--- a/HDSDAB - Strategic Thinking - Capstone Project.docx
+++ b/HDSDAB - Strategic Thinking - Capstone Project.docx
@@ -814,14 +814,7 @@
                                 <w:color w:val="000000"/>
                                 <w:sz w:val="28"/>
                               </w:rPr>
-                              <w:t xml:space="preserve">By submitting this assessment, I confirm that I have read the CCT policy on academic misconduct and understand the implications of submitting work that is not my own or does not appropriately reference material </w:t>
-                            </w:r>
-                            <w:r>
-                              <w:rPr>
-                                <w:color w:val="000000"/>
-                                <w:sz w:val="28"/>
-                              </w:rPr>
-                              <w:t xml:space="preserve">taken from a third party or other source. </w:t>
+                              <w:t xml:space="preserve">By submitting this assessment, I confirm that I have read the CCT policy on academic misconduct and understand the implications of submitting work that is not my own or does not appropriately reference material taken from a third party or other source. </w:t>
                             </w:r>
                           </w:p>
                           <w:p>
@@ -915,14 +908,7 @@
                           <w:color w:val="000000"/>
                           <w:sz w:val="28"/>
                         </w:rPr>
-                        <w:t xml:space="preserve">By submitting this assessment, I confirm that I have read the CCT policy on academic misconduct and understand the implications of submitting work that is not my own or does not appropriately reference material </w:t>
-                      </w:r>
-                      <w:r>
-                        <w:rPr>
-                          <w:color w:val="000000"/>
-                          <w:sz w:val="28"/>
-                        </w:rPr>
-                        <w:t xml:space="preserve">taken from a third party or other source. </w:t>
+                        <w:t xml:space="preserve">By submitting this assessment, I confirm that I have read the CCT policy on academic misconduct and understand the implications of submitting work that is not my own or does not appropriately reference material taken from a third party or other source. </w:t>
                       </w:r>
                     </w:p>
                     <w:p>
@@ -3812,7 +3798,9 @@
     <w:p>
       <w:pPr>
         <w:pStyle w:val="Heading1"/>
-        <w:pPrChange w:id="247" w:author="kyle O'Reilly" w:date="2026-10-21T20:41:00Z" w16du:dateUtc="2026-10-21T19:41:00Z">
+        <w:spacing w:line="360" w:lineRule="auto"/>
+        <w:jc w:val="both"/>
+        <w:pPrChange w:id="247" w:author="kyle O'Reilly" w:date="2026-10-22T18:43:00Z" w16du:dateUtc="2026-10-22T17:43:00Z">
           <w:pPr/>
         </w:pPrChange>
       </w:pPr>
@@ -3826,16 +3814,179 @@
       <w:bookmarkEnd w:id="248"/>
     </w:p>
     <w:p>
-      <w:ins w:id="250" w:author="kyle O'Reilly" w:date="2026-10-21T20:41:00Z" w16du:dateUtc="2026-10-21T19:41:00Z">
-        <w:r>
-          <w:t>?</w:t>
-        </w:r>
-      </w:ins>
-    </w:p>
-    <w:p>
-      <w:pPr>
-        <w:rPr>
-          <w:ins w:id="251" w:author="kyle O'Reilly" w:date="2026-10-21T20:41:00Z" w16du:dateUtc="2026-10-21T19:41:00Z"/>
+      <w:pPr>
+        <w:spacing w:line="360" w:lineRule="auto"/>
+        <w:jc w:val="both"/>
+        <w:rPr>
+          <w:ins w:id="250" w:author="kyle O'Reilly" w:date="2026-10-22T18:18:00Z" w16du:dateUtc="2026-10-22T17:18:00Z"/>
+        </w:rPr>
+        <w:pPrChange w:id="251" w:author="kyle O'Reilly" w:date="2026-10-22T18:43:00Z" w16du:dateUtc="2026-10-22T17:43:00Z">
+          <w:pPr/>
+        </w:pPrChange>
+      </w:pPr>
+      <w:ins w:id="252" w:author="kyle O'Reilly" w:date="2026-10-22T18:13:00Z" w16du:dateUtc="2026-10-22T17:13:00Z">
+        <w:r>
+          <w:t>This Capstone Pro</w:t>
+        </w:r>
+      </w:ins>
+      <w:ins w:id="253" w:author="kyle O'Reilly" w:date="2026-10-22T18:15:00Z" w16du:dateUtc="2026-10-22T17:15:00Z">
+        <w:r>
+          <w:t xml:space="preserve">ject </w:t>
+        </w:r>
+        <w:r>
+          <w:t>is planned across academic semesters</w:t>
+        </w:r>
+      </w:ins>
+      <w:ins w:id="254" w:author="kyle O'Reilly" w:date="2026-10-22T18:16:00Z" w16du:dateUtc="2026-10-22T17:16:00Z">
+        <w:r>
+          <w:t xml:space="preserve">. The first semester </w:t>
+        </w:r>
+        <w:r>
+          <w:t>will focus on the research question, literature, published volatility evidence</w:t>
+        </w:r>
+        <w:r>
+          <w:t xml:space="preserve">, data source </w:t>
+        </w:r>
+      </w:ins>
+      <w:ins w:id="255" w:author="kyle O'Reilly" w:date="2026-10-22T18:17:00Z" w16du:dateUtc="2026-10-22T17:17:00Z">
+        <w:r>
+          <w:t>and methodology. The second will focus on data preparation, model development, predictions</w:t>
+        </w:r>
+        <w:r>
+          <w:t>, evaluation, r</w:t>
+        </w:r>
+      </w:ins>
+      <w:ins w:id="256" w:author="kyle O'Reilly" w:date="2026-10-22T18:18:00Z" w16du:dateUtc="2026-10-22T17:18:00Z">
+        <w:r>
+          <w:t>eporting</w:t>
+        </w:r>
+        <w:r>
+          <w:t xml:space="preserve"> and submission. The </w:t>
+        </w:r>
+      </w:ins>
+      <w:ins w:id="257" w:author="kyle O'Reilly" w:date="2026-10-22T18:43:00Z" w16du:dateUtc="2026-10-22T17:43:00Z">
+        <w:r>
+          <w:t xml:space="preserve">proposed </w:t>
+        </w:r>
+      </w:ins>
+      <w:ins w:id="258" w:author="kyle O'Reilly" w:date="2026-10-22T18:18:00Z" w16du:dateUtc="2026-10-22T17:18:00Z">
+        <w:r>
+          <w:t>illustrate Gantt Chart</w:t>
+        </w:r>
+      </w:ins>
+      <w:ins w:id="259" w:author="kyle O'Reilly" w:date="2026-10-22T18:43:00Z" w16du:dateUtc="2026-10-22T17:43:00Z">
+        <w:r>
+          <w:t xml:space="preserve"> (See Figure 1)</w:t>
+        </w:r>
+      </w:ins>
+      <w:ins w:id="260" w:author="kyle O'Reilly" w:date="2026-10-22T18:18:00Z" w16du:dateUtc="2026-10-22T17:18:00Z">
+        <w:r>
+          <w:t xml:space="preserve"> below will be adjusted to the confirmed academic calendar.</w:t>
+        </w:r>
+      </w:ins>
+    </w:p>
+    <w:p>
+      <w:pPr>
+        <w:keepNext/>
+        <w:jc w:val="center"/>
+        <w:rPr>
+          <w:ins w:id="261" w:author="kyle O'Reilly" w:date="2026-10-22T18:40:00Z" w16du:dateUtc="2026-10-22T17:40:00Z"/>
+        </w:rPr>
+        <w:pPrChange w:id="262" w:author="kyle O'Reilly" w:date="2026-10-22T18:40:00Z" w16du:dateUtc="2026-10-22T17:40:00Z">
+          <w:pPr/>
+        </w:pPrChange>
+      </w:pPr>
+      <w:ins w:id="263" w:author="kyle O'Reilly" w:date="2026-10-22T18:42:00Z" w16du:dateUtc="2026-10-22T17:42:00Z">
+        <w:r>
+          <w:drawing>
+            <wp:inline distT="0" distB="0" distL="0" distR="0" wp14:anchorId="5A0A1F10" wp14:editId="68003201">
+              <wp:extent cx="5731510" cy="2573655"/>
+              <wp:effectExtent l="0" t="0" r="2540" b="0"/>
+              <wp:docPr id="1496030587" name="Picture 1"/>
+              <wp:cNvGraphicFramePr>
+                <a:graphicFrameLocks xmlns:a="http://schemas.openxmlformats.org/drawingml/2006/main" noChangeAspect="1"/>
+              </wp:cNvGraphicFramePr>
+              <a:graphic xmlns:a="http://schemas.openxmlformats.org/drawingml/2006/main">
+                <a:graphicData uri="http://schemas.openxmlformats.org/drawingml/2006/picture">
+                  <pic:pic xmlns:pic="http://schemas.openxmlformats.org/drawingml/2006/picture">
+                    <pic:nvPicPr>
+                      <pic:cNvPr id="1496030587" name=""/>
+                      <pic:cNvPicPr/>
+                    </pic:nvPicPr>
+                    <pic:blipFill>
+                      <a:blip r:embed="rId14"/>
+                      <a:stretch>
+                        <a:fillRect/>
+                      </a:stretch>
+                    </pic:blipFill>
+                    <pic:spPr>
+                      <a:xfrm>
+                        <a:off x="0" y="0"/>
+                        <a:ext cx="5731510" cy="2573655"/>
+                      </a:xfrm>
+                      <a:prstGeom prst="rect">
+                        <a:avLst/>
+                      </a:prstGeom>
+                    </pic:spPr>
+                  </pic:pic>
+                </a:graphicData>
+              </a:graphic>
+            </wp:inline>
+          </w:drawing>
+        </w:r>
+      </w:ins>
+    </w:p>
+    <w:p>
+      <w:pPr>
+        <w:pStyle w:val="Caption"/>
+        <w:jc w:val="center"/>
+        <w:rPr>
+          <w:ins w:id="264" w:author="kyle O'Reilly" w:date="2026-10-22T18:18:00Z" w16du:dateUtc="2026-10-22T17:18:00Z"/>
+        </w:rPr>
+        <w:pPrChange w:id="265" w:author="kyle O'Reilly" w:date="2026-10-22T18:40:00Z" w16du:dateUtc="2026-10-22T17:40:00Z">
+          <w:pPr/>
+        </w:pPrChange>
+      </w:pPr>
+      <w:ins w:id="266" w:author="kyle O'Reilly" w:date="2026-10-22T18:40:00Z" w16du:dateUtc="2026-10-22T17:40:00Z">
+        <w:r>
+          <w:t xml:space="preserve">Figure </w:t>
+        </w:r>
+        <w:r>
+          <w:fldChar w:fldCharType="begin"/>
+        </w:r>
+        <w:r>
+          <w:instrText xml:space="preserve"> SEQ Figure \* ARABIC </w:instrText>
+        </w:r>
+      </w:ins>
+      <w:r>
+        <w:fldChar w:fldCharType="separate"/>
+      </w:r>
+      <w:ins w:id="267" w:author="kyle O'Reilly" w:date="2026-10-22T18:40:00Z" w16du:dateUtc="2026-10-22T17:40:00Z">
+        <w:r>
+          <w:rPr>
+            <w:noProof/>
+          </w:rPr>
+          <w:t>1</w:t>
+        </w:r>
+        <w:r>
+          <w:fldChar w:fldCharType="end"/>
+        </w:r>
+        <w:r>
+          <w:t>: Capstone Project - Project Timeline</w:t>
+        </w:r>
+      </w:ins>
+    </w:p>
+    <w:p>
+      <w:pPr>
+        <w:rPr>
+          <w:del w:id="268" w:author="kyle O'Reilly" w:date="2026-10-22T18:41:00Z" w16du:dateUtc="2026-10-22T17:41:00Z"/>
+        </w:rPr>
+      </w:pPr>
+    </w:p>
+    <w:p>
+      <w:pPr>
+        <w:rPr>
+          <w:ins w:id="269" w:author="kyle O'Reilly" w:date="2026-10-21T20:41:00Z" w16du:dateUtc="2026-10-21T19:41:00Z"/>
         </w:rPr>
       </w:pPr>
     </w:p>
@@ -3845,18 +3996,18 @@
         <w:spacing w:line="360" w:lineRule="auto"/>
         <w:jc w:val="both"/>
         <w:rPr>
-          <w:ins w:id="252" w:author="kyle O'Reilly" w:date="2026-10-21T20:41:00Z" w16du:dateUtc="2026-10-21T19:41:00Z"/>
-        </w:rPr>
-        <w:pPrChange w:id="253" w:author="kyle O'Reilly" w:date="2026-10-21T23:07:00Z" w16du:dateUtc="2026-10-21T22:07:00Z">
+          <w:ins w:id="270" w:author="kyle O'Reilly" w:date="2026-10-21T20:41:00Z" w16du:dateUtc="2026-10-21T19:41:00Z"/>
+        </w:rPr>
+        <w:pPrChange w:id="271" w:author="kyle O'Reilly" w:date="2026-10-21T23:07:00Z" w16du:dateUtc="2026-10-21T22:07:00Z">
           <w:pPr/>
         </w:pPrChange>
       </w:pPr>
-      <w:bookmarkStart w:id="254" w:name="_Toc243520532"/>
-      <w:ins w:id="255" w:author="kyle O'Reilly" w:date="2026-10-21T20:41:00Z" w16du:dateUtc="2026-10-21T19:41:00Z">
+      <w:bookmarkStart w:id="272" w:name="_Toc243520532"/>
+      <w:ins w:id="273" w:author="kyle O'Reilly" w:date="2026-10-21T20:41:00Z" w16du:dateUtc="2026-10-21T19:41:00Z">
         <w:r>
           <w:t>10. Ethical and Legal Considerations</w:t>
         </w:r>
-        <w:bookmarkEnd w:id="254"/>
+        <w:bookmarkEnd w:id="272"/>
       </w:ins>
     </w:p>
     <w:p>
@@ -3864,18 +4015,18 @@
         <w:spacing w:line="360" w:lineRule="auto"/>
         <w:jc w:val="both"/>
         <w:rPr>
-          <w:ins w:id="256" w:author="kyle O'Reilly" w:date="2026-10-21T20:46:00Z" w16du:dateUtc="2026-10-21T19:46:00Z"/>
-        </w:rPr>
-        <w:pPrChange w:id="257" w:author="kyle O'Reilly" w:date="2026-10-21T23:07:00Z" w16du:dateUtc="2026-10-21T22:07:00Z">
+          <w:ins w:id="274" w:author="kyle O'Reilly" w:date="2026-10-21T20:46:00Z" w16du:dateUtc="2026-10-21T19:46:00Z"/>
+        </w:rPr>
+        <w:pPrChange w:id="275" w:author="kyle O'Reilly" w:date="2026-10-21T23:07:00Z" w16du:dateUtc="2026-10-21T22:07:00Z">
           <w:pPr/>
         </w:pPrChange>
       </w:pPr>
-      <w:ins w:id="258" w:author="kyle O'Reilly" w:date="2026-10-21T20:42:00Z" w16du:dateUtc="2026-10-21T19:42:00Z">
+      <w:ins w:id="276" w:author="kyle O'Reilly" w:date="2026-10-21T20:42:00Z" w16du:dateUtc="2026-10-21T19:42:00Z">
         <w:r>
           <w:t>This C</w:t>
         </w:r>
       </w:ins>
-      <w:ins w:id="259" w:author="kyle O'Reilly" w:date="2026-10-21T20:43:00Z" w16du:dateUtc="2026-10-21T19:43:00Z">
+      <w:ins w:id="277" w:author="kyle O'Reilly" w:date="2026-10-21T20:43:00Z" w16du:dateUtc="2026-10-21T19:43:00Z">
         <w:r>
           <w:t xml:space="preserve">apstone Project will use </w:t>
         </w:r>
@@ -3886,12 +4037,12 @@
           <w:t>historical stock</w:t>
         </w:r>
       </w:ins>
-      <w:ins w:id="260" w:author="kyle O'Reilly" w:date="2026-10-21T22:01:00Z" w16du:dateUtc="2026-10-21T21:01:00Z">
+      <w:ins w:id="278" w:author="kyle O'Reilly" w:date="2026-10-21T22:01:00Z" w16du:dateUtc="2026-10-21T21:01:00Z">
         <w:r>
           <w:t xml:space="preserve"> </w:t>
         </w:r>
       </w:ins>
-      <w:ins w:id="261" w:author="kyle O'Reilly" w:date="2026-10-21T20:43:00Z" w16du:dateUtc="2026-10-21T19:43:00Z">
+      <w:ins w:id="279" w:author="kyle O'Reilly" w:date="2026-10-21T20:43:00Z" w16du:dateUtc="2026-10-21T19:43:00Z">
         <w:r>
           <w:t xml:space="preserve">data </w:t>
         </w:r>
@@ -3902,7 +4053,7 @@
           <w:t xml:space="preserve">collect personal information or involve human </w:t>
         </w:r>
       </w:ins>
-      <w:ins w:id="262" w:author="kyle O'Reilly" w:date="2026-10-21T20:44:00Z" w16du:dateUtc="2026-10-21T19:44:00Z">
+      <w:ins w:id="280" w:author="kyle O'Reilly" w:date="2026-10-21T20:44:00Z" w16du:dateUtc="2026-10-21T19:44:00Z">
         <w:r>
           <w:t>participants. Stooq data access and usage conditions, and any Trading 212</w:t>
         </w:r>
@@ -3910,22 +4061,22 @@
           <w:t xml:space="preserve"> information reused in the report, will be reviewed and appropriately attributed</w:t>
         </w:r>
       </w:ins>
-      <w:ins w:id="263" w:author="kyle O'Reilly" w:date="2026-10-21T20:45:00Z" w16du:dateUtc="2026-10-21T19:45:00Z">
+      <w:ins w:id="281" w:author="kyle O'Reilly" w:date="2026-10-21T20:45:00Z" w16du:dateUtc="2026-10-21T19:45:00Z">
         <w:r>
           <w:t xml:space="preserve">. Historical stock </w:t>
         </w:r>
       </w:ins>
-      <w:ins w:id="264" w:author="kyle O'Reilly" w:date="2026-10-21T22:03:00Z" w16du:dateUtc="2026-10-21T21:03:00Z">
+      <w:ins w:id="282" w:author="kyle O'Reilly" w:date="2026-10-21T22:03:00Z" w16du:dateUtc="2026-10-21T21:03:00Z">
         <w:r>
           <w:t xml:space="preserve">market </w:t>
         </w:r>
       </w:ins>
-      <w:ins w:id="265" w:author="kyle O'Reilly" w:date="2026-10-21T20:45:00Z" w16du:dateUtc="2026-10-21T19:45:00Z">
+      <w:ins w:id="283" w:author="kyle O'Reilly" w:date="2026-10-21T20:45:00Z" w16du:dateUtc="2026-10-21T19:45:00Z">
         <w:r>
           <w:t xml:space="preserve">data </w:t>
         </w:r>
       </w:ins>
-      <w:ins w:id="266" w:author="kyle O'Reilly" w:date="2026-10-21T22:11:00Z" w16du:dateUtc="2026-10-21T21:11:00Z">
+      <w:ins w:id="284" w:author="kyle O'Reilly" w:date="2026-10-21T22:11:00Z" w16du:dateUtc="2026-10-21T21:11:00Z">
         <w:r>
           <w:t>Comma</w:t>
         </w:r>
@@ -3936,37 +4087,37 @@
           <w:t>(</w:t>
         </w:r>
       </w:ins>
-      <w:ins w:id="267" w:author="kyle O'Reilly" w:date="2026-10-21T22:05:00Z" w16du:dateUtc="2026-10-21T21:05:00Z">
+      <w:ins w:id="285" w:author="kyle O'Reilly" w:date="2026-10-21T22:05:00Z" w16du:dateUtc="2026-10-21T21:05:00Z">
         <w:r>
           <w:t>CSV</w:t>
         </w:r>
       </w:ins>
-      <w:ins w:id="268" w:author="kyle O'Reilly" w:date="2026-10-21T22:11:00Z" w16du:dateUtc="2026-10-21T21:11:00Z">
+      <w:ins w:id="286" w:author="kyle O'Reilly" w:date="2026-10-21T22:11:00Z" w16du:dateUtc="2026-10-21T21:11:00Z">
         <w:r>
           <w:t>)</w:t>
         </w:r>
       </w:ins>
-      <w:ins w:id="269" w:author="kyle O'Reilly" w:date="2026-10-21T22:05:00Z" w16du:dateUtc="2026-10-21T21:05:00Z">
+      <w:ins w:id="287" w:author="kyle O'Reilly" w:date="2026-10-21T22:05:00Z" w16du:dateUtc="2026-10-21T21:05:00Z">
         <w:r>
           <w:t xml:space="preserve"> </w:t>
         </w:r>
       </w:ins>
-      <w:ins w:id="270" w:author="kyle O'Reilly" w:date="2026-10-21T20:45:00Z" w16du:dateUtc="2026-10-21T19:45:00Z">
+      <w:ins w:id="288" w:author="kyle O'Reilly" w:date="2026-10-21T20:45:00Z" w16du:dateUtc="2026-10-21T19:45:00Z">
         <w:r>
           <w:t>files</w:t>
         </w:r>
       </w:ins>
-      <w:ins w:id="271" w:author="kyle O'Reilly" w:date="2026-10-21T22:07:00Z" w16du:dateUtc="2026-10-21T21:07:00Z">
+      <w:ins w:id="289" w:author="kyle O'Reilly" w:date="2026-10-21T22:07:00Z" w16du:dateUtc="2026-10-21T21:07:00Z">
         <w:r>
           <w:t xml:space="preserve"> downloaded from S</w:t>
         </w:r>
       </w:ins>
-      <w:ins w:id="272" w:author="kyle O'Reilly" w:date="2026-10-21T22:08:00Z" w16du:dateUtc="2026-10-21T21:08:00Z">
+      <w:ins w:id="290" w:author="kyle O'Reilly" w:date="2026-10-21T22:08:00Z" w16du:dateUtc="2026-10-21T21:08:00Z">
         <w:r>
           <w:t>tooq</w:t>
         </w:r>
       </w:ins>
-      <w:ins w:id="273" w:author="kyle O'Reilly" w:date="2026-10-21T20:45:00Z" w16du:dateUtc="2026-10-21T19:45:00Z">
+      <w:ins w:id="291" w:author="kyle O'Reilly" w:date="2026-10-21T20:45:00Z" w16du:dateUtc="2026-10-21T19:45:00Z">
         <w:r>
           <w:t xml:space="preserve"> </w:t>
         </w:r>
@@ -3974,37 +4125,37 @@
           <w:t xml:space="preserve">will only be </w:t>
         </w:r>
       </w:ins>
-      <w:ins w:id="274" w:author="kyle O'Reilly" w:date="2026-10-21T22:08:00Z" w16du:dateUtc="2026-10-21T21:08:00Z">
+      <w:ins w:id="292" w:author="kyle O'Reilly" w:date="2026-10-21T22:08:00Z" w16du:dateUtc="2026-10-21T21:08:00Z">
         <w:r>
           <w:t>uploaded to</w:t>
         </w:r>
       </w:ins>
-      <w:ins w:id="275" w:author="kyle O'Reilly" w:date="2026-10-21T20:45:00Z" w16du:dateUtc="2026-10-21T19:45:00Z">
+      <w:ins w:id="293" w:author="kyle O'Reilly" w:date="2026-10-21T20:45:00Z" w16du:dateUtc="2026-10-21T19:45:00Z">
         <w:r>
           <w:t xml:space="preserve"> </w:t>
         </w:r>
       </w:ins>
-      <w:ins w:id="276" w:author="kyle O'Reilly" w:date="2026-10-21T20:48:00Z" w16du:dateUtc="2026-10-21T19:48:00Z">
+      <w:ins w:id="294" w:author="kyle O'Reilly" w:date="2026-10-21T20:48:00Z" w16du:dateUtc="2026-10-21T19:48:00Z">
         <w:r>
           <w:t>GitHub</w:t>
         </w:r>
       </w:ins>
-      <w:ins w:id="277" w:author="kyle O'Reilly" w:date="2026-10-21T20:45:00Z" w16du:dateUtc="2026-10-21T19:45:00Z">
+      <w:ins w:id="295" w:author="kyle O'Reilly" w:date="2026-10-21T20:45:00Z" w16du:dateUtc="2026-10-21T19:45:00Z">
         <w:r>
           <w:t xml:space="preserve"> </w:t>
         </w:r>
       </w:ins>
-      <w:ins w:id="278" w:author="kyle O'Reilly" w:date="2026-10-21T22:07:00Z" w16du:dateUtc="2026-10-21T21:07:00Z">
+      <w:ins w:id="296" w:author="kyle O'Reilly" w:date="2026-10-21T22:07:00Z" w16du:dateUtc="2026-10-21T21:07:00Z">
         <w:r>
           <w:t>if permitted by Stooq’s terms of service</w:t>
         </w:r>
       </w:ins>
-      <w:ins w:id="279" w:author="kyle O'Reilly" w:date="2026-10-21T20:45:00Z" w16du:dateUtc="2026-10-21T19:45:00Z">
+      <w:ins w:id="297" w:author="kyle O'Reilly" w:date="2026-10-21T20:45:00Z" w16du:dateUtc="2026-10-21T19:45:00Z">
         <w:r>
           <w:t xml:space="preserve">; otherwise, </w:t>
         </w:r>
       </w:ins>
-      <w:ins w:id="280" w:author="kyle O'Reilly" w:date="2026-10-21T22:07:00Z" w16du:dateUtc="2026-10-21T21:07:00Z">
+      <w:ins w:id="298" w:author="kyle O'Reilly" w:date="2026-10-21T22:07:00Z" w16du:dateUtc="2026-10-21T21:07:00Z">
         <w:r>
           <w:t xml:space="preserve">the </w:t>
         </w:r>
@@ -4012,22 +4163,22 @@
           <w:t>Pyt</w:t>
         </w:r>
       </w:ins>
-      <w:ins w:id="281" w:author="kyle O'Reilly" w:date="2026-10-22T00:14:00Z" w16du:dateUtc="2026-10-21T23:14:00Z">
+      <w:ins w:id="299" w:author="kyle O'Reilly" w:date="2026-10-22T00:14:00Z" w16du:dateUtc="2026-10-21T23:14:00Z">
         <w:r>
           <w:t>h</w:t>
         </w:r>
       </w:ins>
-      <w:ins w:id="282" w:author="kyle O'Reilly" w:date="2026-10-21T22:07:00Z" w16du:dateUtc="2026-10-21T21:07:00Z">
+      <w:ins w:id="300" w:author="kyle O'Reilly" w:date="2026-10-21T22:07:00Z" w16du:dateUtc="2026-10-21T21:07:00Z">
         <w:r>
           <w:t xml:space="preserve">on </w:t>
         </w:r>
       </w:ins>
-      <w:ins w:id="283" w:author="kyle O'Reilly" w:date="2026-10-21T20:45:00Z" w16du:dateUtc="2026-10-21T19:45:00Z">
+      <w:ins w:id="301" w:author="kyle O'Reilly" w:date="2026-10-21T20:45:00Z" w16du:dateUtc="2026-10-21T19:45:00Z">
         <w:r>
           <w:t xml:space="preserve">code and retrieval </w:t>
         </w:r>
       </w:ins>
-      <w:ins w:id="284" w:author="kyle O'Reilly" w:date="2026-10-21T20:46:00Z" w16du:dateUtc="2026-10-21T19:46:00Z">
+      <w:ins w:id="302" w:author="kyle O'Reilly" w:date="2026-10-21T20:46:00Z" w16du:dateUtc="2026-10-21T19:46:00Z">
         <w:r>
           <w:t xml:space="preserve">instructions will be provided. </w:t>
         </w:r>
@@ -4038,13 +4189,13 @@
         <w:spacing w:line="360" w:lineRule="auto"/>
         <w:jc w:val="both"/>
         <w:rPr>
-          <w:ins w:id="285" w:author="kyle O'Reilly" w:date="2026-10-21T20:42:00Z" w16du:dateUtc="2026-10-21T19:42:00Z"/>
-        </w:rPr>
-        <w:pPrChange w:id="286" w:author="kyle O'Reilly" w:date="2026-10-21T23:07:00Z" w16du:dateUtc="2026-10-21T22:07:00Z">
+          <w:ins w:id="303" w:author="kyle O'Reilly" w:date="2026-10-21T20:42:00Z" w16du:dateUtc="2026-10-21T19:42:00Z"/>
+        </w:rPr>
+        <w:pPrChange w:id="304" w:author="kyle O'Reilly" w:date="2026-10-21T23:07:00Z" w16du:dateUtc="2026-10-21T22:07:00Z">
           <w:pPr/>
         </w:pPrChange>
       </w:pPr>
-      <w:ins w:id="287" w:author="kyle O'Reilly" w:date="2026-10-21T22:09:00Z" w16du:dateUtc="2026-10-21T21:09:00Z">
+      <w:ins w:id="305" w:author="kyle O'Reilly" w:date="2026-10-21T22:09:00Z" w16du:dateUtc="2026-10-21T21:09:00Z">
         <w:r>
           <w:t>All results</w:t>
         </w:r>
@@ -4052,57 +4203,57 @@
           <w:t>,</w:t>
         </w:r>
       </w:ins>
-      <w:ins w:id="288" w:author="kyle O'Reilly" w:date="2026-10-21T20:47:00Z" w16du:dateUtc="2026-10-21T19:47:00Z">
+      <w:ins w:id="306" w:author="kyle O'Reilly" w:date="2026-10-21T20:47:00Z" w16du:dateUtc="2026-10-21T19:47:00Z">
         <w:r>
           <w:t xml:space="preserve"> including </w:t>
         </w:r>
       </w:ins>
-      <w:ins w:id="289" w:author="kyle O'Reilly" w:date="2026-10-21T22:10:00Z" w16du:dateUtc="2026-10-21T21:10:00Z">
+      <w:ins w:id="307" w:author="kyle O'Reilly" w:date="2026-10-21T22:10:00Z" w16du:dateUtc="2026-10-21T21:10:00Z">
         <w:r>
           <w:t>inaccurate</w:t>
         </w:r>
       </w:ins>
-      <w:ins w:id="290" w:author="kyle O'Reilly" w:date="2026-10-21T20:47:00Z" w16du:dateUtc="2026-10-21T19:47:00Z">
+      <w:ins w:id="308" w:author="kyle O'Reilly" w:date="2026-10-21T20:47:00Z" w16du:dateUtc="2026-10-21T19:47:00Z">
         <w:r>
           <w:t xml:space="preserve"> predictions, will be reported transparently. Th</w:t>
         </w:r>
       </w:ins>
-      <w:ins w:id="291" w:author="kyle O'Reilly" w:date="2026-10-21T22:10:00Z" w16du:dateUtc="2026-10-21T21:10:00Z">
+      <w:ins w:id="309" w:author="kyle O'Reilly" w:date="2026-10-21T22:10:00Z" w16du:dateUtc="2026-10-21T21:10:00Z">
         <w:r>
           <w:t>is Capstone Project</w:t>
         </w:r>
       </w:ins>
-      <w:ins w:id="292" w:author="kyle O'Reilly" w:date="2026-10-21T20:47:00Z" w16du:dateUtc="2026-10-21T19:47:00Z">
+      <w:ins w:id="310" w:author="kyle O'Reilly" w:date="2026-10-21T20:47:00Z" w16du:dateUtc="2026-10-21T19:47:00Z">
         <w:r>
           <w:t xml:space="preserve"> work is for academic purposes</w:t>
         </w:r>
       </w:ins>
-      <w:ins w:id="293" w:author="kyle O'Reilly" w:date="2026-10-21T22:10:00Z" w16du:dateUtc="2026-10-21T21:10:00Z">
+      <w:ins w:id="311" w:author="kyle O'Reilly" w:date="2026-10-21T22:10:00Z" w16du:dateUtc="2026-10-21T21:10:00Z">
         <w:r>
           <w:t xml:space="preserve"> only</w:t>
         </w:r>
       </w:ins>
-      <w:ins w:id="294" w:author="kyle O'Reilly" w:date="2026-10-21T20:47:00Z" w16du:dateUtc="2026-10-21T19:47:00Z">
+      <w:ins w:id="312" w:author="kyle O'Reilly" w:date="2026-10-21T20:47:00Z" w16du:dateUtc="2026-10-21T19:47:00Z">
         <w:r>
           <w:t xml:space="preserve"> and does </w:t>
         </w:r>
       </w:ins>
-      <w:ins w:id="295" w:author="kyle O'Reilly" w:date="2026-10-22T00:14:00Z" w16du:dateUtc="2026-10-21T23:14:00Z">
+      <w:ins w:id="313" w:author="kyle O'Reilly" w:date="2026-10-22T00:14:00Z" w16du:dateUtc="2026-10-21T23:14:00Z">
         <w:r>
           <w:t xml:space="preserve">not </w:t>
         </w:r>
       </w:ins>
-      <w:ins w:id="296" w:author="kyle O'Reilly" w:date="2026-10-21T20:47:00Z" w16du:dateUtc="2026-10-21T19:47:00Z">
+      <w:ins w:id="314" w:author="kyle O'Reilly" w:date="2026-10-21T20:47:00Z" w16du:dateUtc="2026-10-21T19:47:00Z">
         <w:r>
           <w:t>constitute financial inv</w:t>
         </w:r>
       </w:ins>
-      <w:ins w:id="297" w:author="kyle O'Reilly" w:date="2026-10-21T20:48:00Z" w16du:dateUtc="2026-10-21T19:48:00Z">
+      <w:ins w:id="315" w:author="kyle O'Reilly" w:date="2026-10-21T20:48:00Z" w16du:dateUtc="2026-10-21T19:48:00Z">
         <w:r>
           <w:t>estment</w:t>
         </w:r>
       </w:ins>
-      <w:ins w:id="298" w:author="kyle O'Reilly" w:date="2026-10-21T20:47:00Z" w16du:dateUtc="2026-10-21T19:47:00Z">
+      <w:ins w:id="316" w:author="kyle O'Reilly" w:date="2026-10-21T20:47:00Z" w16du:dateUtc="2026-10-21T19:47:00Z">
         <w:r>
           <w:t xml:space="preserve"> advice.</w:t>
         </w:r>
@@ -4111,7 +4262,7 @@
     <w:p>
       <w:pPr>
         <w:rPr>
-          <w:ins w:id="299" w:author="kyle O'Reilly" w:date="2026-10-21T20:42:00Z" w16du:dateUtc="2026-10-21T19:42:00Z"/>
+          <w:ins w:id="317" w:author="kyle O'Reilly" w:date="2026-10-21T20:42:00Z" w16du:dateUtc="2026-10-21T19:42:00Z"/>
         </w:rPr>
       </w:pPr>
     </w:p>
@@ -4119,18 +4270,19 @@
       <w:pPr>
         <w:pStyle w:val="Heading1"/>
         <w:rPr>
-          <w:ins w:id="300" w:author="kyle O'Reilly" w:date="2026-10-21T20:42:00Z" w16du:dateUtc="2026-10-21T19:42:00Z"/>
-        </w:rPr>
-        <w:pPrChange w:id="301" w:author="kyle O'Reilly" w:date="2026-10-21T20:42:00Z" w16du:dateUtc="2026-10-21T19:42:00Z">
+          <w:ins w:id="318" w:author="kyle O'Reilly" w:date="2026-10-21T23:38:00Z" w16du:dateUtc="2026-10-21T22:38:00Z"/>
+        </w:rPr>
+        <w:pPrChange w:id="319" w:author="kyle O'Reilly" w:date="2026-10-22T18:11:00Z" w16du:dateUtc="2026-10-22T17:11:00Z">
           <w:pPr/>
         </w:pPrChange>
       </w:pPr>
-      <w:bookmarkStart w:id="302" w:name="_Toc243520533"/>
-      <w:ins w:id="303" w:author="kyle O'Reilly" w:date="2026-10-21T20:42:00Z" w16du:dateUtc="2026-10-21T19:42:00Z">
-        <w:r>
+      <w:bookmarkStart w:id="320" w:name="_Toc243520533"/>
+      <w:ins w:id="321" w:author="kyle O'Reilly" w:date="2026-10-21T20:42:00Z" w16du:dateUtc="2026-10-21T19:42:00Z">
+        <w:r>
+          <w:lastRenderedPageBreak/>
           <w:t>References</w:t>
         </w:r>
-        <w:bookmarkEnd w:id="302"/>
+        <w:bookmarkEnd w:id="320"/>
         <w:r>
           <w:t xml:space="preserve"> </w:t>
         </w:r>
@@ -4139,17 +4291,10 @@
     <w:p>
       <w:pPr>
         <w:rPr>
-          <w:ins w:id="304" w:author="kyle O'Reilly" w:date="2026-10-21T23:38:00Z" w16du:dateUtc="2026-10-21T22:38:00Z"/>
-        </w:rPr>
-      </w:pPr>
-    </w:p>
-    <w:p>
-      <w:pPr>
-        <w:rPr>
-          <w:ins w:id="305" w:author="kyle O'Reilly" w:date="2026-10-21T23:38:00Z" w16du:dateUtc="2026-10-21T22:38:00Z"/>
-        </w:rPr>
-      </w:pPr>
-      <w:ins w:id="306" w:author="kyle O'Reilly" w:date="2026-10-21T23:38:00Z" w16du:dateUtc="2026-10-21T22:38:00Z">
+          <w:ins w:id="322" w:author="kyle O'Reilly" w:date="2026-10-21T23:38:00Z" w16du:dateUtc="2026-10-21T22:38:00Z"/>
+        </w:rPr>
+      </w:pPr>
+      <w:ins w:id="323" w:author="kyle O'Reilly" w:date="2026-10-21T23:38:00Z" w16du:dateUtc="2026-10-21T22:38:00Z">
         <w:r>
           <w:t xml:space="preserve">Section 7 </w:t>
         </w:r>
@@ -4158,25 +4303,25 @@
     <w:p>
       <w:pPr>
         <w:rPr>
-          <w:ins w:id="307" w:author="kyle O'Reilly" w:date="2026-10-21T23:48:00Z" w16du:dateUtc="2026-10-21T22:48:00Z"/>
-        </w:rPr>
-      </w:pPr>
-      <w:ins w:id="308" w:author="kyle O'Reilly" w:date="2026-10-21T23:50:00Z" w16du:dateUtc="2026-10-21T22:50:00Z">
+          <w:ins w:id="324" w:author="kyle O'Reilly" w:date="2026-10-21T23:48:00Z" w16du:dateUtc="2026-10-21T22:48:00Z"/>
+        </w:rPr>
+      </w:pPr>
+      <w:ins w:id="325" w:author="kyle O'Reilly" w:date="2026-10-21T23:50:00Z" w16du:dateUtc="2026-10-21T22:50:00Z">
         <w:r>
           <w:t>Trading 212</w:t>
         </w:r>
       </w:ins>
-      <w:ins w:id="309" w:author="kyle O'Reilly" w:date="2026-10-21T23:52:00Z" w16du:dateUtc="2026-10-21T22:52:00Z">
+      <w:ins w:id="326" w:author="kyle O'Reilly" w:date="2026-10-21T23:52:00Z" w16du:dateUtc="2026-10-21T22:52:00Z">
         <w:r>
           <w:t xml:space="preserve"> </w:t>
         </w:r>
       </w:ins>
-      <w:ins w:id="310" w:author="kyle O'Reilly" w:date="2026-10-21T23:50:00Z" w16du:dateUtc="2026-10-21T22:50:00Z">
+      <w:ins w:id="327" w:author="kyle O'Reilly" w:date="2026-10-21T23:50:00Z" w16du:dateUtc="2026-10-21T22:50:00Z">
         <w:r>
           <w:t>(n.d.) Trading 212 investment platform. Available at:</w:t>
         </w:r>
       </w:ins>
-      <w:ins w:id="311" w:author="kyle O'Reilly" w:date="2026-10-21T23:51:00Z" w16du:dateUtc="2026-10-21T22:51:00Z">
+      <w:ins w:id="328" w:author="kyle O'Reilly" w:date="2026-10-21T23:51:00Z" w16du:dateUtc="2026-10-21T22:51:00Z">
         <w:r>
           <w:t xml:space="preserve"> </w:t>
         </w:r>
@@ -4208,12 +4353,12 @@
           <w:t xml:space="preserve">  (</w:t>
         </w:r>
       </w:ins>
-      <w:ins w:id="312" w:author="kyle O'Reilly" w:date="2026-10-21T23:50:00Z" w16du:dateUtc="2026-10-21T22:50:00Z">
+      <w:ins w:id="329" w:author="kyle O'Reilly" w:date="2026-10-21T23:50:00Z" w16du:dateUtc="2026-10-21T22:50:00Z">
         <w:r>
           <w:t>Accessed: 2</w:t>
         </w:r>
       </w:ins>
-      <w:ins w:id="313" w:author="kyle O'Reilly" w:date="2026-10-21T23:51:00Z" w16du:dateUtc="2026-10-21T22:51:00Z">
+      <w:ins w:id="330" w:author="kyle O'Reilly" w:date="2026-10-21T23:51:00Z" w16du:dateUtc="2026-10-21T22:51:00Z">
         <w:r>
           <w:t>1 October 2026).</w:t>
         </w:r>
@@ -4222,10 +4367,10 @@
     <w:p>
       <w:pPr>
         <w:rPr>
-          <w:ins w:id="314" w:author="kyle O'Reilly" w:date="2026-10-21T23:53:00Z" w16du:dateUtc="2026-10-21T22:53:00Z"/>
-        </w:rPr>
-      </w:pPr>
-      <w:ins w:id="315" w:author="kyle O'Reilly" w:date="2026-10-21T23:52:00Z" w16du:dateUtc="2026-10-21T22:52:00Z">
+          <w:ins w:id="331" w:author="kyle O'Reilly" w:date="2026-10-21T23:53:00Z" w16du:dateUtc="2026-10-21T22:53:00Z"/>
+        </w:rPr>
+      </w:pPr>
+      <w:ins w:id="332" w:author="kyle O'Reilly" w:date="2026-10-21T23:52:00Z" w16du:dateUtc="2026-10-21T22:52:00Z">
         <w:r>
           <w:t xml:space="preserve">Stooq (n.d.a) </w:t>
         </w:r>
@@ -4233,12 +4378,12 @@
           <w:t>JPMorgan Chase &amp; Co. (JPM.</w:t>
         </w:r>
       </w:ins>
-      <w:ins w:id="316" w:author="kyle O'Reilly" w:date="2026-10-21T23:53:00Z" w16du:dateUtc="2026-10-21T22:53:00Z">
+      <w:ins w:id="333" w:author="kyle O'Reilly" w:date="2026-10-21T23:53:00Z" w16du:dateUtc="2026-10-21T22:53:00Z">
         <w:r>
           <w:t>US) – Historical data. Available at:</w:t>
         </w:r>
       </w:ins>
-      <w:ins w:id="317" w:author="kyle O'Reilly" w:date="2026-10-21T23:57:00Z" w16du:dateUtc="2026-10-21T22:57:00Z">
+      <w:ins w:id="334" w:author="kyle O'Reilly" w:date="2026-10-21T23:57:00Z" w16du:dateUtc="2026-10-21T22:57:00Z">
         <w:r>
           <w:t xml:space="preserve"> </w:t>
         </w:r>
@@ -4250,7 +4395,7 @@
         </w:r>
         <w:r>
           <w:rPr>
-            <w:rPrChange w:id="318" w:author="kyle O'Reilly" w:date="2026-10-21T23:57:00Z" w16du:dateUtc="2026-10-21T22:57:00Z">
+            <w:rPrChange w:id="335" w:author="kyle O'Reilly" w:date="2026-10-21T23:57:00Z" w16du:dateUtc="2026-10-21T22:57:00Z">
               <w:rPr>
                 <w:rStyle w:val="Hyperlink"/>
               </w:rPr>
@@ -4277,7 +4422,7 @@
           <w:t xml:space="preserve"> </w:t>
         </w:r>
       </w:ins>
-      <w:ins w:id="319" w:author="kyle O'Reilly" w:date="2026-10-21T23:53:00Z" w16du:dateUtc="2026-10-21T22:53:00Z">
+      <w:ins w:id="336" w:author="kyle O'Reilly" w:date="2026-10-21T23:53:00Z" w16du:dateUtc="2026-10-21T22:53:00Z">
         <w:r>
           <w:t>(Accessed</w:t>
         </w:r>
@@ -4285,12 +4430,12 @@
           <w:t xml:space="preserve">: 21 </w:t>
         </w:r>
       </w:ins>
-      <w:ins w:id="320" w:author="kyle O'Reilly" w:date="2026-10-21T23:55:00Z" w16du:dateUtc="2026-10-21T22:55:00Z">
+      <w:ins w:id="337" w:author="kyle O'Reilly" w:date="2026-10-21T23:55:00Z" w16du:dateUtc="2026-10-21T22:55:00Z">
         <w:r>
           <w:t>October</w:t>
         </w:r>
       </w:ins>
-      <w:ins w:id="321" w:author="kyle O'Reilly" w:date="2026-10-21T23:53:00Z" w16du:dateUtc="2026-10-21T22:53:00Z">
+      <w:ins w:id="338" w:author="kyle O'Reilly" w:date="2026-10-21T23:53:00Z" w16du:dateUtc="2026-10-21T22:53:00Z">
         <w:r>
           <w:t xml:space="preserve"> 2026).</w:t>
         </w:r>
@@ -4299,45 +4444,45 @@
     <w:p>
       <w:pPr>
         <w:rPr>
-          <w:ins w:id="322" w:author="kyle O'Reilly" w:date="2026-10-21T23:54:00Z" w16du:dateUtc="2026-10-21T22:54:00Z"/>
-        </w:rPr>
-      </w:pPr>
-      <w:ins w:id="323" w:author="kyle O'Reilly" w:date="2026-10-21T23:53:00Z" w16du:dateUtc="2026-10-21T22:53:00Z">
+          <w:ins w:id="339" w:author="kyle O'Reilly" w:date="2026-10-21T23:54:00Z" w16du:dateUtc="2026-10-21T22:54:00Z"/>
+        </w:rPr>
+      </w:pPr>
+      <w:ins w:id="340" w:author="kyle O'Reilly" w:date="2026-10-21T23:53:00Z" w16du:dateUtc="2026-10-21T22:53:00Z">
         <w:r>
           <w:t xml:space="preserve">Stooq (n.d.b) Coca-Cola </w:t>
         </w:r>
       </w:ins>
-      <w:ins w:id="324" w:author="kyle O'Reilly" w:date="2026-10-21T23:54:00Z" w16du:dateUtc="2026-10-21T22:54:00Z">
+      <w:ins w:id="341" w:author="kyle O'Reilly" w:date="2026-10-21T23:54:00Z" w16du:dateUtc="2026-10-21T22:54:00Z">
         <w:r>
           <w:t>Co</w:t>
         </w:r>
       </w:ins>
-      <w:ins w:id="325" w:author="kyle O'Reilly" w:date="2026-10-22T00:04:00Z" w16du:dateUtc="2026-10-21T23:04:00Z">
+      <w:ins w:id="342" w:author="kyle O'Reilly" w:date="2026-10-22T00:04:00Z" w16du:dateUtc="2026-10-21T23:04:00Z">
         <w:r>
           <w:t>.</w:t>
         </w:r>
       </w:ins>
-      <w:ins w:id="326" w:author="kyle O'Reilly" w:date="2026-10-21T23:54:00Z" w16du:dateUtc="2026-10-21T22:54:00Z">
+      <w:ins w:id="343" w:author="kyle O'Reilly" w:date="2026-10-21T23:54:00Z" w16du:dateUtc="2026-10-21T22:54:00Z">
         <w:r>
           <w:t xml:space="preserve"> </w:t>
         </w:r>
       </w:ins>
-      <w:ins w:id="327" w:author="kyle O'Reilly" w:date="2026-10-21T23:53:00Z" w16du:dateUtc="2026-10-21T22:53:00Z">
+      <w:ins w:id="344" w:author="kyle O'Reilly" w:date="2026-10-21T23:53:00Z" w16du:dateUtc="2026-10-21T22:53:00Z">
         <w:r>
           <w:t>(KO.U</w:t>
         </w:r>
       </w:ins>
-      <w:ins w:id="328" w:author="kyle O'Reilly" w:date="2026-10-21T23:54:00Z" w16du:dateUtc="2026-10-21T22:54:00Z">
+      <w:ins w:id="345" w:author="kyle O'Reilly" w:date="2026-10-21T23:54:00Z" w16du:dateUtc="2026-10-21T22:54:00Z">
         <w:r>
           <w:t>S)</w:t>
         </w:r>
       </w:ins>
-      <w:ins w:id="329" w:author="kyle O'Reilly" w:date="2026-10-21T23:55:00Z" w16du:dateUtc="2026-10-21T22:55:00Z">
+      <w:ins w:id="346" w:author="kyle O'Reilly" w:date="2026-10-21T23:55:00Z" w16du:dateUtc="2026-10-21T22:55:00Z">
         <w:r>
           <w:t xml:space="preserve"> – Historical data. Available at:</w:t>
         </w:r>
       </w:ins>
-      <w:ins w:id="330" w:author="kyle O'Reilly" w:date="2026-10-21T23:56:00Z" w16du:dateUtc="2026-10-21T22:56:00Z">
+      <w:ins w:id="347" w:author="kyle O'Reilly" w:date="2026-10-21T23:56:00Z" w16du:dateUtc="2026-10-21T22:56:00Z">
         <w:r>
           <w:t xml:space="preserve"> </w:t>
         </w:r>
@@ -4369,7 +4514,7 @@
           <w:t xml:space="preserve"> </w:t>
         </w:r>
       </w:ins>
-      <w:ins w:id="331" w:author="kyle O'Reilly" w:date="2026-10-21T23:55:00Z" w16du:dateUtc="2026-10-21T22:55:00Z">
+      <w:ins w:id="348" w:author="kyle O'Reilly" w:date="2026-10-21T23:55:00Z" w16du:dateUtc="2026-10-21T22:55:00Z">
         <w:r>
           <w:t>(Accessed: 21 October 2026).</w:t>
         </w:r>
@@ -4378,25 +4523,25 @@
     <w:p>
       <w:pPr>
         <w:rPr>
-          <w:ins w:id="332" w:author="kyle O'Reilly" w:date="2026-10-21T23:49:00Z" w16du:dateUtc="2026-10-21T22:49:00Z"/>
-        </w:rPr>
-      </w:pPr>
-      <w:ins w:id="333" w:author="kyle O'Reilly" w:date="2026-10-21T23:54:00Z" w16du:dateUtc="2026-10-21T22:54:00Z">
+          <w:ins w:id="349" w:author="kyle O'Reilly" w:date="2026-10-21T23:49:00Z" w16du:dateUtc="2026-10-21T22:49:00Z"/>
+        </w:rPr>
+      </w:pPr>
+      <w:ins w:id="350" w:author="kyle O'Reilly" w:date="2026-10-21T23:54:00Z" w16du:dateUtc="2026-10-21T22:54:00Z">
         <w:r>
           <w:t xml:space="preserve">Stooq (n.d.c) Intel </w:t>
         </w:r>
       </w:ins>
-      <w:ins w:id="334" w:author="kyle O'Reilly" w:date="2026-10-22T00:04:00Z" w16du:dateUtc="2026-10-21T23:04:00Z">
+      <w:ins w:id="351" w:author="kyle O'Reilly" w:date="2026-10-22T00:04:00Z" w16du:dateUtc="2026-10-21T23:04:00Z">
         <w:r>
           <w:t xml:space="preserve">Corp. </w:t>
         </w:r>
       </w:ins>
-      <w:ins w:id="335" w:author="kyle O'Reilly" w:date="2026-10-21T23:54:00Z" w16du:dateUtc="2026-10-21T22:54:00Z">
+      <w:ins w:id="352" w:author="kyle O'Reilly" w:date="2026-10-21T23:54:00Z" w16du:dateUtc="2026-10-21T22:54:00Z">
         <w:r>
           <w:t>(INTC.US)</w:t>
         </w:r>
       </w:ins>
-      <w:ins w:id="336" w:author="kyle O'Reilly" w:date="2026-10-21T23:55:00Z" w16du:dateUtc="2026-10-21T22:55:00Z">
+      <w:ins w:id="353" w:author="kyle O'Reilly" w:date="2026-10-21T23:55:00Z" w16du:dateUtc="2026-10-21T22:55:00Z">
         <w:r>
           <w:t xml:space="preserve"> – Historical data. Available at</w:t>
         </w:r>
@@ -4404,7 +4549,7 @@
           <w:t>:</w:t>
         </w:r>
       </w:ins>
-      <w:ins w:id="337" w:author="kyle O'Reilly" w:date="2026-10-21T23:56:00Z" w16du:dateUtc="2026-10-21T22:56:00Z">
+      <w:ins w:id="354" w:author="kyle O'Reilly" w:date="2026-10-21T23:56:00Z" w16du:dateUtc="2026-10-21T22:56:00Z">
         <w:r>
           <w:t xml:space="preserve"> </w:t>
         </w:r>
@@ -4436,7 +4581,7 @@
           <w:t xml:space="preserve"> </w:t>
         </w:r>
       </w:ins>
-      <w:ins w:id="338" w:author="kyle O'Reilly" w:date="2026-10-21T23:55:00Z" w16du:dateUtc="2026-10-21T22:55:00Z">
+      <w:ins w:id="355" w:author="kyle O'Reilly" w:date="2026-10-21T23:55:00Z" w16du:dateUtc="2026-10-21T22:55:00Z">
         <w:r>
           <w:t xml:space="preserve"> </w:t>
         </w:r>
@@ -4444,12 +4589,12 @@
           <w:t xml:space="preserve">(Accessed: 21 </w:t>
         </w:r>
       </w:ins>
-      <w:ins w:id="339" w:author="kyle O'Reilly" w:date="2026-10-22T00:14:00Z" w16du:dateUtc="2026-10-21T23:14:00Z">
+      <w:ins w:id="356" w:author="kyle O'Reilly" w:date="2026-10-22T00:14:00Z" w16du:dateUtc="2026-10-21T23:14:00Z">
         <w:r>
           <w:t>October</w:t>
         </w:r>
       </w:ins>
-      <w:ins w:id="340" w:author="kyle O'Reilly" w:date="2026-10-21T23:55:00Z" w16du:dateUtc="2026-10-21T22:55:00Z">
+      <w:ins w:id="357" w:author="kyle O'Reilly" w:date="2026-10-21T23:55:00Z" w16du:dateUtc="2026-10-21T22:55:00Z">
         <w:r>
           <w:t xml:space="preserve"> 2026).</w:t>
         </w:r>
@@ -4458,84 +4603,44 @@
     <w:p>
       <w:pPr>
         <w:rPr>
-          <w:ins w:id="341" w:author="kyle O'Reilly" w:date="2026-10-21T23:49:00Z" w16du:dateUtc="2026-10-21T22:49:00Z"/>
-        </w:rPr>
-      </w:pPr>
-    </w:p>
-    <w:p>
-      <w:pPr>
-        <w:rPr>
-          <w:ins w:id="342" w:author="kyle O'Reilly" w:date="2026-10-21T23:49:00Z" w16du:dateUtc="2026-10-21T22:49:00Z"/>
-        </w:rPr>
-      </w:pPr>
-    </w:p>
-    <w:p>
-      <w:pPr>
-        <w:rPr>
-          <w:ins w:id="343" w:author="kyle O'Reilly" w:date="2026-10-21T23:49:00Z" w16du:dateUtc="2026-10-21T22:49:00Z"/>
-        </w:rPr>
-      </w:pPr>
-    </w:p>
-    <w:p>
-      <w:pPr>
-        <w:rPr>
-          <w:ins w:id="344" w:author="kyle O'Reilly" w:date="2026-10-21T23:49:00Z" w16du:dateUtc="2026-10-21T22:49:00Z"/>
-        </w:rPr>
-      </w:pPr>
-    </w:p>
-    <w:p>
-      <w:pPr>
-        <w:rPr>
-          <w:ins w:id="345" w:author="kyle O'Reilly" w:date="2026-10-21T23:49:00Z" w16du:dateUtc="2026-10-21T22:49:00Z"/>
-        </w:rPr>
-      </w:pPr>
-    </w:p>
-    <w:p>
-      <w:pPr>
-        <w:rPr>
-          <w:ins w:id="346" w:author="kyle O'Reilly" w:date="2026-10-21T23:49:00Z" w16du:dateUtc="2026-10-21T22:49:00Z"/>
-        </w:rPr>
-      </w:pPr>
-    </w:p>
-    <w:p>
-      <w:pPr>
-        <w:rPr>
-          <w:ins w:id="347" w:author="kyle O'Reilly" w:date="2026-10-21T23:49:00Z" w16du:dateUtc="2026-10-21T22:49:00Z"/>
-        </w:rPr>
-      </w:pPr>
-    </w:p>
-    <w:p>
-      <w:pPr>
-        <w:rPr>
-          <w:ins w:id="348" w:author="kyle O'Reilly" w:date="2026-10-21T23:49:00Z" w16du:dateUtc="2026-10-21T22:49:00Z"/>
-        </w:rPr>
-      </w:pPr>
-    </w:p>
-    <w:p>
-      <w:pPr>
-        <w:rPr>
-          <w:ins w:id="349" w:author="kyle O'Reilly" w:date="2026-10-21T23:49:00Z" w16du:dateUtc="2026-10-21T22:49:00Z"/>
-        </w:rPr>
-      </w:pPr>
-    </w:p>
-    <w:p>
-      <w:pPr>
-        <w:rPr>
-          <w:ins w:id="350" w:author="kyle O'Reilly" w:date="2026-10-21T23:49:00Z" w16du:dateUtc="2026-10-21T22:49:00Z"/>
-        </w:rPr>
-      </w:pPr>
-    </w:p>
-    <w:p>
-      <w:pPr>
-        <w:rPr>
-          <w:ins w:id="351" w:author="kyle O'Reilly" w:date="2026-10-21T23:49:00Z" w16du:dateUtc="2026-10-21T22:49:00Z"/>
-        </w:rPr>
-      </w:pPr>
-    </w:p>
-    <w:p>
-      <w:pPr>
-        <w:rPr>
-          <w:ins w:id="352" w:author="kyle O'Reilly" w:date="2026-10-22T00:15:00Z" w16du:dateUtc="2026-10-21T23:15:00Z"/>
+          <w:ins w:id="358" w:author="kyle O'Reilly" w:date="2026-10-21T23:49:00Z" w16du:dateUtc="2026-10-21T22:49:00Z"/>
+        </w:rPr>
+      </w:pPr>
+    </w:p>
+    <w:p>
+      <w:pPr>
+        <w:rPr>
+          <w:ins w:id="359" w:author="kyle O'Reilly" w:date="2026-10-21T23:49:00Z" w16du:dateUtc="2026-10-21T22:49:00Z"/>
+        </w:rPr>
+      </w:pPr>
+    </w:p>
+    <w:p>
+      <w:pPr>
+        <w:tabs>
+          <w:tab w:val="left" w:pos="1055"/>
+        </w:tabs>
+        <w:rPr>
+          <w:ins w:id="360" w:author="kyle O'Reilly" w:date="2026-10-22T18:11:00Z" w16du:dateUtc="2026-10-22T17:11:00Z"/>
+        </w:rPr>
+      </w:pPr>
+    </w:p>
+    <w:p>
+      <w:pPr>
+        <w:tabs>
+          <w:tab w:val="left" w:pos="1055"/>
+        </w:tabs>
+        <w:rPr>
+          <w:ins w:id="361" w:author="kyle O'Reilly" w:date="2026-10-21T23:49:00Z" w16du:dateUtc="2026-10-21T22:49:00Z"/>
+        </w:rPr>
+        <w:pPrChange w:id="362" w:author="kyle O'Reilly" w:date="2026-10-22T18:11:00Z" w16du:dateUtc="2026-10-22T17:11:00Z">
+          <w:pPr/>
+        </w:pPrChange>
+      </w:pPr>
+    </w:p>
+    <w:p>
+      <w:pPr>
+        <w:rPr>
+          <w:ins w:id="363" w:author="kyle O'Reilly" w:date="2026-10-22T00:15:00Z" w16du:dateUtc="2026-10-21T23:15:00Z"/>
           <w:sz w:val="96"/>
           <w:szCs w:val="96"/>
         </w:rPr>
@@ -4544,12 +4649,12 @@
     <w:p>
       <w:pPr>
         <w:rPr>
-          <w:ins w:id="353" w:author="kyle O'Reilly" w:date="2026-10-21T23:49:00Z" w16du:dateUtc="2026-10-21T22:49:00Z"/>
+          <w:ins w:id="364" w:author="kyle O'Reilly" w:date="2026-10-21T23:49:00Z" w16du:dateUtc="2026-10-21T22:49:00Z"/>
           <w:sz w:val="96"/>
           <w:szCs w:val="96"/>
-          <w:rPrChange w:id="354" w:author="kyle O'Reilly" w:date="2026-10-21T23:49:00Z" w16du:dateUtc="2026-10-21T22:49:00Z">
+          <w:rPrChange w:id="365" w:author="kyle O'Reilly" w:date="2026-10-21T23:49:00Z" w16du:dateUtc="2026-10-21T22:49:00Z">
             <w:rPr>
-              <w:ins w:id="355" w:author="kyle O'Reilly" w:date="2026-10-21T23:49:00Z" w16du:dateUtc="2026-10-21T22:49:00Z"/>
+              <w:ins w:id="366" w:author="kyle O'Reilly" w:date="2026-10-21T23:49:00Z" w16du:dateUtc="2026-10-21T22:49:00Z"/>
             </w:rPr>
           </w:rPrChange>
         </w:rPr>
@@ -4561,20 +4666,20 @@
         <w:rPr>
           <w:sz w:val="96"/>
           <w:szCs w:val="96"/>
-          <w:rPrChange w:id="356" w:author="kyle O'Reilly" w:date="2026-10-21T23:49:00Z" w16du:dateUtc="2026-10-21T22:49:00Z">
+          <w:rPrChange w:id="367" w:author="kyle O'Reilly" w:date="2026-10-21T23:49:00Z" w16du:dateUtc="2026-10-21T22:49:00Z">
             <w:rPr/>
           </w:rPrChange>
         </w:rPr>
-        <w:pPrChange w:id="357" w:author="kyle O'Reilly" w:date="2026-10-21T23:49:00Z" w16du:dateUtc="2026-10-21T22:49:00Z">
+        <w:pPrChange w:id="368" w:author="kyle O'Reilly" w:date="2026-10-21T23:49:00Z" w16du:dateUtc="2026-10-21T22:49:00Z">
           <w:pPr/>
         </w:pPrChange>
       </w:pPr>
-      <w:ins w:id="358" w:author="kyle O'Reilly" w:date="2026-10-21T23:49:00Z" w16du:dateUtc="2026-10-21T22:49:00Z">
+      <w:ins w:id="369" w:author="kyle O'Reilly" w:date="2026-10-21T23:49:00Z" w16du:dateUtc="2026-10-21T22:49:00Z">
         <w:r>
           <w:rPr>
             <w:sz w:val="96"/>
             <w:szCs w:val="96"/>
-            <w:rPrChange w:id="359" w:author="kyle O'Reilly" w:date="2026-10-21T23:49:00Z" w16du:dateUtc="2026-10-21T22:49:00Z">
+            <w:rPrChange w:id="370" w:author="kyle O'Reilly" w:date="2026-10-21T23:49:00Z" w16du:dateUtc="2026-10-21T22:49:00Z">
               <w:rPr/>
             </w:rPrChange>
           </w:rPr>
@@ -4583,8 +4688,8 @@
       </w:ins>
     </w:p>
     <w:sectPr>
-      <w:headerReference w:type="default" r:id="rId14"/>
-      <w:footerReference w:type="default" r:id="rId15"/>
+      <w:headerReference w:type="default" r:id="rId15"/>
+      <w:footerReference w:type="default" r:id="rId16"/>
       <w:pgSz w:w="11906" w:h="16838"/>
       <w:pgMar w:top="1440" w:right="1440" w:bottom="1440" w:left="1440" w:header="708" w:footer="708" w:gutter="0"/>
       <w:pgNumType w:start="1"/>
@@ -6835,6 +6940,25 @@
       <w:u w:val="single"/>
     </w:rPr>
   </w:style>
+  <w:style w:type="paragraph" w:styleId="Caption">
+    <w:name w:val="caption"/>
+    <w:basedOn w:val="Normal"/>
+    <w:next w:val="Normal"/>
+    <w:uiPriority w:val="35"/>
+    <w:unhideWhenUsed/>
+    <w:qFormat/>
+    <w:rsid w:val="000C4F0B"/>
+    <w:pPr>
+      <w:spacing w:after="200" w:line="240" w:lineRule="auto"/>
+    </w:pPr>
+    <w:rPr>
+      <w:i/>
+      <w:iCs/>
+      <w:color w:val="0E2841" w:themeColor="text2"/>
+      <w:sz w:val="18"/>
+      <w:szCs w:val="18"/>
+    </w:rPr>
+  </w:style>
 </w:styles>
 </file>
 

</xml_diff>

<commit_message>
Completed Project Scope section
</commit_message>
<xml_diff>
--- a/HDSDAB - Strategic Thinking - Capstone Project.docx
+++ b/HDSDAB - Strategic Thinking - Capstone Project.docx
@@ -814,7 +814,23 @@
                                 <w:color w:val="000000"/>
                                 <w:sz w:val="28"/>
                               </w:rPr>
-                              <w:t xml:space="preserve">By submitting this assessment, I confirm that I have read the CCT policy on academic misconduct and understand the implications of submitting work that is not my own or does not appropriately reference material taken from a third party or other source. </w:t>
+                              <w:t xml:space="preserve">By submitting this assessment, I confirm that I have read the CCT policy on academic misconduct and understand the implications of submitting work that is not my own or does not appropriately reference material </w:t>
+                            </w:r>
+                            <w:proofErr w:type="gramStart"/>
+                            <w:r>
+                              <w:rPr>
+                                <w:color w:val="000000"/>
+                                <w:sz w:val="28"/>
+                              </w:rPr>
+                              <w:t>taken</w:t>
+                            </w:r>
+                            <w:proofErr w:type="gramEnd"/>
+                            <w:r>
+                              <w:rPr>
+                                <w:color w:val="000000"/>
+                                <w:sz w:val="28"/>
+                              </w:rPr>
+                              <w:t xml:space="preserve"> from a third party or other source. </w:t>
                             </w:r>
                           </w:p>
                           <w:p>
@@ -908,7 +924,23 @@
                           <w:color w:val="000000"/>
                           <w:sz w:val="28"/>
                         </w:rPr>
-                        <w:t xml:space="preserve">By submitting this assessment, I confirm that I have read the CCT policy on academic misconduct and understand the implications of submitting work that is not my own or does not appropriately reference material taken from a third party or other source. </w:t>
+                        <w:t xml:space="preserve">By submitting this assessment, I confirm that I have read the CCT policy on academic misconduct and understand the implications of submitting work that is not my own or does not appropriately reference material </w:t>
+                      </w:r>
+                      <w:proofErr w:type="gramStart"/>
+                      <w:r>
+                        <w:rPr>
+                          <w:color w:val="000000"/>
+                          <w:sz w:val="28"/>
+                        </w:rPr>
+                        <w:t>taken</w:t>
+                      </w:r>
+                      <w:proofErr w:type="gramEnd"/>
+                      <w:r>
+                        <w:rPr>
+                          <w:color w:val="000000"/>
+                          <w:sz w:val="28"/>
+                        </w:rPr>
+                        <w:t xml:space="preserve"> from a third party or other source. </w:t>
                       </w:r>
                     </w:p>
                     <w:p>
@@ -1155,7 +1187,7 @@
               <w:tab w:val="right" w:leader="dot" w:pos="9016"/>
             </w:tabs>
             <w:rPr>
-              <w:ins w:id="8" w:author="kyle O'Reilly" w:date="2026-10-22T00:15:00Z" w16du:dateUtc="2026-10-21T23:15:00Z"/>
+              <w:ins w:id="8" w:author="kyle O'Reilly" w:date="2026-10-22T19:17:00Z" w16du:dateUtc="2026-10-22T18:17:00Z"/>
               <w:rFonts w:asciiTheme="minorHAnsi" w:eastAsiaTheme="minorEastAsia" w:hAnsiTheme="minorHAnsi" w:cstheme="minorBidi"/>
               <w:noProof/>
               <w:kern w:val="2"/>
@@ -1173,7 +1205,7 @@
           <w:r>
             <w:fldChar w:fldCharType="separate"/>
           </w:r>
-          <w:ins w:id="9" w:author="kyle O'Reilly" w:date="2026-10-22T00:15:00Z" w16du:dateUtc="2026-10-21T23:15:00Z">
+          <w:ins w:id="9" w:author="kyle O'Reilly" w:date="2026-10-22T19:17:00Z" w16du:dateUtc="2026-10-22T18:17:00Z">
             <w:r>
               <w:rPr>
                 <w:rStyle w:val="Hyperlink"/>
@@ -1192,7 +1224,7 @@
               <w:rPr>
                 <w:noProof/>
               </w:rPr>
-              <w:instrText>HYPERLINK \l "_Toc243520523"</w:instrText>
+              <w:instrText>HYPERLINK \l "_Toc243589086"</w:instrText>
             </w:r>
             <w:r>
               <w:rPr>
@@ -1240,16 +1272,14 @@
                 <w:noProof/>
                 <w:webHidden/>
               </w:rPr>
-              <w:instrText xml:space="preserve"> PAGEREF _Toc243520523 \h </w:instrText>
-            </w:r>
-          </w:ins>
-          <w:r>
-            <w:rPr>
-              <w:noProof/>
-              <w:webHidden/>
-            </w:rPr>
-          </w:r>
-          <w:ins w:id="10" w:author="kyle O'Reilly" w:date="2026-10-22T00:15:00Z" w16du:dateUtc="2026-10-21T23:15:00Z">
+              <w:instrText xml:space="preserve"> PAGEREF _Toc243589086 \h </w:instrText>
+            </w:r>
+            <w:r>
+              <w:rPr>
+                <w:noProof/>
+                <w:webHidden/>
+              </w:rPr>
+            </w:r>
             <w:r>
               <w:rPr>
                 <w:noProof/>
@@ -1287,7 +1317,7 @@
               <w:tab w:val="right" w:leader="dot" w:pos="9016"/>
             </w:tabs>
             <w:rPr>
-              <w:ins w:id="11" w:author="kyle O'Reilly" w:date="2026-10-22T00:15:00Z" w16du:dateUtc="2026-10-21T23:15:00Z"/>
+              <w:ins w:id="10" w:author="kyle O'Reilly" w:date="2026-10-22T19:17:00Z" w16du:dateUtc="2026-10-22T18:17:00Z"/>
               <w:rFonts w:asciiTheme="minorHAnsi" w:eastAsiaTheme="minorEastAsia" w:hAnsiTheme="minorHAnsi" w:cstheme="minorBidi"/>
               <w:noProof/>
               <w:kern w:val="2"/>
@@ -1296,7 +1326,7 @@
               <w14:ligatures w14:val="standardContextual"/>
             </w:rPr>
           </w:pPr>
-          <w:ins w:id="12" w:author="kyle O'Reilly" w:date="2026-10-22T00:15:00Z" w16du:dateUtc="2026-10-21T23:15:00Z">
+          <w:ins w:id="11" w:author="kyle O'Reilly" w:date="2026-10-22T19:17:00Z" w16du:dateUtc="2026-10-22T18:17:00Z">
             <w:r>
               <w:rPr>
                 <w:rStyle w:val="Hyperlink"/>
@@ -1315,7 +1345,7 @@
               <w:rPr>
                 <w:noProof/>
               </w:rPr>
-              <w:instrText>HYPERLINK \l "_Toc243520524"</w:instrText>
+              <w:instrText>HYPERLINK \l "_Toc243589087"</w:instrText>
             </w:r>
             <w:r>
               <w:rPr>
@@ -1363,16 +1393,14 @@
                 <w:noProof/>
                 <w:webHidden/>
               </w:rPr>
-              <w:instrText xml:space="preserve"> PAGEREF _Toc243520524 \h </w:instrText>
-            </w:r>
-          </w:ins>
-          <w:r>
-            <w:rPr>
-              <w:noProof/>
-              <w:webHidden/>
-            </w:rPr>
-          </w:r>
-          <w:ins w:id="13" w:author="kyle O'Reilly" w:date="2026-10-22T00:15:00Z" w16du:dateUtc="2026-10-21T23:15:00Z">
+              <w:instrText xml:space="preserve"> PAGEREF _Toc243589087 \h </w:instrText>
+            </w:r>
+            <w:r>
+              <w:rPr>
+                <w:noProof/>
+                <w:webHidden/>
+              </w:rPr>
+            </w:r>
             <w:r>
               <w:rPr>
                 <w:noProof/>
@@ -1410,7 +1438,7 @@
               <w:tab w:val="right" w:leader="dot" w:pos="9016"/>
             </w:tabs>
             <w:rPr>
-              <w:ins w:id="14" w:author="kyle O'Reilly" w:date="2026-10-22T00:15:00Z" w16du:dateUtc="2026-10-21T23:15:00Z"/>
+              <w:ins w:id="12" w:author="kyle O'Reilly" w:date="2026-10-22T19:17:00Z" w16du:dateUtc="2026-10-22T18:17:00Z"/>
               <w:rFonts w:asciiTheme="minorHAnsi" w:eastAsiaTheme="minorEastAsia" w:hAnsiTheme="minorHAnsi" w:cstheme="minorBidi"/>
               <w:noProof/>
               <w:kern w:val="2"/>
@@ -1419,7 +1447,7 @@
               <w14:ligatures w14:val="standardContextual"/>
             </w:rPr>
           </w:pPr>
-          <w:ins w:id="15" w:author="kyle O'Reilly" w:date="2026-10-22T00:15:00Z" w16du:dateUtc="2026-10-21T23:15:00Z">
+          <w:ins w:id="13" w:author="kyle O'Reilly" w:date="2026-10-22T19:17:00Z" w16du:dateUtc="2026-10-22T18:17:00Z">
             <w:r>
               <w:rPr>
                 <w:rStyle w:val="Hyperlink"/>
@@ -1438,7 +1466,7 @@
               <w:rPr>
                 <w:noProof/>
               </w:rPr>
-              <w:instrText>HYPERLINK \l "_Toc243520525"</w:instrText>
+              <w:instrText>HYPERLINK \l "_Toc243589088"</w:instrText>
             </w:r>
             <w:r>
               <w:rPr>
@@ -1486,16 +1514,14 @@
                 <w:noProof/>
                 <w:webHidden/>
               </w:rPr>
-              <w:instrText xml:space="preserve"> PAGEREF _Toc243520525 \h </w:instrText>
-            </w:r>
-          </w:ins>
-          <w:r>
-            <w:rPr>
-              <w:noProof/>
-              <w:webHidden/>
-            </w:rPr>
-          </w:r>
-          <w:ins w:id="16" w:author="kyle O'Reilly" w:date="2026-10-22T00:15:00Z" w16du:dateUtc="2026-10-21T23:15:00Z">
+              <w:instrText xml:space="preserve"> PAGEREF _Toc243589088 \h </w:instrText>
+            </w:r>
+            <w:r>
+              <w:rPr>
+                <w:noProof/>
+                <w:webHidden/>
+              </w:rPr>
+            </w:r>
             <w:r>
               <w:rPr>
                 <w:noProof/>
@@ -1533,7 +1559,7 @@
               <w:tab w:val="right" w:leader="dot" w:pos="9016"/>
             </w:tabs>
             <w:rPr>
-              <w:ins w:id="17" w:author="kyle O'Reilly" w:date="2026-10-22T00:15:00Z" w16du:dateUtc="2026-10-21T23:15:00Z"/>
+              <w:ins w:id="14" w:author="kyle O'Reilly" w:date="2026-10-22T19:17:00Z" w16du:dateUtc="2026-10-22T18:17:00Z"/>
               <w:rFonts w:asciiTheme="minorHAnsi" w:eastAsiaTheme="minorEastAsia" w:hAnsiTheme="minorHAnsi" w:cstheme="minorBidi"/>
               <w:noProof/>
               <w:kern w:val="2"/>
@@ -1542,7 +1568,7 @@
               <w14:ligatures w14:val="standardContextual"/>
             </w:rPr>
           </w:pPr>
-          <w:ins w:id="18" w:author="kyle O'Reilly" w:date="2026-10-22T00:15:00Z" w16du:dateUtc="2026-10-21T23:15:00Z">
+          <w:ins w:id="15" w:author="kyle O'Reilly" w:date="2026-10-22T19:17:00Z" w16du:dateUtc="2026-10-22T18:17:00Z">
             <w:r>
               <w:rPr>
                 <w:rStyle w:val="Hyperlink"/>
@@ -1561,7 +1587,7 @@
               <w:rPr>
                 <w:noProof/>
               </w:rPr>
-              <w:instrText>HYPERLINK \l "_Toc243520526"</w:instrText>
+              <w:instrText>HYPERLINK \l "_Toc243589089"</w:instrText>
             </w:r>
             <w:r>
               <w:rPr>
@@ -1609,16 +1635,14 @@
                 <w:noProof/>
                 <w:webHidden/>
               </w:rPr>
-              <w:instrText xml:space="preserve"> PAGEREF _Toc243520526 \h </w:instrText>
-            </w:r>
-          </w:ins>
-          <w:r>
-            <w:rPr>
-              <w:noProof/>
-              <w:webHidden/>
-            </w:rPr>
-          </w:r>
-          <w:ins w:id="19" w:author="kyle O'Reilly" w:date="2026-10-22T00:15:00Z" w16du:dateUtc="2026-10-21T23:15:00Z">
+              <w:instrText xml:space="preserve"> PAGEREF _Toc243589089 \h </w:instrText>
+            </w:r>
+            <w:r>
+              <w:rPr>
+                <w:noProof/>
+                <w:webHidden/>
+              </w:rPr>
+            </w:r>
             <w:r>
               <w:rPr>
                 <w:noProof/>
@@ -1656,7 +1680,7 @@
               <w:tab w:val="right" w:leader="dot" w:pos="9016"/>
             </w:tabs>
             <w:rPr>
-              <w:ins w:id="20" w:author="kyle O'Reilly" w:date="2026-10-22T00:15:00Z" w16du:dateUtc="2026-10-21T23:15:00Z"/>
+              <w:ins w:id="16" w:author="kyle O'Reilly" w:date="2026-10-22T19:17:00Z" w16du:dateUtc="2026-10-22T18:17:00Z"/>
               <w:rFonts w:asciiTheme="minorHAnsi" w:eastAsiaTheme="minorEastAsia" w:hAnsiTheme="minorHAnsi" w:cstheme="minorBidi"/>
               <w:noProof/>
               <w:kern w:val="2"/>
@@ -1665,7 +1689,7 @@
               <w14:ligatures w14:val="standardContextual"/>
             </w:rPr>
           </w:pPr>
-          <w:ins w:id="21" w:author="kyle O'Reilly" w:date="2026-10-22T00:15:00Z" w16du:dateUtc="2026-10-21T23:15:00Z">
+          <w:ins w:id="17" w:author="kyle O'Reilly" w:date="2026-10-22T19:17:00Z" w16du:dateUtc="2026-10-22T18:17:00Z">
             <w:r>
               <w:rPr>
                 <w:rStyle w:val="Hyperlink"/>
@@ -1684,7 +1708,7 @@
               <w:rPr>
                 <w:noProof/>
               </w:rPr>
-              <w:instrText>HYPERLINK \l "_Toc243520527"</w:instrText>
+              <w:instrText>HYPERLINK \l "_Toc243589090"</w:instrText>
             </w:r>
             <w:r>
               <w:rPr>
@@ -1732,16 +1756,14 @@
                 <w:noProof/>
                 <w:webHidden/>
               </w:rPr>
-              <w:instrText xml:space="preserve"> PAGEREF _Toc243520527 \h </w:instrText>
-            </w:r>
-          </w:ins>
-          <w:r>
-            <w:rPr>
-              <w:noProof/>
-              <w:webHidden/>
-            </w:rPr>
-          </w:r>
-          <w:ins w:id="22" w:author="kyle O'Reilly" w:date="2026-10-22T00:15:00Z" w16du:dateUtc="2026-10-21T23:15:00Z">
+              <w:instrText xml:space="preserve"> PAGEREF _Toc243589090 \h </w:instrText>
+            </w:r>
+            <w:r>
+              <w:rPr>
+                <w:noProof/>
+                <w:webHidden/>
+              </w:rPr>
+            </w:r>
             <w:r>
               <w:rPr>
                 <w:noProof/>
@@ -1779,7 +1801,7 @@
               <w:tab w:val="right" w:leader="dot" w:pos="9016"/>
             </w:tabs>
             <w:rPr>
-              <w:ins w:id="23" w:author="kyle O'Reilly" w:date="2026-10-22T00:15:00Z" w16du:dateUtc="2026-10-21T23:15:00Z"/>
+              <w:ins w:id="18" w:author="kyle O'Reilly" w:date="2026-10-22T19:17:00Z" w16du:dateUtc="2026-10-22T18:17:00Z"/>
               <w:rFonts w:asciiTheme="minorHAnsi" w:eastAsiaTheme="minorEastAsia" w:hAnsiTheme="minorHAnsi" w:cstheme="minorBidi"/>
               <w:noProof/>
               <w:kern w:val="2"/>
@@ -1788,7 +1810,7 @@
               <w14:ligatures w14:val="standardContextual"/>
             </w:rPr>
           </w:pPr>
-          <w:ins w:id="24" w:author="kyle O'Reilly" w:date="2026-10-22T00:15:00Z" w16du:dateUtc="2026-10-21T23:15:00Z">
+          <w:ins w:id="19" w:author="kyle O'Reilly" w:date="2026-10-22T19:17:00Z" w16du:dateUtc="2026-10-22T18:17:00Z">
             <w:r>
               <w:rPr>
                 <w:rStyle w:val="Hyperlink"/>
@@ -1807,7 +1829,7 @@
               <w:rPr>
                 <w:noProof/>
               </w:rPr>
-              <w:instrText>HYPERLINK \l "_Toc243520528"</w:instrText>
+              <w:instrText>HYPERLINK \l "_Toc243589091"</w:instrText>
             </w:r>
             <w:r>
               <w:rPr>
@@ -1855,16 +1877,14 @@
                 <w:noProof/>
                 <w:webHidden/>
               </w:rPr>
-              <w:instrText xml:space="preserve"> PAGEREF _Toc243520528 \h </w:instrText>
-            </w:r>
-          </w:ins>
-          <w:r>
-            <w:rPr>
-              <w:noProof/>
-              <w:webHidden/>
-            </w:rPr>
-          </w:r>
-          <w:ins w:id="25" w:author="kyle O'Reilly" w:date="2026-10-22T00:15:00Z" w16du:dateUtc="2026-10-21T23:15:00Z">
+              <w:instrText xml:space="preserve"> PAGEREF _Toc243589091 \h </w:instrText>
+            </w:r>
+            <w:r>
+              <w:rPr>
+                <w:noProof/>
+                <w:webHidden/>
+              </w:rPr>
+            </w:r>
             <w:r>
               <w:rPr>
                 <w:noProof/>
@@ -1902,7 +1922,7 @@
               <w:tab w:val="right" w:leader="dot" w:pos="9016"/>
             </w:tabs>
             <w:rPr>
-              <w:ins w:id="26" w:author="kyle O'Reilly" w:date="2026-10-22T00:15:00Z" w16du:dateUtc="2026-10-21T23:15:00Z"/>
+              <w:ins w:id="20" w:author="kyle O'Reilly" w:date="2026-10-22T19:17:00Z" w16du:dateUtc="2026-10-22T18:17:00Z"/>
               <w:rFonts w:asciiTheme="minorHAnsi" w:eastAsiaTheme="minorEastAsia" w:hAnsiTheme="minorHAnsi" w:cstheme="minorBidi"/>
               <w:noProof/>
               <w:kern w:val="2"/>
@@ -1911,7 +1931,7 @@
               <w14:ligatures w14:val="standardContextual"/>
             </w:rPr>
           </w:pPr>
-          <w:ins w:id="27" w:author="kyle O'Reilly" w:date="2026-10-22T00:15:00Z" w16du:dateUtc="2026-10-21T23:15:00Z">
+          <w:ins w:id="21" w:author="kyle O'Reilly" w:date="2026-10-22T19:17:00Z" w16du:dateUtc="2026-10-22T18:17:00Z">
             <w:r>
               <w:rPr>
                 <w:rStyle w:val="Hyperlink"/>
@@ -1930,7 +1950,7 @@
               <w:rPr>
                 <w:noProof/>
               </w:rPr>
-              <w:instrText>HYPERLINK \l "_Toc243520529"</w:instrText>
+              <w:instrText>HYPERLINK \l "_Toc243589092"</w:instrText>
             </w:r>
             <w:r>
               <w:rPr>
@@ -1978,16 +1998,14 @@
                 <w:noProof/>
                 <w:webHidden/>
               </w:rPr>
-              <w:instrText xml:space="preserve"> PAGEREF _Toc243520529 \h </w:instrText>
-            </w:r>
-          </w:ins>
-          <w:r>
-            <w:rPr>
-              <w:noProof/>
-              <w:webHidden/>
-            </w:rPr>
-          </w:r>
-          <w:ins w:id="28" w:author="kyle O'Reilly" w:date="2026-10-22T00:15:00Z" w16du:dateUtc="2026-10-21T23:15:00Z">
+              <w:instrText xml:space="preserve"> PAGEREF _Toc243589092 \h </w:instrText>
+            </w:r>
+            <w:r>
+              <w:rPr>
+                <w:noProof/>
+                <w:webHidden/>
+              </w:rPr>
+            </w:r>
             <w:r>
               <w:rPr>
                 <w:noProof/>
@@ -2025,7 +2043,7 @@
               <w:tab w:val="right" w:leader="dot" w:pos="9016"/>
             </w:tabs>
             <w:rPr>
-              <w:ins w:id="29" w:author="kyle O'Reilly" w:date="2026-10-22T00:15:00Z" w16du:dateUtc="2026-10-21T23:15:00Z"/>
+              <w:ins w:id="22" w:author="kyle O'Reilly" w:date="2026-10-22T19:17:00Z" w16du:dateUtc="2026-10-22T18:17:00Z"/>
               <w:rFonts w:asciiTheme="minorHAnsi" w:eastAsiaTheme="minorEastAsia" w:hAnsiTheme="minorHAnsi" w:cstheme="minorBidi"/>
               <w:noProof/>
               <w:kern w:val="2"/>
@@ -2034,7 +2052,7 @@
               <w14:ligatures w14:val="standardContextual"/>
             </w:rPr>
           </w:pPr>
-          <w:ins w:id="30" w:author="kyle O'Reilly" w:date="2026-10-22T00:15:00Z" w16du:dateUtc="2026-10-21T23:15:00Z">
+          <w:ins w:id="23" w:author="kyle O'Reilly" w:date="2026-10-22T19:17:00Z" w16du:dateUtc="2026-10-22T18:17:00Z">
             <w:r>
               <w:rPr>
                 <w:rStyle w:val="Hyperlink"/>
@@ -2053,7 +2071,7 @@
               <w:rPr>
                 <w:noProof/>
               </w:rPr>
-              <w:instrText>HYPERLINK \l "_Toc243520530"</w:instrText>
+              <w:instrText>HYPERLINK \l "_Toc243589093"</w:instrText>
             </w:r>
             <w:r>
               <w:rPr>
@@ -2101,21 +2119,19 @@
                 <w:noProof/>
                 <w:webHidden/>
               </w:rPr>
-              <w:instrText xml:space="preserve"> PAGEREF _Toc243520530 \h </w:instrText>
-            </w:r>
-          </w:ins>
-          <w:r>
-            <w:rPr>
-              <w:noProof/>
-              <w:webHidden/>
-            </w:rPr>
-          </w:r>
-          <w:ins w:id="31" w:author="kyle O'Reilly" w:date="2026-10-22T00:15:00Z" w16du:dateUtc="2026-10-21T23:15:00Z">
+              <w:instrText xml:space="preserve"> PAGEREF _Toc243589093 \h </w:instrText>
+            </w:r>
             <w:r>
               <w:rPr>
                 <w:noProof/>
                 <w:webHidden/>
               </w:rPr>
+            </w:r>
+            <w:r>
+              <w:rPr>
+                <w:noProof/>
+                <w:webHidden/>
+              </w:rPr>
               <w:fldChar w:fldCharType="separate"/>
             </w:r>
             <w:r>
@@ -2123,7 +2139,7 @@
                 <w:noProof/>
                 <w:webHidden/>
               </w:rPr>
-              <w:t>2</w:t>
+              <w:t>3</w:t>
             </w:r>
             <w:r>
               <w:rPr>
@@ -2148,7 +2164,7 @@
               <w:tab w:val="right" w:leader="dot" w:pos="9016"/>
             </w:tabs>
             <w:rPr>
-              <w:ins w:id="32" w:author="kyle O'Reilly" w:date="2026-10-22T00:15:00Z" w16du:dateUtc="2026-10-21T23:15:00Z"/>
+              <w:ins w:id="24" w:author="kyle O'Reilly" w:date="2026-10-22T19:17:00Z" w16du:dateUtc="2026-10-22T18:17:00Z"/>
               <w:rFonts w:asciiTheme="minorHAnsi" w:eastAsiaTheme="minorEastAsia" w:hAnsiTheme="minorHAnsi" w:cstheme="minorBidi"/>
               <w:noProof/>
               <w:kern w:val="2"/>
@@ -2157,7 +2173,7 @@
               <w14:ligatures w14:val="standardContextual"/>
             </w:rPr>
           </w:pPr>
-          <w:ins w:id="33" w:author="kyle O'Reilly" w:date="2026-10-22T00:15:00Z" w16du:dateUtc="2026-10-21T23:15:00Z">
+          <w:ins w:id="25" w:author="kyle O'Reilly" w:date="2026-10-22T19:17:00Z" w16du:dateUtc="2026-10-22T18:17:00Z">
             <w:r>
               <w:rPr>
                 <w:rStyle w:val="Hyperlink"/>
@@ -2176,7 +2192,7 @@
               <w:rPr>
                 <w:noProof/>
               </w:rPr>
-              <w:instrText>HYPERLINK \l "_Toc243520531"</w:instrText>
+              <w:instrText>HYPERLINK \l "_Toc243589094"</w:instrText>
             </w:r>
             <w:r>
               <w:rPr>
@@ -2224,21 +2240,19 @@
                 <w:noProof/>
                 <w:webHidden/>
               </w:rPr>
-              <w:instrText xml:space="preserve"> PAGEREF _Toc243520531 \h </w:instrText>
-            </w:r>
-          </w:ins>
-          <w:r>
-            <w:rPr>
-              <w:noProof/>
-              <w:webHidden/>
-            </w:rPr>
-          </w:r>
-          <w:ins w:id="34" w:author="kyle O'Reilly" w:date="2026-10-22T00:15:00Z" w16du:dateUtc="2026-10-21T23:15:00Z">
+              <w:instrText xml:space="preserve"> PAGEREF _Toc243589094 \h </w:instrText>
+            </w:r>
             <w:r>
               <w:rPr>
                 <w:noProof/>
                 <w:webHidden/>
               </w:rPr>
+            </w:r>
+            <w:r>
+              <w:rPr>
+                <w:noProof/>
+                <w:webHidden/>
+              </w:rPr>
               <w:fldChar w:fldCharType="separate"/>
             </w:r>
             <w:r>
@@ -2246,7 +2260,7 @@
                 <w:noProof/>
                 <w:webHidden/>
               </w:rPr>
-              <w:t>2</w:t>
+              <w:t>3</w:t>
             </w:r>
             <w:r>
               <w:rPr>
@@ -2271,7 +2285,7 @@
               <w:tab w:val="right" w:leader="dot" w:pos="9016"/>
             </w:tabs>
             <w:rPr>
-              <w:ins w:id="35" w:author="kyle O'Reilly" w:date="2026-10-22T00:15:00Z" w16du:dateUtc="2026-10-21T23:15:00Z"/>
+              <w:ins w:id="26" w:author="kyle O'Reilly" w:date="2026-10-22T19:17:00Z" w16du:dateUtc="2026-10-22T18:17:00Z"/>
               <w:rFonts w:asciiTheme="minorHAnsi" w:eastAsiaTheme="minorEastAsia" w:hAnsiTheme="minorHAnsi" w:cstheme="minorBidi"/>
               <w:noProof/>
               <w:kern w:val="2"/>
@@ -2280,7 +2294,7 @@
               <w14:ligatures w14:val="standardContextual"/>
             </w:rPr>
           </w:pPr>
-          <w:ins w:id="36" w:author="kyle O'Reilly" w:date="2026-10-22T00:15:00Z" w16du:dateUtc="2026-10-21T23:15:00Z">
+          <w:ins w:id="27" w:author="kyle O'Reilly" w:date="2026-10-22T19:17:00Z" w16du:dateUtc="2026-10-22T18:17:00Z">
             <w:r>
               <w:rPr>
                 <w:rStyle w:val="Hyperlink"/>
@@ -2299,7 +2313,7 @@
               <w:rPr>
                 <w:noProof/>
               </w:rPr>
-              <w:instrText>HYPERLINK \l "_Toc243520532"</w:instrText>
+              <w:instrText>HYPERLINK \l "_Toc243589095"</w:instrText>
             </w:r>
             <w:r>
               <w:rPr>
@@ -2347,21 +2361,19 @@
                 <w:noProof/>
                 <w:webHidden/>
               </w:rPr>
-              <w:instrText xml:space="preserve"> PAGEREF _Toc243520532 \h </w:instrText>
-            </w:r>
-          </w:ins>
-          <w:r>
-            <w:rPr>
-              <w:noProof/>
-              <w:webHidden/>
-            </w:rPr>
-          </w:r>
-          <w:ins w:id="37" w:author="kyle O'Reilly" w:date="2026-10-22T00:15:00Z" w16du:dateUtc="2026-10-21T23:15:00Z">
+              <w:instrText xml:space="preserve"> PAGEREF _Toc243589095 \h </w:instrText>
+            </w:r>
             <w:r>
               <w:rPr>
                 <w:noProof/>
                 <w:webHidden/>
               </w:rPr>
+            </w:r>
+            <w:r>
+              <w:rPr>
+                <w:noProof/>
+                <w:webHidden/>
+              </w:rPr>
               <w:fldChar w:fldCharType="separate"/>
             </w:r>
             <w:r>
@@ -2369,7 +2381,7 @@
                 <w:noProof/>
                 <w:webHidden/>
               </w:rPr>
-              <w:t>3</w:t>
+              <w:t>4</w:t>
             </w:r>
             <w:r>
               <w:rPr>
@@ -2394,7 +2406,7 @@
               <w:tab w:val="right" w:leader="dot" w:pos="9016"/>
             </w:tabs>
             <w:rPr>
-              <w:ins w:id="38" w:author="kyle O'Reilly" w:date="2026-10-22T00:15:00Z" w16du:dateUtc="2026-10-21T23:15:00Z"/>
+              <w:ins w:id="28" w:author="kyle O'Reilly" w:date="2026-10-22T19:17:00Z" w16du:dateUtc="2026-10-22T18:17:00Z"/>
               <w:rFonts w:asciiTheme="minorHAnsi" w:eastAsiaTheme="minorEastAsia" w:hAnsiTheme="minorHAnsi" w:cstheme="minorBidi"/>
               <w:noProof/>
               <w:kern w:val="2"/>
@@ -2403,7 +2415,7 @@
               <w14:ligatures w14:val="standardContextual"/>
             </w:rPr>
           </w:pPr>
-          <w:ins w:id="39" w:author="kyle O'Reilly" w:date="2026-10-22T00:15:00Z" w16du:dateUtc="2026-10-21T23:15:00Z">
+          <w:ins w:id="29" w:author="kyle O'Reilly" w:date="2026-10-22T19:17:00Z" w16du:dateUtc="2026-10-22T18:17:00Z">
             <w:r>
               <w:rPr>
                 <w:rStyle w:val="Hyperlink"/>
@@ -2422,7 +2434,7 @@
               <w:rPr>
                 <w:noProof/>
               </w:rPr>
-              <w:instrText>HYPERLINK \l "_Toc243520533"</w:instrText>
+              <w:instrText>HYPERLINK \l "_Toc243589096"</w:instrText>
             </w:r>
             <w:r>
               <w:rPr>
@@ -2470,21 +2482,19 @@
                 <w:noProof/>
                 <w:webHidden/>
               </w:rPr>
-              <w:instrText xml:space="preserve"> PAGEREF _Toc243520533 \h </w:instrText>
-            </w:r>
-          </w:ins>
-          <w:r>
-            <w:rPr>
-              <w:noProof/>
-              <w:webHidden/>
-            </w:rPr>
-          </w:r>
-          <w:ins w:id="40" w:author="kyle O'Reilly" w:date="2026-10-22T00:15:00Z" w16du:dateUtc="2026-10-21T23:15:00Z">
+              <w:instrText xml:space="preserve"> PAGEREF _Toc243589096 \h </w:instrText>
+            </w:r>
             <w:r>
               <w:rPr>
                 <w:noProof/>
                 <w:webHidden/>
               </w:rPr>
+            </w:r>
+            <w:r>
+              <w:rPr>
+                <w:noProof/>
+                <w:webHidden/>
+              </w:rPr>
               <w:fldChar w:fldCharType="separate"/>
             </w:r>
             <w:r>
@@ -2492,7 +2502,7 @@
                 <w:noProof/>
                 <w:webHidden/>
               </w:rPr>
-              <w:t>3</w:t>
+              <w:t>4</w:t>
             </w:r>
             <w:r>
               <w:rPr>
@@ -2511,7 +2521,7 @@
           </w:ins>
         </w:p>
         <w:p>
-          <w:del w:id="41" w:author="kyle O'Reilly" w:date="2026-10-20T21:26:00Z" w16du:dateUtc="2026-10-20T20:26:00Z">
+          <w:del w:id="30" w:author="kyle O'Reilly" w:date="2026-10-20T21:26:00Z" w16du:dateUtc="2026-10-20T20:26:00Z">
             <w:r>
               <w:rPr>
                 <w:b/>
@@ -2554,42 +2564,42 @@
     <w:p>
       <w:pPr>
         <w:rPr>
-          <w:del w:id="42" w:author="kyle O'Reilly" w:date="2026-10-21T20:42:00Z" w16du:dateUtc="2026-10-21T19:42:00Z"/>
-        </w:rPr>
-      </w:pPr>
-    </w:p>
-    <w:p>
-      <w:pPr>
-        <w:rPr>
-          <w:del w:id="43" w:author="kyle O'Reilly" w:date="2026-10-21T20:42:00Z" w16du:dateUtc="2026-10-21T19:42:00Z"/>
-        </w:rPr>
-      </w:pPr>
-    </w:p>
-    <w:p>
-      <w:pPr>
-        <w:rPr>
-          <w:del w:id="44" w:author="kyle O'Reilly" w:date="2026-10-21T20:42:00Z" w16du:dateUtc="2026-10-21T19:42:00Z"/>
-        </w:rPr>
-      </w:pPr>
-    </w:p>
-    <w:p>
-      <w:pPr>
-        <w:rPr>
-          <w:del w:id="45" w:author="kyle O'Reilly" w:date="2026-10-21T20:42:00Z" w16du:dateUtc="2026-10-21T19:42:00Z"/>
-        </w:rPr>
-      </w:pPr>
-    </w:p>
-    <w:p>
-      <w:pPr>
-        <w:rPr>
-          <w:del w:id="46" w:author="kyle O'Reilly" w:date="2026-10-21T20:42:00Z" w16du:dateUtc="2026-10-21T19:42:00Z"/>
-        </w:rPr>
-      </w:pPr>
-    </w:p>
-    <w:p>
-      <w:pPr>
-        <w:rPr>
-          <w:del w:id="47" w:author="kyle O'Reilly" w:date="2026-10-21T20:42:00Z" w16du:dateUtc="2026-10-21T19:42:00Z"/>
+          <w:del w:id="31" w:author="kyle O'Reilly" w:date="2026-10-21T20:42:00Z" w16du:dateUtc="2026-10-21T19:42:00Z"/>
+        </w:rPr>
+      </w:pPr>
+    </w:p>
+    <w:p>
+      <w:pPr>
+        <w:rPr>
+          <w:del w:id="32" w:author="kyle O'Reilly" w:date="2026-10-21T20:42:00Z" w16du:dateUtc="2026-10-21T19:42:00Z"/>
+        </w:rPr>
+      </w:pPr>
+    </w:p>
+    <w:p>
+      <w:pPr>
+        <w:rPr>
+          <w:del w:id="33" w:author="kyle O'Reilly" w:date="2026-10-21T20:42:00Z" w16du:dateUtc="2026-10-21T19:42:00Z"/>
+        </w:rPr>
+      </w:pPr>
+    </w:p>
+    <w:p>
+      <w:pPr>
+        <w:rPr>
+          <w:del w:id="34" w:author="kyle O'Reilly" w:date="2026-10-21T20:42:00Z" w16du:dateUtc="2026-10-21T19:42:00Z"/>
+        </w:rPr>
+      </w:pPr>
+    </w:p>
+    <w:p>
+      <w:pPr>
+        <w:rPr>
+          <w:del w:id="35" w:author="kyle O'Reilly" w:date="2026-10-21T20:42:00Z" w16du:dateUtc="2026-10-21T19:42:00Z"/>
+        </w:rPr>
+      </w:pPr>
+    </w:p>
+    <w:p>
+      <w:pPr>
+        <w:rPr>
+          <w:del w:id="36" w:author="kyle O'Reilly" w:date="2026-10-21T20:42:00Z" w16du:dateUtc="2026-10-21T19:42:00Z"/>
         </w:rPr>
       </w:pPr>
     </w:p>
@@ -2597,14 +2607,14 @@
     <w:p>
       <w:pPr>
         <w:rPr>
-          <w:del w:id="48" w:author="kyle O'Reilly" w:date="2026-10-21T20:42:00Z" w16du:dateUtc="2026-10-21T19:42:00Z"/>
-        </w:rPr>
-      </w:pPr>
-    </w:p>
-    <w:p>
-      <w:pPr>
-        <w:rPr>
-          <w:del w:id="49" w:author="kyle O'Reilly" w:date="2026-10-21T20:42:00Z" w16du:dateUtc="2026-10-21T19:42:00Z"/>
+          <w:del w:id="37" w:author="kyle O'Reilly" w:date="2026-10-21T20:42:00Z" w16du:dateUtc="2026-10-21T19:42:00Z"/>
+        </w:rPr>
+      </w:pPr>
+    </w:p>
+    <w:p>
+      <w:pPr>
+        <w:rPr>
+          <w:del w:id="38" w:author="kyle O'Reilly" w:date="2026-10-21T20:42:00Z" w16du:dateUtc="2026-10-21T19:42:00Z"/>
         </w:rPr>
       </w:pPr>
     </w:p>
@@ -2612,14 +2622,14 @@
     <w:p>
       <w:pPr>
         <w:rPr>
-          <w:del w:id="50" w:author="kyle O'Reilly" w:date="2026-10-21T20:28:00Z" w16du:dateUtc="2026-10-21T19:28:00Z"/>
-        </w:rPr>
-      </w:pPr>
-    </w:p>
-    <w:p>
-      <w:pPr>
-        <w:rPr>
-          <w:del w:id="51" w:author="kyle O'Reilly" w:date="2026-10-20T21:26:00Z" w16du:dateUtc="2026-10-20T20:26:00Z"/>
+          <w:del w:id="39" w:author="kyle O'Reilly" w:date="2026-10-21T20:28:00Z" w16du:dateUtc="2026-10-21T19:28:00Z"/>
+        </w:rPr>
+      </w:pPr>
+    </w:p>
+    <w:p>
+      <w:pPr>
+        <w:rPr>
+          <w:del w:id="40" w:author="kyle O'Reilly" w:date="2026-10-20T21:26:00Z" w16du:dateUtc="2026-10-20T20:26:00Z"/>
         </w:rPr>
       </w:pPr>
     </w:p>
@@ -2641,31 +2651,31 @@
         <w:spacing w:line="360" w:lineRule="auto"/>
         <w:jc w:val="both"/>
         <w:rPr>
-          <w:ins w:id="52" w:author="kyle O'Reilly" w:date="2026-10-21T20:28:00Z" w16du:dateUtc="2026-10-21T19:28:00Z"/>
-        </w:rPr>
-        <w:pPrChange w:id="53" w:author="kyle O'Reilly" w:date="2026-10-21T20:33:00Z" w16du:dateUtc="2026-10-21T19:33:00Z">
+          <w:ins w:id="41" w:author="kyle O'Reilly" w:date="2026-10-21T20:28:00Z" w16du:dateUtc="2026-10-21T19:28:00Z"/>
+        </w:rPr>
+        <w:pPrChange w:id="42" w:author="kyle O'Reilly" w:date="2026-10-21T20:33:00Z" w16du:dateUtc="2026-10-21T19:33:00Z">
           <w:pPr>
             <w:pStyle w:val="Heading1"/>
           </w:pPr>
         </w:pPrChange>
       </w:pPr>
-      <w:bookmarkStart w:id="54" w:name="_Toc243520523"/>
-      <w:ins w:id="55" w:author="kyle O'Reilly" w:date="2026-10-20T21:25:00Z" w16du:dateUtc="2026-10-20T20:25:00Z">
+      <w:bookmarkStart w:id="43" w:name="_Toc243589086"/>
+      <w:ins w:id="44" w:author="kyle O'Reilly" w:date="2026-10-20T21:25:00Z" w16du:dateUtc="2026-10-20T20:25:00Z">
         <w:r>
           <w:lastRenderedPageBreak/>
           <w:t>1.</w:t>
         </w:r>
       </w:ins>
-      <w:ins w:id="56" w:author="kyle O'Reilly" w:date="2026-10-20T21:26:00Z" w16du:dateUtc="2026-10-20T20:26:00Z">
+      <w:ins w:id="45" w:author="kyle O'Reilly" w:date="2026-10-20T21:26:00Z" w16du:dateUtc="2026-10-20T20:26:00Z">
         <w:r>
           <w:t xml:space="preserve"> </w:t>
         </w:r>
       </w:ins>
-      <w:ins w:id="57" w:author="kyle O'Reilly" w:date="2026-10-21T20:28:00Z" w16du:dateUtc="2026-10-21T19:28:00Z">
+      <w:ins w:id="46" w:author="kyle O'Reilly" w:date="2026-10-21T20:28:00Z" w16du:dateUtc="2026-10-21T19:28:00Z">
         <w:r>
           <w:t>Project Title</w:t>
         </w:r>
-        <w:bookmarkEnd w:id="54"/>
+        <w:bookmarkEnd w:id="43"/>
       </w:ins>
     </w:p>
     <w:p>
@@ -2673,18 +2683,15 @@
         <w:spacing w:line="360" w:lineRule="auto"/>
         <w:jc w:val="both"/>
         <w:rPr>
-          <w:ins w:id="58" w:author="kyle O'Reilly" w:date="2026-10-21T20:32:00Z" w16du:dateUtc="2026-10-21T19:32:00Z"/>
-        </w:rPr>
-        <w:pPrChange w:id="59" w:author="kyle O'Reilly" w:date="2026-10-21T20:33:00Z" w16du:dateUtc="2026-10-21T19:33:00Z">
-          <w:pPr/>
-        </w:pPrChange>
-      </w:pPr>
-      <w:ins w:id="60" w:author="kyle O'Reilly" w:date="2026-10-21T20:28:00Z" w16du:dateUtc="2026-10-21T19:28:00Z">
+          <w:ins w:id="47" w:author="kyle O'Reilly" w:date="2026-10-22T18:49:00Z" w16du:dateUtc="2026-10-22T17:49:00Z"/>
+        </w:rPr>
+      </w:pPr>
+      <w:ins w:id="48" w:author="kyle O'Reilly" w:date="2026-10-21T20:28:00Z" w16du:dateUtc="2026-10-21T19:28:00Z">
         <w:r>
           <w:t xml:space="preserve">Assessing the Accuracy of Machine </w:t>
         </w:r>
       </w:ins>
-      <w:ins w:id="61" w:author="kyle O'Reilly" w:date="2026-10-21T20:29:00Z" w16du:dateUtc="2026-10-21T19:29:00Z">
+      <w:ins w:id="49" w:author="kyle O'Reilly" w:date="2026-10-21T20:29:00Z" w16du:dateUtc="2026-10-21T19:29:00Z">
         <w:r>
           <w:t>Learning Models in Predicting F</w:t>
         </w:r>
@@ -2707,7 +2714,7 @@
           <w:t>wi</w:t>
         </w:r>
       </w:ins>
-      <w:ins w:id="62" w:author="kyle O'Reilly" w:date="2026-10-21T20:30:00Z" w16du:dateUtc="2026-10-21T19:30:00Z">
+      <w:ins w:id="50" w:author="kyle O'Reilly" w:date="2026-10-21T20:30:00Z" w16du:dateUtc="2026-10-21T19:30:00Z">
         <w:r>
           <w:t xml:space="preserve">th Different </w:t>
         </w:r>
@@ -2718,8 +2725,10 @@
     </w:p>
     <w:p>
       <w:pPr>
-        <w:rPr>
-          <w:ins w:id="63" w:author="kyle O'Reilly" w:date="2026-10-21T20:28:00Z" w16du:dateUtc="2026-10-21T19:28:00Z"/>
+        <w:spacing w:line="360" w:lineRule="auto"/>
+        <w:jc w:val="both"/>
+        <w:rPr>
+          <w:ins w:id="51" w:author="kyle O'Reilly" w:date="2026-10-22T18:49:00Z" w16du:dateUtc="2026-10-22T17:49:00Z"/>
         </w:rPr>
       </w:pPr>
     </w:p>
@@ -2727,29 +2736,29 @@
       <w:pPr>
         <w:pStyle w:val="Heading1"/>
         <w:rPr>
-          <w:ins w:id="64" w:author="kyle O'Reilly" w:date="2026-10-21T20:39:00Z" w16du:dateUtc="2026-10-21T19:39:00Z"/>
-        </w:rPr>
-      </w:pPr>
-      <w:bookmarkStart w:id="65" w:name="_Toc243520524"/>
-      <w:ins w:id="66" w:author="kyle O'Reilly" w:date="2026-10-21T20:28:00Z" w16du:dateUtc="2026-10-21T19:28:00Z">
+          <w:ins w:id="52" w:author="kyle O'Reilly" w:date="2026-10-21T20:39:00Z" w16du:dateUtc="2026-10-21T19:39:00Z"/>
+        </w:rPr>
+      </w:pPr>
+      <w:bookmarkStart w:id="53" w:name="_Toc243589087"/>
+      <w:ins w:id="54" w:author="kyle O'Reilly" w:date="2026-10-21T20:28:00Z" w16du:dateUtc="2026-10-21T19:28:00Z">
         <w:r>
           <w:t>2. Introduction</w:t>
         </w:r>
       </w:ins>
-      <w:bookmarkEnd w:id="65"/>
-    </w:p>
-    <w:p>
-      <w:pPr>
-        <w:rPr>
-          <w:ins w:id="67" w:author="kyle O'Reilly" w:date="2026-10-20T21:26:00Z" w16du:dateUtc="2026-10-20T20:26:00Z"/>
-        </w:rPr>
-        <w:pPrChange w:id="68" w:author="kyle O'Reilly" w:date="2026-10-21T20:39:00Z" w16du:dateUtc="2026-10-21T19:39:00Z">
+      <w:bookmarkEnd w:id="53"/>
+    </w:p>
+    <w:p>
+      <w:pPr>
+        <w:rPr>
+          <w:ins w:id="55" w:author="kyle O'Reilly" w:date="2026-10-20T21:26:00Z" w16du:dateUtc="2026-10-20T20:26:00Z"/>
+        </w:rPr>
+        <w:pPrChange w:id="56" w:author="kyle O'Reilly" w:date="2026-10-21T20:39:00Z" w16du:dateUtc="2026-10-21T19:39:00Z">
           <w:pPr>
             <w:pStyle w:val="Heading1"/>
           </w:pPr>
         </w:pPrChange>
       </w:pPr>
-      <w:ins w:id="69" w:author="kyle O'Reilly" w:date="2026-10-21T20:39:00Z" w16du:dateUtc="2026-10-21T19:39:00Z">
+      <w:ins w:id="57" w:author="kyle O'Reilly" w:date="2026-10-22T18:49:00Z" w16du:dateUtc="2026-10-22T17:49:00Z">
         <w:r>
           <w:t>?</w:t>
         </w:r>
@@ -2758,7 +2767,7 @@
     <w:p>
       <w:pPr>
         <w:rPr>
-          <w:ins w:id="70" w:author="kyle O'Reilly" w:date="2026-10-21T20:39:00Z" w16du:dateUtc="2026-10-21T19:39:00Z"/>
+          <w:ins w:id="58" w:author="kyle O'Reilly" w:date="2026-10-21T20:39:00Z" w16du:dateUtc="2026-10-21T19:39:00Z"/>
         </w:rPr>
       </w:pPr>
     </w:p>
@@ -2766,18 +2775,18 @@
       <w:pPr>
         <w:pStyle w:val="Heading1"/>
         <w:rPr>
-          <w:ins w:id="71" w:author="kyle O'Reilly" w:date="2026-10-21T20:39:00Z" w16du:dateUtc="2026-10-21T19:39:00Z"/>
-        </w:rPr>
-        <w:pPrChange w:id="72" w:author="kyle O'Reilly" w:date="2026-10-21T20:40:00Z" w16du:dateUtc="2026-10-21T19:40:00Z">
+          <w:ins w:id="59" w:author="kyle O'Reilly" w:date="2026-10-21T20:39:00Z" w16du:dateUtc="2026-10-21T19:39:00Z"/>
+        </w:rPr>
+        <w:pPrChange w:id="60" w:author="kyle O'Reilly" w:date="2026-10-21T20:40:00Z" w16du:dateUtc="2026-10-21T19:40:00Z">
           <w:pPr/>
         </w:pPrChange>
       </w:pPr>
-      <w:bookmarkStart w:id="73" w:name="_Toc243520525"/>
-      <w:ins w:id="74" w:author="kyle O'Reilly" w:date="2026-10-21T20:39:00Z" w16du:dateUtc="2026-10-21T19:39:00Z">
+      <w:bookmarkStart w:id="61" w:name="_Toc243589088"/>
+      <w:ins w:id="62" w:author="kyle O'Reilly" w:date="2026-10-21T20:39:00Z" w16du:dateUtc="2026-10-21T19:39:00Z">
         <w:r>
           <w:t>3. Problem Definition</w:t>
         </w:r>
-        <w:bookmarkEnd w:id="73"/>
+        <w:bookmarkEnd w:id="61"/>
         <w:r>
           <w:t xml:space="preserve"> </w:t>
         </w:r>
@@ -2786,10 +2795,10 @@
     <w:p>
       <w:pPr>
         <w:rPr>
-          <w:ins w:id="75" w:author="kyle O'Reilly" w:date="2026-10-21T20:39:00Z" w16du:dateUtc="2026-10-21T19:39:00Z"/>
-        </w:rPr>
-      </w:pPr>
-      <w:ins w:id="76" w:author="kyle O'Reilly" w:date="2026-10-21T20:39:00Z" w16du:dateUtc="2026-10-21T19:39:00Z">
+          <w:ins w:id="63" w:author="kyle O'Reilly" w:date="2026-10-21T20:39:00Z" w16du:dateUtc="2026-10-21T19:39:00Z"/>
+        </w:rPr>
+      </w:pPr>
+      <w:ins w:id="64" w:author="kyle O'Reilly" w:date="2026-10-21T20:39:00Z" w16du:dateUtc="2026-10-21T19:39:00Z">
         <w:r>
           <w:t>?</w:t>
         </w:r>
@@ -2797,13 +2806,9 @@
     </w:p>
     <w:p>
       <w:pPr>
-        <w:pStyle w:val="Heading1"/>
-        <w:rPr>
-          <w:ins w:id="77" w:author="kyle O'Reilly" w:date="2026-10-21T20:39:00Z" w16du:dateUtc="2026-10-21T19:39:00Z"/>
-        </w:rPr>
-        <w:pPrChange w:id="78" w:author="kyle O'Reilly" w:date="2026-10-21T20:40:00Z" w16du:dateUtc="2026-10-21T19:40:00Z">
-          <w:pPr/>
-        </w:pPrChange>
+        <w:rPr>
+          <w:ins w:id="65" w:author="kyle O'Reilly" w:date="2026-10-21T20:39:00Z" w16du:dateUtc="2026-10-21T19:39:00Z"/>
+        </w:rPr>
       </w:pPr>
     </w:p>
     <w:p>
@@ -2812,23 +2817,23 @@
         <w:spacing w:line="360" w:lineRule="auto"/>
         <w:jc w:val="both"/>
         <w:rPr>
-          <w:ins w:id="79" w:author="kyle O'Reilly" w:date="2026-10-21T20:40:00Z" w16du:dateUtc="2026-10-21T19:40:00Z"/>
-        </w:rPr>
-        <w:pPrChange w:id="80" w:author="kyle O'Reilly" w:date="2026-10-21T23:18:00Z" w16du:dateUtc="2026-10-21T22:18:00Z">
+          <w:ins w:id="66" w:author="kyle O'Reilly" w:date="2026-10-21T20:40:00Z" w16du:dateUtc="2026-10-21T19:40:00Z"/>
+        </w:rPr>
+        <w:pPrChange w:id="67" w:author="kyle O'Reilly" w:date="2026-10-21T23:18:00Z" w16du:dateUtc="2026-10-21T22:18:00Z">
           <w:pPr/>
         </w:pPrChange>
       </w:pPr>
-      <w:bookmarkStart w:id="81" w:name="_Toc243520526"/>
-      <w:ins w:id="82" w:author="kyle O'Reilly" w:date="2026-10-21T20:39:00Z" w16du:dateUtc="2026-10-21T19:39:00Z">
+      <w:bookmarkStart w:id="68" w:name="_Toc243589089"/>
+      <w:ins w:id="69" w:author="kyle O'Reilly" w:date="2026-10-21T20:39:00Z" w16du:dateUtc="2026-10-21T19:39:00Z">
         <w:r>
           <w:t>4. Aim</w:t>
         </w:r>
       </w:ins>
-      <w:ins w:id="83" w:author="kyle O'Reilly" w:date="2026-10-21T20:40:00Z" w16du:dateUtc="2026-10-21T19:40:00Z">
+      <w:ins w:id="70" w:author="kyle O'Reilly" w:date="2026-10-21T20:40:00Z" w16du:dateUtc="2026-10-21T19:40:00Z">
         <w:r>
           <w:t>, Objectives and Hypothesis</w:t>
         </w:r>
-        <w:bookmarkEnd w:id="81"/>
+        <w:bookmarkEnd w:id="68"/>
         <w:r>
           <w:t xml:space="preserve"> </w:t>
         </w:r>
@@ -2839,18 +2844,18 @@
         <w:spacing w:line="360" w:lineRule="auto"/>
         <w:jc w:val="both"/>
         <w:rPr>
-          <w:ins w:id="84" w:author="kyle O'Reilly" w:date="2026-10-21T23:16:00Z" w16du:dateUtc="2026-10-21T22:16:00Z"/>
-        </w:rPr>
-        <w:pPrChange w:id="85" w:author="kyle O'Reilly" w:date="2026-10-21T23:18:00Z" w16du:dateUtc="2026-10-21T22:18:00Z">
+          <w:ins w:id="71" w:author="kyle O'Reilly" w:date="2026-10-21T23:16:00Z" w16du:dateUtc="2026-10-21T22:16:00Z"/>
+        </w:rPr>
+        <w:pPrChange w:id="72" w:author="kyle O'Reilly" w:date="2026-10-21T23:18:00Z" w16du:dateUtc="2026-10-21T22:18:00Z">
           <w:pPr/>
         </w:pPrChange>
       </w:pPr>
-      <w:ins w:id="86" w:author="kyle O'Reilly" w:date="2026-10-21T23:10:00Z" w16du:dateUtc="2026-10-21T22:10:00Z">
+      <w:ins w:id="73" w:author="kyle O'Reilly" w:date="2026-10-21T23:10:00Z" w16du:dateUtc="2026-10-21T22:10:00Z">
         <w:r>
           <w:rPr>
             <w:b/>
             <w:bCs/>
-            <w:rPrChange w:id="87" w:author="kyle O'Reilly" w:date="2026-10-21T23:11:00Z" w16du:dateUtc="2026-10-21T22:11:00Z">
+            <w:rPrChange w:id="74" w:author="kyle O'Reilly" w:date="2026-10-21T23:11:00Z" w16du:dateUtc="2026-10-21T22:11:00Z">
               <w:rPr/>
             </w:rPrChange>
           </w:rPr>
@@ -2866,33 +2871,33 @@
         <w:spacing w:line="360" w:lineRule="auto"/>
         <w:jc w:val="both"/>
         <w:rPr>
-          <w:ins w:id="88" w:author="kyle O'Reilly" w:date="2026-10-21T23:11:00Z" w16du:dateUtc="2026-10-21T22:11:00Z"/>
-        </w:rPr>
-        <w:pPrChange w:id="89" w:author="kyle O'Reilly" w:date="2026-10-21T23:18:00Z" w16du:dateUtc="2026-10-21T22:18:00Z">
+          <w:ins w:id="75" w:author="kyle O'Reilly" w:date="2026-10-21T23:11:00Z" w16du:dateUtc="2026-10-21T22:11:00Z"/>
+        </w:rPr>
+        <w:pPrChange w:id="76" w:author="kyle O'Reilly" w:date="2026-10-21T23:18:00Z" w16du:dateUtc="2026-10-21T22:18:00Z">
           <w:pPr/>
         </w:pPrChange>
       </w:pPr>
-      <w:ins w:id="90" w:author="kyle O'Reilly" w:date="2026-10-21T23:10:00Z" w16du:dateUtc="2026-10-21T22:10:00Z">
+      <w:ins w:id="77" w:author="kyle O'Reilly" w:date="2026-10-21T23:10:00Z" w16du:dateUtc="2026-10-21T22:10:00Z">
         <w:r>
           <w:t xml:space="preserve">To compare the accuracy of Linear Regression, Random Forest and a </w:t>
         </w:r>
       </w:ins>
-      <w:ins w:id="91" w:author="kyle O'Reilly" w:date="2026-10-21T23:14:00Z" w16du:dateUtc="2026-10-21T22:14:00Z">
+      <w:ins w:id="78" w:author="kyle O'Reilly" w:date="2026-10-21T23:14:00Z" w16du:dateUtc="2026-10-21T22:14:00Z">
         <w:r>
           <w:t>n</w:t>
         </w:r>
       </w:ins>
-      <w:ins w:id="92" w:author="kyle O'Reilly" w:date="2026-10-21T23:10:00Z" w16du:dateUtc="2026-10-21T22:10:00Z">
+      <w:ins w:id="79" w:author="kyle O'Reilly" w:date="2026-10-21T23:10:00Z" w16du:dateUtc="2026-10-21T22:10:00Z">
         <w:r>
           <w:t xml:space="preserve">aïve </w:t>
         </w:r>
       </w:ins>
-      <w:ins w:id="93" w:author="kyle O'Reilly" w:date="2026-10-21T23:14:00Z" w16du:dateUtc="2026-10-21T22:14:00Z">
+      <w:ins w:id="80" w:author="kyle O'Reilly" w:date="2026-10-21T23:14:00Z" w16du:dateUtc="2026-10-21T22:14:00Z">
         <w:r>
           <w:t>b</w:t>
         </w:r>
       </w:ins>
-      <w:ins w:id="94" w:author="kyle O'Reilly" w:date="2026-10-21T23:10:00Z" w16du:dateUtc="2026-10-21T22:10:00Z">
+      <w:ins w:id="81" w:author="kyle O'Reilly" w:date="2026-10-21T23:10:00Z" w16du:dateUtc="2026-10-21T22:10:00Z">
         <w:r>
           <w:t xml:space="preserve">aseline when predicting stock </w:t>
         </w:r>
@@ -2900,37 +2905,37 @@
           <w:t xml:space="preserve">prices twenty </w:t>
         </w:r>
       </w:ins>
-      <w:ins w:id="95" w:author="kyle O'Reilly" w:date="2026-10-22T00:14:00Z" w16du:dateUtc="2026-10-21T23:14:00Z">
+      <w:ins w:id="82" w:author="kyle O'Reilly" w:date="2026-10-22T00:14:00Z" w16du:dateUtc="2026-10-21T23:14:00Z">
         <w:r>
           <w:t xml:space="preserve">trading </w:t>
         </w:r>
       </w:ins>
-      <w:ins w:id="96" w:author="kyle O'Reilly" w:date="2026-10-21T23:10:00Z" w16du:dateUtc="2026-10-21T22:10:00Z">
+      <w:ins w:id="83" w:author="kyle O'Reilly" w:date="2026-10-21T23:10:00Z" w16du:dateUtc="2026-10-21T22:10:00Z">
         <w:r>
           <w:t xml:space="preserve">days after one </w:t>
         </w:r>
       </w:ins>
-      <w:ins w:id="97" w:author="kyle O'Reilly" w:date="2026-10-21T23:11:00Z" w16du:dateUtc="2026-10-21T22:11:00Z">
+      <w:ins w:id="84" w:author="kyle O'Reilly" w:date="2026-10-21T23:11:00Z" w16du:dateUtc="2026-10-21T22:11:00Z">
         <w:r>
           <w:t>historical cut-off stock date from the JPM</w:t>
         </w:r>
       </w:ins>
-      <w:ins w:id="98" w:author="kyle O'Reilly" w:date="2026-10-22T00:04:00Z" w16du:dateUtc="2026-10-21T23:04:00Z">
+      <w:ins w:id="85" w:author="kyle O'Reilly" w:date="2026-10-22T00:04:00Z" w16du:dateUtc="2026-10-21T23:04:00Z">
         <w:r>
           <w:t>.US</w:t>
         </w:r>
       </w:ins>
-      <w:ins w:id="99" w:author="kyle O'Reilly" w:date="2026-10-21T23:11:00Z" w16du:dateUtc="2026-10-21T22:11:00Z">
+      <w:ins w:id="86" w:author="kyle O'Reilly" w:date="2026-10-21T23:11:00Z" w16du:dateUtc="2026-10-21T22:11:00Z">
         <w:r>
           <w:t>, KO</w:t>
         </w:r>
       </w:ins>
-      <w:ins w:id="100" w:author="kyle O'Reilly" w:date="2026-10-22T00:04:00Z" w16du:dateUtc="2026-10-21T23:04:00Z">
+      <w:ins w:id="87" w:author="kyle O'Reilly" w:date="2026-10-22T00:04:00Z" w16du:dateUtc="2026-10-21T23:04:00Z">
         <w:r>
           <w:t>.US</w:t>
         </w:r>
       </w:ins>
-      <w:ins w:id="101" w:author="kyle O'Reilly" w:date="2026-10-21T23:11:00Z" w16du:dateUtc="2026-10-21T22:11:00Z">
+      <w:ins w:id="88" w:author="kyle O'Reilly" w:date="2026-10-21T23:11:00Z" w16du:dateUtc="2026-10-21T22:11:00Z">
         <w:r>
           <w:t xml:space="preserve"> and </w:t>
         </w:r>
@@ -2938,7 +2943,7 @@
           <w:t>INTC.</w:t>
         </w:r>
       </w:ins>
-      <w:ins w:id="102" w:author="kyle O'Reilly" w:date="2026-10-22T00:04:00Z" w16du:dateUtc="2026-10-21T23:04:00Z">
+      <w:ins w:id="89" w:author="kyle O'Reilly" w:date="2026-10-22T00:04:00Z" w16du:dateUtc="2026-10-21T23:04:00Z">
         <w:r>
           <w:t>US.</w:t>
         </w:r>
@@ -2949,25 +2954,25 @@
         <w:spacing w:line="360" w:lineRule="auto"/>
         <w:jc w:val="both"/>
         <w:rPr>
-          <w:ins w:id="103" w:author="kyle O'Reilly" w:date="2026-10-21T23:11:00Z" w16du:dateUtc="2026-10-21T22:11:00Z"/>
+          <w:ins w:id="90" w:author="kyle O'Reilly" w:date="2026-10-21T23:11:00Z" w16du:dateUtc="2026-10-21T22:11:00Z"/>
           <w:b/>
           <w:bCs/>
-          <w:rPrChange w:id="104" w:author="kyle O'Reilly" w:date="2026-10-21T23:16:00Z" w16du:dateUtc="2026-10-21T22:16:00Z">
+          <w:rPrChange w:id="91" w:author="kyle O'Reilly" w:date="2026-10-21T23:16:00Z" w16du:dateUtc="2026-10-21T22:16:00Z">
             <w:rPr>
-              <w:ins w:id="105" w:author="kyle O'Reilly" w:date="2026-10-21T23:11:00Z" w16du:dateUtc="2026-10-21T22:11:00Z"/>
+              <w:ins w:id="92" w:author="kyle O'Reilly" w:date="2026-10-21T23:11:00Z" w16du:dateUtc="2026-10-21T22:11:00Z"/>
             </w:rPr>
           </w:rPrChange>
         </w:rPr>
-        <w:pPrChange w:id="106" w:author="kyle O'Reilly" w:date="2026-10-21T23:18:00Z" w16du:dateUtc="2026-10-21T22:18:00Z">
+        <w:pPrChange w:id="93" w:author="kyle O'Reilly" w:date="2026-10-21T23:18:00Z" w16du:dateUtc="2026-10-21T22:18:00Z">
           <w:pPr/>
         </w:pPrChange>
       </w:pPr>
-      <w:ins w:id="107" w:author="kyle O'Reilly" w:date="2026-10-21T23:11:00Z" w16du:dateUtc="2026-10-21T22:11:00Z">
+      <w:ins w:id="94" w:author="kyle O'Reilly" w:date="2026-10-21T23:11:00Z" w16du:dateUtc="2026-10-21T22:11:00Z">
         <w:r>
           <w:rPr>
             <w:b/>
             <w:bCs/>
-            <w:rPrChange w:id="108" w:author="kyle O'Reilly" w:date="2026-10-21T23:16:00Z" w16du:dateUtc="2026-10-21T22:16:00Z">
+            <w:rPrChange w:id="95" w:author="kyle O'Reilly" w:date="2026-10-21T23:16:00Z" w16du:dateUtc="2026-10-21T22:16:00Z">
               <w:rPr/>
             </w:rPrChange>
           </w:rPr>
@@ -2985,7 +2990,88 @@
         <w:spacing w:line="360" w:lineRule="auto"/>
         <w:jc w:val="both"/>
         <w:rPr>
-          <w:ins w:id="109" w:author="kyle O'Reilly" w:date="2026-10-21T23:13:00Z" w16du:dateUtc="2026-10-21T22:13:00Z"/>
+          <w:ins w:id="96" w:author="kyle O'Reilly" w:date="2026-10-21T23:13:00Z" w16du:dateUtc="2026-10-21T22:13:00Z"/>
+        </w:rPr>
+        <w:pPrChange w:id="97" w:author="kyle O'Reilly" w:date="2026-10-21T23:18:00Z" w16du:dateUtc="2026-10-21T22:18:00Z">
+          <w:pPr>
+            <w:pStyle w:val="ListParagraph"/>
+            <w:numPr>
+              <w:numId w:val="7"/>
+            </w:numPr>
+            <w:ind w:hanging="360"/>
+          </w:pPr>
+        </w:pPrChange>
+      </w:pPr>
+      <w:ins w:id="98" w:author="kyle O'Reilly" w:date="2026-10-21T23:11:00Z" w16du:dateUtc="2026-10-21T22:11:00Z">
+        <w:r>
+          <w:t>S</w:t>
+        </w:r>
+      </w:ins>
+      <w:ins w:id="99" w:author="kyle O'Reilly" w:date="2026-10-21T23:12:00Z" w16du:dateUtc="2026-10-21T22:12:00Z">
+        <w:r>
+          <w:t>elect JPM</w:t>
+        </w:r>
+      </w:ins>
+      <w:ins w:id="100" w:author="kyle O'Reilly" w:date="2026-10-21T23:57:00Z" w16du:dateUtc="2026-10-21T22:57:00Z">
+        <w:r>
+          <w:t>.US</w:t>
+        </w:r>
+      </w:ins>
+      <w:ins w:id="101" w:author="kyle O'Reilly" w:date="2026-10-21T23:12:00Z" w16du:dateUtc="2026-10-21T22:12:00Z">
+        <w:r>
+          <w:t>,</w:t>
+        </w:r>
+        <w:r>
+          <w:t xml:space="preserve"> KO</w:t>
+        </w:r>
+      </w:ins>
+      <w:ins w:id="102" w:author="kyle O'Reilly" w:date="2026-10-21T23:57:00Z" w16du:dateUtc="2026-10-21T22:57:00Z">
+        <w:r>
+          <w:t>.US</w:t>
+        </w:r>
+      </w:ins>
+      <w:ins w:id="103" w:author="kyle O'Reilly" w:date="2026-10-21T23:12:00Z" w16du:dateUtc="2026-10-21T22:12:00Z">
+        <w:r>
+          <w:t xml:space="preserve"> and INTC</w:t>
+        </w:r>
+      </w:ins>
+      <w:ins w:id="104" w:author="kyle O'Reilly" w:date="2026-10-21T23:57:00Z" w16du:dateUtc="2026-10-21T22:57:00Z">
+        <w:r>
+          <w:t>.US</w:t>
+        </w:r>
+      </w:ins>
+      <w:ins w:id="105" w:author="kyle O'Reilly" w:date="2026-10-21T23:12:00Z" w16du:dateUtc="2026-10-21T22:12:00Z">
+        <w:r>
+          <w:t>, and examine comparable published</w:t>
+        </w:r>
+      </w:ins>
+      <w:ins w:id="106" w:author="kyle O'Reilly" w:date="2026-10-21T23:58:00Z" w16du:dateUtc="2026-10-21T22:58:00Z">
+        <w:r>
+          <w:t xml:space="preserve"> Trading 212</w:t>
+        </w:r>
+      </w:ins>
+      <w:ins w:id="107" w:author="kyle O'Reilly" w:date="2026-10-21T23:12:00Z" w16du:dateUtc="2026-10-21T22:12:00Z">
+        <w:r>
+          <w:t xml:space="preserve"> volatility information to justify their proposed contra</w:t>
+        </w:r>
+      </w:ins>
+      <w:ins w:id="108" w:author="kyle O'Reilly" w:date="2026-10-21T23:13:00Z" w16du:dateUtc="2026-10-21T22:13:00Z">
+        <w:r>
+          <w:t>sting volatility levels.</w:t>
+        </w:r>
+      </w:ins>
+    </w:p>
+    <w:p>
+      <w:pPr>
+        <w:pStyle w:val="ListParagraph"/>
+        <w:numPr>
+          <w:ilvl w:val="0"/>
+          <w:numId w:val="7"/>
+        </w:numPr>
+        <w:spacing w:line="360" w:lineRule="auto"/>
+        <w:jc w:val="both"/>
+        <w:rPr>
+          <w:ins w:id="109" w:author="kyle O'Reilly" w:date="2026-10-21T23:14:00Z" w16du:dateUtc="2026-10-21T22:14:00Z"/>
         </w:rPr>
         <w:pPrChange w:id="110" w:author="kyle O'Reilly" w:date="2026-10-21T23:18:00Z" w16du:dateUtc="2026-10-21T22:18:00Z">
           <w:pPr>
@@ -2997,62 +3083,17 @@
           </w:pPr>
         </w:pPrChange>
       </w:pPr>
-      <w:ins w:id="111" w:author="kyle O'Reilly" w:date="2026-10-21T23:11:00Z" w16du:dateUtc="2026-10-21T22:11:00Z">
-        <w:r>
-          <w:t>S</w:t>
-        </w:r>
-      </w:ins>
-      <w:ins w:id="112" w:author="kyle O'Reilly" w:date="2026-10-21T23:12:00Z" w16du:dateUtc="2026-10-21T22:12:00Z">
-        <w:r>
-          <w:t>elect JPM</w:t>
-        </w:r>
-      </w:ins>
-      <w:ins w:id="113" w:author="kyle O'Reilly" w:date="2026-10-21T23:57:00Z" w16du:dateUtc="2026-10-21T22:57:00Z">
-        <w:r>
-          <w:t>.US</w:t>
-        </w:r>
-      </w:ins>
-      <w:ins w:id="114" w:author="kyle O'Reilly" w:date="2026-10-21T23:12:00Z" w16du:dateUtc="2026-10-21T22:12:00Z">
-        <w:r>
-          <w:t>,</w:t>
-        </w:r>
-        <w:r>
-          <w:t xml:space="preserve"> KO</w:t>
-        </w:r>
-      </w:ins>
-      <w:ins w:id="115" w:author="kyle O'Reilly" w:date="2026-10-21T23:57:00Z" w16du:dateUtc="2026-10-21T22:57:00Z">
-        <w:r>
-          <w:t>.US</w:t>
-        </w:r>
-      </w:ins>
-      <w:ins w:id="116" w:author="kyle O'Reilly" w:date="2026-10-21T23:12:00Z" w16du:dateUtc="2026-10-21T22:12:00Z">
-        <w:r>
-          <w:t xml:space="preserve"> and INTC</w:t>
-        </w:r>
-      </w:ins>
-      <w:ins w:id="117" w:author="kyle O'Reilly" w:date="2026-10-21T23:57:00Z" w16du:dateUtc="2026-10-21T22:57:00Z">
-        <w:r>
-          <w:t>.US</w:t>
-        </w:r>
-      </w:ins>
-      <w:ins w:id="118" w:author="kyle O'Reilly" w:date="2026-10-21T23:12:00Z" w16du:dateUtc="2026-10-21T22:12:00Z">
-        <w:r>
-          <w:t>, and examine comparable published</w:t>
-        </w:r>
-      </w:ins>
-      <w:ins w:id="119" w:author="kyle O'Reilly" w:date="2026-10-21T23:58:00Z" w16du:dateUtc="2026-10-21T22:58:00Z">
-        <w:r>
-          <w:t xml:space="preserve"> Trading 212</w:t>
-        </w:r>
-      </w:ins>
-      <w:ins w:id="120" w:author="kyle O'Reilly" w:date="2026-10-21T23:12:00Z" w16du:dateUtc="2026-10-21T22:12:00Z">
-        <w:r>
-          <w:t xml:space="preserve"> volatility information to justify their proposed contra</w:t>
-        </w:r>
-      </w:ins>
-      <w:ins w:id="121" w:author="kyle O'Reilly" w:date="2026-10-21T23:13:00Z" w16du:dateUtc="2026-10-21T22:13:00Z">
-        <w:r>
-          <w:t>sting volatility levels.</w:t>
+      <w:ins w:id="111" w:author="kyle O'Reilly" w:date="2026-10-21T23:13:00Z" w16du:dateUtc="2026-10-21T22:13:00Z">
+        <w:r>
+          <w:t xml:space="preserve">Collect, clean and analyse historical stock data </w:t>
+        </w:r>
+        <w:r>
+          <w:t>from Stooq, and prepare simple historical</w:t>
+        </w:r>
+      </w:ins>
+      <w:ins w:id="112" w:author="kyle O'Reilly" w:date="2026-10-21T23:14:00Z" w16du:dateUtc="2026-10-21T22:14:00Z">
+        <w:r>
+          <w:t xml:space="preserve"> price features for the forecasting models.</w:t>
         </w:r>
       </w:ins>
     </w:p>
@@ -3066,9 +3107,9 @@
         <w:spacing w:line="360" w:lineRule="auto"/>
         <w:jc w:val="both"/>
         <w:rPr>
-          <w:ins w:id="122" w:author="kyle O'Reilly" w:date="2026-10-21T23:14:00Z" w16du:dateUtc="2026-10-21T22:14:00Z"/>
-        </w:rPr>
-        <w:pPrChange w:id="123" w:author="kyle O'Reilly" w:date="2026-10-21T23:18:00Z" w16du:dateUtc="2026-10-21T22:18:00Z">
+          <w:ins w:id="113" w:author="kyle O'Reilly" w:date="2026-10-21T23:14:00Z" w16du:dateUtc="2026-10-21T22:14:00Z"/>
+        </w:rPr>
+        <w:pPrChange w:id="114" w:author="kyle O'Reilly" w:date="2026-10-21T23:18:00Z" w16du:dateUtc="2026-10-21T22:18:00Z">
           <w:pPr>
             <w:pStyle w:val="ListParagraph"/>
             <w:numPr>
@@ -3078,17 +3119,9 @@
           </w:pPr>
         </w:pPrChange>
       </w:pPr>
-      <w:ins w:id="124" w:author="kyle O'Reilly" w:date="2026-10-21T23:13:00Z" w16du:dateUtc="2026-10-21T22:13:00Z">
-        <w:r>
-          <w:t xml:space="preserve">Collect, clean and analyse historical stock data </w:t>
-        </w:r>
-        <w:r>
-          <w:t>from Stooq, and prepare simple historical</w:t>
-        </w:r>
-      </w:ins>
-      <w:ins w:id="125" w:author="kyle O'Reilly" w:date="2026-10-21T23:14:00Z" w16du:dateUtc="2026-10-21T22:14:00Z">
-        <w:r>
-          <w:t xml:space="preserve"> price features for the forecasting models.</w:t>
+      <w:ins w:id="115" w:author="kyle O'Reilly" w:date="2026-10-21T23:14:00Z" w16du:dateUtc="2026-10-21T22:14:00Z">
+        <w:r>
+          <w:t>Develop Linear Regression and Random Forest models and establish a naïve baseline for each selected stock.</w:t>
         </w:r>
       </w:ins>
     </w:p>
@@ -3102,9 +3135,9 @@
         <w:spacing w:line="360" w:lineRule="auto"/>
         <w:jc w:val="both"/>
         <w:rPr>
-          <w:ins w:id="126" w:author="kyle O'Reilly" w:date="2026-10-21T23:14:00Z" w16du:dateUtc="2026-10-21T22:14:00Z"/>
-        </w:rPr>
-        <w:pPrChange w:id="127" w:author="kyle O'Reilly" w:date="2026-10-21T23:18:00Z" w16du:dateUtc="2026-10-21T22:18:00Z">
+          <w:ins w:id="116" w:author="kyle O'Reilly" w:date="2026-10-21T23:15:00Z" w16du:dateUtc="2026-10-21T22:15:00Z"/>
+        </w:rPr>
+        <w:pPrChange w:id="117" w:author="kyle O'Reilly" w:date="2026-10-21T23:18:00Z" w16du:dateUtc="2026-10-21T22:18:00Z">
           <w:pPr>
             <w:pStyle w:val="ListParagraph"/>
             <w:numPr>
@@ -3114,9 +3147,14 @@
           </w:pPr>
         </w:pPrChange>
       </w:pPr>
-      <w:ins w:id="128" w:author="kyle O'Reilly" w:date="2026-10-21T23:14:00Z" w16du:dateUtc="2026-10-21T22:14:00Z">
-        <w:r>
-          <w:t>Develop Linear Regression and Random Forest models and establish a naïve baseline for each selected stock.</w:t>
+      <w:ins w:id="118" w:author="kyle O'Reilly" w:date="2026-10-21T23:14:00Z" w16du:dateUtc="2026-10-21T22:14:00Z">
+        <w:r>
+          <w:t>Generate nine predic</w:t>
+        </w:r>
+      </w:ins>
+      <w:ins w:id="119" w:author="kyle O'Reilly" w:date="2026-10-21T23:15:00Z" w16du:dateUtc="2026-10-21T22:15:00Z">
+        <w:r>
+          <w:t>tions and compare them with three actual closing stock prices twenty days after the historical cut-off stock date.</w:t>
         </w:r>
       </w:ins>
     </w:p>
@@ -3130,9 +3168,9 @@
         <w:spacing w:line="360" w:lineRule="auto"/>
         <w:jc w:val="both"/>
         <w:rPr>
-          <w:ins w:id="129" w:author="kyle O'Reilly" w:date="2026-10-21T23:15:00Z" w16du:dateUtc="2026-10-21T22:15:00Z"/>
-        </w:rPr>
-        <w:pPrChange w:id="130" w:author="kyle O'Reilly" w:date="2026-10-21T23:18:00Z" w16du:dateUtc="2026-10-21T22:18:00Z">
+          <w:ins w:id="120" w:author="kyle O'Reilly" w:date="2026-10-21T23:16:00Z" w16du:dateUtc="2026-10-21T22:16:00Z"/>
+        </w:rPr>
+        <w:pPrChange w:id="121" w:author="kyle O'Reilly" w:date="2026-10-21T23:18:00Z" w16du:dateUtc="2026-10-21T22:18:00Z">
           <w:pPr>
             <w:pStyle w:val="ListParagraph"/>
             <w:numPr>
@@ -3142,77 +3180,44 @@
           </w:pPr>
         </w:pPrChange>
       </w:pPr>
-      <w:ins w:id="131" w:author="kyle O'Reilly" w:date="2026-10-21T23:14:00Z" w16du:dateUtc="2026-10-21T22:14:00Z">
-        <w:r>
-          <w:t>Generate nine predic</w:t>
-        </w:r>
-      </w:ins>
-      <w:ins w:id="132" w:author="kyle O'Reilly" w:date="2026-10-21T23:15:00Z" w16du:dateUtc="2026-10-21T22:15:00Z">
-        <w:r>
-          <w:t>tions and compare them with three actual closing stock prices twenty days after the historical cut-off stock date.</w:t>
-        </w:r>
-      </w:ins>
-    </w:p>
-    <w:p>
-      <w:pPr>
-        <w:pStyle w:val="ListParagraph"/>
-        <w:numPr>
-          <w:ilvl w:val="0"/>
-          <w:numId w:val="7"/>
-        </w:numPr>
+      <w:ins w:id="122" w:author="kyle O'Reilly" w:date="2026-10-21T23:15:00Z" w16du:dateUtc="2026-10-21T22:15:00Z">
+        <w:r>
+          <w:t>Calculate individual prediction errors</w:t>
+        </w:r>
+        <w:r>
+          <w:t>, compare approaches and discuss observed difference between the s</w:t>
+        </w:r>
+      </w:ins>
+      <w:ins w:id="123" w:author="kyle O'Reilly" w:date="2026-10-21T23:16:00Z" w16du:dateUtc="2026-10-21T22:16:00Z">
+        <w:r>
+          <w:t>elected stocks.</w:t>
+        </w:r>
+      </w:ins>
+    </w:p>
+    <w:p>
+      <w:pPr>
         <w:spacing w:line="360" w:lineRule="auto"/>
         <w:jc w:val="both"/>
         <w:rPr>
-          <w:ins w:id="133" w:author="kyle O'Reilly" w:date="2026-10-21T23:16:00Z" w16du:dateUtc="2026-10-21T22:16:00Z"/>
-        </w:rPr>
-        <w:pPrChange w:id="134" w:author="kyle O'Reilly" w:date="2026-10-21T23:18:00Z" w16du:dateUtc="2026-10-21T22:18:00Z">
-          <w:pPr>
-            <w:pStyle w:val="ListParagraph"/>
-            <w:numPr>
-              <w:numId w:val="7"/>
-            </w:numPr>
-            <w:ind w:hanging="360"/>
-          </w:pPr>
-        </w:pPrChange>
-      </w:pPr>
-      <w:ins w:id="135" w:author="kyle O'Reilly" w:date="2026-10-21T23:15:00Z" w16du:dateUtc="2026-10-21T22:15:00Z">
-        <w:r>
-          <w:t>Calculate individual prediction errors</w:t>
-        </w:r>
-        <w:r>
-          <w:t>, compare approaches and discuss observed difference between the s</w:t>
-        </w:r>
-      </w:ins>
-      <w:ins w:id="136" w:author="kyle O'Reilly" w:date="2026-10-21T23:16:00Z" w16du:dateUtc="2026-10-21T22:16:00Z">
-        <w:r>
-          <w:t>elected stocks.</w:t>
-        </w:r>
-      </w:ins>
-    </w:p>
-    <w:p>
-      <w:pPr>
-        <w:spacing w:line="360" w:lineRule="auto"/>
-        <w:jc w:val="both"/>
-        <w:rPr>
-          <w:ins w:id="137" w:author="kyle O'Reilly" w:date="2026-10-21T23:16:00Z" w16du:dateUtc="2026-10-21T22:16:00Z"/>
+          <w:ins w:id="124" w:author="kyle O'Reilly" w:date="2026-10-21T23:16:00Z" w16du:dateUtc="2026-10-21T22:16:00Z"/>
           <w:b/>
           <w:bCs/>
-          <w:rPrChange w:id="138" w:author="kyle O'Reilly" w:date="2026-10-21T23:16:00Z" w16du:dateUtc="2026-10-21T22:16:00Z">
+          <w:rPrChange w:id="125" w:author="kyle O'Reilly" w:date="2026-10-21T23:16:00Z" w16du:dateUtc="2026-10-21T22:16:00Z">
             <w:rPr>
-              <w:ins w:id="139" w:author="kyle O'Reilly" w:date="2026-10-21T23:16:00Z" w16du:dateUtc="2026-10-21T22:16:00Z"/>
+              <w:ins w:id="126" w:author="kyle O'Reilly" w:date="2026-10-21T23:16:00Z" w16du:dateUtc="2026-10-21T22:16:00Z"/>
             </w:rPr>
           </w:rPrChange>
         </w:rPr>
-        <w:pPrChange w:id="140" w:author="kyle O'Reilly" w:date="2026-10-21T23:18:00Z" w16du:dateUtc="2026-10-21T22:18:00Z">
+        <w:pPrChange w:id="127" w:author="kyle O'Reilly" w:date="2026-10-21T23:18:00Z" w16du:dateUtc="2026-10-21T22:18:00Z">
           <w:pPr/>
         </w:pPrChange>
       </w:pPr>
-      <w:ins w:id="141" w:author="kyle O'Reilly" w:date="2026-10-21T23:16:00Z" w16du:dateUtc="2026-10-21T22:16:00Z">
+      <w:ins w:id="128" w:author="kyle O'Reilly" w:date="2026-10-21T23:16:00Z" w16du:dateUtc="2026-10-21T22:16:00Z">
         <w:r>
           <w:rPr>
             <w:b/>
             <w:bCs/>
-            <w:rPrChange w:id="142" w:author="kyle O'Reilly" w:date="2026-10-21T23:16:00Z" w16du:dateUtc="2026-10-21T22:16:00Z">
+            <w:rPrChange w:id="129" w:author="kyle O'Reilly" w:date="2026-10-21T23:16:00Z" w16du:dateUtc="2026-10-21T22:16:00Z">
               <w:rPr/>
             </w:rPrChange>
           </w:rPr>
@@ -3225,13 +3230,13 @@
         <w:spacing w:line="360" w:lineRule="auto"/>
         <w:jc w:val="both"/>
         <w:rPr>
-          <w:ins w:id="143" w:author="kyle O'Reilly" w:date="2026-10-21T20:39:00Z" w16du:dateUtc="2026-10-21T19:39:00Z"/>
-        </w:rPr>
-        <w:pPrChange w:id="144" w:author="kyle O'Reilly" w:date="2026-10-21T23:18:00Z" w16du:dateUtc="2026-10-21T22:18:00Z">
+          <w:ins w:id="130" w:author="kyle O'Reilly" w:date="2026-10-21T20:39:00Z" w16du:dateUtc="2026-10-21T19:39:00Z"/>
+        </w:rPr>
+        <w:pPrChange w:id="131" w:author="kyle O'Reilly" w:date="2026-10-21T23:18:00Z" w16du:dateUtc="2026-10-21T22:18:00Z">
           <w:pPr/>
         </w:pPrChange>
       </w:pPr>
-      <w:ins w:id="145" w:author="kyle O'Reilly" w:date="2026-10-21T23:16:00Z" w16du:dateUtc="2026-10-21T22:16:00Z">
+      <w:ins w:id="132" w:author="kyle O'Reilly" w:date="2026-10-21T23:16:00Z" w16du:dateUtc="2026-10-21T22:16:00Z">
         <w:r>
           <w:lastRenderedPageBreak/>
           <w:t xml:space="preserve">The stock with the highest documented </w:t>
@@ -3240,7 +3245,7 @@
           <w:t>historical volatility will have the highest</w:t>
         </w:r>
       </w:ins>
-      <w:ins w:id="146" w:author="kyle O'Reilly" w:date="2026-10-21T23:17:00Z" w16du:dateUtc="2026-10-21T22:17:00Z">
+      <w:ins w:id="133" w:author="kyle O'Reilly" w:date="2026-10-21T23:17:00Z" w16du:dateUtc="2026-10-21T22:17:00Z">
         <w:r>
           <w:t xml:space="preserve"> average absolute percentage forecasting error across the three forecasting methods. This explo</w:t>
         </w:r>
@@ -3252,81 +3257,7 @@
     <w:p>
       <w:pPr>
         <w:rPr>
-          <w:ins w:id="147" w:author="kyle O'Reilly" w:date="2026-10-21T20:40:00Z" w16du:dateUtc="2026-10-21T19:40:00Z"/>
-        </w:rPr>
-      </w:pPr>
-    </w:p>
-    <w:p>
-      <w:pPr>
-        <w:pStyle w:val="Heading1"/>
-        <w:rPr>
-          <w:ins w:id="148" w:author="kyle O'Reilly" w:date="2026-10-21T20:40:00Z" w16du:dateUtc="2026-10-21T19:40:00Z"/>
-        </w:rPr>
-        <w:pPrChange w:id="149" w:author="kyle O'Reilly" w:date="2026-10-21T20:41:00Z" w16du:dateUtc="2026-10-21T19:41:00Z">
-          <w:pPr/>
-        </w:pPrChange>
-      </w:pPr>
-      <w:bookmarkStart w:id="150" w:name="_Toc243520527"/>
-      <w:ins w:id="151" w:author="kyle O'Reilly" w:date="2026-10-21T20:40:00Z" w16du:dateUtc="2026-10-21T19:40:00Z">
-        <w:r>
-          <w:t>5. Project Scope</w:t>
-        </w:r>
-        <w:bookmarkEnd w:id="150"/>
-      </w:ins>
-    </w:p>
-    <w:p>
-      <w:pPr>
-        <w:rPr>
-          <w:ins w:id="152" w:author="kyle O'Reilly" w:date="2026-10-21T20:40:00Z" w16du:dateUtc="2026-10-21T19:40:00Z"/>
-        </w:rPr>
-      </w:pPr>
-      <w:ins w:id="153" w:author="kyle O'Reilly" w:date="2026-10-21T20:40:00Z" w16du:dateUtc="2026-10-21T19:40:00Z">
-        <w:r>
-          <w:t>?</w:t>
-        </w:r>
-      </w:ins>
-    </w:p>
-    <w:p>
-      <w:pPr>
-        <w:rPr>
-          <w:ins w:id="154" w:author="kyle O'Reilly" w:date="2026-10-21T20:40:00Z" w16du:dateUtc="2026-10-21T19:40:00Z"/>
-        </w:rPr>
-      </w:pPr>
-    </w:p>
-    <w:p>
-      <w:pPr>
-        <w:pStyle w:val="Heading1"/>
-        <w:rPr>
-          <w:ins w:id="155" w:author="kyle O'Reilly" w:date="2026-10-21T20:40:00Z" w16du:dateUtc="2026-10-21T19:40:00Z"/>
-        </w:rPr>
-        <w:pPrChange w:id="156" w:author="kyle O'Reilly" w:date="2026-10-21T20:41:00Z" w16du:dateUtc="2026-10-21T19:41:00Z">
-          <w:pPr/>
-        </w:pPrChange>
-      </w:pPr>
-      <w:bookmarkStart w:id="157" w:name="_Toc243520528"/>
-      <w:ins w:id="158" w:author="kyle O'Reilly" w:date="2026-10-21T20:40:00Z" w16du:dateUtc="2026-10-21T19:40:00Z">
-        <w:r>
-          <w:t>6. Methodology</w:t>
-        </w:r>
-        <w:bookmarkEnd w:id="157"/>
-      </w:ins>
-    </w:p>
-    <w:p>
-      <w:pPr>
-        <w:rPr>
-          <w:ins w:id="159" w:author="kyle O'Reilly" w:date="2026-10-21T20:40:00Z" w16du:dateUtc="2026-10-21T19:40:00Z"/>
-        </w:rPr>
-      </w:pPr>
-      <w:ins w:id="160" w:author="kyle O'Reilly" w:date="2026-10-21T20:40:00Z" w16du:dateUtc="2026-10-21T19:40:00Z">
-        <w:r>
-          <w:t>?</w:t>
-        </w:r>
-      </w:ins>
-    </w:p>
-    <w:p>
-      <w:pPr>
-        <w:rPr>
-          <w:ins w:id="161" w:author="kyle O'Reilly" w:date="2026-10-21T20:40:00Z" w16du:dateUtc="2026-10-21T19:40:00Z"/>
+          <w:ins w:id="134" w:author="kyle O'Reilly" w:date="2026-10-21T20:40:00Z" w16du:dateUtc="2026-10-21T19:40:00Z"/>
         </w:rPr>
       </w:pPr>
     </w:p>
@@ -3336,190 +3267,63 @@
         <w:spacing w:line="360" w:lineRule="auto"/>
         <w:jc w:val="both"/>
         <w:rPr>
-          <w:ins w:id="162" w:author="kyle O'Reilly" w:date="2026-10-21T20:41:00Z" w16du:dateUtc="2026-10-21T19:41:00Z"/>
-        </w:rPr>
-        <w:pPrChange w:id="163" w:author="kyle O'Reilly" w:date="2026-10-22T00:14:00Z" w16du:dateUtc="2026-10-21T23:14:00Z">
+          <w:ins w:id="135" w:author="kyle O'Reilly" w:date="2026-10-21T20:40:00Z" w16du:dateUtc="2026-10-21T19:40:00Z"/>
+        </w:rPr>
+        <w:pPrChange w:id="136" w:author="kyle O'Reilly" w:date="2026-10-22T19:16:00Z" w16du:dateUtc="2026-10-22T18:16:00Z">
           <w:pPr/>
         </w:pPrChange>
       </w:pPr>
-      <w:bookmarkStart w:id="164" w:name="_Toc243520529"/>
-      <w:ins w:id="165" w:author="kyle O'Reilly" w:date="2026-10-21T20:41:00Z" w16du:dateUtc="2026-10-21T19:41:00Z">
-        <w:r>
-          <w:t xml:space="preserve">7. </w:t>
-        </w:r>
-      </w:ins>
-      <w:ins w:id="166" w:author="kyle O'Reilly" w:date="2026-10-21T20:40:00Z" w16du:dateUtc="2026-10-21T19:40:00Z">
-        <w:r>
-          <w:t>Data Sources</w:t>
-        </w:r>
-      </w:ins>
-      <w:bookmarkEnd w:id="164"/>
+      <w:bookmarkStart w:id="137" w:name="_Toc243589090"/>
+      <w:ins w:id="138" w:author="kyle O'Reilly" w:date="2026-10-21T20:40:00Z" w16du:dateUtc="2026-10-21T19:40:00Z">
+        <w:r>
+          <w:t>5. Project Scope</w:t>
+        </w:r>
+        <w:bookmarkEnd w:id="137"/>
+      </w:ins>
     </w:p>
     <w:p>
       <w:pPr>
         <w:spacing w:line="360" w:lineRule="auto"/>
         <w:jc w:val="both"/>
         <w:rPr>
-          <w:ins w:id="167" w:author="kyle O'Reilly" w:date="2026-10-21T23:35:00Z" w16du:dateUtc="2026-10-21T22:35:00Z"/>
-        </w:rPr>
-        <w:pPrChange w:id="168" w:author="kyle O'Reilly" w:date="2026-10-22T00:14:00Z" w16du:dateUtc="2026-10-21T23:14:00Z">
+          <w:ins w:id="139" w:author="kyle O'Reilly" w:date="2026-10-22T19:08:00Z" w16du:dateUtc="2026-10-22T18:08:00Z"/>
+        </w:rPr>
+        <w:pPrChange w:id="140" w:author="kyle O'Reilly" w:date="2026-10-22T19:16:00Z" w16du:dateUtc="2026-10-22T18:16:00Z">
           <w:pPr/>
         </w:pPrChange>
       </w:pPr>
-      <w:ins w:id="169" w:author="kyle O'Reilly" w:date="2026-10-21T23:39:00Z" w16du:dateUtc="2026-10-21T22:39:00Z">
-        <w:r>
-          <w:t>Tradi</w:t>
-        </w:r>
-      </w:ins>
-      <w:ins w:id="170" w:author="kyle O'Reilly" w:date="2026-10-21T23:40:00Z" w16du:dateUtc="2026-10-21T22:40:00Z">
-        <w:r>
-          <w:t xml:space="preserve">ng 212 will be consulted to verify </w:t>
-        </w:r>
-      </w:ins>
-      <w:ins w:id="171" w:author="kyle O'Reilly" w:date="2026-10-21T23:46:00Z" w16du:dateUtc="2026-10-21T22:46:00Z">
-        <w:r>
-          <w:t xml:space="preserve">the </w:t>
-        </w:r>
-      </w:ins>
-      <w:ins w:id="172" w:author="kyle O'Reilly" w:date="2026-10-21T23:40:00Z" w16du:dateUtc="2026-10-21T22:40:00Z">
-        <w:r>
-          <w:t>volatility rating</w:t>
-        </w:r>
-      </w:ins>
-      <w:ins w:id="173" w:author="kyle O'Reilly" w:date="2026-10-21T23:41:00Z" w16du:dateUtc="2026-10-21T22:41:00Z">
-        <w:r>
-          <w:t>s</w:t>
-        </w:r>
-      </w:ins>
-      <w:ins w:id="174" w:author="kyle O'Reilly" w:date="2026-10-21T23:40:00Z" w16du:dateUtc="2026-10-21T22:40:00Z">
-        <w:r>
-          <w:t xml:space="preserve"> of</w:t>
-        </w:r>
-      </w:ins>
-      <w:ins w:id="175" w:author="kyle O'Reilly" w:date="2026-10-21T23:46:00Z" w16du:dateUtc="2026-10-21T22:46:00Z">
-        <w:r>
-          <w:t xml:space="preserve"> all the</w:t>
-        </w:r>
-      </w:ins>
-      <w:ins w:id="176" w:author="kyle O'Reilly" w:date="2026-10-21T23:40:00Z" w16du:dateUtc="2026-10-21T22:40:00Z">
-        <w:r>
-          <w:t xml:space="preserve"> three </w:t>
-        </w:r>
-      </w:ins>
-      <w:ins w:id="177" w:author="kyle O'Reilly" w:date="2026-10-21T23:46:00Z" w16du:dateUtc="2026-10-21T22:46:00Z">
-        <w:r>
-          <w:t xml:space="preserve">selected </w:t>
-        </w:r>
-      </w:ins>
-      <w:ins w:id="178" w:author="kyle O'Reilly" w:date="2026-10-21T23:40:00Z" w16du:dateUtc="2026-10-21T22:40:00Z">
-        <w:r>
-          <w:t>stocks.</w:t>
-        </w:r>
-      </w:ins>
-      <w:ins w:id="179" w:author="kyle O'Reilly" w:date="2026-10-21T23:38:00Z" w16du:dateUtc="2026-10-21T22:38:00Z">
-        <w:r>
-          <w:t xml:space="preserve"> </w:t>
-        </w:r>
-      </w:ins>
-      <w:ins w:id="180" w:author="kyle O'Reilly" w:date="2026-10-21T23:46:00Z" w16du:dateUtc="2026-10-21T22:46:00Z">
-        <w:r>
-          <w:t>JPM</w:t>
-        </w:r>
-      </w:ins>
-      <w:ins w:id="181" w:author="kyle O'Reilly" w:date="2026-10-21T23:54:00Z" w16du:dateUtc="2026-10-21T22:54:00Z">
-        <w:r>
-          <w:t>.US</w:t>
-        </w:r>
-      </w:ins>
-      <w:ins w:id="182" w:author="kyle O'Reilly" w:date="2026-10-21T23:46:00Z" w16du:dateUtc="2026-10-21T22:46:00Z">
-        <w:r>
-          <w:t xml:space="preserve"> (low)</w:t>
-        </w:r>
-        <w:r>
-          <w:t>, KO</w:t>
-        </w:r>
-      </w:ins>
-      <w:ins w:id="183" w:author="kyle O'Reilly" w:date="2026-10-21T23:54:00Z" w16du:dateUtc="2026-10-21T22:54:00Z">
-        <w:r>
-          <w:t>.US</w:t>
-        </w:r>
-      </w:ins>
-      <w:ins w:id="184" w:author="kyle O'Reilly" w:date="2026-10-21T23:46:00Z" w16du:dateUtc="2026-10-21T22:46:00Z">
-        <w:r>
-          <w:t xml:space="preserve"> (medium)</w:t>
-        </w:r>
-        <w:r>
-          <w:t>, and INTC</w:t>
-        </w:r>
-      </w:ins>
-      <w:ins w:id="185" w:author="kyle O'Reilly" w:date="2026-10-21T23:54:00Z" w16du:dateUtc="2026-10-21T22:54:00Z">
-        <w:r>
-          <w:t>.US</w:t>
-        </w:r>
-      </w:ins>
-      <w:ins w:id="186" w:author="kyle O'Reilly" w:date="2026-10-21T23:47:00Z" w16du:dateUtc="2026-10-21T22:47:00Z">
-        <w:r>
-          <w:t xml:space="preserve"> (high), as displayed on the trading 212 platform</w:t>
-        </w:r>
-      </w:ins>
-      <w:ins w:id="187" w:author="kyle O'Reilly" w:date="2026-10-21T23:46:00Z" w16du:dateUtc="2026-10-21T22:46:00Z">
-        <w:r>
-          <w:t xml:space="preserve"> </w:t>
-        </w:r>
-      </w:ins>
-      <w:ins w:id="188" w:author="kyle O'Reilly" w:date="2026-10-21T23:38:00Z" w16du:dateUtc="2026-10-21T22:38:00Z">
-        <w:r>
-          <w:t>(</w:t>
-        </w:r>
-      </w:ins>
-      <w:ins w:id="189" w:author="kyle O'Reilly" w:date="2026-10-21T23:44:00Z" w16du:dateUtc="2026-10-21T22:44:00Z">
-        <w:r>
-          <w:t>Trading 212, n.d.)</w:t>
-        </w:r>
-      </w:ins>
-      <w:ins w:id="190" w:author="kyle O'Reilly" w:date="2026-10-21T23:47:00Z" w16du:dateUtc="2026-10-21T22:47:00Z">
-        <w:r>
-          <w:t xml:space="preserve">. Screenshots of </w:t>
-        </w:r>
-      </w:ins>
-      <w:ins w:id="191" w:author="kyle O'Reilly" w:date="2026-10-22T00:01:00Z" w16du:dateUtc="2026-10-21T23:01:00Z">
-        <w:r>
-          <w:t>each stock’s volatility</w:t>
-        </w:r>
-      </w:ins>
-      <w:ins w:id="192" w:author="kyle O'Reilly" w:date="2026-10-21T23:47:00Z" w16du:dateUtc="2026-10-21T22:47:00Z">
-        <w:r>
-          <w:t xml:space="preserve"> </w:t>
-        </w:r>
-      </w:ins>
-      <w:ins w:id="193" w:author="kyle O'Reilly" w:date="2026-10-22T00:01:00Z" w16du:dateUtc="2026-10-21T23:01:00Z">
-        <w:r>
-          <w:t xml:space="preserve">risk </w:t>
-        </w:r>
-      </w:ins>
-      <w:ins w:id="194" w:author="kyle O'Reilly" w:date="2026-10-21T23:47:00Z" w16du:dateUtc="2026-10-21T22:47:00Z">
-        <w:r>
-          <w:t>rating</w:t>
-        </w:r>
-      </w:ins>
-      <w:ins w:id="195" w:author="kyle O'Reilly" w:date="2026-10-22T00:01:00Z" w16du:dateUtc="2026-10-21T23:01:00Z">
-        <w:r>
-          <w:t xml:space="preserve"> </w:t>
-        </w:r>
-      </w:ins>
-      <w:ins w:id="196" w:author="kyle O'Reilly" w:date="2026-10-21T23:47:00Z" w16du:dateUtc="2026-10-21T22:47:00Z">
-        <w:r>
-          <w:t xml:space="preserve">will be provided in Appendix A to support the stock </w:t>
-        </w:r>
-      </w:ins>
-      <w:ins w:id="197" w:author="kyle O'Reilly" w:date="2026-10-21T23:48:00Z" w16du:dateUtc="2026-10-21T22:48:00Z">
-        <w:r>
-          <w:t>selection</w:t>
-        </w:r>
-      </w:ins>
-      <w:ins w:id="198" w:author="kyle O'Reilly" w:date="2026-10-21T23:47:00Z" w16du:dateUtc="2026-10-21T22:47:00Z">
-        <w:r>
-          <w:t>.</w:t>
+      <w:ins w:id="141" w:author="kyle O'Reilly" w:date="2026-10-22T18:50:00Z" w16du:dateUtc="2026-10-22T17:50:00Z">
+        <w:r>
+          <w:t xml:space="preserve">This Capstone Project </w:t>
+        </w:r>
+        <w:r>
+          <w:t>will examine three ind</w:t>
+        </w:r>
+      </w:ins>
+      <w:ins w:id="142" w:author="kyle O'Reilly" w:date="2026-10-22T18:51:00Z" w16du:dateUtc="2026-10-22T17:51:00Z">
+        <w:r>
+          <w:t>ividual stocks: JPMorgan Chase &amp; Co.</w:t>
+        </w:r>
+        <w:r>
+          <w:t>, Coca-Cola Co., and Intel Corp</w:t>
+        </w:r>
+      </w:ins>
+      <w:ins w:id="143" w:author="kyle O'Reilly" w:date="2026-10-22T19:05:00Z" w16du:dateUtc="2026-10-22T18:05:00Z">
+        <w:r>
+          <w:t xml:space="preserve">. </w:t>
+        </w:r>
+        <w:r>
+          <w:t xml:space="preserve">These stocks have been selected to represent </w:t>
+        </w:r>
+      </w:ins>
+      <w:ins w:id="144" w:author="kyle O'Reilly" w:date="2026-10-22T19:06:00Z" w16du:dateUtc="2026-10-22T18:06:00Z">
+        <w:r>
+          <w:t>low, medium, and high volatility ratings, respectively, as displayed on Trading 212</w:t>
+        </w:r>
+      </w:ins>
+      <w:ins w:id="145" w:author="kyle O'Reilly" w:date="2026-10-22T19:08:00Z" w16du:dateUtc="2026-10-22T18:08:00Z">
+        <w:r>
+          <w:t xml:space="preserve"> (Trading 212, n.d.).</w:t>
         </w:r>
       </w:ins>
     </w:p>
@@ -3528,187 +3332,162 @@
         <w:spacing w:line="360" w:lineRule="auto"/>
         <w:jc w:val="both"/>
         <w:rPr>
-          <w:ins w:id="199" w:author="kyle O'Reilly" w:date="2026-10-21T20:41:00Z" w16du:dateUtc="2026-10-21T19:41:00Z"/>
-        </w:rPr>
-        <w:pPrChange w:id="200" w:author="kyle O'Reilly" w:date="2026-10-22T00:14:00Z" w16du:dateUtc="2026-10-21T23:14:00Z">
+          <w:ins w:id="146" w:author="kyle O'Reilly" w:date="2026-10-22T19:11:00Z" w16du:dateUtc="2026-10-22T18:11:00Z"/>
+        </w:rPr>
+        <w:pPrChange w:id="147" w:author="kyle O'Reilly" w:date="2026-10-22T19:16:00Z" w16du:dateUtc="2026-10-22T18:16:00Z">
           <w:pPr/>
         </w:pPrChange>
       </w:pPr>
-      <w:ins w:id="201" w:author="kyle O'Reilly" w:date="2026-10-21T23:28:00Z" w16du:dateUtc="2026-10-21T22:28:00Z">
-        <w:r>
-          <w:t xml:space="preserve">Stooq will be </w:t>
-        </w:r>
-      </w:ins>
-      <w:ins w:id="202" w:author="kyle O'Reilly" w:date="2026-10-21T23:58:00Z" w16du:dateUtc="2026-10-21T22:58:00Z">
-        <w:r>
-          <w:t>used to obtain</w:t>
-        </w:r>
-      </w:ins>
-      <w:ins w:id="203" w:author="kyle O'Reilly" w:date="2026-10-21T23:28:00Z" w16du:dateUtc="2026-10-21T22:28:00Z">
-        <w:r>
-          <w:t xml:space="preserve"> downloadable historical stock data for JPM</w:t>
-        </w:r>
-      </w:ins>
-      <w:ins w:id="204" w:author="kyle O'Reilly" w:date="2026-10-21T23:58:00Z" w16du:dateUtc="2026-10-21T22:58:00Z">
-        <w:r>
-          <w:t>.US</w:t>
-        </w:r>
-      </w:ins>
-      <w:ins w:id="205" w:author="kyle O'Reilly" w:date="2026-10-21T23:28:00Z" w16du:dateUtc="2026-10-21T22:28:00Z">
-        <w:r>
-          <w:t>, KO</w:t>
-        </w:r>
-      </w:ins>
-      <w:ins w:id="206" w:author="kyle O'Reilly" w:date="2026-10-21T23:58:00Z" w16du:dateUtc="2026-10-21T22:58:00Z">
-        <w:r>
-          <w:t>.US</w:t>
-        </w:r>
-      </w:ins>
-      <w:ins w:id="207" w:author="kyle O'Reilly" w:date="2026-10-21T23:28:00Z" w16du:dateUtc="2026-10-21T22:28:00Z">
-        <w:r>
-          <w:t xml:space="preserve"> and INTC</w:t>
-        </w:r>
-      </w:ins>
-      <w:ins w:id="208" w:author="kyle O'Reilly" w:date="2026-10-21T23:58:00Z" w16du:dateUtc="2026-10-21T22:58:00Z">
-        <w:r>
-          <w:t>.US</w:t>
-        </w:r>
-      </w:ins>
-      <w:ins w:id="209" w:author="kyle O'Reilly" w:date="2026-10-21T23:59:00Z" w16du:dateUtc="2026-10-21T22:59:00Z">
-        <w:r>
-          <w:t xml:space="preserve"> (Stooq</w:t>
-        </w:r>
-        <w:r>
-          <w:t>, n.d.a; Stooq, n.d.b</w:t>
-        </w:r>
-      </w:ins>
-      <w:ins w:id="210" w:author="kyle O'Reilly" w:date="2026-10-22T00:00:00Z" w16du:dateUtc="2026-10-21T23:00:00Z">
-        <w:r>
-          <w:t>; Stooq, n.d.c).</w:t>
-        </w:r>
-      </w:ins>
-      <w:ins w:id="211" w:author="kyle O'Reilly" w:date="2026-10-21T23:28:00Z" w16du:dateUtc="2026-10-21T22:28:00Z">
-        <w:r>
-          <w:t xml:space="preserve"> The </w:t>
-        </w:r>
-      </w:ins>
-      <w:ins w:id="212" w:author="kyle O'Reilly" w:date="2026-10-22T00:00:00Z" w16du:dateUtc="2026-10-21T23:00:00Z">
-        <w:r>
-          <w:t xml:space="preserve">independent </w:t>
-        </w:r>
-        <w:r>
-          <w:t xml:space="preserve">dataset </w:t>
-        </w:r>
-      </w:ins>
-      <w:ins w:id="213" w:author="kyle O'Reilly" w:date="2026-10-21T23:28:00Z" w16du:dateUtc="2026-10-21T22:28:00Z">
-        <w:r>
-          <w:t xml:space="preserve">variables </w:t>
-        </w:r>
-        <w:r>
-          <w:t>will</w:t>
-        </w:r>
-      </w:ins>
-      <w:ins w:id="214" w:author="kyle O'Reilly" w:date="2026-10-22T00:00:00Z" w16du:dateUtc="2026-10-21T23:00:00Z">
-        <w:r>
-          <w:t xml:space="preserve"> include</w:t>
-        </w:r>
-      </w:ins>
-      <w:ins w:id="215" w:author="kyle O'Reilly" w:date="2026-10-21T23:28:00Z" w16du:dateUtc="2026-10-21T22:28:00Z">
-        <w:r>
-          <w:t xml:space="preserve"> </w:t>
-        </w:r>
-      </w:ins>
-      <w:ins w:id="216" w:author="kyle O'Reilly" w:date="2026-10-21T23:31:00Z" w16du:dateUtc="2026-10-21T22:31:00Z">
-        <w:r>
-          <w:t xml:space="preserve">sequential index number, </w:t>
-        </w:r>
-        <w:r>
-          <w:t>the cale</w:t>
-        </w:r>
-      </w:ins>
-      <w:ins w:id="217" w:author="kyle O'Reilly" w:date="2026-10-21T23:32:00Z" w16du:dateUtc="2026-10-21T22:32:00Z">
-        <w:r>
-          <w:t xml:space="preserve">ndar date, the opening price, the maximum </w:t>
-        </w:r>
-      </w:ins>
-      <w:ins w:id="218" w:author="kyle O'Reilly" w:date="2026-10-22T00:01:00Z" w16du:dateUtc="2026-10-21T23:01:00Z">
-        <w:r>
-          <w:t xml:space="preserve">and minimum </w:t>
-        </w:r>
-      </w:ins>
-      <w:ins w:id="219" w:author="kyle O'Reilly" w:date="2026-10-21T23:32:00Z" w16du:dateUtc="2026-10-21T22:32:00Z">
-        <w:r>
-          <w:t>price</w:t>
-        </w:r>
-      </w:ins>
-      <w:ins w:id="220" w:author="kyle O'Reilly" w:date="2026-10-22T00:01:00Z" w16du:dateUtc="2026-10-21T23:01:00Z">
-        <w:r>
-          <w:t>s</w:t>
-        </w:r>
-      </w:ins>
-      <w:ins w:id="221" w:author="kyle O'Reilly" w:date="2026-10-21T23:32:00Z" w16du:dateUtc="2026-10-21T22:32:00Z">
-        <w:r>
-          <w:t xml:space="preserve"> the stock reached </w:t>
-        </w:r>
-      </w:ins>
-      <w:ins w:id="222" w:author="kyle O'Reilly" w:date="2026-10-22T00:02:00Z" w16du:dateUtc="2026-10-21T23:02:00Z">
-        <w:r>
-          <w:t>during each trading</w:t>
-        </w:r>
-      </w:ins>
-      <w:ins w:id="223" w:author="kyle O'Reilly" w:date="2026-10-21T23:32:00Z" w16du:dateUtc="2026-10-21T22:32:00Z">
-        <w:r>
-          <w:t xml:space="preserve"> date,</w:t>
-        </w:r>
-      </w:ins>
-      <w:ins w:id="224" w:author="kyle O'Reilly" w:date="2026-10-21T23:33:00Z" w16du:dateUtc="2026-10-21T22:33:00Z">
-        <w:r>
-          <w:t xml:space="preserve"> closing price,</w:t>
-        </w:r>
-      </w:ins>
-      <w:ins w:id="225" w:author="kyle O'Reilly" w:date="2026-10-22T00:02:00Z" w16du:dateUtc="2026-10-21T23:02:00Z">
-        <w:r>
-          <w:t xml:space="preserve"> daily </w:t>
-        </w:r>
-      </w:ins>
-      <w:ins w:id="226" w:author="kyle O'Reilly" w:date="2026-10-22T00:03:00Z" w16du:dateUtc="2026-10-21T23:03:00Z">
-        <w:r>
-          <w:t>percentage</w:t>
-        </w:r>
-      </w:ins>
-      <w:ins w:id="227" w:author="kyle O'Reilly" w:date="2026-10-22T00:02:00Z" w16du:dateUtc="2026-10-21T23:02:00Z">
-        <w:r>
-          <w:t xml:space="preserve"> and a</w:t>
-        </w:r>
-      </w:ins>
-      <w:ins w:id="228" w:author="kyle O'Reilly" w:date="2026-10-22T00:03:00Z" w16du:dateUtc="2026-10-21T23:03:00Z">
-        <w:r>
-          <w:t>bsolute price change compared with the previous day’s closing price</w:t>
-        </w:r>
-        <w:r>
-          <w:t>,</w:t>
-        </w:r>
-      </w:ins>
-      <w:ins w:id="229" w:author="kyle O'Reilly" w:date="2026-10-21T23:33:00Z" w16du:dateUtc="2026-10-21T22:33:00Z">
-        <w:r>
-          <w:t xml:space="preserve"> and </w:t>
-        </w:r>
-      </w:ins>
-      <w:ins w:id="230" w:author="kyle O'Reilly" w:date="2026-10-21T23:34:00Z" w16du:dateUtc="2026-10-21T22:34:00Z">
-        <w:r>
-          <w:t xml:space="preserve">the total number of shares traded </w:t>
-        </w:r>
-      </w:ins>
-      <w:ins w:id="231" w:author="kyle O'Reilly" w:date="2026-10-22T00:03:00Z" w16du:dateUtc="2026-10-21T23:03:00Z">
-        <w:r>
-          <w:t>each date.</w:t>
-        </w:r>
-      </w:ins>
-    </w:p>
-    <w:p>
-      <w:pPr>
-        <w:rPr>
-          <w:ins w:id="232" w:author="kyle O'Reilly" w:date="2026-10-21T20:41:00Z" w16du:dateUtc="2026-10-21T19:41:00Z"/>
+      <w:ins w:id="148" w:author="kyle O'Reilly" w:date="2026-10-22T19:08:00Z" w16du:dateUtc="2026-10-22T18:08:00Z">
+        <w:r>
+          <w:t>Historical stock data</w:t>
+        </w:r>
+        <w:r>
+          <w:t xml:space="preserve"> covering approximately </w:t>
+        </w:r>
+      </w:ins>
+      <w:ins w:id="149" w:author="kyle O'Reilly" w:date="2026-10-22T19:09:00Z" w16du:dateUtc="2026-10-22T18:09:00Z">
+        <w:r>
+          <w:t>44-46 years, where available, will be obtained from Stooq. The anal</w:t>
+        </w:r>
+      </w:ins>
+      <w:ins w:id="150" w:author="kyle O'Reilly" w:date="2026-10-22T19:10:00Z" w16du:dateUtc="2026-10-22T18:10:00Z">
+        <w:r>
+          <w:t xml:space="preserve">ysis will focus </w:t>
+        </w:r>
+        <w:r>
+          <w:t>on historical closing prices and simple price-based indicators derived from previous trading days. Other factors</w:t>
+        </w:r>
+        <w:r>
+          <w:t>, such as financial news</w:t>
+        </w:r>
+      </w:ins>
+      <w:ins w:id="151" w:author="kyle O'Reilly" w:date="2026-10-22T19:11:00Z" w16du:dateUtc="2026-10-22T18:11:00Z">
+        <w:r>
+          <w:t xml:space="preserve">, economic conditions, company announcements and trading volume, </w:t>
+        </w:r>
+        <w:r>
+          <w:t>will not be included in the forecasting models.</w:t>
+        </w:r>
+      </w:ins>
+    </w:p>
+    <w:p>
+      <w:pPr>
+        <w:spacing w:line="360" w:lineRule="auto"/>
+        <w:jc w:val="both"/>
+        <w:rPr>
+          <w:ins w:id="152" w:author="kyle O'Reilly" w:date="2026-10-22T19:13:00Z" w16du:dateUtc="2026-10-22T18:13:00Z"/>
+        </w:rPr>
+        <w:pPrChange w:id="153" w:author="kyle O'Reilly" w:date="2026-10-22T19:16:00Z" w16du:dateUtc="2026-10-22T18:16:00Z">
+          <w:pPr/>
+        </w:pPrChange>
+      </w:pPr>
+      <w:ins w:id="154" w:author="kyle O'Reilly" w:date="2026-10-22T19:12:00Z" w16du:dateUtc="2026-10-22T18:12:00Z">
+        <w:r>
+          <w:t>The study will use one historical cut-off date to predict each stock’s closing price 0 trading days into the future. Three forecasting metho</w:t>
+        </w:r>
+      </w:ins>
+      <w:ins w:id="155" w:author="kyle O'Reilly" w:date="2026-10-22T19:13:00Z" w16du:dateUtc="2026-10-22T18:13:00Z">
+        <w:r>
+          <w:t>ds will be compared: Linear Regression, Random Forest and a naïve forecasting baseline.</w:t>
+        </w:r>
+      </w:ins>
+    </w:p>
+    <w:p>
+      <w:pPr>
+        <w:spacing w:line="360" w:lineRule="auto"/>
+        <w:jc w:val="both"/>
+        <w:rPr>
+          <w:ins w:id="156" w:author="kyle O'Reilly" w:date="2026-10-22T19:17:00Z" w16du:dateUtc="2026-10-22T18:17:00Z"/>
+        </w:rPr>
+      </w:pPr>
+      <w:ins w:id="157" w:author="kyle O'Reilly" w:date="2026-10-22T19:13:00Z" w16du:dateUtc="2026-10-22T18:13:00Z">
+        <w:r>
+          <w:t>The pro</w:t>
+        </w:r>
+      </w:ins>
+      <w:ins w:id="158" w:author="kyle O'Reilly" w:date="2026-10-22T19:14:00Z" w16du:dateUtc="2026-10-22T18:14:00Z">
+        <w:r>
+          <w:t>j</w:t>
+        </w:r>
+      </w:ins>
+      <w:ins w:id="159" w:author="kyle O'Reilly" w:date="2026-10-22T19:13:00Z" w16du:dateUtc="2026-10-22T18:13:00Z">
+        <w:r>
+          <w:t xml:space="preserve">ect will not involve </w:t>
+        </w:r>
+      </w:ins>
+      <w:ins w:id="160" w:author="kyle O'Reilly" w:date="2026-10-22T19:14:00Z" w16du:dateUtc="2026-10-22T18:14:00Z">
+        <w:r>
+          <w:t xml:space="preserve">live trading, automated investment decisions or financial recommendations. As only </w:t>
+        </w:r>
+        <w:r>
+          <w:t xml:space="preserve">one future </w:t>
+        </w:r>
+      </w:ins>
+      <w:ins w:id="161" w:author="kyle O'Reilly" w:date="2026-10-22T19:15:00Z" w16du:dateUtc="2026-10-22T18:15:00Z">
+        <w:r>
+          <w:t>closing price will be evaluated for each stock</w:t>
+        </w:r>
+      </w:ins>
+      <w:ins w:id="162" w:author="kyle O'Reilly" w:date="2026-10-22T19:16:00Z" w16du:dateUtc="2026-10-22T18:16:00Z">
+        <w:r>
+          <w:t>, the findings will be limited to this case study and cannot establish which forecasting method is consistently more accurate across different market conditions</w:t>
+        </w:r>
+      </w:ins>
+      <w:ins w:id="163" w:author="kyle O'Reilly" w:date="2026-10-22T19:17:00Z" w16du:dateUtc="2026-10-22T18:17:00Z">
+        <w:r>
+          <w:t>.</w:t>
+        </w:r>
+      </w:ins>
+    </w:p>
+    <w:p>
+      <w:pPr>
+        <w:spacing w:line="360" w:lineRule="auto"/>
+        <w:jc w:val="both"/>
+        <w:rPr>
+          <w:ins w:id="164" w:author="kyle O'Reilly" w:date="2026-10-22T19:17:00Z" w16du:dateUtc="2026-10-22T18:17:00Z"/>
+        </w:rPr>
+      </w:pPr>
+    </w:p>
+    <w:p>
+      <w:pPr>
+        <w:pStyle w:val="Heading1"/>
+        <w:rPr>
+          <w:ins w:id="165" w:author="kyle O'Reilly" w:date="2026-10-21T20:40:00Z" w16du:dateUtc="2026-10-21T19:40:00Z"/>
+        </w:rPr>
+        <w:pPrChange w:id="166" w:author="kyle O'Reilly" w:date="2026-10-22T19:17:00Z" w16du:dateUtc="2026-10-22T18:17:00Z">
+          <w:pPr/>
+        </w:pPrChange>
+      </w:pPr>
+      <w:bookmarkStart w:id="167" w:name="_Toc243589091"/>
+      <w:ins w:id="168" w:author="kyle O'Reilly" w:date="2026-10-22T19:17:00Z" w16du:dateUtc="2026-10-22T18:17:00Z">
+        <w:r>
+          <w:t xml:space="preserve">6. </w:t>
+        </w:r>
+      </w:ins>
+      <w:ins w:id="169" w:author="kyle O'Reilly" w:date="2026-10-21T20:40:00Z" w16du:dateUtc="2026-10-21T19:40:00Z">
+        <w:r>
+          <w:t>Methodology</w:t>
+        </w:r>
+        <w:bookmarkEnd w:id="167"/>
+      </w:ins>
+    </w:p>
+    <w:p>
+      <w:pPr>
+        <w:rPr>
+          <w:ins w:id="170" w:author="kyle O'Reilly" w:date="2026-10-21T20:40:00Z" w16du:dateUtc="2026-10-21T19:40:00Z"/>
+        </w:rPr>
+      </w:pPr>
+      <w:ins w:id="171" w:author="kyle O'Reilly" w:date="2026-10-21T20:40:00Z" w16du:dateUtc="2026-10-21T19:40:00Z">
+        <w:r>
+          <w:t>?</w:t>
+        </w:r>
+      </w:ins>
+    </w:p>
+    <w:p>
+      <w:pPr>
+        <w:rPr>
+          <w:ins w:id="172" w:author="kyle O'Reilly" w:date="2026-10-21T20:40:00Z" w16du:dateUtc="2026-10-21T19:40:00Z"/>
         </w:rPr>
       </w:pPr>
     </w:p>
@@ -3718,80 +3497,380 @@
         <w:spacing w:line="360" w:lineRule="auto"/>
         <w:jc w:val="both"/>
         <w:rPr>
-          <w:ins w:id="233" w:author="kyle O'Reilly" w:date="2026-10-21T20:41:00Z" w16du:dateUtc="2026-10-21T19:41:00Z"/>
-        </w:rPr>
-        <w:pPrChange w:id="234" w:author="kyle O'Reilly" w:date="2026-10-22T18:09:00Z" w16du:dateUtc="2026-10-22T17:09:00Z">
+          <w:ins w:id="173" w:author="kyle O'Reilly" w:date="2026-10-21T20:41:00Z" w16du:dateUtc="2026-10-21T19:41:00Z"/>
+        </w:rPr>
+        <w:pPrChange w:id="174" w:author="kyle O'Reilly" w:date="2026-10-22T00:14:00Z" w16du:dateUtc="2026-10-21T23:14:00Z">
           <w:pPr/>
         </w:pPrChange>
       </w:pPr>
-      <w:bookmarkStart w:id="235" w:name="_Toc243520530"/>
-      <w:ins w:id="236" w:author="kyle O'Reilly" w:date="2026-10-21T20:41:00Z" w16du:dateUtc="2026-10-21T19:41:00Z">
-        <w:r>
-          <w:t>8. Expected Deliverables</w:t>
-        </w:r>
-        <w:bookmarkEnd w:id="235"/>
-      </w:ins>
+      <w:bookmarkStart w:id="175" w:name="_Toc243589092"/>
+      <w:ins w:id="176" w:author="kyle O'Reilly" w:date="2026-10-21T20:41:00Z" w16du:dateUtc="2026-10-21T19:41:00Z">
+        <w:r>
+          <w:t xml:space="preserve">7. </w:t>
+        </w:r>
+      </w:ins>
+      <w:ins w:id="177" w:author="kyle O'Reilly" w:date="2026-10-21T20:40:00Z" w16du:dateUtc="2026-10-21T19:40:00Z">
+        <w:r>
+          <w:t>Data Sources</w:t>
+        </w:r>
+      </w:ins>
+      <w:bookmarkEnd w:id="175"/>
     </w:p>
     <w:p>
       <w:pPr>
         <w:spacing w:line="360" w:lineRule="auto"/>
         <w:jc w:val="both"/>
         <w:rPr>
-          <w:ins w:id="237" w:author="kyle O'Reilly" w:date="2026-10-21T20:41:00Z" w16du:dateUtc="2026-10-21T19:41:00Z"/>
-        </w:rPr>
-        <w:pPrChange w:id="238" w:author="kyle O'Reilly" w:date="2026-10-22T18:09:00Z" w16du:dateUtc="2026-10-22T17:09:00Z">
+          <w:ins w:id="178" w:author="kyle O'Reilly" w:date="2026-10-21T23:35:00Z" w16du:dateUtc="2026-10-21T22:35:00Z"/>
+        </w:rPr>
+        <w:pPrChange w:id="179" w:author="kyle O'Reilly" w:date="2026-10-22T00:14:00Z" w16du:dateUtc="2026-10-21T23:14:00Z">
           <w:pPr/>
         </w:pPrChange>
       </w:pPr>
-      <w:ins w:id="239" w:author="kyle O'Reilly" w:date="2026-10-22T18:05:00Z" w16du:dateUtc="2026-10-22T17:05:00Z">
-        <w:r>
-          <w:t>The expected deliverables for this Capstone P</w:t>
-        </w:r>
-      </w:ins>
-      <w:ins w:id="240" w:author="kyle O'Reilly" w:date="2026-10-22T18:06:00Z" w16du:dateUtc="2026-10-22T17:06:00Z">
-        <w:r>
-          <w:t>roject</w:t>
-        </w:r>
-        <w:r>
-          <w:t xml:space="preserve"> will include a </w:t>
-        </w:r>
-      </w:ins>
-      <w:ins w:id="241" w:author="kyle O'Reilly" w:date="2026-10-22T18:09:00Z" w16du:dateUtc="2026-10-22T17:09:00Z">
-        <w:r>
-          <w:t>Jupyter</w:t>
-        </w:r>
-      </w:ins>
-      <w:ins w:id="242" w:author="kyle O'Reilly" w:date="2026-10-22T18:06:00Z" w16du:dateUtc="2026-10-22T17:06:00Z">
-        <w:r>
-          <w:t xml:space="preserve"> Notebook containing data preparation, model training, nin</w:t>
-        </w:r>
-        <w:r>
-          <w:t xml:space="preserve">e </w:t>
-        </w:r>
-      </w:ins>
-      <w:ins w:id="243" w:author="kyle O'Reilly" w:date="2026-10-22T18:07:00Z" w16du:dateUtc="2026-10-22T17:07:00Z">
-        <w:r>
-          <w:t>predictions and evaluation</w:t>
-        </w:r>
-      </w:ins>
-      <w:ins w:id="244" w:author="kyle O'Reilly" w:date="2026-10-22T18:08:00Z" w16du:dateUtc="2026-10-22T17:08:00Z">
-        <w:r>
-          <w:t>; a comparison on the JPMorgan Chase &amp; Co., Coca-Cola Co., and Intel Corp.</w:t>
-        </w:r>
-        <w:r>
-          <w:t>; three actual closing values; individual error calc</w:t>
-        </w:r>
-      </w:ins>
-      <w:ins w:id="245" w:author="kyle O'Reilly" w:date="2026-10-22T18:09:00Z" w16du:dateUtc="2026-10-22T17:09:00Z">
-        <w:r>
-          <w:t>ulations; a final report discussing findings and limitations; and a GitHub repository with code and permitted files.</w:t>
-        </w:r>
-      </w:ins>
-    </w:p>
-    <w:p>
-      <w:pPr>
-        <w:rPr>
-          <w:ins w:id="246" w:author="kyle O'Reilly" w:date="2026-10-21T20:41:00Z" w16du:dateUtc="2026-10-21T19:41:00Z"/>
+      <w:ins w:id="180" w:author="kyle O'Reilly" w:date="2026-10-21T23:39:00Z" w16du:dateUtc="2026-10-21T22:39:00Z">
+        <w:r>
+          <w:t>Tradi</w:t>
+        </w:r>
+      </w:ins>
+      <w:ins w:id="181" w:author="kyle O'Reilly" w:date="2026-10-21T23:40:00Z" w16du:dateUtc="2026-10-21T22:40:00Z">
+        <w:r>
+          <w:t xml:space="preserve">ng 212 will be consulted to verify </w:t>
+        </w:r>
+      </w:ins>
+      <w:ins w:id="182" w:author="kyle O'Reilly" w:date="2026-10-21T23:46:00Z" w16du:dateUtc="2026-10-21T22:46:00Z">
+        <w:r>
+          <w:t xml:space="preserve">the </w:t>
+        </w:r>
+      </w:ins>
+      <w:ins w:id="183" w:author="kyle O'Reilly" w:date="2026-10-21T23:40:00Z" w16du:dateUtc="2026-10-21T22:40:00Z">
+        <w:r>
+          <w:t>volatility rating</w:t>
+        </w:r>
+      </w:ins>
+      <w:ins w:id="184" w:author="kyle O'Reilly" w:date="2026-10-21T23:41:00Z" w16du:dateUtc="2026-10-21T22:41:00Z">
+        <w:r>
+          <w:t>s</w:t>
+        </w:r>
+      </w:ins>
+      <w:ins w:id="185" w:author="kyle O'Reilly" w:date="2026-10-21T23:40:00Z" w16du:dateUtc="2026-10-21T22:40:00Z">
+        <w:r>
+          <w:t xml:space="preserve"> of</w:t>
+        </w:r>
+      </w:ins>
+      <w:ins w:id="186" w:author="kyle O'Reilly" w:date="2026-10-21T23:46:00Z" w16du:dateUtc="2026-10-21T22:46:00Z">
+        <w:r>
+          <w:t xml:space="preserve"> all the</w:t>
+        </w:r>
+      </w:ins>
+      <w:ins w:id="187" w:author="kyle O'Reilly" w:date="2026-10-21T23:40:00Z" w16du:dateUtc="2026-10-21T22:40:00Z">
+        <w:r>
+          <w:t xml:space="preserve"> three </w:t>
+        </w:r>
+      </w:ins>
+      <w:ins w:id="188" w:author="kyle O'Reilly" w:date="2026-10-21T23:46:00Z" w16du:dateUtc="2026-10-21T22:46:00Z">
+        <w:r>
+          <w:t xml:space="preserve">selected </w:t>
+        </w:r>
+      </w:ins>
+      <w:ins w:id="189" w:author="kyle O'Reilly" w:date="2026-10-21T23:40:00Z" w16du:dateUtc="2026-10-21T22:40:00Z">
+        <w:r>
+          <w:t>stocks.</w:t>
+        </w:r>
+      </w:ins>
+      <w:ins w:id="190" w:author="kyle O'Reilly" w:date="2026-10-21T23:38:00Z" w16du:dateUtc="2026-10-21T22:38:00Z">
+        <w:r>
+          <w:t xml:space="preserve"> </w:t>
+        </w:r>
+      </w:ins>
+      <w:ins w:id="191" w:author="kyle O'Reilly" w:date="2026-10-21T23:46:00Z" w16du:dateUtc="2026-10-21T22:46:00Z">
+        <w:r>
+          <w:t>JPM</w:t>
+        </w:r>
+      </w:ins>
+      <w:ins w:id="192" w:author="kyle O'Reilly" w:date="2026-10-21T23:54:00Z" w16du:dateUtc="2026-10-21T22:54:00Z">
+        <w:r>
+          <w:t>.US</w:t>
+        </w:r>
+      </w:ins>
+      <w:ins w:id="193" w:author="kyle O'Reilly" w:date="2026-10-21T23:46:00Z" w16du:dateUtc="2026-10-21T22:46:00Z">
+        <w:r>
+          <w:t xml:space="preserve"> (low)</w:t>
+        </w:r>
+        <w:r>
+          <w:t>, KO</w:t>
+        </w:r>
+      </w:ins>
+      <w:ins w:id="194" w:author="kyle O'Reilly" w:date="2026-10-21T23:54:00Z" w16du:dateUtc="2026-10-21T22:54:00Z">
+        <w:r>
+          <w:t>.US</w:t>
+        </w:r>
+      </w:ins>
+      <w:ins w:id="195" w:author="kyle O'Reilly" w:date="2026-10-21T23:46:00Z" w16du:dateUtc="2026-10-21T22:46:00Z">
+        <w:r>
+          <w:t xml:space="preserve"> (medium)</w:t>
+        </w:r>
+        <w:r>
+          <w:t>, and INTC</w:t>
+        </w:r>
+      </w:ins>
+      <w:ins w:id="196" w:author="kyle O'Reilly" w:date="2026-10-21T23:54:00Z" w16du:dateUtc="2026-10-21T22:54:00Z">
+        <w:r>
+          <w:t>.US</w:t>
+        </w:r>
+      </w:ins>
+      <w:ins w:id="197" w:author="kyle O'Reilly" w:date="2026-10-21T23:47:00Z" w16du:dateUtc="2026-10-21T22:47:00Z">
+        <w:r>
+          <w:t xml:space="preserve"> (high), as displayed on the trading 212 platform</w:t>
+        </w:r>
+      </w:ins>
+      <w:ins w:id="198" w:author="kyle O'Reilly" w:date="2026-10-21T23:46:00Z" w16du:dateUtc="2026-10-21T22:46:00Z">
+        <w:r>
+          <w:t xml:space="preserve"> </w:t>
+        </w:r>
+      </w:ins>
+      <w:ins w:id="199" w:author="kyle O'Reilly" w:date="2026-10-21T23:38:00Z" w16du:dateUtc="2026-10-21T22:38:00Z">
+        <w:r>
+          <w:t>(</w:t>
+        </w:r>
+      </w:ins>
+      <w:ins w:id="200" w:author="kyle O'Reilly" w:date="2026-10-21T23:44:00Z" w16du:dateUtc="2026-10-21T22:44:00Z">
+        <w:r>
+          <w:t>Trading 212, n.d.)</w:t>
+        </w:r>
+      </w:ins>
+      <w:ins w:id="201" w:author="kyle O'Reilly" w:date="2026-10-21T23:47:00Z" w16du:dateUtc="2026-10-21T22:47:00Z">
+        <w:r>
+          <w:t xml:space="preserve">. Screenshots of </w:t>
+        </w:r>
+      </w:ins>
+      <w:ins w:id="202" w:author="kyle O'Reilly" w:date="2026-10-22T00:01:00Z" w16du:dateUtc="2026-10-21T23:01:00Z">
+        <w:r>
+          <w:t>each stock’s volatility</w:t>
+        </w:r>
+      </w:ins>
+      <w:ins w:id="203" w:author="kyle O'Reilly" w:date="2026-10-21T23:47:00Z" w16du:dateUtc="2026-10-21T22:47:00Z">
+        <w:r>
+          <w:t xml:space="preserve"> </w:t>
+        </w:r>
+      </w:ins>
+      <w:ins w:id="204" w:author="kyle O'Reilly" w:date="2026-10-22T00:01:00Z" w16du:dateUtc="2026-10-21T23:01:00Z">
+        <w:r>
+          <w:t xml:space="preserve">risk </w:t>
+        </w:r>
+      </w:ins>
+      <w:ins w:id="205" w:author="kyle O'Reilly" w:date="2026-10-21T23:47:00Z" w16du:dateUtc="2026-10-21T22:47:00Z">
+        <w:r>
+          <w:t>rating</w:t>
+        </w:r>
+      </w:ins>
+      <w:ins w:id="206" w:author="kyle O'Reilly" w:date="2026-10-22T00:01:00Z" w16du:dateUtc="2026-10-21T23:01:00Z">
+        <w:r>
+          <w:t xml:space="preserve"> </w:t>
+        </w:r>
+      </w:ins>
+      <w:ins w:id="207" w:author="kyle O'Reilly" w:date="2026-10-21T23:47:00Z" w16du:dateUtc="2026-10-21T22:47:00Z">
+        <w:r>
+          <w:t xml:space="preserve">will be provided in Appendix A to support the stock </w:t>
+        </w:r>
+      </w:ins>
+      <w:ins w:id="208" w:author="kyle O'Reilly" w:date="2026-10-21T23:48:00Z" w16du:dateUtc="2026-10-21T22:48:00Z">
+        <w:r>
+          <w:t>selection</w:t>
+        </w:r>
+      </w:ins>
+      <w:ins w:id="209" w:author="kyle O'Reilly" w:date="2026-10-21T23:47:00Z" w16du:dateUtc="2026-10-21T22:47:00Z">
+        <w:r>
+          <w:t>.</w:t>
+        </w:r>
+      </w:ins>
+    </w:p>
+    <w:p>
+      <w:pPr>
+        <w:spacing w:line="360" w:lineRule="auto"/>
+        <w:jc w:val="both"/>
+        <w:rPr>
+          <w:ins w:id="210" w:author="kyle O'Reilly" w:date="2026-10-21T20:41:00Z" w16du:dateUtc="2026-10-21T19:41:00Z"/>
+        </w:rPr>
+        <w:pPrChange w:id="211" w:author="kyle O'Reilly" w:date="2026-10-22T00:14:00Z" w16du:dateUtc="2026-10-21T23:14:00Z">
+          <w:pPr/>
+        </w:pPrChange>
+      </w:pPr>
+      <w:ins w:id="212" w:author="kyle O'Reilly" w:date="2026-10-21T23:28:00Z" w16du:dateUtc="2026-10-21T22:28:00Z">
+        <w:r>
+          <w:lastRenderedPageBreak/>
+          <w:t xml:space="preserve">Stooq will be </w:t>
+        </w:r>
+      </w:ins>
+      <w:ins w:id="213" w:author="kyle O'Reilly" w:date="2026-10-21T23:58:00Z" w16du:dateUtc="2026-10-21T22:58:00Z">
+        <w:r>
+          <w:t>used to obtain</w:t>
+        </w:r>
+      </w:ins>
+      <w:ins w:id="214" w:author="kyle O'Reilly" w:date="2026-10-21T23:28:00Z" w16du:dateUtc="2026-10-21T22:28:00Z">
+        <w:r>
+          <w:t xml:space="preserve"> downloadable historical stock data for JPM</w:t>
+        </w:r>
+      </w:ins>
+      <w:ins w:id="215" w:author="kyle O'Reilly" w:date="2026-10-21T23:58:00Z" w16du:dateUtc="2026-10-21T22:58:00Z">
+        <w:r>
+          <w:t>.US</w:t>
+        </w:r>
+      </w:ins>
+      <w:ins w:id="216" w:author="kyle O'Reilly" w:date="2026-10-21T23:28:00Z" w16du:dateUtc="2026-10-21T22:28:00Z">
+        <w:r>
+          <w:t>, KO</w:t>
+        </w:r>
+      </w:ins>
+      <w:ins w:id="217" w:author="kyle O'Reilly" w:date="2026-10-21T23:58:00Z" w16du:dateUtc="2026-10-21T22:58:00Z">
+        <w:r>
+          <w:t>.US</w:t>
+        </w:r>
+      </w:ins>
+      <w:ins w:id="218" w:author="kyle O'Reilly" w:date="2026-10-21T23:28:00Z" w16du:dateUtc="2026-10-21T22:28:00Z">
+        <w:r>
+          <w:t xml:space="preserve"> and INTC</w:t>
+        </w:r>
+      </w:ins>
+      <w:ins w:id="219" w:author="kyle O'Reilly" w:date="2026-10-21T23:58:00Z" w16du:dateUtc="2026-10-21T22:58:00Z">
+        <w:r>
+          <w:t>.US</w:t>
+        </w:r>
+      </w:ins>
+      <w:ins w:id="220" w:author="kyle O'Reilly" w:date="2026-10-21T23:59:00Z" w16du:dateUtc="2026-10-21T22:59:00Z">
+        <w:r>
+          <w:t xml:space="preserve"> (Stooq</w:t>
+        </w:r>
+        <w:r>
+          <w:t>, n.d.a; Stooq, n.d.b</w:t>
+        </w:r>
+      </w:ins>
+      <w:ins w:id="221" w:author="kyle O'Reilly" w:date="2026-10-22T00:00:00Z" w16du:dateUtc="2026-10-21T23:00:00Z">
+        <w:r>
+          <w:t>; Stooq, n.d.c).</w:t>
+        </w:r>
+      </w:ins>
+      <w:ins w:id="222" w:author="kyle O'Reilly" w:date="2026-10-21T23:28:00Z" w16du:dateUtc="2026-10-21T22:28:00Z">
+        <w:r>
+          <w:t xml:space="preserve"> The </w:t>
+        </w:r>
+      </w:ins>
+      <w:ins w:id="223" w:author="kyle O'Reilly" w:date="2026-10-22T00:00:00Z" w16du:dateUtc="2026-10-21T23:00:00Z">
+        <w:r>
+          <w:t xml:space="preserve">independent </w:t>
+        </w:r>
+        <w:r>
+          <w:t xml:space="preserve">dataset </w:t>
+        </w:r>
+      </w:ins>
+      <w:ins w:id="224" w:author="kyle O'Reilly" w:date="2026-10-21T23:28:00Z" w16du:dateUtc="2026-10-21T22:28:00Z">
+        <w:r>
+          <w:t xml:space="preserve">variables </w:t>
+        </w:r>
+        <w:r>
+          <w:t>will</w:t>
+        </w:r>
+      </w:ins>
+      <w:ins w:id="225" w:author="kyle O'Reilly" w:date="2026-10-22T00:00:00Z" w16du:dateUtc="2026-10-21T23:00:00Z">
+        <w:r>
+          <w:t xml:space="preserve"> include</w:t>
+        </w:r>
+      </w:ins>
+      <w:ins w:id="226" w:author="kyle O'Reilly" w:date="2026-10-21T23:28:00Z" w16du:dateUtc="2026-10-21T22:28:00Z">
+        <w:r>
+          <w:t xml:space="preserve"> </w:t>
+        </w:r>
+      </w:ins>
+      <w:ins w:id="227" w:author="kyle O'Reilly" w:date="2026-10-21T23:31:00Z" w16du:dateUtc="2026-10-21T22:31:00Z">
+        <w:r>
+          <w:t xml:space="preserve">sequential index number, </w:t>
+        </w:r>
+        <w:r>
+          <w:t>the cale</w:t>
+        </w:r>
+      </w:ins>
+      <w:ins w:id="228" w:author="kyle O'Reilly" w:date="2026-10-21T23:32:00Z" w16du:dateUtc="2026-10-21T22:32:00Z">
+        <w:r>
+          <w:t xml:space="preserve">ndar date, the opening price, the maximum </w:t>
+        </w:r>
+      </w:ins>
+      <w:ins w:id="229" w:author="kyle O'Reilly" w:date="2026-10-22T00:01:00Z" w16du:dateUtc="2026-10-21T23:01:00Z">
+        <w:r>
+          <w:t xml:space="preserve">and minimum </w:t>
+        </w:r>
+      </w:ins>
+      <w:ins w:id="230" w:author="kyle O'Reilly" w:date="2026-10-21T23:32:00Z" w16du:dateUtc="2026-10-21T22:32:00Z">
+        <w:r>
+          <w:t>price</w:t>
+        </w:r>
+      </w:ins>
+      <w:ins w:id="231" w:author="kyle O'Reilly" w:date="2026-10-22T00:01:00Z" w16du:dateUtc="2026-10-21T23:01:00Z">
+        <w:r>
+          <w:t>s</w:t>
+        </w:r>
+      </w:ins>
+      <w:ins w:id="232" w:author="kyle O'Reilly" w:date="2026-10-21T23:32:00Z" w16du:dateUtc="2026-10-21T22:32:00Z">
+        <w:r>
+          <w:t xml:space="preserve"> the stock reached </w:t>
+        </w:r>
+      </w:ins>
+      <w:ins w:id="233" w:author="kyle O'Reilly" w:date="2026-10-22T00:02:00Z" w16du:dateUtc="2026-10-21T23:02:00Z">
+        <w:r>
+          <w:t>during each trading</w:t>
+        </w:r>
+      </w:ins>
+      <w:ins w:id="234" w:author="kyle O'Reilly" w:date="2026-10-21T23:32:00Z" w16du:dateUtc="2026-10-21T22:32:00Z">
+        <w:r>
+          <w:t xml:space="preserve"> date,</w:t>
+        </w:r>
+      </w:ins>
+      <w:ins w:id="235" w:author="kyle O'Reilly" w:date="2026-10-21T23:33:00Z" w16du:dateUtc="2026-10-21T22:33:00Z">
+        <w:r>
+          <w:t xml:space="preserve"> closing price,</w:t>
+        </w:r>
+      </w:ins>
+      <w:ins w:id="236" w:author="kyle O'Reilly" w:date="2026-10-22T00:02:00Z" w16du:dateUtc="2026-10-21T23:02:00Z">
+        <w:r>
+          <w:t xml:space="preserve"> daily </w:t>
+        </w:r>
+      </w:ins>
+      <w:ins w:id="237" w:author="kyle O'Reilly" w:date="2026-10-22T00:03:00Z" w16du:dateUtc="2026-10-21T23:03:00Z">
+        <w:r>
+          <w:t>percentage</w:t>
+        </w:r>
+      </w:ins>
+      <w:ins w:id="238" w:author="kyle O'Reilly" w:date="2026-10-22T00:02:00Z" w16du:dateUtc="2026-10-21T23:02:00Z">
+        <w:r>
+          <w:t xml:space="preserve"> and a</w:t>
+        </w:r>
+      </w:ins>
+      <w:ins w:id="239" w:author="kyle O'Reilly" w:date="2026-10-22T00:03:00Z" w16du:dateUtc="2026-10-21T23:03:00Z">
+        <w:r>
+          <w:t>bsolute price change compared with the previous day’s closing price</w:t>
+        </w:r>
+        <w:r>
+          <w:t>,</w:t>
+        </w:r>
+      </w:ins>
+      <w:ins w:id="240" w:author="kyle O'Reilly" w:date="2026-10-21T23:33:00Z" w16du:dateUtc="2026-10-21T22:33:00Z">
+        <w:r>
+          <w:t xml:space="preserve"> and </w:t>
+        </w:r>
+      </w:ins>
+      <w:ins w:id="241" w:author="kyle O'Reilly" w:date="2026-10-21T23:34:00Z" w16du:dateUtc="2026-10-21T22:34:00Z">
+        <w:r>
+          <w:t xml:space="preserve">the total number of shares traded </w:t>
+        </w:r>
+      </w:ins>
+      <w:ins w:id="242" w:author="kyle O'Reilly" w:date="2026-10-22T00:03:00Z" w16du:dateUtc="2026-10-21T23:03:00Z">
+        <w:r>
+          <w:t>each date.</w:t>
+        </w:r>
+      </w:ins>
+    </w:p>
+    <w:p>
+      <w:pPr>
+        <w:rPr>
+          <w:ins w:id="243" w:author="kyle O'Reilly" w:date="2026-10-21T20:41:00Z" w16du:dateUtc="2026-10-21T19:41:00Z"/>
         </w:rPr>
       </w:pPr>
     </w:p>
@@ -3800,36 +3879,118 @@
         <w:pStyle w:val="Heading1"/>
         <w:spacing w:line="360" w:lineRule="auto"/>
         <w:jc w:val="both"/>
-        <w:pPrChange w:id="247" w:author="kyle O'Reilly" w:date="2026-10-22T18:43:00Z" w16du:dateUtc="2026-10-22T17:43:00Z">
+        <w:rPr>
+          <w:ins w:id="244" w:author="kyle O'Reilly" w:date="2026-10-21T20:41:00Z" w16du:dateUtc="2026-10-21T19:41:00Z"/>
+        </w:rPr>
+        <w:pPrChange w:id="245" w:author="kyle O'Reilly" w:date="2026-10-22T18:09:00Z" w16du:dateUtc="2026-10-22T17:09:00Z">
           <w:pPr/>
         </w:pPrChange>
       </w:pPr>
-      <w:bookmarkStart w:id="248" w:name="_Toc243520531"/>
-      <w:ins w:id="249" w:author="kyle O'Reilly" w:date="2026-10-21T20:41:00Z" w16du:dateUtc="2026-10-21T19:41:00Z">
-        <w:r>
-          <w:lastRenderedPageBreak/>
-          <w:t>9. Project Timeline</w:t>
-        </w:r>
-      </w:ins>
-      <w:bookmarkEnd w:id="248"/>
+      <w:bookmarkStart w:id="246" w:name="_Toc243589093"/>
+      <w:ins w:id="247" w:author="kyle O'Reilly" w:date="2026-10-21T20:41:00Z" w16du:dateUtc="2026-10-21T19:41:00Z">
+        <w:r>
+          <w:t>8. Expected Deliverables</w:t>
+        </w:r>
+        <w:bookmarkEnd w:id="246"/>
+      </w:ins>
     </w:p>
     <w:p>
       <w:pPr>
         <w:spacing w:line="360" w:lineRule="auto"/>
         <w:jc w:val="both"/>
         <w:rPr>
-          <w:ins w:id="250" w:author="kyle O'Reilly" w:date="2026-10-22T18:18:00Z" w16du:dateUtc="2026-10-22T17:18:00Z"/>
-        </w:rPr>
-        <w:pPrChange w:id="251" w:author="kyle O'Reilly" w:date="2026-10-22T18:43:00Z" w16du:dateUtc="2026-10-22T17:43:00Z">
+          <w:ins w:id="248" w:author="kyle O'Reilly" w:date="2026-10-21T20:41:00Z" w16du:dateUtc="2026-10-21T19:41:00Z"/>
+        </w:rPr>
+        <w:pPrChange w:id="249" w:author="kyle O'Reilly" w:date="2026-10-22T18:09:00Z" w16du:dateUtc="2026-10-22T17:09:00Z">
           <w:pPr/>
         </w:pPrChange>
       </w:pPr>
-      <w:ins w:id="252" w:author="kyle O'Reilly" w:date="2026-10-22T18:13:00Z" w16du:dateUtc="2026-10-22T17:13:00Z">
+      <w:ins w:id="250" w:author="kyle O'Reilly" w:date="2026-10-22T18:05:00Z" w16du:dateUtc="2026-10-22T17:05:00Z">
+        <w:r>
+          <w:t>The expected deliverables for this Capstone P</w:t>
+        </w:r>
+      </w:ins>
+      <w:ins w:id="251" w:author="kyle O'Reilly" w:date="2026-10-22T18:06:00Z" w16du:dateUtc="2026-10-22T17:06:00Z">
+        <w:r>
+          <w:t>roject</w:t>
+        </w:r>
+        <w:r>
+          <w:t xml:space="preserve"> will include a </w:t>
+        </w:r>
+      </w:ins>
+      <w:ins w:id="252" w:author="kyle O'Reilly" w:date="2026-10-22T18:09:00Z" w16du:dateUtc="2026-10-22T17:09:00Z">
+        <w:r>
+          <w:t>Jupyter</w:t>
+        </w:r>
+      </w:ins>
+      <w:ins w:id="253" w:author="kyle O'Reilly" w:date="2026-10-22T18:06:00Z" w16du:dateUtc="2026-10-22T17:06:00Z">
+        <w:r>
+          <w:t xml:space="preserve"> Notebook containing data preparation, model training, nin</w:t>
+        </w:r>
+        <w:r>
+          <w:t xml:space="preserve">e </w:t>
+        </w:r>
+      </w:ins>
+      <w:ins w:id="254" w:author="kyle O'Reilly" w:date="2026-10-22T18:07:00Z" w16du:dateUtc="2026-10-22T17:07:00Z">
+        <w:r>
+          <w:t>predictions and evaluation</w:t>
+        </w:r>
+      </w:ins>
+      <w:ins w:id="255" w:author="kyle O'Reilly" w:date="2026-10-22T18:08:00Z" w16du:dateUtc="2026-10-22T17:08:00Z">
+        <w:r>
+          <w:t>; a comparison on the JPMorgan Chase &amp; Co., Coca-Cola Co., and Intel Corp.</w:t>
+        </w:r>
+        <w:r>
+          <w:t>; three actual closing values; individual error calc</w:t>
+        </w:r>
+      </w:ins>
+      <w:ins w:id="256" w:author="kyle O'Reilly" w:date="2026-10-22T18:09:00Z" w16du:dateUtc="2026-10-22T17:09:00Z">
+        <w:r>
+          <w:t>ulations; a final report discussing findings and limitations; and a GitHub repository with code and permitted files.</w:t>
+        </w:r>
+      </w:ins>
+    </w:p>
+    <w:p>
+      <w:pPr>
+        <w:rPr>
+          <w:ins w:id="257" w:author="kyle O'Reilly" w:date="2026-10-21T20:41:00Z" w16du:dateUtc="2026-10-21T19:41:00Z"/>
+        </w:rPr>
+      </w:pPr>
+    </w:p>
+    <w:p>
+      <w:pPr>
+        <w:pStyle w:val="Heading1"/>
+        <w:spacing w:line="360" w:lineRule="auto"/>
+        <w:jc w:val="both"/>
+        <w:pPrChange w:id="258" w:author="kyle O'Reilly" w:date="2026-10-22T18:43:00Z" w16du:dateUtc="2026-10-22T17:43:00Z">
+          <w:pPr/>
+        </w:pPrChange>
+      </w:pPr>
+      <w:bookmarkStart w:id="259" w:name="_Toc243589094"/>
+      <w:ins w:id="260" w:author="kyle O'Reilly" w:date="2026-10-21T20:41:00Z" w16du:dateUtc="2026-10-21T19:41:00Z">
+        <w:r>
+          <w:t>9. Project Timeline</w:t>
+        </w:r>
+      </w:ins>
+      <w:bookmarkEnd w:id="259"/>
+    </w:p>
+    <w:p>
+      <w:pPr>
+        <w:spacing w:line="360" w:lineRule="auto"/>
+        <w:jc w:val="both"/>
+        <w:rPr>
+          <w:ins w:id="261" w:author="kyle O'Reilly" w:date="2026-10-22T18:18:00Z" w16du:dateUtc="2026-10-22T17:18:00Z"/>
+        </w:rPr>
+        <w:pPrChange w:id="262" w:author="kyle O'Reilly" w:date="2026-10-22T18:43:00Z" w16du:dateUtc="2026-10-22T17:43:00Z">
+          <w:pPr/>
+        </w:pPrChange>
+      </w:pPr>
+      <w:ins w:id="263" w:author="kyle O'Reilly" w:date="2026-10-22T18:13:00Z" w16du:dateUtc="2026-10-22T17:13:00Z">
         <w:r>
           <w:t>This Capstone Pro</w:t>
         </w:r>
       </w:ins>
-      <w:ins w:id="253" w:author="kyle O'Reilly" w:date="2026-10-22T18:15:00Z" w16du:dateUtc="2026-10-22T17:15:00Z">
+      <w:ins w:id="264" w:author="kyle O'Reilly" w:date="2026-10-22T18:15:00Z" w16du:dateUtc="2026-10-22T17:15:00Z">
         <w:r>
           <w:t xml:space="preserve">ject </w:t>
         </w:r>
@@ -3837,7 +3998,7 @@
           <w:t>is planned across academic semesters</w:t>
         </w:r>
       </w:ins>
-      <w:ins w:id="254" w:author="kyle O'Reilly" w:date="2026-10-22T18:16:00Z" w16du:dateUtc="2026-10-22T17:16:00Z">
+      <w:ins w:id="265" w:author="kyle O'Reilly" w:date="2026-10-22T18:16:00Z" w16du:dateUtc="2026-10-22T17:16:00Z">
         <w:r>
           <w:t xml:space="preserve">. The first semester </w:t>
         </w:r>
@@ -3848,7 +4009,7 @@
           <w:t xml:space="preserve">, data source </w:t>
         </w:r>
       </w:ins>
-      <w:ins w:id="255" w:author="kyle O'Reilly" w:date="2026-10-22T18:17:00Z" w16du:dateUtc="2026-10-22T17:17:00Z">
+      <w:ins w:id="266" w:author="kyle O'Reilly" w:date="2026-10-22T18:17:00Z" w16du:dateUtc="2026-10-22T17:17:00Z">
         <w:r>
           <w:t>and methodology. The second will focus on data preparation, model development, predictions</w:t>
         </w:r>
@@ -3856,7 +4017,7 @@
           <w:t>, evaluation, r</w:t>
         </w:r>
       </w:ins>
-      <w:ins w:id="256" w:author="kyle O'Reilly" w:date="2026-10-22T18:18:00Z" w16du:dateUtc="2026-10-22T17:18:00Z">
+      <w:ins w:id="267" w:author="kyle O'Reilly" w:date="2026-10-22T18:18:00Z" w16du:dateUtc="2026-10-22T17:18:00Z">
         <w:r>
           <w:t>eporting</w:t>
         </w:r>
@@ -3864,22 +4025,22 @@
           <w:t xml:space="preserve"> and submission. The </w:t>
         </w:r>
       </w:ins>
-      <w:ins w:id="257" w:author="kyle O'Reilly" w:date="2026-10-22T18:43:00Z" w16du:dateUtc="2026-10-22T17:43:00Z">
+      <w:ins w:id="268" w:author="kyle O'Reilly" w:date="2026-10-22T18:43:00Z" w16du:dateUtc="2026-10-22T17:43:00Z">
         <w:r>
           <w:t xml:space="preserve">proposed </w:t>
         </w:r>
       </w:ins>
-      <w:ins w:id="258" w:author="kyle O'Reilly" w:date="2026-10-22T18:18:00Z" w16du:dateUtc="2026-10-22T17:18:00Z">
+      <w:ins w:id="269" w:author="kyle O'Reilly" w:date="2026-10-22T18:18:00Z" w16du:dateUtc="2026-10-22T17:18:00Z">
         <w:r>
           <w:t>illustrate Gantt Chart</w:t>
         </w:r>
       </w:ins>
-      <w:ins w:id="259" w:author="kyle O'Reilly" w:date="2026-10-22T18:43:00Z" w16du:dateUtc="2026-10-22T17:43:00Z">
+      <w:ins w:id="270" w:author="kyle O'Reilly" w:date="2026-10-22T18:43:00Z" w16du:dateUtc="2026-10-22T17:43:00Z">
         <w:r>
           <w:t xml:space="preserve"> (See Figure 1)</w:t>
         </w:r>
       </w:ins>
-      <w:ins w:id="260" w:author="kyle O'Reilly" w:date="2026-10-22T18:18:00Z" w16du:dateUtc="2026-10-22T17:18:00Z">
+      <w:ins w:id="271" w:author="kyle O'Reilly" w:date="2026-10-22T18:18:00Z" w16du:dateUtc="2026-10-22T17:18:00Z">
         <w:r>
           <w:t xml:space="preserve"> below will be adjusted to the confirmed academic calendar.</w:t>
         </w:r>
@@ -3890,13 +4051,13 @@
         <w:keepNext/>
         <w:jc w:val="center"/>
         <w:rPr>
-          <w:ins w:id="261" w:author="kyle O'Reilly" w:date="2026-10-22T18:40:00Z" w16du:dateUtc="2026-10-22T17:40:00Z"/>
-        </w:rPr>
-        <w:pPrChange w:id="262" w:author="kyle O'Reilly" w:date="2026-10-22T18:40:00Z" w16du:dateUtc="2026-10-22T17:40:00Z">
+          <w:ins w:id="272" w:author="kyle O'Reilly" w:date="2026-10-22T18:40:00Z" w16du:dateUtc="2026-10-22T17:40:00Z"/>
+        </w:rPr>
+        <w:pPrChange w:id="273" w:author="kyle O'Reilly" w:date="2026-10-22T18:40:00Z" w16du:dateUtc="2026-10-22T17:40:00Z">
           <w:pPr/>
         </w:pPrChange>
       </w:pPr>
-      <w:ins w:id="263" w:author="kyle O'Reilly" w:date="2026-10-22T18:42:00Z" w16du:dateUtc="2026-10-22T17:42:00Z">
+      <w:ins w:id="274" w:author="kyle O'Reilly" w:date="2026-10-22T18:42:00Z" w16du:dateUtc="2026-10-22T17:42:00Z">
         <w:r>
           <w:drawing>
             <wp:inline distT="0" distB="0" distL="0" distR="0" wp14:anchorId="5A0A1F10" wp14:editId="68003201">
@@ -3941,13 +4102,13 @@
         <w:pStyle w:val="Caption"/>
         <w:jc w:val="center"/>
         <w:rPr>
-          <w:ins w:id="264" w:author="kyle O'Reilly" w:date="2026-10-22T18:18:00Z" w16du:dateUtc="2026-10-22T17:18:00Z"/>
-        </w:rPr>
-        <w:pPrChange w:id="265" w:author="kyle O'Reilly" w:date="2026-10-22T18:40:00Z" w16du:dateUtc="2026-10-22T17:40:00Z">
+          <w:ins w:id="275" w:author="kyle O'Reilly" w:date="2026-10-22T18:18:00Z" w16du:dateUtc="2026-10-22T17:18:00Z"/>
+        </w:rPr>
+        <w:pPrChange w:id="276" w:author="kyle O'Reilly" w:date="2026-10-22T18:40:00Z" w16du:dateUtc="2026-10-22T17:40:00Z">
           <w:pPr/>
         </w:pPrChange>
       </w:pPr>
-      <w:ins w:id="266" w:author="kyle O'Reilly" w:date="2026-10-22T18:40:00Z" w16du:dateUtc="2026-10-22T17:40:00Z">
+      <w:ins w:id="277" w:author="kyle O'Reilly" w:date="2026-10-22T18:40:00Z" w16du:dateUtc="2026-10-22T17:40:00Z">
         <w:r>
           <w:t xml:space="preserve">Figure </w:t>
         </w:r>
@@ -3961,7 +4122,7 @@
       <w:r>
         <w:fldChar w:fldCharType="separate"/>
       </w:r>
-      <w:ins w:id="267" w:author="kyle O'Reilly" w:date="2026-10-22T18:40:00Z" w16du:dateUtc="2026-10-22T17:40:00Z">
+      <w:ins w:id="278" w:author="kyle O'Reilly" w:date="2026-10-22T18:40:00Z" w16du:dateUtc="2026-10-22T17:40:00Z">
         <w:r>
           <w:rPr>
             <w:noProof/>
@@ -3979,14 +4140,14 @@
     <w:p>
       <w:pPr>
         <w:rPr>
-          <w:del w:id="268" w:author="kyle O'Reilly" w:date="2026-10-22T18:41:00Z" w16du:dateUtc="2026-10-22T17:41:00Z"/>
-        </w:rPr>
-      </w:pPr>
-    </w:p>
-    <w:p>
-      <w:pPr>
-        <w:rPr>
-          <w:ins w:id="269" w:author="kyle O'Reilly" w:date="2026-10-21T20:41:00Z" w16du:dateUtc="2026-10-21T19:41:00Z"/>
+          <w:del w:id="279" w:author="kyle O'Reilly" w:date="2026-10-22T18:41:00Z" w16du:dateUtc="2026-10-22T17:41:00Z"/>
+        </w:rPr>
+      </w:pPr>
+    </w:p>
+    <w:p>
+      <w:pPr>
+        <w:rPr>
+          <w:ins w:id="280" w:author="kyle O'Reilly" w:date="2026-10-21T20:41:00Z" w16du:dateUtc="2026-10-21T19:41:00Z"/>
         </w:rPr>
       </w:pPr>
     </w:p>
@@ -3996,18 +4157,18 @@
         <w:spacing w:line="360" w:lineRule="auto"/>
         <w:jc w:val="both"/>
         <w:rPr>
-          <w:ins w:id="270" w:author="kyle O'Reilly" w:date="2026-10-21T20:41:00Z" w16du:dateUtc="2026-10-21T19:41:00Z"/>
-        </w:rPr>
-        <w:pPrChange w:id="271" w:author="kyle O'Reilly" w:date="2026-10-21T23:07:00Z" w16du:dateUtc="2026-10-21T22:07:00Z">
+          <w:ins w:id="281" w:author="kyle O'Reilly" w:date="2026-10-21T20:41:00Z" w16du:dateUtc="2026-10-21T19:41:00Z"/>
+        </w:rPr>
+        <w:pPrChange w:id="282" w:author="kyle O'Reilly" w:date="2026-10-21T23:07:00Z" w16du:dateUtc="2026-10-21T22:07:00Z">
           <w:pPr/>
         </w:pPrChange>
       </w:pPr>
-      <w:bookmarkStart w:id="272" w:name="_Toc243520532"/>
-      <w:ins w:id="273" w:author="kyle O'Reilly" w:date="2026-10-21T20:41:00Z" w16du:dateUtc="2026-10-21T19:41:00Z">
+      <w:bookmarkStart w:id="283" w:name="_Toc243589095"/>
+      <w:ins w:id="284" w:author="kyle O'Reilly" w:date="2026-10-21T20:41:00Z" w16du:dateUtc="2026-10-21T19:41:00Z">
         <w:r>
           <w:t>10. Ethical and Legal Considerations</w:t>
         </w:r>
-        <w:bookmarkEnd w:id="272"/>
+        <w:bookmarkEnd w:id="283"/>
       </w:ins>
     </w:p>
     <w:p>
@@ -4015,18 +4176,18 @@
         <w:spacing w:line="360" w:lineRule="auto"/>
         <w:jc w:val="both"/>
         <w:rPr>
-          <w:ins w:id="274" w:author="kyle O'Reilly" w:date="2026-10-21T20:46:00Z" w16du:dateUtc="2026-10-21T19:46:00Z"/>
-        </w:rPr>
-        <w:pPrChange w:id="275" w:author="kyle O'Reilly" w:date="2026-10-21T23:07:00Z" w16du:dateUtc="2026-10-21T22:07:00Z">
+          <w:ins w:id="285" w:author="kyle O'Reilly" w:date="2026-10-21T20:46:00Z" w16du:dateUtc="2026-10-21T19:46:00Z"/>
+        </w:rPr>
+        <w:pPrChange w:id="286" w:author="kyle O'Reilly" w:date="2026-10-21T23:07:00Z" w16du:dateUtc="2026-10-21T22:07:00Z">
           <w:pPr/>
         </w:pPrChange>
       </w:pPr>
-      <w:ins w:id="276" w:author="kyle O'Reilly" w:date="2026-10-21T20:42:00Z" w16du:dateUtc="2026-10-21T19:42:00Z">
+      <w:ins w:id="287" w:author="kyle O'Reilly" w:date="2026-10-21T20:42:00Z" w16du:dateUtc="2026-10-21T19:42:00Z">
         <w:r>
           <w:t>This C</w:t>
         </w:r>
       </w:ins>
-      <w:ins w:id="277" w:author="kyle O'Reilly" w:date="2026-10-21T20:43:00Z" w16du:dateUtc="2026-10-21T19:43:00Z">
+      <w:ins w:id="288" w:author="kyle O'Reilly" w:date="2026-10-21T20:43:00Z" w16du:dateUtc="2026-10-21T19:43:00Z">
         <w:r>
           <w:t xml:space="preserve">apstone Project will use </w:t>
         </w:r>
@@ -4037,12 +4198,12 @@
           <w:t>historical stock</w:t>
         </w:r>
       </w:ins>
-      <w:ins w:id="278" w:author="kyle O'Reilly" w:date="2026-10-21T22:01:00Z" w16du:dateUtc="2026-10-21T21:01:00Z">
+      <w:ins w:id="289" w:author="kyle O'Reilly" w:date="2026-10-21T22:01:00Z" w16du:dateUtc="2026-10-21T21:01:00Z">
         <w:r>
           <w:t xml:space="preserve"> </w:t>
         </w:r>
       </w:ins>
-      <w:ins w:id="279" w:author="kyle O'Reilly" w:date="2026-10-21T20:43:00Z" w16du:dateUtc="2026-10-21T19:43:00Z">
+      <w:ins w:id="290" w:author="kyle O'Reilly" w:date="2026-10-21T20:43:00Z" w16du:dateUtc="2026-10-21T19:43:00Z">
         <w:r>
           <w:t xml:space="preserve">data </w:t>
         </w:r>
@@ -4053,7 +4214,7 @@
           <w:t xml:space="preserve">collect personal information or involve human </w:t>
         </w:r>
       </w:ins>
-      <w:ins w:id="280" w:author="kyle O'Reilly" w:date="2026-10-21T20:44:00Z" w16du:dateUtc="2026-10-21T19:44:00Z">
+      <w:ins w:id="291" w:author="kyle O'Reilly" w:date="2026-10-21T20:44:00Z" w16du:dateUtc="2026-10-21T19:44:00Z">
         <w:r>
           <w:t>participants. Stooq data access and usage conditions, and any Trading 212</w:t>
         </w:r>
@@ -4061,22 +4222,22 @@
           <w:t xml:space="preserve"> information reused in the report, will be reviewed and appropriately attributed</w:t>
         </w:r>
       </w:ins>
-      <w:ins w:id="281" w:author="kyle O'Reilly" w:date="2026-10-21T20:45:00Z" w16du:dateUtc="2026-10-21T19:45:00Z">
+      <w:ins w:id="292" w:author="kyle O'Reilly" w:date="2026-10-21T20:45:00Z" w16du:dateUtc="2026-10-21T19:45:00Z">
         <w:r>
           <w:t xml:space="preserve">. Historical stock </w:t>
         </w:r>
       </w:ins>
-      <w:ins w:id="282" w:author="kyle O'Reilly" w:date="2026-10-21T22:03:00Z" w16du:dateUtc="2026-10-21T21:03:00Z">
+      <w:ins w:id="293" w:author="kyle O'Reilly" w:date="2026-10-21T22:03:00Z" w16du:dateUtc="2026-10-21T21:03:00Z">
         <w:r>
           <w:t xml:space="preserve">market </w:t>
         </w:r>
       </w:ins>
-      <w:ins w:id="283" w:author="kyle O'Reilly" w:date="2026-10-21T20:45:00Z" w16du:dateUtc="2026-10-21T19:45:00Z">
+      <w:ins w:id="294" w:author="kyle O'Reilly" w:date="2026-10-21T20:45:00Z" w16du:dateUtc="2026-10-21T19:45:00Z">
         <w:r>
           <w:t xml:space="preserve">data </w:t>
         </w:r>
       </w:ins>
-      <w:ins w:id="284" w:author="kyle O'Reilly" w:date="2026-10-21T22:11:00Z" w16du:dateUtc="2026-10-21T21:11:00Z">
+      <w:ins w:id="295" w:author="kyle O'Reilly" w:date="2026-10-21T22:11:00Z" w16du:dateUtc="2026-10-21T21:11:00Z">
         <w:r>
           <w:t>Comma</w:t>
         </w:r>
@@ -4087,37 +4248,37 @@
           <w:t>(</w:t>
         </w:r>
       </w:ins>
-      <w:ins w:id="285" w:author="kyle O'Reilly" w:date="2026-10-21T22:05:00Z" w16du:dateUtc="2026-10-21T21:05:00Z">
+      <w:ins w:id="296" w:author="kyle O'Reilly" w:date="2026-10-21T22:05:00Z" w16du:dateUtc="2026-10-21T21:05:00Z">
         <w:r>
           <w:t>CSV</w:t>
         </w:r>
       </w:ins>
-      <w:ins w:id="286" w:author="kyle O'Reilly" w:date="2026-10-21T22:11:00Z" w16du:dateUtc="2026-10-21T21:11:00Z">
+      <w:ins w:id="297" w:author="kyle O'Reilly" w:date="2026-10-21T22:11:00Z" w16du:dateUtc="2026-10-21T21:11:00Z">
         <w:r>
           <w:t>)</w:t>
         </w:r>
       </w:ins>
-      <w:ins w:id="287" w:author="kyle O'Reilly" w:date="2026-10-21T22:05:00Z" w16du:dateUtc="2026-10-21T21:05:00Z">
+      <w:ins w:id="298" w:author="kyle O'Reilly" w:date="2026-10-21T22:05:00Z" w16du:dateUtc="2026-10-21T21:05:00Z">
         <w:r>
           <w:t xml:space="preserve"> </w:t>
         </w:r>
       </w:ins>
-      <w:ins w:id="288" w:author="kyle O'Reilly" w:date="2026-10-21T20:45:00Z" w16du:dateUtc="2026-10-21T19:45:00Z">
+      <w:ins w:id="299" w:author="kyle O'Reilly" w:date="2026-10-21T20:45:00Z" w16du:dateUtc="2026-10-21T19:45:00Z">
         <w:r>
           <w:t>files</w:t>
         </w:r>
       </w:ins>
-      <w:ins w:id="289" w:author="kyle O'Reilly" w:date="2026-10-21T22:07:00Z" w16du:dateUtc="2026-10-21T21:07:00Z">
+      <w:ins w:id="300" w:author="kyle O'Reilly" w:date="2026-10-21T22:07:00Z" w16du:dateUtc="2026-10-21T21:07:00Z">
         <w:r>
           <w:t xml:space="preserve"> downloaded from S</w:t>
         </w:r>
       </w:ins>
-      <w:ins w:id="290" w:author="kyle O'Reilly" w:date="2026-10-21T22:08:00Z" w16du:dateUtc="2026-10-21T21:08:00Z">
+      <w:ins w:id="301" w:author="kyle O'Reilly" w:date="2026-10-21T22:08:00Z" w16du:dateUtc="2026-10-21T21:08:00Z">
         <w:r>
           <w:t>tooq</w:t>
         </w:r>
       </w:ins>
-      <w:ins w:id="291" w:author="kyle O'Reilly" w:date="2026-10-21T20:45:00Z" w16du:dateUtc="2026-10-21T19:45:00Z">
+      <w:ins w:id="302" w:author="kyle O'Reilly" w:date="2026-10-21T20:45:00Z" w16du:dateUtc="2026-10-21T19:45:00Z">
         <w:r>
           <w:t xml:space="preserve"> </w:t>
         </w:r>
@@ -4125,37 +4286,37 @@
           <w:t xml:space="preserve">will only be </w:t>
         </w:r>
       </w:ins>
-      <w:ins w:id="292" w:author="kyle O'Reilly" w:date="2026-10-21T22:08:00Z" w16du:dateUtc="2026-10-21T21:08:00Z">
+      <w:ins w:id="303" w:author="kyle O'Reilly" w:date="2026-10-21T22:08:00Z" w16du:dateUtc="2026-10-21T21:08:00Z">
         <w:r>
           <w:t>uploaded to</w:t>
         </w:r>
       </w:ins>
-      <w:ins w:id="293" w:author="kyle O'Reilly" w:date="2026-10-21T20:45:00Z" w16du:dateUtc="2026-10-21T19:45:00Z">
+      <w:ins w:id="304" w:author="kyle O'Reilly" w:date="2026-10-21T20:45:00Z" w16du:dateUtc="2026-10-21T19:45:00Z">
         <w:r>
           <w:t xml:space="preserve"> </w:t>
         </w:r>
       </w:ins>
-      <w:ins w:id="294" w:author="kyle O'Reilly" w:date="2026-10-21T20:48:00Z" w16du:dateUtc="2026-10-21T19:48:00Z">
+      <w:ins w:id="305" w:author="kyle O'Reilly" w:date="2026-10-21T20:48:00Z" w16du:dateUtc="2026-10-21T19:48:00Z">
         <w:r>
           <w:t>GitHub</w:t>
         </w:r>
       </w:ins>
-      <w:ins w:id="295" w:author="kyle O'Reilly" w:date="2026-10-21T20:45:00Z" w16du:dateUtc="2026-10-21T19:45:00Z">
+      <w:ins w:id="306" w:author="kyle O'Reilly" w:date="2026-10-21T20:45:00Z" w16du:dateUtc="2026-10-21T19:45:00Z">
         <w:r>
           <w:t xml:space="preserve"> </w:t>
         </w:r>
       </w:ins>
-      <w:ins w:id="296" w:author="kyle O'Reilly" w:date="2026-10-21T22:07:00Z" w16du:dateUtc="2026-10-21T21:07:00Z">
+      <w:ins w:id="307" w:author="kyle O'Reilly" w:date="2026-10-21T22:07:00Z" w16du:dateUtc="2026-10-21T21:07:00Z">
         <w:r>
           <w:t>if permitted by Stooq’s terms of service</w:t>
         </w:r>
       </w:ins>
-      <w:ins w:id="297" w:author="kyle O'Reilly" w:date="2026-10-21T20:45:00Z" w16du:dateUtc="2026-10-21T19:45:00Z">
+      <w:ins w:id="308" w:author="kyle O'Reilly" w:date="2026-10-21T20:45:00Z" w16du:dateUtc="2026-10-21T19:45:00Z">
         <w:r>
           <w:t xml:space="preserve">; otherwise, </w:t>
         </w:r>
       </w:ins>
-      <w:ins w:id="298" w:author="kyle O'Reilly" w:date="2026-10-21T22:07:00Z" w16du:dateUtc="2026-10-21T21:07:00Z">
+      <w:ins w:id="309" w:author="kyle O'Reilly" w:date="2026-10-21T22:07:00Z" w16du:dateUtc="2026-10-21T21:07:00Z">
         <w:r>
           <w:t xml:space="preserve">the </w:t>
         </w:r>
@@ -4163,22 +4324,22 @@
           <w:t>Pyt</w:t>
         </w:r>
       </w:ins>
-      <w:ins w:id="299" w:author="kyle O'Reilly" w:date="2026-10-22T00:14:00Z" w16du:dateUtc="2026-10-21T23:14:00Z">
+      <w:ins w:id="310" w:author="kyle O'Reilly" w:date="2026-10-22T00:14:00Z" w16du:dateUtc="2026-10-21T23:14:00Z">
         <w:r>
           <w:t>h</w:t>
         </w:r>
       </w:ins>
-      <w:ins w:id="300" w:author="kyle O'Reilly" w:date="2026-10-21T22:07:00Z" w16du:dateUtc="2026-10-21T21:07:00Z">
+      <w:ins w:id="311" w:author="kyle O'Reilly" w:date="2026-10-21T22:07:00Z" w16du:dateUtc="2026-10-21T21:07:00Z">
         <w:r>
           <w:t xml:space="preserve">on </w:t>
         </w:r>
       </w:ins>
-      <w:ins w:id="301" w:author="kyle O'Reilly" w:date="2026-10-21T20:45:00Z" w16du:dateUtc="2026-10-21T19:45:00Z">
+      <w:ins w:id="312" w:author="kyle O'Reilly" w:date="2026-10-21T20:45:00Z" w16du:dateUtc="2026-10-21T19:45:00Z">
         <w:r>
           <w:t xml:space="preserve">code and retrieval </w:t>
         </w:r>
       </w:ins>
-      <w:ins w:id="302" w:author="kyle O'Reilly" w:date="2026-10-21T20:46:00Z" w16du:dateUtc="2026-10-21T19:46:00Z">
+      <w:ins w:id="313" w:author="kyle O'Reilly" w:date="2026-10-21T20:46:00Z" w16du:dateUtc="2026-10-21T19:46:00Z">
         <w:r>
           <w:t xml:space="preserve">instructions will be provided. </w:t>
         </w:r>
@@ -4189,13 +4350,13 @@
         <w:spacing w:line="360" w:lineRule="auto"/>
         <w:jc w:val="both"/>
         <w:rPr>
-          <w:ins w:id="303" w:author="kyle O'Reilly" w:date="2026-10-21T20:42:00Z" w16du:dateUtc="2026-10-21T19:42:00Z"/>
-        </w:rPr>
-        <w:pPrChange w:id="304" w:author="kyle O'Reilly" w:date="2026-10-21T23:07:00Z" w16du:dateUtc="2026-10-21T22:07:00Z">
+          <w:ins w:id="314" w:author="kyle O'Reilly" w:date="2026-10-21T20:42:00Z" w16du:dateUtc="2026-10-21T19:42:00Z"/>
+        </w:rPr>
+        <w:pPrChange w:id="315" w:author="kyle O'Reilly" w:date="2026-10-21T23:07:00Z" w16du:dateUtc="2026-10-21T22:07:00Z">
           <w:pPr/>
         </w:pPrChange>
       </w:pPr>
-      <w:ins w:id="305" w:author="kyle O'Reilly" w:date="2026-10-21T22:09:00Z" w16du:dateUtc="2026-10-21T21:09:00Z">
+      <w:ins w:id="316" w:author="kyle O'Reilly" w:date="2026-10-21T22:09:00Z" w16du:dateUtc="2026-10-21T21:09:00Z">
         <w:r>
           <w:t>All results</w:t>
         </w:r>
@@ -4203,57 +4364,57 @@
           <w:t>,</w:t>
         </w:r>
       </w:ins>
-      <w:ins w:id="306" w:author="kyle O'Reilly" w:date="2026-10-21T20:47:00Z" w16du:dateUtc="2026-10-21T19:47:00Z">
+      <w:ins w:id="317" w:author="kyle O'Reilly" w:date="2026-10-21T20:47:00Z" w16du:dateUtc="2026-10-21T19:47:00Z">
         <w:r>
           <w:t xml:space="preserve"> including </w:t>
         </w:r>
       </w:ins>
-      <w:ins w:id="307" w:author="kyle O'Reilly" w:date="2026-10-21T22:10:00Z" w16du:dateUtc="2026-10-21T21:10:00Z">
+      <w:ins w:id="318" w:author="kyle O'Reilly" w:date="2026-10-21T22:10:00Z" w16du:dateUtc="2026-10-21T21:10:00Z">
         <w:r>
           <w:t>inaccurate</w:t>
         </w:r>
       </w:ins>
-      <w:ins w:id="308" w:author="kyle O'Reilly" w:date="2026-10-21T20:47:00Z" w16du:dateUtc="2026-10-21T19:47:00Z">
+      <w:ins w:id="319" w:author="kyle O'Reilly" w:date="2026-10-21T20:47:00Z" w16du:dateUtc="2026-10-21T19:47:00Z">
         <w:r>
           <w:t xml:space="preserve"> predictions, will be reported transparently. Th</w:t>
         </w:r>
       </w:ins>
-      <w:ins w:id="309" w:author="kyle O'Reilly" w:date="2026-10-21T22:10:00Z" w16du:dateUtc="2026-10-21T21:10:00Z">
+      <w:ins w:id="320" w:author="kyle O'Reilly" w:date="2026-10-21T22:10:00Z" w16du:dateUtc="2026-10-21T21:10:00Z">
         <w:r>
           <w:t>is Capstone Project</w:t>
         </w:r>
       </w:ins>
-      <w:ins w:id="310" w:author="kyle O'Reilly" w:date="2026-10-21T20:47:00Z" w16du:dateUtc="2026-10-21T19:47:00Z">
+      <w:ins w:id="321" w:author="kyle O'Reilly" w:date="2026-10-21T20:47:00Z" w16du:dateUtc="2026-10-21T19:47:00Z">
         <w:r>
           <w:t xml:space="preserve"> work is for academic purposes</w:t>
         </w:r>
       </w:ins>
-      <w:ins w:id="311" w:author="kyle O'Reilly" w:date="2026-10-21T22:10:00Z" w16du:dateUtc="2026-10-21T21:10:00Z">
+      <w:ins w:id="322" w:author="kyle O'Reilly" w:date="2026-10-21T22:10:00Z" w16du:dateUtc="2026-10-21T21:10:00Z">
         <w:r>
           <w:t xml:space="preserve"> only</w:t>
         </w:r>
       </w:ins>
-      <w:ins w:id="312" w:author="kyle O'Reilly" w:date="2026-10-21T20:47:00Z" w16du:dateUtc="2026-10-21T19:47:00Z">
+      <w:ins w:id="323" w:author="kyle O'Reilly" w:date="2026-10-21T20:47:00Z" w16du:dateUtc="2026-10-21T19:47:00Z">
         <w:r>
           <w:t xml:space="preserve"> and does </w:t>
         </w:r>
       </w:ins>
-      <w:ins w:id="313" w:author="kyle O'Reilly" w:date="2026-10-22T00:14:00Z" w16du:dateUtc="2026-10-21T23:14:00Z">
+      <w:ins w:id="324" w:author="kyle O'Reilly" w:date="2026-10-22T00:14:00Z" w16du:dateUtc="2026-10-21T23:14:00Z">
         <w:r>
           <w:t xml:space="preserve">not </w:t>
         </w:r>
       </w:ins>
-      <w:ins w:id="314" w:author="kyle O'Reilly" w:date="2026-10-21T20:47:00Z" w16du:dateUtc="2026-10-21T19:47:00Z">
+      <w:ins w:id="325" w:author="kyle O'Reilly" w:date="2026-10-21T20:47:00Z" w16du:dateUtc="2026-10-21T19:47:00Z">
         <w:r>
           <w:t>constitute financial inv</w:t>
         </w:r>
       </w:ins>
-      <w:ins w:id="315" w:author="kyle O'Reilly" w:date="2026-10-21T20:48:00Z" w16du:dateUtc="2026-10-21T19:48:00Z">
+      <w:ins w:id="326" w:author="kyle O'Reilly" w:date="2026-10-21T20:48:00Z" w16du:dateUtc="2026-10-21T19:48:00Z">
         <w:r>
           <w:t>estment</w:t>
         </w:r>
       </w:ins>
-      <w:ins w:id="316" w:author="kyle O'Reilly" w:date="2026-10-21T20:47:00Z" w16du:dateUtc="2026-10-21T19:47:00Z">
+      <w:ins w:id="327" w:author="kyle O'Reilly" w:date="2026-10-21T20:47:00Z" w16du:dateUtc="2026-10-21T19:47:00Z">
         <w:r>
           <w:t xml:space="preserve"> advice.</w:t>
         </w:r>
@@ -4262,7 +4423,7 @@
     <w:p>
       <w:pPr>
         <w:rPr>
-          <w:ins w:id="317" w:author="kyle O'Reilly" w:date="2026-10-21T20:42:00Z" w16du:dateUtc="2026-10-21T19:42:00Z"/>
+          <w:ins w:id="328" w:author="kyle O'Reilly" w:date="2026-10-21T20:42:00Z" w16du:dateUtc="2026-10-21T19:42:00Z"/>
         </w:rPr>
       </w:pPr>
     </w:p>
@@ -4270,19 +4431,18 @@
       <w:pPr>
         <w:pStyle w:val="Heading1"/>
         <w:rPr>
-          <w:ins w:id="318" w:author="kyle O'Reilly" w:date="2026-10-21T23:38:00Z" w16du:dateUtc="2026-10-21T22:38:00Z"/>
-        </w:rPr>
-        <w:pPrChange w:id="319" w:author="kyle O'Reilly" w:date="2026-10-22T18:11:00Z" w16du:dateUtc="2026-10-22T17:11:00Z">
+          <w:ins w:id="329" w:author="kyle O'Reilly" w:date="2026-10-21T23:38:00Z" w16du:dateUtc="2026-10-21T22:38:00Z"/>
+        </w:rPr>
+        <w:pPrChange w:id="330" w:author="kyle O'Reilly" w:date="2026-10-22T18:11:00Z" w16du:dateUtc="2026-10-22T17:11:00Z">
           <w:pPr/>
         </w:pPrChange>
       </w:pPr>
-      <w:bookmarkStart w:id="320" w:name="_Toc243520533"/>
-      <w:ins w:id="321" w:author="kyle O'Reilly" w:date="2026-10-21T20:42:00Z" w16du:dateUtc="2026-10-21T19:42:00Z">
-        <w:r>
-          <w:lastRenderedPageBreak/>
+      <w:bookmarkStart w:id="331" w:name="_Toc243589096"/>
+      <w:ins w:id="332" w:author="kyle O'Reilly" w:date="2026-10-21T20:42:00Z" w16du:dateUtc="2026-10-21T19:42:00Z">
+        <w:r>
           <w:t>References</w:t>
         </w:r>
-        <w:bookmarkEnd w:id="320"/>
+        <w:bookmarkEnd w:id="331"/>
         <w:r>
           <w:t xml:space="preserve"> </w:t>
         </w:r>
@@ -4291,74 +4451,152 @@
     <w:p>
       <w:pPr>
         <w:rPr>
-          <w:ins w:id="322" w:author="kyle O'Reilly" w:date="2026-10-21T23:38:00Z" w16du:dateUtc="2026-10-21T22:38:00Z"/>
-        </w:rPr>
-      </w:pPr>
-      <w:ins w:id="323" w:author="kyle O'Reilly" w:date="2026-10-21T23:38:00Z" w16du:dateUtc="2026-10-21T22:38:00Z">
-        <w:r>
-          <w:t xml:space="preserve">Section 7 </w:t>
-        </w:r>
-      </w:ins>
-    </w:p>
-    <w:p>
-      <w:pPr>
-        <w:rPr>
-          <w:ins w:id="324" w:author="kyle O'Reilly" w:date="2026-10-21T23:48:00Z" w16du:dateUtc="2026-10-21T22:48:00Z"/>
-        </w:rPr>
-      </w:pPr>
-      <w:ins w:id="325" w:author="kyle O'Reilly" w:date="2026-10-21T23:50:00Z" w16du:dateUtc="2026-10-21T22:50:00Z">
-        <w:r>
-          <w:t>Trading 212</w:t>
-        </w:r>
-      </w:ins>
-      <w:ins w:id="326" w:author="kyle O'Reilly" w:date="2026-10-21T23:52:00Z" w16du:dateUtc="2026-10-21T22:52:00Z">
-        <w:r>
-          <w:t xml:space="preserve"> </w:t>
-        </w:r>
-      </w:ins>
-      <w:ins w:id="327" w:author="kyle O'Reilly" w:date="2026-10-21T23:50:00Z" w16du:dateUtc="2026-10-21T22:50:00Z">
-        <w:r>
-          <w:t>(n.d.) Trading 212 investment platform. Available at:</w:t>
-        </w:r>
-      </w:ins>
-      <w:ins w:id="328" w:author="kyle O'Reilly" w:date="2026-10-21T23:51:00Z" w16du:dateUtc="2026-10-21T22:51:00Z">
-        <w:r>
-          <w:t xml:space="preserve"> </w:t>
-        </w:r>
+          <w:ins w:id="333" w:author="kyle O'Reilly" w:date="2026-10-22T19:06:00Z" w16du:dateUtc="2026-10-22T18:06:00Z"/>
+        </w:rPr>
+      </w:pPr>
+      <w:ins w:id="334" w:author="kyle O'Reilly" w:date="2026-10-22T19:06:00Z" w16du:dateUtc="2026-10-22T18:06:00Z">
+        <w:r>
+          <w:t>Section 5</w:t>
+        </w:r>
+      </w:ins>
+    </w:p>
+    <w:p>
+      <w:pPr>
+        <w:rPr>
+          <w:ins w:id="335" w:author="kyle O'Reilly" w:date="2026-10-22T19:08:00Z" w16du:dateUtc="2026-10-22T18:08:00Z"/>
+        </w:rPr>
+      </w:pPr>
+      <w:ins w:id="336" w:author="kyle O'Reilly" w:date="2026-10-22T19:06:00Z" w16du:dateUtc="2026-10-22T18:06:00Z">
+        <w:r>
+          <w:t>Tra</w:t>
+        </w:r>
+      </w:ins>
+      <w:ins w:id="337" w:author="kyle O'Reilly" w:date="2026-10-22T19:07:00Z" w16du:dateUtc="2026-10-22T18:07:00Z">
+        <w:r>
+          <w:t xml:space="preserve">ding 212 (n.d.) Trading 212 investment platform. Available at: </w:t>
+        </w:r>
+      </w:ins>
+      <w:ins w:id="338" w:author="kyle O'Reilly" w:date="2026-10-22T19:08:00Z" w16du:dateUtc="2026-10-22T18:08:00Z">
         <w:r>
           <w:fldChar w:fldCharType="begin"/>
         </w:r>
         <w:r>
           <w:instrText>HYPERLINK "</w:instrText>
         </w:r>
-        <w:r>
-          <w:instrText>https://www.trading212.com</w:instrText>
-        </w:r>
-        <w:r>
-          <w:instrText>/"</w:instrText>
+      </w:ins>
+      <w:ins w:id="339" w:author="kyle O'Reilly" w:date="2026-10-22T19:07:00Z" w16du:dateUtc="2026-10-22T18:07:00Z">
+        <w:r>
+          <w:instrText>https://www.trading212.com/</w:instrText>
+        </w:r>
+      </w:ins>
+      <w:ins w:id="340" w:author="kyle O'Reilly" w:date="2026-10-22T19:08:00Z" w16du:dateUtc="2026-10-22T18:08:00Z">
+        <w:r>
+          <w:instrText>"</w:instrText>
         </w:r>
         <w:r>
           <w:fldChar w:fldCharType="separate"/>
         </w:r>
+      </w:ins>
+      <w:ins w:id="341" w:author="kyle O'Reilly" w:date="2026-10-22T19:07:00Z" w16du:dateUtc="2026-10-22T18:07:00Z">
         <w:r>
           <w:rPr>
             <w:rStyle w:val="Hyperlink"/>
           </w:rPr>
           <w:t>https://www.trading212.com/</w:t>
         </w:r>
+      </w:ins>
+      <w:ins w:id="342" w:author="kyle O'Reilly" w:date="2026-10-22T19:08:00Z" w16du:dateUtc="2026-10-22T18:08:00Z">
         <w:r>
           <w:fldChar w:fldCharType="end"/>
         </w:r>
         <w:r>
+          <w:t xml:space="preserve"> </w:t>
+        </w:r>
+      </w:ins>
+      <w:ins w:id="343" w:author="kyle O'Reilly" w:date="2026-10-22T19:07:00Z" w16du:dateUtc="2026-10-22T18:07:00Z">
+        <w:r>
+          <w:t>(Accessed: 22 October 2026).</w:t>
+        </w:r>
+      </w:ins>
+    </w:p>
+    <w:p>
+      <w:pPr>
+        <w:rPr>
+          <w:ins w:id="344" w:author="kyle O'Reilly" w:date="2026-10-22T19:06:00Z" w16du:dateUtc="2026-10-22T18:06:00Z"/>
+        </w:rPr>
+      </w:pPr>
+    </w:p>
+    <w:p>
+      <w:pPr>
+        <w:rPr>
+          <w:ins w:id="345" w:author="kyle O'Reilly" w:date="2026-10-21T23:38:00Z" w16du:dateUtc="2026-10-21T22:38:00Z"/>
+        </w:rPr>
+      </w:pPr>
+      <w:ins w:id="346" w:author="kyle O'Reilly" w:date="2026-10-21T23:38:00Z" w16du:dateUtc="2026-10-21T22:38:00Z">
+        <w:r>
+          <w:t xml:space="preserve">Section 7 </w:t>
+        </w:r>
+      </w:ins>
+    </w:p>
+    <w:p>
+      <w:pPr>
+        <w:rPr>
+          <w:ins w:id="347" w:author="kyle O'Reilly" w:date="2026-10-21T23:48:00Z" w16du:dateUtc="2026-10-21T22:48:00Z"/>
+        </w:rPr>
+      </w:pPr>
+      <w:ins w:id="348" w:author="kyle O'Reilly" w:date="2026-10-21T23:50:00Z" w16du:dateUtc="2026-10-21T22:50:00Z">
+        <w:r>
+          <w:t>Trading 212</w:t>
+        </w:r>
+      </w:ins>
+      <w:ins w:id="349" w:author="kyle O'Reilly" w:date="2026-10-21T23:52:00Z" w16du:dateUtc="2026-10-21T22:52:00Z">
+        <w:r>
+          <w:t xml:space="preserve"> </w:t>
+        </w:r>
+      </w:ins>
+      <w:ins w:id="350" w:author="kyle O'Reilly" w:date="2026-10-21T23:50:00Z" w16du:dateUtc="2026-10-21T22:50:00Z">
+        <w:r>
+          <w:t>(n.d.) Trading 212 investment platform. Available at:</w:t>
+        </w:r>
+      </w:ins>
+      <w:ins w:id="351" w:author="kyle O'Reilly" w:date="2026-10-21T23:51:00Z" w16du:dateUtc="2026-10-21T22:51:00Z">
+        <w:r>
+          <w:t xml:space="preserve"> </w:t>
+        </w:r>
+        <w:r>
+          <w:fldChar w:fldCharType="begin"/>
+        </w:r>
+        <w:r>
+          <w:instrText>HYPERLINK "</w:instrText>
+        </w:r>
+        <w:r>
+          <w:instrText>https://www.trading212.com</w:instrText>
+        </w:r>
+        <w:r>
+          <w:instrText>/"</w:instrText>
+        </w:r>
+        <w:r>
+          <w:fldChar w:fldCharType="separate"/>
+        </w:r>
+        <w:r>
+          <w:rPr>
+            <w:rStyle w:val="Hyperlink"/>
+          </w:rPr>
+          <w:t>https://www.trading212.com/</w:t>
+        </w:r>
+        <w:r>
+          <w:fldChar w:fldCharType="end"/>
+        </w:r>
+        <w:r>
           <w:t xml:space="preserve">  (</w:t>
         </w:r>
       </w:ins>
-      <w:ins w:id="329" w:author="kyle O'Reilly" w:date="2026-10-21T23:50:00Z" w16du:dateUtc="2026-10-21T22:50:00Z">
+      <w:ins w:id="352" w:author="kyle O'Reilly" w:date="2026-10-21T23:50:00Z" w16du:dateUtc="2026-10-21T22:50:00Z">
         <w:r>
           <w:t>Accessed: 2</w:t>
         </w:r>
       </w:ins>
-      <w:ins w:id="330" w:author="kyle O'Reilly" w:date="2026-10-21T23:51:00Z" w16du:dateUtc="2026-10-21T22:51:00Z">
+      <w:ins w:id="353" w:author="kyle O'Reilly" w:date="2026-10-21T23:51:00Z" w16du:dateUtc="2026-10-21T22:51:00Z">
         <w:r>
           <w:t>1 October 2026).</w:t>
         </w:r>
@@ -4367,10 +4605,10 @@
     <w:p>
       <w:pPr>
         <w:rPr>
-          <w:ins w:id="331" w:author="kyle O'Reilly" w:date="2026-10-21T23:53:00Z" w16du:dateUtc="2026-10-21T22:53:00Z"/>
-        </w:rPr>
-      </w:pPr>
-      <w:ins w:id="332" w:author="kyle O'Reilly" w:date="2026-10-21T23:52:00Z" w16du:dateUtc="2026-10-21T22:52:00Z">
+          <w:ins w:id="354" w:author="kyle O'Reilly" w:date="2026-10-21T23:53:00Z" w16du:dateUtc="2026-10-21T22:53:00Z"/>
+        </w:rPr>
+      </w:pPr>
+      <w:ins w:id="355" w:author="kyle O'Reilly" w:date="2026-10-21T23:52:00Z" w16du:dateUtc="2026-10-21T22:52:00Z">
         <w:r>
           <w:t xml:space="preserve">Stooq (n.d.a) </w:t>
         </w:r>
@@ -4378,12 +4616,12 @@
           <w:t>JPMorgan Chase &amp; Co. (JPM.</w:t>
         </w:r>
       </w:ins>
-      <w:ins w:id="333" w:author="kyle O'Reilly" w:date="2026-10-21T23:53:00Z" w16du:dateUtc="2026-10-21T22:53:00Z">
+      <w:ins w:id="356" w:author="kyle O'Reilly" w:date="2026-10-21T23:53:00Z" w16du:dateUtc="2026-10-21T22:53:00Z">
         <w:r>
           <w:t>US) – Historical data. Available at:</w:t>
         </w:r>
       </w:ins>
-      <w:ins w:id="334" w:author="kyle O'Reilly" w:date="2026-10-21T23:57:00Z" w16du:dateUtc="2026-10-21T22:57:00Z">
+      <w:ins w:id="357" w:author="kyle O'Reilly" w:date="2026-10-21T23:57:00Z" w16du:dateUtc="2026-10-21T22:57:00Z">
         <w:r>
           <w:t xml:space="preserve"> </w:t>
         </w:r>
@@ -4395,7 +4633,7 @@
         </w:r>
         <w:r>
           <w:rPr>
-            <w:rPrChange w:id="335" w:author="kyle O'Reilly" w:date="2026-10-21T23:57:00Z" w16du:dateUtc="2026-10-21T22:57:00Z">
+            <w:rPrChange w:id="358" w:author="kyle O'Reilly" w:date="2026-10-21T23:57:00Z" w16du:dateUtc="2026-10-21T22:57:00Z">
               <w:rPr>
                 <w:rStyle w:val="Hyperlink"/>
               </w:rPr>
@@ -4422,7 +4660,7 @@
           <w:t xml:space="preserve"> </w:t>
         </w:r>
       </w:ins>
-      <w:ins w:id="336" w:author="kyle O'Reilly" w:date="2026-10-21T23:53:00Z" w16du:dateUtc="2026-10-21T22:53:00Z">
+      <w:ins w:id="359" w:author="kyle O'Reilly" w:date="2026-10-21T23:53:00Z" w16du:dateUtc="2026-10-21T22:53:00Z">
         <w:r>
           <w:t>(Accessed</w:t>
         </w:r>
@@ -4430,12 +4668,12 @@
           <w:t xml:space="preserve">: 21 </w:t>
         </w:r>
       </w:ins>
-      <w:ins w:id="337" w:author="kyle O'Reilly" w:date="2026-10-21T23:55:00Z" w16du:dateUtc="2026-10-21T22:55:00Z">
+      <w:ins w:id="360" w:author="kyle O'Reilly" w:date="2026-10-21T23:55:00Z" w16du:dateUtc="2026-10-21T22:55:00Z">
         <w:r>
           <w:t>October</w:t>
         </w:r>
       </w:ins>
-      <w:ins w:id="338" w:author="kyle O'Reilly" w:date="2026-10-21T23:53:00Z" w16du:dateUtc="2026-10-21T22:53:00Z">
+      <w:ins w:id="361" w:author="kyle O'Reilly" w:date="2026-10-21T23:53:00Z" w16du:dateUtc="2026-10-21T22:53:00Z">
         <w:r>
           <w:t xml:space="preserve"> 2026).</w:t>
         </w:r>
@@ -4444,45 +4682,45 @@
     <w:p>
       <w:pPr>
         <w:rPr>
-          <w:ins w:id="339" w:author="kyle O'Reilly" w:date="2026-10-21T23:54:00Z" w16du:dateUtc="2026-10-21T22:54:00Z"/>
-        </w:rPr>
-      </w:pPr>
-      <w:ins w:id="340" w:author="kyle O'Reilly" w:date="2026-10-21T23:53:00Z" w16du:dateUtc="2026-10-21T22:53:00Z">
+          <w:ins w:id="362" w:author="kyle O'Reilly" w:date="2026-10-21T23:54:00Z" w16du:dateUtc="2026-10-21T22:54:00Z"/>
+        </w:rPr>
+      </w:pPr>
+      <w:ins w:id="363" w:author="kyle O'Reilly" w:date="2026-10-21T23:53:00Z" w16du:dateUtc="2026-10-21T22:53:00Z">
         <w:r>
           <w:t xml:space="preserve">Stooq (n.d.b) Coca-Cola </w:t>
         </w:r>
       </w:ins>
-      <w:ins w:id="341" w:author="kyle O'Reilly" w:date="2026-10-21T23:54:00Z" w16du:dateUtc="2026-10-21T22:54:00Z">
+      <w:ins w:id="364" w:author="kyle O'Reilly" w:date="2026-10-21T23:54:00Z" w16du:dateUtc="2026-10-21T22:54:00Z">
         <w:r>
           <w:t>Co</w:t>
         </w:r>
       </w:ins>
-      <w:ins w:id="342" w:author="kyle O'Reilly" w:date="2026-10-22T00:04:00Z" w16du:dateUtc="2026-10-21T23:04:00Z">
+      <w:ins w:id="365" w:author="kyle O'Reilly" w:date="2026-10-22T00:04:00Z" w16du:dateUtc="2026-10-21T23:04:00Z">
         <w:r>
           <w:t>.</w:t>
         </w:r>
       </w:ins>
-      <w:ins w:id="343" w:author="kyle O'Reilly" w:date="2026-10-21T23:54:00Z" w16du:dateUtc="2026-10-21T22:54:00Z">
+      <w:ins w:id="366" w:author="kyle O'Reilly" w:date="2026-10-21T23:54:00Z" w16du:dateUtc="2026-10-21T22:54:00Z">
         <w:r>
           <w:t xml:space="preserve"> </w:t>
         </w:r>
       </w:ins>
-      <w:ins w:id="344" w:author="kyle O'Reilly" w:date="2026-10-21T23:53:00Z" w16du:dateUtc="2026-10-21T22:53:00Z">
+      <w:ins w:id="367" w:author="kyle O'Reilly" w:date="2026-10-21T23:53:00Z" w16du:dateUtc="2026-10-21T22:53:00Z">
         <w:r>
           <w:t>(KO.U</w:t>
         </w:r>
       </w:ins>
-      <w:ins w:id="345" w:author="kyle O'Reilly" w:date="2026-10-21T23:54:00Z" w16du:dateUtc="2026-10-21T22:54:00Z">
+      <w:ins w:id="368" w:author="kyle O'Reilly" w:date="2026-10-21T23:54:00Z" w16du:dateUtc="2026-10-21T22:54:00Z">
         <w:r>
           <w:t>S)</w:t>
         </w:r>
       </w:ins>
-      <w:ins w:id="346" w:author="kyle O'Reilly" w:date="2026-10-21T23:55:00Z" w16du:dateUtc="2026-10-21T22:55:00Z">
+      <w:ins w:id="369" w:author="kyle O'Reilly" w:date="2026-10-21T23:55:00Z" w16du:dateUtc="2026-10-21T22:55:00Z">
         <w:r>
           <w:t xml:space="preserve"> – Historical data. Available at:</w:t>
         </w:r>
       </w:ins>
-      <w:ins w:id="347" w:author="kyle O'Reilly" w:date="2026-10-21T23:56:00Z" w16du:dateUtc="2026-10-21T22:56:00Z">
+      <w:ins w:id="370" w:author="kyle O'Reilly" w:date="2026-10-21T23:56:00Z" w16du:dateUtc="2026-10-21T22:56:00Z">
         <w:r>
           <w:t xml:space="preserve"> </w:t>
         </w:r>
@@ -4514,7 +4752,7 @@
           <w:t xml:space="preserve"> </w:t>
         </w:r>
       </w:ins>
-      <w:ins w:id="348" w:author="kyle O'Reilly" w:date="2026-10-21T23:55:00Z" w16du:dateUtc="2026-10-21T22:55:00Z">
+      <w:ins w:id="371" w:author="kyle O'Reilly" w:date="2026-10-21T23:55:00Z" w16du:dateUtc="2026-10-21T22:55:00Z">
         <w:r>
           <w:t>(Accessed: 21 October 2026).</w:t>
         </w:r>
@@ -4523,25 +4761,25 @@
     <w:p>
       <w:pPr>
         <w:rPr>
-          <w:ins w:id="349" w:author="kyle O'Reilly" w:date="2026-10-21T23:49:00Z" w16du:dateUtc="2026-10-21T22:49:00Z"/>
-        </w:rPr>
-      </w:pPr>
-      <w:ins w:id="350" w:author="kyle O'Reilly" w:date="2026-10-21T23:54:00Z" w16du:dateUtc="2026-10-21T22:54:00Z">
+          <w:ins w:id="372" w:author="kyle O'Reilly" w:date="2026-10-21T23:49:00Z" w16du:dateUtc="2026-10-21T22:49:00Z"/>
+        </w:rPr>
+      </w:pPr>
+      <w:ins w:id="373" w:author="kyle O'Reilly" w:date="2026-10-21T23:54:00Z" w16du:dateUtc="2026-10-21T22:54:00Z">
         <w:r>
           <w:t xml:space="preserve">Stooq (n.d.c) Intel </w:t>
         </w:r>
       </w:ins>
-      <w:ins w:id="351" w:author="kyle O'Reilly" w:date="2026-10-22T00:04:00Z" w16du:dateUtc="2026-10-21T23:04:00Z">
+      <w:ins w:id="374" w:author="kyle O'Reilly" w:date="2026-10-22T00:04:00Z" w16du:dateUtc="2026-10-21T23:04:00Z">
         <w:r>
           <w:t xml:space="preserve">Corp. </w:t>
         </w:r>
       </w:ins>
-      <w:ins w:id="352" w:author="kyle O'Reilly" w:date="2026-10-21T23:54:00Z" w16du:dateUtc="2026-10-21T22:54:00Z">
+      <w:ins w:id="375" w:author="kyle O'Reilly" w:date="2026-10-21T23:54:00Z" w16du:dateUtc="2026-10-21T22:54:00Z">
         <w:r>
           <w:t>(INTC.US)</w:t>
         </w:r>
       </w:ins>
-      <w:ins w:id="353" w:author="kyle O'Reilly" w:date="2026-10-21T23:55:00Z" w16du:dateUtc="2026-10-21T22:55:00Z">
+      <w:ins w:id="376" w:author="kyle O'Reilly" w:date="2026-10-21T23:55:00Z" w16du:dateUtc="2026-10-21T22:55:00Z">
         <w:r>
           <w:t xml:space="preserve"> – Historical data. Available at</w:t>
         </w:r>
@@ -4549,7 +4787,7 @@
           <w:t>:</w:t>
         </w:r>
       </w:ins>
-      <w:ins w:id="354" w:author="kyle O'Reilly" w:date="2026-10-21T23:56:00Z" w16du:dateUtc="2026-10-21T22:56:00Z">
+      <w:ins w:id="377" w:author="kyle O'Reilly" w:date="2026-10-21T23:56:00Z" w16du:dateUtc="2026-10-21T22:56:00Z">
         <w:r>
           <w:t xml:space="preserve"> </w:t>
         </w:r>
@@ -4581,7 +4819,7 @@
           <w:t xml:space="preserve"> </w:t>
         </w:r>
       </w:ins>
-      <w:ins w:id="355" w:author="kyle O'Reilly" w:date="2026-10-21T23:55:00Z" w16du:dateUtc="2026-10-21T22:55:00Z">
+      <w:ins w:id="378" w:author="kyle O'Reilly" w:date="2026-10-21T23:55:00Z" w16du:dateUtc="2026-10-21T22:55:00Z">
         <w:r>
           <w:t xml:space="preserve"> </w:t>
         </w:r>
@@ -4589,12 +4827,12 @@
           <w:t xml:space="preserve">(Accessed: 21 </w:t>
         </w:r>
       </w:ins>
-      <w:ins w:id="356" w:author="kyle O'Reilly" w:date="2026-10-22T00:14:00Z" w16du:dateUtc="2026-10-21T23:14:00Z">
+      <w:ins w:id="379" w:author="kyle O'Reilly" w:date="2026-10-22T00:14:00Z" w16du:dateUtc="2026-10-21T23:14:00Z">
         <w:r>
           <w:t>October</w:t>
         </w:r>
       </w:ins>
-      <w:ins w:id="357" w:author="kyle O'Reilly" w:date="2026-10-21T23:55:00Z" w16du:dateUtc="2026-10-21T22:55:00Z">
+      <w:ins w:id="380" w:author="kyle O'Reilly" w:date="2026-10-21T23:55:00Z" w16du:dateUtc="2026-10-21T22:55:00Z">
         <w:r>
           <w:t xml:space="preserve"> 2026).</w:t>
         </w:r>
@@ -4603,14 +4841,14 @@
     <w:p>
       <w:pPr>
         <w:rPr>
-          <w:ins w:id="358" w:author="kyle O'Reilly" w:date="2026-10-21T23:49:00Z" w16du:dateUtc="2026-10-21T22:49:00Z"/>
-        </w:rPr>
-      </w:pPr>
-    </w:p>
-    <w:p>
-      <w:pPr>
-        <w:rPr>
-          <w:ins w:id="359" w:author="kyle O'Reilly" w:date="2026-10-21T23:49:00Z" w16du:dateUtc="2026-10-21T22:49:00Z"/>
+          <w:ins w:id="381" w:author="kyle O'Reilly" w:date="2026-10-21T23:49:00Z" w16du:dateUtc="2026-10-21T22:49:00Z"/>
+        </w:rPr>
+      </w:pPr>
+    </w:p>
+    <w:p>
+      <w:pPr>
+        <w:rPr>
+          <w:ins w:id="382" w:author="kyle O'Reilly" w:date="2026-10-21T23:49:00Z" w16du:dateUtc="2026-10-21T22:49:00Z"/>
         </w:rPr>
       </w:pPr>
     </w:p>
@@ -4620,7 +4858,7 @@
           <w:tab w:val="left" w:pos="1055"/>
         </w:tabs>
         <w:rPr>
-          <w:ins w:id="360" w:author="kyle O'Reilly" w:date="2026-10-22T18:11:00Z" w16du:dateUtc="2026-10-22T17:11:00Z"/>
+          <w:ins w:id="383" w:author="kyle O'Reilly" w:date="2026-10-22T18:11:00Z" w16du:dateUtc="2026-10-22T17:11:00Z"/>
         </w:rPr>
       </w:pPr>
     </w:p>
@@ -4630,9 +4868,9 @@
           <w:tab w:val="left" w:pos="1055"/>
         </w:tabs>
         <w:rPr>
-          <w:ins w:id="361" w:author="kyle O'Reilly" w:date="2026-10-21T23:49:00Z" w16du:dateUtc="2026-10-21T22:49:00Z"/>
-        </w:rPr>
-        <w:pPrChange w:id="362" w:author="kyle O'Reilly" w:date="2026-10-22T18:11:00Z" w16du:dateUtc="2026-10-22T17:11:00Z">
+          <w:ins w:id="384" w:author="kyle O'Reilly" w:date="2026-10-21T23:49:00Z" w16du:dateUtc="2026-10-21T22:49:00Z"/>
+        </w:rPr>
+        <w:pPrChange w:id="385" w:author="kyle O'Reilly" w:date="2026-10-22T18:11:00Z" w16du:dateUtc="2026-10-22T17:11:00Z">
           <w:pPr/>
         </w:pPrChange>
       </w:pPr>
@@ -4640,7 +4878,7 @@
     <w:p>
       <w:pPr>
         <w:rPr>
-          <w:ins w:id="363" w:author="kyle O'Reilly" w:date="2026-10-22T00:15:00Z" w16du:dateUtc="2026-10-21T23:15:00Z"/>
+          <w:ins w:id="386" w:author="kyle O'Reilly" w:date="2026-10-22T00:15:00Z" w16du:dateUtc="2026-10-21T23:15:00Z"/>
           <w:sz w:val="96"/>
           <w:szCs w:val="96"/>
         </w:rPr>
@@ -4649,12 +4887,12 @@
     <w:p>
       <w:pPr>
         <w:rPr>
-          <w:ins w:id="364" w:author="kyle O'Reilly" w:date="2026-10-21T23:49:00Z" w16du:dateUtc="2026-10-21T22:49:00Z"/>
+          <w:ins w:id="387" w:author="kyle O'Reilly" w:date="2026-10-21T23:49:00Z" w16du:dateUtc="2026-10-21T22:49:00Z"/>
           <w:sz w:val="96"/>
           <w:szCs w:val="96"/>
-          <w:rPrChange w:id="365" w:author="kyle O'Reilly" w:date="2026-10-21T23:49:00Z" w16du:dateUtc="2026-10-21T22:49:00Z">
+          <w:rPrChange w:id="388" w:author="kyle O'Reilly" w:date="2026-10-21T23:49:00Z" w16du:dateUtc="2026-10-21T22:49:00Z">
             <w:rPr>
-              <w:ins w:id="366" w:author="kyle O'Reilly" w:date="2026-10-21T23:49:00Z" w16du:dateUtc="2026-10-21T22:49:00Z"/>
+              <w:ins w:id="389" w:author="kyle O'Reilly" w:date="2026-10-21T23:49:00Z" w16du:dateUtc="2026-10-21T22:49:00Z"/>
             </w:rPr>
           </w:rPrChange>
         </w:rPr>
@@ -4666,20 +4904,20 @@
         <w:rPr>
           <w:sz w:val="96"/>
           <w:szCs w:val="96"/>
-          <w:rPrChange w:id="367" w:author="kyle O'Reilly" w:date="2026-10-21T23:49:00Z" w16du:dateUtc="2026-10-21T22:49:00Z">
+          <w:rPrChange w:id="390" w:author="kyle O'Reilly" w:date="2026-10-21T23:49:00Z" w16du:dateUtc="2026-10-21T22:49:00Z">
             <w:rPr/>
           </w:rPrChange>
         </w:rPr>
-        <w:pPrChange w:id="368" w:author="kyle O'Reilly" w:date="2026-10-21T23:49:00Z" w16du:dateUtc="2026-10-21T22:49:00Z">
+        <w:pPrChange w:id="391" w:author="kyle O'Reilly" w:date="2026-10-21T23:49:00Z" w16du:dateUtc="2026-10-21T22:49:00Z">
           <w:pPr/>
         </w:pPrChange>
       </w:pPr>
-      <w:ins w:id="369" w:author="kyle O'Reilly" w:date="2026-10-21T23:49:00Z" w16du:dateUtc="2026-10-21T22:49:00Z">
+      <w:ins w:id="392" w:author="kyle O'Reilly" w:date="2026-10-21T23:49:00Z" w16du:dateUtc="2026-10-21T22:49:00Z">
         <w:r>
           <w:rPr>
             <w:sz w:val="96"/>
             <w:szCs w:val="96"/>
-            <w:rPrChange w:id="370" w:author="kyle O'Reilly" w:date="2026-10-21T23:49:00Z" w16du:dateUtc="2026-10-21T22:49:00Z">
+            <w:rPrChange w:id="393" w:author="kyle O'Reilly" w:date="2026-10-21T23:49:00Z" w16du:dateUtc="2026-10-21T22:49:00Z">
               <w:rPr/>
             </w:rPrChange>
           </w:rPr>

</xml_diff>

<commit_message>
Corrected Table of Contents information.
</commit_message>
<xml_diff>
--- a/HDSDAB - Strategic Thinking - Capstone Project.docx
+++ b/HDSDAB - Strategic Thinking - Capstone Project.docx
@@ -1187,7 +1187,7 @@
               <w:tab w:val="right" w:leader="dot" w:pos="9016"/>
             </w:tabs>
             <w:rPr>
-              <w:ins w:id="8" w:author="kyle O'Reilly" w:date="2026-10-22T19:17:00Z" w16du:dateUtc="2026-10-22T18:17:00Z"/>
+              <w:ins w:id="8" w:author="kyle O'Reilly" w:date="2026-10-22T19:32:00Z" w16du:dateUtc="2026-10-22T18:32:00Z"/>
               <w:rFonts w:asciiTheme="minorHAnsi" w:eastAsiaTheme="minorEastAsia" w:hAnsiTheme="minorHAnsi" w:cstheme="minorBidi"/>
               <w:noProof/>
               <w:kern w:val="2"/>
@@ -1205,7 +1205,7 @@
           <w:r>
             <w:fldChar w:fldCharType="separate"/>
           </w:r>
-          <w:ins w:id="9" w:author="kyle O'Reilly" w:date="2026-10-22T19:17:00Z" w16du:dateUtc="2026-10-22T18:17:00Z">
+          <w:ins w:id="9" w:author="kyle O'Reilly" w:date="2026-10-22T19:32:00Z" w16du:dateUtc="2026-10-22T18:32:00Z">
             <w:r>
               <w:rPr>
                 <w:rStyle w:val="Hyperlink"/>
@@ -1224,7 +1224,7 @@
               <w:rPr>
                 <w:noProof/>
               </w:rPr>
-              <w:instrText>HYPERLINK \l "_Toc243589086"</w:instrText>
+              <w:instrText>HYPERLINK \l "_Toc243589977"</w:instrText>
             </w:r>
             <w:r>
               <w:rPr>
@@ -1272,7 +1272,7 @@
                 <w:noProof/>
                 <w:webHidden/>
               </w:rPr>
-              <w:instrText xml:space="preserve"> PAGEREF _Toc243589086 \h </w:instrText>
+              <w:instrText xml:space="preserve"> PAGEREF _Toc243589977 \h </w:instrText>
             </w:r>
             <w:r>
               <w:rPr>
@@ -1317,7 +1317,7 @@
               <w:tab w:val="right" w:leader="dot" w:pos="9016"/>
             </w:tabs>
             <w:rPr>
-              <w:ins w:id="10" w:author="kyle O'Reilly" w:date="2026-10-22T19:17:00Z" w16du:dateUtc="2026-10-22T18:17:00Z"/>
+              <w:ins w:id="10" w:author="kyle O'Reilly" w:date="2026-10-22T19:32:00Z" w16du:dateUtc="2026-10-22T18:32:00Z"/>
               <w:rFonts w:asciiTheme="minorHAnsi" w:eastAsiaTheme="minorEastAsia" w:hAnsiTheme="minorHAnsi" w:cstheme="minorBidi"/>
               <w:noProof/>
               <w:kern w:val="2"/>
@@ -1326,7 +1326,7 @@
               <w14:ligatures w14:val="standardContextual"/>
             </w:rPr>
           </w:pPr>
-          <w:ins w:id="11" w:author="kyle O'Reilly" w:date="2026-10-22T19:17:00Z" w16du:dateUtc="2026-10-22T18:17:00Z">
+          <w:ins w:id="11" w:author="kyle O'Reilly" w:date="2026-10-22T19:32:00Z" w16du:dateUtc="2026-10-22T18:32:00Z">
             <w:r>
               <w:rPr>
                 <w:rStyle w:val="Hyperlink"/>
@@ -1345,7 +1345,7 @@
               <w:rPr>
                 <w:noProof/>
               </w:rPr>
-              <w:instrText>HYPERLINK \l "_Toc243589087"</w:instrText>
+              <w:instrText>HYPERLINK \l "_Toc243589978"</w:instrText>
             </w:r>
             <w:r>
               <w:rPr>
@@ -1393,7 +1393,7 @@
                 <w:noProof/>
                 <w:webHidden/>
               </w:rPr>
-              <w:instrText xml:space="preserve"> PAGEREF _Toc243589087 \h </w:instrText>
+              <w:instrText xml:space="preserve"> PAGEREF _Toc243589978 \h </w:instrText>
             </w:r>
             <w:r>
               <w:rPr>
@@ -1438,7 +1438,7 @@
               <w:tab w:val="right" w:leader="dot" w:pos="9016"/>
             </w:tabs>
             <w:rPr>
-              <w:ins w:id="12" w:author="kyle O'Reilly" w:date="2026-10-22T19:17:00Z" w16du:dateUtc="2026-10-22T18:17:00Z"/>
+              <w:ins w:id="12" w:author="kyle O'Reilly" w:date="2026-10-22T19:32:00Z" w16du:dateUtc="2026-10-22T18:32:00Z"/>
               <w:rFonts w:asciiTheme="minorHAnsi" w:eastAsiaTheme="minorEastAsia" w:hAnsiTheme="minorHAnsi" w:cstheme="minorBidi"/>
               <w:noProof/>
               <w:kern w:val="2"/>
@@ -1447,7 +1447,7 @@
               <w14:ligatures w14:val="standardContextual"/>
             </w:rPr>
           </w:pPr>
-          <w:ins w:id="13" w:author="kyle O'Reilly" w:date="2026-10-22T19:17:00Z" w16du:dateUtc="2026-10-22T18:17:00Z">
+          <w:ins w:id="13" w:author="kyle O'Reilly" w:date="2026-10-22T19:32:00Z" w16du:dateUtc="2026-10-22T18:32:00Z">
             <w:r>
               <w:rPr>
                 <w:rStyle w:val="Hyperlink"/>
@@ -1466,7 +1466,7 @@
               <w:rPr>
                 <w:noProof/>
               </w:rPr>
-              <w:instrText>HYPERLINK \l "_Toc243589088"</w:instrText>
+              <w:instrText>HYPERLINK \l "_Toc243589979"</w:instrText>
             </w:r>
             <w:r>
               <w:rPr>
@@ -1514,7 +1514,7 @@
                 <w:noProof/>
                 <w:webHidden/>
               </w:rPr>
-              <w:instrText xml:space="preserve"> PAGEREF _Toc243589088 \h </w:instrText>
+              <w:instrText xml:space="preserve"> PAGEREF _Toc243589979 \h </w:instrText>
             </w:r>
             <w:r>
               <w:rPr>
@@ -1559,7 +1559,7 @@
               <w:tab w:val="right" w:leader="dot" w:pos="9016"/>
             </w:tabs>
             <w:rPr>
-              <w:ins w:id="14" w:author="kyle O'Reilly" w:date="2026-10-22T19:17:00Z" w16du:dateUtc="2026-10-22T18:17:00Z"/>
+              <w:ins w:id="14" w:author="kyle O'Reilly" w:date="2026-10-22T19:32:00Z" w16du:dateUtc="2026-10-22T18:32:00Z"/>
               <w:rFonts w:asciiTheme="minorHAnsi" w:eastAsiaTheme="minorEastAsia" w:hAnsiTheme="minorHAnsi" w:cstheme="minorBidi"/>
               <w:noProof/>
               <w:kern w:val="2"/>
@@ -1568,7 +1568,7 @@
               <w14:ligatures w14:val="standardContextual"/>
             </w:rPr>
           </w:pPr>
-          <w:ins w:id="15" w:author="kyle O'Reilly" w:date="2026-10-22T19:17:00Z" w16du:dateUtc="2026-10-22T18:17:00Z">
+          <w:ins w:id="15" w:author="kyle O'Reilly" w:date="2026-10-22T19:32:00Z" w16du:dateUtc="2026-10-22T18:32:00Z">
             <w:r>
               <w:rPr>
                 <w:rStyle w:val="Hyperlink"/>
@@ -1587,7 +1587,7 @@
               <w:rPr>
                 <w:noProof/>
               </w:rPr>
-              <w:instrText>HYPERLINK \l "_Toc243589089"</w:instrText>
+              <w:instrText>HYPERLINK \l "_Toc243589980"</w:instrText>
             </w:r>
             <w:r>
               <w:rPr>
@@ -1635,7 +1635,7 @@
                 <w:noProof/>
                 <w:webHidden/>
               </w:rPr>
-              <w:instrText xml:space="preserve"> PAGEREF _Toc243589089 \h </w:instrText>
+              <w:instrText xml:space="preserve"> PAGEREF _Toc243589980 \h </w:instrText>
             </w:r>
             <w:r>
               <w:rPr>
@@ -1680,7 +1680,7 @@
               <w:tab w:val="right" w:leader="dot" w:pos="9016"/>
             </w:tabs>
             <w:rPr>
-              <w:ins w:id="16" w:author="kyle O'Reilly" w:date="2026-10-22T19:17:00Z" w16du:dateUtc="2026-10-22T18:17:00Z"/>
+              <w:ins w:id="16" w:author="kyle O'Reilly" w:date="2026-10-22T19:32:00Z" w16du:dateUtc="2026-10-22T18:32:00Z"/>
               <w:rFonts w:asciiTheme="minorHAnsi" w:eastAsiaTheme="minorEastAsia" w:hAnsiTheme="minorHAnsi" w:cstheme="minorBidi"/>
               <w:noProof/>
               <w:kern w:val="2"/>
@@ -1689,7 +1689,7 @@
               <w14:ligatures w14:val="standardContextual"/>
             </w:rPr>
           </w:pPr>
-          <w:ins w:id="17" w:author="kyle O'Reilly" w:date="2026-10-22T19:17:00Z" w16du:dateUtc="2026-10-22T18:17:00Z">
+          <w:ins w:id="17" w:author="kyle O'Reilly" w:date="2026-10-22T19:32:00Z" w16du:dateUtc="2026-10-22T18:32:00Z">
             <w:r>
               <w:rPr>
                 <w:rStyle w:val="Hyperlink"/>
@@ -1708,7 +1708,7 @@
               <w:rPr>
                 <w:noProof/>
               </w:rPr>
-              <w:instrText>HYPERLINK \l "_Toc243589090"</w:instrText>
+              <w:instrText>HYPERLINK \l "_Toc243589981"</w:instrText>
             </w:r>
             <w:r>
               <w:rPr>
@@ -1756,7 +1756,7 @@
                 <w:noProof/>
                 <w:webHidden/>
               </w:rPr>
-              <w:instrText xml:space="preserve"> PAGEREF _Toc243589090 \h </w:instrText>
+              <w:instrText xml:space="preserve"> PAGEREF _Toc243589981 \h </w:instrText>
             </w:r>
             <w:r>
               <w:rPr>
@@ -1801,7 +1801,7 @@
               <w:tab w:val="right" w:leader="dot" w:pos="9016"/>
             </w:tabs>
             <w:rPr>
-              <w:ins w:id="18" w:author="kyle O'Reilly" w:date="2026-10-22T19:17:00Z" w16du:dateUtc="2026-10-22T18:17:00Z"/>
+              <w:ins w:id="18" w:author="kyle O'Reilly" w:date="2026-10-22T19:32:00Z" w16du:dateUtc="2026-10-22T18:32:00Z"/>
               <w:rFonts w:asciiTheme="minorHAnsi" w:eastAsiaTheme="minorEastAsia" w:hAnsiTheme="minorHAnsi" w:cstheme="minorBidi"/>
               <w:noProof/>
               <w:kern w:val="2"/>
@@ -1810,7 +1810,7 @@
               <w14:ligatures w14:val="standardContextual"/>
             </w:rPr>
           </w:pPr>
-          <w:ins w:id="19" w:author="kyle O'Reilly" w:date="2026-10-22T19:17:00Z" w16du:dateUtc="2026-10-22T18:17:00Z">
+          <w:ins w:id="19" w:author="kyle O'Reilly" w:date="2026-10-22T19:32:00Z" w16du:dateUtc="2026-10-22T18:32:00Z">
             <w:r>
               <w:rPr>
                 <w:rStyle w:val="Hyperlink"/>
@@ -1829,7 +1829,7 @@
               <w:rPr>
                 <w:noProof/>
               </w:rPr>
-              <w:instrText>HYPERLINK \l "_Toc243589091"</w:instrText>
+              <w:instrText>HYPERLINK \l "_Toc243589982"</w:instrText>
             </w:r>
             <w:r>
               <w:rPr>
@@ -1877,7 +1877,7 @@
                 <w:noProof/>
                 <w:webHidden/>
               </w:rPr>
-              <w:instrText xml:space="preserve"> PAGEREF _Toc243589091 \h </w:instrText>
+              <w:instrText xml:space="preserve"> PAGEREF _Toc243589982 \h </w:instrText>
             </w:r>
             <w:r>
               <w:rPr>
@@ -1922,7 +1922,7 @@
               <w:tab w:val="right" w:leader="dot" w:pos="9016"/>
             </w:tabs>
             <w:rPr>
-              <w:ins w:id="20" w:author="kyle O'Reilly" w:date="2026-10-22T19:17:00Z" w16du:dateUtc="2026-10-22T18:17:00Z"/>
+              <w:ins w:id="20" w:author="kyle O'Reilly" w:date="2026-10-22T19:32:00Z" w16du:dateUtc="2026-10-22T18:32:00Z"/>
               <w:rFonts w:asciiTheme="minorHAnsi" w:eastAsiaTheme="minorEastAsia" w:hAnsiTheme="minorHAnsi" w:cstheme="minorBidi"/>
               <w:noProof/>
               <w:kern w:val="2"/>
@@ -1931,7 +1931,7 @@
               <w14:ligatures w14:val="standardContextual"/>
             </w:rPr>
           </w:pPr>
-          <w:ins w:id="21" w:author="kyle O'Reilly" w:date="2026-10-22T19:17:00Z" w16du:dateUtc="2026-10-22T18:17:00Z">
+          <w:ins w:id="21" w:author="kyle O'Reilly" w:date="2026-10-22T19:32:00Z" w16du:dateUtc="2026-10-22T18:32:00Z">
             <w:r>
               <w:rPr>
                 <w:rStyle w:val="Hyperlink"/>
@@ -1950,7 +1950,7 @@
               <w:rPr>
                 <w:noProof/>
               </w:rPr>
-              <w:instrText>HYPERLINK \l "_Toc243589092"</w:instrText>
+              <w:instrText>HYPERLINK \l "_Toc243589983"</w:instrText>
             </w:r>
             <w:r>
               <w:rPr>
@@ -1998,7 +1998,7 @@
                 <w:noProof/>
                 <w:webHidden/>
               </w:rPr>
-              <w:instrText xml:space="preserve"> PAGEREF _Toc243589092 \h </w:instrText>
+              <w:instrText xml:space="preserve"> PAGEREF _Toc243589983 \h </w:instrText>
             </w:r>
             <w:r>
               <w:rPr>
@@ -2043,7 +2043,7 @@
               <w:tab w:val="right" w:leader="dot" w:pos="9016"/>
             </w:tabs>
             <w:rPr>
-              <w:ins w:id="22" w:author="kyle O'Reilly" w:date="2026-10-22T19:17:00Z" w16du:dateUtc="2026-10-22T18:17:00Z"/>
+              <w:ins w:id="22" w:author="kyle O'Reilly" w:date="2026-10-22T19:32:00Z" w16du:dateUtc="2026-10-22T18:32:00Z"/>
               <w:rFonts w:asciiTheme="minorHAnsi" w:eastAsiaTheme="minorEastAsia" w:hAnsiTheme="minorHAnsi" w:cstheme="minorBidi"/>
               <w:noProof/>
               <w:kern w:val="2"/>
@@ -2052,7 +2052,7 @@
               <w14:ligatures w14:val="standardContextual"/>
             </w:rPr>
           </w:pPr>
-          <w:ins w:id="23" w:author="kyle O'Reilly" w:date="2026-10-22T19:17:00Z" w16du:dateUtc="2026-10-22T18:17:00Z">
+          <w:ins w:id="23" w:author="kyle O'Reilly" w:date="2026-10-22T19:32:00Z" w16du:dateUtc="2026-10-22T18:32:00Z">
             <w:r>
               <w:rPr>
                 <w:rStyle w:val="Hyperlink"/>
@@ -2071,7 +2071,7 @@
               <w:rPr>
                 <w:noProof/>
               </w:rPr>
-              <w:instrText>HYPERLINK \l "_Toc243589093"</w:instrText>
+              <w:instrText>HYPERLINK \l "_Toc243589984"</w:instrText>
             </w:r>
             <w:r>
               <w:rPr>
@@ -2119,7 +2119,7 @@
                 <w:noProof/>
                 <w:webHidden/>
               </w:rPr>
-              <w:instrText xml:space="preserve"> PAGEREF _Toc243589093 \h </w:instrText>
+              <w:instrText xml:space="preserve"> PAGEREF _Toc243589984 \h </w:instrText>
             </w:r>
             <w:r>
               <w:rPr>
@@ -2164,7 +2164,7 @@
               <w:tab w:val="right" w:leader="dot" w:pos="9016"/>
             </w:tabs>
             <w:rPr>
-              <w:ins w:id="24" w:author="kyle O'Reilly" w:date="2026-10-22T19:17:00Z" w16du:dateUtc="2026-10-22T18:17:00Z"/>
+              <w:ins w:id="24" w:author="kyle O'Reilly" w:date="2026-10-22T19:32:00Z" w16du:dateUtc="2026-10-22T18:32:00Z"/>
               <w:rFonts w:asciiTheme="minorHAnsi" w:eastAsiaTheme="minorEastAsia" w:hAnsiTheme="minorHAnsi" w:cstheme="minorBidi"/>
               <w:noProof/>
               <w:kern w:val="2"/>
@@ -2173,7 +2173,7 @@
               <w14:ligatures w14:val="standardContextual"/>
             </w:rPr>
           </w:pPr>
-          <w:ins w:id="25" w:author="kyle O'Reilly" w:date="2026-10-22T19:17:00Z" w16du:dateUtc="2026-10-22T18:17:00Z">
+          <w:ins w:id="25" w:author="kyle O'Reilly" w:date="2026-10-22T19:32:00Z" w16du:dateUtc="2026-10-22T18:32:00Z">
             <w:r>
               <w:rPr>
                 <w:rStyle w:val="Hyperlink"/>
@@ -2192,7 +2192,7 @@
               <w:rPr>
                 <w:noProof/>
               </w:rPr>
-              <w:instrText>HYPERLINK \l "_Toc243589094"</w:instrText>
+              <w:instrText>HYPERLINK \l "_Toc243589985"</w:instrText>
             </w:r>
             <w:r>
               <w:rPr>
@@ -2240,7 +2240,7 @@
                 <w:noProof/>
                 <w:webHidden/>
               </w:rPr>
-              <w:instrText xml:space="preserve"> PAGEREF _Toc243589094 \h </w:instrText>
+              <w:instrText xml:space="preserve"> PAGEREF _Toc243589985 \h </w:instrText>
             </w:r>
             <w:r>
               <w:rPr>
@@ -2285,7 +2285,7 @@
               <w:tab w:val="right" w:leader="dot" w:pos="9016"/>
             </w:tabs>
             <w:rPr>
-              <w:ins w:id="26" w:author="kyle O'Reilly" w:date="2026-10-22T19:17:00Z" w16du:dateUtc="2026-10-22T18:17:00Z"/>
+              <w:ins w:id="26" w:author="kyle O'Reilly" w:date="2026-10-22T19:32:00Z" w16du:dateUtc="2026-10-22T18:32:00Z"/>
               <w:rFonts w:asciiTheme="minorHAnsi" w:eastAsiaTheme="minorEastAsia" w:hAnsiTheme="minorHAnsi" w:cstheme="minorBidi"/>
               <w:noProof/>
               <w:kern w:val="2"/>
@@ -2294,7 +2294,7 @@
               <w14:ligatures w14:val="standardContextual"/>
             </w:rPr>
           </w:pPr>
-          <w:ins w:id="27" w:author="kyle O'Reilly" w:date="2026-10-22T19:17:00Z" w16du:dateUtc="2026-10-22T18:17:00Z">
+          <w:ins w:id="27" w:author="kyle O'Reilly" w:date="2026-10-22T19:32:00Z" w16du:dateUtc="2026-10-22T18:32:00Z">
             <w:r>
               <w:rPr>
                 <w:rStyle w:val="Hyperlink"/>
@@ -2313,7 +2313,7 @@
               <w:rPr>
                 <w:noProof/>
               </w:rPr>
-              <w:instrText>HYPERLINK \l "_Toc243589095"</w:instrText>
+              <w:instrText>HYPERLINK \l "_Toc243589986"</w:instrText>
             </w:r>
             <w:r>
               <w:rPr>
@@ -2361,7 +2361,7 @@
                 <w:noProof/>
                 <w:webHidden/>
               </w:rPr>
-              <w:instrText xml:space="preserve"> PAGEREF _Toc243589095 \h </w:instrText>
+              <w:instrText xml:space="preserve"> PAGEREF _Toc243589986 \h </w:instrText>
             </w:r>
             <w:r>
               <w:rPr>
@@ -2406,7 +2406,7 @@
               <w:tab w:val="right" w:leader="dot" w:pos="9016"/>
             </w:tabs>
             <w:rPr>
-              <w:ins w:id="28" w:author="kyle O'Reilly" w:date="2026-10-22T19:17:00Z" w16du:dateUtc="2026-10-22T18:17:00Z"/>
+              <w:ins w:id="28" w:author="kyle O'Reilly" w:date="2026-10-22T19:32:00Z" w16du:dateUtc="2026-10-22T18:32:00Z"/>
               <w:rFonts w:asciiTheme="minorHAnsi" w:eastAsiaTheme="minorEastAsia" w:hAnsiTheme="minorHAnsi" w:cstheme="minorBidi"/>
               <w:noProof/>
               <w:kern w:val="2"/>
@@ -2415,7 +2415,7 @@
               <w14:ligatures w14:val="standardContextual"/>
             </w:rPr>
           </w:pPr>
-          <w:ins w:id="29" w:author="kyle O'Reilly" w:date="2026-10-22T19:17:00Z" w16du:dateUtc="2026-10-22T18:17:00Z">
+          <w:ins w:id="29" w:author="kyle O'Reilly" w:date="2026-10-22T19:32:00Z" w16du:dateUtc="2026-10-22T18:32:00Z">
             <w:r>
               <w:rPr>
                 <w:rStyle w:val="Hyperlink"/>
@@ -2434,7 +2434,7 @@
               <w:rPr>
                 <w:noProof/>
               </w:rPr>
-              <w:instrText>HYPERLINK \l "_Toc243589096"</w:instrText>
+              <w:instrText>HYPERLINK \l "_Toc243589987"</w:instrText>
             </w:r>
             <w:r>
               <w:rPr>
@@ -2482,7 +2482,7 @@
                 <w:noProof/>
                 <w:webHidden/>
               </w:rPr>
-              <w:instrText xml:space="preserve"> PAGEREF _Toc243589096 \h </w:instrText>
+              <w:instrText xml:space="preserve"> PAGEREF _Toc243589987 \h </w:instrText>
             </w:r>
             <w:r>
               <w:rPr>
@@ -2659,7 +2659,7 @@
           </w:pPr>
         </w:pPrChange>
       </w:pPr>
-      <w:bookmarkStart w:id="43" w:name="_Toc243589086"/>
+      <w:bookmarkStart w:id="43" w:name="_Toc243589977"/>
       <w:ins w:id="44" w:author="kyle O'Reilly" w:date="2026-10-20T21:25:00Z" w16du:dateUtc="2026-10-20T20:25:00Z">
         <w:r>
           <w:lastRenderedPageBreak/>
@@ -2739,7 +2739,7 @@
           <w:ins w:id="52" w:author="kyle O'Reilly" w:date="2026-10-21T20:39:00Z" w16du:dateUtc="2026-10-21T19:39:00Z"/>
         </w:rPr>
       </w:pPr>
-      <w:bookmarkStart w:id="53" w:name="_Toc243589087"/>
+      <w:bookmarkStart w:id="53" w:name="_Toc243589978"/>
       <w:ins w:id="54" w:author="kyle O'Reilly" w:date="2026-10-21T20:28:00Z" w16du:dateUtc="2026-10-21T19:28:00Z">
         <w:r>
           <w:t>2. Introduction</w:t>
@@ -2781,7 +2781,7 @@
           <w:pPr/>
         </w:pPrChange>
       </w:pPr>
-      <w:bookmarkStart w:id="61" w:name="_Toc243589088"/>
+      <w:bookmarkStart w:id="61" w:name="_Toc243589979"/>
       <w:ins w:id="62" w:author="kyle O'Reilly" w:date="2026-10-21T20:39:00Z" w16du:dateUtc="2026-10-21T19:39:00Z">
         <w:r>
           <w:t>3. Problem Definition</w:t>
@@ -2823,7 +2823,7 @@
           <w:pPr/>
         </w:pPrChange>
       </w:pPr>
-      <w:bookmarkStart w:id="68" w:name="_Toc243589089"/>
+      <w:bookmarkStart w:id="68" w:name="_Toc243589980"/>
       <w:ins w:id="69" w:author="kyle O'Reilly" w:date="2026-10-21T20:39:00Z" w16du:dateUtc="2026-10-21T19:39:00Z">
         <w:r>
           <w:t>4. Aim</w:t>
@@ -3273,7 +3273,7 @@
           <w:pPr/>
         </w:pPrChange>
       </w:pPr>
-      <w:bookmarkStart w:id="137" w:name="_Toc243589090"/>
+      <w:bookmarkStart w:id="137" w:name="_Toc243589981"/>
       <w:ins w:id="138" w:author="kyle O'Reilly" w:date="2026-10-21T20:40:00Z" w16du:dateUtc="2026-10-21T19:40:00Z">
         <w:r>
           <w:t>5. Project Scope</w:t>
@@ -3459,7 +3459,7 @@
           <w:pPr/>
         </w:pPrChange>
       </w:pPr>
-      <w:bookmarkStart w:id="167" w:name="_Toc243589091"/>
+      <w:bookmarkStart w:id="167" w:name="_Toc243589982"/>
       <w:ins w:id="168" w:author="kyle O'Reilly" w:date="2026-10-22T19:17:00Z" w16du:dateUtc="2026-10-22T18:17:00Z">
         <w:r>
           <w:t xml:space="preserve">6. </w:t>
@@ -3503,7 +3503,7 @@
           <w:pPr/>
         </w:pPrChange>
       </w:pPr>
-      <w:bookmarkStart w:id="175" w:name="_Toc243589092"/>
+      <w:bookmarkStart w:id="175" w:name="_Toc243589983"/>
       <w:ins w:id="176" w:author="kyle O'Reilly" w:date="2026-10-21T20:41:00Z" w16du:dateUtc="2026-10-21T19:41:00Z">
         <w:r>
           <w:t xml:space="preserve">7. </w:t>
@@ -3886,7 +3886,7 @@
           <w:pPr/>
         </w:pPrChange>
       </w:pPr>
-      <w:bookmarkStart w:id="246" w:name="_Toc243589093"/>
+      <w:bookmarkStart w:id="246" w:name="_Toc243589984"/>
       <w:ins w:id="247" w:author="kyle O'Reilly" w:date="2026-10-21T20:41:00Z" w16du:dateUtc="2026-10-21T19:41:00Z">
         <w:r>
           <w:t>8. Expected Deliverables</w:t>
@@ -3966,7 +3966,7 @@
           <w:pPr/>
         </w:pPrChange>
       </w:pPr>
-      <w:bookmarkStart w:id="259" w:name="_Toc243589094"/>
+      <w:bookmarkStart w:id="259" w:name="_Toc243589985"/>
       <w:ins w:id="260" w:author="kyle O'Reilly" w:date="2026-10-21T20:41:00Z" w16du:dateUtc="2026-10-21T19:41:00Z">
         <w:r>
           <w:t>9. Project Timeline</w:t>
@@ -4163,7 +4163,7 @@
           <w:pPr/>
         </w:pPrChange>
       </w:pPr>
-      <w:bookmarkStart w:id="283" w:name="_Toc243589095"/>
+      <w:bookmarkStart w:id="283" w:name="_Toc243589986"/>
       <w:ins w:id="284" w:author="kyle O'Reilly" w:date="2026-10-21T20:41:00Z" w16du:dateUtc="2026-10-21T19:41:00Z">
         <w:r>
           <w:t>10. Ethical and Legal Considerations</w:t>
@@ -4437,7 +4437,7 @@
           <w:pPr/>
         </w:pPrChange>
       </w:pPr>
-      <w:bookmarkStart w:id="331" w:name="_Toc243589096"/>
+      <w:bookmarkStart w:id="331" w:name="_Toc243589987"/>
       <w:ins w:id="332" w:author="kyle O'Reilly" w:date="2026-10-21T20:42:00Z" w16du:dateUtc="2026-10-21T19:42:00Z">
         <w:r>
           <w:t>References</w:t>

</xml_diff>

<commit_message>
Completed Problem Definition section
</commit_message>
<xml_diff>
--- a/HDSDAB - Strategic Thinking - Capstone Project.docx
+++ b/HDSDAB - Strategic Thinking - Capstone Project.docx
@@ -814,23 +814,7 @@
                                 <w:color w:val="000000"/>
                                 <w:sz w:val="28"/>
                               </w:rPr>
-                              <w:t xml:space="preserve">By submitting this assessment, I confirm that I have read the CCT policy on academic misconduct and understand the implications of submitting work that is not my own or does not appropriately reference material </w:t>
-                            </w:r>
-                            <w:proofErr w:type="gramStart"/>
-                            <w:r>
-                              <w:rPr>
-                                <w:color w:val="000000"/>
-                                <w:sz w:val="28"/>
-                              </w:rPr>
-                              <w:t>taken</w:t>
-                            </w:r>
-                            <w:proofErr w:type="gramEnd"/>
-                            <w:r>
-                              <w:rPr>
-                                <w:color w:val="000000"/>
-                                <w:sz w:val="28"/>
-                              </w:rPr>
-                              <w:t xml:space="preserve"> from a third party or other source. </w:t>
+                              <w:t xml:space="preserve">By submitting this assessment, I confirm that I have read the CCT policy on academic misconduct and understand the implications of submitting work that is not my own or does not appropriately reference material taken from a third party or other source. </w:t>
                             </w:r>
                           </w:p>
                           <w:p>
@@ -924,23 +908,7 @@
                           <w:color w:val="000000"/>
                           <w:sz w:val="28"/>
                         </w:rPr>
-                        <w:t xml:space="preserve">By submitting this assessment, I confirm that I have read the CCT policy on academic misconduct and understand the implications of submitting work that is not my own or does not appropriately reference material </w:t>
-                      </w:r>
-                      <w:proofErr w:type="gramStart"/>
-                      <w:r>
-                        <w:rPr>
-                          <w:color w:val="000000"/>
-                          <w:sz w:val="28"/>
-                        </w:rPr>
-                        <w:t>taken</w:t>
-                      </w:r>
-                      <w:proofErr w:type="gramEnd"/>
-                      <w:r>
-                        <w:rPr>
-                          <w:color w:val="000000"/>
-                          <w:sz w:val="28"/>
-                        </w:rPr>
-                        <w:t xml:space="preserve"> from a third party or other source. </w:t>
+                        <w:t xml:space="preserve">By submitting this assessment, I confirm that I have read the CCT policy on academic misconduct and understand the implications of submitting work that is not my own or does not appropriately reference material taken from a third party or other source. </w:t>
                       </w:r>
                     </w:p>
                     <w:p>
@@ -3097,15 +3065,184 @@
       <w:pPr>
         <w:spacing w:line="360" w:lineRule="auto"/>
         <w:rPr>
-          <w:ins w:id="107" w:author="kyle O'Reilly" w:date="2026-10-22T21:21:00Z" w16du:dateUtc="2026-10-22T20:21:00Z"/>
-        </w:rPr>
-        <w:pPrChange w:id="108" w:author="kyle O'Reilly" w:date="2026-10-22T21:22:00Z" w16du:dateUtc="2026-10-22T20:22:00Z">
+          <w:ins w:id="107" w:author="kyle O'Reilly" w:date="2026-10-22T23:05:00Z" w16du:dateUtc="2026-10-22T22:05:00Z"/>
+        </w:rPr>
+      </w:pPr>
+      <w:ins w:id="108" w:author="kyle O'Reilly" w:date="2026-10-22T23:03:00Z" w16du:dateUtc="2026-10-22T22:03:00Z">
+        <w:r>
+          <w:t>Predicting future stock closing prices is</w:t>
+        </w:r>
+      </w:ins>
+      <w:ins w:id="109" w:author="kyle O'Reilly" w:date="2026-10-22T23:04:00Z" w16du:dateUtc="2026-10-22T22:04:00Z">
+        <w:r>
+          <w:t xml:space="preserve"> challenging due to market volatility, uncertainty and the unpredictable nature if financial data. Historical stock prices often contain </w:t>
+        </w:r>
+      </w:ins>
+      <w:ins w:id="110" w:author="kyle O'Reilly" w:date="2026-10-22T23:05:00Z" w16du:dateUtc="2026-10-22T22:05:00Z">
+        <w:r>
+          <w:t>noise</w:t>
+        </w:r>
+      </w:ins>
+      <w:ins w:id="111" w:author="kyle O'Reilly" w:date="2026-10-22T23:04:00Z" w16du:dateUtc="2026-10-22T22:04:00Z">
+        <w:r>
+          <w:t xml:space="preserve"> and non-linear patterns, making accurate </w:t>
+        </w:r>
+      </w:ins>
+      <w:ins w:id="112" w:author="kyle O'Reilly" w:date="2026-10-22T23:05:00Z" w16du:dateUtc="2026-10-22T22:05:00Z">
+        <w:r>
+          <w:t>forecasting difficult (</w:t>
+        </w:r>
+        <w:proofErr w:type="spellStart"/>
+        <w:r>
+          <w:t>Khuwaja</w:t>
+        </w:r>
+        <w:proofErr w:type="spellEnd"/>
+        <w:r>
+          <w:t xml:space="preserve"> et al., 2020).</w:t>
+        </w:r>
+      </w:ins>
+    </w:p>
+    <w:p>
+      <w:pPr>
+        <w:spacing w:line="360" w:lineRule="auto"/>
+        <w:rPr>
+          <w:ins w:id="113" w:author="kyle O'Reilly" w:date="2026-10-22T23:06:00Z" w16du:dateUtc="2026-10-22T22:06:00Z"/>
+        </w:rPr>
+      </w:pPr>
+      <w:ins w:id="114" w:author="kyle O'Reilly" w:date="2026-10-22T23:05:00Z" w16du:dateUtc="2026-10-22T22:05:00Z">
+        <w:r>
+          <w:t xml:space="preserve">Although machine learning models are used in stock market forecasting, their accuracy can vary </w:t>
+        </w:r>
+      </w:ins>
+      <w:ins w:id="115" w:author="kyle O'Reilly" w:date="2026-10-22T23:07:00Z" w16du:dateUtc="2026-10-22T22:07:00Z">
+        <w:r>
+          <w:t>depending</w:t>
+        </w:r>
+      </w:ins>
+      <w:ins w:id="116" w:author="kyle O'Reilly" w:date="2026-10-22T23:05:00Z" w16du:dateUtc="2026-10-22T22:05:00Z">
+        <w:r>
+          <w:t xml:space="preserve"> on the model and market conditions. Indra et al. </w:t>
+        </w:r>
+      </w:ins>
+      <w:ins w:id="117" w:author="kyle O'Reilly" w:date="2026-10-22T23:06:00Z" w16du:dateUtc="2026-10-22T22:06:00Z">
+        <w:r>
+          <w:t>(2025) highlight the importance of comparing different machine approaches to evaluate their predictive performance.</w:t>
+        </w:r>
+      </w:ins>
+    </w:p>
+    <w:p>
+      <w:pPr>
+        <w:spacing w:line="360" w:lineRule="auto"/>
+        <w:rPr>
+          <w:ins w:id="118" w:author="kyle O'Reilly" w:date="2026-10-22T23:07:00Z" w16du:dateUtc="2026-10-22T22:07:00Z"/>
+        </w:rPr>
+      </w:pPr>
+      <w:ins w:id="119" w:author="kyle O'Reilly" w:date="2026-10-22T23:06:00Z" w16du:dateUtc="2026-10-22T22:06:00Z">
+        <w:r>
+          <w:t xml:space="preserve">This Capstone Project investigates whether Linear Regression, Random Forest Regressor can </w:t>
+        </w:r>
+      </w:ins>
+      <w:ins w:id="120" w:author="kyle O'Reilly" w:date="2026-10-22T23:07:00Z" w16du:dateUtc="2026-10-22T22:07:00Z">
+        <w:r>
+          <w:t>accurately</w:t>
+        </w:r>
+      </w:ins>
+      <w:ins w:id="121" w:author="kyle O'Reilly" w:date="2026-10-22T23:06:00Z" w16du:dateUtc="2026-10-22T22:06:00Z">
+        <w:r>
+          <w:t xml:space="preserve"> </w:t>
+        </w:r>
+        <w:r>
+          <w:t>predict stock closing pric</w:t>
+        </w:r>
+      </w:ins>
+      <w:ins w:id="122" w:author="kyle O'Reilly" w:date="2026-10-22T23:07:00Z" w16du:dateUtc="2026-10-22T22:07:00Z">
+        <w:r>
+          <w:t>es 20 trading days ahead, compared with a naïve time-series forecasting baseline.</w:t>
+        </w:r>
+      </w:ins>
+    </w:p>
+    <w:p>
+      <w:pPr>
+        <w:spacing w:line="360" w:lineRule="auto"/>
+        <w:rPr>
+          <w:ins w:id="123" w:author="kyle O'Reilly" w:date="2026-10-22T21:21:00Z" w16du:dateUtc="2026-10-22T20:21:00Z"/>
+        </w:rPr>
+        <w:pPrChange w:id="124" w:author="kyle O'Reilly" w:date="2026-10-22T21:22:00Z" w16du:dateUtc="2026-10-22T20:22:00Z">
           <w:pPr/>
         </w:pPrChange>
       </w:pPr>
-      <w:ins w:id="109" w:author="kyle O'Reilly" w:date="2026-10-21T20:39:00Z" w16du:dateUtc="2026-10-21T19:39:00Z">
-        <w:r>
-          <w:t>?</w:t>
+      <w:ins w:id="125" w:author="kyle O'Reilly" w:date="2026-10-22T23:07:00Z" w16du:dateUtc="2026-10-22T22:07:00Z">
+        <w:r>
+          <w:t xml:space="preserve">The </w:t>
+        </w:r>
+      </w:ins>
+      <w:ins w:id="126" w:author="kyle O'Reilly" w:date="2026-10-22T23:08:00Z" w16du:dateUtc="2026-10-22T22:08:00Z">
+        <w:r>
+          <w:t xml:space="preserve">research </w:t>
+        </w:r>
+      </w:ins>
+      <w:ins w:id="127" w:author="kyle O'Reilly" w:date="2026-10-22T23:07:00Z" w16du:dateUtc="2026-10-22T22:07:00Z">
+        <w:r>
+          <w:t xml:space="preserve">will examine JPMorgan Chase &amp; Co., Coca-Cola Co. and Intel Corp. to </w:t>
+        </w:r>
+      </w:ins>
+      <w:ins w:id="128" w:author="kyle O'Reilly" w:date="2026-10-22T23:08:00Z" w16du:dateUtc="2026-10-22T22:08:00Z">
+        <w:r>
+          <w:t>determine</w:t>
+        </w:r>
+      </w:ins>
+      <w:ins w:id="129" w:author="kyle O'Reilly" w:date="2026-10-22T23:07:00Z" w16du:dateUtc="2026-10-22T22:07:00Z">
+        <w:r>
+          <w:t xml:space="preserve"> </w:t>
+        </w:r>
+      </w:ins>
+      <w:ins w:id="130" w:author="kyle O'Reilly" w:date="2026-10-22T23:08:00Z" w16du:dateUtc="2026-10-22T22:08:00Z">
+        <w:r>
+          <w:t>whether</w:t>
+        </w:r>
+      </w:ins>
+      <w:ins w:id="131" w:author="kyle O'Reilly" w:date="2026-10-22T23:07:00Z" w16du:dateUtc="2026-10-22T22:07:00Z">
+        <w:r>
+          <w:t xml:space="preserve"> </w:t>
+        </w:r>
+      </w:ins>
+      <w:ins w:id="132" w:author="kyle O'Reilly" w:date="2026-10-22T23:08:00Z" w16du:dateUtc="2026-10-22T22:08:00Z">
+        <w:r>
+          <w:t>forecasting</w:t>
+        </w:r>
+      </w:ins>
+      <w:ins w:id="133" w:author="kyle O'Reilly" w:date="2026-10-22T23:07:00Z" w16du:dateUtc="2026-10-22T22:07:00Z">
+        <w:r>
+          <w:t xml:space="preserve"> </w:t>
+        </w:r>
+      </w:ins>
+      <w:ins w:id="134" w:author="kyle O'Reilly" w:date="2026-10-22T23:08:00Z" w16du:dateUtc="2026-10-22T22:08:00Z">
+        <w:r>
+          <w:t>errors</w:t>
+        </w:r>
+        <w:r>
+          <w:t xml:space="preserve"> differ across </w:t>
+        </w:r>
+        <w:r>
+          <w:t xml:space="preserve">stocks with different volatility </w:t>
+        </w:r>
+        <w:r>
+          <w:t xml:space="preserve">levels and whether machine learning models </w:t>
+        </w:r>
+      </w:ins>
+      <w:ins w:id="135" w:author="kyle O'Reilly" w:date="2026-10-22T23:09:00Z" w16du:dateUtc="2026-10-22T22:09:00Z">
+        <w:r>
+          <w:t>outperform</w:t>
+        </w:r>
+      </w:ins>
+      <w:ins w:id="136" w:author="kyle O'Reilly" w:date="2026-10-22T23:08:00Z" w16du:dateUtc="2026-10-22T22:08:00Z">
+        <w:r>
+          <w:t xml:space="preserve"> the simpler base</w:t>
+        </w:r>
+      </w:ins>
+      <w:ins w:id="137" w:author="kyle O'Reilly" w:date="2026-10-22T23:09:00Z" w16du:dateUtc="2026-10-22T22:09:00Z">
+        <w:r>
+          <w:t>line.</w:t>
         </w:r>
       </w:ins>
     </w:p>
@@ -3113,9 +3250,9 @@
       <w:pPr>
         <w:spacing w:line="360" w:lineRule="auto"/>
         <w:rPr>
-          <w:ins w:id="110" w:author="kyle O'Reilly" w:date="2026-10-21T20:39:00Z" w16du:dateUtc="2026-10-21T19:39:00Z"/>
-        </w:rPr>
-        <w:pPrChange w:id="111" w:author="kyle O'Reilly" w:date="2026-10-22T21:22:00Z" w16du:dateUtc="2026-10-22T20:22:00Z">
+          <w:ins w:id="138" w:author="kyle O'Reilly" w:date="2026-10-21T20:39:00Z" w16du:dateUtc="2026-10-21T19:39:00Z"/>
+        </w:rPr>
+        <w:pPrChange w:id="139" w:author="kyle O'Reilly" w:date="2026-10-22T21:22:00Z" w16du:dateUtc="2026-10-22T20:22:00Z">
           <w:pPr/>
         </w:pPrChange>
       </w:pPr>
@@ -3126,23 +3263,23 @@
         <w:spacing w:line="360" w:lineRule="auto"/>
         <w:jc w:val="both"/>
         <w:rPr>
-          <w:ins w:id="112" w:author="kyle O'Reilly" w:date="2026-10-21T20:40:00Z" w16du:dateUtc="2026-10-21T19:40:00Z"/>
-        </w:rPr>
-        <w:pPrChange w:id="113" w:author="kyle O'Reilly" w:date="2026-10-22T21:22:00Z" w16du:dateUtc="2026-10-22T20:22:00Z">
+          <w:ins w:id="140" w:author="kyle O'Reilly" w:date="2026-10-21T20:40:00Z" w16du:dateUtc="2026-10-21T19:40:00Z"/>
+        </w:rPr>
+        <w:pPrChange w:id="141" w:author="kyle O'Reilly" w:date="2026-10-22T21:22:00Z" w16du:dateUtc="2026-10-22T20:22:00Z">
           <w:pPr/>
         </w:pPrChange>
       </w:pPr>
-      <w:bookmarkStart w:id="114" w:name="_Toc243601431"/>
-      <w:ins w:id="115" w:author="kyle O'Reilly" w:date="2026-10-21T20:39:00Z" w16du:dateUtc="2026-10-21T19:39:00Z">
+      <w:bookmarkStart w:id="142" w:name="_Toc243601431"/>
+      <w:ins w:id="143" w:author="kyle O'Reilly" w:date="2026-10-21T20:39:00Z" w16du:dateUtc="2026-10-21T19:39:00Z">
         <w:r>
           <w:t>4. Aim</w:t>
         </w:r>
       </w:ins>
-      <w:ins w:id="116" w:author="kyle O'Reilly" w:date="2026-10-21T20:40:00Z" w16du:dateUtc="2026-10-21T19:40:00Z">
+      <w:ins w:id="144" w:author="kyle O'Reilly" w:date="2026-10-21T20:40:00Z" w16du:dateUtc="2026-10-21T19:40:00Z">
         <w:r>
           <w:t>, Objectives and Hypothesis</w:t>
         </w:r>
-        <w:bookmarkEnd w:id="114"/>
+        <w:bookmarkEnd w:id="142"/>
         <w:r>
           <w:t xml:space="preserve"> </w:t>
         </w:r>
@@ -3153,18 +3290,18 @@
         <w:spacing w:line="360" w:lineRule="auto"/>
         <w:jc w:val="both"/>
         <w:rPr>
-          <w:ins w:id="117" w:author="kyle O'Reilly" w:date="2026-10-21T23:16:00Z" w16du:dateUtc="2026-10-21T22:16:00Z"/>
-        </w:rPr>
-        <w:pPrChange w:id="118" w:author="kyle O'Reilly" w:date="2026-10-22T21:22:00Z" w16du:dateUtc="2026-10-22T20:22:00Z">
+          <w:ins w:id="145" w:author="kyle O'Reilly" w:date="2026-10-21T23:16:00Z" w16du:dateUtc="2026-10-21T22:16:00Z"/>
+        </w:rPr>
+        <w:pPrChange w:id="146" w:author="kyle O'Reilly" w:date="2026-10-22T21:22:00Z" w16du:dateUtc="2026-10-22T20:22:00Z">
           <w:pPr/>
         </w:pPrChange>
       </w:pPr>
-      <w:ins w:id="119" w:author="kyle O'Reilly" w:date="2026-10-21T23:10:00Z" w16du:dateUtc="2026-10-21T22:10:00Z">
+      <w:ins w:id="147" w:author="kyle O'Reilly" w:date="2026-10-21T23:10:00Z" w16du:dateUtc="2026-10-21T22:10:00Z">
         <w:r>
           <w:rPr>
             <w:b/>
             <w:bCs/>
-            <w:rPrChange w:id="120" w:author="kyle O'Reilly" w:date="2026-10-21T23:11:00Z" w16du:dateUtc="2026-10-21T22:11:00Z">
+            <w:rPrChange w:id="148" w:author="kyle O'Reilly" w:date="2026-10-21T23:11:00Z" w16du:dateUtc="2026-10-21T22:11:00Z">
               <w:rPr/>
             </w:rPrChange>
           </w:rPr>
@@ -3180,33 +3317,33 @@
         <w:spacing w:line="360" w:lineRule="auto"/>
         <w:jc w:val="both"/>
         <w:rPr>
-          <w:ins w:id="121" w:author="kyle O'Reilly" w:date="2026-10-21T23:11:00Z" w16du:dateUtc="2026-10-21T22:11:00Z"/>
-        </w:rPr>
-        <w:pPrChange w:id="122" w:author="kyle O'Reilly" w:date="2026-10-22T21:22:00Z" w16du:dateUtc="2026-10-22T20:22:00Z">
+          <w:ins w:id="149" w:author="kyle O'Reilly" w:date="2026-10-21T23:11:00Z" w16du:dateUtc="2026-10-21T22:11:00Z"/>
+        </w:rPr>
+        <w:pPrChange w:id="150" w:author="kyle O'Reilly" w:date="2026-10-22T21:22:00Z" w16du:dateUtc="2026-10-22T20:22:00Z">
           <w:pPr/>
         </w:pPrChange>
       </w:pPr>
-      <w:ins w:id="123" w:author="kyle O'Reilly" w:date="2026-10-21T23:10:00Z" w16du:dateUtc="2026-10-21T22:10:00Z">
+      <w:ins w:id="151" w:author="kyle O'Reilly" w:date="2026-10-21T23:10:00Z" w16du:dateUtc="2026-10-21T22:10:00Z">
         <w:r>
           <w:t xml:space="preserve">To compare the accuracy of Linear Regression, Random Forest and a </w:t>
         </w:r>
       </w:ins>
-      <w:ins w:id="124" w:author="kyle O'Reilly" w:date="2026-10-21T23:14:00Z" w16du:dateUtc="2026-10-21T22:14:00Z">
+      <w:ins w:id="152" w:author="kyle O'Reilly" w:date="2026-10-21T23:14:00Z" w16du:dateUtc="2026-10-21T22:14:00Z">
         <w:r>
           <w:t>n</w:t>
         </w:r>
       </w:ins>
-      <w:ins w:id="125" w:author="kyle O'Reilly" w:date="2026-10-21T23:10:00Z" w16du:dateUtc="2026-10-21T22:10:00Z">
+      <w:ins w:id="153" w:author="kyle O'Reilly" w:date="2026-10-21T23:10:00Z" w16du:dateUtc="2026-10-21T22:10:00Z">
         <w:r>
           <w:t xml:space="preserve">aïve </w:t>
         </w:r>
       </w:ins>
-      <w:ins w:id="126" w:author="kyle O'Reilly" w:date="2026-10-21T23:14:00Z" w16du:dateUtc="2026-10-21T22:14:00Z">
+      <w:ins w:id="154" w:author="kyle O'Reilly" w:date="2026-10-21T23:14:00Z" w16du:dateUtc="2026-10-21T22:14:00Z">
         <w:r>
           <w:t>b</w:t>
         </w:r>
       </w:ins>
-      <w:ins w:id="127" w:author="kyle O'Reilly" w:date="2026-10-21T23:10:00Z" w16du:dateUtc="2026-10-21T22:10:00Z">
+      <w:ins w:id="155" w:author="kyle O'Reilly" w:date="2026-10-21T23:10:00Z" w16du:dateUtc="2026-10-21T22:10:00Z">
         <w:r>
           <w:t xml:space="preserve">aseline when predicting stock </w:t>
         </w:r>
@@ -3214,37 +3351,37 @@
           <w:t xml:space="preserve">prices twenty </w:t>
         </w:r>
       </w:ins>
-      <w:ins w:id="128" w:author="kyle O'Reilly" w:date="2026-10-22T00:14:00Z" w16du:dateUtc="2026-10-21T23:14:00Z">
+      <w:ins w:id="156" w:author="kyle O'Reilly" w:date="2026-10-22T00:14:00Z" w16du:dateUtc="2026-10-21T23:14:00Z">
         <w:r>
           <w:t xml:space="preserve">trading </w:t>
         </w:r>
       </w:ins>
-      <w:ins w:id="129" w:author="kyle O'Reilly" w:date="2026-10-21T23:10:00Z" w16du:dateUtc="2026-10-21T22:10:00Z">
+      <w:ins w:id="157" w:author="kyle O'Reilly" w:date="2026-10-21T23:10:00Z" w16du:dateUtc="2026-10-21T22:10:00Z">
         <w:r>
           <w:t xml:space="preserve">days after one </w:t>
         </w:r>
       </w:ins>
-      <w:ins w:id="130" w:author="kyle O'Reilly" w:date="2026-10-21T23:11:00Z" w16du:dateUtc="2026-10-21T22:11:00Z">
+      <w:ins w:id="158" w:author="kyle O'Reilly" w:date="2026-10-21T23:11:00Z" w16du:dateUtc="2026-10-21T22:11:00Z">
         <w:r>
           <w:t>historical cut-off stock date from the JPM</w:t>
         </w:r>
       </w:ins>
-      <w:ins w:id="131" w:author="kyle O'Reilly" w:date="2026-10-22T00:04:00Z" w16du:dateUtc="2026-10-21T23:04:00Z">
+      <w:ins w:id="159" w:author="kyle O'Reilly" w:date="2026-10-22T00:04:00Z" w16du:dateUtc="2026-10-21T23:04:00Z">
         <w:r>
           <w:t>.US</w:t>
         </w:r>
       </w:ins>
-      <w:ins w:id="132" w:author="kyle O'Reilly" w:date="2026-10-21T23:11:00Z" w16du:dateUtc="2026-10-21T22:11:00Z">
+      <w:ins w:id="160" w:author="kyle O'Reilly" w:date="2026-10-21T23:11:00Z" w16du:dateUtc="2026-10-21T22:11:00Z">
         <w:r>
           <w:t>, KO</w:t>
         </w:r>
       </w:ins>
-      <w:ins w:id="133" w:author="kyle O'Reilly" w:date="2026-10-22T00:04:00Z" w16du:dateUtc="2026-10-21T23:04:00Z">
+      <w:ins w:id="161" w:author="kyle O'Reilly" w:date="2026-10-22T00:04:00Z" w16du:dateUtc="2026-10-21T23:04:00Z">
         <w:r>
           <w:t>.US</w:t>
         </w:r>
       </w:ins>
-      <w:ins w:id="134" w:author="kyle O'Reilly" w:date="2026-10-21T23:11:00Z" w16du:dateUtc="2026-10-21T22:11:00Z">
+      <w:ins w:id="162" w:author="kyle O'Reilly" w:date="2026-10-21T23:11:00Z" w16du:dateUtc="2026-10-21T22:11:00Z">
         <w:r>
           <w:t xml:space="preserve"> and </w:t>
         </w:r>
@@ -3252,7 +3389,7 @@
           <w:t>INTC.</w:t>
         </w:r>
       </w:ins>
-      <w:ins w:id="135" w:author="kyle O'Reilly" w:date="2026-10-22T00:04:00Z" w16du:dateUtc="2026-10-21T23:04:00Z">
+      <w:ins w:id="163" w:author="kyle O'Reilly" w:date="2026-10-22T00:04:00Z" w16du:dateUtc="2026-10-21T23:04:00Z">
         <w:r>
           <w:t>US.</w:t>
         </w:r>
@@ -3263,25 +3400,25 @@
         <w:spacing w:line="360" w:lineRule="auto"/>
         <w:jc w:val="both"/>
         <w:rPr>
-          <w:ins w:id="136" w:author="kyle O'Reilly" w:date="2026-10-21T23:11:00Z" w16du:dateUtc="2026-10-21T22:11:00Z"/>
+          <w:ins w:id="164" w:author="kyle O'Reilly" w:date="2026-10-21T23:11:00Z" w16du:dateUtc="2026-10-21T22:11:00Z"/>
           <w:b/>
           <w:bCs/>
-          <w:rPrChange w:id="137" w:author="kyle O'Reilly" w:date="2026-10-21T23:16:00Z" w16du:dateUtc="2026-10-21T22:16:00Z">
+          <w:rPrChange w:id="165" w:author="kyle O'Reilly" w:date="2026-10-21T23:16:00Z" w16du:dateUtc="2026-10-21T22:16:00Z">
             <w:rPr>
-              <w:ins w:id="138" w:author="kyle O'Reilly" w:date="2026-10-21T23:11:00Z" w16du:dateUtc="2026-10-21T22:11:00Z"/>
+              <w:ins w:id="166" w:author="kyle O'Reilly" w:date="2026-10-21T23:11:00Z" w16du:dateUtc="2026-10-21T22:11:00Z"/>
             </w:rPr>
           </w:rPrChange>
         </w:rPr>
-        <w:pPrChange w:id="139" w:author="kyle O'Reilly" w:date="2026-10-22T21:22:00Z" w16du:dateUtc="2026-10-22T20:22:00Z">
+        <w:pPrChange w:id="167" w:author="kyle O'Reilly" w:date="2026-10-22T21:22:00Z" w16du:dateUtc="2026-10-22T20:22:00Z">
           <w:pPr/>
         </w:pPrChange>
       </w:pPr>
-      <w:ins w:id="140" w:author="kyle O'Reilly" w:date="2026-10-21T23:11:00Z" w16du:dateUtc="2026-10-21T22:11:00Z">
+      <w:ins w:id="168" w:author="kyle O'Reilly" w:date="2026-10-21T23:11:00Z" w16du:dateUtc="2026-10-21T22:11:00Z">
         <w:r>
           <w:rPr>
             <w:b/>
             <w:bCs/>
-            <w:rPrChange w:id="141" w:author="kyle O'Reilly" w:date="2026-10-21T23:16:00Z" w16du:dateUtc="2026-10-21T22:16:00Z">
+            <w:rPrChange w:id="169" w:author="kyle O'Reilly" w:date="2026-10-21T23:16:00Z" w16du:dateUtc="2026-10-21T22:16:00Z">
               <w:rPr/>
             </w:rPrChange>
           </w:rPr>
@@ -3299,9 +3436,9 @@
         <w:spacing w:line="360" w:lineRule="auto"/>
         <w:jc w:val="both"/>
         <w:rPr>
-          <w:ins w:id="142" w:author="kyle O'Reilly" w:date="2026-10-21T23:13:00Z" w16du:dateUtc="2026-10-21T22:13:00Z"/>
-        </w:rPr>
-        <w:pPrChange w:id="143" w:author="kyle O'Reilly" w:date="2026-10-22T21:22:00Z" w16du:dateUtc="2026-10-22T20:22:00Z">
+          <w:ins w:id="170" w:author="kyle O'Reilly" w:date="2026-10-21T23:13:00Z" w16du:dateUtc="2026-10-21T22:13:00Z"/>
+        </w:rPr>
+        <w:pPrChange w:id="171" w:author="kyle O'Reilly" w:date="2026-10-22T21:22:00Z" w16du:dateUtc="2026-10-22T20:22:00Z">
           <w:pPr>
             <w:pStyle w:val="ListParagraph"/>
             <w:numPr>
@@ -3311,22 +3448,22 @@
           </w:pPr>
         </w:pPrChange>
       </w:pPr>
-      <w:ins w:id="144" w:author="kyle O'Reilly" w:date="2026-10-21T23:11:00Z" w16du:dateUtc="2026-10-21T22:11:00Z">
+      <w:ins w:id="172" w:author="kyle O'Reilly" w:date="2026-10-21T23:11:00Z" w16du:dateUtc="2026-10-21T22:11:00Z">
         <w:r>
           <w:t>S</w:t>
         </w:r>
       </w:ins>
-      <w:ins w:id="145" w:author="kyle O'Reilly" w:date="2026-10-21T23:12:00Z" w16du:dateUtc="2026-10-21T22:12:00Z">
+      <w:ins w:id="173" w:author="kyle O'Reilly" w:date="2026-10-21T23:12:00Z" w16du:dateUtc="2026-10-21T22:12:00Z">
         <w:r>
           <w:t>elect JPM</w:t>
         </w:r>
       </w:ins>
-      <w:ins w:id="146" w:author="kyle O'Reilly" w:date="2026-10-21T23:57:00Z" w16du:dateUtc="2026-10-21T22:57:00Z">
+      <w:ins w:id="174" w:author="kyle O'Reilly" w:date="2026-10-21T23:57:00Z" w16du:dateUtc="2026-10-21T22:57:00Z">
         <w:r>
           <w:t>.US</w:t>
         </w:r>
       </w:ins>
-      <w:ins w:id="147" w:author="kyle O'Reilly" w:date="2026-10-21T23:12:00Z" w16du:dateUtc="2026-10-21T22:12:00Z">
+      <w:ins w:id="175" w:author="kyle O'Reilly" w:date="2026-10-21T23:12:00Z" w16du:dateUtc="2026-10-21T22:12:00Z">
         <w:r>
           <w:t>,</w:t>
         </w:r>
@@ -3334,37 +3471,37 @@
           <w:t xml:space="preserve"> KO</w:t>
         </w:r>
       </w:ins>
-      <w:ins w:id="148" w:author="kyle O'Reilly" w:date="2026-10-21T23:57:00Z" w16du:dateUtc="2026-10-21T22:57:00Z">
+      <w:ins w:id="176" w:author="kyle O'Reilly" w:date="2026-10-21T23:57:00Z" w16du:dateUtc="2026-10-21T22:57:00Z">
         <w:r>
           <w:t>.US</w:t>
         </w:r>
       </w:ins>
-      <w:ins w:id="149" w:author="kyle O'Reilly" w:date="2026-10-21T23:12:00Z" w16du:dateUtc="2026-10-21T22:12:00Z">
+      <w:ins w:id="177" w:author="kyle O'Reilly" w:date="2026-10-21T23:12:00Z" w16du:dateUtc="2026-10-21T22:12:00Z">
         <w:r>
           <w:t xml:space="preserve"> and INTC</w:t>
         </w:r>
       </w:ins>
-      <w:ins w:id="150" w:author="kyle O'Reilly" w:date="2026-10-21T23:57:00Z" w16du:dateUtc="2026-10-21T22:57:00Z">
+      <w:ins w:id="178" w:author="kyle O'Reilly" w:date="2026-10-21T23:57:00Z" w16du:dateUtc="2026-10-21T22:57:00Z">
         <w:r>
           <w:t>.US</w:t>
         </w:r>
       </w:ins>
-      <w:ins w:id="151" w:author="kyle O'Reilly" w:date="2026-10-21T23:12:00Z" w16du:dateUtc="2026-10-21T22:12:00Z">
+      <w:ins w:id="179" w:author="kyle O'Reilly" w:date="2026-10-21T23:12:00Z" w16du:dateUtc="2026-10-21T22:12:00Z">
         <w:r>
           <w:t>, and examine comparable published</w:t>
         </w:r>
       </w:ins>
-      <w:ins w:id="152" w:author="kyle O'Reilly" w:date="2026-10-21T23:58:00Z" w16du:dateUtc="2026-10-21T22:58:00Z">
+      <w:ins w:id="180" w:author="kyle O'Reilly" w:date="2026-10-21T23:58:00Z" w16du:dateUtc="2026-10-21T22:58:00Z">
         <w:r>
           <w:t xml:space="preserve"> Trading 212</w:t>
         </w:r>
       </w:ins>
-      <w:ins w:id="153" w:author="kyle O'Reilly" w:date="2026-10-21T23:12:00Z" w16du:dateUtc="2026-10-21T22:12:00Z">
+      <w:ins w:id="181" w:author="kyle O'Reilly" w:date="2026-10-21T23:12:00Z" w16du:dateUtc="2026-10-21T22:12:00Z">
         <w:r>
           <w:t xml:space="preserve"> volatility information to justify their proposed contra</w:t>
         </w:r>
       </w:ins>
-      <w:ins w:id="154" w:author="kyle O'Reilly" w:date="2026-10-21T23:13:00Z" w16du:dateUtc="2026-10-21T22:13:00Z">
+      <w:ins w:id="182" w:author="kyle O'Reilly" w:date="2026-10-21T23:13:00Z" w16du:dateUtc="2026-10-21T22:13:00Z">
         <w:r>
           <w:t>sting volatility levels.</w:t>
         </w:r>
@@ -3380,9 +3517,9 @@
         <w:spacing w:line="360" w:lineRule="auto"/>
         <w:jc w:val="both"/>
         <w:rPr>
-          <w:ins w:id="155" w:author="kyle O'Reilly" w:date="2026-10-21T23:14:00Z" w16du:dateUtc="2026-10-21T22:14:00Z"/>
-        </w:rPr>
-        <w:pPrChange w:id="156" w:author="kyle O'Reilly" w:date="2026-10-22T21:22:00Z" w16du:dateUtc="2026-10-22T20:22:00Z">
+          <w:ins w:id="183" w:author="kyle O'Reilly" w:date="2026-10-21T23:14:00Z" w16du:dateUtc="2026-10-21T22:14:00Z"/>
+        </w:rPr>
+        <w:pPrChange w:id="184" w:author="kyle O'Reilly" w:date="2026-10-22T21:22:00Z" w16du:dateUtc="2026-10-22T20:22:00Z">
           <w:pPr>
             <w:pStyle w:val="ListParagraph"/>
             <w:numPr>
@@ -3392,7 +3529,7 @@
           </w:pPr>
         </w:pPrChange>
       </w:pPr>
-      <w:ins w:id="157" w:author="kyle O'Reilly" w:date="2026-10-21T23:13:00Z" w16du:dateUtc="2026-10-21T22:13:00Z">
+      <w:ins w:id="185" w:author="kyle O'Reilly" w:date="2026-10-21T23:13:00Z" w16du:dateUtc="2026-10-21T22:13:00Z">
         <w:r>
           <w:t xml:space="preserve">Collect, clean and analyse historical stock data </w:t>
         </w:r>
@@ -3400,7 +3537,7 @@
           <w:t>from Stooq, and prepare simple historical</w:t>
         </w:r>
       </w:ins>
-      <w:ins w:id="158" w:author="kyle O'Reilly" w:date="2026-10-21T23:14:00Z" w16du:dateUtc="2026-10-21T22:14:00Z">
+      <w:ins w:id="186" w:author="kyle O'Reilly" w:date="2026-10-21T23:14:00Z" w16du:dateUtc="2026-10-21T22:14:00Z">
         <w:r>
           <w:t xml:space="preserve"> price features for the forecasting models.</w:t>
         </w:r>
@@ -3416,9 +3553,9 @@
         <w:spacing w:line="360" w:lineRule="auto"/>
         <w:jc w:val="both"/>
         <w:rPr>
-          <w:ins w:id="159" w:author="kyle O'Reilly" w:date="2026-10-21T23:14:00Z" w16du:dateUtc="2026-10-21T22:14:00Z"/>
-        </w:rPr>
-        <w:pPrChange w:id="160" w:author="kyle O'Reilly" w:date="2026-10-22T21:22:00Z" w16du:dateUtc="2026-10-22T20:22:00Z">
+          <w:ins w:id="187" w:author="kyle O'Reilly" w:date="2026-10-21T23:14:00Z" w16du:dateUtc="2026-10-21T22:14:00Z"/>
+        </w:rPr>
+        <w:pPrChange w:id="188" w:author="kyle O'Reilly" w:date="2026-10-22T21:22:00Z" w16du:dateUtc="2026-10-22T20:22:00Z">
           <w:pPr>
             <w:pStyle w:val="ListParagraph"/>
             <w:numPr>
@@ -3428,8 +3565,9 @@
           </w:pPr>
         </w:pPrChange>
       </w:pPr>
-      <w:ins w:id="161" w:author="kyle O'Reilly" w:date="2026-10-21T23:14:00Z" w16du:dateUtc="2026-10-21T22:14:00Z">
-        <w:r>
+      <w:ins w:id="189" w:author="kyle O'Reilly" w:date="2026-10-21T23:14:00Z" w16du:dateUtc="2026-10-21T22:14:00Z">
+        <w:r>
+          <w:lastRenderedPageBreak/>
           <w:t>Develop Linear Regression and Random Forest models and establish a naïve baseline for each selected stock.</w:t>
         </w:r>
       </w:ins>
@@ -3444,9 +3582,9 @@
         <w:spacing w:line="360" w:lineRule="auto"/>
         <w:jc w:val="both"/>
         <w:rPr>
-          <w:ins w:id="162" w:author="kyle O'Reilly" w:date="2026-10-21T23:15:00Z" w16du:dateUtc="2026-10-21T22:15:00Z"/>
-        </w:rPr>
-        <w:pPrChange w:id="163" w:author="kyle O'Reilly" w:date="2026-10-22T21:22:00Z" w16du:dateUtc="2026-10-22T20:22:00Z">
+          <w:ins w:id="190" w:author="kyle O'Reilly" w:date="2026-10-21T23:15:00Z" w16du:dateUtc="2026-10-21T22:15:00Z"/>
+        </w:rPr>
+        <w:pPrChange w:id="191" w:author="kyle O'Reilly" w:date="2026-10-22T21:22:00Z" w16du:dateUtc="2026-10-22T20:22:00Z">
           <w:pPr>
             <w:pStyle w:val="ListParagraph"/>
             <w:numPr>
@@ -3456,12 +3594,12 @@
           </w:pPr>
         </w:pPrChange>
       </w:pPr>
-      <w:ins w:id="164" w:author="kyle O'Reilly" w:date="2026-10-21T23:14:00Z" w16du:dateUtc="2026-10-21T22:14:00Z">
+      <w:ins w:id="192" w:author="kyle O'Reilly" w:date="2026-10-21T23:14:00Z" w16du:dateUtc="2026-10-21T22:14:00Z">
         <w:r>
           <w:t>Generate nine predic</w:t>
         </w:r>
       </w:ins>
-      <w:ins w:id="165" w:author="kyle O'Reilly" w:date="2026-10-21T23:15:00Z" w16du:dateUtc="2026-10-21T22:15:00Z">
+      <w:ins w:id="193" w:author="kyle O'Reilly" w:date="2026-10-21T23:15:00Z" w16du:dateUtc="2026-10-21T22:15:00Z">
         <w:r>
           <w:t>tions and compare them with three actual closing stock prices twenty days after the historical cut-off stock date.</w:t>
         </w:r>
@@ -3477,9 +3615,9 @@
         <w:spacing w:line="360" w:lineRule="auto"/>
         <w:jc w:val="both"/>
         <w:rPr>
-          <w:ins w:id="166" w:author="kyle O'Reilly" w:date="2026-10-21T23:16:00Z" w16du:dateUtc="2026-10-21T22:16:00Z"/>
-        </w:rPr>
-        <w:pPrChange w:id="167" w:author="kyle O'Reilly" w:date="2026-10-22T21:22:00Z" w16du:dateUtc="2026-10-22T20:22:00Z">
+          <w:ins w:id="194" w:author="kyle O'Reilly" w:date="2026-10-21T23:16:00Z" w16du:dateUtc="2026-10-21T22:16:00Z"/>
+        </w:rPr>
+        <w:pPrChange w:id="195" w:author="kyle O'Reilly" w:date="2026-10-22T21:22:00Z" w16du:dateUtc="2026-10-22T20:22:00Z">
           <w:pPr>
             <w:pStyle w:val="ListParagraph"/>
             <w:numPr>
@@ -3489,7 +3627,7 @@
           </w:pPr>
         </w:pPrChange>
       </w:pPr>
-      <w:ins w:id="168" w:author="kyle O'Reilly" w:date="2026-10-21T23:15:00Z" w16du:dateUtc="2026-10-21T22:15:00Z">
+      <w:ins w:id="196" w:author="kyle O'Reilly" w:date="2026-10-21T23:15:00Z" w16du:dateUtc="2026-10-21T22:15:00Z">
         <w:r>
           <w:t>Calculate individual prediction errors</w:t>
         </w:r>
@@ -3497,7 +3635,7 @@
           <w:t>, compare approaches and discuss observed difference between the s</w:t>
         </w:r>
       </w:ins>
-      <w:ins w:id="169" w:author="kyle O'Reilly" w:date="2026-10-21T23:16:00Z" w16du:dateUtc="2026-10-21T22:16:00Z">
+      <w:ins w:id="197" w:author="kyle O'Reilly" w:date="2026-10-21T23:16:00Z" w16du:dateUtc="2026-10-21T22:16:00Z">
         <w:r>
           <w:t>elected stocks.</w:t>
         </w:r>
@@ -3508,25 +3646,25 @@
         <w:spacing w:line="360" w:lineRule="auto"/>
         <w:jc w:val="both"/>
         <w:rPr>
-          <w:ins w:id="170" w:author="kyle O'Reilly" w:date="2026-10-21T23:16:00Z" w16du:dateUtc="2026-10-21T22:16:00Z"/>
+          <w:ins w:id="198" w:author="kyle O'Reilly" w:date="2026-10-21T23:16:00Z" w16du:dateUtc="2026-10-21T22:16:00Z"/>
           <w:b/>
           <w:bCs/>
-          <w:rPrChange w:id="171" w:author="kyle O'Reilly" w:date="2026-10-21T23:16:00Z" w16du:dateUtc="2026-10-21T22:16:00Z">
+          <w:rPrChange w:id="199" w:author="kyle O'Reilly" w:date="2026-10-21T23:16:00Z" w16du:dateUtc="2026-10-21T22:16:00Z">
             <w:rPr>
-              <w:ins w:id="172" w:author="kyle O'Reilly" w:date="2026-10-21T23:16:00Z" w16du:dateUtc="2026-10-21T22:16:00Z"/>
+              <w:ins w:id="200" w:author="kyle O'Reilly" w:date="2026-10-21T23:16:00Z" w16du:dateUtc="2026-10-21T22:16:00Z"/>
             </w:rPr>
           </w:rPrChange>
         </w:rPr>
-        <w:pPrChange w:id="173" w:author="kyle O'Reilly" w:date="2026-10-22T21:22:00Z" w16du:dateUtc="2026-10-22T20:22:00Z">
+        <w:pPrChange w:id="201" w:author="kyle O'Reilly" w:date="2026-10-22T21:22:00Z" w16du:dateUtc="2026-10-22T20:22:00Z">
           <w:pPr/>
         </w:pPrChange>
       </w:pPr>
-      <w:ins w:id="174" w:author="kyle O'Reilly" w:date="2026-10-21T23:16:00Z" w16du:dateUtc="2026-10-21T22:16:00Z">
+      <w:ins w:id="202" w:author="kyle O'Reilly" w:date="2026-10-21T23:16:00Z" w16du:dateUtc="2026-10-21T22:16:00Z">
         <w:r>
           <w:rPr>
             <w:b/>
             <w:bCs/>
-            <w:rPrChange w:id="175" w:author="kyle O'Reilly" w:date="2026-10-21T23:16:00Z" w16du:dateUtc="2026-10-21T22:16:00Z">
+            <w:rPrChange w:id="203" w:author="kyle O'Reilly" w:date="2026-10-21T23:16:00Z" w16du:dateUtc="2026-10-21T22:16:00Z">
               <w:rPr/>
             </w:rPrChange>
           </w:rPr>
@@ -3539,13 +3677,13 @@
         <w:spacing w:line="360" w:lineRule="auto"/>
         <w:jc w:val="both"/>
         <w:rPr>
-          <w:ins w:id="176" w:author="kyle O'Reilly" w:date="2026-10-21T20:39:00Z" w16du:dateUtc="2026-10-21T19:39:00Z"/>
-        </w:rPr>
-        <w:pPrChange w:id="177" w:author="kyle O'Reilly" w:date="2026-10-22T21:22:00Z" w16du:dateUtc="2026-10-22T20:22:00Z">
+          <w:ins w:id="204" w:author="kyle O'Reilly" w:date="2026-10-21T20:39:00Z" w16du:dateUtc="2026-10-21T19:39:00Z"/>
+        </w:rPr>
+        <w:pPrChange w:id="205" w:author="kyle O'Reilly" w:date="2026-10-22T21:22:00Z" w16du:dateUtc="2026-10-22T20:22:00Z">
           <w:pPr/>
         </w:pPrChange>
       </w:pPr>
-      <w:ins w:id="178" w:author="kyle O'Reilly" w:date="2026-10-21T23:16:00Z" w16du:dateUtc="2026-10-21T22:16:00Z">
+      <w:ins w:id="206" w:author="kyle O'Reilly" w:date="2026-10-21T23:16:00Z" w16du:dateUtc="2026-10-21T22:16:00Z">
         <w:r>
           <w:t xml:space="preserve">The stock with the highest documented </w:t>
         </w:r>
@@ -3553,7 +3691,7 @@
           <w:t>historical volatility will have the highest</w:t>
         </w:r>
       </w:ins>
-      <w:ins w:id="179" w:author="kyle O'Reilly" w:date="2026-10-21T23:17:00Z" w16du:dateUtc="2026-10-21T22:17:00Z">
+      <w:ins w:id="207" w:author="kyle O'Reilly" w:date="2026-10-21T23:17:00Z" w16du:dateUtc="2026-10-21T22:17:00Z">
         <w:r>
           <w:t xml:space="preserve"> average absolute percentage forecasting error across the three forecasting methods. This explo</w:t>
         </w:r>
@@ -3566,9 +3704,9 @@
       <w:pPr>
         <w:spacing w:line="360" w:lineRule="auto"/>
         <w:rPr>
-          <w:ins w:id="180" w:author="kyle O'Reilly" w:date="2026-10-21T20:40:00Z" w16du:dateUtc="2026-10-21T19:40:00Z"/>
-        </w:rPr>
-        <w:pPrChange w:id="181" w:author="kyle O'Reilly" w:date="2026-10-22T21:22:00Z" w16du:dateUtc="2026-10-22T20:22:00Z">
+          <w:ins w:id="208" w:author="kyle O'Reilly" w:date="2026-10-21T20:40:00Z" w16du:dateUtc="2026-10-21T19:40:00Z"/>
+        </w:rPr>
+        <w:pPrChange w:id="209" w:author="kyle O'Reilly" w:date="2026-10-22T21:22:00Z" w16du:dateUtc="2026-10-22T20:22:00Z">
           <w:pPr/>
         </w:pPrChange>
       </w:pPr>
@@ -3579,19 +3717,18 @@
         <w:spacing w:line="360" w:lineRule="auto"/>
         <w:jc w:val="both"/>
         <w:rPr>
-          <w:ins w:id="182" w:author="kyle O'Reilly" w:date="2026-10-21T20:40:00Z" w16du:dateUtc="2026-10-21T19:40:00Z"/>
-        </w:rPr>
-        <w:pPrChange w:id="183" w:author="kyle O'Reilly" w:date="2026-10-22T21:22:00Z" w16du:dateUtc="2026-10-22T20:22:00Z">
+          <w:ins w:id="210" w:author="kyle O'Reilly" w:date="2026-10-21T20:40:00Z" w16du:dateUtc="2026-10-21T19:40:00Z"/>
+        </w:rPr>
+        <w:pPrChange w:id="211" w:author="kyle O'Reilly" w:date="2026-10-22T21:22:00Z" w16du:dateUtc="2026-10-22T20:22:00Z">
           <w:pPr/>
         </w:pPrChange>
       </w:pPr>
-      <w:bookmarkStart w:id="184" w:name="_Toc243601432"/>
-      <w:ins w:id="185" w:author="kyle O'Reilly" w:date="2026-10-21T20:40:00Z" w16du:dateUtc="2026-10-21T19:40:00Z">
-        <w:r>
-          <w:lastRenderedPageBreak/>
+      <w:bookmarkStart w:id="212" w:name="_Toc243601432"/>
+      <w:ins w:id="213" w:author="kyle O'Reilly" w:date="2026-10-21T20:40:00Z" w16du:dateUtc="2026-10-21T19:40:00Z">
+        <w:r>
           <w:t>5. Project Scope</w:t>
         </w:r>
-        <w:bookmarkEnd w:id="184"/>
+        <w:bookmarkEnd w:id="212"/>
       </w:ins>
     </w:p>
     <w:p>
@@ -3599,13 +3736,13 @@
         <w:spacing w:line="360" w:lineRule="auto"/>
         <w:jc w:val="both"/>
         <w:rPr>
-          <w:ins w:id="186" w:author="kyle O'Reilly" w:date="2026-10-22T19:08:00Z" w16du:dateUtc="2026-10-22T18:08:00Z"/>
-        </w:rPr>
-        <w:pPrChange w:id="187" w:author="kyle O'Reilly" w:date="2026-10-22T21:22:00Z" w16du:dateUtc="2026-10-22T20:22:00Z">
+          <w:ins w:id="214" w:author="kyle O'Reilly" w:date="2026-10-22T19:08:00Z" w16du:dateUtc="2026-10-22T18:08:00Z"/>
+        </w:rPr>
+        <w:pPrChange w:id="215" w:author="kyle O'Reilly" w:date="2026-10-22T21:22:00Z" w16du:dateUtc="2026-10-22T20:22:00Z">
           <w:pPr/>
         </w:pPrChange>
       </w:pPr>
-      <w:ins w:id="188" w:author="kyle O'Reilly" w:date="2026-10-22T18:50:00Z" w16du:dateUtc="2026-10-22T17:50:00Z">
+      <w:ins w:id="216" w:author="kyle O'Reilly" w:date="2026-10-22T18:50:00Z" w16du:dateUtc="2026-10-22T17:50:00Z">
         <w:r>
           <w:t xml:space="preserve">This Capstone Project </w:t>
         </w:r>
@@ -3613,7 +3750,7 @@
           <w:t>will examine three ind</w:t>
         </w:r>
       </w:ins>
-      <w:ins w:id="189" w:author="kyle O'Reilly" w:date="2026-10-22T18:51:00Z" w16du:dateUtc="2026-10-22T17:51:00Z">
+      <w:ins w:id="217" w:author="kyle O'Reilly" w:date="2026-10-22T18:51:00Z" w16du:dateUtc="2026-10-22T17:51:00Z">
         <w:r>
           <w:t>ividual stocks: JPMorgan Chase &amp; Co.</w:t>
         </w:r>
@@ -3621,7 +3758,7 @@
           <w:t>, Coca-Cola Co., and Intel Corp</w:t>
         </w:r>
       </w:ins>
-      <w:ins w:id="190" w:author="kyle O'Reilly" w:date="2026-10-22T19:05:00Z" w16du:dateUtc="2026-10-22T18:05:00Z">
+      <w:ins w:id="218" w:author="kyle O'Reilly" w:date="2026-10-22T19:05:00Z" w16du:dateUtc="2026-10-22T18:05:00Z">
         <w:r>
           <w:t xml:space="preserve">. </w:t>
         </w:r>
@@ -3629,12 +3766,12 @@
           <w:t xml:space="preserve">These stocks have been selected to represent </w:t>
         </w:r>
       </w:ins>
-      <w:ins w:id="191" w:author="kyle O'Reilly" w:date="2026-10-22T19:06:00Z" w16du:dateUtc="2026-10-22T18:06:00Z">
+      <w:ins w:id="219" w:author="kyle O'Reilly" w:date="2026-10-22T19:06:00Z" w16du:dateUtc="2026-10-22T18:06:00Z">
         <w:r>
           <w:t>low, medium, and high volatility ratings, respectively, as displayed on Trading 212</w:t>
         </w:r>
       </w:ins>
-      <w:ins w:id="192" w:author="kyle O'Reilly" w:date="2026-10-22T19:08:00Z" w16du:dateUtc="2026-10-22T18:08:00Z">
+      <w:ins w:id="220" w:author="kyle O'Reilly" w:date="2026-10-22T19:08:00Z" w16du:dateUtc="2026-10-22T18:08:00Z">
         <w:r>
           <w:t xml:space="preserve"> (Trading 212, n.d.).</w:t>
         </w:r>
@@ -3645,13 +3782,13 @@
         <w:spacing w:line="360" w:lineRule="auto"/>
         <w:jc w:val="both"/>
         <w:rPr>
-          <w:ins w:id="193" w:author="kyle O'Reilly" w:date="2026-10-22T19:11:00Z" w16du:dateUtc="2026-10-22T18:11:00Z"/>
-        </w:rPr>
-        <w:pPrChange w:id="194" w:author="kyle O'Reilly" w:date="2026-10-22T21:22:00Z" w16du:dateUtc="2026-10-22T20:22:00Z">
+          <w:ins w:id="221" w:author="kyle O'Reilly" w:date="2026-10-22T19:11:00Z" w16du:dateUtc="2026-10-22T18:11:00Z"/>
+        </w:rPr>
+        <w:pPrChange w:id="222" w:author="kyle O'Reilly" w:date="2026-10-22T21:22:00Z" w16du:dateUtc="2026-10-22T20:22:00Z">
           <w:pPr/>
         </w:pPrChange>
       </w:pPr>
-      <w:ins w:id="195" w:author="kyle O'Reilly" w:date="2026-10-22T19:08:00Z" w16du:dateUtc="2026-10-22T18:08:00Z">
+      <w:ins w:id="223" w:author="kyle O'Reilly" w:date="2026-10-22T19:08:00Z" w16du:dateUtc="2026-10-22T18:08:00Z">
         <w:r>
           <w:t>Historical stock data</w:t>
         </w:r>
@@ -3659,12 +3796,12 @@
           <w:t xml:space="preserve"> covering approximately </w:t>
         </w:r>
       </w:ins>
-      <w:ins w:id="196" w:author="kyle O'Reilly" w:date="2026-10-22T19:09:00Z" w16du:dateUtc="2026-10-22T18:09:00Z">
+      <w:ins w:id="224" w:author="kyle O'Reilly" w:date="2026-10-22T19:09:00Z" w16du:dateUtc="2026-10-22T18:09:00Z">
         <w:r>
           <w:t>44-46 years, where available, will be obtained from Stooq. The anal</w:t>
         </w:r>
       </w:ins>
-      <w:ins w:id="197" w:author="kyle O'Reilly" w:date="2026-10-22T19:10:00Z" w16du:dateUtc="2026-10-22T18:10:00Z">
+      <w:ins w:id="225" w:author="kyle O'Reilly" w:date="2026-10-22T19:10:00Z" w16du:dateUtc="2026-10-22T18:10:00Z">
         <w:r>
           <w:t xml:space="preserve">ysis will focus </w:t>
         </w:r>
@@ -3675,7 +3812,7 @@
           <w:t>, such as financial news</w:t>
         </w:r>
       </w:ins>
-      <w:ins w:id="198" w:author="kyle O'Reilly" w:date="2026-10-22T19:11:00Z" w16du:dateUtc="2026-10-22T18:11:00Z">
+      <w:ins w:id="226" w:author="kyle O'Reilly" w:date="2026-10-22T19:11:00Z" w16du:dateUtc="2026-10-22T18:11:00Z">
         <w:r>
           <w:t xml:space="preserve">, economic conditions, company announcements and trading volume, </w:t>
         </w:r>
@@ -3689,18 +3826,18 @@
         <w:spacing w:line="360" w:lineRule="auto"/>
         <w:jc w:val="both"/>
         <w:rPr>
-          <w:ins w:id="199" w:author="kyle O'Reilly" w:date="2026-10-22T19:13:00Z" w16du:dateUtc="2026-10-22T18:13:00Z"/>
-        </w:rPr>
-        <w:pPrChange w:id="200" w:author="kyle O'Reilly" w:date="2026-10-22T21:22:00Z" w16du:dateUtc="2026-10-22T20:22:00Z">
+          <w:ins w:id="227" w:author="kyle O'Reilly" w:date="2026-10-22T19:13:00Z" w16du:dateUtc="2026-10-22T18:13:00Z"/>
+        </w:rPr>
+        <w:pPrChange w:id="228" w:author="kyle O'Reilly" w:date="2026-10-22T21:22:00Z" w16du:dateUtc="2026-10-22T20:22:00Z">
           <w:pPr/>
         </w:pPrChange>
       </w:pPr>
-      <w:ins w:id="201" w:author="kyle O'Reilly" w:date="2026-10-22T19:12:00Z" w16du:dateUtc="2026-10-22T18:12:00Z">
+      <w:ins w:id="229" w:author="kyle O'Reilly" w:date="2026-10-22T19:12:00Z" w16du:dateUtc="2026-10-22T18:12:00Z">
         <w:r>
           <w:t>The study will use one historical cut-off date to predict each stock’s closing price 0 trading days into the future. Three forecasting metho</w:t>
         </w:r>
       </w:ins>
-      <w:ins w:id="202" w:author="kyle O'Reilly" w:date="2026-10-22T19:13:00Z" w16du:dateUtc="2026-10-22T18:13:00Z">
+      <w:ins w:id="230" w:author="kyle O'Reilly" w:date="2026-10-22T19:13:00Z" w16du:dateUtc="2026-10-22T18:13:00Z">
         <w:r>
           <w:t>ds will be compared: Linear Regression, Random Forest and a naïve forecasting baseline.</w:t>
         </w:r>
@@ -3711,25 +3848,25 @@
         <w:spacing w:line="360" w:lineRule="auto"/>
         <w:jc w:val="both"/>
         <w:rPr>
-          <w:ins w:id="203" w:author="kyle O'Reilly" w:date="2026-10-22T19:17:00Z" w16du:dateUtc="2026-10-22T18:17:00Z"/>
-        </w:rPr>
-      </w:pPr>
-      <w:ins w:id="204" w:author="kyle O'Reilly" w:date="2026-10-22T19:13:00Z" w16du:dateUtc="2026-10-22T18:13:00Z">
+          <w:ins w:id="231" w:author="kyle O'Reilly" w:date="2026-10-22T19:17:00Z" w16du:dateUtc="2026-10-22T18:17:00Z"/>
+        </w:rPr>
+      </w:pPr>
+      <w:ins w:id="232" w:author="kyle O'Reilly" w:date="2026-10-22T19:13:00Z" w16du:dateUtc="2026-10-22T18:13:00Z">
         <w:r>
           <w:t>The pro</w:t>
         </w:r>
       </w:ins>
-      <w:ins w:id="205" w:author="kyle O'Reilly" w:date="2026-10-22T19:14:00Z" w16du:dateUtc="2026-10-22T18:14:00Z">
+      <w:ins w:id="233" w:author="kyle O'Reilly" w:date="2026-10-22T19:14:00Z" w16du:dateUtc="2026-10-22T18:14:00Z">
         <w:r>
           <w:t>j</w:t>
         </w:r>
       </w:ins>
-      <w:ins w:id="206" w:author="kyle O'Reilly" w:date="2026-10-22T19:13:00Z" w16du:dateUtc="2026-10-22T18:13:00Z">
+      <w:ins w:id="234" w:author="kyle O'Reilly" w:date="2026-10-22T19:13:00Z" w16du:dateUtc="2026-10-22T18:13:00Z">
         <w:r>
           <w:t xml:space="preserve">ect will not involve </w:t>
         </w:r>
       </w:ins>
-      <w:ins w:id="207" w:author="kyle O'Reilly" w:date="2026-10-22T19:14:00Z" w16du:dateUtc="2026-10-22T18:14:00Z">
+      <w:ins w:id="235" w:author="kyle O'Reilly" w:date="2026-10-22T19:14:00Z" w16du:dateUtc="2026-10-22T18:14:00Z">
         <w:r>
           <w:t xml:space="preserve">live trading, automated investment decisions or financial recommendations. As only </w:t>
         </w:r>
@@ -3737,17 +3874,17 @@
           <w:t xml:space="preserve">one future </w:t>
         </w:r>
       </w:ins>
-      <w:ins w:id="208" w:author="kyle O'Reilly" w:date="2026-10-22T19:15:00Z" w16du:dateUtc="2026-10-22T18:15:00Z">
+      <w:ins w:id="236" w:author="kyle O'Reilly" w:date="2026-10-22T19:15:00Z" w16du:dateUtc="2026-10-22T18:15:00Z">
         <w:r>
           <w:t>closing price will be evaluated for each stock</w:t>
         </w:r>
       </w:ins>
-      <w:ins w:id="209" w:author="kyle O'Reilly" w:date="2026-10-22T19:16:00Z" w16du:dateUtc="2026-10-22T18:16:00Z">
+      <w:ins w:id="237" w:author="kyle O'Reilly" w:date="2026-10-22T19:16:00Z" w16du:dateUtc="2026-10-22T18:16:00Z">
         <w:r>
           <w:t>, the findings will be limited to this case study and cannot establish which forecasting method is consistently more accurate across different market conditions</w:t>
         </w:r>
       </w:ins>
-      <w:ins w:id="210" w:author="kyle O'Reilly" w:date="2026-10-22T19:17:00Z" w16du:dateUtc="2026-10-22T18:17:00Z">
+      <w:ins w:id="238" w:author="kyle O'Reilly" w:date="2026-10-22T19:17:00Z" w16du:dateUtc="2026-10-22T18:17:00Z">
         <w:r>
           <w:t>.</w:t>
         </w:r>
@@ -3758,7 +3895,7 @@
         <w:spacing w:line="360" w:lineRule="auto"/>
         <w:jc w:val="both"/>
         <w:rPr>
-          <w:ins w:id="211" w:author="kyle O'Reilly" w:date="2026-10-22T19:17:00Z" w16du:dateUtc="2026-10-22T18:17:00Z"/>
+          <w:ins w:id="239" w:author="kyle O'Reilly" w:date="2026-10-22T19:17:00Z" w16du:dateUtc="2026-10-22T18:17:00Z"/>
         </w:rPr>
       </w:pPr>
     </w:p>
@@ -3767,36 +3904,37 @@
         <w:pStyle w:val="Heading1"/>
         <w:spacing w:line="360" w:lineRule="auto"/>
         <w:rPr>
-          <w:ins w:id="212" w:author="kyle O'Reilly" w:date="2026-10-21T20:40:00Z" w16du:dateUtc="2026-10-21T19:40:00Z"/>
-        </w:rPr>
-        <w:pPrChange w:id="213" w:author="kyle O'Reilly" w:date="2026-10-22T21:22:00Z" w16du:dateUtc="2026-10-22T20:22:00Z">
+          <w:ins w:id="240" w:author="kyle O'Reilly" w:date="2026-10-21T20:40:00Z" w16du:dateUtc="2026-10-21T19:40:00Z"/>
+        </w:rPr>
+        <w:pPrChange w:id="241" w:author="kyle O'Reilly" w:date="2026-10-22T21:22:00Z" w16du:dateUtc="2026-10-22T20:22:00Z">
           <w:pPr/>
         </w:pPrChange>
       </w:pPr>
-      <w:bookmarkStart w:id="214" w:name="_Toc243601433"/>
-      <w:ins w:id="215" w:author="kyle O'Reilly" w:date="2026-10-22T19:17:00Z" w16du:dateUtc="2026-10-22T18:17:00Z">
-        <w:r>
+      <w:bookmarkStart w:id="242" w:name="_Toc243601433"/>
+      <w:ins w:id="243" w:author="kyle O'Reilly" w:date="2026-10-22T19:17:00Z" w16du:dateUtc="2026-10-22T18:17:00Z">
+        <w:r>
+          <w:lastRenderedPageBreak/>
           <w:t xml:space="preserve">6. </w:t>
         </w:r>
       </w:ins>
-      <w:ins w:id="216" w:author="kyle O'Reilly" w:date="2026-10-21T20:40:00Z" w16du:dateUtc="2026-10-21T19:40:00Z">
+      <w:ins w:id="244" w:author="kyle O'Reilly" w:date="2026-10-21T20:40:00Z" w16du:dateUtc="2026-10-21T19:40:00Z">
         <w:r>
           <w:t>Methodology</w:t>
         </w:r>
-        <w:bookmarkEnd w:id="214"/>
+        <w:bookmarkEnd w:id="242"/>
       </w:ins>
     </w:p>
     <w:p>
       <w:pPr>
         <w:spacing w:line="360" w:lineRule="auto"/>
         <w:rPr>
-          <w:ins w:id="217" w:author="kyle O'Reilly" w:date="2026-10-21T20:40:00Z" w16du:dateUtc="2026-10-21T19:40:00Z"/>
-        </w:rPr>
-        <w:pPrChange w:id="218" w:author="kyle O'Reilly" w:date="2026-10-22T21:22:00Z" w16du:dateUtc="2026-10-22T20:22:00Z">
+          <w:ins w:id="245" w:author="kyle O'Reilly" w:date="2026-10-21T20:40:00Z" w16du:dateUtc="2026-10-21T19:40:00Z"/>
+        </w:rPr>
+        <w:pPrChange w:id="246" w:author="kyle O'Reilly" w:date="2026-10-22T21:22:00Z" w16du:dateUtc="2026-10-22T20:22:00Z">
           <w:pPr/>
         </w:pPrChange>
       </w:pPr>
-      <w:ins w:id="219" w:author="kyle O'Reilly" w:date="2026-10-21T20:40:00Z" w16du:dateUtc="2026-10-21T19:40:00Z">
+      <w:ins w:id="247" w:author="kyle O'Reilly" w:date="2026-10-21T20:40:00Z" w16du:dateUtc="2026-10-21T19:40:00Z">
         <w:r>
           <w:t>?</w:t>
         </w:r>
@@ -3806,9 +3944,9 @@
       <w:pPr>
         <w:spacing w:line="360" w:lineRule="auto"/>
         <w:rPr>
-          <w:ins w:id="220" w:author="kyle O'Reilly" w:date="2026-10-21T20:40:00Z" w16du:dateUtc="2026-10-21T19:40:00Z"/>
-        </w:rPr>
-        <w:pPrChange w:id="221" w:author="kyle O'Reilly" w:date="2026-10-22T21:22:00Z" w16du:dateUtc="2026-10-22T20:22:00Z">
+          <w:ins w:id="248" w:author="kyle O'Reilly" w:date="2026-10-21T20:40:00Z" w16du:dateUtc="2026-10-21T19:40:00Z"/>
+        </w:rPr>
+        <w:pPrChange w:id="249" w:author="kyle O'Reilly" w:date="2026-10-22T21:22:00Z" w16du:dateUtc="2026-10-22T20:22:00Z">
           <w:pPr/>
         </w:pPrChange>
       </w:pPr>
@@ -3819,102 +3957,102 @@
         <w:spacing w:line="360" w:lineRule="auto"/>
         <w:jc w:val="both"/>
         <w:rPr>
-          <w:ins w:id="222" w:author="kyle O'Reilly" w:date="2026-10-21T20:41:00Z" w16du:dateUtc="2026-10-21T19:41:00Z"/>
-        </w:rPr>
-        <w:pPrChange w:id="223" w:author="kyle O'Reilly" w:date="2026-10-22T21:22:00Z" w16du:dateUtc="2026-10-22T20:22:00Z">
+          <w:ins w:id="250" w:author="kyle O'Reilly" w:date="2026-10-21T20:41:00Z" w16du:dateUtc="2026-10-21T19:41:00Z"/>
+        </w:rPr>
+        <w:pPrChange w:id="251" w:author="kyle O'Reilly" w:date="2026-10-22T21:22:00Z" w16du:dateUtc="2026-10-22T20:22:00Z">
           <w:pPr/>
         </w:pPrChange>
       </w:pPr>
-      <w:bookmarkStart w:id="224" w:name="_Toc243601434"/>
-      <w:ins w:id="225" w:author="kyle O'Reilly" w:date="2026-10-21T20:41:00Z" w16du:dateUtc="2026-10-21T19:41:00Z">
+      <w:bookmarkStart w:id="252" w:name="_Toc243601434"/>
+      <w:ins w:id="253" w:author="kyle O'Reilly" w:date="2026-10-21T20:41:00Z" w16du:dateUtc="2026-10-21T19:41:00Z">
         <w:r>
           <w:t xml:space="preserve">7. </w:t>
         </w:r>
       </w:ins>
-      <w:ins w:id="226" w:author="kyle O'Reilly" w:date="2026-10-21T20:40:00Z" w16du:dateUtc="2026-10-21T19:40:00Z">
+      <w:ins w:id="254" w:author="kyle O'Reilly" w:date="2026-10-21T20:40:00Z" w16du:dateUtc="2026-10-21T19:40:00Z">
         <w:r>
           <w:t>Data Sources</w:t>
         </w:r>
       </w:ins>
-      <w:bookmarkEnd w:id="224"/>
+      <w:bookmarkEnd w:id="252"/>
     </w:p>
     <w:p>
       <w:pPr>
         <w:spacing w:line="360" w:lineRule="auto"/>
         <w:jc w:val="both"/>
         <w:rPr>
-          <w:ins w:id="227" w:author="kyle O'Reilly" w:date="2026-10-21T23:35:00Z" w16du:dateUtc="2026-10-21T22:35:00Z"/>
-        </w:rPr>
-        <w:pPrChange w:id="228" w:author="kyle O'Reilly" w:date="2026-10-22T21:22:00Z" w16du:dateUtc="2026-10-22T20:22:00Z">
+          <w:ins w:id="255" w:author="kyle O'Reilly" w:date="2026-10-21T23:35:00Z" w16du:dateUtc="2026-10-21T22:35:00Z"/>
+        </w:rPr>
+        <w:pPrChange w:id="256" w:author="kyle O'Reilly" w:date="2026-10-22T21:22:00Z" w16du:dateUtc="2026-10-22T20:22:00Z">
           <w:pPr/>
         </w:pPrChange>
       </w:pPr>
-      <w:ins w:id="229" w:author="kyle O'Reilly" w:date="2026-10-21T23:39:00Z" w16du:dateUtc="2026-10-21T22:39:00Z">
+      <w:ins w:id="257" w:author="kyle O'Reilly" w:date="2026-10-21T23:39:00Z" w16du:dateUtc="2026-10-21T22:39:00Z">
         <w:r>
           <w:t>Tradi</w:t>
         </w:r>
       </w:ins>
-      <w:ins w:id="230" w:author="kyle O'Reilly" w:date="2026-10-21T23:40:00Z" w16du:dateUtc="2026-10-21T22:40:00Z">
+      <w:ins w:id="258" w:author="kyle O'Reilly" w:date="2026-10-21T23:40:00Z" w16du:dateUtc="2026-10-21T22:40:00Z">
         <w:r>
           <w:t xml:space="preserve">ng 212 will be consulted to verify </w:t>
         </w:r>
       </w:ins>
-      <w:ins w:id="231" w:author="kyle O'Reilly" w:date="2026-10-21T23:46:00Z" w16du:dateUtc="2026-10-21T22:46:00Z">
+      <w:ins w:id="259" w:author="kyle O'Reilly" w:date="2026-10-21T23:46:00Z" w16du:dateUtc="2026-10-21T22:46:00Z">
         <w:r>
           <w:t xml:space="preserve">the </w:t>
         </w:r>
       </w:ins>
-      <w:ins w:id="232" w:author="kyle O'Reilly" w:date="2026-10-21T23:40:00Z" w16du:dateUtc="2026-10-21T22:40:00Z">
+      <w:ins w:id="260" w:author="kyle O'Reilly" w:date="2026-10-21T23:40:00Z" w16du:dateUtc="2026-10-21T22:40:00Z">
         <w:r>
           <w:t>volatility rating</w:t>
         </w:r>
       </w:ins>
-      <w:ins w:id="233" w:author="kyle O'Reilly" w:date="2026-10-21T23:41:00Z" w16du:dateUtc="2026-10-21T22:41:00Z">
+      <w:ins w:id="261" w:author="kyle O'Reilly" w:date="2026-10-21T23:41:00Z" w16du:dateUtc="2026-10-21T22:41:00Z">
         <w:r>
           <w:t>s</w:t>
         </w:r>
       </w:ins>
-      <w:ins w:id="234" w:author="kyle O'Reilly" w:date="2026-10-21T23:40:00Z" w16du:dateUtc="2026-10-21T22:40:00Z">
+      <w:ins w:id="262" w:author="kyle O'Reilly" w:date="2026-10-21T23:40:00Z" w16du:dateUtc="2026-10-21T22:40:00Z">
         <w:r>
           <w:t xml:space="preserve"> of</w:t>
         </w:r>
       </w:ins>
-      <w:ins w:id="235" w:author="kyle O'Reilly" w:date="2026-10-21T23:46:00Z" w16du:dateUtc="2026-10-21T22:46:00Z">
+      <w:ins w:id="263" w:author="kyle O'Reilly" w:date="2026-10-21T23:46:00Z" w16du:dateUtc="2026-10-21T22:46:00Z">
         <w:r>
           <w:t xml:space="preserve"> all the</w:t>
         </w:r>
       </w:ins>
-      <w:ins w:id="236" w:author="kyle O'Reilly" w:date="2026-10-21T23:40:00Z" w16du:dateUtc="2026-10-21T22:40:00Z">
+      <w:ins w:id="264" w:author="kyle O'Reilly" w:date="2026-10-21T23:40:00Z" w16du:dateUtc="2026-10-21T22:40:00Z">
         <w:r>
           <w:t xml:space="preserve"> three </w:t>
         </w:r>
       </w:ins>
-      <w:ins w:id="237" w:author="kyle O'Reilly" w:date="2026-10-21T23:46:00Z" w16du:dateUtc="2026-10-21T22:46:00Z">
+      <w:ins w:id="265" w:author="kyle O'Reilly" w:date="2026-10-21T23:46:00Z" w16du:dateUtc="2026-10-21T22:46:00Z">
         <w:r>
           <w:t xml:space="preserve">selected </w:t>
         </w:r>
       </w:ins>
-      <w:ins w:id="238" w:author="kyle O'Reilly" w:date="2026-10-21T23:40:00Z" w16du:dateUtc="2026-10-21T22:40:00Z">
+      <w:ins w:id="266" w:author="kyle O'Reilly" w:date="2026-10-21T23:40:00Z" w16du:dateUtc="2026-10-21T22:40:00Z">
         <w:r>
           <w:t>stocks.</w:t>
         </w:r>
       </w:ins>
-      <w:ins w:id="239" w:author="kyle O'Reilly" w:date="2026-10-21T23:38:00Z" w16du:dateUtc="2026-10-21T22:38:00Z">
+      <w:ins w:id="267" w:author="kyle O'Reilly" w:date="2026-10-21T23:38:00Z" w16du:dateUtc="2026-10-21T22:38:00Z">
         <w:r>
           <w:t xml:space="preserve"> </w:t>
         </w:r>
       </w:ins>
-      <w:ins w:id="240" w:author="kyle O'Reilly" w:date="2026-10-21T23:46:00Z" w16du:dateUtc="2026-10-21T22:46:00Z">
+      <w:ins w:id="268" w:author="kyle O'Reilly" w:date="2026-10-21T23:46:00Z" w16du:dateUtc="2026-10-21T22:46:00Z">
         <w:r>
           <w:t>JPM</w:t>
         </w:r>
       </w:ins>
-      <w:ins w:id="241" w:author="kyle O'Reilly" w:date="2026-10-21T23:54:00Z" w16du:dateUtc="2026-10-21T22:54:00Z">
+      <w:ins w:id="269" w:author="kyle O'Reilly" w:date="2026-10-21T23:54:00Z" w16du:dateUtc="2026-10-21T22:54:00Z">
         <w:r>
           <w:t>.US</w:t>
         </w:r>
       </w:ins>
-      <w:ins w:id="242" w:author="kyle O'Reilly" w:date="2026-10-21T23:46:00Z" w16du:dateUtc="2026-10-21T22:46:00Z">
+      <w:ins w:id="270" w:author="kyle O'Reilly" w:date="2026-10-21T23:46:00Z" w16du:dateUtc="2026-10-21T22:46:00Z">
         <w:r>
           <w:t xml:space="preserve"> (low)</w:t>
         </w:r>
@@ -3922,12 +4060,12 @@
           <w:t>, KO</w:t>
         </w:r>
       </w:ins>
-      <w:ins w:id="243" w:author="kyle O'Reilly" w:date="2026-10-21T23:54:00Z" w16du:dateUtc="2026-10-21T22:54:00Z">
+      <w:ins w:id="271" w:author="kyle O'Reilly" w:date="2026-10-21T23:54:00Z" w16du:dateUtc="2026-10-21T22:54:00Z">
         <w:r>
           <w:t>.US</w:t>
         </w:r>
       </w:ins>
-      <w:ins w:id="244" w:author="kyle O'Reilly" w:date="2026-10-21T23:46:00Z" w16du:dateUtc="2026-10-21T22:46:00Z">
+      <w:ins w:id="272" w:author="kyle O'Reilly" w:date="2026-10-21T23:46:00Z" w16du:dateUtc="2026-10-21T22:46:00Z">
         <w:r>
           <w:t xml:space="preserve"> (medium)</w:t>
         </w:r>
@@ -3935,72 +4073,72 @@
           <w:t>, and INTC</w:t>
         </w:r>
       </w:ins>
-      <w:ins w:id="245" w:author="kyle O'Reilly" w:date="2026-10-21T23:54:00Z" w16du:dateUtc="2026-10-21T22:54:00Z">
+      <w:ins w:id="273" w:author="kyle O'Reilly" w:date="2026-10-21T23:54:00Z" w16du:dateUtc="2026-10-21T22:54:00Z">
         <w:r>
           <w:t>.US</w:t>
         </w:r>
       </w:ins>
-      <w:ins w:id="246" w:author="kyle O'Reilly" w:date="2026-10-21T23:47:00Z" w16du:dateUtc="2026-10-21T22:47:00Z">
+      <w:ins w:id="274" w:author="kyle O'Reilly" w:date="2026-10-21T23:47:00Z" w16du:dateUtc="2026-10-21T22:47:00Z">
         <w:r>
           <w:t xml:space="preserve"> (high), as displayed on the trading 212 platform</w:t>
         </w:r>
       </w:ins>
-      <w:ins w:id="247" w:author="kyle O'Reilly" w:date="2026-10-21T23:46:00Z" w16du:dateUtc="2026-10-21T22:46:00Z">
+      <w:ins w:id="275" w:author="kyle O'Reilly" w:date="2026-10-21T23:46:00Z" w16du:dateUtc="2026-10-21T22:46:00Z">
         <w:r>
           <w:t xml:space="preserve"> </w:t>
         </w:r>
       </w:ins>
-      <w:ins w:id="248" w:author="kyle O'Reilly" w:date="2026-10-21T23:38:00Z" w16du:dateUtc="2026-10-21T22:38:00Z">
+      <w:ins w:id="276" w:author="kyle O'Reilly" w:date="2026-10-21T23:38:00Z" w16du:dateUtc="2026-10-21T22:38:00Z">
         <w:r>
           <w:t>(</w:t>
         </w:r>
       </w:ins>
-      <w:ins w:id="249" w:author="kyle O'Reilly" w:date="2026-10-21T23:44:00Z" w16du:dateUtc="2026-10-21T22:44:00Z">
+      <w:ins w:id="277" w:author="kyle O'Reilly" w:date="2026-10-21T23:44:00Z" w16du:dateUtc="2026-10-21T22:44:00Z">
         <w:r>
           <w:t>Trading 212, n.d.)</w:t>
         </w:r>
       </w:ins>
-      <w:ins w:id="250" w:author="kyle O'Reilly" w:date="2026-10-21T23:47:00Z" w16du:dateUtc="2026-10-21T22:47:00Z">
+      <w:ins w:id="278" w:author="kyle O'Reilly" w:date="2026-10-21T23:47:00Z" w16du:dateUtc="2026-10-21T22:47:00Z">
         <w:r>
           <w:t xml:space="preserve">. Screenshots of </w:t>
         </w:r>
       </w:ins>
-      <w:ins w:id="251" w:author="kyle O'Reilly" w:date="2026-10-22T00:01:00Z" w16du:dateUtc="2026-10-21T23:01:00Z">
+      <w:ins w:id="279" w:author="kyle O'Reilly" w:date="2026-10-22T00:01:00Z" w16du:dateUtc="2026-10-21T23:01:00Z">
         <w:r>
           <w:t>each stock’s volatility</w:t>
         </w:r>
       </w:ins>
-      <w:ins w:id="252" w:author="kyle O'Reilly" w:date="2026-10-21T23:47:00Z" w16du:dateUtc="2026-10-21T22:47:00Z">
+      <w:ins w:id="280" w:author="kyle O'Reilly" w:date="2026-10-21T23:47:00Z" w16du:dateUtc="2026-10-21T22:47:00Z">
         <w:r>
           <w:t xml:space="preserve"> </w:t>
         </w:r>
       </w:ins>
-      <w:ins w:id="253" w:author="kyle O'Reilly" w:date="2026-10-22T00:01:00Z" w16du:dateUtc="2026-10-21T23:01:00Z">
+      <w:ins w:id="281" w:author="kyle O'Reilly" w:date="2026-10-22T00:01:00Z" w16du:dateUtc="2026-10-21T23:01:00Z">
         <w:r>
           <w:t xml:space="preserve">risk </w:t>
         </w:r>
       </w:ins>
-      <w:ins w:id="254" w:author="kyle O'Reilly" w:date="2026-10-21T23:47:00Z" w16du:dateUtc="2026-10-21T22:47:00Z">
+      <w:ins w:id="282" w:author="kyle O'Reilly" w:date="2026-10-21T23:47:00Z" w16du:dateUtc="2026-10-21T22:47:00Z">
         <w:r>
           <w:t>rating</w:t>
         </w:r>
       </w:ins>
-      <w:ins w:id="255" w:author="kyle O'Reilly" w:date="2026-10-22T00:01:00Z" w16du:dateUtc="2026-10-21T23:01:00Z">
+      <w:ins w:id="283" w:author="kyle O'Reilly" w:date="2026-10-22T00:01:00Z" w16du:dateUtc="2026-10-21T23:01:00Z">
         <w:r>
           <w:t xml:space="preserve"> </w:t>
         </w:r>
       </w:ins>
-      <w:ins w:id="256" w:author="kyle O'Reilly" w:date="2026-10-21T23:47:00Z" w16du:dateUtc="2026-10-21T22:47:00Z">
+      <w:ins w:id="284" w:author="kyle O'Reilly" w:date="2026-10-21T23:47:00Z" w16du:dateUtc="2026-10-21T22:47:00Z">
         <w:r>
           <w:t xml:space="preserve">will be provided in Appendix A to support the stock </w:t>
         </w:r>
       </w:ins>
-      <w:ins w:id="257" w:author="kyle O'Reilly" w:date="2026-10-21T23:48:00Z" w16du:dateUtc="2026-10-21T22:48:00Z">
+      <w:ins w:id="285" w:author="kyle O'Reilly" w:date="2026-10-21T23:48:00Z" w16du:dateUtc="2026-10-21T22:48:00Z">
         <w:r>
           <w:t>selection</w:t>
         </w:r>
       </w:ins>
-      <w:ins w:id="258" w:author="kyle O'Reilly" w:date="2026-10-21T23:47:00Z" w16du:dateUtc="2026-10-21T22:47:00Z">
+      <w:ins w:id="286" w:author="kyle O'Reilly" w:date="2026-10-21T23:47:00Z" w16du:dateUtc="2026-10-21T22:47:00Z">
         <w:r>
           <w:t>.</w:t>
         </w:r>
@@ -4011,53 +4149,53 @@
         <w:spacing w:line="360" w:lineRule="auto"/>
         <w:jc w:val="both"/>
         <w:rPr>
-          <w:ins w:id="259" w:author="kyle O'Reilly" w:date="2026-10-21T20:41:00Z" w16du:dateUtc="2026-10-21T19:41:00Z"/>
-        </w:rPr>
-        <w:pPrChange w:id="260" w:author="kyle O'Reilly" w:date="2026-10-22T21:22:00Z" w16du:dateUtc="2026-10-22T20:22:00Z">
+          <w:ins w:id="287" w:author="kyle O'Reilly" w:date="2026-10-21T20:41:00Z" w16du:dateUtc="2026-10-21T19:41:00Z"/>
+        </w:rPr>
+        <w:pPrChange w:id="288" w:author="kyle O'Reilly" w:date="2026-10-22T21:22:00Z" w16du:dateUtc="2026-10-22T20:22:00Z">
           <w:pPr/>
         </w:pPrChange>
       </w:pPr>
-      <w:ins w:id="261" w:author="kyle O'Reilly" w:date="2026-10-21T23:28:00Z" w16du:dateUtc="2026-10-21T22:28:00Z">
+      <w:ins w:id="289" w:author="kyle O'Reilly" w:date="2026-10-21T23:28:00Z" w16du:dateUtc="2026-10-21T22:28:00Z">
         <w:r>
           <w:t xml:space="preserve">Stooq will be </w:t>
         </w:r>
       </w:ins>
-      <w:ins w:id="262" w:author="kyle O'Reilly" w:date="2026-10-21T23:58:00Z" w16du:dateUtc="2026-10-21T22:58:00Z">
+      <w:ins w:id="290" w:author="kyle O'Reilly" w:date="2026-10-21T23:58:00Z" w16du:dateUtc="2026-10-21T22:58:00Z">
         <w:r>
           <w:t>used to obtain</w:t>
         </w:r>
       </w:ins>
-      <w:ins w:id="263" w:author="kyle O'Reilly" w:date="2026-10-21T23:28:00Z" w16du:dateUtc="2026-10-21T22:28:00Z">
+      <w:ins w:id="291" w:author="kyle O'Reilly" w:date="2026-10-21T23:28:00Z" w16du:dateUtc="2026-10-21T22:28:00Z">
         <w:r>
           <w:t xml:space="preserve"> downloadable historical stock data for JPM</w:t>
         </w:r>
       </w:ins>
-      <w:ins w:id="264" w:author="kyle O'Reilly" w:date="2026-10-21T23:58:00Z" w16du:dateUtc="2026-10-21T22:58:00Z">
+      <w:ins w:id="292" w:author="kyle O'Reilly" w:date="2026-10-21T23:58:00Z" w16du:dateUtc="2026-10-21T22:58:00Z">
         <w:r>
           <w:t>.US</w:t>
         </w:r>
       </w:ins>
-      <w:ins w:id="265" w:author="kyle O'Reilly" w:date="2026-10-21T23:28:00Z" w16du:dateUtc="2026-10-21T22:28:00Z">
+      <w:ins w:id="293" w:author="kyle O'Reilly" w:date="2026-10-21T23:28:00Z" w16du:dateUtc="2026-10-21T22:28:00Z">
         <w:r>
           <w:t>, KO</w:t>
         </w:r>
       </w:ins>
-      <w:ins w:id="266" w:author="kyle O'Reilly" w:date="2026-10-21T23:58:00Z" w16du:dateUtc="2026-10-21T22:58:00Z">
+      <w:ins w:id="294" w:author="kyle O'Reilly" w:date="2026-10-21T23:58:00Z" w16du:dateUtc="2026-10-21T22:58:00Z">
         <w:r>
           <w:t>.US</w:t>
         </w:r>
       </w:ins>
-      <w:ins w:id="267" w:author="kyle O'Reilly" w:date="2026-10-21T23:28:00Z" w16du:dateUtc="2026-10-21T22:28:00Z">
+      <w:ins w:id="295" w:author="kyle O'Reilly" w:date="2026-10-21T23:28:00Z" w16du:dateUtc="2026-10-21T22:28:00Z">
         <w:r>
           <w:t xml:space="preserve"> and INTC</w:t>
         </w:r>
       </w:ins>
-      <w:ins w:id="268" w:author="kyle O'Reilly" w:date="2026-10-21T23:58:00Z" w16du:dateUtc="2026-10-21T22:58:00Z">
+      <w:ins w:id="296" w:author="kyle O'Reilly" w:date="2026-10-21T23:58:00Z" w16du:dateUtc="2026-10-21T22:58:00Z">
         <w:r>
           <w:t>.US</w:t>
         </w:r>
       </w:ins>
-      <w:ins w:id="269" w:author="kyle O'Reilly" w:date="2026-10-21T23:59:00Z" w16du:dateUtc="2026-10-21T22:59:00Z">
+      <w:ins w:id="297" w:author="kyle O'Reilly" w:date="2026-10-21T23:59:00Z" w16du:dateUtc="2026-10-21T22:59:00Z">
         <w:r>
           <w:t xml:space="preserve"> (Stooq</w:t>
         </w:r>
@@ -4065,17 +4203,17 @@
           <w:t>, n.d.a; Stooq, n.d.b</w:t>
         </w:r>
       </w:ins>
-      <w:ins w:id="270" w:author="kyle O'Reilly" w:date="2026-10-22T00:00:00Z" w16du:dateUtc="2026-10-21T23:00:00Z">
+      <w:ins w:id="298" w:author="kyle O'Reilly" w:date="2026-10-22T00:00:00Z" w16du:dateUtc="2026-10-21T23:00:00Z">
         <w:r>
           <w:t>; Stooq, n.d.c).</w:t>
         </w:r>
       </w:ins>
-      <w:ins w:id="271" w:author="kyle O'Reilly" w:date="2026-10-21T23:28:00Z" w16du:dateUtc="2026-10-21T22:28:00Z">
+      <w:ins w:id="299" w:author="kyle O'Reilly" w:date="2026-10-21T23:28:00Z" w16du:dateUtc="2026-10-21T22:28:00Z">
         <w:r>
           <w:t xml:space="preserve"> The </w:t>
         </w:r>
       </w:ins>
-      <w:ins w:id="272" w:author="kyle O'Reilly" w:date="2026-10-22T00:00:00Z" w16du:dateUtc="2026-10-21T23:00:00Z">
+      <w:ins w:id="300" w:author="kyle O'Reilly" w:date="2026-10-22T00:00:00Z" w16du:dateUtc="2026-10-21T23:00:00Z">
         <w:r>
           <w:t xml:space="preserve">independent </w:t>
         </w:r>
@@ -4083,7 +4221,7 @@
           <w:t xml:space="preserve">dataset </w:t>
         </w:r>
       </w:ins>
-      <w:ins w:id="273" w:author="kyle O'Reilly" w:date="2026-10-21T23:28:00Z" w16du:dateUtc="2026-10-21T22:28:00Z">
+      <w:ins w:id="301" w:author="kyle O'Reilly" w:date="2026-10-21T23:28:00Z" w16du:dateUtc="2026-10-21T22:28:00Z">
         <w:r>
           <w:t xml:space="preserve">variables </w:t>
         </w:r>
@@ -4091,17 +4229,17 @@
           <w:t>will</w:t>
         </w:r>
       </w:ins>
-      <w:ins w:id="274" w:author="kyle O'Reilly" w:date="2026-10-22T00:00:00Z" w16du:dateUtc="2026-10-21T23:00:00Z">
+      <w:ins w:id="302" w:author="kyle O'Reilly" w:date="2026-10-22T00:00:00Z" w16du:dateUtc="2026-10-21T23:00:00Z">
         <w:r>
           <w:t xml:space="preserve"> include</w:t>
         </w:r>
       </w:ins>
-      <w:ins w:id="275" w:author="kyle O'Reilly" w:date="2026-10-21T23:28:00Z" w16du:dateUtc="2026-10-21T22:28:00Z">
+      <w:ins w:id="303" w:author="kyle O'Reilly" w:date="2026-10-21T23:28:00Z" w16du:dateUtc="2026-10-21T22:28:00Z">
         <w:r>
           <w:t xml:space="preserve"> </w:t>
         </w:r>
       </w:ins>
-      <w:ins w:id="276" w:author="kyle O'Reilly" w:date="2026-10-21T23:31:00Z" w16du:dateUtc="2026-10-21T22:31:00Z">
+      <w:ins w:id="304" w:author="kyle O'Reilly" w:date="2026-10-21T23:31:00Z" w16du:dateUtc="2026-10-21T22:31:00Z">
         <w:r>
           <w:t xml:space="preserve">sequential index number, </w:t>
         </w:r>
@@ -4109,63 +4247,62 @@
           <w:t>the cale</w:t>
         </w:r>
       </w:ins>
-      <w:ins w:id="277" w:author="kyle O'Reilly" w:date="2026-10-21T23:32:00Z" w16du:dateUtc="2026-10-21T22:32:00Z">
+      <w:ins w:id="305" w:author="kyle O'Reilly" w:date="2026-10-21T23:32:00Z" w16du:dateUtc="2026-10-21T22:32:00Z">
         <w:r>
           <w:t xml:space="preserve">ndar date, the opening price, the maximum </w:t>
         </w:r>
       </w:ins>
-      <w:ins w:id="278" w:author="kyle O'Reilly" w:date="2026-10-22T00:01:00Z" w16du:dateUtc="2026-10-21T23:01:00Z">
+      <w:ins w:id="306" w:author="kyle O'Reilly" w:date="2026-10-22T00:01:00Z" w16du:dateUtc="2026-10-21T23:01:00Z">
         <w:r>
           <w:t xml:space="preserve">and minimum </w:t>
         </w:r>
       </w:ins>
-      <w:ins w:id="279" w:author="kyle O'Reilly" w:date="2026-10-21T23:32:00Z" w16du:dateUtc="2026-10-21T22:32:00Z">
+      <w:ins w:id="307" w:author="kyle O'Reilly" w:date="2026-10-21T23:32:00Z" w16du:dateUtc="2026-10-21T22:32:00Z">
         <w:r>
           <w:t>price</w:t>
         </w:r>
       </w:ins>
-      <w:ins w:id="280" w:author="kyle O'Reilly" w:date="2026-10-22T00:01:00Z" w16du:dateUtc="2026-10-21T23:01:00Z">
+      <w:ins w:id="308" w:author="kyle O'Reilly" w:date="2026-10-22T00:01:00Z" w16du:dateUtc="2026-10-21T23:01:00Z">
         <w:r>
           <w:t>s</w:t>
         </w:r>
       </w:ins>
-      <w:ins w:id="281" w:author="kyle O'Reilly" w:date="2026-10-21T23:32:00Z" w16du:dateUtc="2026-10-21T22:32:00Z">
+      <w:ins w:id="309" w:author="kyle O'Reilly" w:date="2026-10-21T23:32:00Z" w16du:dateUtc="2026-10-21T22:32:00Z">
         <w:r>
           <w:t xml:space="preserve"> the stock reached </w:t>
         </w:r>
       </w:ins>
-      <w:ins w:id="282" w:author="kyle O'Reilly" w:date="2026-10-22T00:02:00Z" w16du:dateUtc="2026-10-21T23:02:00Z">
-        <w:r>
-          <w:lastRenderedPageBreak/>
+      <w:ins w:id="310" w:author="kyle O'Reilly" w:date="2026-10-22T00:02:00Z" w16du:dateUtc="2026-10-21T23:02:00Z">
+        <w:r>
           <w:t>during each trading</w:t>
         </w:r>
       </w:ins>
-      <w:ins w:id="283" w:author="kyle O'Reilly" w:date="2026-10-21T23:32:00Z" w16du:dateUtc="2026-10-21T22:32:00Z">
+      <w:ins w:id="311" w:author="kyle O'Reilly" w:date="2026-10-21T23:32:00Z" w16du:dateUtc="2026-10-21T22:32:00Z">
         <w:r>
           <w:t xml:space="preserve"> date,</w:t>
         </w:r>
       </w:ins>
-      <w:ins w:id="284" w:author="kyle O'Reilly" w:date="2026-10-21T23:33:00Z" w16du:dateUtc="2026-10-21T22:33:00Z">
+      <w:ins w:id="312" w:author="kyle O'Reilly" w:date="2026-10-21T23:33:00Z" w16du:dateUtc="2026-10-21T22:33:00Z">
         <w:r>
           <w:t xml:space="preserve"> closing price,</w:t>
         </w:r>
       </w:ins>
-      <w:ins w:id="285" w:author="kyle O'Reilly" w:date="2026-10-22T00:02:00Z" w16du:dateUtc="2026-10-21T23:02:00Z">
+      <w:ins w:id="313" w:author="kyle O'Reilly" w:date="2026-10-22T00:02:00Z" w16du:dateUtc="2026-10-21T23:02:00Z">
         <w:r>
           <w:t xml:space="preserve"> daily </w:t>
         </w:r>
       </w:ins>
-      <w:ins w:id="286" w:author="kyle O'Reilly" w:date="2026-10-22T00:03:00Z" w16du:dateUtc="2026-10-21T23:03:00Z">
+      <w:ins w:id="314" w:author="kyle O'Reilly" w:date="2026-10-22T00:03:00Z" w16du:dateUtc="2026-10-21T23:03:00Z">
         <w:r>
           <w:t>percentage</w:t>
         </w:r>
       </w:ins>
-      <w:ins w:id="287" w:author="kyle O'Reilly" w:date="2026-10-22T00:02:00Z" w16du:dateUtc="2026-10-21T23:02:00Z">
+      <w:ins w:id="315" w:author="kyle O'Reilly" w:date="2026-10-22T00:02:00Z" w16du:dateUtc="2026-10-21T23:02:00Z">
         <w:r>
           <w:t xml:space="preserve"> and a</w:t>
         </w:r>
       </w:ins>
-      <w:ins w:id="288" w:author="kyle O'Reilly" w:date="2026-10-22T00:03:00Z" w16du:dateUtc="2026-10-21T23:03:00Z">
+      <w:ins w:id="316" w:author="kyle O'Reilly" w:date="2026-10-22T00:03:00Z" w16du:dateUtc="2026-10-21T23:03:00Z">
         <w:r>
           <w:t>bsolute price change compared with the previous day’s closing price</w:t>
         </w:r>
@@ -4173,17 +4310,17 @@
           <w:t>,</w:t>
         </w:r>
       </w:ins>
-      <w:ins w:id="289" w:author="kyle O'Reilly" w:date="2026-10-21T23:33:00Z" w16du:dateUtc="2026-10-21T22:33:00Z">
+      <w:ins w:id="317" w:author="kyle O'Reilly" w:date="2026-10-21T23:33:00Z" w16du:dateUtc="2026-10-21T22:33:00Z">
         <w:r>
           <w:t xml:space="preserve"> and </w:t>
         </w:r>
       </w:ins>
-      <w:ins w:id="290" w:author="kyle O'Reilly" w:date="2026-10-21T23:34:00Z" w16du:dateUtc="2026-10-21T22:34:00Z">
+      <w:ins w:id="318" w:author="kyle O'Reilly" w:date="2026-10-21T23:34:00Z" w16du:dateUtc="2026-10-21T22:34:00Z">
         <w:r>
           <w:t xml:space="preserve">the total number of shares traded </w:t>
         </w:r>
       </w:ins>
-      <w:ins w:id="291" w:author="kyle O'Reilly" w:date="2026-10-22T00:03:00Z" w16du:dateUtc="2026-10-21T23:03:00Z">
+      <w:ins w:id="319" w:author="kyle O'Reilly" w:date="2026-10-22T00:03:00Z" w16du:dateUtc="2026-10-21T23:03:00Z">
         <w:r>
           <w:t>each date.</w:t>
         </w:r>
@@ -4193,9 +4330,9 @@
       <w:pPr>
         <w:spacing w:line="360" w:lineRule="auto"/>
         <w:rPr>
-          <w:ins w:id="292" w:author="kyle O'Reilly" w:date="2026-10-21T20:41:00Z" w16du:dateUtc="2026-10-21T19:41:00Z"/>
-        </w:rPr>
-        <w:pPrChange w:id="293" w:author="kyle O'Reilly" w:date="2026-10-22T21:22:00Z" w16du:dateUtc="2026-10-22T20:22:00Z">
+          <w:ins w:id="320" w:author="kyle O'Reilly" w:date="2026-10-21T20:41:00Z" w16du:dateUtc="2026-10-21T19:41:00Z"/>
+        </w:rPr>
+        <w:pPrChange w:id="321" w:author="kyle O'Reilly" w:date="2026-10-22T21:22:00Z" w16du:dateUtc="2026-10-22T20:22:00Z">
           <w:pPr/>
         </w:pPrChange>
       </w:pPr>
@@ -4206,18 +4343,18 @@
         <w:spacing w:line="360" w:lineRule="auto"/>
         <w:jc w:val="both"/>
         <w:rPr>
-          <w:ins w:id="294" w:author="kyle O'Reilly" w:date="2026-10-21T20:41:00Z" w16du:dateUtc="2026-10-21T19:41:00Z"/>
-        </w:rPr>
-        <w:pPrChange w:id="295" w:author="kyle O'Reilly" w:date="2026-10-22T21:22:00Z" w16du:dateUtc="2026-10-22T20:22:00Z">
+          <w:ins w:id="322" w:author="kyle O'Reilly" w:date="2026-10-21T20:41:00Z" w16du:dateUtc="2026-10-21T19:41:00Z"/>
+        </w:rPr>
+        <w:pPrChange w:id="323" w:author="kyle O'Reilly" w:date="2026-10-22T21:22:00Z" w16du:dateUtc="2026-10-22T20:22:00Z">
           <w:pPr/>
         </w:pPrChange>
       </w:pPr>
-      <w:bookmarkStart w:id="296" w:name="_Toc243601435"/>
-      <w:ins w:id="297" w:author="kyle O'Reilly" w:date="2026-10-21T20:41:00Z" w16du:dateUtc="2026-10-21T19:41:00Z">
+      <w:bookmarkStart w:id="324" w:name="_Toc243601435"/>
+      <w:ins w:id="325" w:author="kyle O'Reilly" w:date="2026-10-21T20:41:00Z" w16du:dateUtc="2026-10-21T19:41:00Z">
         <w:r>
           <w:t>8. Expected Deliverables</w:t>
         </w:r>
-        <w:bookmarkEnd w:id="296"/>
+        <w:bookmarkEnd w:id="324"/>
       </w:ins>
     </w:p>
     <w:p>
@@ -4225,18 +4362,18 @@
         <w:spacing w:line="360" w:lineRule="auto"/>
         <w:jc w:val="both"/>
         <w:rPr>
-          <w:ins w:id="298" w:author="kyle O'Reilly" w:date="2026-10-21T20:41:00Z" w16du:dateUtc="2026-10-21T19:41:00Z"/>
-        </w:rPr>
-        <w:pPrChange w:id="299" w:author="kyle O'Reilly" w:date="2026-10-22T21:22:00Z" w16du:dateUtc="2026-10-22T20:22:00Z">
+          <w:ins w:id="326" w:author="kyle O'Reilly" w:date="2026-10-21T20:41:00Z" w16du:dateUtc="2026-10-21T19:41:00Z"/>
+        </w:rPr>
+        <w:pPrChange w:id="327" w:author="kyle O'Reilly" w:date="2026-10-22T21:22:00Z" w16du:dateUtc="2026-10-22T20:22:00Z">
           <w:pPr/>
         </w:pPrChange>
       </w:pPr>
-      <w:ins w:id="300" w:author="kyle O'Reilly" w:date="2026-10-22T18:05:00Z" w16du:dateUtc="2026-10-22T17:05:00Z">
+      <w:ins w:id="328" w:author="kyle O'Reilly" w:date="2026-10-22T18:05:00Z" w16du:dateUtc="2026-10-22T17:05:00Z">
         <w:r>
           <w:t>The expected deliverables for this Capstone P</w:t>
         </w:r>
       </w:ins>
-      <w:ins w:id="301" w:author="kyle O'Reilly" w:date="2026-10-22T18:06:00Z" w16du:dateUtc="2026-10-22T17:06:00Z">
+      <w:ins w:id="329" w:author="kyle O'Reilly" w:date="2026-10-22T18:06:00Z" w16du:dateUtc="2026-10-22T17:06:00Z">
         <w:r>
           <w:t>roject</w:t>
         </w:r>
@@ -4244,12 +4381,12 @@
           <w:t xml:space="preserve"> will include a </w:t>
         </w:r>
       </w:ins>
-      <w:ins w:id="302" w:author="kyle O'Reilly" w:date="2026-10-22T18:09:00Z" w16du:dateUtc="2026-10-22T17:09:00Z">
+      <w:ins w:id="330" w:author="kyle O'Reilly" w:date="2026-10-22T18:09:00Z" w16du:dateUtc="2026-10-22T17:09:00Z">
         <w:r>
           <w:t>Jupyter</w:t>
         </w:r>
       </w:ins>
-      <w:ins w:id="303" w:author="kyle O'Reilly" w:date="2026-10-22T18:06:00Z" w16du:dateUtc="2026-10-22T17:06:00Z">
+      <w:ins w:id="331" w:author="kyle O'Reilly" w:date="2026-10-22T18:06:00Z" w16du:dateUtc="2026-10-22T17:06:00Z">
         <w:r>
           <w:t xml:space="preserve"> Notebook containing data preparation, model training, nin</w:t>
         </w:r>
@@ -4257,12 +4394,12 @@
           <w:t xml:space="preserve">e </w:t>
         </w:r>
       </w:ins>
-      <w:ins w:id="304" w:author="kyle O'Reilly" w:date="2026-10-22T18:07:00Z" w16du:dateUtc="2026-10-22T17:07:00Z">
+      <w:ins w:id="332" w:author="kyle O'Reilly" w:date="2026-10-22T18:07:00Z" w16du:dateUtc="2026-10-22T17:07:00Z">
         <w:r>
           <w:t>predictions and evaluation</w:t>
         </w:r>
       </w:ins>
-      <w:ins w:id="305" w:author="kyle O'Reilly" w:date="2026-10-22T18:08:00Z" w16du:dateUtc="2026-10-22T17:08:00Z">
+      <w:ins w:id="333" w:author="kyle O'Reilly" w:date="2026-10-22T18:08:00Z" w16du:dateUtc="2026-10-22T17:08:00Z">
         <w:r>
           <w:t>; a comparison on the JPMorgan Chase &amp; Co., Coca-Cola Co., and Intel Corp.</w:t>
         </w:r>
@@ -4270,7 +4407,7 @@
           <w:t>; three actual closing values; individual error calc</w:t>
         </w:r>
       </w:ins>
-      <w:ins w:id="306" w:author="kyle O'Reilly" w:date="2026-10-22T18:09:00Z" w16du:dateUtc="2026-10-22T17:09:00Z">
+      <w:ins w:id="334" w:author="kyle O'Reilly" w:date="2026-10-22T18:09:00Z" w16du:dateUtc="2026-10-22T17:09:00Z">
         <w:r>
           <w:t>ulations; a final report discussing findings and limitations; and a GitHub repository with code and permitted files.</w:t>
         </w:r>
@@ -4280,9 +4417,9 @@
       <w:pPr>
         <w:spacing w:line="360" w:lineRule="auto"/>
         <w:rPr>
-          <w:ins w:id="307" w:author="kyle O'Reilly" w:date="2026-10-21T20:41:00Z" w16du:dateUtc="2026-10-21T19:41:00Z"/>
-        </w:rPr>
-        <w:pPrChange w:id="308" w:author="kyle O'Reilly" w:date="2026-10-22T21:22:00Z" w16du:dateUtc="2026-10-22T20:22:00Z">
+          <w:ins w:id="335" w:author="kyle O'Reilly" w:date="2026-10-21T20:41:00Z" w16du:dateUtc="2026-10-21T19:41:00Z"/>
+        </w:rPr>
+        <w:pPrChange w:id="336" w:author="kyle O'Reilly" w:date="2026-10-22T21:22:00Z" w16du:dateUtc="2026-10-22T20:22:00Z">
           <w:pPr/>
         </w:pPrChange>
       </w:pPr>
@@ -4292,35 +4429,35 @@
         <w:pStyle w:val="Heading1"/>
         <w:spacing w:line="360" w:lineRule="auto"/>
         <w:jc w:val="both"/>
-        <w:pPrChange w:id="309" w:author="kyle O'Reilly" w:date="2026-10-22T21:22:00Z" w16du:dateUtc="2026-10-22T20:22:00Z">
+        <w:pPrChange w:id="337" w:author="kyle O'Reilly" w:date="2026-10-22T21:22:00Z" w16du:dateUtc="2026-10-22T20:22:00Z">
           <w:pPr/>
         </w:pPrChange>
       </w:pPr>
-      <w:bookmarkStart w:id="310" w:name="_Toc243601436"/>
-      <w:ins w:id="311" w:author="kyle O'Reilly" w:date="2026-10-21T20:41:00Z" w16du:dateUtc="2026-10-21T19:41:00Z">
+      <w:bookmarkStart w:id="338" w:name="_Toc243601436"/>
+      <w:ins w:id="339" w:author="kyle O'Reilly" w:date="2026-10-21T20:41:00Z" w16du:dateUtc="2026-10-21T19:41:00Z">
         <w:r>
           <w:t>9. Project Timeline</w:t>
         </w:r>
       </w:ins>
-      <w:bookmarkEnd w:id="310"/>
+      <w:bookmarkEnd w:id="338"/>
     </w:p>
     <w:p>
       <w:pPr>
         <w:spacing w:line="360" w:lineRule="auto"/>
         <w:jc w:val="both"/>
         <w:rPr>
-          <w:ins w:id="312" w:author="kyle O'Reilly" w:date="2026-10-22T18:18:00Z" w16du:dateUtc="2026-10-22T17:18:00Z"/>
-        </w:rPr>
-        <w:pPrChange w:id="313" w:author="kyle O'Reilly" w:date="2026-10-22T21:22:00Z" w16du:dateUtc="2026-10-22T20:22:00Z">
+          <w:ins w:id="340" w:author="kyle O'Reilly" w:date="2026-10-22T18:18:00Z" w16du:dateUtc="2026-10-22T17:18:00Z"/>
+        </w:rPr>
+        <w:pPrChange w:id="341" w:author="kyle O'Reilly" w:date="2026-10-22T21:22:00Z" w16du:dateUtc="2026-10-22T20:22:00Z">
           <w:pPr/>
         </w:pPrChange>
       </w:pPr>
-      <w:ins w:id="314" w:author="kyle O'Reilly" w:date="2026-10-22T18:13:00Z" w16du:dateUtc="2026-10-22T17:13:00Z">
+      <w:ins w:id="342" w:author="kyle O'Reilly" w:date="2026-10-22T18:13:00Z" w16du:dateUtc="2026-10-22T17:13:00Z">
         <w:r>
           <w:t>This Capstone Pro</w:t>
         </w:r>
       </w:ins>
-      <w:ins w:id="315" w:author="kyle O'Reilly" w:date="2026-10-22T18:15:00Z" w16du:dateUtc="2026-10-22T17:15:00Z">
+      <w:ins w:id="343" w:author="kyle O'Reilly" w:date="2026-10-22T18:15:00Z" w16du:dateUtc="2026-10-22T17:15:00Z">
         <w:r>
           <w:t xml:space="preserve">ject </w:t>
         </w:r>
@@ -4328,7 +4465,7 @@
           <w:t>is planned across academic semesters</w:t>
         </w:r>
       </w:ins>
-      <w:ins w:id="316" w:author="kyle O'Reilly" w:date="2026-10-22T18:16:00Z" w16du:dateUtc="2026-10-22T17:16:00Z">
+      <w:ins w:id="344" w:author="kyle O'Reilly" w:date="2026-10-22T18:16:00Z" w16du:dateUtc="2026-10-22T17:16:00Z">
         <w:r>
           <w:t xml:space="preserve">. The first semester </w:t>
         </w:r>
@@ -4339,7 +4476,7 @@
           <w:t xml:space="preserve">, data source </w:t>
         </w:r>
       </w:ins>
-      <w:ins w:id="317" w:author="kyle O'Reilly" w:date="2026-10-22T18:17:00Z" w16du:dateUtc="2026-10-22T17:17:00Z">
+      <w:ins w:id="345" w:author="kyle O'Reilly" w:date="2026-10-22T18:17:00Z" w16du:dateUtc="2026-10-22T17:17:00Z">
         <w:r>
           <w:t>and methodology. The second will focus on data preparation, model development, predictions</w:t>
         </w:r>
@@ -4347,7 +4484,7 @@
           <w:t>, evaluation, r</w:t>
         </w:r>
       </w:ins>
-      <w:ins w:id="318" w:author="kyle O'Reilly" w:date="2026-10-22T18:18:00Z" w16du:dateUtc="2026-10-22T17:18:00Z">
+      <w:ins w:id="346" w:author="kyle O'Reilly" w:date="2026-10-22T18:18:00Z" w16du:dateUtc="2026-10-22T17:18:00Z">
         <w:r>
           <w:t>eporting</w:t>
         </w:r>
@@ -4355,22 +4492,22 @@
           <w:t xml:space="preserve"> and submission. The </w:t>
         </w:r>
       </w:ins>
-      <w:ins w:id="319" w:author="kyle O'Reilly" w:date="2026-10-22T18:43:00Z" w16du:dateUtc="2026-10-22T17:43:00Z">
+      <w:ins w:id="347" w:author="kyle O'Reilly" w:date="2026-10-22T18:43:00Z" w16du:dateUtc="2026-10-22T17:43:00Z">
         <w:r>
           <w:t xml:space="preserve">proposed </w:t>
         </w:r>
       </w:ins>
-      <w:ins w:id="320" w:author="kyle O'Reilly" w:date="2026-10-22T18:18:00Z" w16du:dateUtc="2026-10-22T17:18:00Z">
+      <w:ins w:id="348" w:author="kyle O'Reilly" w:date="2026-10-22T18:18:00Z" w16du:dateUtc="2026-10-22T17:18:00Z">
         <w:r>
           <w:t>illustrate Gantt Chart</w:t>
         </w:r>
       </w:ins>
-      <w:ins w:id="321" w:author="kyle O'Reilly" w:date="2026-10-22T18:43:00Z" w16du:dateUtc="2026-10-22T17:43:00Z">
+      <w:ins w:id="349" w:author="kyle O'Reilly" w:date="2026-10-22T18:43:00Z" w16du:dateUtc="2026-10-22T17:43:00Z">
         <w:r>
           <w:t xml:space="preserve"> (See Figure 1)</w:t>
         </w:r>
       </w:ins>
-      <w:ins w:id="322" w:author="kyle O'Reilly" w:date="2026-10-22T18:18:00Z" w16du:dateUtc="2026-10-22T17:18:00Z">
+      <w:ins w:id="350" w:author="kyle O'Reilly" w:date="2026-10-22T18:18:00Z" w16du:dateUtc="2026-10-22T17:18:00Z">
         <w:r>
           <w:t xml:space="preserve"> below will be adjusted to the confirmed academic calendar.</w:t>
         </w:r>
@@ -4382,17 +4519,18 @@
         <w:spacing w:line="360" w:lineRule="auto"/>
         <w:jc w:val="center"/>
         <w:rPr>
-          <w:ins w:id="323" w:author="kyle O'Reilly" w:date="2026-10-22T18:40:00Z" w16du:dateUtc="2026-10-22T17:40:00Z"/>
-        </w:rPr>
-        <w:pPrChange w:id="324" w:author="kyle O'Reilly" w:date="2026-10-22T21:22:00Z" w16du:dateUtc="2026-10-22T20:22:00Z">
+          <w:ins w:id="351" w:author="kyle O'Reilly" w:date="2026-10-22T18:40:00Z" w16du:dateUtc="2026-10-22T17:40:00Z"/>
+        </w:rPr>
+        <w:pPrChange w:id="352" w:author="kyle O'Reilly" w:date="2026-10-22T21:22:00Z" w16du:dateUtc="2026-10-22T20:22:00Z">
           <w:pPr/>
         </w:pPrChange>
       </w:pPr>
-      <w:ins w:id="325" w:author="kyle O'Reilly" w:date="2026-10-22T18:42:00Z" w16du:dateUtc="2026-10-22T17:42:00Z">
+      <w:ins w:id="353" w:author="kyle O'Reilly" w:date="2026-10-22T18:42:00Z" w16du:dateUtc="2026-10-22T17:42:00Z">
         <w:r>
           <w:rPr>
             <w:noProof/>
           </w:rPr>
+          <w:lastRenderedPageBreak/>
           <w:drawing>
             <wp:inline distT="0" distB="0" distL="0" distR="0" wp14:anchorId="5A0A1F10" wp14:editId="68003201">
               <wp:extent cx="5731510" cy="2573655"/>
@@ -4437,13 +4575,13 @@
         <w:spacing w:line="360" w:lineRule="auto"/>
         <w:jc w:val="center"/>
         <w:rPr>
-          <w:ins w:id="326" w:author="kyle O'Reilly" w:date="2026-10-22T18:18:00Z" w16du:dateUtc="2026-10-22T17:18:00Z"/>
-        </w:rPr>
-        <w:pPrChange w:id="327" w:author="kyle O'Reilly" w:date="2026-10-22T21:22:00Z" w16du:dateUtc="2026-10-22T20:22:00Z">
+          <w:ins w:id="354" w:author="kyle O'Reilly" w:date="2026-10-22T18:18:00Z" w16du:dateUtc="2026-10-22T17:18:00Z"/>
+        </w:rPr>
+        <w:pPrChange w:id="355" w:author="kyle O'Reilly" w:date="2026-10-22T21:22:00Z" w16du:dateUtc="2026-10-22T20:22:00Z">
           <w:pPr/>
         </w:pPrChange>
       </w:pPr>
-      <w:ins w:id="328" w:author="kyle O'Reilly" w:date="2026-10-22T18:40:00Z" w16du:dateUtc="2026-10-22T17:40:00Z">
+      <w:ins w:id="356" w:author="kyle O'Reilly" w:date="2026-10-22T18:40:00Z" w16du:dateUtc="2026-10-22T17:40:00Z">
         <w:r>
           <w:t xml:space="preserve">Figure </w:t>
         </w:r>
@@ -4457,7 +4595,7 @@
       <w:r>
         <w:fldChar w:fldCharType="separate"/>
       </w:r>
-      <w:ins w:id="329" w:author="kyle O'Reilly" w:date="2026-10-22T18:40:00Z" w16du:dateUtc="2026-10-22T17:40:00Z">
+      <w:ins w:id="357" w:author="kyle O'Reilly" w:date="2026-10-22T18:40:00Z" w16du:dateUtc="2026-10-22T17:40:00Z">
         <w:r>
           <w:rPr>
             <w:noProof/>
@@ -4476,9 +4614,9 @@
       <w:pPr>
         <w:spacing w:line="360" w:lineRule="auto"/>
         <w:rPr>
-          <w:del w:id="330" w:author="kyle O'Reilly" w:date="2026-10-22T18:41:00Z" w16du:dateUtc="2026-10-22T17:41:00Z"/>
-        </w:rPr>
-        <w:pPrChange w:id="331" w:author="kyle O'Reilly" w:date="2026-10-22T21:22:00Z" w16du:dateUtc="2026-10-22T20:22:00Z">
+          <w:del w:id="358" w:author="kyle O'Reilly" w:date="2026-10-22T18:41:00Z" w16du:dateUtc="2026-10-22T17:41:00Z"/>
+        </w:rPr>
+        <w:pPrChange w:id="359" w:author="kyle O'Reilly" w:date="2026-10-22T21:22:00Z" w16du:dateUtc="2026-10-22T20:22:00Z">
           <w:pPr/>
         </w:pPrChange>
       </w:pPr>
@@ -4487,9 +4625,9 @@
       <w:pPr>
         <w:spacing w:line="360" w:lineRule="auto"/>
         <w:rPr>
-          <w:ins w:id="332" w:author="kyle O'Reilly" w:date="2026-10-21T20:41:00Z" w16du:dateUtc="2026-10-21T19:41:00Z"/>
-        </w:rPr>
-        <w:pPrChange w:id="333" w:author="kyle O'Reilly" w:date="2026-10-22T21:22:00Z" w16du:dateUtc="2026-10-22T20:22:00Z">
+          <w:ins w:id="360" w:author="kyle O'Reilly" w:date="2026-10-21T20:41:00Z" w16du:dateUtc="2026-10-21T19:41:00Z"/>
+        </w:rPr>
+        <w:pPrChange w:id="361" w:author="kyle O'Reilly" w:date="2026-10-22T21:22:00Z" w16du:dateUtc="2026-10-22T20:22:00Z">
           <w:pPr/>
         </w:pPrChange>
       </w:pPr>
@@ -4500,19 +4638,18 @@
         <w:spacing w:line="360" w:lineRule="auto"/>
         <w:jc w:val="both"/>
         <w:rPr>
-          <w:ins w:id="334" w:author="kyle O'Reilly" w:date="2026-10-21T20:41:00Z" w16du:dateUtc="2026-10-21T19:41:00Z"/>
-        </w:rPr>
-        <w:pPrChange w:id="335" w:author="kyle O'Reilly" w:date="2026-10-22T21:22:00Z" w16du:dateUtc="2026-10-22T20:22:00Z">
+          <w:ins w:id="362" w:author="kyle O'Reilly" w:date="2026-10-21T20:41:00Z" w16du:dateUtc="2026-10-21T19:41:00Z"/>
+        </w:rPr>
+        <w:pPrChange w:id="363" w:author="kyle O'Reilly" w:date="2026-10-22T21:22:00Z" w16du:dateUtc="2026-10-22T20:22:00Z">
           <w:pPr/>
         </w:pPrChange>
       </w:pPr>
-      <w:bookmarkStart w:id="336" w:name="_Toc243601437"/>
-      <w:ins w:id="337" w:author="kyle O'Reilly" w:date="2026-10-21T20:41:00Z" w16du:dateUtc="2026-10-21T19:41:00Z">
-        <w:r>
-          <w:lastRenderedPageBreak/>
+      <w:bookmarkStart w:id="364" w:name="_Toc243601437"/>
+      <w:ins w:id="365" w:author="kyle O'Reilly" w:date="2026-10-21T20:41:00Z" w16du:dateUtc="2026-10-21T19:41:00Z">
+        <w:r>
           <w:t>10. Ethical and Legal Considerations</w:t>
         </w:r>
-        <w:bookmarkEnd w:id="336"/>
+        <w:bookmarkEnd w:id="364"/>
       </w:ins>
     </w:p>
     <w:p>
@@ -4520,18 +4657,18 @@
         <w:spacing w:line="360" w:lineRule="auto"/>
         <w:jc w:val="both"/>
         <w:rPr>
-          <w:ins w:id="338" w:author="kyle O'Reilly" w:date="2026-10-21T20:46:00Z" w16du:dateUtc="2026-10-21T19:46:00Z"/>
-        </w:rPr>
-        <w:pPrChange w:id="339" w:author="kyle O'Reilly" w:date="2026-10-22T21:22:00Z" w16du:dateUtc="2026-10-22T20:22:00Z">
+          <w:ins w:id="366" w:author="kyle O'Reilly" w:date="2026-10-21T20:46:00Z" w16du:dateUtc="2026-10-21T19:46:00Z"/>
+        </w:rPr>
+        <w:pPrChange w:id="367" w:author="kyle O'Reilly" w:date="2026-10-22T21:22:00Z" w16du:dateUtc="2026-10-22T20:22:00Z">
           <w:pPr/>
         </w:pPrChange>
       </w:pPr>
-      <w:ins w:id="340" w:author="kyle O'Reilly" w:date="2026-10-21T20:42:00Z" w16du:dateUtc="2026-10-21T19:42:00Z">
+      <w:ins w:id="368" w:author="kyle O'Reilly" w:date="2026-10-21T20:42:00Z" w16du:dateUtc="2026-10-21T19:42:00Z">
         <w:r>
           <w:t>This C</w:t>
         </w:r>
       </w:ins>
-      <w:ins w:id="341" w:author="kyle O'Reilly" w:date="2026-10-21T20:43:00Z" w16du:dateUtc="2026-10-21T19:43:00Z">
+      <w:ins w:id="369" w:author="kyle O'Reilly" w:date="2026-10-21T20:43:00Z" w16du:dateUtc="2026-10-21T19:43:00Z">
         <w:r>
           <w:t xml:space="preserve">apstone Project will use </w:t>
         </w:r>
@@ -4542,12 +4679,12 @@
           <w:t>historical stock</w:t>
         </w:r>
       </w:ins>
-      <w:ins w:id="342" w:author="kyle O'Reilly" w:date="2026-10-21T22:01:00Z" w16du:dateUtc="2026-10-21T21:01:00Z">
+      <w:ins w:id="370" w:author="kyle O'Reilly" w:date="2026-10-21T22:01:00Z" w16du:dateUtc="2026-10-21T21:01:00Z">
         <w:r>
           <w:t xml:space="preserve"> </w:t>
         </w:r>
       </w:ins>
-      <w:ins w:id="343" w:author="kyle O'Reilly" w:date="2026-10-21T20:43:00Z" w16du:dateUtc="2026-10-21T19:43:00Z">
+      <w:ins w:id="371" w:author="kyle O'Reilly" w:date="2026-10-21T20:43:00Z" w16du:dateUtc="2026-10-21T19:43:00Z">
         <w:r>
           <w:t xml:space="preserve">data </w:t>
         </w:r>
@@ -4558,7 +4695,7 @@
           <w:t xml:space="preserve">collect personal information or involve human </w:t>
         </w:r>
       </w:ins>
-      <w:ins w:id="344" w:author="kyle O'Reilly" w:date="2026-10-21T20:44:00Z" w16du:dateUtc="2026-10-21T19:44:00Z">
+      <w:ins w:id="372" w:author="kyle O'Reilly" w:date="2026-10-21T20:44:00Z" w16du:dateUtc="2026-10-21T19:44:00Z">
         <w:r>
           <w:t>participants. Stooq data access and usage conditions, and any Trading 212</w:t>
         </w:r>
@@ -4566,22 +4703,22 @@
           <w:t xml:space="preserve"> information reused in the report, will be reviewed and appropriately attributed</w:t>
         </w:r>
       </w:ins>
-      <w:ins w:id="345" w:author="kyle O'Reilly" w:date="2026-10-21T20:45:00Z" w16du:dateUtc="2026-10-21T19:45:00Z">
+      <w:ins w:id="373" w:author="kyle O'Reilly" w:date="2026-10-21T20:45:00Z" w16du:dateUtc="2026-10-21T19:45:00Z">
         <w:r>
           <w:t xml:space="preserve">. Historical stock </w:t>
         </w:r>
       </w:ins>
-      <w:ins w:id="346" w:author="kyle O'Reilly" w:date="2026-10-21T22:03:00Z" w16du:dateUtc="2026-10-21T21:03:00Z">
+      <w:ins w:id="374" w:author="kyle O'Reilly" w:date="2026-10-21T22:03:00Z" w16du:dateUtc="2026-10-21T21:03:00Z">
         <w:r>
           <w:t xml:space="preserve">market </w:t>
         </w:r>
       </w:ins>
-      <w:ins w:id="347" w:author="kyle O'Reilly" w:date="2026-10-21T20:45:00Z" w16du:dateUtc="2026-10-21T19:45:00Z">
+      <w:ins w:id="375" w:author="kyle O'Reilly" w:date="2026-10-21T20:45:00Z" w16du:dateUtc="2026-10-21T19:45:00Z">
         <w:r>
           <w:t xml:space="preserve">data </w:t>
         </w:r>
       </w:ins>
-      <w:ins w:id="348" w:author="kyle O'Reilly" w:date="2026-10-21T22:11:00Z" w16du:dateUtc="2026-10-21T21:11:00Z">
+      <w:ins w:id="376" w:author="kyle O'Reilly" w:date="2026-10-21T22:11:00Z" w16du:dateUtc="2026-10-21T21:11:00Z">
         <w:r>
           <w:t>Comma</w:t>
         </w:r>
@@ -4592,37 +4729,37 @@
           <w:t>(</w:t>
         </w:r>
       </w:ins>
-      <w:ins w:id="349" w:author="kyle O'Reilly" w:date="2026-10-21T22:05:00Z" w16du:dateUtc="2026-10-21T21:05:00Z">
+      <w:ins w:id="377" w:author="kyle O'Reilly" w:date="2026-10-21T22:05:00Z" w16du:dateUtc="2026-10-21T21:05:00Z">
         <w:r>
           <w:t>CSV</w:t>
         </w:r>
       </w:ins>
-      <w:ins w:id="350" w:author="kyle O'Reilly" w:date="2026-10-21T22:11:00Z" w16du:dateUtc="2026-10-21T21:11:00Z">
+      <w:ins w:id="378" w:author="kyle O'Reilly" w:date="2026-10-21T22:11:00Z" w16du:dateUtc="2026-10-21T21:11:00Z">
         <w:r>
           <w:t>)</w:t>
         </w:r>
       </w:ins>
-      <w:ins w:id="351" w:author="kyle O'Reilly" w:date="2026-10-21T22:05:00Z" w16du:dateUtc="2026-10-21T21:05:00Z">
+      <w:ins w:id="379" w:author="kyle O'Reilly" w:date="2026-10-21T22:05:00Z" w16du:dateUtc="2026-10-21T21:05:00Z">
         <w:r>
           <w:t xml:space="preserve"> </w:t>
         </w:r>
       </w:ins>
-      <w:ins w:id="352" w:author="kyle O'Reilly" w:date="2026-10-21T20:45:00Z" w16du:dateUtc="2026-10-21T19:45:00Z">
+      <w:ins w:id="380" w:author="kyle O'Reilly" w:date="2026-10-21T20:45:00Z" w16du:dateUtc="2026-10-21T19:45:00Z">
         <w:r>
           <w:t>files</w:t>
         </w:r>
       </w:ins>
-      <w:ins w:id="353" w:author="kyle O'Reilly" w:date="2026-10-21T22:07:00Z" w16du:dateUtc="2026-10-21T21:07:00Z">
+      <w:ins w:id="381" w:author="kyle O'Reilly" w:date="2026-10-21T22:07:00Z" w16du:dateUtc="2026-10-21T21:07:00Z">
         <w:r>
           <w:t xml:space="preserve"> downloaded from S</w:t>
         </w:r>
       </w:ins>
-      <w:ins w:id="354" w:author="kyle O'Reilly" w:date="2026-10-21T22:08:00Z" w16du:dateUtc="2026-10-21T21:08:00Z">
+      <w:ins w:id="382" w:author="kyle O'Reilly" w:date="2026-10-21T22:08:00Z" w16du:dateUtc="2026-10-21T21:08:00Z">
         <w:r>
           <w:t>tooq</w:t>
         </w:r>
       </w:ins>
-      <w:ins w:id="355" w:author="kyle O'Reilly" w:date="2026-10-21T20:45:00Z" w16du:dateUtc="2026-10-21T19:45:00Z">
+      <w:ins w:id="383" w:author="kyle O'Reilly" w:date="2026-10-21T20:45:00Z" w16du:dateUtc="2026-10-21T19:45:00Z">
         <w:r>
           <w:t xml:space="preserve"> </w:t>
         </w:r>
@@ -4630,37 +4767,37 @@
           <w:t xml:space="preserve">will only be </w:t>
         </w:r>
       </w:ins>
-      <w:ins w:id="356" w:author="kyle O'Reilly" w:date="2026-10-21T22:08:00Z" w16du:dateUtc="2026-10-21T21:08:00Z">
+      <w:ins w:id="384" w:author="kyle O'Reilly" w:date="2026-10-21T22:08:00Z" w16du:dateUtc="2026-10-21T21:08:00Z">
         <w:r>
           <w:t>uploaded to</w:t>
         </w:r>
       </w:ins>
-      <w:ins w:id="357" w:author="kyle O'Reilly" w:date="2026-10-21T20:45:00Z" w16du:dateUtc="2026-10-21T19:45:00Z">
+      <w:ins w:id="385" w:author="kyle O'Reilly" w:date="2026-10-21T20:45:00Z" w16du:dateUtc="2026-10-21T19:45:00Z">
         <w:r>
           <w:t xml:space="preserve"> </w:t>
         </w:r>
       </w:ins>
-      <w:ins w:id="358" w:author="kyle O'Reilly" w:date="2026-10-21T20:48:00Z" w16du:dateUtc="2026-10-21T19:48:00Z">
+      <w:ins w:id="386" w:author="kyle O'Reilly" w:date="2026-10-21T20:48:00Z" w16du:dateUtc="2026-10-21T19:48:00Z">
         <w:r>
           <w:t>GitHub</w:t>
         </w:r>
       </w:ins>
-      <w:ins w:id="359" w:author="kyle O'Reilly" w:date="2026-10-21T20:45:00Z" w16du:dateUtc="2026-10-21T19:45:00Z">
+      <w:ins w:id="387" w:author="kyle O'Reilly" w:date="2026-10-21T20:45:00Z" w16du:dateUtc="2026-10-21T19:45:00Z">
         <w:r>
           <w:t xml:space="preserve"> </w:t>
         </w:r>
       </w:ins>
-      <w:ins w:id="360" w:author="kyle O'Reilly" w:date="2026-10-21T22:07:00Z" w16du:dateUtc="2026-10-21T21:07:00Z">
+      <w:ins w:id="388" w:author="kyle O'Reilly" w:date="2026-10-21T22:07:00Z" w16du:dateUtc="2026-10-21T21:07:00Z">
         <w:r>
           <w:t>if permitted by Stooq’s terms of service</w:t>
         </w:r>
       </w:ins>
-      <w:ins w:id="361" w:author="kyle O'Reilly" w:date="2026-10-21T20:45:00Z" w16du:dateUtc="2026-10-21T19:45:00Z">
+      <w:ins w:id="389" w:author="kyle O'Reilly" w:date="2026-10-21T20:45:00Z" w16du:dateUtc="2026-10-21T19:45:00Z">
         <w:r>
           <w:t xml:space="preserve">; otherwise, </w:t>
         </w:r>
       </w:ins>
-      <w:ins w:id="362" w:author="kyle O'Reilly" w:date="2026-10-21T22:07:00Z" w16du:dateUtc="2026-10-21T21:07:00Z">
+      <w:ins w:id="390" w:author="kyle O'Reilly" w:date="2026-10-21T22:07:00Z" w16du:dateUtc="2026-10-21T21:07:00Z">
         <w:r>
           <w:t xml:space="preserve">the </w:t>
         </w:r>
@@ -4668,22 +4805,22 @@
           <w:t>Pyt</w:t>
         </w:r>
       </w:ins>
-      <w:ins w:id="363" w:author="kyle O'Reilly" w:date="2026-10-22T00:14:00Z" w16du:dateUtc="2026-10-21T23:14:00Z">
+      <w:ins w:id="391" w:author="kyle O'Reilly" w:date="2026-10-22T00:14:00Z" w16du:dateUtc="2026-10-21T23:14:00Z">
         <w:r>
           <w:t>h</w:t>
         </w:r>
       </w:ins>
-      <w:ins w:id="364" w:author="kyle O'Reilly" w:date="2026-10-21T22:07:00Z" w16du:dateUtc="2026-10-21T21:07:00Z">
+      <w:ins w:id="392" w:author="kyle O'Reilly" w:date="2026-10-21T22:07:00Z" w16du:dateUtc="2026-10-21T21:07:00Z">
         <w:r>
           <w:t xml:space="preserve">on </w:t>
         </w:r>
       </w:ins>
-      <w:ins w:id="365" w:author="kyle O'Reilly" w:date="2026-10-21T20:45:00Z" w16du:dateUtc="2026-10-21T19:45:00Z">
+      <w:ins w:id="393" w:author="kyle O'Reilly" w:date="2026-10-21T20:45:00Z" w16du:dateUtc="2026-10-21T19:45:00Z">
         <w:r>
           <w:t xml:space="preserve">code and retrieval </w:t>
         </w:r>
       </w:ins>
-      <w:ins w:id="366" w:author="kyle O'Reilly" w:date="2026-10-21T20:46:00Z" w16du:dateUtc="2026-10-21T19:46:00Z">
+      <w:ins w:id="394" w:author="kyle O'Reilly" w:date="2026-10-21T20:46:00Z" w16du:dateUtc="2026-10-21T19:46:00Z">
         <w:r>
           <w:t xml:space="preserve">instructions will be provided. </w:t>
         </w:r>
@@ -4694,15 +4831,15 @@
         <w:spacing w:line="360" w:lineRule="auto"/>
         <w:jc w:val="both"/>
         <w:rPr>
-          <w:ins w:id="367" w:author="kyle O'Reilly" w:date="2026-10-22T21:22:00Z" w16du:dateUtc="2026-10-22T20:22:00Z"/>
-        </w:rPr>
-        <w:pPrChange w:id="368" w:author="kyle O'Reilly" w:date="2026-10-22T21:23:00Z" w16du:dateUtc="2026-10-22T20:23:00Z">
+          <w:ins w:id="395" w:author="kyle O'Reilly" w:date="2026-10-22T21:22:00Z" w16du:dateUtc="2026-10-22T20:22:00Z"/>
+        </w:rPr>
+        <w:pPrChange w:id="396" w:author="kyle O'Reilly" w:date="2026-10-22T21:23:00Z" w16du:dateUtc="2026-10-22T20:23:00Z">
           <w:pPr>
             <w:pStyle w:val="Heading1"/>
           </w:pPr>
         </w:pPrChange>
       </w:pPr>
-      <w:ins w:id="369" w:author="kyle O'Reilly" w:date="2026-10-21T22:09:00Z" w16du:dateUtc="2026-10-21T21:09:00Z">
+      <w:ins w:id="397" w:author="kyle O'Reilly" w:date="2026-10-21T22:09:00Z" w16du:dateUtc="2026-10-21T21:09:00Z">
         <w:r>
           <w:t>All results</w:t>
         </w:r>
@@ -4710,57 +4847,57 @@
           <w:t>,</w:t>
         </w:r>
       </w:ins>
-      <w:ins w:id="370" w:author="kyle O'Reilly" w:date="2026-10-21T20:47:00Z" w16du:dateUtc="2026-10-21T19:47:00Z">
+      <w:ins w:id="398" w:author="kyle O'Reilly" w:date="2026-10-21T20:47:00Z" w16du:dateUtc="2026-10-21T19:47:00Z">
         <w:r>
           <w:t xml:space="preserve"> including </w:t>
         </w:r>
       </w:ins>
-      <w:ins w:id="371" w:author="kyle O'Reilly" w:date="2026-10-21T22:10:00Z" w16du:dateUtc="2026-10-21T21:10:00Z">
+      <w:ins w:id="399" w:author="kyle O'Reilly" w:date="2026-10-21T22:10:00Z" w16du:dateUtc="2026-10-21T21:10:00Z">
         <w:r>
           <w:t>inaccurate</w:t>
         </w:r>
       </w:ins>
-      <w:ins w:id="372" w:author="kyle O'Reilly" w:date="2026-10-21T20:47:00Z" w16du:dateUtc="2026-10-21T19:47:00Z">
+      <w:ins w:id="400" w:author="kyle O'Reilly" w:date="2026-10-21T20:47:00Z" w16du:dateUtc="2026-10-21T19:47:00Z">
         <w:r>
           <w:t xml:space="preserve"> predictions, will be reported transparently. Th</w:t>
         </w:r>
       </w:ins>
-      <w:ins w:id="373" w:author="kyle O'Reilly" w:date="2026-10-21T22:10:00Z" w16du:dateUtc="2026-10-21T21:10:00Z">
+      <w:ins w:id="401" w:author="kyle O'Reilly" w:date="2026-10-21T22:10:00Z" w16du:dateUtc="2026-10-21T21:10:00Z">
         <w:r>
           <w:t>is Capstone Project</w:t>
         </w:r>
       </w:ins>
-      <w:ins w:id="374" w:author="kyle O'Reilly" w:date="2026-10-21T20:47:00Z" w16du:dateUtc="2026-10-21T19:47:00Z">
+      <w:ins w:id="402" w:author="kyle O'Reilly" w:date="2026-10-21T20:47:00Z" w16du:dateUtc="2026-10-21T19:47:00Z">
         <w:r>
           <w:t xml:space="preserve"> work is for academic purposes</w:t>
         </w:r>
       </w:ins>
-      <w:ins w:id="375" w:author="kyle O'Reilly" w:date="2026-10-21T22:10:00Z" w16du:dateUtc="2026-10-21T21:10:00Z">
+      <w:ins w:id="403" w:author="kyle O'Reilly" w:date="2026-10-21T22:10:00Z" w16du:dateUtc="2026-10-21T21:10:00Z">
         <w:r>
           <w:t xml:space="preserve"> only</w:t>
         </w:r>
       </w:ins>
-      <w:ins w:id="376" w:author="kyle O'Reilly" w:date="2026-10-21T20:47:00Z" w16du:dateUtc="2026-10-21T19:47:00Z">
+      <w:ins w:id="404" w:author="kyle O'Reilly" w:date="2026-10-21T20:47:00Z" w16du:dateUtc="2026-10-21T19:47:00Z">
         <w:r>
           <w:t xml:space="preserve"> and does </w:t>
         </w:r>
       </w:ins>
-      <w:ins w:id="377" w:author="kyle O'Reilly" w:date="2026-10-22T00:14:00Z" w16du:dateUtc="2026-10-21T23:14:00Z">
+      <w:ins w:id="405" w:author="kyle O'Reilly" w:date="2026-10-22T00:14:00Z" w16du:dateUtc="2026-10-21T23:14:00Z">
         <w:r>
           <w:t xml:space="preserve">not </w:t>
         </w:r>
       </w:ins>
-      <w:ins w:id="378" w:author="kyle O'Reilly" w:date="2026-10-21T20:47:00Z" w16du:dateUtc="2026-10-21T19:47:00Z">
+      <w:ins w:id="406" w:author="kyle O'Reilly" w:date="2026-10-21T20:47:00Z" w16du:dateUtc="2026-10-21T19:47:00Z">
         <w:r>
           <w:t>constitute financial inv</w:t>
         </w:r>
       </w:ins>
-      <w:ins w:id="379" w:author="kyle O'Reilly" w:date="2026-10-21T20:48:00Z" w16du:dateUtc="2026-10-21T19:48:00Z">
+      <w:ins w:id="407" w:author="kyle O'Reilly" w:date="2026-10-21T20:48:00Z" w16du:dateUtc="2026-10-21T19:48:00Z">
         <w:r>
           <w:t>estment</w:t>
         </w:r>
       </w:ins>
-      <w:ins w:id="380" w:author="kyle O'Reilly" w:date="2026-10-21T20:47:00Z" w16du:dateUtc="2026-10-21T19:47:00Z">
+      <w:ins w:id="408" w:author="kyle O'Reilly" w:date="2026-10-21T20:47:00Z" w16du:dateUtc="2026-10-21T19:47:00Z">
         <w:r>
           <w:t xml:space="preserve"> advice.</w:t>
         </w:r>
@@ -4770,7 +4907,7 @@
       <w:pPr>
         <w:pStyle w:val="Heading1"/>
         <w:rPr>
-          <w:ins w:id="381" w:author="kyle O'Reilly" w:date="2026-10-22T21:23:00Z" w16du:dateUtc="2026-10-22T20:23:00Z"/>
+          <w:ins w:id="409" w:author="kyle O'Reilly" w:date="2026-10-22T21:23:00Z" w16du:dateUtc="2026-10-22T20:23:00Z"/>
         </w:rPr>
       </w:pPr>
     </w:p>
@@ -4778,7 +4915,7 @@
       <w:pPr>
         <w:pStyle w:val="Heading1"/>
         <w:rPr>
-          <w:ins w:id="382" w:author="kyle O'Reilly" w:date="2026-10-22T21:23:00Z" w16du:dateUtc="2026-10-22T20:23:00Z"/>
+          <w:ins w:id="410" w:author="kyle O'Reilly" w:date="2026-10-22T21:23:00Z" w16du:dateUtc="2026-10-22T20:23:00Z"/>
         </w:rPr>
       </w:pPr>
     </w:p>
@@ -4786,7 +4923,7 @@
       <w:pPr>
         <w:pStyle w:val="Heading1"/>
         <w:rPr>
-          <w:ins w:id="383" w:author="kyle O'Reilly" w:date="2026-10-22T21:23:00Z" w16du:dateUtc="2026-10-22T20:23:00Z"/>
+          <w:ins w:id="411" w:author="kyle O'Reilly" w:date="2026-10-22T21:23:00Z" w16du:dateUtc="2026-10-22T20:23:00Z"/>
         </w:rPr>
       </w:pPr>
     </w:p>
@@ -4794,7 +4931,7 @@
       <w:pPr>
         <w:pStyle w:val="Heading1"/>
         <w:rPr>
-          <w:ins w:id="384" w:author="kyle O'Reilly" w:date="2026-10-22T21:23:00Z" w16du:dateUtc="2026-10-22T20:23:00Z"/>
+          <w:ins w:id="412" w:author="kyle O'Reilly" w:date="2026-10-22T21:23:00Z" w16du:dateUtc="2026-10-22T20:23:00Z"/>
         </w:rPr>
       </w:pPr>
     </w:p>
@@ -4802,18 +4939,18 @@
       <w:pPr>
         <w:pStyle w:val="Heading1"/>
         <w:rPr>
-          <w:ins w:id="385" w:author="kyle O'Reilly" w:date="2026-10-21T23:38:00Z" w16du:dateUtc="2026-10-21T22:38:00Z"/>
-        </w:rPr>
-        <w:pPrChange w:id="386" w:author="kyle O'Reilly" w:date="2026-10-22T18:11:00Z" w16du:dateUtc="2026-10-22T17:11:00Z">
+          <w:ins w:id="413" w:author="kyle O'Reilly" w:date="2026-10-21T23:38:00Z" w16du:dateUtc="2026-10-21T22:38:00Z"/>
+        </w:rPr>
+        <w:pPrChange w:id="414" w:author="kyle O'Reilly" w:date="2026-10-22T18:11:00Z" w16du:dateUtc="2026-10-22T17:11:00Z">
           <w:pPr/>
         </w:pPrChange>
       </w:pPr>
-      <w:bookmarkStart w:id="387" w:name="_Toc243601438"/>
-      <w:ins w:id="388" w:author="kyle O'Reilly" w:date="2026-10-21T20:42:00Z" w16du:dateUtc="2026-10-21T19:42:00Z">
+      <w:bookmarkStart w:id="415" w:name="_Toc243601438"/>
+      <w:ins w:id="416" w:author="kyle O'Reilly" w:date="2026-10-21T20:42:00Z" w16du:dateUtc="2026-10-21T19:42:00Z">
         <w:r>
           <w:t>References</w:t>
         </w:r>
-        <w:bookmarkEnd w:id="387"/>
+        <w:bookmarkEnd w:id="415"/>
         <w:r>
           <w:t xml:space="preserve"> </w:t>
         </w:r>
@@ -4822,10 +4959,10 @@
     <w:p>
       <w:pPr>
         <w:rPr>
-          <w:ins w:id="389" w:author="kyle O'Reilly" w:date="2026-10-22T22:46:00Z" w16du:dateUtc="2026-10-22T21:46:00Z"/>
-        </w:rPr>
-      </w:pPr>
-      <w:ins w:id="390" w:author="kyle O'Reilly" w:date="2026-10-22T22:46:00Z" w16du:dateUtc="2026-10-22T21:46:00Z">
+          <w:ins w:id="417" w:author="kyle O'Reilly" w:date="2026-10-22T22:46:00Z" w16du:dateUtc="2026-10-22T21:46:00Z"/>
+        </w:rPr>
+      </w:pPr>
+      <w:ins w:id="418" w:author="kyle O'Reilly" w:date="2026-10-22T22:46:00Z" w16du:dateUtc="2026-10-22T21:46:00Z">
         <w:r>
           <w:t>Section 2</w:t>
         </w:r>
@@ -4834,25 +4971,25 @@
     <w:p>
       <w:pPr>
         <w:rPr>
-          <w:ins w:id="391" w:author="kyle O'Reilly" w:date="2026-10-22T22:59:00Z" w16du:dateUtc="2026-10-22T21:59:00Z"/>
-        </w:rPr>
-      </w:pPr>
-      <w:ins w:id="392" w:author="kyle O'Reilly" w:date="2026-10-22T22:58:00Z" w16du:dateUtc="2026-10-22T21:58:00Z">
+          <w:ins w:id="419" w:author="kyle O'Reilly" w:date="2026-10-22T22:59:00Z" w16du:dateUtc="2026-10-22T21:59:00Z"/>
+        </w:rPr>
+      </w:pPr>
+      <w:ins w:id="420" w:author="kyle O'Reilly" w:date="2026-10-22T22:58:00Z" w16du:dateUtc="2026-10-22T21:58:00Z">
         <w:r>
           <w:rPr>
             <w:highlight w:val="red"/>
-            <w:rPrChange w:id="393" w:author="kyle O'Reilly" w:date="2026-10-22T22:59:00Z" w16du:dateUtc="2026-10-22T21:59:00Z">
+            <w:rPrChange w:id="421" w:author="kyle O'Reilly" w:date="2026-10-22T22:59:00Z" w16du:dateUtc="2026-10-22T21:59:00Z">
               <w:rPr/>
             </w:rPrChange>
           </w:rPr>
           <w:t>Need to do refer</w:t>
         </w:r>
       </w:ins>
-      <w:ins w:id="394" w:author="kyle O'Reilly" w:date="2026-10-22T22:59:00Z" w16du:dateUtc="2026-10-22T21:59:00Z">
+      <w:ins w:id="422" w:author="kyle O'Reilly" w:date="2026-10-22T22:59:00Z" w16du:dateUtc="2026-10-22T21:59:00Z">
         <w:r>
           <w:rPr>
             <w:highlight w:val="red"/>
-            <w:rPrChange w:id="395" w:author="kyle O'Reilly" w:date="2026-10-22T22:59:00Z" w16du:dateUtc="2026-10-22T21:59:00Z">
+            <w:rPrChange w:id="423" w:author="kyle O'Reilly" w:date="2026-10-22T22:59:00Z" w16du:dateUtc="2026-10-22T21:59:00Z">
               <w:rPr/>
             </w:rPrChange>
           </w:rPr>
@@ -4866,18 +5003,19 @@
     <w:p>
       <w:pPr>
         <w:rPr>
-          <w:ins w:id="396" w:author="kyle O'Reilly" w:date="2026-10-22T22:46:00Z" w16du:dateUtc="2026-10-22T21:46:00Z"/>
-        </w:rPr>
-      </w:pPr>
-    </w:p>
-    <w:p>
-      <w:pPr>
-        <w:rPr>
-          <w:ins w:id="397" w:author="kyle O'Reilly" w:date="2026-10-22T19:06:00Z" w16du:dateUtc="2026-10-22T18:06:00Z"/>
-        </w:rPr>
-      </w:pPr>
-      <w:ins w:id="398" w:author="kyle O'Reilly" w:date="2026-10-22T19:06:00Z" w16du:dateUtc="2026-10-22T18:06:00Z">
-        <w:r>
+          <w:ins w:id="424" w:author="kyle O'Reilly" w:date="2026-10-22T22:46:00Z" w16du:dateUtc="2026-10-22T21:46:00Z"/>
+        </w:rPr>
+      </w:pPr>
+    </w:p>
+    <w:p>
+      <w:pPr>
+        <w:rPr>
+          <w:ins w:id="425" w:author="kyle O'Reilly" w:date="2026-10-22T19:06:00Z" w16du:dateUtc="2026-10-22T18:06:00Z"/>
+        </w:rPr>
+      </w:pPr>
+      <w:ins w:id="426" w:author="kyle O'Reilly" w:date="2026-10-22T19:06:00Z" w16du:dateUtc="2026-10-22T18:06:00Z">
+        <w:r>
+          <w:lastRenderedPageBreak/>
           <w:t>Section 5</w:t>
         </w:r>
       </w:ins>
@@ -4885,20 +5023,20 @@
     <w:p>
       <w:pPr>
         <w:rPr>
-          <w:ins w:id="399" w:author="kyle O'Reilly" w:date="2026-10-22T19:08:00Z" w16du:dateUtc="2026-10-22T18:08:00Z"/>
-        </w:rPr>
-      </w:pPr>
-      <w:ins w:id="400" w:author="kyle O'Reilly" w:date="2026-10-22T19:06:00Z" w16du:dateUtc="2026-10-22T18:06:00Z">
+          <w:ins w:id="427" w:author="kyle O'Reilly" w:date="2026-10-22T19:08:00Z" w16du:dateUtc="2026-10-22T18:08:00Z"/>
+        </w:rPr>
+      </w:pPr>
+      <w:ins w:id="428" w:author="kyle O'Reilly" w:date="2026-10-22T19:06:00Z" w16du:dateUtc="2026-10-22T18:06:00Z">
         <w:r>
           <w:t>Tra</w:t>
         </w:r>
       </w:ins>
-      <w:ins w:id="401" w:author="kyle O'Reilly" w:date="2026-10-22T19:07:00Z" w16du:dateUtc="2026-10-22T18:07:00Z">
+      <w:ins w:id="429" w:author="kyle O'Reilly" w:date="2026-10-22T19:07:00Z" w16du:dateUtc="2026-10-22T18:07:00Z">
         <w:r>
           <w:t xml:space="preserve">ding 212 (n.d.) Trading 212 investment platform. Available at: </w:t>
         </w:r>
       </w:ins>
-      <w:ins w:id="402" w:author="kyle O'Reilly" w:date="2026-10-22T19:08:00Z" w16du:dateUtc="2026-10-22T18:08:00Z">
+      <w:ins w:id="430" w:author="kyle O'Reilly" w:date="2026-10-22T19:08:00Z" w16du:dateUtc="2026-10-22T18:08:00Z">
         <w:r>
           <w:fldChar w:fldCharType="begin"/>
         </w:r>
@@ -4906,12 +5044,12 @@
           <w:instrText>HYPERLINK "</w:instrText>
         </w:r>
       </w:ins>
-      <w:ins w:id="403" w:author="kyle O'Reilly" w:date="2026-10-22T19:07:00Z" w16du:dateUtc="2026-10-22T18:07:00Z">
+      <w:ins w:id="431" w:author="kyle O'Reilly" w:date="2026-10-22T19:07:00Z" w16du:dateUtc="2026-10-22T18:07:00Z">
         <w:r>
           <w:instrText>https://www.trading212.com/</w:instrText>
         </w:r>
       </w:ins>
-      <w:ins w:id="404" w:author="kyle O'Reilly" w:date="2026-10-22T19:08:00Z" w16du:dateUtc="2026-10-22T18:08:00Z">
+      <w:ins w:id="432" w:author="kyle O'Reilly" w:date="2026-10-22T19:08:00Z" w16du:dateUtc="2026-10-22T18:08:00Z">
         <w:r>
           <w:instrText>"</w:instrText>
         </w:r>
@@ -4919,7 +5057,7 @@
           <w:fldChar w:fldCharType="separate"/>
         </w:r>
       </w:ins>
-      <w:ins w:id="405" w:author="kyle O'Reilly" w:date="2026-10-22T19:07:00Z" w16du:dateUtc="2026-10-22T18:07:00Z">
+      <w:ins w:id="433" w:author="kyle O'Reilly" w:date="2026-10-22T19:07:00Z" w16du:dateUtc="2026-10-22T18:07:00Z">
         <w:r>
           <w:rPr>
             <w:rStyle w:val="Hyperlink"/>
@@ -4927,7 +5065,7 @@
           <w:t>https://www.trading212.com/</w:t>
         </w:r>
       </w:ins>
-      <w:ins w:id="406" w:author="kyle O'Reilly" w:date="2026-10-22T19:08:00Z" w16du:dateUtc="2026-10-22T18:08:00Z">
+      <w:ins w:id="434" w:author="kyle O'Reilly" w:date="2026-10-22T19:08:00Z" w16du:dateUtc="2026-10-22T18:08:00Z">
         <w:r>
           <w:fldChar w:fldCharType="end"/>
         </w:r>
@@ -4935,7 +5073,7 @@
           <w:t xml:space="preserve"> </w:t>
         </w:r>
       </w:ins>
-      <w:ins w:id="407" w:author="kyle O'Reilly" w:date="2026-10-22T19:07:00Z" w16du:dateUtc="2026-10-22T18:07:00Z">
+      <w:ins w:id="435" w:author="kyle O'Reilly" w:date="2026-10-22T19:07:00Z" w16du:dateUtc="2026-10-22T18:07:00Z">
         <w:r>
           <w:t>(Accessed: 22 October 2026).</w:t>
         </w:r>
@@ -4944,17 +5082,17 @@
     <w:p>
       <w:pPr>
         <w:rPr>
-          <w:ins w:id="408" w:author="kyle O'Reilly" w:date="2026-10-22T19:06:00Z" w16du:dateUtc="2026-10-22T18:06:00Z"/>
-        </w:rPr>
-      </w:pPr>
-    </w:p>
-    <w:p>
-      <w:pPr>
-        <w:rPr>
-          <w:ins w:id="409" w:author="kyle O'Reilly" w:date="2026-10-21T23:38:00Z" w16du:dateUtc="2026-10-21T22:38:00Z"/>
-        </w:rPr>
-      </w:pPr>
-      <w:ins w:id="410" w:author="kyle O'Reilly" w:date="2026-10-21T23:38:00Z" w16du:dateUtc="2026-10-21T22:38:00Z">
+          <w:ins w:id="436" w:author="kyle O'Reilly" w:date="2026-10-22T19:06:00Z" w16du:dateUtc="2026-10-22T18:06:00Z"/>
+        </w:rPr>
+      </w:pPr>
+    </w:p>
+    <w:p>
+      <w:pPr>
+        <w:rPr>
+          <w:ins w:id="437" w:author="kyle O'Reilly" w:date="2026-10-21T23:38:00Z" w16du:dateUtc="2026-10-21T22:38:00Z"/>
+        </w:rPr>
+      </w:pPr>
+      <w:ins w:id="438" w:author="kyle O'Reilly" w:date="2026-10-21T23:38:00Z" w16du:dateUtc="2026-10-21T22:38:00Z">
         <w:r>
           <w:t xml:space="preserve">Section 7 </w:t>
         </w:r>
@@ -4963,25 +5101,25 @@
     <w:p>
       <w:pPr>
         <w:rPr>
-          <w:ins w:id="411" w:author="kyle O'Reilly" w:date="2026-10-21T23:48:00Z" w16du:dateUtc="2026-10-21T22:48:00Z"/>
-        </w:rPr>
-      </w:pPr>
-      <w:ins w:id="412" w:author="kyle O'Reilly" w:date="2026-10-21T23:50:00Z" w16du:dateUtc="2026-10-21T22:50:00Z">
+          <w:ins w:id="439" w:author="kyle O'Reilly" w:date="2026-10-21T23:48:00Z" w16du:dateUtc="2026-10-21T22:48:00Z"/>
+        </w:rPr>
+      </w:pPr>
+      <w:ins w:id="440" w:author="kyle O'Reilly" w:date="2026-10-21T23:50:00Z" w16du:dateUtc="2026-10-21T22:50:00Z">
         <w:r>
           <w:t>Trading 212</w:t>
         </w:r>
       </w:ins>
-      <w:ins w:id="413" w:author="kyle O'Reilly" w:date="2026-10-21T23:52:00Z" w16du:dateUtc="2026-10-21T22:52:00Z">
+      <w:ins w:id="441" w:author="kyle O'Reilly" w:date="2026-10-21T23:52:00Z" w16du:dateUtc="2026-10-21T22:52:00Z">
         <w:r>
           <w:t xml:space="preserve"> </w:t>
         </w:r>
       </w:ins>
-      <w:ins w:id="414" w:author="kyle O'Reilly" w:date="2026-10-21T23:50:00Z" w16du:dateUtc="2026-10-21T22:50:00Z">
+      <w:ins w:id="442" w:author="kyle O'Reilly" w:date="2026-10-21T23:50:00Z" w16du:dateUtc="2026-10-21T22:50:00Z">
         <w:r>
           <w:t>(n.d.) Trading 212 investment platform. Available at:</w:t>
         </w:r>
       </w:ins>
-      <w:ins w:id="415" w:author="kyle O'Reilly" w:date="2026-10-21T23:51:00Z" w16du:dateUtc="2026-10-21T22:51:00Z">
+      <w:ins w:id="443" w:author="kyle O'Reilly" w:date="2026-10-21T23:51:00Z" w16du:dateUtc="2026-10-21T22:51:00Z">
         <w:r>
           <w:t xml:space="preserve"> </w:t>
         </w:r>
@@ -5013,12 +5151,12 @@
           <w:t xml:space="preserve">  (</w:t>
         </w:r>
       </w:ins>
-      <w:ins w:id="416" w:author="kyle O'Reilly" w:date="2026-10-21T23:50:00Z" w16du:dateUtc="2026-10-21T22:50:00Z">
+      <w:ins w:id="444" w:author="kyle O'Reilly" w:date="2026-10-21T23:50:00Z" w16du:dateUtc="2026-10-21T22:50:00Z">
         <w:r>
           <w:t>Accessed: 2</w:t>
         </w:r>
       </w:ins>
-      <w:ins w:id="417" w:author="kyle O'Reilly" w:date="2026-10-21T23:51:00Z" w16du:dateUtc="2026-10-21T22:51:00Z">
+      <w:ins w:id="445" w:author="kyle O'Reilly" w:date="2026-10-21T23:51:00Z" w16du:dateUtc="2026-10-21T22:51:00Z">
         <w:r>
           <w:t>1 October 2026).</w:t>
         </w:r>
@@ -5027,10 +5165,10 @@
     <w:p>
       <w:pPr>
         <w:rPr>
-          <w:ins w:id="418" w:author="kyle O'Reilly" w:date="2026-10-21T23:53:00Z" w16du:dateUtc="2026-10-21T22:53:00Z"/>
-        </w:rPr>
-      </w:pPr>
-      <w:ins w:id="419" w:author="kyle O'Reilly" w:date="2026-10-21T23:52:00Z" w16du:dateUtc="2026-10-21T22:52:00Z">
+          <w:ins w:id="446" w:author="kyle O'Reilly" w:date="2026-10-21T23:53:00Z" w16du:dateUtc="2026-10-21T22:53:00Z"/>
+        </w:rPr>
+      </w:pPr>
+      <w:ins w:id="447" w:author="kyle O'Reilly" w:date="2026-10-21T23:52:00Z" w16du:dateUtc="2026-10-21T22:52:00Z">
         <w:r>
           <w:t xml:space="preserve">Stooq (n.d.a) </w:t>
         </w:r>
@@ -5038,12 +5176,12 @@
           <w:t>JPMorgan Chase &amp; Co. (JPM.</w:t>
         </w:r>
       </w:ins>
-      <w:ins w:id="420" w:author="kyle O'Reilly" w:date="2026-10-21T23:53:00Z" w16du:dateUtc="2026-10-21T22:53:00Z">
+      <w:ins w:id="448" w:author="kyle O'Reilly" w:date="2026-10-21T23:53:00Z" w16du:dateUtc="2026-10-21T22:53:00Z">
         <w:r>
           <w:t>US) – Historical data. Available at:</w:t>
         </w:r>
       </w:ins>
-      <w:ins w:id="421" w:author="kyle O'Reilly" w:date="2026-10-21T23:57:00Z" w16du:dateUtc="2026-10-21T22:57:00Z">
+      <w:ins w:id="449" w:author="kyle O'Reilly" w:date="2026-10-21T23:57:00Z" w16du:dateUtc="2026-10-21T22:57:00Z">
         <w:r>
           <w:t xml:space="preserve"> </w:t>
         </w:r>
@@ -5055,7 +5193,7 @@
         </w:r>
         <w:r>
           <w:rPr>
-            <w:rPrChange w:id="422" w:author="kyle O'Reilly" w:date="2026-10-21T23:57:00Z" w16du:dateUtc="2026-10-21T22:57:00Z">
+            <w:rPrChange w:id="450" w:author="kyle O'Reilly" w:date="2026-10-21T23:57:00Z" w16du:dateUtc="2026-10-21T22:57:00Z">
               <w:rPr>
                 <w:rStyle w:val="Hyperlink"/>
               </w:rPr>
@@ -5082,7 +5220,7 @@
           <w:t xml:space="preserve"> </w:t>
         </w:r>
       </w:ins>
-      <w:ins w:id="423" w:author="kyle O'Reilly" w:date="2026-10-21T23:53:00Z" w16du:dateUtc="2026-10-21T22:53:00Z">
+      <w:ins w:id="451" w:author="kyle O'Reilly" w:date="2026-10-21T23:53:00Z" w16du:dateUtc="2026-10-21T22:53:00Z">
         <w:r>
           <w:t>(Accessed</w:t>
         </w:r>
@@ -5090,12 +5228,12 @@
           <w:t xml:space="preserve">: 21 </w:t>
         </w:r>
       </w:ins>
-      <w:ins w:id="424" w:author="kyle O'Reilly" w:date="2026-10-21T23:55:00Z" w16du:dateUtc="2026-10-21T22:55:00Z">
+      <w:ins w:id="452" w:author="kyle O'Reilly" w:date="2026-10-21T23:55:00Z" w16du:dateUtc="2026-10-21T22:55:00Z">
         <w:r>
           <w:t>October</w:t>
         </w:r>
       </w:ins>
-      <w:ins w:id="425" w:author="kyle O'Reilly" w:date="2026-10-21T23:53:00Z" w16du:dateUtc="2026-10-21T22:53:00Z">
+      <w:ins w:id="453" w:author="kyle O'Reilly" w:date="2026-10-21T23:53:00Z" w16du:dateUtc="2026-10-21T22:53:00Z">
         <w:r>
           <w:t xml:space="preserve"> 2026).</w:t>
         </w:r>
@@ -5104,45 +5242,45 @@
     <w:p>
       <w:pPr>
         <w:rPr>
-          <w:ins w:id="426" w:author="kyle O'Reilly" w:date="2026-10-21T23:54:00Z" w16du:dateUtc="2026-10-21T22:54:00Z"/>
-        </w:rPr>
-      </w:pPr>
-      <w:ins w:id="427" w:author="kyle O'Reilly" w:date="2026-10-21T23:53:00Z" w16du:dateUtc="2026-10-21T22:53:00Z">
+          <w:ins w:id="454" w:author="kyle O'Reilly" w:date="2026-10-21T23:54:00Z" w16du:dateUtc="2026-10-21T22:54:00Z"/>
+        </w:rPr>
+      </w:pPr>
+      <w:ins w:id="455" w:author="kyle O'Reilly" w:date="2026-10-21T23:53:00Z" w16du:dateUtc="2026-10-21T22:53:00Z">
         <w:r>
           <w:t xml:space="preserve">Stooq (n.d.b) Coca-Cola </w:t>
         </w:r>
       </w:ins>
-      <w:ins w:id="428" w:author="kyle O'Reilly" w:date="2026-10-21T23:54:00Z" w16du:dateUtc="2026-10-21T22:54:00Z">
+      <w:ins w:id="456" w:author="kyle O'Reilly" w:date="2026-10-21T23:54:00Z" w16du:dateUtc="2026-10-21T22:54:00Z">
         <w:r>
           <w:t>Co</w:t>
         </w:r>
       </w:ins>
-      <w:ins w:id="429" w:author="kyle O'Reilly" w:date="2026-10-22T00:04:00Z" w16du:dateUtc="2026-10-21T23:04:00Z">
+      <w:ins w:id="457" w:author="kyle O'Reilly" w:date="2026-10-22T00:04:00Z" w16du:dateUtc="2026-10-21T23:04:00Z">
         <w:r>
           <w:t>.</w:t>
         </w:r>
       </w:ins>
-      <w:ins w:id="430" w:author="kyle O'Reilly" w:date="2026-10-21T23:54:00Z" w16du:dateUtc="2026-10-21T22:54:00Z">
+      <w:ins w:id="458" w:author="kyle O'Reilly" w:date="2026-10-21T23:54:00Z" w16du:dateUtc="2026-10-21T22:54:00Z">
         <w:r>
           <w:t xml:space="preserve"> </w:t>
         </w:r>
       </w:ins>
-      <w:ins w:id="431" w:author="kyle O'Reilly" w:date="2026-10-21T23:53:00Z" w16du:dateUtc="2026-10-21T22:53:00Z">
+      <w:ins w:id="459" w:author="kyle O'Reilly" w:date="2026-10-21T23:53:00Z" w16du:dateUtc="2026-10-21T22:53:00Z">
         <w:r>
           <w:t>(KO.U</w:t>
         </w:r>
       </w:ins>
-      <w:ins w:id="432" w:author="kyle O'Reilly" w:date="2026-10-21T23:54:00Z" w16du:dateUtc="2026-10-21T22:54:00Z">
+      <w:ins w:id="460" w:author="kyle O'Reilly" w:date="2026-10-21T23:54:00Z" w16du:dateUtc="2026-10-21T22:54:00Z">
         <w:r>
           <w:t>S)</w:t>
         </w:r>
       </w:ins>
-      <w:ins w:id="433" w:author="kyle O'Reilly" w:date="2026-10-21T23:55:00Z" w16du:dateUtc="2026-10-21T22:55:00Z">
+      <w:ins w:id="461" w:author="kyle O'Reilly" w:date="2026-10-21T23:55:00Z" w16du:dateUtc="2026-10-21T22:55:00Z">
         <w:r>
           <w:t xml:space="preserve"> – Historical data. Available at:</w:t>
         </w:r>
       </w:ins>
-      <w:ins w:id="434" w:author="kyle O'Reilly" w:date="2026-10-21T23:56:00Z" w16du:dateUtc="2026-10-21T22:56:00Z">
+      <w:ins w:id="462" w:author="kyle O'Reilly" w:date="2026-10-21T23:56:00Z" w16du:dateUtc="2026-10-21T22:56:00Z">
         <w:r>
           <w:t xml:space="preserve"> </w:t>
         </w:r>
@@ -5174,7 +5312,7 @@
           <w:t xml:space="preserve"> </w:t>
         </w:r>
       </w:ins>
-      <w:ins w:id="435" w:author="kyle O'Reilly" w:date="2026-10-21T23:55:00Z" w16du:dateUtc="2026-10-21T22:55:00Z">
+      <w:ins w:id="463" w:author="kyle O'Reilly" w:date="2026-10-21T23:55:00Z" w16du:dateUtc="2026-10-21T22:55:00Z">
         <w:r>
           <w:t>(Accessed: 21 October 2026).</w:t>
         </w:r>
@@ -5183,25 +5321,25 @@
     <w:p>
       <w:pPr>
         <w:rPr>
-          <w:ins w:id="436" w:author="kyle O'Reilly" w:date="2026-10-21T23:49:00Z" w16du:dateUtc="2026-10-21T22:49:00Z"/>
-        </w:rPr>
-      </w:pPr>
-      <w:ins w:id="437" w:author="kyle O'Reilly" w:date="2026-10-21T23:54:00Z" w16du:dateUtc="2026-10-21T22:54:00Z">
+          <w:ins w:id="464" w:author="kyle O'Reilly" w:date="2026-10-21T23:49:00Z" w16du:dateUtc="2026-10-21T22:49:00Z"/>
+        </w:rPr>
+      </w:pPr>
+      <w:ins w:id="465" w:author="kyle O'Reilly" w:date="2026-10-21T23:54:00Z" w16du:dateUtc="2026-10-21T22:54:00Z">
         <w:r>
           <w:t xml:space="preserve">Stooq (n.d.c) Intel </w:t>
         </w:r>
       </w:ins>
-      <w:ins w:id="438" w:author="kyle O'Reilly" w:date="2026-10-22T00:04:00Z" w16du:dateUtc="2026-10-21T23:04:00Z">
+      <w:ins w:id="466" w:author="kyle O'Reilly" w:date="2026-10-22T00:04:00Z" w16du:dateUtc="2026-10-21T23:04:00Z">
         <w:r>
           <w:t xml:space="preserve">Corp. </w:t>
         </w:r>
       </w:ins>
-      <w:ins w:id="439" w:author="kyle O'Reilly" w:date="2026-10-21T23:54:00Z" w16du:dateUtc="2026-10-21T22:54:00Z">
+      <w:ins w:id="467" w:author="kyle O'Reilly" w:date="2026-10-21T23:54:00Z" w16du:dateUtc="2026-10-21T22:54:00Z">
         <w:r>
           <w:t>(INTC.US)</w:t>
         </w:r>
       </w:ins>
-      <w:ins w:id="440" w:author="kyle O'Reilly" w:date="2026-10-21T23:55:00Z" w16du:dateUtc="2026-10-21T22:55:00Z">
+      <w:ins w:id="468" w:author="kyle O'Reilly" w:date="2026-10-21T23:55:00Z" w16du:dateUtc="2026-10-21T22:55:00Z">
         <w:r>
           <w:t xml:space="preserve"> – Historical data. Available at</w:t>
         </w:r>
@@ -5209,7 +5347,7 @@
           <w:t>:</w:t>
         </w:r>
       </w:ins>
-      <w:ins w:id="441" w:author="kyle O'Reilly" w:date="2026-10-21T23:56:00Z" w16du:dateUtc="2026-10-21T22:56:00Z">
+      <w:ins w:id="469" w:author="kyle O'Reilly" w:date="2026-10-21T23:56:00Z" w16du:dateUtc="2026-10-21T22:56:00Z">
         <w:r>
           <w:t xml:space="preserve"> </w:t>
         </w:r>
@@ -5241,7 +5379,7 @@
           <w:t xml:space="preserve"> </w:t>
         </w:r>
       </w:ins>
-      <w:ins w:id="442" w:author="kyle O'Reilly" w:date="2026-10-21T23:55:00Z" w16du:dateUtc="2026-10-21T22:55:00Z">
+      <w:ins w:id="470" w:author="kyle O'Reilly" w:date="2026-10-21T23:55:00Z" w16du:dateUtc="2026-10-21T22:55:00Z">
         <w:r>
           <w:t xml:space="preserve"> </w:t>
         </w:r>
@@ -5249,12 +5387,12 @@
           <w:t xml:space="preserve">(Accessed: 21 </w:t>
         </w:r>
       </w:ins>
-      <w:ins w:id="443" w:author="kyle O'Reilly" w:date="2026-10-22T00:14:00Z" w16du:dateUtc="2026-10-21T23:14:00Z">
+      <w:ins w:id="471" w:author="kyle O'Reilly" w:date="2026-10-22T00:14:00Z" w16du:dateUtc="2026-10-21T23:14:00Z">
         <w:r>
           <w:t>October</w:t>
         </w:r>
       </w:ins>
-      <w:ins w:id="444" w:author="kyle O'Reilly" w:date="2026-10-21T23:55:00Z" w16du:dateUtc="2026-10-21T22:55:00Z">
+      <w:ins w:id="472" w:author="kyle O'Reilly" w:date="2026-10-21T23:55:00Z" w16du:dateUtc="2026-10-21T22:55:00Z">
         <w:r>
           <w:t xml:space="preserve"> 2026).</w:t>
         </w:r>
@@ -5263,14 +5401,14 @@
     <w:p>
       <w:pPr>
         <w:rPr>
-          <w:ins w:id="445" w:author="kyle O'Reilly" w:date="2026-10-21T23:49:00Z" w16du:dateUtc="2026-10-21T22:49:00Z"/>
-        </w:rPr>
-      </w:pPr>
-    </w:p>
-    <w:p>
-      <w:pPr>
-        <w:rPr>
-          <w:ins w:id="446" w:author="kyle O'Reilly" w:date="2026-10-21T23:49:00Z" w16du:dateUtc="2026-10-21T22:49:00Z"/>
+          <w:ins w:id="473" w:author="kyle O'Reilly" w:date="2026-10-21T23:49:00Z" w16du:dateUtc="2026-10-21T22:49:00Z"/>
+        </w:rPr>
+      </w:pPr>
+    </w:p>
+    <w:p>
+      <w:pPr>
+        <w:rPr>
+          <w:ins w:id="474" w:author="kyle O'Reilly" w:date="2026-10-21T23:49:00Z" w16du:dateUtc="2026-10-21T22:49:00Z"/>
         </w:rPr>
       </w:pPr>
     </w:p>
@@ -5280,7 +5418,7 @@
           <w:tab w:val="left" w:pos="1055"/>
         </w:tabs>
         <w:rPr>
-          <w:ins w:id="447" w:author="kyle O'Reilly" w:date="2026-10-22T18:11:00Z" w16du:dateUtc="2026-10-22T17:11:00Z"/>
+          <w:ins w:id="475" w:author="kyle O'Reilly" w:date="2026-10-22T18:11:00Z" w16du:dateUtc="2026-10-22T17:11:00Z"/>
         </w:rPr>
       </w:pPr>
     </w:p>
@@ -5290,9 +5428,9 @@
           <w:tab w:val="left" w:pos="1055"/>
         </w:tabs>
         <w:rPr>
-          <w:ins w:id="448" w:author="kyle O'Reilly" w:date="2026-10-21T23:49:00Z" w16du:dateUtc="2026-10-21T22:49:00Z"/>
-        </w:rPr>
-        <w:pPrChange w:id="449" w:author="kyle O'Reilly" w:date="2026-10-22T18:11:00Z" w16du:dateUtc="2026-10-22T17:11:00Z">
+          <w:ins w:id="476" w:author="kyle O'Reilly" w:date="2026-10-21T23:49:00Z" w16du:dateUtc="2026-10-21T22:49:00Z"/>
+        </w:rPr>
+        <w:pPrChange w:id="477" w:author="kyle O'Reilly" w:date="2026-10-22T18:11:00Z" w16du:dateUtc="2026-10-22T17:11:00Z">
           <w:pPr/>
         </w:pPrChange>
       </w:pPr>
@@ -5300,7 +5438,7 @@
     <w:p>
       <w:pPr>
         <w:rPr>
-          <w:ins w:id="450" w:author="kyle O'Reilly" w:date="2026-10-22T00:15:00Z" w16du:dateUtc="2026-10-21T23:15:00Z"/>
+          <w:ins w:id="478" w:author="kyle O'Reilly" w:date="2026-10-22T00:15:00Z" w16du:dateUtc="2026-10-21T23:15:00Z"/>
           <w:sz w:val="96"/>
           <w:szCs w:val="96"/>
         </w:rPr>
@@ -5309,7 +5447,7 @@
     <w:p>
       <w:pPr>
         <w:rPr>
-          <w:ins w:id="451" w:author="kyle O'Reilly" w:date="2026-10-22T21:22:00Z" w16du:dateUtc="2026-10-22T20:22:00Z"/>
+          <w:ins w:id="479" w:author="kyle O'Reilly" w:date="2026-10-22T21:22:00Z" w16du:dateUtc="2026-10-22T20:22:00Z"/>
           <w:sz w:val="96"/>
           <w:szCs w:val="96"/>
         </w:rPr>
@@ -5318,7 +5456,7 @@
     <w:p>
       <w:pPr>
         <w:rPr>
-          <w:ins w:id="452" w:author="kyle O'Reilly" w:date="2026-10-22T21:22:00Z" w16du:dateUtc="2026-10-22T20:22:00Z"/>
+          <w:ins w:id="480" w:author="kyle O'Reilly" w:date="2026-10-22T21:22:00Z" w16du:dateUtc="2026-10-22T20:22:00Z"/>
           <w:sz w:val="96"/>
           <w:szCs w:val="96"/>
         </w:rPr>
@@ -5327,12 +5465,12 @@
     <w:p>
       <w:pPr>
         <w:rPr>
-          <w:ins w:id="453" w:author="kyle O'Reilly" w:date="2026-10-21T23:49:00Z" w16du:dateUtc="2026-10-21T22:49:00Z"/>
+          <w:ins w:id="481" w:author="kyle O'Reilly" w:date="2026-10-21T23:49:00Z" w16du:dateUtc="2026-10-21T22:49:00Z"/>
           <w:sz w:val="96"/>
           <w:szCs w:val="96"/>
-          <w:rPrChange w:id="454" w:author="kyle O'Reilly" w:date="2026-10-21T23:49:00Z" w16du:dateUtc="2026-10-21T22:49:00Z">
+          <w:rPrChange w:id="482" w:author="kyle O'Reilly" w:date="2026-10-21T23:49:00Z" w16du:dateUtc="2026-10-21T22:49:00Z">
             <w:rPr>
-              <w:ins w:id="455" w:author="kyle O'Reilly" w:date="2026-10-21T23:49:00Z" w16du:dateUtc="2026-10-21T22:49:00Z"/>
+              <w:ins w:id="483" w:author="kyle O'Reilly" w:date="2026-10-21T23:49:00Z" w16du:dateUtc="2026-10-21T22:49:00Z"/>
             </w:rPr>
           </w:rPrChange>
         </w:rPr>
@@ -5344,20 +5482,20 @@
         <w:rPr>
           <w:sz w:val="96"/>
           <w:szCs w:val="96"/>
-          <w:rPrChange w:id="456" w:author="kyle O'Reilly" w:date="2026-10-21T23:49:00Z" w16du:dateUtc="2026-10-21T22:49:00Z">
+          <w:rPrChange w:id="484" w:author="kyle O'Reilly" w:date="2026-10-21T23:49:00Z" w16du:dateUtc="2026-10-21T22:49:00Z">
             <w:rPr/>
           </w:rPrChange>
         </w:rPr>
-        <w:pPrChange w:id="457" w:author="kyle O'Reilly" w:date="2026-10-21T23:49:00Z" w16du:dateUtc="2026-10-21T22:49:00Z">
+        <w:pPrChange w:id="485" w:author="kyle O'Reilly" w:date="2026-10-21T23:49:00Z" w16du:dateUtc="2026-10-21T22:49:00Z">
           <w:pPr/>
         </w:pPrChange>
       </w:pPr>
-      <w:ins w:id="458" w:author="kyle O'Reilly" w:date="2026-10-21T23:49:00Z" w16du:dateUtc="2026-10-21T22:49:00Z">
+      <w:ins w:id="486" w:author="kyle O'Reilly" w:date="2026-10-21T23:49:00Z" w16du:dateUtc="2026-10-21T22:49:00Z">
         <w:r>
           <w:rPr>
             <w:sz w:val="96"/>
             <w:szCs w:val="96"/>
-            <w:rPrChange w:id="459" w:author="kyle O'Reilly" w:date="2026-10-21T23:49:00Z" w16du:dateUtc="2026-10-21T22:49:00Z">
+            <w:rPrChange w:id="487" w:author="kyle O'Reilly" w:date="2026-10-21T23:49:00Z" w16du:dateUtc="2026-10-21T22:49:00Z">
               <w:rPr/>
             </w:rPrChange>
           </w:rPr>

</xml_diff>

<commit_message>
Started to format document correctly.
</commit_message>
<xml_diff>
--- a/HDSDAB - Strategic Thinking - Capstone Project.docx
+++ b/HDSDAB - Strategic Thinking - Capstone Project.docx
@@ -640,7 +640,6 @@
           <w:szCs w:val="32"/>
         </w:rPr>
       </w:pPr>
-      <w:proofErr w:type="spellStart"/>
       <w:r>
         <w:rPr>
           <w:i/>
@@ -649,17 +648,7 @@
           <w:szCs w:val="32"/>
         </w:rPr>
         <w:lastRenderedPageBreak/>
-        <w:t>Github</w:t>
-      </w:r>
-      <w:proofErr w:type="spellEnd"/>
-      <w:r>
-        <w:rPr>
-          <w:i/>
-          <w:color w:val="156082"/>
-          <w:sz w:val="32"/>
-          <w:szCs w:val="32"/>
-        </w:rPr>
-        <w:t xml:space="preserve"> Repository </w:t>
+        <w:t xml:space="preserve">Github Repository </w:t>
       </w:r>
     </w:p>
     <w:p>
@@ -683,22 +672,9 @@
             <w:sz w:val="32"/>
             <w:szCs w:val="32"/>
           </w:rPr>
-          <w:t>https://github.com/sba26104-KOR/HDSDAB---Strategic-Thinking---Capstone-</w:t>
-        </w:r>
-        <w:proofErr w:type="spellStart"/>
-        <w:r>
-          <w:rPr>
-            <w:bCs/>
-            <w:i/>
-            <w:iCs/>
-            <w:color w:val="EE0000"/>
-            <w:sz w:val="32"/>
-            <w:szCs w:val="32"/>
-          </w:rPr>
-          <w:t>Project.git</w:t>
-        </w:r>
-      </w:ins>
-      <w:proofErr w:type="spellEnd"/>
+          <w:t>https://github.com/sba26104-KOR/HDSDAB---Strategic-Thinking---Capstone-Project.git</w:t>
+        </w:r>
+      </w:ins>
     </w:p>
     <w:p>
       <w:pPr>
@@ -814,23 +790,7 @@
                                 <w:color w:val="000000"/>
                                 <w:sz w:val="28"/>
                               </w:rPr>
-                              <w:t xml:space="preserve">By submitting this assessment, I confirm that I have read the CCT policy on academic misconduct and understand the implications of submitting work that is not my own or does not appropriately reference material </w:t>
-                            </w:r>
-                            <w:proofErr w:type="gramStart"/>
-                            <w:r>
-                              <w:rPr>
-                                <w:color w:val="000000"/>
-                                <w:sz w:val="28"/>
-                              </w:rPr>
-                              <w:t>taken</w:t>
-                            </w:r>
-                            <w:proofErr w:type="gramEnd"/>
-                            <w:r>
-                              <w:rPr>
-                                <w:color w:val="000000"/>
-                                <w:sz w:val="28"/>
-                              </w:rPr>
-                              <w:t xml:space="preserve"> from a third party or other source. </w:t>
+                              <w:t xml:space="preserve">By submitting this assessment, I confirm that I have read the CCT policy on academic misconduct and understand the implications of submitting work that is not my own or does not appropriately reference material taken from a third party or other source. </w:t>
                             </w:r>
                           </w:p>
                           <w:p>
@@ -924,23 +884,7 @@
                           <w:color w:val="000000"/>
                           <w:sz w:val="28"/>
                         </w:rPr>
-                        <w:t xml:space="preserve">By submitting this assessment, I confirm that I have read the CCT policy on academic misconduct and understand the implications of submitting work that is not my own or does not appropriately reference material </w:t>
-                      </w:r>
-                      <w:proofErr w:type="gramStart"/>
-                      <w:r>
-                        <w:rPr>
-                          <w:color w:val="000000"/>
-                          <w:sz w:val="28"/>
-                        </w:rPr>
-                        <w:t>taken</w:t>
-                      </w:r>
-                      <w:proofErr w:type="gramEnd"/>
-                      <w:r>
-                        <w:rPr>
-                          <w:color w:val="000000"/>
-                          <w:sz w:val="28"/>
-                        </w:rPr>
-                        <w:t xml:space="preserve"> from a third party or other source. </w:t>
+                        <w:t xml:space="preserve">By submitting this assessment, I confirm that I have read the CCT policy on academic misconduct and understand the implications of submitting work that is not my own or does not appropriately reference material taken from a third party or other source. </w:t>
                       </w:r>
                     </w:p>
                     <w:p>
@@ -2723,16 +2667,22 @@
     <w:p>
       <w:pPr>
         <w:spacing w:line="360" w:lineRule="auto"/>
+        <w:jc w:val="both"/>
         <w:rPr>
           <w:ins w:id="57" w:author="kyle O'Reilly" w:date="2026-10-22T22:31:00Z" w16du:dateUtc="2026-10-22T21:31:00Z"/>
         </w:rPr>
-      </w:pPr>
-      <w:ins w:id="58" w:author="kyle O'Reilly" w:date="2026-10-22T22:28:00Z" w16du:dateUtc="2026-10-22T21:28:00Z">
+        <w:pPrChange w:id="58" w:author="kyle O'Reilly" w:date="2026-10-22T23:33:00Z" w16du:dateUtc="2026-10-22T22:33:00Z">
+          <w:pPr>
+            <w:spacing w:line="360" w:lineRule="auto"/>
+          </w:pPr>
+        </w:pPrChange>
+      </w:pPr>
+      <w:ins w:id="59" w:author="kyle O'Reilly" w:date="2026-10-22T22:28:00Z" w16du:dateUtc="2026-10-22T21:28:00Z">
         <w:r>
           <w:t xml:space="preserve">Predicting future stock prices is an important area of financial research, as accurate forecasts can help investors and financial </w:t>
         </w:r>
       </w:ins>
-      <w:ins w:id="59" w:author="kyle O'Reilly" w:date="2026-10-22T22:29:00Z" w16du:dateUtc="2026-10-22T21:29:00Z">
+      <w:ins w:id="60" w:author="kyle O'Reilly" w:date="2026-10-22T22:29:00Z" w16du:dateUtc="2026-10-22T21:29:00Z">
         <w:r>
           <w:t xml:space="preserve">institutes </w:t>
         </w:r>
@@ -2743,33 +2693,25 @@
           <w:t xml:space="preserve">because prices are influenced by several factors, </w:t>
         </w:r>
       </w:ins>
-      <w:ins w:id="60" w:author="kyle O'Reilly" w:date="2026-10-22T22:30:00Z" w16du:dateUtc="2026-10-22T21:30:00Z">
+      <w:ins w:id="61" w:author="kyle O'Reilly" w:date="2026-10-22T22:30:00Z" w16du:dateUtc="2026-10-22T21:30:00Z">
         <w:r>
           <w:t xml:space="preserve">including economic </w:t>
         </w:r>
       </w:ins>
-      <w:ins w:id="61" w:author="kyle O'Reilly" w:date="2026-10-22T22:31:00Z" w16du:dateUtc="2026-10-22T21:31:00Z">
+      <w:ins w:id="62" w:author="kyle O'Reilly" w:date="2026-10-22T22:31:00Z" w16du:dateUtc="2026-10-22T21:31:00Z">
         <w:r>
           <w:t>conditions,</w:t>
         </w:r>
       </w:ins>
-      <w:ins w:id="62" w:author="kyle O'Reilly" w:date="2026-10-22T22:30:00Z" w16du:dateUtc="2026-10-22T21:30:00Z">
-        <w:r>
-          <w:t xml:space="preserve"> company performance, political events, and investor sentiment (</w:t>
-        </w:r>
-        <w:proofErr w:type="spellStart"/>
-        <w:r>
-          <w:t>Jeribi</w:t>
-        </w:r>
-        <w:proofErr w:type="spellEnd"/>
-        <w:r>
-          <w:t xml:space="preserve"> et al., 2024; Zain-ul-Abid</w:t>
+      <w:ins w:id="63" w:author="kyle O'Reilly" w:date="2026-10-22T22:30:00Z" w16du:dateUtc="2026-10-22T21:30:00Z">
+        <w:r>
+          <w:t xml:space="preserve"> company performance, political events, and investor sentiment (Jeribi et al., 2024; Zain-ul-Abid</w:t>
         </w:r>
         <w:r>
           <w:t xml:space="preserve">een et </w:t>
         </w:r>
       </w:ins>
-      <w:ins w:id="63" w:author="kyle O'Reilly" w:date="2026-10-22T22:31:00Z" w16du:dateUtc="2026-10-22T21:31:00Z">
+      <w:ins w:id="64" w:author="kyle O'Reilly" w:date="2026-10-22T22:31:00Z" w16du:dateUtc="2026-10-22T21:31:00Z">
         <w:r>
           <w:t>al., 2024).</w:t>
         </w:r>
@@ -2778,11 +2720,17 @@
     <w:p>
       <w:pPr>
         <w:spacing w:line="360" w:lineRule="auto"/>
-        <w:rPr>
-          <w:ins w:id="64" w:author="kyle O'Reilly" w:date="2026-10-22T22:33:00Z" w16du:dateUtc="2026-10-22T21:33:00Z"/>
-        </w:rPr>
-      </w:pPr>
-      <w:ins w:id="65" w:author="kyle O'Reilly" w:date="2026-10-22T22:31:00Z" w16du:dateUtc="2026-10-22T21:31:00Z">
+        <w:jc w:val="both"/>
+        <w:rPr>
+          <w:ins w:id="65" w:author="kyle O'Reilly" w:date="2026-10-22T22:33:00Z" w16du:dateUtc="2026-10-22T21:33:00Z"/>
+        </w:rPr>
+        <w:pPrChange w:id="66" w:author="kyle O'Reilly" w:date="2026-10-22T23:33:00Z" w16du:dateUtc="2026-10-22T22:33:00Z">
+          <w:pPr>
+            <w:spacing w:line="360" w:lineRule="auto"/>
+          </w:pPr>
+        </w:pPrChange>
+      </w:pPr>
+      <w:ins w:id="67" w:author="kyle O'Reilly" w:date="2026-10-22T22:31:00Z" w16du:dateUtc="2026-10-22T21:31:00Z">
         <w:r>
           <w:t xml:space="preserve">Historical stock </w:t>
         </w:r>
@@ -2790,23 +2738,18 @@
           <w:t xml:space="preserve">market data can be analysed using machine learning techniques to identify </w:t>
         </w:r>
       </w:ins>
-      <w:ins w:id="66" w:author="kyle O'Reilly" w:date="2026-10-22T22:32:00Z" w16du:dateUtc="2026-10-22T21:32:00Z">
+      <w:ins w:id="68" w:author="kyle O'Reilly" w:date="2026-10-22T22:32:00Z" w16du:dateUtc="2026-10-22T21:32:00Z">
         <w:r>
           <w:t xml:space="preserve">patterns and relationships that may help forecast future prices movements. </w:t>
         </w:r>
-        <w:proofErr w:type="spellStart"/>
-        <w:r>
-          <w:t>Khuwaja</w:t>
-        </w:r>
-        <w:proofErr w:type="spellEnd"/>
-        <w:r>
-          <w:t xml:space="preserve"> et al. (2020) highlight the challenges associated </w:t>
+        <w:r>
+          <w:t xml:space="preserve">Khuwaja et al. (2020) highlight the challenges associated </w:t>
         </w:r>
         <w:r>
           <w:t>with financial dat</w:t>
         </w:r>
       </w:ins>
-      <w:ins w:id="67" w:author="kyle O'Reilly" w:date="2026-10-22T22:33:00Z" w16du:dateUtc="2026-10-22T21:33:00Z">
+      <w:ins w:id="69" w:author="kyle O'Reilly" w:date="2026-10-22T22:33:00Z" w16du:dateUtc="2026-10-22T21:33:00Z">
         <w:r>
           <w:t xml:space="preserve">a, including its unpredictable, noisy and non-linear characteristics. These challenges have encouraged researchers to investigate different predictive modelling techniques. </w:t>
         </w:r>
@@ -2815,11 +2758,17 @@
     <w:p>
       <w:pPr>
         <w:spacing w:line="360" w:lineRule="auto"/>
-        <w:rPr>
-          <w:ins w:id="68" w:author="kyle O'Reilly" w:date="2026-10-22T22:37:00Z" w16du:dateUtc="2026-10-22T21:37:00Z"/>
-        </w:rPr>
-      </w:pPr>
-      <w:ins w:id="69" w:author="kyle O'Reilly" w:date="2026-10-22T22:34:00Z" w16du:dateUtc="2026-10-22T21:34:00Z">
+        <w:jc w:val="both"/>
+        <w:rPr>
+          <w:ins w:id="70" w:author="kyle O'Reilly" w:date="2026-10-22T22:37:00Z" w16du:dateUtc="2026-10-22T21:37:00Z"/>
+        </w:rPr>
+        <w:pPrChange w:id="71" w:author="kyle O'Reilly" w:date="2026-10-22T23:33:00Z" w16du:dateUtc="2026-10-22T22:33:00Z">
+          <w:pPr>
+            <w:spacing w:line="360" w:lineRule="auto"/>
+          </w:pPr>
+        </w:pPrChange>
+      </w:pPr>
+      <w:ins w:id="72" w:author="kyle O'Reilly" w:date="2026-10-22T22:34:00Z" w16du:dateUtc="2026-10-22T21:34:00Z">
         <w:r>
           <w:t xml:space="preserve">Recent research has explored the effectiveness of machine learning algorithms </w:t>
         </w:r>
@@ -2827,7 +2776,7 @@
           <w:t>in forecasting stock market behaviour. Indra et al. (2025)</w:t>
         </w:r>
       </w:ins>
-      <w:ins w:id="70" w:author="kyle O'Reilly" w:date="2026-10-22T22:35:00Z" w16du:dateUtc="2026-10-22T21:35:00Z">
+      <w:ins w:id="73" w:author="kyle O'Reilly" w:date="2026-10-22T22:35:00Z" w16du:dateUtc="2026-10-22T21:35:00Z">
         <w:r>
           <w:t xml:space="preserve"> compared Linear Regression, Random Forest and other </w:t>
         </w:r>
@@ -2838,7 +2787,7 @@
           <w:t xml:space="preserve">demonstrated the difficulties of achieving reliable </w:t>
         </w:r>
       </w:ins>
-      <w:ins w:id="71" w:author="kyle O'Reilly" w:date="2026-10-22T22:36:00Z" w16du:dateUtc="2026-10-22T21:36:00Z">
+      <w:ins w:id="74" w:author="kyle O'Reilly" w:date="2026-10-22T22:36:00Z" w16du:dateUtc="2026-10-22T21:36:00Z">
         <w:r>
           <w:t xml:space="preserve">predictions, even when </w:t>
         </w:r>
@@ -2846,12 +2795,12 @@
           <w:t xml:space="preserve">using advanced algorithms. This </w:t>
         </w:r>
       </w:ins>
-      <w:ins w:id="72" w:author="kyle O'Reilly" w:date="2026-10-22T22:37:00Z" w16du:dateUtc="2026-10-22T21:37:00Z">
+      <w:ins w:id="75" w:author="kyle O'Reilly" w:date="2026-10-22T22:37:00Z" w16du:dateUtc="2026-10-22T21:37:00Z">
         <w:r>
           <w:t>highlights</w:t>
         </w:r>
       </w:ins>
-      <w:ins w:id="73" w:author="kyle O'Reilly" w:date="2026-10-22T22:36:00Z" w16du:dateUtc="2026-10-22T21:36:00Z">
+      <w:ins w:id="76" w:author="kyle O'Reilly" w:date="2026-10-22T22:36:00Z" w16du:dateUtc="2026-10-22T21:36:00Z">
         <w:r>
           <w:t xml:space="preserve"> </w:t>
         </w:r>
@@ -2859,7 +2808,7 @@
           <w:t>the importance of eva</w:t>
         </w:r>
       </w:ins>
-      <w:ins w:id="74" w:author="kyle O'Reilly" w:date="2026-10-22T22:37:00Z" w16du:dateUtc="2026-10-22T21:37:00Z">
+      <w:ins w:id="77" w:author="kyle O'Reilly" w:date="2026-10-22T22:37:00Z" w16du:dateUtc="2026-10-22T21:37:00Z">
         <w:r>
           <w:t xml:space="preserve">luating model performance rather than assuming that more complex techniques will automatically produce more accurate forecasts. </w:t>
         </w:r>
@@ -2868,11 +2817,17 @@
     <w:p>
       <w:pPr>
         <w:spacing w:line="360" w:lineRule="auto"/>
-        <w:rPr>
-          <w:ins w:id="75" w:author="kyle O'Reilly" w:date="2026-10-22T22:40:00Z" w16du:dateUtc="2026-10-22T21:40:00Z"/>
-        </w:rPr>
-      </w:pPr>
-      <w:ins w:id="76" w:author="kyle O'Reilly" w:date="2026-10-22T22:37:00Z" w16du:dateUtc="2026-10-22T21:37:00Z">
+        <w:jc w:val="both"/>
+        <w:rPr>
+          <w:ins w:id="78" w:author="kyle O'Reilly" w:date="2026-10-22T22:40:00Z" w16du:dateUtc="2026-10-22T21:40:00Z"/>
+        </w:rPr>
+        <w:pPrChange w:id="79" w:author="kyle O'Reilly" w:date="2026-10-22T23:33:00Z" w16du:dateUtc="2026-10-22T22:33:00Z">
+          <w:pPr>
+            <w:spacing w:line="360" w:lineRule="auto"/>
+          </w:pPr>
+        </w:pPrChange>
+      </w:pPr>
+      <w:ins w:id="80" w:author="kyle O'Reilly" w:date="2026-10-22T22:37:00Z" w16du:dateUtc="2026-10-22T21:37:00Z">
         <w:r>
           <w:t xml:space="preserve">This Capstone Project </w:t>
         </w:r>
@@ -2880,12 +2835,12 @@
           <w:t>proposes to investigate the accuracy of</w:t>
         </w:r>
       </w:ins>
-      <w:ins w:id="77" w:author="kyle O'Reilly" w:date="2026-10-22T22:38:00Z" w16du:dateUtc="2026-10-22T21:38:00Z">
+      <w:ins w:id="81" w:author="kyle O'Reilly" w:date="2026-10-22T22:38:00Z" w16du:dateUtc="2026-10-22T21:38:00Z">
         <w:r>
           <w:t xml:space="preserve"> Linear Regression, Random Forest Regressor and a naïve time-series forecasting baseline when predicting </w:t>
         </w:r>
       </w:ins>
-      <w:ins w:id="78" w:author="kyle O'Reilly" w:date="2026-10-22T22:39:00Z" w16du:dateUtc="2026-10-22T21:39:00Z">
+      <w:ins w:id="82" w:author="kyle O'Reilly" w:date="2026-10-22T22:39:00Z" w16du:dateUtc="2026-10-22T21:39:00Z">
         <w:r>
           <w:t xml:space="preserve">stock prices </w:t>
         </w:r>
@@ -2893,7 +2848,7 @@
           <w:t>20 trading days into the future. Three publicly traded companies: JPMorg</w:t>
         </w:r>
       </w:ins>
-      <w:ins w:id="79" w:author="kyle O'Reilly" w:date="2026-10-22T22:40:00Z" w16du:dateUtc="2026-10-22T21:40:00Z">
+      <w:ins w:id="83" w:author="kyle O'Reilly" w:date="2026-10-22T22:40:00Z" w16du:dateUtc="2026-10-22T21:40:00Z">
         <w:r>
           <w:t xml:space="preserve">an Chase &amp; Co., Coca-Cola Co. and Intel Corp. </w:t>
         </w:r>
@@ -2905,14 +2860,15 @@
     <w:p>
       <w:pPr>
         <w:spacing w:line="360" w:lineRule="auto"/>
-        <w:rPr>
-          <w:ins w:id="80" w:author="kyle O'Reilly" w:date="2026-10-22T21:21:00Z" w16du:dateUtc="2026-10-22T20:21:00Z"/>
-        </w:rPr>
-        <w:pPrChange w:id="81" w:author="kyle O'Reilly" w:date="2026-10-22T21:22:00Z" w16du:dateUtc="2026-10-22T20:22:00Z">
+        <w:jc w:val="both"/>
+        <w:rPr>
+          <w:ins w:id="84" w:author="kyle O'Reilly" w:date="2026-10-22T21:21:00Z" w16du:dateUtc="2026-10-22T20:21:00Z"/>
+        </w:rPr>
+        <w:pPrChange w:id="85" w:author="kyle O'Reilly" w:date="2026-10-22T23:33:00Z" w16du:dateUtc="2026-10-22T22:33:00Z">
           <w:pPr/>
         </w:pPrChange>
       </w:pPr>
-      <w:ins w:id="82" w:author="kyle O'Reilly" w:date="2026-10-22T22:40:00Z" w16du:dateUtc="2026-10-22T21:40:00Z">
+      <w:ins w:id="86" w:author="kyle O'Reilly" w:date="2026-10-22T22:40:00Z" w16du:dateUtc="2026-10-22T21:40:00Z">
         <w:r>
           <w:t xml:space="preserve">This project will use historical </w:t>
         </w:r>
@@ -2920,7 +2876,7 @@
           <w:t>stoc</w:t>
         </w:r>
       </w:ins>
-      <w:ins w:id="83" w:author="kyle O'Reilly" w:date="2026-10-22T22:41:00Z" w16du:dateUtc="2026-10-22T21:41:00Z">
+      <w:ins w:id="87" w:author="kyle O'Reilly" w:date="2026-10-22T22:41:00Z" w16du:dateUtc="2026-10-22T21:41:00Z">
         <w:r>
           <w:t>k closing prices and quantitative data analytic techniques to generate forecasts and com</w:t>
         </w:r>
@@ -2928,17 +2884,17 @@
           <w:t xml:space="preserve">pare thema </w:t>
         </w:r>
       </w:ins>
-      <w:ins w:id="84" w:author="kyle O'Reilly" w:date="2026-10-22T22:42:00Z" w16du:dateUtc="2026-10-22T21:42:00Z">
+      <w:ins w:id="88" w:author="kyle O'Reilly" w:date="2026-10-22T22:42:00Z" w16du:dateUtc="2026-10-22T21:42:00Z">
         <w:r>
           <w:t>against</w:t>
         </w:r>
       </w:ins>
-      <w:ins w:id="85" w:author="kyle O'Reilly" w:date="2026-10-22T22:41:00Z" w16du:dateUtc="2026-10-22T21:41:00Z">
+      <w:ins w:id="89" w:author="kyle O'Reilly" w:date="2026-10-22T22:41:00Z" w16du:dateUtc="2026-10-22T21:41:00Z">
         <w:r>
           <w:t xml:space="preserve"> actual closing prices. The aim is to </w:t>
         </w:r>
       </w:ins>
-      <w:ins w:id="86" w:author="kyle O'Reilly" w:date="2026-10-22T22:42:00Z" w16du:dateUtc="2026-10-22T21:42:00Z">
+      <w:ins w:id="90" w:author="kyle O'Reilly" w:date="2026-10-22T22:42:00Z" w16du:dateUtc="2026-10-22T21:42:00Z">
         <w:r>
           <w:t xml:space="preserve">determine which </w:t>
         </w:r>
@@ -2950,7 +2906,7 @@
           <w:t xml:space="preserve">produces the smallest </w:t>
         </w:r>
       </w:ins>
-      <w:ins w:id="87" w:author="kyle O'Reilly" w:date="2026-10-22T22:43:00Z" w16du:dateUtc="2026-10-22T21:43:00Z">
+      <w:ins w:id="91" w:author="kyle O'Reilly" w:date="2026-10-22T22:43:00Z" w16du:dateUtc="2026-10-22T21:43:00Z">
         <w:r>
           <w:t>prediction</w:t>
         </w:r>
@@ -2961,12 +2917,12 @@
           <w:t>investigates</w:t>
         </w:r>
       </w:ins>
-      <w:ins w:id="88" w:author="kyle O'Reilly" w:date="2026-10-22T22:42:00Z" w16du:dateUtc="2026-10-22T21:42:00Z">
+      <w:ins w:id="92" w:author="kyle O'Reilly" w:date="2026-10-22T22:42:00Z" w16du:dateUtc="2026-10-22T21:42:00Z">
         <w:r>
           <w:t xml:space="preserve"> each company an</w:t>
         </w:r>
       </w:ins>
-      <w:ins w:id="89" w:author="kyle O'Reilly" w:date="2026-10-22T22:43:00Z" w16du:dateUtc="2026-10-22T21:43:00Z">
+      <w:ins w:id="93" w:author="kyle O'Reilly" w:date="2026-10-22T22:43:00Z" w16du:dateUtc="2026-10-22T21:43:00Z">
         <w:r>
           <w:t>d investigate whether differences in stock volatility are associated with differences in forecasting accuracy.</w:t>
         </w:r>
@@ -2976,9 +2932,9 @@
       <w:pPr>
         <w:spacing w:line="360" w:lineRule="auto"/>
         <w:rPr>
-          <w:ins w:id="90" w:author="kyle O'Reilly" w:date="2026-10-21T20:39:00Z" w16du:dateUtc="2026-10-21T19:39:00Z"/>
-        </w:rPr>
-        <w:pPrChange w:id="91" w:author="kyle O'Reilly" w:date="2026-10-22T21:22:00Z" w16du:dateUtc="2026-10-22T20:22:00Z">
+          <w:ins w:id="94" w:author="kyle O'Reilly" w:date="2026-10-21T20:39:00Z" w16du:dateUtc="2026-10-21T19:39:00Z"/>
+        </w:rPr>
+        <w:pPrChange w:id="95" w:author="kyle O'Reilly" w:date="2026-10-22T21:22:00Z" w16du:dateUtc="2026-10-22T20:22:00Z">
           <w:pPr/>
         </w:pPrChange>
       </w:pPr>
@@ -2988,18 +2944,18 @@
         <w:pStyle w:val="Heading1"/>
         <w:spacing w:line="360" w:lineRule="auto"/>
         <w:rPr>
-          <w:ins w:id="92" w:author="kyle O'Reilly" w:date="2026-10-21T20:39:00Z" w16du:dateUtc="2026-10-21T19:39:00Z"/>
-        </w:rPr>
-        <w:pPrChange w:id="93" w:author="kyle O'Reilly" w:date="2026-10-22T21:22:00Z" w16du:dateUtc="2026-10-22T20:22:00Z">
+          <w:ins w:id="96" w:author="kyle O'Reilly" w:date="2026-10-21T20:39:00Z" w16du:dateUtc="2026-10-21T19:39:00Z"/>
+        </w:rPr>
+        <w:pPrChange w:id="97" w:author="kyle O'Reilly" w:date="2026-10-22T21:22:00Z" w16du:dateUtc="2026-10-22T20:22:00Z">
           <w:pPr/>
         </w:pPrChange>
       </w:pPr>
-      <w:bookmarkStart w:id="94" w:name="_Toc243604264"/>
-      <w:ins w:id="95" w:author="kyle O'Reilly" w:date="2026-10-21T20:39:00Z" w16du:dateUtc="2026-10-21T19:39:00Z">
+      <w:bookmarkStart w:id="98" w:name="_Toc243604264"/>
+      <w:ins w:id="99" w:author="kyle O'Reilly" w:date="2026-10-21T20:39:00Z" w16du:dateUtc="2026-10-21T19:39:00Z">
         <w:r>
           <w:t>3. Problem Definition</w:t>
         </w:r>
-        <w:bookmarkEnd w:id="94"/>
+        <w:bookmarkEnd w:id="98"/>
         <w:r>
           <w:t xml:space="preserve"> </w:t>
         </w:r>
@@ -3008,67 +2964,71 @@
     <w:p>
       <w:pPr>
         <w:spacing w:line="360" w:lineRule="auto"/>
-        <w:rPr>
-          <w:ins w:id="96" w:author="kyle O'Reilly" w:date="2026-10-22T23:05:00Z" w16du:dateUtc="2026-10-22T22:05:00Z"/>
-        </w:rPr>
-      </w:pPr>
-      <w:ins w:id="97" w:author="kyle O'Reilly" w:date="2026-10-22T23:03:00Z" w16du:dateUtc="2026-10-22T22:03:00Z">
+        <w:jc w:val="both"/>
+        <w:rPr>
+          <w:ins w:id="100" w:author="kyle O'Reilly" w:date="2026-10-22T23:05:00Z" w16du:dateUtc="2026-10-22T22:05:00Z"/>
+        </w:rPr>
+        <w:pPrChange w:id="101" w:author="kyle O'Reilly" w:date="2026-10-22T23:33:00Z" w16du:dateUtc="2026-10-22T22:33:00Z">
+          <w:pPr>
+            <w:spacing w:line="360" w:lineRule="auto"/>
+          </w:pPr>
+        </w:pPrChange>
+      </w:pPr>
+      <w:ins w:id="102" w:author="kyle O'Reilly" w:date="2026-10-22T23:03:00Z" w16du:dateUtc="2026-10-22T22:03:00Z">
         <w:r>
           <w:t>Predicting future stock closing prices is</w:t>
         </w:r>
       </w:ins>
-      <w:ins w:id="98" w:author="kyle O'Reilly" w:date="2026-10-22T23:04:00Z" w16du:dateUtc="2026-10-22T22:04:00Z">
+      <w:ins w:id="103" w:author="kyle O'Reilly" w:date="2026-10-22T23:04:00Z" w16du:dateUtc="2026-10-22T22:04:00Z">
         <w:r>
           <w:t xml:space="preserve"> challenging due to market volatility, uncertainty and the unpredictable nature if financial data. Historical stock prices often contain </w:t>
         </w:r>
       </w:ins>
-      <w:ins w:id="99" w:author="kyle O'Reilly" w:date="2026-10-22T23:05:00Z" w16du:dateUtc="2026-10-22T22:05:00Z">
+      <w:ins w:id="104" w:author="kyle O'Reilly" w:date="2026-10-22T23:05:00Z" w16du:dateUtc="2026-10-22T22:05:00Z">
         <w:r>
           <w:t>noise</w:t>
         </w:r>
       </w:ins>
-      <w:ins w:id="100" w:author="kyle O'Reilly" w:date="2026-10-22T23:04:00Z" w16du:dateUtc="2026-10-22T22:04:00Z">
+      <w:ins w:id="105" w:author="kyle O'Reilly" w:date="2026-10-22T23:04:00Z" w16du:dateUtc="2026-10-22T22:04:00Z">
         <w:r>
           <w:t xml:space="preserve"> and non-linear patterns, making accurate </w:t>
         </w:r>
       </w:ins>
-      <w:ins w:id="101" w:author="kyle O'Reilly" w:date="2026-10-22T23:05:00Z" w16du:dateUtc="2026-10-22T22:05:00Z">
-        <w:r>
-          <w:t>forecasting difficult (</w:t>
-        </w:r>
-        <w:proofErr w:type="spellStart"/>
-        <w:r>
-          <w:t>Khuwaja</w:t>
-        </w:r>
-        <w:proofErr w:type="spellEnd"/>
-        <w:r>
-          <w:t xml:space="preserve"> et al., 2020).</w:t>
+      <w:ins w:id="106" w:author="kyle O'Reilly" w:date="2026-10-22T23:05:00Z" w16du:dateUtc="2026-10-22T22:05:00Z">
+        <w:r>
+          <w:t>forecasting difficult (Khuwaja et al., 2020).</w:t>
         </w:r>
       </w:ins>
     </w:p>
     <w:p>
       <w:pPr>
         <w:spacing w:line="360" w:lineRule="auto"/>
-        <w:rPr>
-          <w:ins w:id="102" w:author="kyle O'Reilly" w:date="2026-10-22T23:06:00Z" w16du:dateUtc="2026-10-22T22:06:00Z"/>
-        </w:rPr>
-      </w:pPr>
-      <w:ins w:id="103" w:author="kyle O'Reilly" w:date="2026-10-22T23:05:00Z" w16du:dateUtc="2026-10-22T22:05:00Z">
+        <w:jc w:val="both"/>
+        <w:rPr>
+          <w:ins w:id="107" w:author="kyle O'Reilly" w:date="2026-10-22T23:06:00Z" w16du:dateUtc="2026-10-22T22:06:00Z"/>
+        </w:rPr>
+        <w:pPrChange w:id="108" w:author="kyle O'Reilly" w:date="2026-10-22T23:33:00Z" w16du:dateUtc="2026-10-22T22:33:00Z">
+          <w:pPr>
+            <w:spacing w:line="360" w:lineRule="auto"/>
+          </w:pPr>
+        </w:pPrChange>
+      </w:pPr>
+      <w:ins w:id="109" w:author="kyle O'Reilly" w:date="2026-10-22T23:05:00Z" w16du:dateUtc="2026-10-22T22:05:00Z">
         <w:r>
           <w:t xml:space="preserve">Although machine learning models are used in stock market forecasting, their accuracy can vary </w:t>
         </w:r>
       </w:ins>
-      <w:ins w:id="104" w:author="kyle O'Reilly" w:date="2026-10-22T23:07:00Z" w16du:dateUtc="2026-10-22T22:07:00Z">
+      <w:ins w:id="110" w:author="kyle O'Reilly" w:date="2026-10-22T23:07:00Z" w16du:dateUtc="2026-10-22T22:07:00Z">
         <w:r>
           <w:t>depending</w:t>
         </w:r>
       </w:ins>
-      <w:ins w:id="105" w:author="kyle O'Reilly" w:date="2026-10-22T23:05:00Z" w16du:dateUtc="2026-10-22T22:05:00Z">
+      <w:ins w:id="111" w:author="kyle O'Reilly" w:date="2026-10-22T23:05:00Z" w16du:dateUtc="2026-10-22T22:05:00Z">
         <w:r>
           <w:t xml:space="preserve"> on the model and market conditions. Indra et al. </w:t>
         </w:r>
       </w:ins>
-      <w:ins w:id="106" w:author="kyle O'Reilly" w:date="2026-10-22T23:06:00Z" w16du:dateUtc="2026-10-22T22:06:00Z">
+      <w:ins w:id="112" w:author="kyle O'Reilly" w:date="2026-10-22T23:06:00Z" w16du:dateUtc="2026-10-22T22:06:00Z">
         <w:r>
           <w:t>(2025) highlight the importance of comparing different machine approaches to evaluate their predictive performance.</w:t>
         </w:r>
@@ -3077,21 +3037,27 @@
     <w:p>
       <w:pPr>
         <w:spacing w:line="360" w:lineRule="auto"/>
-        <w:rPr>
-          <w:ins w:id="107" w:author="kyle O'Reilly" w:date="2026-10-22T23:07:00Z" w16du:dateUtc="2026-10-22T22:07:00Z"/>
-        </w:rPr>
-      </w:pPr>
-      <w:ins w:id="108" w:author="kyle O'Reilly" w:date="2026-10-22T23:06:00Z" w16du:dateUtc="2026-10-22T22:06:00Z">
+        <w:jc w:val="both"/>
+        <w:rPr>
+          <w:ins w:id="113" w:author="kyle O'Reilly" w:date="2026-10-22T23:07:00Z" w16du:dateUtc="2026-10-22T22:07:00Z"/>
+        </w:rPr>
+        <w:pPrChange w:id="114" w:author="kyle O'Reilly" w:date="2026-10-22T23:33:00Z" w16du:dateUtc="2026-10-22T22:33:00Z">
+          <w:pPr>
+            <w:spacing w:line="360" w:lineRule="auto"/>
+          </w:pPr>
+        </w:pPrChange>
+      </w:pPr>
+      <w:ins w:id="115" w:author="kyle O'Reilly" w:date="2026-10-22T23:06:00Z" w16du:dateUtc="2026-10-22T22:06:00Z">
         <w:r>
           <w:t xml:space="preserve">This Capstone Project investigates whether Linear Regression, Random Forest Regressor can </w:t>
         </w:r>
       </w:ins>
-      <w:ins w:id="109" w:author="kyle O'Reilly" w:date="2026-10-22T23:07:00Z" w16du:dateUtc="2026-10-22T22:07:00Z">
+      <w:ins w:id="116" w:author="kyle O'Reilly" w:date="2026-10-22T23:07:00Z" w16du:dateUtc="2026-10-22T22:07:00Z">
         <w:r>
           <w:t>accurately</w:t>
         </w:r>
       </w:ins>
-      <w:ins w:id="110" w:author="kyle O'Reilly" w:date="2026-10-22T23:06:00Z" w16du:dateUtc="2026-10-22T22:06:00Z">
+      <w:ins w:id="117" w:author="kyle O'Reilly" w:date="2026-10-22T23:06:00Z" w16du:dateUtc="2026-10-22T22:06:00Z">
         <w:r>
           <w:t xml:space="preserve"> </w:t>
         </w:r>
@@ -3099,7 +3065,7 @@
           <w:t>predict stock closing pric</w:t>
         </w:r>
       </w:ins>
-      <w:ins w:id="111" w:author="kyle O'Reilly" w:date="2026-10-22T23:07:00Z" w16du:dateUtc="2026-10-22T22:07:00Z">
+      <w:ins w:id="118" w:author="kyle O'Reilly" w:date="2026-10-22T23:07:00Z" w16du:dateUtc="2026-10-22T22:07:00Z">
         <w:r>
           <w:t>es 20 trading days ahead, compared with a naïve time-series forecasting baseline.</w:t>
         </w:r>
@@ -3108,59 +3074,60 @@
     <w:p>
       <w:pPr>
         <w:spacing w:line="360" w:lineRule="auto"/>
-        <w:rPr>
-          <w:ins w:id="112" w:author="kyle O'Reilly" w:date="2026-10-22T21:21:00Z" w16du:dateUtc="2026-10-22T20:21:00Z"/>
-        </w:rPr>
-        <w:pPrChange w:id="113" w:author="kyle O'Reilly" w:date="2026-10-22T21:22:00Z" w16du:dateUtc="2026-10-22T20:22:00Z">
+        <w:jc w:val="both"/>
+        <w:rPr>
+          <w:ins w:id="119" w:author="kyle O'Reilly" w:date="2026-10-22T21:21:00Z" w16du:dateUtc="2026-10-22T20:21:00Z"/>
+        </w:rPr>
+        <w:pPrChange w:id="120" w:author="kyle O'Reilly" w:date="2026-10-22T23:33:00Z" w16du:dateUtc="2026-10-22T22:33:00Z">
           <w:pPr/>
         </w:pPrChange>
       </w:pPr>
-      <w:ins w:id="114" w:author="kyle O'Reilly" w:date="2026-10-22T23:07:00Z" w16du:dateUtc="2026-10-22T22:07:00Z">
+      <w:ins w:id="121" w:author="kyle O'Reilly" w:date="2026-10-22T23:07:00Z" w16du:dateUtc="2026-10-22T22:07:00Z">
         <w:r>
           <w:t xml:space="preserve">The </w:t>
         </w:r>
       </w:ins>
-      <w:ins w:id="115" w:author="kyle O'Reilly" w:date="2026-10-22T23:08:00Z" w16du:dateUtc="2026-10-22T22:08:00Z">
+      <w:ins w:id="122" w:author="kyle O'Reilly" w:date="2026-10-22T23:08:00Z" w16du:dateUtc="2026-10-22T22:08:00Z">
         <w:r>
           <w:t xml:space="preserve">research </w:t>
         </w:r>
       </w:ins>
-      <w:ins w:id="116" w:author="kyle O'Reilly" w:date="2026-10-22T23:07:00Z" w16du:dateUtc="2026-10-22T22:07:00Z">
+      <w:ins w:id="123" w:author="kyle O'Reilly" w:date="2026-10-22T23:07:00Z" w16du:dateUtc="2026-10-22T22:07:00Z">
         <w:r>
           <w:t xml:space="preserve">will examine JPMorgan Chase &amp; Co., Coca-Cola Co. and Intel Corp. to </w:t>
         </w:r>
       </w:ins>
-      <w:ins w:id="117" w:author="kyle O'Reilly" w:date="2026-10-22T23:08:00Z" w16du:dateUtc="2026-10-22T22:08:00Z">
+      <w:ins w:id="124" w:author="kyle O'Reilly" w:date="2026-10-22T23:08:00Z" w16du:dateUtc="2026-10-22T22:08:00Z">
         <w:r>
           <w:t>determine</w:t>
         </w:r>
       </w:ins>
-      <w:ins w:id="118" w:author="kyle O'Reilly" w:date="2026-10-22T23:07:00Z" w16du:dateUtc="2026-10-22T22:07:00Z">
+      <w:ins w:id="125" w:author="kyle O'Reilly" w:date="2026-10-22T23:07:00Z" w16du:dateUtc="2026-10-22T22:07:00Z">
         <w:r>
           <w:t xml:space="preserve"> </w:t>
         </w:r>
       </w:ins>
-      <w:ins w:id="119" w:author="kyle O'Reilly" w:date="2026-10-22T23:08:00Z" w16du:dateUtc="2026-10-22T22:08:00Z">
+      <w:ins w:id="126" w:author="kyle O'Reilly" w:date="2026-10-22T23:08:00Z" w16du:dateUtc="2026-10-22T22:08:00Z">
         <w:r>
           <w:t>whether</w:t>
         </w:r>
       </w:ins>
-      <w:ins w:id="120" w:author="kyle O'Reilly" w:date="2026-10-22T23:07:00Z" w16du:dateUtc="2026-10-22T22:07:00Z">
+      <w:ins w:id="127" w:author="kyle O'Reilly" w:date="2026-10-22T23:07:00Z" w16du:dateUtc="2026-10-22T22:07:00Z">
         <w:r>
           <w:t xml:space="preserve"> </w:t>
         </w:r>
       </w:ins>
-      <w:ins w:id="121" w:author="kyle O'Reilly" w:date="2026-10-22T23:08:00Z" w16du:dateUtc="2026-10-22T22:08:00Z">
+      <w:ins w:id="128" w:author="kyle O'Reilly" w:date="2026-10-22T23:08:00Z" w16du:dateUtc="2026-10-22T22:08:00Z">
         <w:r>
           <w:t>forecasting</w:t>
         </w:r>
       </w:ins>
-      <w:ins w:id="122" w:author="kyle O'Reilly" w:date="2026-10-22T23:07:00Z" w16du:dateUtc="2026-10-22T22:07:00Z">
+      <w:ins w:id="129" w:author="kyle O'Reilly" w:date="2026-10-22T23:07:00Z" w16du:dateUtc="2026-10-22T22:07:00Z">
         <w:r>
           <w:t xml:space="preserve"> </w:t>
         </w:r>
       </w:ins>
-      <w:ins w:id="123" w:author="kyle O'Reilly" w:date="2026-10-22T23:08:00Z" w16du:dateUtc="2026-10-22T22:08:00Z">
+      <w:ins w:id="130" w:author="kyle O'Reilly" w:date="2026-10-22T23:08:00Z" w16du:dateUtc="2026-10-22T22:08:00Z">
         <w:r>
           <w:t>errors</w:t>
         </w:r>
@@ -3174,17 +3141,17 @@
           <w:t xml:space="preserve">levels and whether machine learning models </w:t>
         </w:r>
       </w:ins>
-      <w:ins w:id="124" w:author="kyle O'Reilly" w:date="2026-10-22T23:09:00Z" w16du:dateUtc="2026-10-22T22:09:00Z">
+      <w:ins w:id="131" w:author="kyle O'Reilly" w:date="2026-10-22T23:09:00Z" w16du:dateUtc="2026-10-22T22:09:00Z">
         <w:r>
           <w:t>outperform</w:t>
         </w:r>
       </w:ins>
-      <w:ins w:id="125" w:author="kyle O'Reilly" w:date="2026-10-22T23:08:00Z" w16du:dateUtc="2026-10-22T22:08:00Z">
+      <w:ins w:id="132" w:author="kyle O'Reilly" w:date="2026-10-22T23:08:00Z" w16du:dateUtc="2026-10-22T22:08:00Z">
         <w:r>
           <w:t xml:space="preserve"> the simpler base</w:t>
         </w:r>
       </w:ins>
-      <w:ins w:id="126" w:author="kyle O'Reilly" w:date="2026-10-22T23:09:00Z" w16du:dateUtc="2026-10-22T22:09:00Z">
+      <w:ins w:id="133" w:author="kyle O'Reilly" w:date="2026-10-22T23:09:00Z" w16du:dateUtc="2026-10-22T22:09:00Z">
         <w:r>
           <w:t>line.</w:t>
         </w:r>
@@ -3194,9 +3161,9 @@
       <w:pPr>
         <w:spacing w:line="360" w:lineRule="auto"/>
         <w:rPr>
-          <w:ins w:id="127" w:author="kyle O'Reilly" w:date="2026-10-21T20:39:00Z" w16du:dateUtc="2026-10-21T19:39:00Z"/>
-        </w:rPr>
-        <w:pPrChange w:id="128" w:author="kyle O'Reilly" w:date="2026-10-22T21:22:00Z" w16du:dateUtc="2026-10-22T20:22:00Z">
+          <w:ins w:id="134" w:author="kyle O'Reilly" w:date="2026-10-21T20:39:00Z" w16du:dateUtc="2026-10-21T19:39:00Z"/>
+        </w:rPr>
+        <w:pPrChange w:id="135" w:author="kyle O'Reilly" w:date="2026-10-22T21:22:00Z" w16du:dateUtc="2026-10-22T20:22:00Z">
           <w:pPr/>
         </w:pPrChange>
       </w:pPr>
@@ -3207,23 +3174,23 @@
         <w:spacing w:line="360" w:lineRule="auto"/>
         <w:jc w:val="both"/>
         <w:rPr>
-          <w:ins w:id="129" w:author="kyle O'Reilly" w:date="2026-10-21T20:40:00Z" w16du:dateUtc="2026-10-21T19:40:00Z"/>
-        </w:rPr>
-        <w:pPrChange w:id="130" w:author="kyle O'Reilly" w:date="2026-10-22T21:22:00Z" w16du:dateUtc="2026-10-22T20:22:00Z">
+          <w:ins w:id="136" w:author="kyle O'Reilly" w:date="2026-10-21T20:40:00Z" w16du:dateUtc="2026-10-21T19:40:00Z"/>
+        </w:rPr>
+        <w:pPrChange w:id="137" w:author="kyle O'Reilly" w:date="2026-10-22T21:22:00Z" w16du:dateUtc="2026-10-22T20:22:00Z">
           <w:pPr/>
         </w:pPrChange>
       </w:pPr>
-      <w:bookmarkStart w:id="131" w:name="_Toc243604265"/>
-      <w:ins w:id="132" w:author="kyle O'Reilly" w:date="2026-10-21T20:39:00Z" w16du:dateUtc="2026-10-21T19:39:00Z">
+      <w:bookmarkStart w:id="138" w:name="_Toc243604265"/>
+      <w:ins w:id="139" w:author="kyle O'Reilly" w:date="2026-10-21T20:39:00Z" w16du:dateUtc="2026-10-21T19:39:00Z">
         <w:r>
           <w:t>4. Aim</w:t>
         </w:r>
       </w:ins>
-      <w:ins w:id="133" w:author="kyle O'Reilly" w:date="2026-10-21T20:40:00Z" w16du:dateUtc="2026-10-21T19:40:00Z">
+      <w:ins w:id="140" w:author="kyle O'Reilly" w:date="2026-10-21T20:40:00Z" w16du:dateUtc="2026-10-21T19:40:00Z">
         <w:r>
           <w:t>, Objectives and Hypothesis</w:t>
         </w:r>
-        <w:bookmarkEnd w:id="131"/>
+        <w:bookmarkEnd w:id="138"/>
         <w:r>
           <w:t xml:space="preserve"> </w:t>
         </w:r>
@@ -3234,18 +3201,18 @@
         <w:spacing w:line="360" w:lineRule="auto"/>
         <w:jc w:val="both"/>
         <w:rPr>
-          <w:ins w:id="134" w:author="kyle O'Reilly" w:date="2026-10-21T23:16:00Z" w16du:dateUtc="2026-10-21T22:16:00Z"/>
-        </w:rPr>
-        <w:pPrChange w:id="135" w:author="kyle O'Reilly" w:date="2026-10-22T21:22:00Z" w16du:dateUtc="2026-10-22T20:22:00Z">
+          <w:ins w:id="141" w:author="kyle O'Reilly" w:date="2026-10-21T23:16:00Z" w16du:dateUtc="2026-10-21T22:16:00Z"/>
+        </w:rPr>
+        <w:pPrChange w:id="142" w:author="kyle O'Reilly" w:date="2026-10-22T21:22:00Z" w16du:dateUtc="2026-10-22T20:22:00Z">
           <w:pPr/>
         </w:pPrChange>
       </w:pPr>
-      <w:ins w:id="136" w:author="kyle O'Reilly" w:date="2026-10-21T23:10:00Z" w16du:dateUtc="2026-10-21T22:10:00Z">
+      <w:ins w:id="143" w:author="kyle O'Reilly" w:date="2026-10-21T23:10:00Z" w16du:dateUtc="2026-10-21T22:10:00Z">
         <w:r>
           <w:rPr>
             <w:b/>
             <w:bCs/>
-            <w:rPrChange w:id="137" w:author="kyle O'Reilly" w:date="2026-10-21T23:11:00Z" w16du:dateUtc="2026-10-21T22:11:00Z">
+            <w:rPrChange w:id="144" w:author="kyle O'Reilly" w:date="2026-10-21T23:11:00Z" w16du:dateUtc="2026-10-21T22:11:00Z">
               <w:rPr/>
             </w:rPrChange>
           </w:rPr>
@@ -3261,33 +3228,33 @@
         <w:spacing w:line="360" w:lineRule="auto"/>
         <w:jc w:val="both"/>
         <w:rPr>
-          <w:ins w:id="138" w:author="kyle O'Reilly" w:date="2026-10-21T23:11:00Z" w16du:dateUtc="2026-10-21T22:11:00Z"/>
-        </w:rPr>
-        <w:pPrChange w:id="139" w:author="kyle O'Reilly" w:date="2026-10-22T21:22:00Z" w16du:dateUtc="2026-10-22T20:22:00Z">
+          <w:ins w:id="145" w:author="kyle O'Reilly" w:date="2026-10-21T23:11:00Z" w16du:dateUtc="2026-10-21T22:11:00Z"/>
+        </w:rPr>
+        <w:pPrChange w:id="146" w:author="kyle O'Reilly" w:date="2026-10-22T21:22:00Z" w16du:dateUtc="2026-10-22T20:22:00Z">
           <w:pPr/>
         </w:pPrChange>
       </w:pPr>
-      <w:ins w:id="140" w:author="kyle O'Reilly" w:date="2026-10-21T23:10:00Z" w16du:dateUtc="2026-10-21T22:10:00Z">
+      <w:ins w:id="147" w:author="kyle O'Reilly" w:date="2026-10-21T23:10:00Z" w16du:dateUtc="2026-10-21T22:10:00Z">
         <w:r>
           <w:t xml:space="preserve">To compare the accuracy of Linear Regression, Random Forest and a </w:t>
         </w:r>
       </w:ins>
-      <w:ins w:id="141" w:author="kyle O'Reilly" w:date="2026-10-21T23:14:00Z" w16du:dateUtc="2026-10-21T22:14:00Z">
+      <w:ins w:id="148" w:author="kyle O'Reilly" w:date="2026-10-21T23:14:00Z" w16du:dateUtc="2026-10-21T22:14:00Z">
         <w:r>
           <w:t>n</w:t>
         </w:r>
       </w:ins>
-      <w:ins w:id="142" w:author="kyle O'Reilly" w:date="2026-10-21T23:10:00Z" w16du:dateUtc="2026-10-21T22:10:00Z">
+      <w:ins w:id="149" w:author="kyle O'Reilly" w:date="2026-10-21T23:10:00Z" w16du:dateUtc="2026-10-21T22:10:00Z">
         <w:r>
           <w:t xml:space="preserve">aïve </w:t>
         </w:r>
       </w:ins>
-      <w:ins w:id="143" w:author="kyle O'Reilly" w:date="2026-10-21T23:14:00Z" w16du:dateUtc="2026-10-21T22:14:00Z">
+      <w:ins w:id="150" w:author="kyle O'Reilly" w:date="2026-10-21T23:14:00Z" w16du:dateUtc="2026-10-21T22:14:00Z">
         <w:r>
           <w:t>b</w:t>
         </w:r>
       </w:ins>
-      <w:ins w:id="144" w:author="kyle O'Reilly" w:date="2026-10-21T23:10:00Z" w16du:dateUtc="2026-10-21T22:10:00Z">
+      <w:ins w:id="151" w:author="kyle O'Reilly" w:date="2026-10-21T23:10:00Z" w16du:dateUtc="2026-10-21T22:10:00Z">
         <w:r>
           <w:t xml:space="preserve">aseline when predicting stock </w:t>
         </w:r>
@@ -3295,37 +3262,37 @@
           <w:t xml:space="preserve">prices twenty </w:t>
         </w:r>
       </w:ins>
-      <w:ins w:id="145" w:author="kyle O'Reilly" w:date="2026-10-22T00:14:00Z" w16du:dateUtc="2026-10-21T23:14:00Z">
+      <w:ins w:id="152" w:author="kyle O'Reilly" w:date="2026-10-22T00:14:00Z" w16du:dateUtc="2026-10-21T23:14:00Z">
         <w:r>
           <w:t xml:space="preserve">trading </w:t>
         </w:r>
       </w:ins>
-      <w:ins w:id="146" w:author="kyle O'Reilly" w:date="2026-10-21T23:10:00Z" w16du:dateUtc="2026-10-21T22:10:00Z">
+      <w:ins w:id="153" w:author="kyle O'Reilly" w:date="2026-10-21T23:10:00Z" w16du:dateUtc="2026-10-21T22:10:00Z">
         <w:r>
           <w:t xml:space="preserve">days after one </w:t>
         </w:r>
       </w:ins>
-      <w:ins w:id="147" w:author="kyle O'Reilly" w:date="2026-10-21T23:11:00Z" w16du:dateUtc="2026-10-21T22:11:00Z">
+      <w:ins w:id="154" w:author="kyle O'Reilly" w:date="2026-10-21T23:11:00Z" w16du:dateUtc="2026-10-21T22:11:00Z">
         <w:r>
           <w:t>historical cut-off stock date from the JPM</w:t>
         </w:r>
       </w:ins>
-      <w:ins w:id="148" w:author="kyle O'Reilly" w:date="2026-10-22T00:04:00Z" w16du:dateUtc="2026-10-21T23:04:00Z">
+      <w:ins w:id="155" w:author="kyle O'Reilly" w:date="2026-10-22T00:04:00Z" w16du:dateUtc="2026-10-21T23:04:00Z">
         <w:r>
           <w:t>.US</w:t>
         </w:r>
       </w:ins>
-      <w:ins w:id="149" w:author="kyle O'Reilly" w:date="2026-10-21T23:11:00Z" w16du:dateUtc="2026-10-21T22:11:00Z">
+      <w:ins w:id="156" w:author="kyle O'Reilly" w:date="2026-10-21T23:11:00Z" w16du:dateUtc="2026-10-21T22:11:00Z">
         <w:r>
           <w:t>, KO</w:t>
         </w:r>
       </w:ins>
-      <w:ins w:id="150" w:author="kyle O'Reilly" w:date="2026-10-22T00:04:00Z" w16du:dateUtc="2026-10-21T23:04:00Z">
+      <w:ins w:id="157" w:author="kyle O'Reilly" w:date="2026-10-22T00:04:00Z" w16du:dateUtc="2026-10-21T23:04:00Z">
         <w:r>
           <w:t>.US</w:t>
         </w:r>
       </w:ins>
-      <w:ins w:id="151" w:author="kyle O'Reilly" w:date="2026-10-21T23:11:00Z" w16du:dateUtc="2026-10-21T22:11:00Z">
+      <w:ins w:id="158" w:author="kyle O'Reilly" w:date="2026-10-21T23:11:00Z" w16du:dateUtc="2026-10-21T22:11:00Z">
         <w:r>
           <w:t xml:space="preserve"> and </w:t>
         </w:r>
@@ -3333,7 +3300,7 @@
           <w:t>INTC.</w:t>
         </w:r>
       </w:ins>
-      <w:ins w:id="152" w:author="kyle O'Reilly" w:date="2026-10-22T00:04:00Z" w16du:dateUtc="2026-10-21T23:04:00Z">
+      <w:ins w:id="159" w:author="kyle O'Reilly" w:date="2026-10-22T00:04:00Z" w16du:dateUtc="2026-10-21T23:04:00Z">
         <w:r>
           <w:t>US.</w:t>
         </w:r>
@@ -3344,25 +3311,25 @@
         <w:spacing w:line="360" w:lineRule="auto"/>
         <w:jc w:val="both"/>
         <w:rPr>
-          <w:ins w:id="153" w:author="kyle O'Reilly" w:date="2026-10-21T23:11:00Z" w16du:dateUtc="2026-10-21T22:11:00Z"/>
+          <w:ins w:id="160" w:author="kyle O'Reilly" w:date="2026-10-21T23:11:00Z" w16du:dateUtc="2026-10-21T22:11:00Z"/>
           <w:b/>
           <w:bCs/>
-          <w:rPrChange w:id="154" w:author="kyle O'Reilly" w:date="2026-10-21T23:16:00Z" w16du:dateUtc="2026-10-21T22:16:00Z">
+          <w:rPrChange w:id="161" w:author="kyle O'Reilly" w:date="2026-10-21T23:16:00Z" w16du:dateUtc="2026-10-21T22:16:00Z">
             <w:rPr>
-              <w:ins w:id="155" w:author="kyle O'Reilly" w:date="2026-10-21T23:11:00Z" w16du:dateUtc="2026-10-21T22:11:00Z"/>
+              <w:ins w:id="162" w:author="kyle O'Reilly" w:date="2026-10-21T23:11:00Z" w16du:dateUtc="2026-10-21T22:11:00Z"/>
             </w:rPr>
           </w:rPrChange>
         </w:rPr>
-        <w:pPrChange w:id="156" w:author="kyle O'Reilly" w:date="2026-10-22T21:22:00Z" w16du:dateUtc="2026-10-22T20:22:00Z">
+        <w:pPrChange w:id="163" w:author="kyle O'Reilly" w:date="2026-10-22T21:22:00Z" w16du:dateUtc="2026-10-22T20:22:00Z">
           <w:pPr/>
         </w:pPrChange>
       </w:pPr>
-      <w:ins w:id="157" w:author="kyle O'Reilly" w:date="2026-10-21T23:11:00Z" w16du:dateUtc="2026-10-21T22:11:00Z">
+      <w:ins w:id="164" w:author="kyle O'Reilly" w:date="2026-10-21T23:11:00Z" w16du:dateUtc="2026-10-21T22:11:00Z">
         <w:r>
           <w:rPr>
             <w:b/>
             <w:bCs/>
-            <w:rPrChange w:id="158" w:author="kyle O'Reilly" w:date="2026-10-21T23:16:00Z" w16du:dateUtc="2026-10-21T22:16:00Z">
+            <w:rPrChange w:id="165" w:author="kyle O'Reilly" w:date="2026-10-21T23:16:00Z" w16du:dateUtc="2026-10-21T22:16:00Z">
               <w:rPr/>
             </w:rPrChange>
           </w:rPr>
@@ -3380,9 +3347,9 @@
         <w:spacing w:line="360" w:lineRule="auto"/>
         <w:jc w:val="both"/>
         <w:rPr>
-          <w:ins w:id="159" w:author="kyle O'Reilly" w:date="2026-10-21T23:13:00Z" w16du:dateUtc="2026-10-21T22:13:00Z"/>
-        </w:rPr>
-        <w:pPrChange w:id="160" w:author="kyle O'Reilly" w:date="2026-10-22T21:22:00Z" w16du:dateUtc="2026-10-22T20:22:00Z">
+          <w:ins w:id="166" w:author="kyle O'Reilly" w:date="2026-10-21T23:13:00Z" w16du:dateUtc="2026-10-21T22:13:00Z"/>
+        </w:rPr>
+        <w:pPrChange w:id="167" w:author="kyle O'Reilly" w:date="2026-10-22T21:22:00Z" w16du:dateUtc="2026-10-22T20:22:00Z">
           <w:pPr>
             <w:pStyle w:val="ListParagraph"/>
             <w:numPr>
@@ -3392,22 +3359,22 @@
           </w:pPr>
         </w:pPrChange>
       </w:pPr>
-      <w:ins w:id="161" w:author="kyle O'Reilly" w:date="2026-10-21T23:11:00Z" w16du:dateUtc="2026-10-21T22:11:00Z">
+      <w:ins w:id="168" w:author="kyle O'Reilly" w:date="2026-10-21T23:11:00Z" w16du:dateUtc="2026-10-21T22:11:00Z">
         <w:r>
           <w:t>S</w:t>
         </w:r>
       </w:ins>
-      <w:ins w:id="162" w:author="kyle O'Reilly" w:date="2026-10-21T23:12:00Z" w16du:dateUtc="2026-10-21T22:12:00Z">
+      <w:ins w:id="169" w:author="kyle O'Reilly" w:date="2026-10-21T23:12:00Z" w16du:dateUtc="2026-10-21T22:12:00Z">
         <w:r>
           <w:t>elect JPM</w:t>
         </w:r>
       </w:ins>
-      <w:ins w:id="163" w:author="kyle O'Reilly" w:date="2026-10-21T23:57:00Z" w16du:dateUtc="2026-10-21T22:57:00Z">
+      <w:ins w:id="170" w:author="kyle O'Reilly" w:date="2026-10-21T23:57:00Z" w16du:dateUtc="2026-10-21T22:57:00Z">
         <w:r>
           <w:t>.US</w:t>
         </w:r>
       </w:ins>
-      <w:ins w:id="164" w:author="kyle O'Reilly" w:date="2026-10-21T23:12:00Z" w16du:dateUtc="2026-10-21T22:12:00Z">
+      <w:ins w:id="171" w:author="kyle O'Reilly" w:date="2026-10-21T23:12:00Z" w16du:dateUtc="2026-10-21T22:12:00Z">
         <w:r>
           <w:t>,</w:t>
         </w:r>
@@ -3415,37 +3382,37 @@
           <w:t xml:space="preserve"> KO</w:t>
         </w:r>
       </w:ins>
-      <w:ins w:id="165" w:author="kyle O'Reilly" w:date="2026-10-21T23:57:00Z" w16du:dateUtc="2026-10-21T22:57:00Z">
+      <w:ins w:id="172" w:author="kyle O'Reilly" w:date="2026-10-21T23:57:00Z" w16du:dateUtc="2026-10-21T22:57:00Z">
         <w:r>
           <w:t>.US</w:t>
         </w:r>
       </w:ins>
-      <w:ins w:id="166" w:author="kyle O'Reilly" w:date="2026-10-21T23:12:00Z" w16du:dateUtc="2026-10-21T22:12:00Z">
+      <w:ins w:id="173" w:author="kyle O'Reilly" w:date="2026-10-21T23:12:00Z" w16du:dateUtc="2026-10-21T22:12:00Z">
         <w:r>
           <w:t xml:space="preserve"> and INTC</w:t>
         </w:r>
       </w:ins>
-      <w:ins w:id="167" w:author="kyle O'Reilly" w:date="2026-10-21T23:57:00Z" w16du:dateUtc="2026-10-21T22:57:00Z">
+      <w:ins w:id="174" w:author="kyle O'Reilly" w:date="2026-10-21T23:57:00Z" w16du:dateUtc="2026-10-21T22:57:00Z">
         <w:r>
           <w:t>.US</w:t>
         </w:r>
       </w:ins>
-      <w:ins w:id="168" w:author="kyle O'Reilly" w:date="2026-10-21T23:12:00Z" w16du:dateUtc="2026-10-21T22:12:00Z">
+      <w:ins w:id="175" w:author="kyle O'Reilly" w:date="2026-10-21T23:12:00Z" w16du:dateUtc="2026-10-21T22:12:00Z">
         <w:r>
           <w:t>, and examine comparable published</w:t>
         </w:r>
       </w:ins>
-      <w:ins w:id="169" w:author="kyle O'Reilly" w:date="2026-10-21T23:58:00Z" w16du:dateUtc="2026-10-21T22:58:00Z">
+      <w:ins w:id="176" w:author="kyle O'Reilly" w:date="2026-10-21T23:58:00Z" w16du:dateUtc="2026-10-21T22:58:00Z">
         <w:r>
           <w:t xml:space="preserve"> Trading 212</w:t>
         </w:r>
       </w:ins>
-      <w:ins w:id="170" w:author="kyle O'Reilly" w:date="2026-10-21T23:12:00Z" w16du:dateUtc="2026-10-21T22:12:00Z">
+      <w:ins w:id="177" w:author="kyle O'Reilly" w:date="2026-10-21T23:12:00Z" w16du:dateUtc="2026-10-21T22:12:00Z">
         <w:r>
           <w:t xml:space="preserve"> volatility information to justify their proposed contra</w:t>
         </w:r>
       </w:ins>
-      <w:ins w:id="171" w:author="kyle O'Reilly" w:date="2026-10-21T23:13:00Z" w16du:dateUtc="2026-10-21T22:13:00Z">
+      <w:ins w:id="178" w:author="kyle O'Reilly" w:date="2026-10-21T23:13:00Z" w16du:dateUtc="2026-10-21T22:13:00Z">
         <w:r>
           <w:t>sting volatility levels.</w:t>
         </w:r>
@@ -3461,72 +3428,7 @@
         <w:spacing w:line="360" w:lineRule="auto"/>
         <w:jc w:val="both"/>
         <w:rPr>
-          <w:ins w:id="172" w:author="kyle O'Reilly" w:date="2026-10-21T23:14:00Z" w16du:dateUtc="2026-10-21T22:14:00Z"/>
-        </w:rPr>
-        <w:pPrChange w:id="173" w:author="kyle O'Reilly" w:date="2026-10-22T21:22:00Z" w16du:dateUtc="2026-10-22T20:22:00Z">
-          <w:pPr>
-            <w:pStyle w:val="ListParagraph"/>
-            <w:numPr>
-              <w:numId w:val="7"/>
-            </w:numPr>
-            <w:ind w:hanging="360"/>
-          </w:pPr>
-        </w:pPrChange>
-      </w:pPr>
-      <w:ins w:id="174" w:author="kyle O'Reilly" w:date="2026-10-21T23:13:00Z" w16du:dateUtc="2026-10-21T22:13:00Z">
-        <w:r>
-          <w:t xml:space="preserve">Collect, clean and analyse historical stock data </w:t>
-        </w:r>
-        <w:r>
-          <w:t>from Stooq, and prepare simple historical</w:t>
-        </w:r>
-      </w:ins>
-      <w:ins w:id="175" w:author="kyle O'Reilly" w:date="2026-10-21T23:14:00Z" w16du:dateUtc="2026-10-21T22:14:00Z">
-        <w:r>
-          <w:t xml:space="preserve"> price features for the forecasting models.</w:t>
-        </w:r>
-      </w:ins>
-    </w:p>
-    <w:p>
-      <w:pPr>
-        <w:pStyle w:val="ListParagraph"/>
-        <w:numPr>
-          <w:ilvl w:val="0"/>
-          <w:numId w:val="7"/>
-        </w:numPr>
-        <w:spacing w:line="360" w:lineRule="auto"/>
-        <w:jc w:val="both"/>
-        <w:rPr>
-          <w:ins w:id="176" w:author="kyle O'Reilly" w:date="2026-10-21T23:14:00Z" w16du:dateUtc="2026-10-21T22:14:00Z"/>
-        </w:rPr>
-        <w:pPrChange w:id="177" w:author="kyle O'Reilly" w:date="2026-10-22T21:22:00Z" w16du:dateUtc="2026-10-22T20:22:00Z">
-          <w:pPr>
-            <w:pStyle w:val="ListParagraph"/>
-            <w:numPr>
-              <w:numId w:val="7"/>
-            </w:numPr>
-            <w:ind w:hanging="360"/>
-          </w:pPr>
-        </w:pPrChange>
-      </w:pPr>
-      <w:ins w:id="178" w:author="kyle O'Reilly" w:date="2026-10-21T23:14:00Z" w16du:dateUtc="2026-10-21T22:14:00Z">
-        <w:r>
-          <w:lastRenderedPageBreak/>
-          <w:t>Develop Linear Regression and Random Forest models and establish a naïve baseline for each selected stock.</w:t>
-        </w:r>
-      </w:ins>
-    </w:p>
-    <w:p>
-      <w:pPr>
-        <w:pStyle w:val="ListParagraph"/>
-        <w:numPr>
-          <w:ilvl w:val="0"/>
-          <w:numId w:val="7"/>
-        </w:numPr>
-        <w:spacing w:line="360" w:lineRule="auto"/>
-        <w:jc w:val="both"/>
-        <w:rPr>
-          <w:ins w:id="179" w:author="kyle O'Reilly" w:date="2026-10-21T23:15:00Z" w16du:dateUtc="2026-10-21T22:15:00Z"/>
+          <w:ins w:id="179" w:author="kyle O'Reilly" w:date="2026-10-21T23:14:00Z" w16du:dateUtc="2026-10-21T22:14:00Z"/>
         </w:rPr>
         <w:pPrChange w:id="180" w:author="kyle O'Reilly" w:date="2026-10-22T21:22:00Z" w16du:dateUtc="2026-10-22T20:22:00Z">
           <w:pPr>
@@ -3538,14 +3440,17 @@
           </w:pPr>
         </w:pPrChange>
       </w:pPr>
-      <w:ins w:id="181" w:author="kyle O'Reilly" w:date="2026-10-21T23:14:00Z" w16du:dateUtc="2026-10-21T22:14:00Z">
-        <w:r>
-          <w:t>Generate nine predic</w:t>
-        </w:r>
-      </w:ins>
-      <w:ins w:id="182" w:author="kyle O'Reilly" w:date="2026-10-21T23:15:00Z" w16du:dateUtc="2026-10-21T22:15:00Z">
-        <w:r>
-          <w:t>tions and compare them with three actual closing stock prices twenty days after the historical cut-off stock date.</w:t>
+      <w:ins w:id="181" w:author="kyle O'Reilly" w:date="2026-10-21T23:13:00Z" w16du:dateUtc="2026-10-21T22:13:00Z">
+        <w:r>
+          <w:t xml:space="preserve">Collect, clean and analyse historical stock data </w:t>
+        </w:r>
+        <w:r>
+          <w:t>from Stooq, and prepare simple historical</w:t>
+        </w:r>
+      </w:ins>
+      <w:ins w:id="182" w:author="kyle O'Reilly" w:date="2026-10-21T23:14:00Z" w16du:dateUtc="2026-10-21T22:14:00Z">
+        <w:r>
+          <w:t xml:space="preserve"> price features for the forecasting models.</w:t>
         </w:r>
       </w:ins>
     </w:p>
@@ -3559,7 +3464,7 @@
         <w:spacing w:line="360" w:lineRule="auto"/>
         <w:jc w:val="both"/>
         <w:rPr>
-          <w:ins w:id="183" w:author="kyle O'Reilly" w:date="2026-10-21T23:16:00Z" w16du:dateUtc="2026-10-21T22:16:00Z"/>
+          <w:ins w:id="183" w:author="kyle O'Reilly" w:date="2026-10-21T23:14:00Z" w16du:dateUtc="2026-10-21T22:14:00Z"/>
         </w:rPr>
         <w:pPrChange w:id="184" w:author="kyle O'Reilly" w:date="2026-10-22T21:22:00Z" w16du:dateUtc="2026-10-22T20:22:00Z">
           <w:pPr>
@@ -3571,44 +3476,106 @@
           </w:pPr>
         </w:pPrChange>
       </w:pPr>
-      <w:ins w:id="185" w:author="kyle O'Reilly" w:date="2026-10-21T23:15:00Z" w16du:dateUtc="2026-10-21T22:15:00Z">
-        <w:r>
-          <w:t>Calculate individual prediction errors</w:t>
-        </w:r>
-        <w:r>
-          <w:t>, compare approaches and discuss observed difference between the s</w:t>
-        </w:r>
-      </w:ins>
-      <w:ins w:id="186" w:author="kyle O'Reilly" w:date="2026-10-21T23:16:00Z" w16du:dateUtc="2026-10-21T22:16:00Z">
-        <w:r>
-          <w:t>elected stocks.</w:t>
-        </w:r>
-      </w:ins>
-    </w:p>
-    <w:p>
-      <w:pPr>
+      <w:ins w:id="185" w:author="kyle O'Reilly" w:date="2026-10-21T23:14:00Z" w16du:dateUtc="2026-10-21T22:14:00Z">
+        <w:r>
+          <w:lastRenderedPageBreak/>
+          <w:t>Develop Linear Regression and Random Forest models and establish a naïve baseline for each selected stock.</w:t>
+        </w:r>
+      </w:ins>
+    </w:p>
+    <w:p>
+      <w:pPr>
+        <w:pStyle w:val="ListParagraph"/>
+        <w:numPr>
+          <w:ilvl w:val="0"/>
+          <w:numId w:val="7"/>
+        </w:numPr>
         <w:spacing w:line="360" w:lineRule="auto"/>
         <w:jc w:val="both"/>
         <w:rPr>
-          <w:ins w:id="187" w:author="kyle O'Reilly" w:date="2026-10-21T23:16:00Z" w16du:dateUtc="2026-10-21T22:16:00Z"/>
+          <w:ins w:id="186" w:author="kyle O'Reilly" w:date="2026-10-21T23:15:00Z" w16du:dateUtc="2026-10-21T22:15:00Z"/>
+        </w:rPr>
+        <w:pPrChange w:id="187" w:author="kyle O'Reilly" w:date="2026-10-22T21:22:00Z" w16du:dateUtc="2026-10-22T20:22:00Z">
+          <w:pPr>
+            <w:pStyle w:val="ListParagraph"/>
+            <w:numPr>
+              <w:numId w:val="7"/>
+            </w:numPr>
+            <w:ind w:hanging="360"/>
+          </w:pPr>
+        </w:pPrChange>
+      </w:pPr>
+      <w:ins w:id="188" w:author="kyle O'Reilly" w:date="2026-10-21T23:14:00Z" w16du:dateUtc="2026-10-21T22:14:00Z">
+        <w:r>
+          <w:t>Generate nine predic</w:t>
+        </w:r>
+      </w:ins>
+      <w:ins w:id="189" w:author="kyle O'Reilly" w:date="2026-10-21T23:15:00Z" w16du:dateUtc="2026-10-21T22:15:00Z">
+        <w:r>
+          <w:t>tions and compare them with three actual closing stock prices twenty days after the historical cut-off stock date.</w:t>
+        </w:r>
+      </w:ins>
+    </w:p>
+    <w:p>
+      <w:pPr>
+        <w:pStyle w:val="ListParagraph"/>
+        <w:numPr>
+          <w:ilvl w:val="0"/>
+          <w:numId w:val="7"/>
+        </w:numPr>
+        <w:spacing w:line="360" w:lineRule="auto"/>
+        <w:jc w:val="both"/>
+        <w:rPr>
+          <w:ins w:id="190" w:author="kyle O'Reilly" w:date="2026-10-21T23:16:00Z" w16du:dateUtc="2026-10-21T22:16:00Z"/>
+        </w:rPr>
+        <w:pPrChange w:id="191" w:author="kyle O'Reilly" w:date="2026-10-22T21:22:00Z" w16du:dateUtc="2026-10-22T20:22:00Z">
+          <w:pPr>
+            <w:pStyle w:val="ListParagraph"/>
+            <w:numPr>
+              <w:numId w:val="7"/>
+            </w:numPr>
+            <w:ind w:hanging="360"/>
+          </w:pPr>
+        </w:pPrChange>
+      </w:pPr>
+      <w:ins w:id="192" w:author="kyle O'Reilly" w:date="2026-10-21T23:15:00Z" w16du:dateUtc="2026-10-21T22:15:00Z">
+        <w:r>
+          <w:t>Calculate individual prediction errors</w:t>
+        </w:r>
+        <w:r>
+          <w:t>, compare approaches and discuss observed difference between the s</w:t>
+        </w:r>
+      </w:ins>
+      <w:ins w:id="193" w:author="kyle O'Reilly" w:date="2026-10-21T23:16:00Z" w16du:dateUtc="2026-10-21T22:16:00Z">
+        <w:r>
+          <w:t>elected stocks.</w:t>
+        </w:r>
+      </w:ins>
+    </w:p>
+    <w:p>
+      <w:pPr>
+        <w:spacing w:line="360" w:lineRule="auto"/>
+        <w:jc w:val="both"/>
+        <w:rPr>
+          <w:ins w:id="194" w:author="kyle O'Reilly" w:date="2026-10-21T23:16:00Z" w16du:dateUtc="2026-10-21T22:16:00Z"/>
           <w:b/>
           <w:bCs/>
-          <w:rPrChange w:id="188" w:author="kyle O'Reilly" w:date="2026-10-21T23:16:00Z" w16du:dateUtc="2026-10-21T22:16:00Z">
+          <w:rPrChange w:id="195" w:author="kyle O'Reilly" w:date="2026-10-21T23:16:00Z" w16du:dateUtc="2026-10-21T22:16:00Z">
             <w:rPr>
-              <w:ins w:id="189" w:author="kyle O'Reilly" w:date="2026-10-21T23:16:00Z" w16du:dateUtc="2026-10-21T22:16:00Z"/>
+              <w:ins w:id="196" w:author="kyle O'Reilly" w:date="2026-10-21T23:16:00Z" w16du:dateUtc="2026-10-21T22:16:00Z"/>
             </w:rPr>
           </w:rPrChange>
         </w:rPr>
-        <w:pPrChange w:id="190" w:author="kyle O'Reilly" w:date="2026-10-22T21:22:00Z" w16du:dateUtc="2026-10-22T20:22:00Z">
+        <w:pPrChange w:id="197" w:author="kyle O'Reilly" w:date="2026-10-22T21:22:00Z" w16du:dateUtc="2026-10-22T20:22:00Z">
           <w:pPr/>
         </w:pPrChange>
       </w:pPr>
-      <w:ins w:id="191" w:author="kyle O'Reilly" w:date="2026-10-21T23:16:00Z" w16du:dateUtc="2026-10-21T22:16:00Z">
+      <w:ins w:id="198" w:author="kyle O'Reilly" w:date="2026-10-21T23:16:00Z" w16du:dateUtc="2026-10-21T22:16:00Z">
         <w:r>
           <w:rPr>
             <w:b/>
             <w:bCs/>
-            <w:rPrChange w:id="192" w:author="kyle O'Reilly" w:date="2026-10-21T23:16:00Z" w16du:dateUtc="2026-10-21T22:16:00Z">
+            <w:rPrChange w:id="199" w:author="kyle O'Reilly" w:date="2026-10-21T23:16:00Z" w16du:dateUtc="2026-10-21T22:16:00Z">
               <w:rPr/>
             </w:rPrChange>
           </w:rPr>
@@ -3621,13 +3588,13 @@
         <w:spacing w:line="360" w:lineRule="auto"/>
         <w:jc w:val="both"/>
         <w:rPr>
-          <w:ins w:id="193" w:author="kyle O'Reilly" w:date="2026-10-21T20:39:00Z" w16du:dateUtc="2026-10-21T19:39:00Z"/>
-        </w:rPr>
-        <w:pPrChange w:id="194" w:author="kyle O'Reilly" w:date="2026-10-22T21:22:00Z" w16du:dateUtc="2026-10-22T20:22:00Z">
+          <w:ins w:id="200" w:author="kyle O'Reilly" w:date="2026-10-21T20:39:00Z" w16du:dateUtc="2026-10-21T19:39:00Z"/>
+        </w:rPr>
+        <w:pPrChange w:id="201" w:author="kyle O'Reilly" w:date="2026-10-22T21:22:00Z" w16du:dateUtc="2026-10-22T20:22:00Z">
           <w:pPr/>
         </w:pPrChange>
       </w:pPr>
-      <w:ins w:id="195" w:author="kyle O'Reilly" w:date="2026-10-21T23:16:00Z" w16du:dateUtc="2026-10-21T22:16:00Z">
+      <w:ins w:id="202" w:author="kyle O'Reilly" w:date="2026-10-21T23:16:00Z" w16du:dateUtc="2026-10-21T22:16:00Z">
         <w:r>
           <w:t xml:space="preserve">The stock with the highest documented </w:t>
         </w:r>
@@ -3635,7 +3602,7 @@
           <w:t>historical volatility will have the highest</w:t>
         </w:r>
       </w:ins>
-      <w:ins w:id="196" w:author="kyle O'Reilly" w:date="2026-10-21T23:17:00Z" w16du:dateUtc="2026-10-21T22:17:00Z">
+      <w:ins w:id="203" w:author="kyle O'Reilly" w:date="2026-10-21T23:17:00Z" w16du:dateUtc="2026-10-21T22:17:00Z">
         <w:r>
           <w:t xml:space="preserve"> average absolute percentage forecasting error across the three forecasting methods. This explo</w:t>
         </w:r>
@@ -3648,9 +3615,9 @@
       <w:pPr>
         <w:spacing w:line="360" w:lineRule="auto"/>
         <w:rPr>
-          <w:ins w:id="197" w:author="kyle O'Reilly" w:date="2026-10-21T20:40:00Z" w16du:dateUtc="2026-10-21T19:40:00Z"/>
-        </w:rPr>
-        <w:pPrChange w:id="198" w:author="kyle O'Reilly" w:date="2026-10-22T21:22:00Z" w16du:dateUtc="2026-10-22T20:22:00Z">
+          <w:ins w:id="204" w:author="kyle O'Reilly" w:date="2026-10-21T20:40:00Z" w16du:dateUtc="2026-10-21T19:40:00Z"/>
+        </w:rPr>
+        <w:pPrChange w:id="205" w:author="kyle O'Reilly" w:date="2026-10-22T21:22:00Z" w16du:dateUtc="2026-10-22T20:22:00Z">
           <w:pPr/>
         </w:pPrChange>
       </w:pPr>
@@ -3661,18 +3628,18 @@
         <w:spacing w:line="360" w:lineRule="auto"/>
         <w:jc w:val="both"/>
         <w:rPr>
-          <w:ins w:id="199" w:author="kyle O'Reilly" w:date="2026-10-21T20:40:00Z" w16du:dateUtc="2026-10-21T19:40:00Z"/>
-        </w:rPr>
-        <w:pPrChange w:id="200" w:author="kyle O'Reilly" w:date="2026-10-22T21:22:00Z" w16du:dateUtc="2026-10-22T20:22:00Z">
+          <w:ins w:id="206" w:author="kyle O'Reilly" w:date="2026-10-21T20:40:00Z" w16du:dateUtc="2026-10-21T19:40:00Z"/>
+        </w:rPr>
+        <w:pPrChange w:id="207" w:author="kyle O'Reilly" w:date="2026-10-22T21:22:00Z" w16du:dateUtc="2026-10-22T20:22:00Z">
           <w:pPr/>
         </w:pPrChange>
       </w:pPr>
-      <w:bookmarkStart w:id="201" w:name="_Toc243604266"/>
-      <w:ins w:id="202" w:author="kyle O'Reilly" w:date="2026-10-21T20:40:00Z" w16du:dateUtc="2026-10-21T19:40:00Z">
+      <w:bookmarkStart w:id="208" w:name="_Toc243604266"/>
+      <w:ins w:id="209" w:author="kyle O'Reilly" w:date="2026-10-21T20:40:00Z" w16du:dateUtc="2026-10-21T19:40:00Z">
         <w:r>
           <w:t>5. Project Scope</w:t>
         </w:r>
-        <w:bookmarkEnd w:id="201"/>
+        <w:bookmarkEnd w:id="208"/>
       </w:ins>
     </w:p>
     <w:p>
@@ -3680,88 +3647,44 @@
         <w:spacing w:line="360" w:lineRule="auto"/>
         <w:jc w:val="both"/>
         <w:rPr>
-          <w:ins w:id="203" w:author="kyle O'Reilly" w:date="2026-10-22T19:08:00Z" w16du:dateUtc="2026-10-22T18:08:00Z"/>
-        </w:rPr>
-        <w:pPrChange w:id="204" w:author="kyle O'Reilly" w:date="2026-10-22T21:22:00Z" w16du:dateUtc="2026-10-22T20:22:00Z">
-          <w:pPr/>
-        </w:pPrChange>
-      </w:pPr>
-      <w:ins w:id="205" w:author="kyle O'Reilly" w:date="2026-10-22T18:50:00Z" w16du:dateUtc="2026-10-22T17:50:00Z">
-        <w:r>
-          <w:t xml:space="preserve">This Capstone Project </w:t>
-        </w:r>
-        <w:r>
-          <w:t>will examine three ind</w:t>
-        </w:r>
-      </w:ins>
-      <w:ins w:id="206" w:author="kyle O'Reilly" w:date="2026-10-22T18:51:00Z" w16du:dateUtc="2026-10-22T17:51:00Z">
-        <w:r>
-          <w:t>ividual stocks: JPMorgan Chase &amp; Co.</w:t>
-        </w:r>
-        <w:r>
-          <w:t>, Coca-Cola Co., and Intel Corp</w:t>
-        </w:r>
-      </w:ins>
-      <w:ins w:id="207" w:author="kyle O'Reilly" w:date="2026-10-22T19:05:00Z" w16du:dateUtc="2026-10-22T18:05:00Z">
-        <w:r>
-          <w:t xml:space="preserve">. </w:t>
-        </w:r>
-        <w:r>
-          <w:t xml:space="preserve">These stocks have been selected to represent </w:t>
-        </w:r>
-      </w:ins>
-      <w:ins w:id="208" w:author="kyle O'Reilly" w:date="2026-10-22T19:06:00Z" w16du:dateUtc="2026-10-22T18:06:00Z">
-        <w:r>
-          <w:t>low, medium, and high volatility ratings, respectively, as displayed on Trading 212</w:t>
-        </w:r>
-      </w:ins>
-      <w:ins w:id="209" w:author="kyle O'Reilly" w:date="2026-10-22T19:08:00Z" w16du:dateUtc="2026-10-22T18:08:00Z">
-        <w:r>
-          <w:t xml:space="preserve"> (Trading 212, n.d.).</w:t>
-        </w:r>
-      </w:ins>
-    </w:p>
-    <w:p>
-      <w:pPr>
-        <w:spacing w:line="360" w:lineRule="auto"/>
-        <w:jc w:val="both"/>
-        <w:rPr>
-          <w:ins w:id="210" w:author="kyle O'Reilly" w:date="2026-10-22T19:11:00Z" w16du:dateUtc="2026-10-22T18:11:00Z"/>
+          <w:ins w:id="210" w:author="kyle O'Reilly" w:date="2026-10-22T19:08:00Z" w16du:dateUtc="2026-10-22T18:08:00Z"/>
         </w:rPr>
         <w:pPrChange w:id="211" w:author="kyle O'Reilly" w:date="2026-10-22T21:22:00Z" w16du:dateUtc="2026-10-22T20:22:00Z">
           <w:pPr/>
         </w:pPrChange>
       </w:pPr>
-      <w:ins w:id="212" w:author="kyle O'Reilly" w:date="2026-10-22T19:08:00Z" w16du:dateUtc="2026-10-22T18:08:00Z">
-        <w:r>
-          <w:t>Historical stock data</w:t>
-        </w:r>
-        <w:r>
-          <w:t xml:space="preserve"> covering approximately </w:t>
-        </w:r>
-      </w:ins>
-      <w:ins w:id="213" w:author="kyle O'Reilly" w:date="2026-10-22T19:09:00Z" w16du:dateUtc="2026-10-22T18:09:00Z">
-        <w:r>
-          <w:t>44-46 years, where available, will be obtained from Stooq. The anal</w:t>
-        </w:r>
-      </w:ins>
-      <w:ins w:id="214" w:author="kyle O'Reilly" w:date="2026-10-22T19:10:00Z" w16du:dateUtc="2026-10-22T18:10:00Z">
-        <w:r>
-          <w:t xml:space="preserve">ysis will focus </w:t>
-        </w:r>
-        <w:r>
-          <w:t>on historical closing prices and simple price-based indicators derived from previous trading days. Other factors</w:t>
-        </w:r>
-        <w:r>
-          <w:t>, such as financial news</w:t>
-        </w:r>
-      </w:ins>
-      <w:ins w:id="215" w:author="kyle O'Reilly" w:date="2026-10-22T19:11:00Z" w16du:dateUtc="2026-10-22T18:11:00Z">
-        <w:r>
-          <w:t xml:space="preserve">, economic conditions, company announcements and trading volume, </w:t>
-        </w:r>
-        <w:r>
-          <w:t>will not be included in the forecasting models.</w:t>
+      <w:ins w:id="212" w:author="kyle O'Reilly" w:date="2026-10-22T18:50:00Z" w16du:dateUtc="2026-10-22T17:50:00Z">
+        <w:r>
+          <w:t xml:space="preserve">This Capstone Project </w:t>
+        </w:r>
+        <w:r>
+          <w:t>will examine three ind</w:t>
+        </w:r>
+      </w:ins>
+      <w:ins w:id="213" w:author="kyle O'Reilly" w:date="2026-10-22T18:51:00Z" w16du:dateUtc="2026-10-22T17:51:00Z">
+        <w:r>
+          <w:t>ividual stocks: JPMorgan Chase &amp; Co.</w:t>
+        </w:r>
+        <w:r>
+          <w:t>, Coca-Cola Co., and Intel Corp</w:t>
+        </w:r>
+      </w:ins>
+      <w:ins w:id="214" w:author="kyle O'Reilly" w:date="2026-10-22T19:05:00Z" w16du:dateUtc="2026-10-22T18:05:00Z">
+        <w:r>
+          <w:t xml:space="preserve">. </w:t>
+        </w:r>
+        <w:r>
+          <w:t xml:space="preserve">These stocks have been selected to represent </w:t>
+        </w:r>
+      </w:ins>
+      <w:ins w:id="215" w:author="kyle O'Reilly" w:date="2026-10-22T19:06:00Z" w16du:dateUtc="2026-10-22T18:06:00Z">
+        <w:r>
+          <w:t>low, medium, and high volatility ratings, respectively, as displayed on Trading 212</w:t>
+        </w:r>
+      </w:ins>
+      <w:ins w:id="216" w:author="kyle O'Reilly" w:date="2026-10-22T19:08:00Z" w16du:dateUtc="2026-10-22T18:08:00Z">
+        <w:r>
+          <w:t xml:space="preserve"> (Trading 212, n.d.).</w:t>
         </w:r>
       </w:ins>
     </w:p>
@@ -3770,20 +3693,42 @@
         <w:spacing w:line="360" w:lineRule="auto"/>
         <w:jc w:val="both"/>
         <w:rPr>
-          <w:ins w:id="216" w:author="kyle O'Reilly" w:date="2026-10-22T19:13:00Z" w16du:dateUtc="2026-10-22T18:13:00Z"/>
-        </w:rPr>
-        <w:pPrChange w:id="217" w:author="kyle O'Reilly" w:date="2026-10-22T21:22:00Z" w16du:dateUtc="2026-10-22T20:22:00Z">
+          <w:ins w:id="217" w:author="kyle O'Reilly" w:date="2026-10-22T19:11:00Z" w16du:dateUtc="2026-10-22T18:11:00Z"/>
+        </w:rPr>
+        <w:pPrChange w:id="218" w:author="kyle O'Reilly" w:date="2026-10-22T21:22:00Z" w16du:dateUtc="2026-10-22T20:22:00Z">
           <w:pPr/>
         </w:pPrChange>
       </w:pPr>
-      <w:ins w:id="218" w:author="kyle O'Reilly" w:date="2026-10-22T19:12:00Z" w16du:dateUtc="2026-10-22T18:12:00Z">
-        <w:r>
-          <w:t>The study will use one historical cut-off date to predict each stock’s closing price 0 trading days into the future. Three forecasting metho</w:t>
-        </w:r>
-      </w:ins>
-      <w:ins w:id="219" w:author="kyle O'Reilly" w:date="2026-10-22T19:13:00Z" w16du:dateUtc="2026-10-22T18:13:00Z">
-        <w:r>
-          <w:t>ds will be compared: Linear Regression, Random Forest and a naïve forecasting baseline.</w:t>
+      <w:ins w:id="219" w:author="kyle O'Reilly" w:date="2026-10-22T19:08:00Z" w16du:dateUtc="2026-10-22T18:08:00Z">
+        <w:r>
+          <w:t>Historical stock data</w:t>
+        </w:r>
+        <w:r>
+          <w:t xml:space="preserve"> covering approximately </w:t>
+        </w:r>
+      </w:ins>
+      <w:ins w:id="220" w:author="kyle O'Reilly" w:date="2026-10-22T19:09:00Z" w16du:dateUtc="2026-10-22T18:09:00Z">
+        <w:r>
+          <w:t>44-46 years, where available, will be obtained from Stooq. The anal</w:t>
+        </w:r>
+      </w:ins>
+      <w:ins w:id="221" w:author="kyle O'Reilly" w:date="2026-10-22T19:10:00Z" w16du:dateUtc="2026-10-22T18:10:00Z">
+        <w:r>
+          <w:t xml:space="preserve">ysis will focus </w:t>
+        </w:r>
+        <w:r>
+          <w:t>on historical closing prices and simple price-based indicators derived from previous trading days. Other factors</w:t>
+        </w:r>
+        <w:r>
+          <w:t>, such as financial news</w:t>
+        </w:r>
+      </w:ins>
+      <w:ins w:id="222" w:author="kyle O'Reilly" w:date="2026-10-22T19:11:00Z" w16du:dateUtc="2026-10-22T18:11:00Z">
+        <w:r>
+          <w:t xml:space="preserve">, economic conditions, company announcements and trading volume, </w:t>
+        </w:r>
+        <w:r>
+          <w:t>will not be included in the forecasting models.</w:t>
         </w:r>
       </w:ins>
     </w:p>
@@ -3792,45 +3737,30 @@
         <w:spacing w:line="360" w:lineRule="auto"/>
         <w:jc w:val="both"/>
         <w:rPr>
-          <w:ins w:id="220" w:author="kyle O'Reilly" w:date="2026-10-22T19:17:00Z" w16du:dateUtc="2026-10-22T18:17:00Z"/>
-        </w:rPr>
-      </w:pPr>
-      <w:ins w:id="221" w:author="kyle O'Reilly" w:date="2026-10-22T19:13:00Z" w16du:dateUtc="2026-10-22T18:13:00Z">
-        <w:r>
-          <w:t>The pro</w:t>
-        </w:r>
-      </w:ins>
-      <w:ins w:id="222" w:author="kyle O'Reilly" w:date="2026-10-22T19:14:00Z" w16du:dateUtc="2026-10-22T18:14:00Z">
-        <w:r>
-          <w:t>j</w:t>
-        </w:r>
-      </w:ins>
-      <w:ins w:id="223" w:author="kyle O'Reilly" w:date="2026-10-22T19:13:00Z" w16du:dateUtc="2026-10-22T18:13:00Z">
-        <w:r>
-          <w:t xml:space="preserve">ect will not involve </w:t>
-        </w:r>
-      </w:ins>
-      <w:ins w:id="224" w:author="kyle O'Reilly" w:date="2026-10-22T19:14:00Z" w16du:dateUtc="2026-10-22T18:14:00Z">
-        <w:r>
-          <w:t xml:space="preserve">live trading, automated investment decisions or financial recommendations. As only </w:t>
-        </w:r>
-        <w:r>
-          <w:t xml:space="preserve">one future </w:t>
-        </w:r>
-      </w:ins>
-      <w:ins w:id="225" w:author="kyle O'Reilly" w:date="2026-10-22T19:15:00Z" w16du:dateUtc="2026-10-22T18:15:00Z">
-        <w:r>
-          <w:t>closing price will be evaluated for each stock</w:t>
-        </w:r>
-      </w:ins>
-      <w:ins w:id="226" w:author="kyle O'Reilly" w:date="2026-10-22T19:16:00Z" w16du:dateUtc="2026-10-22T18:16:00Z">
-        <w:r>
-          <w:t>, the findings will be limited to this case study and cannot establish which forecasting method is consistently more accurate across different market conditions</w:t>
-        </w:r>
-      </w:ins>
-      <w:ins w:id="227" w:author="kyle O'Reilly" w:date="2026-10-22T19:17:00Z" w16du:dateUtc="2026-10-22T18:17:00Z">
-        <w:r>
-          <w:t>.</w:t>
+          <w:ins w:id="223" w:author="kyle O'Reilly" w:date="2026-10-22T19:13:00Z" w16du:dateUtc="2026-10-22T18:13:00Z"/>
+        </w:rPr>
+        <w:pPrChange w:id="224" w:author="kyle O'Reilly" w:date="2026-10-22T21:22:00Z" w16du:dateUtc="2026-10-22T20:22:00Z">
+          <w:pPr/>
+        </w:pPrChange>
+      </w:pPr>
+      <w:ins w:id="225" w:author="kyle O'Reilly" w:date="2026-10-22T19:12:00Z" w16du:dateUtc="2026-10-22T18:12:00Z">
+        <w:r>
+          <w:t xml:space="preserve">The study will use one historical cut-off date to predict each stock’s closing price </w:t>
+        </w:r>
+      </w:ins>
+      <w:ins w:id="226" w:author="kyle O'Reilly" w:date="2026-10-22T23:35:00Z" w16du:dateUtc="2026-10-22T22:35:00Z">
+        <w:r>
+          <w:t>2</w:t>
+        </w:r>
+      </w:ins>
+      <w:ins w:id="227" w:author="kyle O'Reilly" w:date="2026-10-22T19:12:00Z" w16du:dateUtc="2026-10-22T18:12:00Z">
+        <w:r>
+          <w:t>0 trading days into the future. Three forecasting metho</w:t>
+        </w:r>
+      </w:ins>
+      <w:ins w:id="228" w:author="kyle O'Reilly" w:date="2026-10-22T19:13:00Z" w16du:dateUtc="2026-10-22T18:13:00Z">
+        <w:r>
+          <w:t>ds will be compared: Linear Regression, Random Forest and a naïve forecasting baseline.</w:t>
         </w:r>
       </w:ins>
     </w:p>
@@ -3839,7 +3769,54 @@
         <w:spacing w:line="360" w:lineRule="auto"/>
         <w:jc w:val="both"/>
         <w:rPr>
-          <w:ins w:id="228" w:author="kyle O'Reilly" w:date="2026-10-22T19:17:00Z" w16du:dateUtc="2026-10-22T18:17:00Z"/>
+          <w:ins w:id="229" w:author="kyle O'Reilly" w:date="2026-10-22T19:17:00Z" w16du:dateUtc="2026-10-22T18:17:00Z"/>
+        </w:rPr>
+      </w:pPr>
+      <w:ins w:id="230" w:author="kyle O'Reilly" w:date="2026-10-22T19:13:00Z" w16du:dateUtc="2026-10-22T18:13:00Z">
+        <w:r>
+          <w:t>The pro</w:t>
+        </w:r>
+      </w:ins>
+      <w:ins w:id="231" w:author="kyle O'Reilly" w:date="2026-10-22T19:14:00Z" w16du:dateUtc="2026-10-22T18:14:00Z">
+        <w:r>
+          <w:t>j</w:t>
+        </w:r>
+      </w:ins>
+      <w:ins w:id="232" w:author="kyle O'Reilly" w:date="2026-10-22T19:13:00Z" w16du:dateUtc="2026-10-22T18:13:00Z">
+        <w:r>
+          <w:t xml:space="preserve">ect will not involve </w:t>
+        </w:r>
+      </w:ins>
+      <w:ins w:id="233" w:author="kyle O'Reilly" w:date="2026-10-22T19:14:00Z" w16du:dateUtc="2026-10-22T18:14:00Z">
+        <w:r>
+          <w:t xml:space="preserve">live trading, automated investment decisions or financial recommendations. As only </w:t>
+        </w:r>
+        <w:r>
+          <w:t xml:space="preserve">one future </w:t>
+        </w:r>
+      </w:ins>
+      <w:ins w:id="234" w:author="kyle O'Reilly" w:date="2026-10-22T19:15:00Z" w16du:dateUtc="2026-10-22T18:15:00Z">
+        <w:r>
+          <w:t>closing price will be evaluated for each stock</w:t>
+        </w:r>
+      </w:ins>
+      <w:ins w:id="235" w:author="kyle O'Reilly" w:date="2026-10-22T19:16:00Z" w16du:dateUtc="2026-10-22T18:16:00Z">
+        <w:r>
+          <w:t>, the findings will be limited to this case study and cannot establish which forecasting method is consistently more accurate across different market conditions</w:t>
+        </w:r>
+      </w:ins>
+      <w:ins w:id="236" w:author="kyle O'Reilly" w:date="2026-10-22T19:17:00Z" w16du:dateUtc="2026-10-22T18:17:00Z">
+        <w:r>
+          <w:t>.</w:t>
+        </w:r>
+      </w:ins>
+    </w:p>
+    <w:p>
+      <w:pPr>
+        <w:spacing w:line="360" w:lineRule="auto"/>
+        <w:jc w:val="both"/>
+        <w:rPr>
+          <w:ins w:id="237" w:author="kyle O'Reilly" w:date="2026-10-22T19:17:00Z" w16du:dateUtc="2026-10-22T18:17:00Z"/>
         </w:rPr>
       </w:pPr>
     </w:p>
@@ -3848,39 +3825,45 @@
         <w:pStyle w:val="Heading1"/>
         <w:spacing w:line="360" w:lineRule="auto"/>
         <w:rPr>
-          <w:ins w:id="229" w:author="kyle O'Reilly" w:date="2026-10-21T20:40:00Z" w16du:dateUtc="2026-10-21T19:40:00Z"/>
-        </w:rPr>
-        <w:pPrChange w:id="230" w:author="kyle O'Reilly" w:date="2026-10-22T21:22:00Z" w16du:dateUtc="2026-10-22T20:22:00Z">
+          <w:ins w:id="238" w:author="kyle O'Reilly" w:date="2026-10-21T20:40:00Z" w16du:dateUtc="2026-10-21T19:40:00Z"/>
+        </w:rPr>
+        <w:pPrChange w:id="239" w:author="kyle O'Reilly" w:date="2026-10-22T21:22:00Z" w16du:dateUtc="2026-10-22T20:22:00Z">
           <w:pPr/>
         </w:pPrChange>
       </w:pPr>
-      <w:bookmarkStart w:id="231" w:name="_Toc243604267"/>
-      <w:ins w:id="232" w:author="kyle O'Reilly" w:date="2026-10-22T19:17:00Z" w16du:dateUtc="2026-10-22T18:17:00Z">
+      <w:bookmarkStart w:id="240" w:name="_Toc243604267"/>
+      <w:ins w:id="241" w:author="kyle O'Reilly" w:date="2026-10-22T19:17:00Z" w16du:dateUtc="2026-10-22T18:17:00Z">
         <w:r>
           <w:lastRenderedPageBreak/>
           <w:t xml:space="preserve">6. </w:t>
         </w:r>
       </w:ins>
-      <w:ins w:id="233" w:author="kyle O'Reilly" w:date="2026-10-21T20:40:00Z" w16du:dateUtc="2026-10-21T19:40:00Z">
+      <w:ins w:id="242" w:author="kyle O'Reilly" w:date="2026-10-21T20:40:00Z" w16du:dateUtc="2026-10-21T19:40:00Z">
         <w:r>
           <w:t>Methodology</w:t>
         </w:r>
-        <w:bookmarkEnd w:id="231"/>
+        <w:bookmarkEnd w:id="240"/>
       </w:ins>
     </w:p>
     <w:p>
       <w:pPr>
         <w:spacing w:line="360" w:lineRule="auto"/>
-        <w:rPr>
-          <w:ins w:id="234" w:author="kyle O'Reilly" w:date="2026-10-22T23:12:00Z" w16du:dateUtc="2026-10-22T22:12:00Z"/>
-        </w:rPr>
-      </w:pPr>
-      <w:ins w:id="235" w:author="kyle O'Reilly" w:date="2026-10-22T23:10:00Z" w16du:dateUtc="2026-10-22T22:10:00Z">
+        <w:jc w:val="both"/>
+        <w:rPr>
+          <w:ins w:id="243" w:author="kyle O'Reilly" w:date="2026-10-22T23:12:00Z" w16du:dateUtc="2026-10-22T22:12:00Z"/>
+        </w:rPr>
+        <w:pPrChange w:id="244" w:author="kyle O'Reilly" w:date="2026-10-22T23:33:00Z" w16du:dateUtc="2026-10-22T22:33:00Z">
+          <w:pPr>
+            <w:spacing w:line="360" w:lineRule="auto"/>
+          </w:pPr>
+        </w:pPrChange>
+      </w:pPr>
+      <w:ins w:id="245" w:author="kyle O'Reilly" w:date="2026-10-22T23:10:00Z" w16du:dateUtc="2026-10-22T22:10:00Z">
         <w:r>
           <w:t xml:space="preserve">This Capstone Project will </w:t>
         </w:r>
       </w:ins>
-      <w:ins w:id="236" w:author="kyle O'Reilly" w:date="2026-10-22T23:11:00Z" w16du:dateUtc="2026-10-22T22:11:00Z">
+      <w:ins w:id="246" w:author="kyle O'Reilly" w:date="2026-10-22T23:11:00Z" w16du:dateUtc="2026-10-22T22:11:00Z">
         <w:r>
           <w:t xml:space="preserve">adopt a quantitative research approach, using historical numerical stock market data to evaluate forecasting accuracy. The methodology will compare Linear Regression, Random Forest Regressor and a naïve </w:t>
         </w:r>
@@ -3888,7 +3871,7 @@
           <w:t>time-se</w:t>
         </w:r>
       </w:ins>
-      <w:ins w:id="237" w:author="kyle O'Reilly" w:date="2026-10-22T23:12:00Z" w16du:dateUtc="2026-10-22T22:12:00Z">
+      <w:ins w:id="247" w:author="kyle O'Reilly" w:date="2026-10-22T23:12:00Z" w16du:dateUtc="2026-10-22T22:12:00Z">
         <w:r>
           <w:t>ries baseline across three companies selected to represent different volatility risk ratings.</w:t>
         </w:r>
@@ -3897,23 +3880,29 @@
     <w:p>
       <w:pPr>
         <w:spacing w:line="360" w:lineRule="auto"/>
-        <w:rPr>
-          <w:ins w:id="238" w:author="kyle O'Reilly" w:date="2026-10-22T23:12:00Z" w16du:dateUtc="2026-10-22T22:12:00Z"/>
+        <w:jc w:val="both"/>
+        <w:rPr>
+          <w:ins w:id="248" w:author="kyle O'Reilly" w:date="2026-10-22T23:12:00Z" w16du:dateUtc="2026-10-22T22:12:00Z"/>
           <w:b/>
           <w:bCs/>
-          <w:rPrChange w:id="239" w:author="kyle O'Reilly" w:date="2026-10-22T23:12:00Z" w16du:dateUtc="2026-10-22T22:12:00Z">
+          <w:rPrChange w:id="249" w:author="kyle O'Reilly" w:date="2026-10-22T23:12:00Z" w16du:dateUtc="2026-10-22T22:12:00Z">
             <w:rPr>
-              <w:ins w:id="240" w:author="kyle O'Reilly" w:date="2026-10-22T23:12:00Z" w16du:dateUtc="2026-10-22T22:12:00Z"/>
+              <w:ins w:id="250" w:author="kyle O'Reilly" w:date="2026-10-22T23:12:00Z" w16du:dateUtc="2026-10-22T22:12:00Z"/>
             </w:rPr>
           </w:rPrChange>
         </w:rPr>
-      </w:pPr>
-      <w:ins w:id="241" w:author="kyle O'Reilly" w:date="2026-10-22T23:12:00Z" w16du:dateUtc="2026-10-22T22:12:00Z">
+        <w:pPrChange w:id="251" w:author="kyle O'Reilly" w:date="2026-10-22T23:33:00Z" w16du:dateUtc="2026-10-22T22:33:00Z">
+          <w:pPr>
+            <w:spacing w:line="360" w:lineRule="auto"/>
+          </w:pPr>
+        </w:pPrChange>
+      </w:pPr>
+      <w:ins w:id="252" w:author="kyle O'Reilly" w:date="2026-10-22T23:12:00Z" w16du:dateUtc="2026-10-22T22:12:00Z">
         <w:r>
           <w:rPr>
             <w:b/>
             <w:bCs/>
-            <w:rPrChange w:id="242" w:author="kyle O'Reilly" w:date="2026-10-22T23:12:00Z" w16du:dateUtc="2026-10-22T22:12:00Z">
+            <w:rPrChange w:id="253" w:author="kyle O'Reilly" w:date="2026-10-22T23:12:00Z" w16du:dateUtc="2026-10-22T22:12:00Z">
               <w:rPr/>
             </w:rPrChange>
           </w:rPr>
@@ -3924,16 +3913,22 @@
     <w:p>
       <w:pPr>
         <w:spacing w:line="360" w:lineRule="auto"/>
-        <w:rPr>
-          <w:ins w:id="243" w:author="kyle O'Reilly" w:date="2026-10-22T23:15:00Z" w16du:dateUtc="2026-10-22T22:15:00Z"/>
-        </w:rPr>
-      </w:pPr>
-      <w:ins w:id="244" w:author="kyle O'Reilly" w:date="2026-10-22T23:12:00Z" w16du:dateUtc="2026-10-22T22:12:00Z">
+        <w:jc w:val="both"/>
+        <w:rPr>
+          <w:ins w:id="254" w:author="kyle O'Reilly" w:date="2026-10-22T23:15:00Z" w16du:dateUtc="2026-10-22T22:15:00Z"/>
+        </w:rPr>
+        <w:pPrChange w:id="255" w:author="kyle O'Reilly" w:date="2026-10-22T23:33:00Z" w16du:dateUtc="2026-10-22T22:33:00Z">
+          <w:pPr>
+            <w:spacing w:line="360" w:lineRule="auto"/>
+          </w:pPr>
+        </w:pPrChange>
+      </w:pPr>
+      <w:ins w:id="256" w:author="kyle O'Reilly" w:date="2026-10-22T23:12:00Z" w16du:dateUtc="2026-10-22T22:12:00Z">
         <w:r>
           <w:t>Daily historical stock prices for JPMorgan Chase &amp; Co.,</w:t>
         </w:r>
       </w:ins>
-      <w:ins w:id="245" w:author="kyle O'Reilly" w:date="2026-10-22T23:13:00Z" w16du:dateUtc="2026-10-22T22:13:00Z">
+      <w:ins w:id="257" w:author="kyle O'Reilly" w:date="2026-10-22T23:13:00Z" w16du:dateUtc="2026-10-22T22:13:00Z">
         <w:r>
           <w:t xml:space="preserve"> Coca-Cola Co., and Intel Corp. </w:t>
         </w:r>
@@ -3944,22 +3939,22 @@
           <w:t xml:space="preserve">and </w:t>
         </w:r>
       </w:ins>
-      <w:ins w:id="246" w:author="kyle O'Reilly" w:date="2026-10-22T23:14:00Z" w16du:dateUtc="2026-10-22T22:14:00Z">
+      <w:ins w:id="258" w:author="kyle O'Reilly" w:date="2026-10-22T23:14:00Z" w16du:dateUtc="2026-10-22T22:14:00Z">
         <w:r>
           <w:t xml:space="preserve">organised chronologically. Historical stock closing prices will be used to calculate lagged prices and moving averages as </w:t>
         </w:r>
       </w:ins>
-      <w:ins w:id="247" w:author="kyle O'Reilly" w:date="2026-10-22T23:15:00Z" w16du:dateUtc="2026-10-22T22:15:00Z">
+      <w:ins w:id="259" w:author="kyle O'Reilly" w:date="2026-10-22T23:15:00Z" w16du:dateUtc="2026-10-22T22:15:00Z">
         <w:r>
           <w:t>predictive</w:t>
         </w:r>
       </w:ins>
-      <w:ins w:id="248" w:author="kyle O'Reilly" w:date="2026-10-22T23:14:00Z" w16du:dateUtc="2026-10-22T22:14:00Z">
+      <w:ins w:id="260" w:author="kyle O'Reilly" w:date="2026-10-22T23:14:00Z" w16du:dateUtc="2026-10-22T22:14:00Z">
         <w:r>
           <w:t xml:space="preserve"> featur</w:t>
         </w:r>
       </w:ins>
-      <w:ins w:id="249" w:author="kyle O'Reilly" w:date="2026-10-22T23:15:00Z" w16du:dateUtc="2026-10-22T22:15:00Z">
+      <w:ins w:id="261" w:author="kyle O'Reilly" w:date="2026-10-22T23:15:00Z" w16du:dateUtc="2026-10-22T22:15:00Z">
         <w:r>
           <w:t>es.</w:t>
         </w:r>
@@ -3968,23 +3963,29 @@
     <w:p>
       <w:pPr>
         <w:spacing w:line="360" w:lineRule="auto"/>
-        <w:rPr>
-          <w:ins w:id="250" w:author="kyle O'Reilly" w:date="2026-10-22T23:15:00Z" w16du:dateUtc="2026-10-22T22:15:00Z"/>
+        <w:jc w:val="both"/>
+        <w:rPr>
+          <w:ins w:id="262" w:author="kyle O'Reilly" w:date="2026-10-22T23:15:00Z" w16du:dateUtc="2026-10-22T22:15:00Z"/>
           <w:b/>
           <w:bCs/>
-          <w:rPrChange w:id="251" w:author="kyle O'Reilly" w:date="2026-10-22T23:15:00Z" w16du:dateUtc="2026-10-22T22:15:00Z">
+          <w:rPrChange w:id="263" w:author="kyle O'Reilly" w:date="2026-10-22T23:15:00Z" w16du:dateUtc="2026-10-22T22:15:00Z">
             <w:rPr>
-              <w:ins w:id="252" w:author="kyle O'Reilly" w:date="2026-10-22T23:15:00Z" w16du:dateUtc="2026-10-22T22:15:00Z"/>
+              <w:ins w:id="264" w:author="kyle O'Reilly" w:date="2026-10-22T23:15:00Z" w16du:dateUtc="2026-10-22T22:15:00Z"/>
             </w:rPr>
           </w:rPrChange>
         </w:rPr>
-      </w:pPr>
-      <w:ins w:id="253" w:author="kyle O'Reilly" w:date="2026-10-22T23:15:00Z" w16du:dateUtc="2026-10-22T22:15:00Z">
+        <w:pPrChange w:id="265" w:author="kyle O'Reilly" w:date="2026-10-22T23:33:00Z" w16du:dateUtc="2026-10-22T22:33:00Z">
+          <w:pPr>
+            <w:spacing w:line="360" w:lineRule="auto"/>
+          </w:pPr>
+        </w:pPrChange>
+      </w:pPr>
+      <w:ins w:id="266" w:author="kyle O'Reilly" w:date="2026-10-22T23:15:00Z" w16du:dateUtc="2026-10-22T22:15:00Z">
         <w:r>
           <w:rPr>
             <w:b/>
             <w:bCs/>
-            <w:rPrChange w:id="254" w:author="kyle O'Reilly" w:date="2026-10-22T23:15:00Z" w16du:dateUtc="2026-10-22T22:15:00Z">
+            <w:rPrChange w:id="267" w:author="kyle O'Reilly" w:date="2026-10-22T23:15:00Z" w16du:dateUtc="2026-10-22T22:15:00Z">
               <w:rPr/>
             </w:rPrChange>
           </w:rPr>
@@ -3995,26 +3996,32 @@
     <w:p>
       <w:pPr>
         <w:spacing w:line="360" w:lineRule="auto"/>
-        <w:rPr>
-          <w:ins w:id="255" w:author="kyle O'Reilly" w:date="2026-10-22T23:17:00Z" w16du:dateUtc="2026-10-22T22:17:00Z"/>
-        </w:rPr>
-      </w:pPr>
-      <w:ins w:id="256" w:author="kyle O'Reilly" w:date="2026-10-22T23:15:00Z" w16du:dateUtc="2026-10-22T22:15:00Z">
+        <w:jc w:val="both"/>
+        <w:rPr>
+          <w:ins w:id="268" w:author="kyle O'Reilly" w:date="2026-10-22T23:17:00Z" w16du:dateUtc="2026-10-22T22:17:00Z"/>
+        </w:rPr>
+        <w:pPrChange w:id="269" w:author="kyle O'Reilly" w:date="2026-10-22T23:33:00Z" w16du:dateUtc="2026-10-22T22:33:00Z">
+          <w:pPr>
+            <w:spacing w:line="360" w:lineRule="auto"/>
+          </w:pPr>
+        </w:pPrChange>
+      </w:pPr>
+      <w:ins w:id="270" w:author="kyle O'Reilly" w:date="2026-10-22T23:15:00Z" w16du:dateUtc="2026-10-22T22:15:00Z">
         <w:r>
           <w:t xml:space="preserve">Linear Regression will be used to identify linear relationships between </w:t>
         </w:r>
       </w:ins>
-      <w:ins w:id="257" w:author="kyle O'Reilly" w:date="2026-10-22T23:16:00Z" w16du:dateUtc="2026-10-22T22:16:00Z">
+      <w:ins w:id="271" w:author="kyle O'Reilly" w:date="2026-10-22T23:16:00Z" w16du:dateUtc="2026-10-22T22:16:00Z">
         <w:r>
           <w:t>historical</w:t>
         </w:r>
       </w:ins>
-      <w:ins w:id="258" w:author="kyle O'Reilly" w:date="2026-10-22T23:15:00Z" w16du:dateUtc="2026-10-22T22:15:00Z">
+      <w:ins w:id="272" w:author="kyle O'Reilly" w:date="2026-10-22T23:15:00Z" w16du:dateUtc="2026-10-22T22:15:00Z">
         <w:r>
           <w:t xml:space="preserve"> </w:t>
         </w:r>
       </w:ins>
-      <w:ins w:id="259" w:author="kyle O'Reilly" w:date="2026-10-22T23:16:00Z" w16du:dateUtc="2026-10-22T22:16:00Z">
+      <w:ins w:id="273" w:author="kyle O'Reilly" w:date="2026-10-22T23:16:00Z" w16du:dateUtc="2026-10-22T22:16:00Z">
         <w:r>
           <w:t xml:space="preserve">prices and future closing prices. Random Forest Regressor will combine multiple decision trees to model potentially non-linear relationships </w:t>
         </w:r>
@@ -4022,7 +4029,7 @@
           <w:t>(Indra e</w:t>
         </w:r>
       </w:ins>
-      <w:ins w:id="260" w:author="kyle O'Reilly" w:date="2026-10-22T23:17:00Z" w16du:dateUtc="2026-10-22T22:17:00Z">
+      <w:ins w:id="274" w:author="kyle O'Reilly" w:date="2026-10-22T23:17:00Z" w16du:dateUtc="2026-10-22T22:17:00Z">
         <w:r>
           <w:t>t al., 2025; Divyashreee et al., 2024).</w:t>
         </w:r>
@@ -4031,16 +4038,22 @@
     <w:p>
       <w:pPr>
         <w:spacing w:line="360" w:lineRule="auto"/>
-        <w:rPr>
-          <w:ins w:id="261" w:author="kyle O'Reilly" w:date="2026-10-22T23:19:00Z" w16du:dateUtc="2026-10-22T22:19:00Z"/>
-        </w:rPr>
-      </w:pPr>
-      <w:ins w:id="262" w:author="kyle O'Reilly" w:date="2026-10-22T23:17:00Z" w16du:dateUtc="2026-10-22T22:17:00Z">
+        <w:jc w:val="both"/>
+        <w:rPr>
+          <w:ins w:id="275" w:author="kyle O'Reilly" w:date="2026-10-22T23:19:00Z" w16du:dateUtc="2026-10-22T22:19:00Z"/>
+        </w:rPr>
+        <w:pPrChange w:id="276" w:author="kyle O'Reilly" w:date="2026-10-22T23:33:00Z" w16du:dateUtc="2026-10-22T22:33:00Z">
+          <w:pPr>
+            <w:spacing w:line="360" w:lineRule="auto"/>
+          </w:pPr>
+        </w:pPrChange>
+      </w:pPr>
+      <w:ins w:id="277" w:author="kyle O'Reilly" w:date="2026-10-22T23:17:00Z" w16du:dateUtc="2026-10-22T22:17:00Z">
         <w:r>
           <w:t xml:space="preserve">A naïve time-series baseline will be also included, assuming that the closing price 20 trading days ahead </w:t>
         </w:r>
       </w:ins>
-      <w:ins w:id="263" w:author="kyle O'Reilly" w:date="2026-10-22T23:18:00Z" w16du:dateUtc="2026-10-22T22:18:00Z">
+      <w:ins w:id="278" w:author="kyle O'Reilly" w:date="2026-10-22T23:18:00Z" w16du:dateUtc="2026-10-22T22:18:00Z">
         <w:r>
           <w:t xml:space="preserve">will equal the last observed closing </w:t>
         </w:r>
@@ -4051,7 +4064,7 @@
           <w:t xml:space="preserve">. This provides a simple benchmark </w:t>
         </w:r>
       </w:ins>
-      <w:ins w:id="264" w:author="kyle O'Reilly" w:date="2026-10-22T23:19:00Z" w16du:dateUtc="2026-10-22T22:19:00Z">
+      <w:ins w:id="279" w:author="kyle O'Reilly" w:date="2026-10-22T23:19:00Z" w16du:dateUtc="2026-10-22T22:19:00Z">
         <w:r>
           <w:t>against which the machine learning models can be compared.</w:t>
         </w:r>
@@ -4060,23 +4073,29 @@
     <w:p>
       <w:pPr>
         <w:spacing w:line="360" w:lineRule="auto"/>
-        <w:rPr>
-          <w:ins w:id="265" w:author="kyle O'Reilly" w:date="2026-10-22T23:19:00Z" w16du:dateUtc="2026-10-22T22:19:00Z"/>
+        <w:jc w:val="both"/>
+        <w:rPr>
+          <w:ins w:id="280" w:author="kyle O'Reilly" w:date="2026-10-22T23:19:00Z" w16du:dateUtc="2026-10-22T22:19:00Z"/>
           <w:b/>
           <w:bCs/>
-          <w:rPrChange w:id="266" w:author="kyle O'Reilly" w:date="2026-10-22T23:19:00Z" w16du:dateUtc="2026-10-22T22:19:00Z">
+          <w:rPrChange w:id="281" w:author="kyle O'Reilly" w:date="2026-10-22T23:19:00Z" w16du:dateUtc="2026-10-22T22:19:00Z">
             <w:rPr>
-              <w:ins w:id="267" w:author="kyle O'Reilly" w:date="2026-10-22T23:19:00Z" w16du:dateUtc="2026-10-22T22:19:00Z"/>
+              <w:ins w:id="282" w:author="kyle O'Reilly" w:date="2026-10-22T23:19:00Z" w16du:dateUtc="2026-10-22T22:19:00Z"/>
             </w:rPr>
           </w:rPrChange>
         </w:rPr>
-      </w:pPr>
-      <w:ins w:id="268" w:author="kyle O'Reilly" w:date="2026-10-22T23:19:00Z" w16du:dateUtc="2026-10-22T22:19:00Z">
+        <w:pPrChange w:id="283" w:author="kyle O'Reilly" w:date="2026-10-22T23:33:00Z" w16du:dateUtc="2026-10-22T22:33:00Z">
+          <w:pPr>
+            <w:spacing w:line="360" w:lineRule="auto"/>
+          </w:pPr>
+        </w:pPrChange>
+      </w:pPr>
+      <w:ins w:id="284" w:author="kyle O'Reilly" w:date="2026-10-22T23:19:00Z" w16du:dateUtc="2026-10-22T22:19:00Z">
         <w:r>
           <w:rPr>
             <w:b/>
             <w:bCs/>
-            <w:rPrChange w:id="269" w:author="kyle O'Reilly" w:date="2026-10-22T23:19:00Z" w16du:dateUtc="2026-10-22T22:19:00Z">
+            <w:rPrChange w:id="285" w:author="kyle O'Reilly" w:date="2026-10-22T23:19:00Z" w16du:dateUtc="2026-10-22T22:19:00Z">
               <w:rPr/>
             </w:rPrChange>
           </w:rPr>
@@ -4087,31 +4106,37 @@
     <w:p>
       <w:pPr>
         <w:spacing w:line="360" w:lineRule="auto"/>
-        <w:rPr>
-          <w:ins w:id="270" w:author="kyle O'Reilly" w:date="2026-10-22T23:21:00Z" w16du:dateUtc="2026-10-22T22:21:00Z"/>
-        </w:rPr>
-      </w:pPr>
-      <w:ins w:id="271" w:author="kyle O'Reilly" w:date="2026-10-22T23:19:00Z" w16du:dateUtc="2026-10-22T22:19:00Z">
+        <w:jc w:val="both"/>
+        <w:rPr>
+          <w:ins w:id="286" w:author="kyle O'Reilly" w:date="2026-10-22T23:21:00Z" w16du:dateUtc="2026-10-22T22:21:00Z"/>
+        </w:rPr>
+        <w:pPrChange w:id="287" w:author="kyle O'Reilly" w:date="2026-10-22T23:33:00Z" w16du:dateUtc="2026-10-22T22:33:00Z">
+          <w:pPr>
+            <w:spacing w:line="360" w:lineRule="auto"/>
+          </w:pPr>
+        </w:pPrChange>
+      </w:pPr>
+      <w:ins w:id="288" w:author="kyle O'Reilly" w:date="2026-10-22T23:19:00Z" w16du:dateUtc="2026-10-22T22:19:00Z">
         <w:r>
           <w:t>A common historical cutoff date will be selected</w:t>
         </w:r>
       </w:ins>
-      <w:ins w:id="272" w:author="kyle O'Reilly" w:date="2026-10-22T23:20:00Z" w16du:dateUtc="2026-10-22T22:20:00Z">
+      <w:ins w:id="289" w:author="kyle O'Reilly" w:date="2026-10-22T23:20:00Z" w16du:dateUtc="2026-10-22T22:20:00Z">
         <w:r>
           <w:t>, with only earlier data used to train the models. Each method will predict the closing prices 20 trading days ahead for each company. Predictions will then be compared against actual historical stock c</w:t>
         </w:r>
       </w:ins>
-      <w:ins w:id="273" w:author="kyle O'Reilly" w:date="2026-10-22T23:21:00Z" w16du:dateUtc="2026-10-22T22:21:00Z">
+      <w:ins w:id="290" w:author="kyle O'Reilly" w:date="2026-10-22T23:21:00Z" w16du:dateUtc="2026-10-22T22:21:00Z">
         <w:r>
           <w:t>l</w:t>
         </w:r>
       </w:ins>
-      <w:ins w:id="274" w:author="kyle O'Reilly" w:date="2026-10-22T23:20:00Z" w16du:dateUtc="2026-10-22T22:20:00Z">
+      <w:ins w:id="291" w:author="kyle O'Reilly" w:date="2026-10-22T23:20:00Z" w16du:dateUtc="2026-10-22T22:20:00Z">
         <w:r>
           <w:t>osing prices</w:t>
         </w:r>
       </w:ins>
-      <w:ins w:id="275" w:author="kyle O'Reilly" w:date="2026-10-22T23:21:00Z" w16du:dateUtc="2026-10-22T22:21:00Z">
+      <w:ins w:id="292" w:author="kyle O'Reilly" w:date="2026-10-22T23:21:00Z" w16du:dateUtc="2026-10-22T22:21:00Z">
         <w:r>
           <w:t>.</w:t>
         </w:r>
@@ -4120,41 +4145,47 @@
     <w:p>
       <w:pPr>
         <w:spacing w:line="360" w:lineRule="auto"/>
-        <w:rPr>
-          <w:ins w:id="276" w:author="kyle O'Reilly" w:date="2026-10-22T23:22:00Z" w16du:dateUtc="2026-10-22T22:22:00Z"/>
-        </w:rPr>
-      </w:pPr>
-      <w:ins w:id="277" w:author="kyle O'Reilly" w:date="2026-10-22T23:21:00Z" w16du:dateUtc="2026-10-22T22:21:00Z">
+        <w:jc w:val="both"/>
+        <w:rPr>
+          <w:ins w:id="293" w:author="kyle O'Reilly" w:date="2026-10-22T23:22:00Z" w16du:dateUtc="2026-10-22T22:22:00Z"/>
+        </w:rPr>
+        <w:pPrChange w:id="294" w:author="kyle O'Reilly" w:date="2026-10-22T23:33:00Z" w16du:dateUtc="2026-10-22T22:33:00Z">
+          <w:pPr>
+            <w:spacing w:line="360" w:lineRule="auto"/>
+          </w:pPr>
+        </w:pPrChange>
+      </w:pPr>
+      <w:ins w:id="295" w:author="kyle O'Reilly" w:date="2026-10-22T23:21:00Z" w16du:dateUtc="2026-10-22T22:21:00Z">
         <w:r>
           <w:t xml:space="preserve">Forecasting accuracy will be evaluated using absolute error and </w:t>
         </w:r>
       </w:ins>
-      <w:ins w:id="278" w:author="kyle O'Reilly" w:date="2026-10-22T23:22:00Z" w16du:dateUtc="2026-10-22T22:22:00Z">
+      <w:ins w:id="296" w:author="kyle O'Reilly" w:date="2026-10-22T23:22:00Z" w16du:dateUtc="2026-10-22T22:22:00Z">
         <w:r>
           <w:t>absolute</w:t>
         </w:r>
       </w:ins>
-      <w:ins w:id="279" w:author="kyle O'Reilly" w:date="2026-10-22T23:21:00Z" w16du:dateUtc="2026-10-22T22:21:00Z">
+      <w:ins w:id="297" w:author="kyle O'Reilly" w:date="2026-10-22T23:21:00Z" w16du:dateUtc="2026-10-22T22:21:00Z">
         <w:r>
           <w:t xml:space="preserve"> </w:t>
         </w:r>
       </w:ins>
-      <w:ins w:id="280" w:author="kyle O'Reilly" w:date="2026-10-22T23:22:00Z" w16du:dateUtc="2026-10-22T22:22:00Z">
+      <w:ins w:id="298" w:author="kyle O'Reilly" w:date="2026-10-22T23:22:00Z" w16du:dateUtc="2026-10-22T22:22:00Z">
         <w:r>
           <w:t>percentage</w:t>
         </w:r>
       </w:ins>
-      <w:ins w:id="281" w:author="kyle O'Reilly" w:date="2026-10-22T23:21:00Z" w16du:dateUtc="2026-10-22T22:21:00Z">
+      <w:ins w:id="299" w:author="kyle O'Reilly" w:date="2026-10-22T23:21:00Z" w16du:dateUtc="2026-10-22T22:21:00Z">
         <w:r>
           <w:t xml:space="preserve"> error. The </w:t>
         </w:r>
       </w:ins>
-      <w:ins w:id="282" w:author="kyle O'Reilly" w:date="2026-10-22T23:22:00Z" w16du:dateUtc="2026-10-22T22:22:00Z">
+      <w:ins w:id="300" w:author="kyle O'Reilly" w:date="2026-10-22T23:22:00Z" w16du:dateUtc="2026-10-22T22:22:00Z">
         <w:r>
           <w:t>results</w:t>
         </w:r>
       </w:ins>
-      <w:ins w:id="283" w:author="kyle O'Reilly" w:date="2026-10-22T23:21:00Z" w16du:dateUtc="2026-10-22T22:21:00Z">
+      <w:ins w:id="301" w:author="kyle O'Reilly" w:date="2026-10-22T23:21:00Z" w16du:dateUtc="2026-10-22T22:21:00Z">
         <w:r>
           <w:t xml:space="preserve"> will be </w:t>
         </w:r>
@@ -4162,37 +4193,37 @@
           <w:t xml:space="preserve">presented in comparison tables and </w:t>
         </w:r>
       </w:ins>
-      <w:ins w:id="284" w:author="kyle O'Reilly" w:date="2026-10-22T23:22:00Z" w16du:dateUtc="2026-10-22T22:22:00Z">
+      <w:ins w:id="302" w:author="kyle O'Reilly" w:date="2026-10-22T23:22:00Z" w16du:dateUtc="2026-10-22T22:22:00Z">
         <w:r>
           <w:t>charts</w:t>
         </w:r>
       </w:ins>
-      <w:ins w:id="285" w:author="kyle O'Reilly" w:date="2026-10-22T23:21:00Z" w16du:dateUtc="2026-10-22T22:21:00Z">
+      <w:ins w:id="303" w:author="kyle O'Reilly" w:date="2026-10-22T23:21:00Z" w16du:dateUtc="2026-10-22T22:21:00Z">
         <w:r>
           <w:t xml:space="preserve"> to </w:t>
         </w:r>
       </w:ins>
-      <w:ins w:id="286" w:author="kyle O'Reilly" w:date="2026-10-22T23:22:00Z" w16du:dateUtc="2026-10-22T22:22:00Z">
+      <w:ins w:id="304" w:author="kyle O'Reilly" w:date="2026-10-22T23:22:00Z" w16du:dateUtc="2026-10-22T22:22:00Z">
         <w:r>
           <w:t>investigate</w:t>
         </w:r>
       </w:ins>
-      <w:ins w:id="287" w:author="kyle O'Reilly" w:date="2026-10-22T23:21:00Z" w16du:dateUtc="2026-10-22T22:21:00Z">
+      <w:ins w:id="305" w:author="kyle O'Reilly" w:date="2026-10-22T23:21:00Z" w16du:dateUtc="2026-10-22T22:21:00Z">
         <w:r>
           <w:t xml:space="preserve"> whether model </w:t>
         </w:r>
       </w:ins>
-      <w:ins w:id="288" w:author="kyle O'Reilly" w:date="2026-10-22T23:22:00Z" w16du:dateUtc="2026-10-22T22:22:00Z">
+      <w:ins w:id="306" w:author="kyle O'Reilly" w:date="2026-10-22T23:22:00Z" w16du:dateUtc="2026-10-22T22:22:00Z">
         <w:r>
           <w:t>performance</w:t>
         </w:r>
       </w:ins>
-      <w:ins w:id="289" w:author="kyle O'Reilly" w:date="2026-10-22T23:21:00Z" w16du:dateUtc="2026-10-22T22:21:00Z">
+      <w:ins w:id="307" w:author="kyle O'Reilly" w:date="2026-10-22T23:21:00Z" w16du:dateUtc="2026-10-22T22:21:00Z">
         <w:r>
           <w:t xml:space="preserve"> differs across all three selected stocks</w:t>
         </w:r>
       </w:ins>
-      <w:ins w:id="290" w:author="kyle O'Reilly" w:date="2026-10-22T23:22:00Z" w16du:dateUtc="2026-10-22T22:22:00Z">
+      <w:ins w:id="308" w:author="kyle O'Reilly" w:date="2026-10-22T23:22:00Z" w16du:dateUtc="2026-10-22T22:22:00Z">
         <w:r>
           <w:t>.</w:t>
         </w:r>
@@ -4201,18 +4232,24 @@
     <w:p>
       <w:pPr>
         <w:spacing w:line="360" w:lineRule="auto"/>
-        <w:rPr>
-          <w:ins w:id="291" w:author="kyle O'Reilly" w:date="2026-10-22T23:22:00Z" w16du:dateUtc="2026-10-22T22:22:00Z"/>
+        <w:jc w:val="both"/>
+        <w:rPr>
+          <w:ins w:id="309" w:author="kyle O'Reilly" w:date="2026-10-22T23:22:00Z" w16du:dateUtc="2026-10-22T22:22:00Z"/>
           <w:b/>
           <w:bCs/>
-          <w:rPrChange w:id="292" w:author="kyle O'Reilly" w:date="2026-10-22T23:22:00Z" w16du:dateUtc="2026-10-22T22:22:00Z">
+          <w:rPrChange w:id="310" w:author="kyle O'Reilly" w:date="2026-10-22T23:22:00Z" w16du:dateUtc="2026-10-22T22:22:00Z">
             <w:rPr>
-              <w:ins w:id="293" w:author="kyle O'Reilly" w:date="2026-10-22T23:22:00Z" w16du:dateUtc="2026-10-22T22:22:00Z"/>
+              <w:ins w:id="311" w:author="kyle O'Reilly" w:date="2026-10-22T23:22:00Z" w16du:dateUtc="2026-10-22T22:22:00Z"/>
             </w:rPr>
           </w:rPrChange>
         </w:rPr>
-      </w:pPr>
-      <w:ins w:id="294" w:author="kyle O'Reilly" w:date="2026-10-22T23:22:00Z" w16du:dateUtc="2026-10-22T22:22:00Z">
+        <w:pPrChange w:id="312" w:author="kyle O'Reilly" w:date="2026-10-22T23:33:00Z" w16du:dateUtc="2026-10-22T22:33:00Z">
+          <w:pPr>
+            <w:spacing w:line="360" w:lineRule="auto"/>
+          </w:pPr>
+        </w:pPrChange>
+      </w:pPr>
+      <w:ins w:id="313" w:author="kyle O'Reilly" w:date="2026-10-22T23:22:00Z" w16du:dateUtc="2026-10-22T22:22:00Z">
         <w:r>
           <w:rPr>
             <w:b/>
@@ -4224,7 +4261,7 @@
           <w:rPr>
             <w:b/>
             <w:bCs/>
-            <w:rPrChange w:id="295" w:author="kyle O'Reilly" w:date="2026-10-22T23:22:00Z" w16du:dateUtc="2026-10-22T22:22:00Z">
+            <w:rPrChange w:id="314" w:author="kyle O'Reilly" w:date="2026-10-22T23:22:00Z" w16du:dateUtc="2026-10-22T22:22:00Z">
               <w:rPr/>
             </w:rPrChange>
           </w:rPr>
@@ -4235,54 +4272,60 @@
     <w:p>
       <w:pPr>
         <w:spacing w:line="360" w:lineRule="auto"/>
-        <w:rPr>
-          <w:ins w:id="296" w:author="kyle O'Reilly" w:date="2026-10-22T23:28:00Z" w16du:dateUtc="2026-10-22T22:28:00Z"/>
-        </w:rPr>
-      </w:pPr>
-      <w:ins w:id="297" w:author="kyle O'Reilly" w:date="2026-10-22T23:22:00Z" w16du:dateUtc="2026-10-22T22:22:00Z">
-        <w:r>
-          <w:t>Phyton and Jupyter Notebook will be used to conduct the data analysis. Pandas and NumPy will support data p</w:t>
-        </w:r>
-      </w:ins>
-      <w:ins w:id="298" w:author="kyle O'Reilly" w:date="2026-10-22T23:23:00Z" w16du:dateUtc="2026-10-22T22:23:00Z">
-        <w:r>
-          <w:t>reparation and calculations, Sc</w:t>
-        </w:r>
-        <w:r>
-          <w:t xml:space="preserve">ikit-learn will implement the predictive models, and Matplotlib will generate visualisations. These tools will be </w:t>
-        </w:r>
-      </w:ins>
-      <w:ins w:id="299" w:author="kyle O'Reilly" w:date="2026-10-22T23:24:00Z" w16du:dateUtc="2026-10-22T22:24:00Z">
-        <w:r>
-          <w:t>suitable</w:t>
-        </w:r>
-      </w:ins>
-      <w:ins w:id="300" w:author="kyle O'Reilly" w:date="2026-10-22T23:23:00Z" w16du:dateUtc="2026-10-22T22:23:00Z">
-        <w:r>
-          <w:t xml:space="preserve"> for </w:t>
-        </w:r>
-      </w:ins>
-      <w:ins w:id="301" w:author="kyle O'Reilly" w:date="2026-10-22T23:24:00Z" w16du:dateUtc="2026-10-22T22:24:00Z">
-        <w:r>
-          <w:t>reproducible and accessible data analytics project.</w:t>
-        </w:r>
-      </w:ins>
-    </w:p>
-    <w:p>
-      <w:pPr>
-        <w:keepNext/>
-        <w:spacing w:line="360" w:lineRule="auto"/>
-        <w:jc w:val="center"/>
-        <w:rPr>
-          <w:ins w:id="302" w:author="kyle O'Reilly" w:date="2026-10-22T23:28:00Z" w16du:dateUtc="2026-10-22T22:28:00Z"/>
-        </w:rPr>
-        <w:pPrChange w:id="303" w:author="kyle O'Reilly" w:date="2026-10-22T23:28:00Z" w16du:dateUtc="2026-10-22T22:28:00Z">
+        <w:jc w:val="both"/>
+        <w:rPr>
+          <w:ins w:id="315" w:author="kyle O'Reilly" w:date="2026-10-22T23:28:00Z" w16du:dateUtc="2026-10-22T22:28:00Z"/>
+        </w:rPr>
+        <w:pPrChange w:id="316" w:author="kyle O'Reilly" w:date="2026-10-22T23:33:00Z" w16du:dateUtc="2026-10-22T22:33:00Z">
           <w:pPr>
             <w:spacing w:line="360" w:lineRule="auto"/>
           </w:pPr>
         </w:pPrChange>
       </w:pPr>
-      <w:ins w:id="304" w:author="kyle O'Reilly" w:date="2026-10-22T23:28:00Z" w16du:dateUtc="2026-10-22T22:28:00Z">
+      <w:ins w:id="317" w:author="kyle O'Reilly" w:date="2026-10-22T23:22:00Z" w16du:dateUtc="2026-10-22T22:22:00Z">
+        <w:r>
+          <w:t>Phyton and Jupyter Notebook will be used to conduct the data analysis. Pandas and NumPy will support data p</w:t>
+        </w:r>
+      </w:ins>
+      <w:ins w:id="318" w:author="kyle O'Reilly" w:date="2026-10-22T23:23:00Z" w16du:dateUtc="2026-10-22T22:23:00Z">
+        <w:r>
+          <w:t>reparation and calculations, Sc</w:t>
+        </w:r>
+        <w:r>
+          <w:t xml:space="preserve">ikit-learn will implement the predictive models, and Matplotlib will generate visualisations. These tools will be </w:t>
+        </w:r>
+      </w:ins>
+      <w:ins w:id="319" w:author="kyle O'Reilly" w:date="2026-10-22T23:24:00Z" w16du:dateUtc="2026-10-22T22:24:00Z">
+        <w:r>
+          <w:t>suitable</w:t>
+        </w:r>
+      </w:ins>
+      <w:ins w:id="320" w:author="kyle O'Reilly" w:date="2026-10-22T23:23:00Z" w16du:dateUtc="2026-10-22T22:23:00Z">
+        <w:r>
+          <w:t xml:space="preserve"> for </w:t>
+        </w:r>
+      </w:ins>
+      <w:ins w:id="321" w:author="kyle O'Reilly" w:date="2026-10-22T23:24:00Z" w16du:dateUtc="2026-10-22T22:24:00Z">
+        <w:r>
+          <w:t>reproducible and accessible data analytics project.</w:t>
+        </w:r>
+      </w:ins>
+    </w:p>
+    <w:p>
+      <w:pPr>
+        <w:keepNext/>
+        <w:spacing w:line="360" w:lineRule="auto"/>
+        <w:jc w:val="center"/>
+        <w:rPr>
+          <w:ins w:id="322" w:author="kyle O'Reilly" w:date="2026-10-22T23:28:00Z" w16du:dateUtc="2026-10-22T22:28:00Z"/>
+        </w:rPr>
+        <w:pPrChange w:id="323" w:author="kyle O'Reilly" w:date="2026-10-22T23:28:00Z" w16du:dateUtc="2026-10-22T22:28:00Z">
+          <w:pPr>
+            <w:spacing w:line="360" w:lineRule="auto"/>
+          </w:pPr>
+        </w:pPrChange>
+      </w:pPr>
+      <w:ins w:id="324" w:author="kyle O'Reilly" w:date="2026-10-22T23:28:00Z" w16du:dateUtc="2026-10-22T22:28:00Z">
         <w:r>
           <w:lastRenderedPageBreak/>
           <w:drawing>
@@ -4328,13 +4371,13 @@
         <w:pStyle w:val="Caption"/>
         <w:jc w:val="center"/>
         <w:rPr>
-          <w:ins w:id="305" w:author="kyle O'Reilly" w:date="2026-10-21T20:40:00Z" w16du:dateUtc="2026-10-21T19:40:00Z"/>
-        </w:rPr>
-        <w:pPrChange w:id="306" w:author="kyle O'Reilly" w:date="2026-10-22T23:28:00Z" w16du:dateUtc="2026-10-22T22:28:00Z">
+          <w:ins w:id="325" w:author="kyle O'Reilly" w:date="2026-10-21T20:40:00Z" w16du:dateUtc="2026-10-21T19:40:00Z"/>
+        </w:rPr>
+        <w:pPrChange w:id="326" w:author="kyle O'Reilly" w:date="2026-10-22T23:28:00Z" w16du:dateUtc="2026-10-22T22:28:00Z">
           <w:pPr/>
         </w:pPrChange>
       </w:pPr>
-      <w:ins w:id="307" w:author="kyle O'Reilly" w:date="2026-10-22T23:28:00Z" w16du:dateUtc="2026-10-22T22:28:00Z">
+      <w:ins w:id="327" w:author="kyle O'Reilly" w:date="2026-10-22T23:28:00Z" w16du:dateUtc="2026-10-22T22:28:00Z">
         <w:r>
           <w:t xml:space="preserve">Figure </w:t>
         </w:r>
@@ -4348,7 +4391,7 @@
       <w:r>
         <w:fldChar w:fldCharType="separate"/>
       </w:r>
-      <w:ins w:id="308" w:author="kyle O'Reilly" w:date="2026-10-22T23:28:00Z" w16du:dateUtc="2026-10-22T22:28:00Z">
+      <w:ins w:id="328" w:author="kyle O'Reilly" w:date="2026-10-22T23:28:00Z" w16du:dateUtc="2026-10-22T22:28:00Z">
         <w:r>
           <w:rPr>
             <w:noProof/>
@@ -4369,102 +4412,102 @@
         <w:spacing w:line="360" w:lineRule="auto"/>
         <w:jc w:val="both"/>
         <w:rPr>
-          <w:ins w:id="309" w:author="kyle O'Reilly" w:date="2026-10-21T20:41:00Z" w16du:dateUtc="2026-10-21T19:41:00Z"/>
-        </w:rPr>
-        <w:pPrChange w:id="310" w:author="kyle O'Reilly" w:date="2026-10-22T21:22:00Z" w16du:dateUtc="2026-10-22T20:22:00Z">
+          <w:ins w:id="329" w:author="kyle O'Reilly" w:date="2026-10-21T20:41:00Z" w16du:dateUtc="2026-10-21T19:41:00Z"/>
+        </w:rPr>
+        <w:pPrChange w:id="330" w:author="kyle O'Reilly" w:date="2026-10-22T21:22:00Z" w16du:dateUtc="2026-10-22T20:22:00Z">
           <w:pPr/>
         </w:pPrChange>
       </w:pPr>
-      <w:bookmarkStart w:id="311" w:name="_Toc243604268"/>
-      <w:ins w:id="312" w:author="kyle O'Reilly" w:date="2026-10-21T20:41:00Z" w16du:dateUtc="2026-10-21T19:41:00Z">
+      <w:bookmarkStart w:id="331" w:name="_Toc243604268"/>
+      <w:ins w:id="332" w:author="kyle O'Reilly" w:date="2026-10-21T20:41:00Z" w16du:dateUtc="2026-10-21T19:41:00Z">
         <w:r>
           <w:t xml:space="preserve">7. </w:t>
         </w:r>
       </w:ins>
-      <w:ins w:id="313" w:author="kyle O'Reilly" w:date="2026-10-21T20:40:00Z" w16du:dateUtc="2026-10-21T19:40:00Z">
+      <w:ins w:id="333" w:author="kyle O'Reilly" w:date="2026-10-21T20:40:00Z" w16du:dateUtc="2026-10-21T19:40:00Z">
         <w:r>
           <w:t>Data Sources</w:t>
         </w:r>
       </w:ins>
-      <w:bookmarkEnd w:id="311"/>
+      <w:bookmarkEnd w:id="331"/>
     </w:p>
     <w:p>
       <w:pPr>
         <w:spacing w:line="360" w:lineRule="auto"/>
         <w:jc w:val="both"/>
         <w:rPr>
-          <w:ins w:id="314" w:author="kyle O'Reilly" w:date="2026-10-21T23:35:00Z" w16du:dateUtc="2026-10-21T22:35:00Z"/>
-        </w:rPr>
-        <w:pPrChange w:id="315" w:author="kyle O'Reilly" w:date="2026-10-22T21:22:00Z" w16du:dateUtc="2026-10-22T20:22:00Z">
+          <w:ins w:id="334" w:author="kyle O'Reilly" w:date="2026-10-21T23:35:00Z" w16du:dateUtc="2026-10-21T22:35:00Z"/>
+        </w:rPr>
+        <w:pPrChange w:id="335" w:author="kyle O'Reilly" w:date="2026-10-22T21:22:00Z" w16du:dateUtc="2026-10-22T20:22:00Z">
           <w:pPr/>
         </w:pPrChange>
       </w:pPr>
-      <w:ins w:id="316" w:author="kyle O'Reilly" w:date="2026-10-21T23:39:00Z" w16du:dateUtc="2026-10-21T22:39:00Z">
+      <w:ins w:id="336" w:author="kyle O'Reilly" w:date="2026-10-21T23:39:00Z" w16du:dateUtc="2026-10-21T22:39:00Z">
         <w:r>
           <w:t>Tradi</w:t>
         </w:r>
       </w:ins>
-      <w:ins w:id="317" w:author="kyle O'Reilly" w:date="2026-10-21T23:40:00Z" w16du:dateUtc="2026-10-21T22:40:00Z">
+      <w:ins w:id="337" w:author="kyle O'Reilly" w:date="2026-10-21T23:40:00Z" w16du:dateUtc="2026-10-21T22:40:00Z">
         <w:r>
           <w:t xml:space="preserve">ng 212 will be consulted to verify </w:t>
         </w:r>
       </w:ins>
-      <w:ins w:id="318" w:author="kyle O'Reilly" w:date="2026-10-21T23:46:00Z" w16du:dateUtc="2026-10-21T22:46:00Z">
+      <w:ins w:id="338" w:author="kyle O'Reilly" w:date="2026-10-21T23:46:00Z" w16du:dateUtc="2026-10-21T22:46:00Z">
         <w:r>
           <w:t xml:space="preserve">the </w:t>
         </w:r>
       </w:ins>
-      <w:ins w:id="319" w:author="kyle O'Reilly" w:date="2026-10-21T23:40:00Z" w16du:dateUtc="2026-10-21T22:40:00Z">
+      <w:ins w:id="339" w:author="kyle O'Reilly" w:date="2026-10-21T23:40:00Z" w16du:dateUtc="2026-10-21T22:40:00Z">
         <w:r>
           <w:t>volatility rating</w:t>
         </w:r>
       </w:ins>
-      <w:ins w:id="320" w:author="kyle O'Reilly" w:date="2026-10-21T23:41:00Z" w16du:dateUtc="2026-10-21T22:41:00Z">
+      <w:ins w:id="340" w:author="kyle O'Reilly" w:date="2026-10-21T23:41:00Z" w16du:dateUtc="2026-10-21T22:41:00Z">
         <w:r>
           <w:t>s</w:t>
         </w:r>
       </w:ins>
-      <w:ins w:id="321" w:author="kyle O'Reilly" w:date="2026-10-21T23:40:00Z" w16du:dateUtc="2026-10-21T22:40:00Z">
+      <w:ins w:id="341" w:author="kyle O'Reilly" w:date="2026-10-21T23:40:00Z" w16du:dateUtc="2026-10-21T22:40:00Z">
         <w:r>
           <w:t xml:space="preserve"> of</w:t>
         </w:r>
       </w:ins>
-      <w:ins w:id="322" w:author="kyle O'Reilly" w:date="2026-10-21T23:46:00Z" w16du:dateUtc="2026-10-21T22:46:00Z">
+      <w:ins w:id="342" w:author="kyle O'Reilly" w:date="2026-10-21T23:46:00Z" w16du:dateUtc="2026-10-21T22:46:00Z">
         <w:r>
           <w:t xml:space="preserve"> all the</w:t>
         </w:r>
       </w:ins>
-      <w:ins w:id="323" w:author="kyle O'Reilly" w:date="2026-10-21T23:40:00Z" w16du:dateUtc="2026-10-21T22:40:00Z">
+      <w:ins w:id="343" w:author="kyle O'Reilly" w:date="2026-10-21T23:40:00Z" w16du:dateUtc="2026-10-21T22:40:00Z">
         <w:r>
           <w:t xml:space="preserve"> three </w:t>
         </w:r>
       </w:ins>
-      <w:ins w:id="324" w:author="kyle O'Reilly" w:date="2026-10-21T23:46:00Z" w16du:dateUtc="2026-10-21T22:46:00Z">
+      <w:ins w:id="344" w:author="kyle O'Reilly" w:date="2026-10-21T23:46:00Z" w16du:dateUtc="2026-10-21T22:46:00Z">
         <w:r>
           <w:t xml:space="preserve">selected </w:t>
         </w:r>
       </w:ins>
-      <w:ins w:id="325" w:author="kyle O'Reilly" w:date="2026-10-21T23:40:00Z" w16du:dateUtc="2026-10-21T22:40:00Z">
+      <w:ins w:id="345" w:author="kyle O'Reilly" w:date="2026-10-21T23:40:00Z" w16du:dateUtc="2026-10-21T22:40:00Z">
         <w:r>
           <w:t>stocks.</w:t>
         </w:r>
       </w:ins>
-      <w:ins w:id="326" w:author="kyle O'Reilly" w:date="2026-10-21T23:38:00Z" w16du:dateUtc="2026-10-21T22:38:00Z">
+      <w:ins w:id="346" w:author="kyle O'Reilly" w:date="2026-10-21T23:38:00Z" w16du:dateUtc="2026-10-21T22:38:00Z">
         <w:r>
           <w:t xml:space="preserve"> </w:t>
         </w:r>
       </w:ins>
-      <w:ins w:id="327" w:author="kyle O'Reilly" w:date="2026-10-21T23:46:00Z" w16du:dateUtc="2026-10-21T22:46:00Z">
+      <w:ins w:id="347" w:author="kyle O'Reilly" w:date="2026-10-21T23:46:00Z" w16du:dateUtc="2026-10-21T22:46:00Z">
         <w:r>
           <w:t>JPM</w:t>
         </w:r>
       </w:ins>
-      <w:ins w:id="328" w:author="kyle O'Reilly" w:date="2026-10-21T23:54:00Z" w16du:dateUtc="2026-10-21T22:54:00Z">
+      <w:ins w:id="348" w:author="kyle O'Reilly" w:date="2026-10-21T23:54:00Z" w16du:dateUtc="2026-10-21T22:54:00Z">
         <w:r>
           <w:t>.US</w:t>
         </w:r>
       </w:ins>
-      <w:ins w:id="329" w:author="kyle O'Reilly" w:date="2026-10-21T23:46:00Z" w16du:dateUtc="2026-10-21T22:46:00Z">
+      <w:ins w:id="349" w:author="kyle O'Reilly" w:date="2026-10-21T23:46:00Z" w16du:dateUtc="2026-10-21T22:46:00Z">
         <w:r>
           <w:t xml:space="preserve"> (low)</w:t>
         </w:r>
@@ -4472,12 +4515,12 @@
           <w:t>, KO</w:t>
         </w:r>
       </w:ins>
-      <w:ins w:id="330" w:author="kyle O'Reilly" w:date="2026-10-21T23:54:00Z" w16du:dateUtc="2026-10-21T22:54:00Z">
+      <w:ins w:id="350" w:author="kyle O'Reilly" w:date="2026-10-21T23:54:00Z" w16du:dateUtc="2026-10-21T22:54:00Z">
         <w:r>
           <w:t>.US</w:t>
         </w:r>
       </w:ins>
-      <w:ins w:id="331" w:author="kyle O'Reilly" w:date="2026-10-21T23:46:00Z" w16du:dateUtc="2026-10-21T22:46:00Z">
+      <w:ins w:id="351" w:author="kyle O'Reilly" w:date="2026-10-21T23:46:00Z" w16du:dateUtc="2026-10-21T22:46:00Z">
         <w:r>
           <w:t xml:space="preserve"> (medium)</w:t>
         </w:r>
@@ -4485,72 +4528,72 @@
           <w:t>, and INTC</w:t>
         </w:r>
       </w:ins>
-      <w:ins w:id="332" w:author="kyle O'Reilly" w:date="2026-10-21T23:54:00Z" w16du:dateUtc="2026-10-21T22:54:00Z">
+      <w:ins w:id="352" w:author="kyle O'Reilly" w:date="2026-10-21T23:54:00Z" w16du:dateUtc="2026-10-21T22:54:00Z">
         <w:r>
           <w:t>.US</w:t>
         </w:r>
       </w:ins>
-      <w:ins w:id="333" w:author="kyle O'Reilly" w:date="2026-10-21T23:47:00Z" w16du:dateUtc="2026-10-21T22:47:00Z">
+      <w:ins w:id="353" w:author="kyle O'Reilly" w:date="2026-10-21T23:47:00Z" w16du:dateUtc="2026-10-21T22:47:00Z">
         <w:r>
           <w:t xml:space="preserve"> (high), as displayed on the trading 212 platform</w:t>
         </w:r>
       </w:ins>
-      <w:ins w:id="334" w:author="kyle O'Reilly" w:date="2026-10-21T23:46:00Z" w16du:dateUtc="2026-10-21T22:46:00Z">
+      <w:ins w:id="354" w:author="kyle O'Reilly" w:date="2026-10-21T23:46:00Z" w16du:dateUtc="2026-10-21T22:46:00Z">
         <w:r>
           <w:t xml:space="preserve"> </w:t>
         </w:r>
       </w:ins>
-      <w:ins w:id="335" w:author="kyle O'Reilly" w:date="2026-10-21T23:38:00Z" w16du:dateUtc="2026-10-21T22:38:00Z">
+      <w:ins w:id="355" w:author="kyle O'Reilly" w:date="2026-10-21T23:38:00Z" w16du:dateUtc="2026-10-21T22:38:00Z">
         <w:r>
           <w:t>(</w:t>
         </w:r>
       </w:ins>
-      <w:ins w:id="336" w:author="kyle O'Reilly" w:date="2026-10-21T23:44:00Z" w16du:dateUtc="2026-10-21T22:44:00Z">
+      <w:ins w:id="356" w:author="kyle O'Reilly" w:date="2026-10-21T23:44:00Z" w16du:dateUtc="2026-10-21T22:44:00Z">
         <w:r>
           <w:t>Trading 212, n.d.)</w:t>
         </w:r>
       </w:ins>
-      <w:ins w:id="337" w:author="kyle O'Reilly" w:date="2026-10-21T23:47:00Z" w16du:dateUtc="2026-10-21T22:47:00Z">
+      <w:ins w:id="357" w:author="kyle O'Reilly" w:date="2026-10-21T23:47:00Z" w16du:dateUtc="2026-10-21T22:47:00Z">
         <w:r>
           <w:t xml:space="preserve">. Screenshots of </w:t>
         </w:r>
       </w:ins>
-      <w:ins w:id="338" w:author="kyle O'Reilly" w:date="2026-10-22T00:01:00Z" w16du:dateUtc="2026-10-21T23:01:00Z">
+      <w:ins w:id="358" w:author="kyle O'Reilly" w:date="2026-10-22T00:01:00Z" w16du:dateUtc="2026-10-21T23:01:00Z">
         <w:r>
           <w:t>each stock’s volatility</w:t>
         </w:r>
       </w:ins>
-      <w:ins w:id="339" w:author="kyle O'Reilly" w:date="2026-10-21T23:47:00Z" w16du:dateUtc="2026-10-21T22:47:00Z">
+      <w:ins w:id="359" w:author="kyle O'Reilly" w:date="2026-10-21T23:47:00Z" w16du:dateUtc="2026-10-21T22:47:00Z">
         <w:r>
           <w:t xml:space="preserve"> </w:t>
         </w:r>
       </w:ins>
-      <w:ins w:id="340" w:author="kyle O'Reilly" w:date="2026-10-22T00:01:00Z" w16du:dateUtc="2026-10-21T23:01:00Z">
+      <w:ins w:id="360" w:author="kyle O'Reilly" w:date="2026-10-22T00:01:00Z" w16du:dateUtc="2026-10-21T23:01:00Z">
         <w:r>
           <w:t xml:space="preserve">risk </w:t>
         </w:r>
       </w:ins>
-      <w:ins w:id="341" w:author="kyle O'Reilly" w:date="2026-10-21T23:47:00Z" w16du:dateUtc="2026-10-21T22:47:00Z">
+      <w:ins w:id="361" w:author="kyle O'Reilly" w:date="2026-10-21T23:47:00Z" w16du:dateUtc="2026-10-21T22:47:00Z">
         <w:r>
           <w:t>rating</w:t>
         </w:r>
       </w:ins>
-      <w:ins w:id="342" w:author="kyle O'Reilly" w:date="2026-10-22T00:01:00Z" w16du:dateUtc="2026-10-21T23:01:00Z">
+      <w:ins w:id="362" w:author="kyle O'Reilly" w:date="2026-10-22T00:01:00Z" w16du:dateUtc="2026-10-21T23:01:00Z">
         <w:r>
           <w:t xml:space="preserve"> </w:t>
         </w:r>
       </w:ins>
-      <w:ins w:id="343" w:author="kyle O'Reilly" w:date="2026-10-21T23:47:00Z" w16du:dateUtc="2026-10-21T22:47:00Z">
+      <w:ins w:id="363" w:author="kyle O'Reilly" w:date="2026-10-21T23:47:00Z" w16du:dateUtc="2026-10-21T22:47:00Z">
         <w:r>
           <w:t xml:space="preserve">will be provided in Appendix A to support the stock </w:t>
         </w:r>
       </w:ins>
-      <w:ins w:id="344" w:author="kyle O'Reilly" w:date="2026-10-21T23:48:00Z" w16du:dateUtc="2026-10-21T22:48:00Z">
+      <w:ins w:id="364" w:author="kyle O'Reilly" w:date="2026-10-21T23:48:00Z" w16du:dateUtc="2026-10-21T22:48:00Z">
         <w:r>
           <w:t>selection</w:t>
         </w:r>
       </w:ins>
-      <w:ins w:id="345" w:author="kyle O'Reilly" w:date="2026-10-21T23:47:00Z" w16du:dateUtc="2026-10-21T22:47:00Z">
+      <w:ins w:id="365" w:author="kyle O'Reilly" w:date="2026-10-21T23:47:00Z" w16du:dateUtc="2026-10-21T22:47:00Z">
         <w:r>
           <w:t>.</w:t>
         </w:r>
@@ -4561,53 +4604,53 @@
         <w:spacing w:line="360" w:lineRule="auto"/>
         <w:jc w:val="both"/>
         <w:rPr>
-          <w:ins w:id="346" w:author="kyle O'Reilly" w:date="2026-10-21T20:41:00Z" w16du:dateUtc="2026-10-21T19:41:00Z"/>
-        </w:rPr>
-        <w:pPrChange w:id="347" w:author="kyle O'Reilly" w:date="2026-10-22T21:22:00Z" w16du:dateUtc="2026-10-22T20:22:00Z">
+          <w:ins w:id="366" w:author="kyle O'Reilly" w:date="2026-10-21T20:41:00Z" w16du:dateUtc="2026-10-21T19:41:00Z"/>
+        </w:rPr>
+        <w:pPrChange w:id="367" w:author="kyle O'Reilly" w:date="2026-10-22T21:22:00Z" w16du:dateUtc="2026-10-22T20:22:00Z">
           <w:pPr/>
         </w:pPrChange>
       </w:pPr>
-      <w:ins w:id="348" w:author="kyle O'Reilly" w:date="2026-10-21T23:28:00Z" w16du:dateUtc="2026-10-21T22:28:00Z">
+      <w:ins w:id="368" w:author="kyle O'Reilly" w:date="2026-10-21T23:28:00Z" w16du:dateUtc="2026-10-21T22:28:00Z">
         <w:r>
           <w:t xml:space="preserve">Stooq will be </w:t>
         </w:r>
       </w:ins>
-      <w:ins w:id="349" w:author="kyle O'Reilly" w:date="2026-10-21T23:58:00Z" w16du:dateUtc="2026-10-21T22:58:00Z">
+      <w:ins w:id="369" w:author="kyle O'Reilly" w:date="2026-10-21T23:58:00Z" w16du:dateUtc="2026-10-21T22:58:00Z">
         <w:r>
           <w:t>used to obtain</w:t>
         </w:r>
       </w:ins>
-      <w:ins w:id="350" w:author="kyle O'Reilly" w:date="2026-10-21T23:28:00Z" w16du:dateUtc="2026-10-21T22:28:00Z">
+      <w:ins w:id="370" w:author="kyle O'Reilly" w:date="2026-10-21T23:28:00Z" w16du:dateUtc="2026-10-21T22:28:00Z">
         <w:r>
           <w:t xml:space="preserve"> downloadable historical stock data for JPM</w:t>
         </w:r>
       </w:ins>
-      <w:ins w:id="351" w:author="kyle O'Reilly" w:date="2026-10-21T23:58:00Z" w16du:dateUtc="2026-10-21T22:58:00Z">
+      <w:ins w:id="371" w:author="kyle O'Reilly" w:date="2026-10-21T23:58:00Z" w16du:dateUtc="2026-10-21T22:58:00Z">
         <w:r>
           <w:t>.US</w:t>
         </w:r>
       </w:ins>
-      <w:ins w:id="352" w:author="kyle O'Reilly" w:date="2026-10-21T23:28:00Z" w16du:dateUtc="2026-10-21T22:28:00Z">
+      <w:ins w:id="372" w:author="kyle O'Reilly" w:date="2026-10-21T23:28:00Z" w16du:dateUtc="2026-10-21T22:28:00Z">
         <w:r>
           <w:t>, KO</w:t>
         </w:r>
       </w:ins>
-      <w:ins w:id="353" w:author="kyle O'Reilly" w:date="2026-10-21T23:58:00Z" w16du:dateUtc="2026-10-21T22:58:00Z">
+      <w:ins w:id="373" w:author="kyle O'Reilly" w:date="2026-10-21T23:58:00Z" w16du:dateUtc="2026-10-21T22:58:00Z">
         <w:r>
           <w:t>.US</w:t>
         </w:r>
       </w:ins>
-      <w:ins w:id="354" w:author="kyle O'Reilly" w:date="2026-10-21T23:28:00Z" w16du:dateUtc="2026-10-21T22:28:00Z">
+      <w:ins w:id="374" w:author="kyle O'Reilly" w:date="2026-10-21T23:28:00Z" w16du:dateUtc="2026-10-21T22:28:00Z">
         <w:r>
           <w:t xml:space="preserve"> and INTC</w:t>
         </w:r>
       </w:ins>
-      <w:ins w:id="355" w:author="kyle O'Reilly" w:date="2026-10-21T23:58:00Z" w16du:dateUtc="2026-10-21T22:58:00Z">
+      <w:ins w:id="375" w:author="kyle O'Reilly" w:date="2026-10-21T23:58:00Z" w16du:dateUtc="2026-10-21T22:58:00Z">
         <w:r>
           <w:t>.US</w:t>
         </w:r>
       </w:ins>
-      <w:ins w:id="356" w:author="kyle O'Reilly" w:date="2026-10-21T23:59:00Z" w16du:dateUtc="2026-10-21T22:59:00Z">
+      <w:ins w:id="376" w:author="kyle O'Reilly" w:date="2026-10-21T23:59:00Z" w16du:dateUtc="2026-10-21T22:59:00Z">
         <w:r>
           <w:t xml:space="preserve"> (Stooq</w:t>
         </w:r>
@@ -4615,17 +4658,17 @@
           <w:t>, n.d.a; Stooq, n.d.b</w:t>
         </w:r>
       </w:ins>
-      <w:ins w:id="357" w:author="kyle O'Reilly" w:date="2026-10-22T00:00:00Z" w16du:dateUtc="2026-10-21T23:00:00Z">
+      <w:ins w:id="377" w:author="kyle O'Reilly" w:date="2026-10-22T00:00:00Z" w16du:dateUtc="2026-10-21T23:00:00Z">
         <w:r>
           <w:t>; Stooq, n.d.c).</w:t>
         </w:r>
       </w:ins>
-      <w:ins w:id="358" w:author="kyle O'Reilly" w:date="2026-10-21T23:28:00Z" w16du:dateUtc="2026-10-21T22:28:00Z">
+      <w:ins w:id="378" w:author="kyle O'Reilly" w:date="2026-10-21T23:28:00Z" w16du:dateUtc="2026-10-21T22:28:00Z">
         <w:r>
           <w:t xml:space="preserve"> The </w:t>
         </w:r>
       </w:ins>
-      <w:ins w:id="359" w:author="kyle O'Reilly" w:date="2026-10-22T00:00:00Z" w16du:dateUtc="2026-10-21T23:00:00Z">
+      <w:ins w:id="379" w:author="kyle O'Reilly" w:date="2026-10-22T00:00:00Z" w16du:dateUtc="2026-10-21T23:00:00Z">
         <w:r>
           <w:t xml:space="preserve">independent </w:t>
         </w:r>
@@ -4633,7 +4676,7 @@
           <w:t xml:space="preserve">dataset </w:t>
         </w:r>
       </w:ins>
-      <w:ins w:id="360" w:author="kyle O'Reilly" w:date="2026-10-21T23:28:00Z" w16du:dateUtc="2026-10-21T22:28:00Z">
+      <w:ins w:id="380" w:author="kyle O'Reilly" w:date="2026-10-21T23:28:00Z" w16du:dateUtc="2026-10-21T22:28:00Z">
         <w:r>
           <w:t xml:space="preserve">variables </w:t>
         </w:r>
@@ -4641,17 +4684,17 @@
           <w:t>will</w:t>
         </w:r>
       </w:ins>
-      <w:ins w:id="361" w:author="kyle O'Reilly" w:date="2026-10-22T00:00:00Z" w16du:dateUtc="2026-10-21T23:00:00Z">
+      <w:ins w:id="381" w:author="kyle O'Reilly" w:date="2026-10-22T00:00:00Z" w16du:dateUtc="2026-10-21T23:00:00Z">
         <w:r>
           <w:t xml:space="preserve"> include</w:t>
         </w:r>
       </w:ins>
-      <w:ins w:id="362" w:author="kyle O'Reilly" w:date="2026-10-21T23:28:00Z" w16du:dateUtc="2026-10-21T22:28:00Z">
+      <w:ins w:id="382" w:author="kyle O'Reilly" w:date="2026-10-21T23:28:00Z" w16du:dateUtc="2026-10-21T22:28:00Z">
         <w:r>
           <w:t xml:space="preserve"> </w:t>
         </w:r>
       </w:ins>
-      <w:ins w:id="363" w:author="kyle O'Reilly" w:date="2026-10-21T23:31:00Z" w16du:dateUtc="2026-10-21T22:31:00Z">
+      <w:ins w:id="383" w:author="kyle O'Reilly" w:date="2026-10-21T23:31:00Z" w16du:dateUtc="2026-10-21T22:31:00Z">
         <w:r>
           <w:t xml:space="preserve">sequential index number, </w:t>
         </w:r>
@@ -4659,62 +4702,62 @@
           <w:t>the cale</w:t>
         </w:r>
       </w:ins>
-      <w:ins w:id="364" w:author="kyle O'Reilly" w:date="2026-10-21T23:32:00Z" w16du:dateUtc="2026-10-21T22:32:00Z">
+      <w:ins w:id="384" w:author="kyle O'Reilly" w:date="2026-10-21T23:32:00Z" w16du:dateUtc="2026-10-21T22:32:00Z">
         <w:r>
           <w:t xml:space="preserve">ndar date, the opening price, the maximum </w:t>
         </w:r>
       </w:ins>
-      <w:ins w:id="365" w:author="kyle O'Reilly" w:date="2026-10-22T00:01:00Z" w16du:dateUtc="2026-10-21T23:01:00Z">
+      <w:ins w:id="385" w:author="kyle O'Reilly" w:date="2026-10-22T00:01:00Z" w16du:dateUtc="2026-10-21T23:01:00Z">
         <w:r>
           <w:t xml:space="preserve">and minimum </w:t>
         </w:r>
       </w:ins>
-      <w:ins w:id="366" w:author="kyle O'Reilly" w:date="2026-10-21T23:32:00Z" w16du:dateUtc="2026-10-21T22:32:00Z">
+      <w:ins w:id="386" w:author="kyle O'Reilly" w:date="2026-10-21T23:32:00Z" w16du:dateUtc="2026-10-21T22:32:00Z">
         <w:r>
           <w:t>price</w:t>
         </w:r>
       </w:ins>
-      <w:ins w:id="367" w:author="kyle O'Reilly" w:date="2026-10-22T00:01:00Z" w16du:dateUtc="2026-10-21T23:01:00Z">
+      <w:ins w:id="387" w:author="kyle O'Reilly" w:date="2026-10-22T00:01:00Z" w16du:dateUtc="2026-10-21T23:01:00Z">
         <w:r>
           <w:t>s</w:t>
         </w:r>
       </w:ins>
-      <w:ins w:id="368" w:author="kyle O'Reilly" w:date="2026-10-21T23:32:00Z" w16du:dateUtc="2026-10-21T22:32:00Z">
+      <w:ins w:id="388" w:author="kyle O'Reilly" w:date="2026-10-21T23:32:00Z" w16du:dateUtc="2026-10-21T22:32:00Z">
         <w:r>
           <w:t xml:space="preserve"> the stock reached </w:t>
         </w:r>
       </w:ins>
-      <w:ins w:id="369" w:author="kyle O'Reilly" w:date="2026-10-22T00:02:00Z" w16du:dateUtc="2026-10-21T23:02:00Z">
+      <w:ins w:id="389" w:author="kyle O'Reilly" w:date="2026-10-22T00:02:00Z" w16du:dateUtc="2026-10-21T23:02:00Z">
         <w:r>
           <w:t>during each trading</w:t>
         </w:r>
       </w:ins>
-      <w:ins w:id="370" w:author="kyle O'Reilly" w:date="2026-10-21T23:32:00Z" w16du:dateUtc="2026-10-21T22:32:00Z">
+      <w:ins w:id="390" w:author="kyle O'Reilly" w:date="2026-10-21T23:32:00Z" w16du:dateUtc="2026-10-21T22:32:00Z">
         <w:r>
           <w:t xml:space="preserve"> date,</w:t>
         </w:r>
       </w:ins>
-      <w:ins w:id="371" w:author="kyle O'Reilly" w:date="2026-10-21T23:33:00Z" w16du:dateUtc="2026-10-21T22:33:00Z">
+      <w:ins w:id="391" w:author="kyle O'Reilly" w:date="2026-10-21T23:33:00Z" w16du:dateUtc="2026-10-21T22:33:00Z">
         <w:r>
           <w:t xml:space="preserve"> closing price,</w:t>
         </w:r>
       </w:ins>
-      <w:ins w:id="372" w:author="kyle O'Reilly" w:date="2026-10-22T00:02:00Z" w16du:dateUtc="2026-10-21T23:02:00Z">
+      <w:ins w:id="392" w:author="kyle O'Reilly" w:date="2026-10-22T00:02:00Z" w16du:dateUtc="2026-10-21T23:02:00Z">
         <w:r>
           <w:t xml:space="preserve"> daily </w:t>
         </w:r>
       </w:ins>
-      <w:ins w:id="373" w:author="kyle O'Reilly" w:date="2026-10-22T00:03:00Z" w16du:dateUtc="2026-10-21T23:03:00Z">
+      <w:ins w:id="393" w:author="kyle O'Reilly" w:date="2026-10-22T00:03:00Z" w16du:dateUtc="2026-10-21T23:03:00Z">
         <w:r>
           <w:t>percentage</w:t>
         </w:r>
       </w:ins>
-      <w:ins w:id="374" w:author="kyle O'Reilly" w:date="2026-10-22T00:02:00Z" w16du:dateUtc="2026-10-21T23:02:00Z">
+      <w:ins w:id="394" w:author="kyle O'Reilly" w:date="2026-10-22T00:02:00Z" w16du:dateUtc="2026-10-21T23:02:00Z">
         <w:r>
           <w:t xml:space="preserve"> and a</w:t>
         </w:r>
       </w:ins>
-      <w:ins w:id="375" w:author="kyle O'Reilly" w:date="2026-10-22T00:03:00Z" w16du:dateUtc="2026-10-21T23:03:00Z">
+      <w:ins w:id="395" w:author="kyle O'Reilly" w:date="2026-10-22T00:03:00Z" w16du:dateUtc="2026-10-21T23:03:00Z">
         <w:r>
           <w:t>bsolute price change compared with the previous day’s closing price</w:t>
         </w:r>
@@ -4722,17 +4765,17 @@
           <w:t>,</w:t>
         </w:r>
       </w:ins>
-      <w:ins w:id="376" w:author="kyle O'Reilly" w:date="2026-10-21T23:33:00Z" w16du:dateUtc="2026-10-21T22:33:00Z">
+      <w:ins w:id="396" w:author="kyle O'Reilly" w:date="2026-10-21T23:33:00Z" w16du:dateUtc="2026-10-21T22:33:00Z">
         <w:r>
           <w:t xml:space="preserve"> and </w:t>
         </w:r>
       </w:ins>
-      <w:ins w:id="377" w:author="kyle O'Reilly" w:date="2026-10-21T23:34:00Z" w16du:dateUtc="2026-10-21T22:34:00Z">
+      <w:ins w:id="397" w:author="kyle O'Reilly" w:date="2026-10-21T23:34:00Z" w16du:dateUtc="2026-10-21T22:34:00Z">
         <w:r>
           <w:t xml:space="preserve">the total number of shares traded </w:t>
         </w:r>
       </w:ins>
-      <w:ins w:id="378" w:author="kyle O'Reilly" w:date="2026-10-22T00:03:00Z" w16du:dateUtc="2026-10-21T23:03:00Z">
+      <w:ins w:id="398" w:author="kyle O'Reilly" w:date="2026-10-22T00:03:00Z" w16du:dateUtc="2026-10-21T23:03:00Z">
         <w:r>
           <w:t>each date.</w:t>
         </w:r>
@@ -4742,9 +4785,9 @@
       <w:pPr>
         <w:spacing w:line="360" w:lineRule="auto"/>
         <w:rPr>
-          <w:ins w:id="379" w:author="kyle O'Reilly" w:date="2026-10-21T20:41:00Z" w16du:dateUtc="2026-10-21T19:41:00Z"/>
-        </w:rPr>
-        <w:pPrChange w:id="380" w:author="kyle O'Reilly" w:date="2026-10-22T21:22:00Z" w16du:dateUtc="2026-10-22T20:22:00Z">
+          <w:ins w:id="399" w:author="kyle O'Reilly" w:date="2026-10-21T20:41:00Z" w16du:dateUtc="2026-10-21T19:41:00Z"/>
+        </w:rPr>
+        <w:pPrChange w:id="400" w:author="kyle O'Reilly" w:date="2026-10-22T21:22:00Z" w16du:dateUtc="2026-10-22T20:22:00Z">
           <w:pPr/>
         </w:pPrChange>
       </w:pPr>
@@ -4755,18 +4798,18 @@
         <w:spacing w:line="360" w:lineRule="auto"/>
         <w:jc w:val="both"/>
         <w:rPr>
-          <w:ins w:id="381" w:author="kyle O'Reilly" w:date="2026-10-21T20:41:00Z" w16du:dateUtc="2026-10-21T19:41:00Z"/>
-        </w:rPr>
-        <w:pPrChange w:id="382" w:author="kyle O'Reilly" w:date="2026-10-22T21:22:00Z" w16du:dateUtc="2026-10-22T20:22:00Z">
+          <w:ins w:id="401" w:author="kyle O'Reilly" w:date="2026-10-21T20:41:00Z" w16du:dateUtc="2026-10-21T19:41:00Z"/>
+        </w:rPr>
+        <w:pPrChange w:id="402" w:author="kyle O'Reilly" w:date="2026-10-22T21:22:00Z" w16du:dateUtc="2026-10-22T20:22:00Z">
           <w:pPr/>
         </w:pPrChange>
       </w:pPr>
-      <w:bookmarkStart w:id="383" w:name="_Toc243604269"/>
-      <w:ins w:id="384" w:author="kyle O'Reilly" w:date="2026-10-21T20:41:00Z" w16du:dateUtc="2026-10-21T19:41:00Z">
+      <w:bookmarkStart w:id="403" w:name="_Toc243604269"/>
+      <w:ins w:id="404" w:author="kyle O'Reilly" w:date="2026-10-21T20:41:00Z" w16du:dateUtc="2026-10-21T19:41:00Z">
         <w:r>
           <w:t>8. Expected Deliverables</w:t>
         </w:r>
-        <w:bookmarkEnd w:id="383"/>
+        <w:bookmarkEnd w:id="403"/>
       </w:ins>
     </w:p>
     <w:p>
@@ -4774,18 +4817,18 @@
         <w:spacing w:line="360" w:lineRule="auto"/>
         <w:jc w:val="both"/>
         <w:rPr>
-          <w:ins w:id="385" w:author="kyle O'Reilly" w:date="2026-10-21T20:41:00Z" w16du:dateUtc="2026-10-21T19:41:00Z"/>
-        </w:rPr>
-        <w:pPrChange w:id="386" w:author="kyle O'Reilly" w:date="2026-10-22T21:22:00Z" w16du:dateUtc="2026-10-22T20:22:00Z">
+          <w:ins w:id="405" w:author="kyle O'Reilly" w:date="2026-10-21T20:41:00Z" w16du:dateUtc="2026-10-21T19:41:00Z"/>
+        </w:rPr>
+        <w:pPrChange w:id="406" w:author="kyle O'Reilly" w:date="2026-10-22T21:22:00Z" w16du:dateUtc="2026-10-22T20:22:00Z">
           <w:pPr/>
         </w:pPrChange>
       </w:pPr>
-      <w:ins w:id="387" w:author="kyle O'Reilly" w:date="2026-10-22T18:05:00Z" w16du:dateUtc="2026-10-22T17:05:00Z">
+      <w:ins w:id="407" w:author="kyle O'Reilly" w:date="2026-10-22T18:05:00Z" w16du:dateUtc="2026-10-22T17:05:00Z">
         <w:r>
           <w:t>The expected deliverables for this Capstone P</w:t>
         </w:r>
       </w:ins>
-      <w:ins w:id="388" w:author="kyle O'Reilly" w:date="2026-10-22T18:06:00Z" w16du:dateUtc="2026-10-22T17:06:00Z">
+      <w:ins w:id="408" w:author="kyle O'Reilly" w:date="2026-10-22T18:06:00Z" w16du:dateUtc="2026-10-22T17:06:00Z">
         <w:r>
           <w:t>roject</w:t>
         </w:r>
@@ -4793,12 +4836,12 @@
           <w:t xml:space="preserve"> will include a </w:t>
         </w:r>
       </w:ins>
-      <w:ins w:id="389" w:author="kyle O'Reilly" w:date="2026-10-22T18:09:00Z" w16du:dateUtc="2026-10-22T17:09:00Z">
+      <w:ins w:id="409" w:author="kyle O'Reilly" w:date="2026-10-22T18:09:00Z" w16du:dateUtc="2026-10-22T17:09:00Z">
         <w:r>
           <w:t>Jupyter</w:t>
         </w:r>
       </w:ins>
-      <w:ins w:id="390" w:author="kyle O'Reilly" w:date="2026-10-22T18:06:00Z" w16du:dateUtc="2026-10-22T17:06:00Z">
+      <w:ins w:id="410" w:author="kyle O'Reilly" w:date="2026-10-22T18:06:00Z" w16du:dateUtc="2026-10-22T17:06:00Z">
         <w:r>
           <w:t xml:space="preserve"> Notebook containing data preparation, model training, nin</w:t>
         </w:r>
@@ -4806,12 +4849,12 @@
           <w:t xml:space="preserve">e </w:t>
         </w:r>
       </w:ins>
-      <w:ins w:id="391" w:author="kyle O'Reilly" w:date="2026-10-22T18:07:00Z" w16du:dateUtc="2026-10-22T17:07:00Z">
+      <w:ins w:id="411" w:author="kyle O'Reilly" w:date="2026-10-22T18:07:00Z" w16du:dateUtc="2026-10-22T17:07:00Z">
         <w:r>
           <w:t>predictions and evaluation</w:t>
         </w:r>
       </w:ins>
-      <w:ins w:id="392" w:author="kyle O'Reilly" w:date="2026-10-22T18:08:00Z" w16du:dateUtc="2026-10-22T17:08:00Z">
+      <w:ins w:id="412" w:author="kyle O'Reilly" w:date="2026-10-22T18:08:00Z" w16du:dateUtc="2026-10-22T17:08:00Z">
         <w:r>
           <w:t xml:space="preserve">; a comparison on the JPMorgan Chase &amp; </w:t>
         </w:r>
@@ -4823,7 +4866,7 @@
           <w:t>; three actual closing values; individual error calc</w:t>
         </w:r>
       </w:ins>
-      <w:ins w:id="393" w:author="kyle O'Reilly" w:date="2026-10-22T18:09:00Z" w16du:dateUtc="2026-10-22T17:09:00Z">
+      <w:ins w:id="413" w:author="kyle O'Reilly" w:date="2026-10-22T18:09:00Z" w16du:dateUtc="2026-10-22T17:09:00Z">
         <w:r>
           <w:t>ulations; a final report discussing findings and limitations; and a GitHub repository with code and permitted files.</w:t>
         </w:r>
@@ -4833,9 +4876,9 @@
       <w:pPr>
         <w:spacing w:line="360" w:lineRule="auto"/>
         <w:rPr>
-          <w:ins w:id="394" w:author="kyle O'Reilly" w:date="2026-10-21T20:41:00Z" w16du:dateUtc="2026-10-21T19:41:00Z"/>
-        </w:rPr>
-        <w:pPrChange w:id="395" w:author="kyle O'Reilly" w:date="2026-10-22T21:22:00Z" w16du:dateUtc="2026-10-22T20:22:00Z">
+          <w:ins w:id="414" w:author="kyle O'Reilly" w:date="2026-10-21T20:41:00Z" w16du:dateUtc="2026-10-21T19:41:00Z"/>
+        </w:rPr>
+        <w:pPrChange w:id="415" w:author="kyle O'Reilly" w:date="2026-10-22T21:22:00Z" w16du:dateUtc="2026-10-22T20:22:00Z">
           <w:pPr/>
         </w:pPrChange>
       </w:pPr>
@@ -4845,35 +4888,35 @@
         <w:pStyle w:val="Heading1"/>
         <w:spacing w:line="360" w:lineRule="auto"/>
         <w:jc w:val="both"/>
-        <w:pPrChange w:id="396" w:author="kyle O'Reilly" w:date="2026-10-22T21:22:00Z" w16du:dateUtc="2026-10-22T20:22:00Z">
+        <w:pPrChange w:id="416" w:author="kyle O'Reilly" w:date="2026-10-22T21:22:00Z" w16du:dateUtc="2026-10-22T20:22:00Z">
           <w:pPr/>
         </w:pPrChange>
       </w:pPr>
-      <w:bookmarkStart w:id="397" w:name="_Toc243604270"/>
-      <w:ins w:id="398" w:author="kyle O'Reilly" w:date="2026-10-21T20:41:00Z" w16du:dateUtc="2026-10-21T19:41:00Z">
+      <w:bookmarkStart w:id="417" w:name="_Toc243604270"/>
+      <w:ins w:id="418" w:author="kyle O'Reilly" w:date="2026-10-21T20:41:00Z" w16du:dateUtc="2026-10-21T19:41:00Z">
         <w:r>
           <w:t>9. Project Timeline</w:t>
         </w:r>
       </w:ins>
-      <w:bookmarkEnd w:id="397"/>
+      <w:bookmarkEnd w:id="417"/>
     </w:p>
     <w:p>
       <w:pPr>
         <w:spacing w:line="360" w:lineRule="auto"/>
         <w:jc w:val="both"/>
         <w:rPr>
-          <w:ins w:id="399" w:author="kyle O'Reilly" w:date="2026-10-22T18:18:00Z" w16du:dateUtc="2026-10-22T17:18:00Z"/>
-        </w:rPr>
-        <w:pPrChange w:id="400" w:author="kyle O'Reilly" w:date="2026-10-22T21:22:00Z" w16du:dateUtc="2026-10-22T20:22:00Z">
+          <w:ins w:id="419" w:author="kyle O'Reilly" w:date="2026-10-22T18:18:00Z" w16du:dateUtc="2026-10-22T17:18:00Z"/>
+        </w:rPr>
+        <w:pPrChange w:id="420" w:author="kyle O'Reilly" w:date="2026-10-22T21:22:00Z" w16du:dateUtc="2026-10-22T20:22:00Z">
           <w:pPr/>
         </w:pPrChange>
       </w:pPr>
-      <w:ins w:id="401" w:author="kyle O'Reilly" w:date="2026-10-22T18:13:00Z" w16du:dateUtc="2026-10-22T17:13:00Z">
+      <w:ins w:id="421" w:author="kyle O'Reilly" w:date="2026-10-22T18:13:00Z" w16du:dateUtc="2026-10-22T17:13:00Z">
         <w:r>
           <w:t>This Capstone Pro</w:t>
         </w:r>
       </w:ins>
-      <w:ins w:id="402" w:author="kyle O'Reilly" w:date="2026-10-22T18:15:00Z" w16du:dateUtc="2026-10-22T17:15:00Z">
+      <w:ins w:id="422" w:author="kyle O'Reilly" w:date="2026-10-22T18:15:00Z" w16du:dateUtc="2026-10-22T17:15:00Z">
         <w:r>
           <w:t xml:space="preserve">ject </w:t>
         </w:r>
@@ -4881,7 +4924,7 @@
           <w:t>is planned across academic semesters</w:t>
         </w:r>
       </w:ins>
-      <w:ins w:id="403" w:author="kyle O'Reilly" w:date="2026-10-22T18:16:00Z" w16du:dateUtc="2026-10-22T17:16:00Z">
+      <w:ins w:id="423" w:author="kyle O'Reilly" w:date="2026-10-22T18:16:00Z" w16du:dateUtc="2026-10-22T17:16:00Z">
         <w:r>
           <w:t xml:space="preserve">. The first semester </w:t>
         </w:r>
@@ -4892,7 +4935,7 @@
           <w:t xml:space="preserve">, data source </w:t>
         </w:r>
       </w:ins>
-      <w:ins w:id="404" w:author="kyle O'Reilly" w:date="2026-10-22T18:17:00Z" w16du:dateUtc="2026-10-22T17:17:00Z">
+      <w:ins w:id="424" w:author="kyle O'Reilly" w:date="2026-10-22T18:17:00Z" w16du:dateUtc="2026-10-22T17:17:00Z">
         <w:r>
           <w:t>and methodology. The second will focus on data preparation, model development, predictions</w:t>
         </w:r>
@@ -4900,7 +4943,7 @@
           <w:t>, evaluation, r</w:t>
         </w:r>
       </w:ins>
-      <w:ins w:id="405" w:author="kyle O'Reilly" w:date="2026-10-22T18:18:00Z" w16du:dateUtc="2026-10-22T17:18:00Z">
+      <w:ins w:id="425" w:author="kyle O'Reilly" w:date="2026-10-22T18:18:00Z" w16du:dateUtc="2026-10-22T17:18:00Z">
         <w:r>
           <w:t>eporting</w:t>
         </w:r>
@@ -4908,22 +4951,22 @@
           <w:t xml:space="preserve"> and submission. The </w:t>
         </w:r>
       </w:ins>
-      <w:ins w:id="406" w:author="kyle O'Reilly" w:date="2026-10-22T18:43:00Z" w16du:dateUtc="2026-10-22T17:43:00Z">
+      <w:ins w:id="426" w:author="kyle O'Reilly" w:date="2026-10-22T18:43:00Z" w16du:dateUtc="2026-10-22T17:43:00Z">
         <w:r>
           <w:t xml:space="preserve">proposed </w:t>
         </w:r>
       </w:ins>
-      <w:ins w:id="407" w:author="kyle O'Reilly" w:date="2026-10-22T18:18:00Z" w16du:dateUtc="2026-10-22T17:18:00Z">
+      <w:ins w:id="427" w:author="kyle O'Reilly" w:date="2026-10-22T18:18:00Z" w16du:dateUtc="2026-10-22T17:18:00Z">
         <w:r>
           <w:t>illustrate Gantt Chart</w:t>
         </w:r>
       </w:ins>
-      <w:ins w:id="408" w:author="kyle O'Reilly" w:date="2026-10-22T18:43:00Z" w16du:dateUtc="2026-10-22T17:43:00Z">
+      <w:ins w:id="428" w:author="kyle O'Reilly" w:date="2026-10-22T18:43:00Z" w16du:dateUtc="2026-10-22T17:43:00Z">
         <w:r>
           <w:t xml:space="preserve"> (See Figure 1)</w:t>
         </w:r>
       </w:ins>
-      <w:ins w:id="409" w:author="kyle O'Reilly" w:date="2026-10-22T18:18:00Z" w16du:dateUtc="2026-10-22T17:18:00Z">
+      <w:ins w:id="429" w:author="kyle O'Reilly" w:date="2026-10-22T18:18:00Z" w16du:dateUtc="2026-10-22T17:18:00Z">
         <w:r>
           <w:t xml:space="preserve"> below will be adjusted to the confirmed academic calendar.</w:t>
         </w:r>
@@ -4935,13 +4978,13 @@
         <w:spacing w:line="360" w:lineRule="auto"/>
         <w:jc w:val="center"/>
         <w:rPr>
-          <w:ins w:id="410" w:author="kyle O'Reilly" w:date="2026-10-22T18:40:00Z" w16du:dateUtc="2026-10-22T17:40:00Z"/>
-        </w:rPr>
-        <w:pPrChange w:id="411" w:author="kyle O'Reilly" w:date="2026-10-22T21:22:00Z" w16du:dateUtc="2026-10-22T20:22:00Z">
+          <w:ins w:id="430" w:author="kyle O'Reilly" w:date="2026-10-22T18:40:00Z" w16du:dateUtc="2026-10-22T17:40:00Z"/>
+        </w:rPr>
+        <w:pPrChange w:id="431" w:author="kyle O'Reilly" w:date="2026-10-22T21:22:00Z" w16du:dateUtc="2026-10-22T20:22:00Z">
           <w:pPr/>
         </w:pPrChange>
       </w:pPr>
-      <w:ins w:id="412" w:author="kyle O'Reilly" w:date="2026-10-22T18:42:00Z" w16du:dateUtc="2026-10-22T17:42:00Z">
+      <w:ins w:id="432" w:author="kyle O'Reilly" w:date="2026-10-22T18:42:00Z" w16du:dateUtc="2026-10-22T17:42:00Z">
         <w:r>
           <w:rPr>
             <w:noProof/>
@@ -4990,13 +5033,13 @@
         <w:spacing w:line="360" w:lineRule="auto"/>
         <w:jc w:val="center"/>
         <w:rPr>
-          <w:ins w:id="413" w:author="kyle O'Reilly" w:date="2026-10-22T18:18:00Z" w16du:dateUtc="2026-10-22T17:18:00Z"/>
-        </w:rPr>
-        <w:pPrChange w:id="414" w:author="kyle O'Reilly" w:date="2026-10-22T21:22:00Z" w16du:dateUtc="2026-10-22T20:22:00Z">
+          <w:ins w:id="433" w:author="kyle O'Reilly" w:date="2026-10-22T18:18:00Z" w16du:dateUtc="2026-10-22T17:18:00Z"/>
+        </w:rPr>
+        <w:pPrChange w:id="434" w:author="kyle O'Reilly" w:date="2026-10-22T21:22:00Z" w16du:dateUtc="2026-10-22T20:22:00Z">
           <w:pPr/>
         </w:pPrChange>
       </w:pPr>
-      <w:ins w:id="415" w:author="kyle O'Reilly" w:date="2026-10-22T18:40:00Z" w16du:dateUtc="2026-10-22T17:40:00Z">
+      <w:ins w:id="435" w:author="kyle O'Reilly" w:date="2026-10-22T18:40:00Z" w16du:dateUtc="2026-10-22T17:40:00Z">
         <w:r>
           <w:t xml:space="preserve">Figure </w:t>
         </w:r>
@@ -5010,7 +5053,7 @@
       <w:r>
         <w:fldChar w:fldCharType="separate"/>
       </w:r>
-      <w:ins w:id="416" w:author="kyle O'Reilly" w:date="2026-10-22T23:28:00Z" w16du:dateUtc="2026-10-22T22:28:00Z">
+      <w:ins w:id="436" w:author="kyle O'Reilly" w:date="2026-10-22T23:28:00Z" w16du:dateUtc="2026-10-22T22:28:00Z">
         <w:r>
           <w:rPr>
             <w:noProof/>
@@ -5018,7 +5061,7 @@
           <w:t>2</w:t>
         </w:r>
       </w:ins>
-      <w:ins w:id="417" w:author="kyle O'Reilly" w:date="2026-10-22T18:40:00Z" w16du:dateUtc="2026-10-22T17:40:00Z">
+      <w:ins w:id="437" w:author="kyle O'Reilly" w:date="2026-10-22T18:40:00Z" w16du:dateUtc="2026-10-22T17:40:00Z">
         <w:r>
           <w:fldChar w:fldCharType="end"/>
         </w:r>
@@ -5031,9 +5074,9 @@
       <w:pPr>
         <w:spacing w:line="360" w:lineRule="auto"/>
         <w:rPr>
-          <w:del w:id="418" w:author="kyle O'Reilly" w:date="2026-10-22T18:41:00Z" w16du:dateUtc="2026-10-22T17:41:00Z"/>
-        </w:rPr>
-        <w:pPrChange w:id="419" w:author="kyle O'Reilly" w:date="2026-10-22T21:22:00Z" w16du:dateUtc="2026-10-22T20:22:00Z">
+          <w:del w:id="438" w:author="kyle O'Reilly" w:date="2026-10-22T18:41:00Z" w16du:dateUtc="2026-10-22T17:41:00Z"/>
+        </w:rPr>
+        <w:pPrChange w:id="439" w:author="kyle O'Reilly" w:date="2026-10-22T21:22:00Z" w16du:dateUtc="2026-10-22T20:22:00Z">
           <w:pPr/>
         </w:pPrChange>
       </w:pPr>
@@ -5042,9 +5085,9 @@
       <w:pPr>
         <w:spacing w:line="360" w:lineRule="auto"/>
         <w:rPr>
-          <w:ins w:id="420" w:author="kyle O'Reilly" w:date="2026-10-21T20:41:00Z" w16du:dateUtc="2026-10-21T19:41:00Z"/>
-        </w:rPr>
-        <w:pPrChange w:id="421" w:author="kyle O'Reilly" w:date="2026-10-22T21:22:00Z" w16du:dateUtc="2026-10-22T20:22:00Z">
+          <w:ins w:id="440" w:author="kyle O'Reilly" w:date="2026-10-21T20:41:00Z" w16du:dateUtc="2026-10-21T19:41:00Z"/>
+        </w:rPr>
+        <w:pPrChange w:id="441" w:author="kyle O'Reilly" w:date="2026-10-22T21:22:00Z" w16du:dateUtc="2026-10-22T20:22:00Z">
           <w:pPr/>
         </w:pPrChange>
       </w:pPr>
@@ -5055,32 +5098,32 @@
         <w:spacing w:line="360" w:lineRule="auto"/>
         <w:jc w:val="both"/>
         <w:rPr>
-          <w:ins w:id="422" w:author="kyle O'Reilly" w:date="2026-10-21T20:41:00Z" w16du:dateUtc="2026-10-21T19:41:00Z"/>
-        </w:rPr>
-        <w:pPrChange w:id="423" w:author="kyle O'Reilly" w:date="2026-10-22T21:22:00Z" w16du:dateUtc="2026-10-22T20:22:00Z">
+          <w:ins w:id="442" w:author="kyle O'Reilly" w:date="2026-10-21T20:41:00Z" w16du:dateUtc="2026-10-21T19:41:00Z"/>
+        </w:rPr>
+        <w:pPrChange w:id="443" w:author="kyle O'Reilly" w:date="2026-10-22T21:22:00Z" w16du:dateUtc="2026-10-22T20:22:00Z">
           <w:pPr/>
         </w:pPrChange>
       </w:pPr>
-      <w:bookmarkStart w:id="424" w:name="_Toc243604271"/>
-      <w:ins w:id="425" w:author="kyle O'Reilly" w:date="2026-10-21T20:41:00Z" w16du:dateUtc="2026-10-21T19:41:00Z">
+      <w:bookmarkStart w:id="444" w:name="_Toc243604271"/>
+      <w:ins w:id="445" w:author="kyle O'Reilly" w:date="2026-10-21T20:41:00Z" w16du:dateUtc="2026-10-21T19:41:00Z">
         <w:r>
           <w:t>10. Ethical and Legal Considerations</w:t>
         </w:r>
-        <w:bookmarkEnd w:id="424"/>
-      </w:ins>
-    </w:p>
-    <w:p>
-      <w:pPr>
-        <w:rPr>
-          <w:ins w:id="426" w:author="kyle O'Reilly" w:date="2026-10-21T20:46:00Z" w16du:dateUtc="2026-10-21T19:46:00Z"/>
-        </w:rPr>
-      </w:pPr>
-      <w:ins w:id="427" w:author="kyle O'Reilly" w:date="2026-10-21T20:42:00Z" w16du:dateUtc="2026-10-21T19:42:00Z">
+        <w:bookmarkEnd w:id="444"/>
+      </w:ins>
+    </w:p>
+    <w:p>
+      <w:pPr>
+        <w:rPr>
+          <w:ins w:id="446" w:author="kyle O'Reilly" w:date="2026-10-21T20:46:00Z" w16du:dateUtc="2026-10-21T19:46:00Z"/>
+        </w:rPr>
+      </w:pPr>
+      <w:ins w:id="447" w:author="kyle O'Reilly" w:date="2026-10-21T20:42:00Z" w16du:dateUtc="2026-10-21T19:42:00Z">
         <w:r>
           <w:t>This C</w:t>
         </w:r>
       </w:ins>
-      <w:ins w:id="428" w:author="kyle O'Reilly" w:date="2026-10-21T20:43:00Z" w16du:dateUtc="2026-10-21T19:43:00Z">
+      <w:ins w:id="448" w:author="kyle O'Reilly" w:date="2026-10-21T20:43:00Z" w16du:dateUtc="2026-10-21T19:43:00Z">
         <w:r>
           <w:t xml:space="preserve">apstone Project will use </w:t>
         </w:r>
@@ -5091,12 +5134,12 @@
           <w:t>historical stock</w:t>
         </w:r>
       </w:ins>
-      <w:ins w:id="429" w:author="kyle O'Reilly" w:date="2026-10-21T22:01:00Z" w16du:dateUtc="2026-10-21T21:01:00Z">
+      <w:ins w:id="449" w:author="kyle O'Reilly" w:date="2026-10-21T22:01:00Z" w16du:dateUtc="2026-10-21T21:01:00Z">
         <w:r>
           <w:t xml:space="preserve"> </w:t>
         </w:r>
       </w:ins>
-      <w:ins w:id="430" w:author="kyle O'Reilly" w:date="2026-10-21T20:43:00Z" w16du:dateUtc="2026-10-21T19:43:00Z">
+      <w:ins w:id="450" w:author="kyle O'Reilly" w:date="2026-10-21T20:43:00Z" w16du:dateUtc="2026-10-21T19:43:00Z">
         <w:r>
           <w:t xml:space="preserve">data </w:t>
         </w:r>
@@ -5107,7 +5150,7 @@
           <w:t xml:space="preserve">collect personal information or involve human </w:t>
         </w:r>
       </w:ins>
-      <w:ins w:id="431" w:author="kyle O'Reilly" w:date="2026-10-21T20:44:00Z" w16du:dateUtc="2026-10-21T19:44:00Z">
+      <w:ins w:id="451" w:author="kyle O'Reilly" w:date="2026-10-21T20:44:00Z" w16du:dateUtc="2026-10-21T19:44:00Z">
         <w:r>
           <w:t>participants. Stooq data access and usage conditions, and any Trading 212</w:t>
         </w:r>
@@ -5115,22 +5158,22 @@
           <w:t xml:space="preserve"> information reused in the report, will be reviewed and appropriately attributed</w:t>
         </w:r>
       </w:ins>
-      <w:ins w:id="432" w:author="kyle O'Reilly" w:date="2026-10-21T20:45:00Z" w16du:dateUtc="2026-10-21T19:45:00Z">
+      <w:ins w:id="452" w:author="kyle O'Reilly" w:date="2026-10-21T20:45:00Z" w16du:dateUtc="2026-10-21T19:45:00Z">
         <w:r>
           <w:t xml:space="preserve">. Historical stock </w:t>
         </w:r>
       </w:ins>
-      <w:ins w:id="433" w:author="kyle O'Reilly" w:date="2026-10-21T22:03:00Z" w16du:dateUtc="2026-10-21T21:03:00Z">
+      <w:ins w:id="453" w:author="kyle O'Reilly" w:date="2026-10-21T22:03:00Z" w16du:dateUtc="2026-10-21T21:03:00Z">
         <w:r>
           <w:t xml:space="preserve">market </w:t>
         </w:r>
       </w:ins>
-      <w:ins w:id="434" w:author="kyle O'Reilly" w:date="2026-10-21T20:45:00Z" w16du:dateUtc="2026-10-21T19:45:00Z">
+      <w:ins w:id="454" w:author="kyle O'Reilly" w:date="2026-10-21T20:45:00Z" w16du:dateUtc="2026-10-21T19:45:00Z">
         <w:r>
           <w:t xml:space="preserve">data </w:t>
         </w:r>
       </w:ins>
-      <w:ins w:id="435" w:author="kyle O'Reilly" w:date="2026-10-21T22:11:00Z" w16du:dateUtc="2026-10-21T21:11:00Z">
+      <w:ins w:id="455" w:author="kyle O'Reilly" w:date="2026-10-21T22:11:00Z" w16du:dateUtc="2026-10-21T21:11:00Z">
         <w:r>
           <w:t>Comma</w:t>
         </w:r>
@@ -5141,37 +5184,37 @@
           <w:t>(</w:t>
         </w:r>
       </w:ins>
-      <w:ins w:id="436" w:author="kyle O'Reilly" w:date="2026-10-21T22:05:00Z" w16du:dateUtc="2026-10-21T21:05:00Z">
+      <w:ins w:id="456" w:author="kyle O'Reilly" w:date="2026-10-21T22:05:00Z" w16du:dateUtc="2026-10-21T21:05:00Z">
         <w:r>
           <w:t>CSV</w:t>
         </w:r>
       </w:ins>
-      <w:ins w:id="437" w:author="kyle O'Reilly" w:date="2026-10-21T22:11:00Z" w16du:dateUtc="2026-10-21T21:11:00Z">
+      <w:ins w:id="457" w:author="kyle O'Reilly" w:date="2026-10-21T22:11:00Z" w16du:dateUtc="2026-10-21T21:11:00Z">
         <w:r>
           <w:t>)</w:t>
         </w:r>
       </w:ins>
-      <w:ins w:id="438" w:author="kyle O'Reilly" w:date="2026-10-21T22:05:00Z" w16du:dateUtc="2026-10-21T21:05:00Z">
+      <w:ins w:id="458" w:author="kyle O'Reilly" w:date="2026-10-21T22:05:00Z" w16du:dateUtc="2026-10-21T21:05:00Z">
         <w:r>
           <w:t xml:space="preserve"> </w:t>
         </w:r>
       </w:ins>
-      <w:ins w:id="439" w:author="kyle O'Reilly" w:date="2026-10-21T20:45:00Z" w16du:dateUtc="2026-10-21T19:45:00Z">
+      <w:ins w:id="459" w:author="kyle O'Reilly" w:date="2026-10-21T20:45:00Z" w16du:dateUtc="2026-10-21T19:45:00Z">
         <w:r>
           <w:t>files</w:t>
         </w:r>
       </w:ins>
-      <w:ins w:id="440" w:author="kyle O'Reilly" w:date="2026-10-21T22:07:00Z" w16du:dateUtc="2026-10-21T21:07:00Z">
+      <w:ins w:id="460" w:author="kyle O'Reilly" w:date="2026-10-21T22:07:00Z" w16du:dateUtc="2026-10-21T21:07:00Z">
         <w:r>
           <w:t xml:space="preserve"> downloaded from S</w:t>
         </w:r>
       </w:ins>
-      <w:ins w:id="441" w:author="kyle O'Reilly" w:date="2026-10-21T22:08:00Z" w16du:dateUtc="2026-10-21T21:08:00Z">
+      <w:ins w:id="461" w:author="kyle O'Reilly" w:date="2026-10-21T22:08:00Z" w16du:dateUtc="2026-10-21T21:08:00Z">
         <w:r>
           <w:t>tooq</w:t>
         </w:r>
       </w:ins>
-      <w:ins w:id="442" w:author="kyle O'Reilly" w:date="2026-10-21T20:45:00Z" w16du:dateUtc="2026-10-21T19:45:00Z">
+      <w:ins w:id="462" w:author="kyle O'Reilly" w:date="2026-10-21T20:45:00Z" w16du:dateUtc="2026-10-21T19:45:00Z">
         <w:r>
           <w:t xml:space="preserve"> </w:t>
         </w:r>
@@ -5179,37 +5222,37 @@
           <w:t xml:space="preserve">will only be </w:t>
         </w:r>
       </w:ins>
-      <w:ins w:id="443" w:author="kyle O'Reilly" w:date="2026-10-21T22:08:00Z" w16du:dateUtc="2026-10-21T21:08:00Z">
+      <w:ins w:id="463" w:author="kyle O'Reilly" w:date="2026-10-21T22:08:00Z" w16du:dateUtc="2026-10-21T21:08:00Z">
         <w:r>
           <w:t>uploaded to</w:t>
         </w:r>
       </w:ins>
-      <w:ins w:id="444" w:author="kyle O'Reilly" w:date="2026-10-21T20:45:00Z" w16du:dateUtc="2026-10-21T19:45:00Z">
+      <w:ins w:id="464" w:author="kyle O'Reilly" w:date="2026-10-21T20:45:00Z" w16du:dateUtc="2026-10-21T19:45:00Z">
         <w:r>
           <w:t xml:space="preserve"> </w:t>
         </w:r>
       </w:ins>
-      <w:ins w:id="445" w:author="kyle O'Reilly" w:date="2026-10-21T20:48:00Z" w16du:dateUtc="2026-10-21T19:48:00Z">
+      <w:ins w:id="465" w:author="kyle O'Reilly" w:date="2026-10-21T20:48:00Z" w16du:dateUtc="2026-10-21T19:48:00Z">
         <w:r>
           <w:t>GitHub</w:t>
         </w:r>
       </w:ins>
-      <w:ins w:id="446" w:author="kyle O'Reilly" w:date="2026-10-21T20:45:00Z" w16du:dateUtc="2026-10-21T19:45:00Z">
+      <w:ins w:id="466" w:author="kyle O'Reilly" w:date="2026-10-21T20:45:00Z" w16du:dateUtc="2026-10-21T19:45:00Z">
         <w:r>
           <w:t xml:space="preserve"> </w:t>
         </w:r>
       </w:ins>
-      <w:ins w:id="447" w:author="kyle O'Reilly" w:date="2026-10-21T22:07:00Z" w16du:dateUtc="2026-10-21T21:07:00Z">
+      <w:ins w:id="467" w:author="kyle O'Reilly" w:date="2026-10-21T22:07:00Z" w16du:dateUtc="2026-10-21T21:07:00Z">
         <w:r>
           <w:t>if permitted by Stooq’s terms of service</w:t>
         </w:r>
       </w:ins>
-      <w:ins w:id="448" w:author="kyle O'Reilly" w:date="2026-10-21T20:45:00Z" w16du:dateUtc="2026-10-21T19:45:00Z">
+      <w:ins w:id="468" w:author="kyle O'Reilly" w:date="2026-10-21T20:45:00Z" w16du:dateUtc="2026-10-21T19:45:00Z">
         <w:r>
           <w:t xml:space="preserve">; otherwise, </w:t>
         </w:r>
       </w:ins>
-      <w:ins w:id="449" w:author="kyle O'Reilly" w:date="2026-10-21T22:07:00Z" w16du:dateUtc="2026-10-21T21:07:00Z">
+      <w:ins w:id="469" w:author="kyle O'Reilly" w:date="2026-10-21T22:07:00Z" w16du:dateUtc="2026-10-21T21:07:00Z">
         <w:r>
           <w:t xml:space="preserve">the </w:t>
         </w:r>
@@ -5217,22 +5260,22 @@
           <w:t>Pyt</w:t>
         </w:r>
       </w:ins>
-      <w:ins w:id="450" w:author="kyle O'Reilly" w:date="2026-10-22T00:14:00Z" w16du:dateUtc="2026-10-21T23:14:00Z">
+      <w:ins w:id="470" w:author="kyle O'Reilly" w:date="2026-10-22T00:14:00Z" w16du:dateUtc="2026-10-21T23:14:00Z">
         <w:r>
           <w:t>h</w:t>
         </w:r>
       </w:ins>
-      <w:ins w:id="451" w:author="kyle O'Reilly" w:date="2026-10-21T22:07:00Z" w16du:dateUtc="2026-10-21T21:07:00Z">
+      <w:ins w:id="471" w:author="kyle O'Reilly" w:date="2026-10-21T22:07:00Z" w16du:dateUtc="2026-10-21T21:07:00Z">
         <w:r>
           <w:t xml:space="preserve">on </w:t>
         </w:r>
       </w:ins>
-      <w:ins w:id="452" w:author="kyle O'Reilly" w:date="2026-10-21T20:45:00Z" w16du:dateUtc="2026-10-21T19:45:00Z">
+      <w:ins w:id="472" w:author="kyle O'Reilly" w:date="2026-10-21T20:45:00Z" w16du:dateUtc="2026-10-21T19:45:00Z">
         <w:r>
           <w:t xml:space="preserve">code and retrieval </w:t>
         </w:r>
       </w:ins>
-      <w:ins w:id="453" w:author="kyle O'Reilly" w:date="2026-10-21T20:46:00Z" w16du:dateUtc="2026-10-21T19:46:00Z">
+      <w:ins w:id="473" w:author="kyle O'Reilly" w:date="2026-10-21T20:46:00Z" w16du:dateUtc="2026-10-21T19:46:00Z">
         <w:r>
           <w:t xml:space="preserve">instructions will be provided. </w:t>
         </w:r>
@@ -5241,10 +5284,10 @@
     <w:p>
       <w:pPr>
         <w:rPr>
-          <w:ins w:id="454" w:author="kyle O'Reilly" w:date="2026-10-22T23:30:00Z" w16du:dateUtc="2026-10-22T22:30:00Z"/>
-        </w:rPr>
-      </w:pPr>
-      <w:ins w:id="455" w:author="kyle O'Reilly" w:date="2026-10-21T22:09:00Z" w16du:dateUtc="2026-10-21T21:09:00Z">
+          <w:ins w:id="474" w:author="kyle O'Reilly" w:date="2026-10-22T23:30:00Z" w16du:dateUtc="2026-10-22T22:30:00Z"/>
+        </w:rPr>
+      </w:pPr>
+      <w:ins w:id="475" w:author="kyle O'Reilly" w:date="2026-10-21T22:09:00Z" w16du:dateUtc="2026-10-21T21:09:00Z">
         <w:r>
           <w:t>All results</w:t>
         </w:r>
@@ -5252,57 +5295,57 @@
           <w:t>,</w:t>
         </w:r>
       </w:ins>
-      <w:ins w:id="456" w:author="kyle O'Reilly" w:date="2026-10-21T20:47:00Z" w16du:dateUtc="2026-10-21T19:47:00Z">
+      <w:ins w:id="476" w:author="kyle O'Reilly" w:date="2026-10-21T20:47:00Z" w16du:dateUtc="2026-10-21T19:47:00Z">
         <w:r>
           <w:t xml:space="preserve"> including </w:t>
         </w:r>
       </w:ins>
-      <w:ins w:id="457" w:author="kyle O'Reilly" w:date="2026-10-21T22:10:00Z" w16du:dateUtc="2026-10-21T21:10:00Z">
+      <w:ins w:id="477" w:author="kyle O'Reilly" w:date="2026-10-21T22:10:00Z" w16du:dateUtc="2026-10-21T21:10:00Z">
         <w:r>
           <w:t>inaccurate</w:t>
         </w:r>
       </w:ins>
-      <w:ins w:id="458" w:author="kyle O'Reilly" w:date="2026-10-21T20:47:00Z" w16du:dateUtc="2026-10-21T19:47:00Z">
+      <w:ins w:id="478" w:author="kyle O'Reilly" w:date="2026-10-21T20:47:00Z" w16du:dateUtc="2026-10-21T19:47:00Z">
         <w:r>
           <w:t xml:space="preserve"> predictions, will be reported transparently. Th</w:t>
         </w:r>
       </w:ins>
-      <w:ins w:id="459" w:author="kyle O'Reilly" w:date="2026-10-21T22:10:00Z" w16du:dateUtc="2026-10-21T21:10:00Z">
+      <w:ins w:id="479" w:author="kyle O'Reilly" w:date="2026-10-21T22:10:00Z" w16du:dateUtc="2026-10-21T21:10:00Z">
         <w:r>
           <w:t>is Capstone Project</w:t>
         </w:r>
       </w:ins>
-      <w:ins w:id="460" w:author="kyle O'Reilly" w:date="2026-10-21T20:47:00Z" w16du:dateUtc="2026-10-21T19:47:00Z">
+      <w:ins w:id="480" w:author="kyle O'Reilly" w:date="2026-10-21T20:47:00Z" w16du:dateUtc="2026-10-21T19:47:00Z">
         <w:r>
           <w:t xml:space="preserve"> work is for academic purposes</w:t>
         </w:r>
       </w:ins>
-      <w:ins w:id="461" w:author="kyle O'Reilly" w:date="2026-10-21T22:10:00Z" w16du:dateUtc="2026-10-21T21:10:00Z">
+      <w:ins w:id="481" w:author="kyle O'Reilly" w:date="2026-10-21T22:10:00Z" w16du:dateUtc="2026-10-21T21:10:00Z">
         <w:r>
           <w:t xml:space="preserve"> only</w:t>
         </w:r>
       </w:ins>
-      <w:ins w:id="462" w:author="kyle O'Reilly" w:date="2026-10-21T20:47:00Z" w16du:dateUtc="2026-10-21T19:47:00Z">
+      <w:ins w:id="482" w:author="kyle O'Reilly" w:date="2026-10-21T20:47:00Z" w16du:dateUtc="2026-10-21T19:47:00Z">
         <w:r>
           <w:t xml:space="preserve"> and does </w:t>
         </w:r>
       </w:ins>
-      <w:ins w:id="463" w:author="kyle O'Reilly" w:date="2026-10-22T00:14:00Z" w16du:dateUtc="2026-10-21T23:14:00Z">
+      <w:ins w:id="483" w:author="kyle O'Reilly" w:date="2026-10-22T00:14:00Z" w16du:dateUtc="2026-10-21T23:14:00Z">
         <w:r>
           <w:t xml:space="preserve">not </w:t>
         </w:r>
       </w:ins>
-      <w:ins w:id="464" w:author="kyle O'Reilly" w:date="2026-10-21T20:47:00Z" w16du:dateUtc="2026-10-21T19:47:00Z">
+      <w:ins w:id="484" w:author="kyle O'Reilly" w:date="2026-10-21T20:47:00Z" w16du:dateUtc="2026-10-21T19:47:00Z">
         <w:r>
           <w:t>constitute financial inv</w:t>
         </w:r>
       </w:ins>
-      <w:ins w:id="465" w:author="kyle O'Reilly" w:date="2026-10-21T20:48:00Z" w16du:dateUtc="2026-10-21T19:48:00Z">
+      <w:ins w:id="485" w:author="kyle O'Reilly" w:date="2026-10-21T20:48:00Z" w16du:dateUtc="2026-10-21T19:48:00Z">
         <w:r>
           <w:t>estment</w:t>
         </w:r>
       </w:ins>
-      <w:ins w:id="466" w:author="kyle O'Reilly" w:date="2026-10-21T20:47:00Z" w16du:dateUtc="2026-10-21T19:47:00Z">
+      <w:ins w:id="486" w:author="kyle O'Reilly" w:date="2026-10-21T20:47:00Z" w16du:dateUtc="2026-10-21T19:47:00Z">
         <w:r>
           <w:t xml:space="preserve"> advice.</w:t>
         </w:r>
@@ -5312,19 +5355,19 @@
       <w:pPr>
         <w:pStyle w:val="Heading1"/>
         <w:rPr>
-          <w:ins w:id="467" w:author="kyle O'Reilly" w:date="2026-10-21T23:38:00Z" w16du:dateUtc="2026-10-21T22:38:00Z"/>
-        </w:rPr>
-        <w:pPrChange w:id="468" w:author="kyle O'Reilly" w:date="2026-10-22T23:30:00Z" w16du:dateUtc="2026-10-22T22:30:00Z">
+          <w:ins w:id="487" w:author="kyle O'Reilly" w:date="2026-10-21T23:38:00Z" w16du:dateUtc="2026-10-21T22:38:00Z"/>
+        </w:rPr>
+        <w:pPrChange w:id="488" w:author="kyle O'Reilly" w:date="2026-10-22T23:30:00Z" w16du:dateUtc="2026-10-22T22:30:00Z">
           <w:pPr/>
         </w:pPrChange>
       </w:pPr>
-      <w:bookmarkStart w:id="469" w:name="_Toc243604272"/>
-      <w:ins w:id="470" w:author="kyle O'Reilly" w:date="2026-10-21T20:42:00Z" w16du:dateUtc="2026-10-21T19:42:00Z">
+      <w:bookmarkStart w:id="489" w:name="_Toc243604272"/>
+      <w:ins w:id="490" w:author="kyle O'Reilly" w:date="2026-10-21T20:42:00Z" w16du:dateUtc="2026-10-21T19:42:00Z">
         <w:r>
           <w:lastRenderedPageBreak/>
           <w:t>References</w:t>
         </w:r>
-        <w:bookmarkEnd w:id="469"/>
+        <w:bookmarkEnd w:id="489"/>
         <w:r>
           <w:t xml:space="preserve"> </w:t>
         </w:r>
@@ -5333,10 +5376,10 @@
     <w:p>
       <w:pPr>
         <w:rPr>
-          <w:ins w:id="471" w:author="kyle O'Reilly" w:date="2026-10-22T22:46:00Z" w16du:dateUtc="2026-10-22T21:46:00Z"/>
-        </w:rPr>
-      </w:pPr>
-      <w:ins w:id="472" w:author="kyle O'Reilly" w:date="2026-10-22T22:46:00Z" w16du:dateUtc="2026-10-22T21:46:00Z">
+          <w:ins w:id="491" w:author="kyle O'Reilly" w:date="2026-10-22T22:46:00Z" w16du:dateUtc="2026-10-22T21:46:00Z"/>
+        </w:rPr>
+      </w:pPr>
+      <w:ins w:id="492" w:author="kyle O'Reilly" w:date="2026-10-22T22:46:00Z" w16du:dateUtc="2026-10-22T21:46:00Z">
         <w:r>
           <w:t>Section 2</w:t>
         </w:r>
@@ -5345,25 +5388,25 @@
     <w:p>
       <w:pPr>
         <w:rPr>
-          <w:ins w:id="473" w:author="kyle O'Reilly" w:date="2026-10-22T22:59:00Z" w16du:dateUtc="2026-10-22T21:59:00Z"/>
-        </w:rPr>
-      </w:pPr>
-      <w:ins w:id="474" w:author="kyle O'Reilly" w:date="2026-10-22T22:58:00Z" w16du:dateUtc="2026-10-22T21:58:00Z">
+          <w:ins w:id="493" w:author="kyle O'Reilly" w:date="2026-10-22T22:59:00Z" w16du:dateUtc="2026-10-22T21:59:00Z"/>
+        </w:rPr>
+      </w:pPr>
+      <w:ins w:id="494" w:author="kyle O'Reilly" w:date="2026-10-22T22:58:00Z" w16du:dateUtc="2026-10-22T21:58:00Z">
         <w:r>
           <w:rPr>
             <w:highlight w:val="red"/>
-            <w:rPrChange w:id="475" w:author="kyle O'Reilly" w:date="2026-10-22T22:59:00Z" w16du:dateUtc="2026-10-22T21:59:00Z">
+            <w:rPrChange w:id="495" w:author="kyle O'Reilly" w:date="2026-10-22T22:59:00Z" w16du:dateUtc="2026-10-22T21:59:00Z">
               <w:rPr/>
             </w:rPrChange>
           </w:rPr>
           <w:t>Need to do refer</w:t>
         </w:r>
       </w:ins>
-      <w:ins w:id="476" w:author="kyle O'Reilly" w:date="2026-10-22T22:59:00Z" w16du:dateUtc="2026-10-22T21:59:00Z">
+      <w:ins w:id="496" w:author="kyle O'Reilly" w:date="2026-10-22T22:59:00Z" w16du:dateUtc="2026-10-22T21:59:00Z">
         <w:r>
           <w:rPr>
             <w:highlight w:val="red"/>
-            <w:rPrChange w:id="477" w:author="kyle O'Reilly" w:date="2026-10-22T22:59:00Z" w16du:dateUtc="2026-10-22T21:59:00Z">
+            <w:rPrChange w:id="497" w:author="kyle O'Reilly" w:date="2026-10-22T22:59:00Z" w16du:dateUtc="2026-10-22T21:59:00Z">
               <w:rPr/>
             </w:rPrChange>
           </w:rPr>
@@ -5377,17 +5420,17 @@
     <w:p>
       <w:pPr>
         <w:rPr>
-          <w:ins w:id="478" w:author="kyle O'Reilly" w:date="2026-10-22T22:46:00Z" w16du:dateUtc="2026-10-22T21:46:00Z"/>
-        </w:rPr>
-      </w:pPr>
-    </w:p>
-    <w:p>
-      <w:pPr>
-        <w:rPr>
-          <w:ins w:id="479" w:author="kyle O'Reilly" w:date="2026-10-22T19:06:00Z" w16du:dateUtc="2026-10-22T18:06:00Z"/>
-        </w:rPr>
-      </w:pPr>
-      <w:ins w:id="480" w:author="kyle O'Reilly" w:date="2026-10-22T19:06:00Z" w16du:dateUtc="2026-10-22T18:06:00Z">
+          <w:ins w:id="498" w:author="kyle O'Reilly" w:date="2026-10-22T22:46:00Z" w16du:dateUtc="2026-10-22T21:46:00Z"/>
+        </w:rPr>
+      </w:pPr>
+    </w:p>
+    <w:p>
+      <w:pPr>
+        <w:rPr>
+          <w:ins w:id="499" w:author="kyle O'Reilly" w:date="2026-10-22T19:06:00Z" w16du:dateUtc="2026-10-22T18:06:00Z"/>
+        </w:rPr>
+      </w:pPr>
+      <w:ins w:id="500" w:author="kyle O'Reilly" w:date="2026-10-22T19:06:00Z" w16du:dateUtc="2026-10-22T18:06:00Z">
         <w:r>
           <w:t>Section 5</w:t>
         </w:r>
@@ -5396,20 +5439,20 @@
     <w:p>
       <w:pPr>
         <w:rPr>
-          <w:ins w:id="481" w:author="kyle O'Reilly" w:date="2026-10-22T19:08:00Z" w16du:dateUtc="2026-10-22T18:08:00Z"/>
-        </w:rPr>
-      </w:pPr>
-      <w:ins w:id="482" w:author="kyle O'Reilly" w:date="2026-10-22T19:06:00Z" w16du:dateUtc="2026-10-22T18:06:00Z">
+          <w:ins w:id="501" w:author="kyle O'Reilly" w:date="2026-10-22T19:08:00Z" w16du:dateUtc="2026-10-22T18:08:00Z"/>
+        </w:rPr>
+      </w:pPr>
+      <w:ins w:id="502" w:author="kyle O'Reilly" w:date="2026-10-22T19:06:00Z" w16du:dateUtc="2026-10-22T18:06:00Z">
         <w:r>
           <w:t>Tra</w:t>
         </w:r>
       </w:ins>
-      <w:ins w:id="483" w:author="kyle O'Reilly" w:date="2026-10-22T19:07:00Z" w16du:dateUtc="2026-10-22T18:07:00Z">
+      <w:ins w:id="503" w:author="kyle O'Reilly" w:date="2026-10-22T19:07:00Z" w16du:dateUtc="2026-10-22T18:07:00Z">
         <w:r>
           <w:t xml:space="preserve">ding 212 (n.d.) Trading 212 investment platform. Available at: </w:t>
         </w:r>
       </w:ins>
-      <w:ins w:id="484" w:author="kyle O'Reilly" w:date="2026-10-22T19:08:00Z" w16du:dateUtc="2026-10-22T18:08:00Z">
+      <w:ins w:id="504" w:author="kyle O'Reilly" w:date="2026-10-22T19:08:00Z" w16du:dateUtc="2026-10-22T18:08:00Z">
         <w:r>
           <w:fldChar w:fldCharType="begin"/>
         </w:r>
@@ -5417,12 +5460,12 @@
           <w:instrText>HYPERLINK "</w:instrText>
         </w:r>
       </w:ins>
-      <w:ins w:id="485" w:author="kyle O'Reilly" w:date="2026-10-22T19:07:00Z" w16du:dateUtc="2026-10-22T18:07:00Z">
+      <w:ins w:id="505" w:author="kyle O'Reilly" w:date="2026-10-22T19:07:00Z" w16du:dateUtc="2026-10-22T18:07:00Z">
         <w:r>
           <w:instrText>https://www.trading212.com/</w:instrText>
         </w:r>
       </w:ins>
-      <w:ins w:id="486" w:author="kyle O'Reilly" w:date="2026-10-22T19:08:00Z" w16du:dateUtc="2026-10-22T18:08:00Z">
+      <w:ins w:id="506" w:author="kyle O'Reilly" w:date="2026-10-22T19:08:00Z" w16du:dateUtc="2026-10-22T18:08:00Z">
         <w:r>
           <w:instrText>"</w:instrText>
         </w:r>
@@ -5430,7 +5473,7 @@
           <w:fldChar w:fldCharType="separate"/>
         </w:r>
       </w:ins>
-      <w:ins w:id="487" w:author="kyle O'Reilly" w:date="2026-10-22T19:07:00Z" w16du:dateUtc="2026-10-22T18:07:00Z">
+      <w:ins w:id="507" w:author="kyle O'Reilly" w:date="2026-10-22T19:07:00Z" w16du:dateUtc="2026-10-22T18:07:00Z">
         <w:r>
           <w:rPr>
             <w:rStyle w:val="Hyperlink"/>
@@ -5438,7 +5481,7 @@
           <w:t>https://www.trading212.com/</w:t>
         </w:r>
       </w:ins>
-      <w:ins w:id="488" w:author="kyle O'Reilly" w:date="2026-10-22T19:08:00Z" w16du:dateUtc="2026-10-22T18:08:00Z">
+      <w:ins w:id="508" w:author="kyle O'Reilly" w:date="2026-10-22T19:08:00Z" w16du:dateUtc="2026-10-22T18:08:00Z">
         <w:r>
           <w:fldChar w:fldCharType="end"/>
         </w:r>
@@ -5446,7 +5489,7 @@
           <w:t xml:space="preserve"> </w:t>
         </w:r>
       </w:ins>
-      <w:ins w:id="489" w:author="kyle O'Reilly" w:date="2026-10-22T19:07:00Z" w16du:dateUtc="2026-10-22T18:07:00Z">
+      <w:ins w:id="509" w:author="kyle O'Reilly" w:date="2026-10-22T19:07:00Z" w16du:dateUtc="2026-10-22T18:07:00Z">
         <w:r>
           <w:t>(Accessed: 22 October 2026).</w:t>
         </w:r>
@@ -5455,17 +5498,17 @@
     <w:p>
       <w:pPr>
         <w:rPr>
-          <w:ins w:id="490" w:author="kyle O'Reilly" w:date="2026-10-22T19:06:00Z" w16du:dateUtc="2026-10-22T18:06:00Z"/>
-        </w:rPr>
-      </w:pPr>
-    </w:p>
-    <w:p>
-      <w:pPr>
-        <w:rPr>
-          <w:ins w:id="491" w:author="kyle O'Reilly" w:date="2026-10-21T23:38:00Z" w16du:dateUtc="2026-10-21T22:38:00Z"/>
-        </w:rPr>
-      </w:pPr>
-      <w:ins w:id="492" w:author="kyle O'Reilly" w:date="2026-10-21T23:38:00Z" w16du:dateUtc="2026-10-21T22:38:00Z">
+          <w:ins w:id="510" w:author="kyle O'Reilly" w:date="2026-10-22T19:06:00Z" w16du:dateUtc="2026-10-22T18:06:00Z"/>
+        </w:rPr>
+      </w:pPr>
+    </w:p>
+    <w:p>
+      <w:pPr>
+        <w:rPr>
+          <w:ins w:id="511" w:author="kyle O'Reilly" w:date="2026-10-21T23:38:00Z" w16du:dateUtc="2026-10-21T22:38:00Z"/>
+        </w:rPr>
+      </w:pPr>
+      <w:ins w:id="512" w:author="kyle O'Reilly" w:date="2026-10-21T23:38:00Z" w16du:dateUtc="2026-10-21T22:38:00Z">
         <w:r>
           <w:t xml:space="preserve">Section 7 </w:t>
         </w:r>
@@ -5474,25 +5517,25 @@
     <w:p>
       <w:pPr>
         <w:rPr>
-          <w:ins w:id="493" w:author="kyle O'Reilly" w:date="2026-10-21T23:48:00Z" w16du:dateUtc="2026-10-21T22:48:00Z"/>
-        </w:rPr>
-      </w:pPr>
-      <w:ins w:id="494" w:author="kyle O'Reilly" w:date="2026-10-21T23:50:00Z" w16du:dateUtc="2026-10-21T22:50:00Z">
+          <w:ins w:id="513" w:author="kyle O'Reilly" w:date="2026-10-21T23:48:00Z" w16du:dateUtc="2026-10-21T22:48:00Z"/>
+        </w:rPr>
+      </w:pPr>
+      <w:ins w:id="514" w:author="kyle O'Reilly" w:date="2026-10-21T23:50:00Z" w16du:dateUtc="2026-10-21T22:50:00Z">
         <w:r>
           <w:t>Trading 212</w:t>
         </w:r>
       </w:ins>
-      <w:ins w:id="495" w:author="kyle O'Reilly" w:date="2026-10-21T23:52:00Z" w16du:dateUtc="2026-10-21T22:52:00Z">
+      <w:ins w:id="515" w:author="kyle O'Reilly" w:date="2026-10-21T23:52:00Z" w16du:dateUtc="2026-10-21T22:52:00Z">
         <w:r>
           <w:t xml:space="preserve"> </w:t>
         </w:r>
       </w:ins>
-      <w:ins w:id="496" w:author="kyle O'Reilly" w:date="2026-10-21T23:50:00Z" w16du:dateUtc="2026-10-21T22:50:00Z">
+      <w:ins w:id="516" w:author="kyle O'Reilly" w:date="2026-10-21T23:50:00Z" w16du:dateUtc="2026-10-21T22:50:00Z">
         <w:r>
           <w:t>(n.d.) Trading 212 investment platform. Available at:</w:t>
         </w:r>
       </w:ins>
-      <w:ins w:id="497" w:author="kyle O'Reilly" w:date="2026-10-21T23:51:00Z" w16du:dateUtc="2026-10-21T22:51:00Z">
+      <w:ins w:id="517" w:author="kyle O'Reilly" w:date="2026-10-21T23:51:00Z" w16du:dateUtc="2026-10-21T22:51:00Z">
         <w:r>
           <w:t xml:space="preserve"> </w:t>
         </w:r>
@@ -5524,12 +5567,12 @@
           <w:t xml:space="preserve">  (</w:t>
         </w:r>
       </w:ins>
-      <w:ins w:id="498" w:author="kyle O'Reilly" w:date="2026-10-21T23:50:00Z" w16du:dateUtc="2026-10-21T22:50:00Z">
+      <w:ins w:id="518" w:author="kyle O'Reilly" w:date="2026-10-21T23:50:00Z" w16du:dateUtc="2026-10-21T22:50:00Z">
         <w:r>
           <w:t>Accessed: 2</w:t>
         </w:r>
       </w:ins>
-      <w:ins w:id="499" w:author="kyle O'Reilly" w:date="2026-10-21T23:51:00Z" w16du:dateUtc="2026-10-21T22:51:00Z">
+      <w:ins w:id="519" w:author="kyle O'Reilly" w:date="2026-10-21T23:51:00Z" w16du:dateUtc="2026-10-21T22:51:00Z">
         <w:r>
           <w:t>1 October 2026).</w:t>
         </w:r>
@@ -5538,10 +5581,10 @@
     <w:p>
       <w:pPr>
         <w:rPr>
-          <w:ins w:id="500" w:author="kyle O'Reilly" w:date="2026-10-21T23:53:00Z" w16du:dateUtc="2026-10-21T22:53:00Z"/>
-        </w:rPr>
-      </w:pPr>
-      <w:ins w:id="501" w:author="kyle O'Reilly" w:date="2026-10-21T23:52:00Z" w16du:dateUtc="2026-10-21T22:52:00Z">
+          <w:ins w:id="520" w:author="kyle O'Reilly" w:date="2026-10-21T23:53:00Z" w16du:dateUtc="2026-10-21T22:53:00Z"/>
+        </w:rPr>
+      </w:pPr>
+      <w:ins w:id="521" w:author="kyle O'Reilly" w:date="2026-10-21T23:52:00Z" w16du:dateUtc="2026-10-21T22:52:00Z">
         <w:r>
           <w:t xml:space="preserve">Stooq (n.d.a) </w:t>
         </w:r>
@@ -5549,12 +5592,12 @@
           <w:t>JPMorgan Chase &amp; Co. (JPM.</w:t>
         </w:r>
       </w:ins>
-      <w:ins w:id="502" w:author="kyle O'Reilly" w:date="2026-10-21T23:53:00Z" w16du:dateUtc="2026-10-21T22:53:00Z">
+      <w:ins w:id="522" w:author="kyle O'Reilly" w:date="2026-10-21T23:53:00Z" w16du:dateUtc="2026-10-21T22:53:00Z">
         <w:r>
           <w:t>US) – Historical data. Available at:</w:t>
         </w:r>
       </w:ins>
-      <w:ins w:id="503" w:author="kyle O'Reilly" w:date="2026-10-21T23:57:00Z" w16du:dateUtc="2026-10-21T22:57:00Z">
+      <w:ins w:id="523" w:author="kyle O'Reilly" w:date="2026-10-21T23:57:00Z" w16du:dateUtc="2026-10-21T22:57:00Z">
         <w:r>
           <w:t xml:space="preserve"> </w:t>
         </w:r>
@@ -5566,7 +5609,7 @@
         </w:r>
         <w:r>
           <w:rPr>
-            <w:rPrChange w:id="504" w:author="kyle O'Reilly" w:date="2026-10-21T23:57:00Z" w16du:dateUtc="2026-10-21T22:57:00Z">
+            <w:rPrChange w:id="524" w:author="kyle O'Reilly" w:date="2026-10-21T23:57:00Z" w16du:dateUtc="2026-10-21T22:57:00Z">
               <w:rPr>
                 <w:rStyle w:val="Hyperlink"/>
               </w:rPr>
@@ -5593,7 +5636,7 @@
           <w:t xml:space="preserve"> </w:t>
         </w:r>
       </w:ins>
-      <w:ins w:id="505" w:author="kyle O'Reilly" w:date="2026-10-21T23:53:00Z" w16du:dateUtc="2026-10-21T22:53:00Z">
+      <w:ins w:id="525" w:author="kyle O'Reilly" w:date="2026-10-21T23:53:00Z" w16du:dateUtc="2026-10-21T22:53:00Z">
         <w:r>
           <w:t>(Accessed</w:t>
         </w:r>
@@ -5601,12 +5644,12 @@
           <w:t xml:space="preserve">: 21 </w:t>
         </w:r>
       </w:ins>
-      <w:ins w:id="506" w:author="kyle O'Reilly" w:date="2026-10-21T23:55:00Z" w16du:dateUtc="2026-10-21T22:55:00Z">
+      <w:ins w:id="526" w:author="kyle O'Reilly" w:date="2026-10-21T23:55:00Z" w16du:dateUtc="2026-10-21T22:55:00Z">
         <w:r>
           <w:t>October</w:t>
         </w:r>
       </w:ins>
-      <w:ins w:id="507" w:author="kyle O'Reilly" w:date="2026-10-21T23:53:00Z" w16du:dateUtc="2026-10-21T22:53:00Z">
+      <w:ins w:id="527" w:author="kyle O'Reilly" w:date="2026-10-21T23:53:00Z" w16du:dateUtc="2026-10-21T22:53:00Z">
         <w:r>
           <w:t xml:space="preserve"> 2026).</w:t>
         </w:r>
@@ -5615,45 +5658,45 @@
     <w:p>
       <w:pPr>
         <w:rPr>
-          <w:ins w:id="508" w:author="kyle O'Reilly" w:date="2026-10-21T23:54:00Z" w16du:dateUtc="2026-10-21T22:54:00Z"/>
-        </w:rPr>
-      </w:pPr>
-      <w:ins w:id="509" w:author="kyle O'Reilly" w:date="2026-10-21T23:53:00Z" w16du:dateUtc="2026-10-21T22:53:00Z">
+          <w:ins w:id="528" w:author="kyle O'Reilly" w:date="2026-10-21T23:54:00Z" w16du:dateUtc="2026-10-21T22:54:00Z"/>
+        </w:rPr>
+      </w:pPr>
+      <w:ins w:id="529" w:author="kyle O'Reilly" w:date="2026-10-21T23:53:00Z" w16du:dateUtc="2026-10-21T22:53:00Z">
         <w:r>
           <w:t xml:space="preserve">Stooq (n.d.b) Coca-Cola </w:t>
         </w:r>
       </w:ins>
-      <w:ins w:id="510" w:author="kyle O'Reilly" w:date="2026-10-21T23:54:00Z" w16du:dateUtc="2026-10-21T22:54:00Z">
+      <w:ins w:id="530" w:author="kyle O'Reilly" w:date="2026-10-21T23:54:00Z" w16du:dateUtc="2026-10-21T22:54:00Z">
         <w:r>
           <w:t>Co</w:t>
         </w:r>
       </w:ins>
-      <w:ins w:id="511" w:author="kyle O'Reilly" w:date="2026-10-22T00:04:00Z" w16du:dateUtc="2026-10-21T23:04:00Z">
+      <w:ins w:id="531" w:author="kyle O'Reilly" w:date="2026-10-22T00:04:00Z" w16du:dateUtc="2026-10-21T23:04:00Z">
         <w:r>
           <w:t>.</w:t>
         </w:r>
       </w:ins>
-      <w:ins w:id="512" w:author="kyle O'Reilly" w:date="2026-10-21T23:54:00Z" w16du:dateUtc="2026-10-21T22:54:00Z">
+      <w:ins w:id="532" w:author="kyle O'Reilly" w:date="2026-10-21T23:54:00Z" w16du:dateUtc="2026-10-21T22:54:00Z">
         <w:r>
           <w:t xml:space="preserve"> </w:t>
         </w:r>
       </w:ins>
-      <w:ins w:id="513" w:author="kyle O'Reilly" w:date="2026-10-21T23:53:00Z" w16du:dateUtc="2026-10-21T22:53:00Z">
+      <w:ins w:id="533" w:author="kyle O'Reilly" w:date="2026-10-21T23:53:00Z" w16du:dateUtc="2026-10-21T22:53:00Z">
         <w:r>
           <w:t>(KO.U</w:t>
         </w:r>
       </w:ins>
-      <w:ins w:id="514" w:author="kyle O'Reilly" w:date="2026-10-21T23:54:00Z" w16du:dateUtc="2026-10-21T22:54:00Z">
+      <w:ins w:id="534" w:author="kyle O'Reilly" w:date="2026-10-21T23:54:00Z" w16du:dateUtc="2026-10-21T22:54:00Z">
         <w:r>
           <w:t>S)</w:t>
         </w:r>
       </w:ins>
-      <w:ins w:id="515" w:author="kyle O'Reilly" w:date="2026-10-21T23:55:00Z" w16du:dateUtc="2026-10-21T22:55:00Z">
+      <w:ins w:id="535" w:author="kyle O'Reilly" w:date="2026-10-21T23:55:00Z" w16du:dateUtc="2026-10-21T22:55:00Z">
         <w:r>
           <w:t xml:space="preserve"> – Historical data. Available at:</w:t>
         </w:r>
       </w:ins>
-      <w:ins w:id="516" w:author="kyle O'Reilly" w:date="2026-10-21T23:56:00Z" w16du:dateUtc="2026-10-21T22:56:00Z">
+      <w:ins w:id="536" w:author="kyle O'Reilly" w:date="2026-10-21T23:56:00Z" w16du:dateUtc="2026-10-21T22:56:00Z">
         <w:r>
           <w:t xml:space="preserve"> </w:t>
         </w:r>
@@ -5685,7 +5728,7 @@
           <w:t xml:space="preserve"> </w:t>
         </w:r>
       </w:ins>
-      <w:ins w:id="517" w:author="kyle O'Reilly" w:date="2026-10-21T23:55:00Z" w16du:dateUtc="2026-10-21T22:55:00Z">
+      <w:ins w:id="537" w:author="kyle O'Reilly" w:date="2026-10-21T23:55:00Z" w16du:dateUtc="2026-10-21T22:55:00Z">
         <w:r>
           <w:t>(Accessed: 21 October 2026).</w:t>
         </w:r>
@@ -5694,25 +5737,25 @@
     <w:p>
       <w:pPr>
         <w:rPr>
-          <w:ins w:id="518" w:author="kyle O'Reilly" w:date="2026-10-21T23:49:00Z" w16du:dateUtc="2026-10-21T22:49:00Z"/>
-        </w:rPr>
-      </w:pPr>
-      <w:ins w:id="519" w:author="kyle O'Reilly" w:date="2026-10-21T23:54:00Z" w16du:dateUtc="2026-10-21T22:54:00Z">
+          <w:ins w:id="538" w:author="kyle O'Reilly" w:date="2026-10-21T23:49:00Z" w16du:dateUtc="2026-10-21T22:49:00Z"/>
+        </w:rPr>
+      </w:pPr>
+      <w:ins w:id="539" w:author="kyle O'Reilly" w:date="2026-10-21T23:54:00Z" w16du:dateUtc="2026-10-21T22:54:00Z">
         <w:r>
           <w:t xml:space="preserve">Stooq (n.d.c) Intel </w:t>
         </w:r>
       </w:ins>
-      <w:ins w:id="520" w:author="kyle O'Reilly" w:date="2026-10-22T00:04:00Z" w16du:dateUtc="2026-10-21T23:04:00Z">
+      <w:ins w:id="540" w:author="kyle O'Reilly" w:date="2026-10-22T00:04:00Z" w16du:dateUtc="2026-10-21T23:04:00Z">
         <w:r>
           <w:t xml:space="preserve">Corp. </w:t>
         </w:r>
       </w:ins>
-      <w:ins w:id="521" w:author="kyle O'Reilly" w:date="2026-10-21T23:54:00Z" w16du:dateUtc="2026-10-21T22:54:00Z">
+      <w:ins w:id="541" w:author="kyle O'Reilly" w:date="2026-10-21T23:54:00Z" w16du:dateUtc="2026-10-21T22:54:00Z">
         <w:r>
           <w:t>(INTC.US)</w:t>
         </w:r>
       </w:ins>
-      <w:ins w:id="522" w:author="kyle O'Reilly" w:date="2026-10-21T23:55:00Z" w16du:dateUtc="2026-10-21T22:55:00Z">
+      <w:ins w:id="542" w:author="kyle O'Reilly" w:date="2026-10-21T23:55:00Z" w16du:dateUtc="2026-10-21T22:55:00Z">
         <w:r>
           <w:t xml:space="preserve"> – Historical data. Available at</w:t>
         </w:r>
@@ -5720,7 +5763,7 @@
           <w:t>:</w:t>
         </w:r>
       </w:ins>
-      <w:ins w:id="523" w:author="kyle O'Reilly" w:date="2026-10-21T23:56:00Z" w16du:dateUtc="2026-10-21T22:56:00Z">
+      <w:ins w:id="543" w:author="kyle O'Reilly" w:date="2026-10-21T23:56:00Z" w16du:dateUtc="2026-10-21T22:56:00Z">
         <w:r>
           <w:t xml:space="preserve"> </w:t>
         </w:r>
@@ -5752,7 +5795,7 @@
           <w:t xml:space="preserve"> </w:t>
         </w:r>
       </w:ins>
-      <w:ins w:id="524" w:author="kyle O'Reilly" w:date="2026-10-21T23:55:00Z" w16du:dateUtc="2026-10-21T22:55:00Z">
+      <w:ins w:id="544" w:author="kyle O'Reilly" w:date="2026-10-21T23:55:00Z" w16du:dateUtc="2026-10-21T22:55:00Z">
         <w:r>
           <w:t xml:space="preserve"> </w:t>
         </w:r>
@@ -5760,12 +5803,12 @@
           <w:t xml:space="preserve">(Accessed: 21 </w:t>
         </w:r>
       </w:ins>
-      <w:ins w:id="525" w:author="kyle O'Reilly" w:date="2026-10-22T00:14:00Z" w16du:dateUtc="2026-10-21T23:14:00Z">
+      <w:ins w:id="545" w:author="kyle O'Reilly" w:date="2026-10-22T00:14:00Z" w16du:dateUtc="2026-10-21T23:14:00Z">
         <w:r>
           <w:t>October</w:t>
         </w:r>
       </w:ins>
-      <w:ins w:id="526" w:author="kyle O'Reilly" w:date="2026-10-21T23:55:00Z" w16du:dateUtc="2026-10-21T22:55:00Z">
+      <w:ins w:id="546" w:author="kyle O'Reilly" w:date="2026-10-21T23:55:00Z" w16du:dateUtc="2026-10-21T22:55:00Z">
         <w:r>
           <w:t xml:space="preserve"> 2026).</w:t>
         </w:r>
@@ -5774,14 +5817,14 @@
     <w:p>
       <w:pPr>
         <w:rPr>
-          <w:ins w:id="527" w:author="kyle O'Reilly" w:date="2026-10-21T23:49:00Z" w16du:dateUtc="2026-10-21T22:49:00Z"/>
-        </w:rPr>
-      </w:pPr>
-    </w:p>
-    <w:p>
-      <w:pPr>
-        <w:rPr>
-          <w:ins w:id="528" w:author="kyle O'Reilly" w:date="2026-10-21T23:49:00Z" w16du:dateUtc="2026-10-21T22:49:00Z"/>
+          <w:ins w:id="547" w:author="kyle O'Reilly" w:date="2026-10-21T23:49:00Z" w16du:dateUtc="2026-10-21T22:49:00Z"/>
+        </w:rPr>
+      </w:pPr>
+    </w:p>
+    <w:p>
+      <w:pPr>
+        <w:rPr>
+          <w:ins w:id="548" w:author="kyle O'Reilly" w:date="2026-10-21T23:49:00Z" w16du:dateUtc="2026-10-21T22:49:00Z"/>
         </w:rPr>
       </w:pPr>
     </w:p>
@@ -5791,7 +5834,7 @@
           <w:tab w:val="left" w:pos="1055"/>
         </w:tabs>
         <w:rPr>
-          <w:ins w:id="529" w:author="kyle O'Reilly" w:date="2026-10-22T18:11:00Z" w16du:dateUtc="2026-10-22T17:11:00Z"/>
+          <w:ins w:id="549" w:author="kyle O'Reilly" w:date="2026-10-22T18:11:00Z" w16du:dateUtc="2026-10-22T17:11:00Z"/>
         </w:rPr>
       </w:pPr>
     </w:p>
@@ -5801,9 +5844,9 @@
           <w:tab w:val="left" w:pos="1055"/>
         </w:tabs>
         <w:rPr>
-          <w:ins w:id="530" w:author="kyle O'Reilly" w:date="2026-10-21T23:49:00Z" w16du:dateUtc="2026-10-21T22:49:00Z"/>
-        </w:rPr>
-        <w:pPrChange w:id="531" w:author="kyle O'Reilly" w:date="2026-10-22T18:11:00Z" w16du:dateUtc="2026-10-22T17:11:00Z">
+          <w:ins w:id="550" w:author="kyle O'Reilly" w:date="2026-10-21T23:49:00Z" w16du:dateUtc="2026-10-21T22:49:00Z"/>
+        </w:rPr>
+        <w:pPrChange w:id="551" w:author="kyle O'Reilly" w:date="2026-10-22T18:11:00Z" w16du:dateUtc="2026-10-22T17:11:00Z">
           <w:pPr/>
         </w:pPrChange>
       </w:pPr>
@@ -5811,7 +5854,7 @@
     <w:p>
       <w:pPr>
         <w:rPr>
-          <w:ins w:id="532" w:author="kyle O'Reilly" w:date="2026-10-22T00:15:00Z" w16du:dateUtc="2026-10-21T23:15:00Z"/>
+          <w:ins w:id="552" w:author="kyle O'Reilly" w:date="2026-10-22T00:15:00Z" w16du:dateUtc="2026-10-21T23:15:00Z"/>
           <w:sz w:val="96"/>
           <w:szCs w:val="96"/>
         </w:rPr>
@@ -5820,7 +5863,7 @@
     <w:p>
       <w:pPr>
         <w:rPr>
-          <w:ins w:id="533" w:author="kyle O'Reilly" w:date="2026-10-22T21:22:00Z" w16du:dateUtc="2026-10-22T20:22:00Z"/>
+          <w:ins w:id="553" w:author="kyle O'Reilly" w:date="2026-10-22T21:22:00Z" w16du:dateUtc="2026-10-22T20:22:00Z"/>
           <w:sz w:val="96"/>
           <w:szCs w:val="96"/>
         </w:rPr>
@@ -5829,7 +5872,7 @@
     <w:p>
       <w:pPr>
         <w:rPr>
-          <w:ins w:id="534" w:author="kyle O'Reilly" w:date="2026-10-22T21:22:00Z" w16du:dateUtc="2026-10-22T20:22:00Z"/>
+          <w:ins w:id="554" w:author="kyle O'Reilly" w:date="2026-10-22T21:22:00Z" w16du:dateUtc="2026-10-22T20:22:00Z"/>
           <w:sz w:val="96"/>
           <w:szCs w:val="96"/>
         </w:rPr>
@@ -5838,7 +5881,7 @@
     <w:p>
       <w:pPr>
         <w:rPr>
-          <w:ins w:id="535" w:author="kyle O'Reilly" w:date="2026-10-22T23:30:00Z" w16du:dateUtc="2026-10-22T22:30:00Z"/>
+          <w:ins w:id="555" w:author="kyle O'Reilly" w:date="2026-10-22T23:30:00Z" w16du:dateUtc="2026-10-22T22:30:00Z"/>
           <w:sz w:val="96"/>
           <w:szCs w:val="96"/>
         </w:rPr>
@@ -5847,12 +5890,12 @@
     <w:p>
       <w:pPr>
         <w:rPr>
-          <w:ins w:id="536" w:author="kyle O'Reilly" w:date="2026-10-21T23:49:00Z" w16du:dateUtc="2026-10-21T22:49:00Z"/>
+          <w:ins w:id="556" w:author="kyle O'Reilly" w:date="2026-10-21T23:49:00Z" w16du:dateUtc="2026-10-21T22:49:00Z"/>
           <w:sz w:val="96"/>
           <w:szCs w:val="96"/>
-          <w:rPrChange w:id="537" w:author="kyle O'Reilly" w:date="2026-10-21T23:49:00Z" w16du:dateUtc="2026-10-21T22:49:00Z">
+          <w:rPrChange w:id="557" w:author="kyle O'Reilly" w:date="2026-10-21T23:49:00Z" w16du:dateUtc="2026-10-21T22:49:00Z">
             <w:rPr>
-              <w:ins w:id="538" w:author="kyle O'Reilly" w:date="2026-10-21T23:49:00Z" w16du:dateUtc="2026-10-21T22:49:00Z"/>
+              <w:ins w:id="558" w:author="kyle O'Reilly" w:date="2026-10-21T23:49:00Z" w16du:dateUtc="2026-10-21T22:49:00Z"/>
             </w:rPr>
           </w:rPrChange>
         </w:rPr>
@@ -5864,20 +5907,20 @@
         <w:rPr>
           <w:sz w:val="96"/>
           <w:szCs w:val="96"/>
-          <w:rPrChange w:id="539" w:author="kyle O'Reilly" w:date="2026-10-21T23:49:00Z" w16du:dateUtc="2026-10-21T22:49:00Z">
+          <w:rPrChange w:id="559" w:author="kyle O'Reilly" w:date="2026-10-21T23:49:00Z" w16du:dateUtc="2026-10-21T22:49:00Z">
             <w:rPr/>
           </w:rPrChange>
         </w:rPr>
-        <w:pPrChange w:id="540" w:author="kyle O'Reilly" w:date="2026-10-21T23:49:00Z" w16du:dateUtc="2026-10-21T22:49:00Z">
+        <w:pPrChange w:id="560" w:author="kyle O'Reilly" w:date="2026-10-21T23:49:00Z" w16du:dateUtc="2026-10-21T22:49:00Z">
           <w:pPr/>
         </w:pPrChange>
       </w:pPr>
-      <w:ins w:id="541" w:author="kyle O'Reilly" w:date="2026-10-21T23:49:00Z" w16du:dateUtc="2026-10-21T22:49:00Z">
+      <w:ins w:id="561" w:author="kyle O'Reilly" w:date="2026-10-21T23:49:00Z" w16du:dateUtc="2026-10-21T22:49:00Z">
         <w:r>
           <w:rPr>
             <w:sz w:val="96"/>
             <w:szCs w:val="96"/>
-            <w:rPrChange w:id="542" w:author="kyle O'Reilly" w:date="2026-10-21T23:49:00Z" w16du:dateUtc="2026-10-21T22:49:00Z">
+            <w:rPrChange w:id="562" w:author="kyle O'Reilly" w:date="2026-10-21T23:49:00Z" w16du:dateUtc="2026-10-21T22:49:00Z">
               <w:rPr/>
             </w:rPrChange>
           </w:rPr>

</xml_diff>